<commit_message>
Added alert dialog for the onClick effect for the POI markers
</commit_message>
<xml_diff>
--- a/MAD_Report.docx
+++ b/MAD_Report.docx
@@ -1666,15 +1666,7 @@
           <w:szCs w:val="24"/>
         </w:rPr>
         <w:lastRenderedPageBreak/>
-        <w:t xml:space="preserve">2. </w:t>
-      </w:r>
-      <w:r>
-        <w:rPr>
-          <w:rFonts w:ascii="Trebuchet MS" w:hAnsi="Trebuchet MS"/>
-          <w:sz w:val="24"/>
-          <w:szCs w:val="24"/>
-        </w:rPr>
-        <w:t>“</w:t>
+        <w:t>2. “</w:t>
       </w:r>
       <w:r>
         <w:rPr>
@@ -2015,10 +2007,7 @@
         <w:t xml:space="preserve">be </w:t>
       </w:r>
       <w:r>
-        <w:t xml:space="preserve">stored in </w:t>
-      </w:r>
-      <w:r>
-        <w:t>my</w:t>
+        <w:t>stored in my</w:t>
       </w:r>
       <w:r>
         <w:t xml:space="preserve"> </w:t>
@@ -2214,151 +2203,23 @@
         <w:ind w:left="720"/>
       </w:pPr>
       <w:r>
+        <w:rPr>
+          <w:noProof/>
+        </w:rPr>
         <w:lastRenderedPageBreak/>
-        <w:t xml:space="preserve">I will finally update the main composable to include the map page and the add poi page using the compose navigation. I will add the </w:t>
-      </w:r>
-      <w:proofErr w:type="spellStart"/>
-      <w:r>
-        <w:t>NavHost</w:t>
-      </w:r>
-      <w:proofErr w:type="spellEnd"/>
-      <w:r>
-        <w:t xml:space="preserve"> which will contain the two routes for the map page and the add poi page. I will then be able to define the callback functions for the </w:t>
-      </w:r>
-      <w:proofErr w:type="spellStart"/>
-      <w:r>
-        <w:t>onPoiAdded</w:t>
-      </w:r>
-      <w:proofErr w:type="spellEnd"/>
-      <w:r>
-        <w:t xml:space="preserve"> and </w:t>
-      </w:r>
-      <w:proofErr w:type="spellStart"/>
-      <w:r>
-        <w:t>onNavigateBack</w:t>
-      </w:r>
-      <w:proofErr w:type="spellEnd"/>
-      <w:r>
-        <w:t xml:space="preserve">. </w:t>
-      </w:r>
-      <w:proofErr w:type="spellStart"/>
-      <w:r>
-        <w:t>onPoiAdded</w:t>
-      </w:r>
-      <w:proofErr w:type="spellEnd"/>
-      <w:r>
-        <w:t xml:space="preserve"> will add the new poi to the ViewModel and the </w:t>
-      </w:r>
-      <w:proofErr w:type="spellStart"/>
-      <w:r>
-        <w:t>onNavigateBack</w:t>
-      </w:r>
-      <w:proofErr w:type="spellEnd"/>
-      <w:r>
-        <w:t xml:space="preserve"> will return the user to the previous page they were on. </w:t>
-      </w:r>
-      <w:r>
-        <w:t xml:space="preserve">I will place a </w:t>
-      </w:r>
-      <w:r>
-        <w:t>Symbol marker</w:t>
-      </w:r>
-      <w:r>
-        <w:t xml:space="preserve"> inside </w:t>
-      </w:r>
-      <w:r>
-        <w:t xml:space="preserve">the </w:t>
-      </w:r>
-      <w:proofErr w:type="spellStart"/>
-      <w:r>
-        <w:t>MapLibre</w:t>
-      </w:r>
-      <w:proofErr w:type="spellEnd"/>
-      <w:r>
-        <w:t xml:space="preserve"> lambda</w:t>
-      </w:r>
-      <w:r>
-        <w:t xml:space="preserve">. </w:t>
-      </w:r>
-      <w:r>
-        <w:t xml:space="preserve">The map </w:t>
-      </w:r>
-      <w:r>
-        <w:t xml:space="preserve">will then </w:t>
-      </w:r>
-      <w:r>
-        <w:t>be redrawn</w:t>
-      </w:r>
-      <w:r>
-        <w:t xml:space="preserve"> whenever</w:t>
-      </w:r>
-      <w:r>
-        <w:t xml:space="preserve"> the</w:t>
-      </w:r>
-      <w:r>
-        <w:t xml:space="preserve"> </w:t>
-      </w:r>
-      <w:proofErr w:type="spellStart"/>
-      <w:proofErr w:type="gramStart"/>
-      <w:r>
-        <w:t>poisState</w:t>
-      </w:r>
-      <w:proofErr w:type="spellEnd"/>
-      <w:proofErr w:type="gramEnd"/>
-      <w:r>
-        <w:t xml:space="preserve"> changes</w:t>
-      </w:r>
-      <w:r>
-        <w:t>. This will then</w:t>
-      </w:r>
-      <w:r>
-        <w:t xml:space="preserve"> loop through </w:t>
-      </w:r>
-      <w:proofErr w:type="spellStart"/>
-      <w:r>
-        <w:t>poisState</w:t>
-      </w:r>
-      <w:proofErr w:type="spellEnd"/>
-      <w:r>
-        <w:t xml:space="preserve"> and plac</w:t>
-      </w:r>
-      <w:r>
-        <w:t>e</w:t>
-      </w:r>
-      <w:r>
-        <w:t xml:space="preserve"> a Symbol at each POI's LatLng</w:t>
-      </w:r>
-      <w:r>
-        <w:t>. This makes it so</w:t>
-      </w:r>
-      <w:r>
-        <w:t xml:space="preserve"> new markers appear automatically the moment a POI is added</w:t>
-      </w:r>
-      <w:r>
-        <w:t>.</w:t>
-      </w:r>
-    </w:p>
-    <w:p>
-      <w:pPr>
-        <w:ind w:left="720"/>
-      </w:pPr>
-      <w:r>
-        <w:rPr>
-          <w:noProof/>
-        </w:rPr>
         <w:drawing>
-          <wp:anchor distT="0" distB="0" distL="114300" distR="114300" simplePos="0" relativeHeight="251672576" behindDoc="0" locked="0" layoutInCell="1" allowOverlap="1" wp14:anchorId="19B9166B" wp14:editId="07A914DE">
+          <wp:anchor distT="0" distB="0" distL="114300" distR="114300" simplePos="0" relativeHeight="251672576" behindDoc="0" locked="0" layoutInCell="1" allowOverlap="1" wp14:anchorId="2F0E38C9" wp14:editId="09E285FE">
             <wp:simplePos x="0" y="0"/>
             <wp:positionH relativeFrom="margin">
               <wp:align>center</wp:align>
             </wp:positionH>
             <wp:positionV relativeFrom="paragraph">
-              <wp:posOffset>148093</wp:posOffset>
+              <wp:posOffset>2187575</wp:posOffset>
             </wp:positionV>
-            <wp:extent cx="4742815" cy="5488940"/>
-            <wp:effectExtent l="0" t="0" r="635" b="0"/>
+            <wp:extent cx="4327525" cy="6029325"/>
+            <wp:effectExtent l="0" t="0" r="0" b="9525"/>
             <wp:wrapTopAndBottom/>
-            <wp:docPr id="1947300734" name="Picture 1"/>
+            <wp:docPr id="495453487" name="Picture 1"/>
             <wp:cNvGraphicFramePr>
               <a:graphicFrameLocks xmlns:a="http://schemas.openxmlformats.org/drawingml/2006/main" noChangeAspect="1"/>
             </wp:cNvGraphicFramePr>
@@ -2366,7 +2227,7 @@
               <a:graphicData uri="http://schemas.openxmlformats.org/drawingml/2006/picture">
                 <pic:pic xmlns:pic="http://schemas.openxmlformats.org/drawingml/2006/picture">
                   <pic:nvPicPr>
-                    <pic:cNvPr id="1947300734" name=""/>
+                    <pic:cNvPr id="495453487" name=""/>
                     <pic:cNvPicPr/>
                   </pic:nvPicPr>
                   <pic:blipFill>
@@ -2384,7 +2245,7 @@
                   <pic:spPr>
                     <a:xfrm>
                       <a:off x="0" y="0"/>
-                      <a:ext cx="4742815" cy="5488940"/>
+                      <a:ext cx="4327525" cy="6029325"/>
                     </a:xfrm>
                     <a:prstGeom prst="rect">
                       <a:avLst/>
@@ -2402,6 +2263,147 @@
           </wp:anchor>
         </w:drawing>
       </w:r>
+      <w:r>
+        <w:t xml:space="preserve">I will finally update the main composable to include the map page and the add poi page using the compose navigation. I will add the </w:t>
+      </w:r>
+      <w:proofErr w:type="spellStart"/>
+      <w:r>
+        <w:t>NavHost</w:t>
+      </w:r>
+      <w:proofErr w:type="spellEnd"/>
+      <w:r>
+        <w:t xml:space="preserve"> which will contain the two routes for the map page and the add poi page. I will then be able to define the callback functions for the </w:t>
+      </w:r>
+      <w:proofErr w:type="spellStart"/>
+      <w:r>
+        <w:t>onPoiAdded</w:t>
+      </w:r>
+      <w:proofErr w:type="spellEnd"/>
+      <w:r>
+        <w:t xml:space="preserve"> and </w:t>
+      </w:r>
+      <w:proofErr w:type="spellStart"/>
+      <w:r>
+        <w:t>onNavigateBack</w:t>
+      </w:r>
+      <w:proofErr w:type="spellEnd"/>
+      <w:r>
+        <w:t xml:space="preserve">. </w:t>
+      </w:r>
+      <w:proofErr w:type="spellStart"/>
+      <w:r>
+        <w:t>onPoiAdded</w:t>
+      </w:r>
+      <w:proofErr w:type="spellEnd"/>
+      <w:r>
+        <w:t xml:space="preserve"> will add the new poi to the </w:t>
+      </w:r>
+      <w:proofErr w:type="spellStart"/>
+      <w:r>
+        <w:t>ViewModel</w:t>
+      </w:r>
+      <w:proofErr w:type="spellEnd"/>
+      <w:r>
+        <w:t xml:space="preserve"> and the </w:t>
+      </w:r>
+      <w:proofErr w:type="spellStart"/>
+      <w:r>
+        <w:t>onNavigateBack</w:t>
+      </w:r>
+      <w:proofErr w:type="spellEnd"/>
+      <w:r>
+        <w:t xml:space="preserve"> will return the user to the previous page they were on. </w:t>
+      </w:r>
+      <w:r>
+        <w:t xml:space="preserve">I will place a </w:t>
+      </w:r>
+      <w:r>
+        <w:t xml:space="preserve">Symbol marker inside </w:t>
+      </w:r>
+      <w:r>
+        <w:t xml:space="preserve">the </w:t>
+      </w:r>
+      <w:proofErr w:type="spellStart"/>
+      <w:r>
+        <w:t>MapLibre</w:t>
+      </w:r>
+      <w:proofErr w:type="spellEnd"/>
+      <w:r>
+        <w:t xml:space="preserve"> lambda</w:t>
+      </w:r>
+      <w:r>
+        <w:t xml:space="preserve">. </w:t>
+      </w:r>
+      <w:r>
+        <w:t xml:space="preserve">The map </w:t>
+      </w:r>
+      <w:r>
+        <w:t xml:space="preserve">will then </w:t>
+      </w:r>
+      <w:r>
+        <w:t>be redrawn whenever</w:t>
+      </w:r>
+      <w:r>
+        <w:t xml:space="preserve"> the</w:t>
+      </w:r>
+      <w:r>
+        <w:t xml:space="preserve"> </w:t>
+      </w:r>
+      <w:proofErr w:type="spellStart"/>
+      <w:proofErr w:type="gramStart"/>
+      <w:r>
+        <w:t>poisState</w:t>
+      </w:r>
+      <w:proofErr w:type="spellEnd"/>
+      <w:proofErr w:type="gramEnd"/>
+      <w:r>
+        <w:t xml:space="preserve"> changes</w:t>
+      </w:r>
+      <w:r>
+        <w:t>. This will then</w:t>
+      </w:r>
+      <w:r>
+        <w:t xml:space="preserve"> loop through </w:t>
+      </w:r>
+      <w:proofErr w:type="spellStart"/>
+      <w:r>
+        <w:t>poisState</w:t>
+      </w:r>
+      <w:proofErr w:type="spellEnd"/>
+      <w:r>
+        <w:t xml:space="preserve"> and plac</w:t>
+      </w:r>
+      <w:r>
+        <w:t>e</w:t>
+      </w:r>
+      <w:r>
+        <w:t xml:space="preserve"> a Symbol at each POI's LatLng</w:t>
+      </w:r>
+      <w:r>
+        <w:t>. This makes it so</w:t>
+      </w:r>
+      <w:r>
+        <w:t xml:space="preserve"> new markers appear automatically the moment a POI is added</w:t>
+      </w:r>
+      <w:r>
+        <w:t>.</w:t>
+      </w:r>
+      <w:r>
+        <w:t xml:space="preserve"> I will make </w:t>
+      </w:r>
+      <w:proofErr w:type="gramStart"/>
+      <w:r>
+        <w:t>it</w:t>
+      </w:r>
+      <w:proofErr w:type="gramEnd"/>
+      <w:r>
+        <w:t xml:space="preserve"> so an alert dialog appears when the marker is clicked on, displaying the markers details including its name, type and description. This allows me to test that the marker has been added correctly.</w:t>
+      </w:r>
+    </w:p>
+    <w:p>
+      <w:pPr>
+        <w:ind w:left="720"/>
+      </w:pPr>
     </w:p>
     <w:p>
       <w:pPr>
@@ -2939,6 +2941,7 @@
   <w:style w:type="character" w:default="1" w:styleId="DefaultParagraphFont">
     <w:name w:val="Default Paragraph Font"/>
     <w:uiPriority w:val="1"/>
+    <w:semiHidden/>
     <w:unhideWhenUsed/>
   </w:style>
   <w:style w:type="table" w:default="1" w:styleId="TableNormal">

</xml_diff>

<commit_message>
Added dependecies for Room
</commit_message>
<xml_diff>
--- a/MAD_Report.docx
+++ b/MAD_Report.docx
@@ -2412,8 +2412,384 @@
     </w:p>
     <w:p>
       <w:pPr>
-        <w:ind w:left="720"/>
-      </w:pPr>
+        <w:rPr>
+          <w:rFonts w:ascii="Trebuchet MS" w:hAnsi="Trebuchet MS"/>
+          <w:i/>
+          <w:iCs/>
+          <w:sz w:val="24"/>
+          <w:szCs w:val="24"/>
+        </w:rPr>
+      </w:pPr>
+      <w:r>
+        <w:t xml:space="preserve">3. </w:t>
+      </w:r>
+      <w:r>
+        <w:rPr>
+          <w:i/>
+          <w:iCs/>
+        </w:rPr>
+        <w:t>“</w:t>
+      </w:r>
+      <w:r>
+        <w:rPr>
+          <w:rFonts w:ascii="Trebuchet MS" w:hAnsi="Trebuchet MS"/>
+          <w:i/>
+          <w:iCs/>
+          <w:sz w:val="24"/>
+          <w:szCs w:val="24"/>
+        </w:rPr>
+        <w:t>A user should be able to save all points of interest added to a local SQLite database.</w:t>
+      </w:r>
+      <w:r>
+        <w:rPr>
+          <w:rFonts w:ascii="Trebuchet MS" w:hAnsi="Trebuchet MS"/>
+          <w:i/>
+          <w:iCs/>
+          <w:sz w:val="24"/>
+          <w:szCs w:val="24"/>
+        </w:rPr>
+        <w:t>”</w:t>
+      </w:r>
+    </w:p>
+    <w:p>
+      <w:pPr>
+        <w:rPr>
+          <w:rFonts w:ascii="Trebuchet MS" w:hAnsi="Trebuchet MS"/>
+          <w:sz w:val="24"/>
+          <w:szCs w:val="24"/>
+        </w:rPr>
+      </w:pPr>
+      <w:r>
+        <w:rPr>
+          <w:rFonts w:ascii="Trebuchet MS" w:hAnsi="Trebuchet MS"/>
+          <w:sz w:val="24"/>
+          <w:szCs w:val="24"/>
+        </w:rPr>
+        <w:tab/>
+      </w:r>
+    </w:p>
+    <w:p>
+      <w:pPr>
+        <w:rPr>
+          <w:rFonts w:ascii="Trebuchet MS" w:hAnsi="Trebuchet MS"/>
+          <w:sz w:val="24"/>
+          <w:szCs w:val="24"/>
+        </w:rPr>
+      </w:pPr>
+      <w:r>
+        <w:rPr>
+          <w:noProof/>
+        </w:rPr>
+        <w:drawing>
+          <wp:anchor distT="0" distB="0" distL="114300" distR="114300" simplePos="0" relativeHeight="251677696" behindDoc="0" locked="0" layoutInCell="1" allowOverlap="1" wp14:anchorId="0FAB348F" wp14:editId="30F3C7A2">
+            <wp:simplePos x="0" y="0"/>
+            <wp:positionH relativeFrom="margin">
+              <wp:align>center</wp:align>
+            </wp:positionH>
+            <wp:positionV relativeFrom="paragraph">
+              <wp:posOffset>2125345</wp:posOffset>
+            </wp:positionV>
+            <wp:extent cx="2752725" cy="638175"/>
+            <wp:effectExtent l="0" t="0" r="9525" b="9525"/>
+            <wp:wrapTopAndBottom/>
+            <wp:docPr id="1276431068" name="Picture 1"/>
+            <wp:cNvGraphicFramePr>
+              <a:graphicFrameLocks xmlns:a="http://schemas.openxmlformats.org/drawingml/2006/main" noChangeAspect="1"/>
+            </wp:cNvGraphicFramePr>
+            <a:graphic xmlns:a="http://schemas.openxmlformats.org/drawingml/2006/main">
+              <a:graphicData uri="http://schemas.openxmlformats.org/drawingml/2006/picture">
+                <pic:pic xmlns:pic="http://schemas.openxmlformats.org/drawingml/2006/picture">
+                  <pic:nvPicPr>
+                    <pic:cNvPr id="1276431068" name=""/>
+                    <pic:cNvPicPr/>
+                  </pic:nvPicPr>
+                  <pic:blipFill>
+                    <a:blip r:embed="rId19">
+                      <a:extLst>
+                        <a:ext uri="{28A0092B-C50C-407E-A947-70E740481C1C}">
+                          <a14:useLocalDpi xmlns:a14="http://schemas.microsoft.com/office/drawing/2010/main" val="0"/>
+                        </a:ext>
+                      </a:extLst>
+                    </a:blip>
+                    <a:stretch>
+                      <a:fillRect/>
+                    </a:stretch>
+                  </pic:blipFill>
+                  <pic:spPr>
+                    <a:xfrm>
+                      <a:off x="0" y="0"/>
+                      <a:ext cx="2752725" cy="638175"/>
+                    </a:xfrm>
+                    <a:prstGeom prst="rect">
+                      <a:avLst/>
+                    </a:prstGeom>
+                  </pic:spPr>
+                </pic:pic>
+              </a:graphicData>
+            </a:graphic>
+          </wp:anchor>
+        </w:drawing>
+      </w:r>
+      <w:r>
+        <w:rPr>
+          <w:noProof/>
+        </w:rPr>
+        <w:drawing>
+          <wp:anchor distT="0" distB="0" distL="114300" distR="114300" simplePos="0" relativeHeight="251676672" behindDoc="0" locked="0" layoutInCell="1" allowOverlap="1" wp14:anchorId="516695D4" wp14:editId="3AC9BE64">
+            <wp:simplePos x="0" y="0"/>
+            <wp:positionH relativeFrom="margin">
+              <wp:align>center</wp:align>
+            </wp:positionH>
+            <wp:positionV relativeFrom="paragraph">
+              <wp:posOffset>1791970</wp:posOffset>
+            </wp:positionV>
+            <wp:extent cx="1885950" cy="266700"/>
+            <wp:effectExtent l="0" t="0" r="0" b="0"/>
+            <wp:wrapTopAndBottom/>
+            <wp:docPr id="1622975503" name="Picture 1"/>
+            <wp:cNvGraphicFramePr>
+              <a:graphicFrameLocks xmlns:a="http://schemas.openxmlformats.org/drawingml/2006/main" noChangeAspect="1"/>
+            </wp:cNvGraphicFramePr>
+            <a:graphic xmlns:a="http://schemas.openxmlformats.org/drawingml/2006/main">
+              <a:graphicData uri="http://schemas.openxmlformats.org/drawingml/2006/picture">
+                <pic:pic xmlns:pic="http://schemas.openxmlformats.org/drawingml/2006/picture">
+                  <pic:nvPicPr>
+                    <pic:cNvPr id="1622975503" name=""/>
+                    <pic:cNvPicPr/>
+                  </pic:nvPicPr>
+                  <pic:blipFill>
+                    <a:blip r:embed="rId20">
+                      <a:extLst>
+                        <a:ext uri="{28A0092B-C50C-407E-A947-70E740481C1C}">
+                          <a14:useLocalDpi xmlns:a14="http://schemas.microsoft.com/office/drawing/2010/main" val="0"/>
+                        </a:ext>
+                      </a:extLst>
+                    </a:blip>
+                    <a:stretch>
+                      <a:fillRect/>
+                    </a:stretch>
+                  </pic:blipFill>
+                  <pic:spPr>
+                    <a:xfrm>
+                      <a:off x="0" y="0"/>
+                      <a:ext cx="1885950" cy="266700"/>
+                    </a:xfrm>
+                    <a:prstGeom prst="rect">
+                      <a:avLst/>
+                    </a:prstGeom>
+                  </pic:spPr>
+                </pic:pic>
+              </a:graphicData>
+            </a:graphic>
+          </wp:anchor>
+        </w:drawing>
+      </w:r>
+      <w:r>
+        <w:rPr>
+          <w:noProof/>
+        </w:rPr>
+        <w:drawing>
+          <wp:anchor distT="0" distB="0" distL="114300" distR="114300" simplePos="0" relativeHeight="251675648" behindDoc="0" locked="0" layoutInCell="1" allowOverlap="1" wp14:anchorId="3C4ED549" wp14:editId="250A7096">
+            <wp:simplePos x="0" y="0"/>
+            <wp:positionH relativeFrom="margin">
+              <wp:align>center</wp:align>
+            </wp:positionH>
+            <wp:positionV relativeFrom="paragraph">
+              <wp:posOffset>1458595</wp:posOffset>
+            </wp:positionV>
+            <wp:extent cx="4829175" cy="257175"/>
+            <wp:effectExtent l="0" t="0" r="9525" b="9525"/>
+            <wp:wrapTopAndBottom/>
+            <wp:docPr id="1962970364" name="Picture 1"/>
+            <wp:cNvGraphicFramePr>
+              <a:graphicFrameLocks xmlns:a="http://schemas.openxmlformats.org/drawingml/2006/main" noChangeAspect="1"/>
+            </wp:cNvGraphicFramePr>
+            <a:graphic xmlns:a="http://schemas.openxmlformats.org/drawingml/2006/main">
+              <a:graphicData uri="http://schemas.openxmlformats.org/drawingml/2006/picture">
+                <pic:pic xmlns:pic="http://schemas.openxmlformats.org/drawingml/2006/picture">
+                  <pic:nvPicPr>
+                    <pic:cNvPr id="1962970364" name=""/>
+                    <pic:cNvPicPr/>
+                  </pic:nvPicPr>
+                  <pic:blipFill>
+                    <a:blip r:embed="rId21">
+                      <a:extLst>
+                        <a:ext uri="{28A0092B-C50C-407E-A947-70E740481C1C}">
+                          <a14:useLocalDpi xmlns:a14="http://schemas.microsoft.com/office/drawing/2010/main" val="0"/>
+                        </a:ext>
+                      </a:extLst>
+                    </a:blip>
+                    <a:stretch>
+                      <a:fillRect/>
+                    </a:stretch>
+                  </pic:blipFill>
+                  <pic:spPr>
+                    <a:xfrm>
+                      <a:off x="0" y="0"/>
+                      <a:ext cx="4829175" cy="257175"/>
+                    </a:xfrm>
+                    <a:prstGeom prst="rect">
+                      <a:avLst/>
+                    </a:prstGeom>
+                  </pic:spPr>
+                </pic:pic>
+              </a:graphicData>
+            </a:graphic>
+          </wp:anchor>
+        </w:drawing>
+      </w:r>
+      <w:r>
+        <w:rPr>
+          <w:noProof/>
+        </w:rPr>
+        <w:drawing>
+          <wp:anchor distT="0" distB="0" distL="114300" distR="114300" simplePos="0" relativeHeight="251674624" behindDoc="0" locked="0" layoutInCell="1" allowOverlap="1" wp14:anchorId="06DF79B4" wp14:editId="3342893F">
+            <wp:simplePos x="0" y="0"/>
+            <wp:positionH relativeFrom="margin">
+              <wp:align>right</wp:align>
+            </wp:positionH>
+            <wp:positionV relativeFrom="paragraph">
+              <wp:posOffset>810895</wp:posOffset>
+            </wp:positionV>
+            <wp:extent cx="5943600" cy="570865"/>
+            <wp:effectExtent l="0" t="0" r="0" b="635"/>
+            <wp:wrapTopAndBottom/>
+            <wp:docPr id="186289336" name="Picture 1"/>
+            <wp:cNvGraphicFramePr>
+              <a:graphicFrameLocks xmlns:a="http://schemas.openxmlformats.org/drawingml/2006/main" noChangeAspect="1"/>
+            </wp:cNvGraphicFramePr>
+            <a:graphic xmlns:a="http://schemas.openxmlformats.org/drawingml/2006/main">
+              <a:graphicData uri="http://schemas.openxmlformats.org/drawingml/2006/picture">
+                <pic:pic xmlns:pic="http://schemas.openxmlformats.org/drawingml/2006/picture">
+                  <pic:nvPicPr>
+                    <pic:cNvPr id="186289336" name=""/>
+                    <pic:cNvPicPr/>
+                  </pic:nvPicPr>
+                  <pic:blipFill>
+                    <a:blip r:embed="rId22">
+                      <a:extLst>
+                        <a:ext uri="{28A0092B-C50C-407E-A947-70E740481C1C}">
+                          <a14:useLocalDpi xmlns:a14="http://schemas.microsoft.com/office/drawing/2010/main" val="0"/>
+                        </a:ext>
+                      </a:extLst>
+                    </a:blip>
+                    <a:stretch>
+                      <a:fillRect/>
+                    </a:stretch>
+                  </pic:blipFill>
+                  <pic:spPr>
+                    <a:xfrm>
+                      <a:off x="0" y="0"/>
+                      <a:ext cx="5943600" cy="570865"/>
+                    </a:xfrm>
+                    <a:prstGeom prst="rect">
+                      <a:avLst/>
+                    </a:prstGeom>
+                  </pic:spPr>
+                </pic:pic>
+              </a:graphicData>
+            </a:graphic>
+          </wp:anchor>
+        </w:drawing>
+      </w:r>
+      <w:r>
+        <w:rPr>
+          <w:noProof/>
+        </w:rPr>
+        <w:drawing>
+          <wp:anchor distT="0" distB="0" distL="114300" distR="114300" simplePos="0" relativeHeight="251673600" behindDoc="0" locked="0" layoutInCell="1" allowOverlap="1" wp14:anchorId="4C8530E4" wp14:editId="418C784F">
+            <wp:simplePos x="0" y="0"/>
+            <wp:positionH relativeFrom="margin">
+              <wp:align>center</wp:align>
+            </wp:positionH>
+            <wp:positionV relativeFrom="paragraph">
+              <wp:posOffset>306070</wp:posOffset>
+            </wp:positionV>
+            <wp:extent cx="1247775" cy="466725"/>
+            <wp:effectExtent l="0" t="0" r="9525" b="9525"/>
+            <wp:wrapTopAndBottom/>
+            <wp:docPr id="952200938" name="Picture 1"/>
+            <wp:cNvGraphicFramePr>
+              <a:graphicFrameLocks xmlns:a="http://schemas.openxmlformats.org/drawingml/2006/main" noChangeAspect="1"/>
+            </wp:cNvGraphicFramePr>
+            <a:graphic xmlns:a="http://schemas.openxmlformats.org/drawingml/2006/main">
+              <a:graphicData uri="http://schemas.openxmlformats.org/drawingml/2006/picture">
+                <pic:pic xmlns:pic="http://schemas.openxmlformats.org/drawingml/2006/picture">
+                  <pic:nvPicPr>
+                    <pic:cNvPr id="952200938" name=""/>
+                    <pic:cNvPicPr/>
+                  </pic:nvPicPr>
+                  <pic:blipFill>
+                    <a:blip r:embed="rId23">
+                      <a:extLst>
+                        <a:ext uri="{28A0092B-C50C-407E-A947-70E740481C1C}">
+                          <a14:useLocalDpi xmlns:a14="http://schemas.microsoft.com/office/drawing/2010/main" val="0"/>
+                        </a:ext>
+                      </a:extLst>
+                    </a:blip>
+                    <a:stretch>
+                      <a:fillRect/>
+                    </a:stretch>
+                  </pic:blipFill>
+                  <pic:spPr>
+                    <a:xfrm>
+                      <a:off x="0" y="0"/>
+                      <a:ext cx="1247775" cy="466725"/>
+                    </a:xfrm>
+                    <a:prstGeom prst="rect">
+                      <a:avLst/>
+                    </a:prstGeom>
+                  </pic:spPr>
+                </pic:pic>
+              </a:graphicData>
+            </a:graphic>
+          </wp:anchor>
+        </w:drawing>
+      </w:r>
+      <w:r>
+        <w:rPr>
+          <w:rFonts w:ascii="Trebuchet MS" w:hAnsi="Trebuchet MS"/>
+          <w:sz w:val="24"/>
+          <w:szCs w:val="24"/>
+        </w:rPr>
+        <w:tab/>
+      </w:r>
+      <w:r>
+        <w:rPr>
+          <w:rFonts w:ascii="Trebuchet MS" w:hAnsi="Trebuchet MS"/>
+          <w:sz w:val="24"/>
+          <w:szCs w:val="24"/>
+        </w:rPr>
+        <w:t>I will first begin this task by adding the dependencies for Room.</w:t>
+      </w:r>
+    </w:p>
+    <w:p>
+      <w:pPr>
+        <w:rPr>
+          <w:rFonts w:ascii="Trebuchet MS" w:hAnsi="Trebuchet MS"/>
+          <w:sz w:val="24"/>
+          <w:szCs w:val="24"/>
+        </w:rPr>
+      </w:pPr>
+    </w:p>
+    <w:p>
+      <w:pPr>
+        <w:rPr>
+          <w:rFonts w:ascii="Trebuchet MS" w:hAnsi="Trebuchet MS"/>
+          <w:sz w:val="24"/>
+          <w:szCs w:val="24"/>
+        </w:rPr>
+      </w:pPr>
+    </w:p>
+    <w:p>
+      <w:r>
+        <w:rPr>
+          <w:rFonts w:ascii="Trebuchet MS" w:hAnsi="Trebuchet MS"/>
+          <w:sz w:val="24"/>
+          <w:szCs w:val="24"/>
+        </w:rPr>
+        <w:tab/>
+      </w:r>
     </w:p>
     <w:sectPr>
       <w:pgSz w:w="12240" w:h="15840"/>

</xml_diff>

<commit_message>
Updated POI data class to be used as a room entity
</commit_message>
<xml_diff>
--- a/MAD_Report.docx
+++ b/MAD_Report.docx
@@ -2782,14 +2782,97 @@
       </w:pPr>
     </w:p>
     <w:p>
-      <w:r>
+      <w:pPr>
+        <w:ind w:left="720"/>
         <w:rPr>
           <w:rFonts w:ascii="Trebuchet MS" w:hAnsi="Trebuchet MS"/>
           <w:sz w:val="24"/>
           <w:szCs w:val="24"/>
         </w:rPr>
-        <w:tab/>
-      </w:r>
+      </w:pPr>
+      <w:r>
+        <w:rPr>
+          <w:noProof/>
+        </w:rPr>
+        <w:drawing>
+          <wp:anchor distT="0" distB="0" distL="114300" distR="114300" simplePos="0" relativeHeight="251678720" behindDoc="0" locked="0" layoutInCell="1" allowOverlap="1" wp14:anchorId="321F7754" wp14:editId="057EDCBE">
+            <wp:simplePos x="0" y="0"/>
+            <wp:positionH relativeFrom="margin">
+              <wp:align>center</wp:align>
+            </wp:positionH>
+            <wp:positionV relativeFrom="paragraph">
+              <wp:posOffset>478790</wp:posOffset>
+            </wp:positionV>
+            <wp:extent cx="3398520" cy="2162175"/>
+            <wp:effectExtent l="0" t="0" r="0" b="9525"/>
+            <wp:wrapTopAndBottom/>
+            <wp:docPr id="1192581997" name="Picture 1"/>
+            <wp:cNvGraphicFramePr>
+              <a:graphicFrameLocks xmlns:a="http://schemas.openxmlformats.org/drawingml/2006/main" noChangeAspect="1"/>
+            </wp:cNvGraphicFramePr>
+            <a:graphic xmlns:a="http://schemas.openxmlformats.org/drawingml/2006/main">
+              <a:graphicData uri="http://schemas.openxmlformats.org/drawingml/2006/picture">
+                <pic:pic xmlns:pic="http://schemas.openxmlformats.org/drawingml/2006/picture">
+                  <pic:nvPicPr>
+                    <pic:cNvPr id="1192581997" name=""/>
+                    <pic:cNvPicPr/>
+                  </pic:nvPicPr>
+                  <pic:blipFill>
+                    <a:blip r:embed="rId24">
+                      <a:extLst>
+                        <a:ext uri="{28A0092B-C50C-407E-A947-70E740481C1C}">
+                          <a14:useLocalDpi xmlns:a14="http://schemas.microsoft.com/office/drawing/2010/main" val="0"/>
+                        </a:ext>
+                      </a:extLst>
+                    </a:blip>
+                    <a:stretch>
+                      <a:fillRect/>
+                    </a:stretch>
+                  </pic:blipFill>
+                  <pic:spPr>
+                    <a:xfrm>
+                      <a:off x="0" y="0"/>
+                      <a:ext cx="3398520" cy="2162175"/>
+                    </a:xfrm>
+                    <a:prstGeom prst="rect">
+                      <a:avLst/>
+                    </a:prstGeom>
+                  </pic:spPr>
+                </pic:pic>
+              </a:graphicData>
+            </a:graphic>
+            <wp14:sizeRelH relativeFrom="margin">
+              <wp14:pctWidth>0</wp14:pctWidth>
+            </wp14:sizeRelH>
+            <wp14:sizeRelV relativeFrom="margin">
+              <wp14:pctHeight>0</wp14:pctHeight>
+            </wp14:sizeRelV>
+          </wp:anchor>
+        </w:drawing>
+      </w:r>
+      <w:r>
+        <w:rPr>
+          <w:rFonts w:ascii="Trebuchet MS" w:hAnsi="Trebuchet MS"/>
+          <w:sz w:val="24"/>
+          <w:szCs w:val="24"/>
+        </w:rPr>
+        <w:t>I will then update my POI data class to be a room entity instead. This will allow me to easily save any POI to the local database.</w:t>
+      </w:r>
+    </w:p>
+    <w:p>
+      <w:pPr>
+        <w:ind w:left="720"/>
+        <w:rPr>
+          <w:rFonts w:ascii="Trebuchet MS" w:hAnsi="Trebuchet MS"/>
+          <w:sz w:val="24"/>
+          <w:szCs w:val="24"/>
+        </w:rPr>
+      </w:pPr>
+    </w:p>
+    <w:p>
+      <w:pPr>
+        <w:ind w:left="720"/>
+      </w:pPr>
     </w:p>
     <w:sectPr>
       <w:pgSz w:w="12240" w:h="15840"/>

</xml_diff>

<commit_message>
Added poi database file
</commit_message>
<xml_diff>
--- a/MAD_Report.docx
+++ b/MAD_Report.docx
@@ -2934,15 +2934,15 @@
         </w:rPr>
         <w:lastRenderedPageBreak/>
         <w:drawing>
-          <wp:anchor distT="0" distB="0" distL="114300" distR="114300" simplePos="0" relativeHeight="251679744" behindDoc="0" locked="0" layoutInCell="1" allowOverlap="1" wp14:anchorId="6B4D34FA" wp14:editId="49A4F457">
+          <wp:anchor distT="0" distB="0" distL="114300" distR="114300" simplePos="0" relativeHeight="251679744" behindDoc="0" locked="0" layoutInCell="1" allowOverlap="1" wp14:anchorId="6B4D34FA" wp14:editId="45ED0183">
             <wp:simplePos x="0" y="0"/>
             <wp:positionH relativeFrom="margin">
               <wp:align>center</wp:align>
             </wp:positionH>
             <wp:positionV relativeFrom="paragraph">
-              <wp:posOffset>1371600</wp:posOffset>
+              <wp:posOffset>1295400</wp:posOffset>
             </wp:positionV>
-            <wp:extent cx="3352800" cy="3581400"/>
+            <wp:extent cx="2157730" cy="2305050"/>
             <wp:effectExtent l="0" t="0" r="0" b="0"/>
             <wp:wrapTopAndBottom/>
             <wp:docPr id="1140100640" name="Picture 1"/>
@@ -2971,7 +2971,7 @@
                   <pic:spPr>
                     <a:xfrm>
                       <a:off x="0" y="0"/>
-                      <a:ext cx="3352800" cy="3581400"/>
+                      <a:ext cx="2157730" cy="2305050"/>
                     </a:xfrm>
                     <a:prstGeom prst="rect">
                       <a:avLst/>
@@ -2980,6 +2980,12 @@
                 </pic:pic>
               </a:graphicData>
             </a:graphic>
+            <wp14:sizeRelH relativeFrom="margin">
+              <wp14:pctWidth>0</wp14:pctWidth>
+            </wp14:sizeRelH>
+            <wp14:sizeRelV relativeFrom="margin">
+              <wp14:pctHeight>0</wp14:pctHeight>
+            </wp14:sizeRelV>
           </wp:anchor>
         </w:drawing>
       </w:r>
@@ -3151,6 +3157,120 @@
           <w:szCs w:val="24"/>
         </w:rPr>
       </w:pPr>
+      <w:r>
+        <w:rPr>
+          <w:noProof/>
+        </w:rPr>
+        <w:drawing>
+          <wp:anchor distT="0" distB="0" distL="114300" distR="114300" simplePos="0" relativeHeight="251680768" behindDoc="0" locked="0" layoutInCell="1" allowOverlap="1" wp14:anchorId="67BE6305" wp14:editId="71FA3EA6">
+            <wp:simplePos x="0" y="0"/>
+            <wp:positionH relativeFrom="margin">
+              <wp:align>center</wp:align>
+            </wp:positionH>
+            <wp:positionV relativeFrom="paragraph">
+              <wp:posOffset>1012825</wp:posOffset>
+            </wp:positionV>
+            <wp:extent cx="2867025" cy="3405505"/>
+            <wp:effectExtent l="0" t="0" r="9525" b="4445"/>
+            <wp:wrapTopAndBottom/>
+            <wp:docPr id="1312127306" name="Picture 1"/>
+            <wp:cNvGraphicFramePr>
+              <a:graphicFrameLocks xmlns:a="http://schemas.openxmlformats.org/drawingml/2006/main" noChangeAspect="1"/>
+            </wp:cNvGraphicFramePr>
+            <a:graphic xmlns:a="http://schemas.openxmlformats.org/drawingml/2006/main">
+              <a:graphicData uri="http://schemas.openxmlformats.org/drawingml/2006/picture">
+                <pic:pic xmlns:pic="http://schemas.openxmlformats.org/drawingml/2006/picture">
+                  <pic:nvPicPr>
+                    <pic:cNvPr id="1312127306" name=""/>
+                    <pic:cNvPicPr/>
+                  </pic:nvPicPr>
+                  <pic:blipFill>
+                    <a:blip r:embed="rId26">
+                      <a:extLst>
+                        <a:ext uri="{28A0092B-C50C-407E-A947-70E740481C1C}">
+                          <a14:useLocalDpi xmlns:a14="http://schemas.microsoft.com/office/drawing/2010/main" val="0"/>
+                        </a:ext>
+                      </a:extLst>
+                    </a:blip>
+                    <a:stretch>
+                      <a:fillRect/>
+                    </a:stretch>
+                  </pic:blipFill>
+                  <pic:spPr>
+                    <a:xfrm>
+                      <a:off x="0" y="0"/>
+                      <a:ext cx="2867025" cy="3405505"/>
+                    </a:xfrm>
+                    <a:prstGeom prst="rect">
+                      <a:avLst/>
+                    </a:prstGeom>
+                  </pic:spPr>
+                </pic:pic>
+              </a:graphicData>
+            </a:graphic>
+            <wp14:sizeRelH relativeFrom="margin">
+              <wp14:pctWidth>0</wp14:pctWidth>
+            </wp14:sizeRelH>
+            <wp14:sizeRelV relativeFrom="margin">
+              <wp14:pctHeight>0</wp14:pctHeight>
+            </wp14:sizeRelV>
+          </wp:anchor>
+        </w:drawing>
+      </w:r>
+      <w:r>
+        <w:rPr>
+          <w:rFonts w:ascii="Trebuchet MS" w:hAnsi="Trebuchet MS"/>
+          <w:sz w:val="24"/>
+          <w:szCs w:val="24"/>
+        </w:rPr>
+        <w:t xml:space="preserve">I plan to next create the file for the database itself. This will be placed within an abstract function which allows my other files to access its DAO and all the database operations within it. Inside it I will put a </w:t>
+      </w:r>
+      <w:proofErr w:type="spellStart"/>
+      <w:proofErr w:type="gramStart"/>
+      <w:r>
+        <w:rPr>
+          <w:rFonts w:ascii="Trebuchet MS" w:hAnsi="Trebuchet MS"/>
+          <w:sz w:val="24"/>
+          <w:szCs w:val="24"/>
+        </w:rPr>
+        <w:t>getDatabase</w:t>
+      </w:r>
+      <w:proofErr w:type="spellEnd"/>
+      <w:r>
+        <w:rPr>
+          <w:rFonts w:ascii="Trebuchet MS" w:hAnsi="Trebuchet MS"/>
+          <w:sz w:val="24"/>
+          <w:szCs w:val="24"/>
+        </w:rPr>
+        <w:t>(</w:t>
+      </w:r>
+      <w:proofErr w:type="gramEnd"/>
+      <w:r>
+        <w:rPr>
+          <w:rFonts w:ascii="Trebuchet MS" w:hAnsi="Trebuchet MS"/>
+          <w:sz w:val="24"/>
+          <w:szCs w:val="24"/>
+        </w:rPr>
+        <w:t xml:space="preserve">) function which will check that a database </w:t>
+      </w:r>
+      <w:proofErr w:type="gramStart"/>
+      <w:r>
+        <w:rPr>
+          <w:rFonts w:ascii="Trebuchet MS" w:hAnsi="Trebuchet MS"/>
+          <w:sz w:val="24"/>
+          <w:szCs w:val="24"/>
+        </w:rPr>
+        <w:t>doesn’t already</w:t>
+      </w:r>
+      <w:proofErr w:type="gramEnd"/>
+      <w:r>
+        <w:rPr>
+          <w:rFonts w:ascii="Trebuchet MS" w:hAnsi="Trebuchet MS"/>
+          <w:sz w:val="24"/>
+          <w:szCs w:val="24"/>
+        </w:rPr>
+        <w:t xml:space="preserve"> exist, if not it will create one and save it, otherwise it will simply return the one that already exists.</w:t>
+      </w:r>
     </w:p>
     <w:p>
       <w:pPr>
@@ -3192,6 +3312,7 @@
       <w:pgMar w:top="1440" w:right="1440" w:bottom="1440" w:left="1440" w:header="720" w:footer="720" w:gutter="0"/>
       <w:pgNumType w:start="1"/>
       <w:cols w:space="720"/>
+      <w:docGrid w:linePitch="299"/>
     </w:sectPr>
   </w:body>
 </w:document>

</xml_diff>

<commit_message>
Integrated a POI database into my code
</commit_message>
<xml_diff>
--- a/MAD_Report.docx
+++ b/MAD_Report.docx
@@ -3281,6 +3281,235 @@
           <w:szCs w:val="24"/>
         </w:rPr>
       </w:pPr>
+      <w:r>
+        <w:rPr>
+          <w:noProof/>
+        </w:rPr>
+        <w:lastRenderedPageBreak/>
+        <w:drawing>
+          <wp:anchor distT="0" distB="0" distL="114300" distR="114300" simplePos="0" relativeHeight="251681792" behindDoc="0" locked="0" layoutInCell="1" allowOverlap="1" wp14:anchorId="7CE67090" wp14:editId="6D2F0C56">
+            <wp:simplePos x="0" y="0"/>
+            <wp:positionH relativeFrom="margin">
+              <wp:align>center</wp:align>
+            </wp:positionH>
+            <wp:positionV relativeFrom="paragraph">
+              <wp:posOffset>1514475</wp:posOffset>
+            </wp:positionV>
+            <wp:extent cx="5219065" cy="3638550"/>
+            <wp:effectExtent l="0" t="0" r="635" b="0"/>
+            <wp:wrapTopAndBottom/>
+            <wp:docPr id="650322858" name="Picture 1"/>
+            <wp:cNvGraphicFramePr>
+              <a:graphicFrameLocks xmlns:a="http://schemas.openxmlformats.org/drawingml/2006/main" noChangeAspect="1"/>
+            </wp:cNvGraphicFramePr>
+            <a:graphic xmlns:a="http://schemas.openxmlformats.org/drawingml/2006/main">
+              <a:graphicData uri="http://schemas.openxmlformats.org/drawingml/2006/picture">
+                <pic:pic xmlns:pic="http://schemas.openxmlformats.org/drawingml/2006/picture">
+                  <pic:nvPicPr>
+                    <pic:cNvPr id="650322858" name=""/>
+                    <pic:cNvPicPr/>
+                  </pic:nvPicPr>
+                  <pic:blipFill>
+                    <a:blip r:embed="rId27">
+                      <a:extLst>
+                        <a:ext uri="{28A0092B-C50C-407E-A947-70E740481C1C}">
+                          <a14:useLocalDpi xmlns:a14="http://schemas.microsoft.com/office/drawing/2010/main" val="0"/>
+                        </a:ext>
+                      </a:extLst>
+                    </a:blip>
+                    <a:stretch>
+                      <a:fillRect/>
+                    </a:stretch>
+                  </pic:blipFill>
+                  <pic:spPr>
+                    <a:xfrm>
+                      <a:off x="0" y="0"/>
+                      <a:ext cx="5219065" cy="3638550"/>
+                    </a:xfrm>
+                    <a:prstGeom prst="rect">
+                      <a:avLst/>
+                    </a:prstGeom>
+                  </pic:spPr>
+                </pic:pic>
+              </a:graphicData>
+            </a:graphic>
+            <wp14:sizeRelH relativeFrom="margin">
+              <wp14:pctWidth>0</wp14:pctWidth>
+            </wp14:sizeRelH>
+            <wp14:sizeRelV relativeFrom="margin">
+              <wp14:pctHeight>0</wp14:pctHeight>
+            </wp14:sizeRelV>
+          </wp:anchor>
+        </w:drawing>
+      </w:r>
+      <w:r>
+        <w:rPr>
+          <w:rFonts w:ascii="Trebuchet MS" w:hAnsi="Trebuchet MS"/>
+          <w:sz w:val="24"/>
+          <w:szCs w:val="24"/>
+        </w:rPr>
+        <w:t xml:space="preserve">I will next update my </w:t>
+      </w:r>
+      <w:proofErr w:type="spellStart"/>
+      <w:r>
+        <w:rPr>
+          <w:rFonts w:ascii="Trebuchet MS" w:hAnsi="Trebuchet MS"/>
+          <w:sz w:val="24"/>
+          <w:szCs w:val="24"/>
+        </w:rPr>
+        <w:t>Viewmodel</w:t>
+      </w:r>
+      <w:proofErr w:type="spellEnd"/>
+      <w:r>
+        <w:rPr>
+          <w:rFonts w:ascii="Trebuchet MS" w:hAnsi="Trebuchet MS"/>
+          <w:sz w:val="24"/>
+          <w:szCs w:val="24"/>
+        </w:rPr>
+        <w:t xml:space="preserve">. </w:t>
+      </w:r>
+      <w:r>
+        <w:rPr>
+          <w:rFonts w:ascii="Trebuchet MS" w:hAnsi="Trebuchet MS"/>
+          <w:sz w:val="24"/>
+          <w:szCs w:val="24"/>
+        </w:rPr>
+        <w:t xml:space="preserve">I will first change the </w:t>
+      </w:r>
+      <w:proofErr w:type="spellStart"/>
+      <w:r>
+        <w:rPr>
+          <w:rFonts w:ascii="Trebuchet MS" w:hAnsi="Trebuchet MS"/>
+          <w:sz w:val="24"/>
+          <w:szCs w:val="24"/>
+        </w:rPr>
+        <w:t>ViewModel</w:t>
+      </w:r>
+      <w:proofErr w:type="spellEnd"/>
+      <w:r>
+        <w:rPr>
+          <w:rFonts w:ascii="Trebuchet MS" w:hAnsi="Trebuchet MS"/>
+          <w:sz w:val="24"/>
+          <w:szCs w:val="24"/>
+        </w:rPr>
+        <w:t xml:space="preserve"> for </w:t>
+      </w:r>
+      <w:proofErr w:type="gramStart"/>
+      <w:r>
+        <w:rPr>
+          <w:rFonts w:ascii="Trebuchet MS" w:hAnsi="Trebuchet MS"/>
+          <w:sz w:val="24"/>
+          <w:szCs w:val="24"/>
+        </w:rPr>
+        <w:t xml:space="preserve">a </w:t>
+      </w:r>
+      <w:proofErr w:type="spellStart"/>
+      <w:r>
+        <w:rPr>
+          <w:rFonts w:ascii="Trebuchet MS" w:hAnsi="Trebuchet MS"/>
+          <w:sz w:val="24"/>
+          <w:szCs w:val="24"/>
+        </w:rPr>
+        <w:t>AndroidViewModel</w:t>
+      </w:r>
+      <w:proofErr w:type="spellEnd"/>
+      <w:proofErr w:type="gramEnd"/>
+      <w:r>
+        <w:rPr>
+          <w:rFonts w:ascii="Trebuchet MS" w:hAnsi="Trebuchet MS"/>
+          <w:sz w:val="24"/>
+          <w:szCs w:val="24"/>
+        </w:rPr>
+        <w:t xml:space="preserve"> so that it can access the application context which will be needed to open the database. </w:t>
+      </w:r>
+      <w:r>
+        <w:rPr>
+          <w:rFonts w:ascii="Trebuchet MS" w:hAnsi="Trebuchet MS"/>
+          <w:sz w:val="24"/>
+          <w:szCs w:val="24"/>
+        </w:rPr>
+        <w:t xml:space="preserve">I plan to update the poi variable so that it gathers all the pois from the database as </w:t>
+      </w:r>
+      <w:proofErr w:type="spellStart"/>
+      <w:r>
+        <w:rPr>
+          <w:rFonts w:ascii="Trebuchet MS" w:hAnsi="Trebuchet MS"/>
+          <w:sz w:val="24"/>
+          <w:szCs w:val="24"/>
+        </w:rPr>
+        <w:t>LiveData</w:t>
+      </w:r>
+      <w:proofErr w:type="spellEnd"/>
+      <w:r>
+        <w:rPr>
+          <w:rFonts w:ascii="Trebuchet MS" w:hAnsi="Trebuchet MS"/>
+          <w:sz w:val="24"/>
+          <w:szCs w:val="24"/>
+        </w:rPr>
+        <w:t xml:space="preserve"> allowing it to automatically update when a new POI is added. Because of this, I will also need to change the </w:t>
+      </w:r>
+      <w:proofErr w:type="spellStart"/>
+      <w:r>
+        <w:rPr>
+          <w:rFonts w:ascii="Trebuchet MS" w:hAnsi="Trebuchet MS"/>
+          <w:sz w:val="24"/>
+          <w:szCs w:val="24"/>
+        </w:rPr>
+        <w:t>addpoi</w:t>
+      </w:r>
+      <w:proofErr w:type="spellEnd"/>
+      <w:r>
+        <w:rPr>
+          <w:rFonts w:ascii="Trebuchet MS" w:hAnsi="Trebuchet MS"/>
+          <w:sz w:val="24"/>
+          <w:szCs w:val="24"/>
+        </w:rPr>
+        <w:t xml:space="preserve"> function in the </w:t>
+      </w:r>
+      <w:proofErr w:type="spellStart"/>
+      <w:r>
+        <w:rPr>
+          <w:rFonts w:ascii="Trebuchet MS" w:hAnsi="Trebuchet MS"/>
+          <w:sz w:val="24"/>
+          <w:szCs w:val="24"/>
+        </w:rPr>
+        <w:t>Viewmodel</w:t>
+      </w:r>
+      <w:proofErr w:type="spellEnd"/>
+      <w:r>
+        <w:rPr>
+          <w:rFonts w:ascii="Trebuchet MS" w:hAnsi="Trebuchet MS"/>
+          <w:sz w:val="24"/>
+          <w:szCs w:val="24"/>
+        </w:rPr>
+        <w:t xml:space="preserve"> so that it adds the poi to the database instead of list using the </w:t>
+      </w:r>
+      <w:proofErr w:type="spellStart"/>
+      <w:r>
+        <w:rPr>
+          <w:rFonts w:ascii="Trebuchet MS" w:hAnsi="Trebuchet MS"/>
+          <w:sz w:val="24"/>
+          <w:szCs w:val="24"/>
+        </w:rPr>
+        <w:t>poiDao’s</w:t>
+      </w:r>
+      <w:proofErr w:type="spellEnd"/>
+      <w:r>
+        <w:rPr>
+          <w:rFonts w:ascii="Trebuchet MS" w:hAnsi="Trebuchet MS"/>
+          <w:sz w:val="24"/>
+          <w:szCs w:val="24"/>
+        </w:rPr>
+        <w:t xml:space="preserve"> ins</w:t>
+      </w:r>
+      <w:r>
+        <w:rPr>
+          <w:rFonts w:ascii="Trebuchet MS" w:hAnsi="Trebuchet MS"/>
+          <w:sz w:val="24"/>
+          <w:szCs w:val="24"/>
+        </w:rPr>
+        <w:t>ert function.</w:t>
+      </w:r>
     </w:p>
     <w:p>
       <w:pPr>
@@ -3305,7 +3534,294 @@
     <w:p>
       <w:pPr>
         <w:ind w:left="720"/>
-      </w:pPr>
+        <w:rPr>
+          <w:rFonts w:ascii="Trebuchet MS" w:hAnsi="Trebuchet MS"/>
+          <w:sz w:val="24"/>
+          <w:szCs w:val="24"/>
+        </w:rPr>
+      </w:pPr>
+      <w:r>
+        <w:rPr>
+          <w:noProof/>
+        </w:rPr>
+        <w:drawing>
+          <wp:anchor distT="0" distB="0" distL="114300" distR="114300" simplePos="0" relativeHeight="251682816" behindDoc="0" locked="0" layoutInCell="1" allowOverlap="1" wp14:anchorId="0ABF882C" wp14:editId="2E143B9C">
+            <wp:simplePos x="0" y="0"/>
+            <wp:positionH relativeFrom="margin">
+              <wp:align>center</wp:align>
+            </wp:positionH>
+            <wp:positionV relativeFrom="paragraph">
+              <wp:posOffset>704215</wp:posOffset>
+            </wp:positionV>
+            <wp:extent cx="2543175" cy="1959610"/>
+            <wp:effectExtent l="0" t="0" r="9525" b="2540"/>
+            <wp:wrapTopAndBottom/>
+            <wp:docPr id="1579269633" name="Picture 1"/>
+            <wp:cNvGraphicFramePr>
+              <a:graphicFrameLocks xmlns:a="http://schemas.openxmlformats.org/drawingml/2006/main" noChangeAspect="1"/>
+            </wp:cNvGraphicFramePr>
+            <a:graphic xmlns:a="http://schemas.openxmlformats.org/drawingml/2006/main">
+              <a:graphicData uri="http://schemas.openxmlformats.org/drawingml/2006/picture">
+                <pic:pic xmlns:pic="http://schemas.openxmlformats.org/drawingml/2006/picture">
+                  <pic:nvPicPr>
+                    <pic:cNvPr id="1579269633" name=""/>
+                    <pic:cNvPicPr/>
+                  </pic:nvPicPr>
+                  <pic:blipFill>
+                    <a:blip r:embed="rId28">
+                      <a:extLst>
+                        <a:ext uri="{28A0092B-C50C-407E-A947-70E740481C1C}">
+                          <a14:useLocalDpi xmlns:a14="http://schemas.microsoft.com/office/drawing/2010/main" val="0"/>
+                        </a:ext>
+                      </a:extLst>
+                    </a:blip>
+                    <a:stretch>
+                      <a:fillRect/>
+                    </a:stretch>
+                  </pic:blipFill>
+                  <pic:spPr>
+                    <a:xfrm>
+                      <a:off x="0" y="0"/>
+                      <a:ext cx="2543175" cy="1959610"/>
+                    </a:xfrm>
+                    <a:prstGeom prst="rect">
+                      <a:avLst/>
+                    </a:prstGeom>
+                  </pic:spPr>
+                </pic:pic>
+              </a:graphicData>
+            </a:graphic>
+            <wp14:sizeRelH relativeFrom="margin">
+              <wp14:pctWidth>0</wp14:pctWidth>
+            </wp14:sizeRelH>
+            <wp14:sizeRelV relativeFrom="margin">
+              <wp14:pctHeight>0</wp14:pctHeight>
+            </wp14:sizeRelV>
+          </wp:anchor>
+        </w:drawing>
+      </w:r>
+      <w:r>
+        <w:rPr>
+          <w:rFonts w:ascii="Trebuchet MS" w:hAnsi="Trebuchet MS"/>
+          <w:sz w:val="24"/>
+          <w:szCs w:val="24"/>
+        </w:rPr>
+        <w:t xml:space="preserve">I will then update the button for my </w:t>
+      </w:r>
+      <w:proofErr w:type="spellStart"/>
+      <w:r>
+        <w:rPr>
+          <w:rFonts w:ascii="Trebuchet MS" w:hAnsi="Trebuchet MS"/>
+          <w:sz w:val="24"/>
+          <w:szCs w:val="24"/>
+        </w:rPr>
+        <w:t>AddPoiScreen</w:t>
+      </w:r>
+      <w:proofErr w:type="spellEnd"/>
+      <w:r>
+        <w:rPr>
+          <w:rFonts w:ascii="Trebuchet MS" w:hAnsi="Trebuchet MS"/>
+          <w:sz w:val="24"/>
+          <w:szCs w:val="24"/>
+        </w:rPr>
+        <w:t>. I will simply change the Poi structure in the button so that it fits the databases poi structure since the latitude and longitude for the pois in the database are separate variables.</w:t>
+      </w:r>
+    </w:p>
+    <w:p>
+      <w:pPr>
+        <w:ind w:left="720"/>
+        <w:rPr>
+          <w:rFonts w:ascii="Trebuchet MS" w:hAnsi="Trebuchet MS"/>
+          <w:sz w:val="24"/>
+          <w:szCs w:val="24"/>
+        </w:rPr>
+      </w:pPr>
+      <w:r>
+        <w:rPr>
+          <w:noProof/>
+        </w:rPr>
+        <w:lastRenderedPageBreak/>
+        <w:drawing>
+          <wp:anchor distT="0" distB="0" distL="114300" distR="114300" simplePos="0" relativeHeight="251683840" behindDoc="0" locked="0" layoutInCell="1" allowOverlap="1" wp14:anchorId="3BBBDE1F" wp14:editId="235A82AC">
+            <wp:simplePos x="0" y="0"/>
+            <wp:positionH relativeFrom="margin">
+              <wp:align>center</wp:align>
+            </wp:positionH>
+            <wp:positionV relativeFrom="paragraph">
+              <wp:posOffset>495300</wp:posOffset>
+            </wp:positionV>
+            <wp:extent cx="4257675" cy="1514475"/>
+            <wp:effectExtent l="0" t="0" r="9525" b="9525"/>
+            <wp:wrapTopAndBottom/>
+            <wp:docPr id="1030101622" name="Picture 1"/>
+            <wp:cNvGraphicFramePr>
+              <a:graphicFrameLocks xmlns:a="http://schemas.openxmlformats.org/drawingml/2006/main" noChangeAspect="1"/>
+            </wp:cNvGraphicFramePr>
+            <a:graphic xmlns:a="http://schemas.openxmlformats.org/drawingml/2006/main">
+              <a:graphicData uri="http://schemas.openxmlformats.org/drawingml/2006/picture">
+                <pic:pic xmlns:pic="http://schemas.openxmlformats.org/drawingml/2006/picture">
+                  <pic:nvPicPr>
+                    <pic:cNvPr id="1030101622" name=""/>
+                    <pic:cNvPicPr/>
+                  </pic:nvPicPr>
+                  <pic:blipFill>
+                    <a:blip r:embed="rId29">
+                      <a:extLst>
+                        <a:ext uri="{28A0092B-C50C-407E-A947-70E740481C1C}">
+                          <a14:useLocalDpi xmlns:a14="http://schemas.microsoft.com/office/drawing/2010/main" val="0"/>
+                        </a:ext>
+                      </a:extLst>
+                    </a:blip>
+                    <a:stretch>
+                      <a:fillRect/>
+                    </a:stretch>
+                  </pic:blipFill>
+                  <pic:spPr>
+                    <a:xfrm>
+                      <a:off x="0" y="0"/>
+                      <a:ext cx="4257675" cy="1514475"/>
+                    </a:xfrm>
+                    <a:prstGeom prst="rect">
+                      <a:avLst/>
+                    </a:prstGeom>
+                  </pic:spPr>
+                </pic:pic>
+              </a:graphicData>
+            </a:graphic>
+          </wp:anchor>
+        </w:drawing>
+      </w:r>
+      <w:r>
+        <w:rPr>
+          <w:rFonts w:ascii="Trebuchet MS" w:hAnsi="Trebuchet MS"/>
+          <w:sz w:val="24"/>
+          <w:szCs w:val="24"/>
+        </w:rPr>
+        <w:t xml:space="preserve">I will then need to change the </w:t>
+      </w:r>
+      <w:proofErr w:type="spellStart"/>
+      <w:r>
+        <w:rPr>
+          <w:rFonts w:ascii="Trebuchet MS" w:hAnsi="Trebuchet MS"/>
+          <w:sz w:val="24"/>
+          <w:szCs w:val="24"/>
+        </w:rPr>
+        <w:t>MainActivity</w:t>
+      </w:r>
+      <w:proofErr w:type="spellEnd"/>
+      <w:r>
+        <w:rPr>
+          <w:rFonts w:ascii="Trebuchet MS" w:hAnsi="Trebuchet MS"/>
+          <w:sz w:val="24"/>
+          <w:szCs w:val="24"/>
+        </w:rPr>
+        <w:t xml:space="preserve"> so that the Poi is converted back into the </w:t>
+      </w:r>
+      <w:proofErr w:type="spellStart"/>
+      <w:r>
+        <w:rPr>
+          <w:rFonts w:ascii="Trebuchet MS" w:hAnsi="Trebuchet MS"/>
+          <w:sz w:val="24"/>
+          <w:szCs w:val="24"/>
+        </w:rPr>
+        <w:t>LatLng</w:t>
+      </w:r>
+      <w:proofErr w:type="spellEnd"/>
+      <w:r>
+        <w:rPr>
+          <w:rFonts w:ascii="Trebuchet MS" w:hAnsi="Trebuchet MS"/>
+          <w:sz w:val="24"/>
+          <w:szCs w:val="24"/>
+        </w:rPr>
+        <w:t xml:space="preserve"> so that the map can properly mark its location.</w:t>
+      </w:r>
+    </w:p>
+    <w:p>
+      <w:pPr>
+        <w:ind w:left="720"/>
+        <w:rPr>
+          <w:rFonts w:ascii="Trebuchet MS" w:hAnsi="Trebuchet MS"/>
+          <w:sz w:val="24"/>
+          <w:szCs w:val="24"/>
+        </w:rPr>
+      </w:pPr>
+    </w:p>
+    <w:p>
+      <w:pPr>
+        <w:ind w:left="720"/>
+        <w:rPr>
+          <w:rFonts w:ascii="Trebuchet MS" w:hAnsi="Trebuchet MS"/>
+          <w:sz w:val="24"/>
+          <w:szCs w:val="24"/>
+        </w:rPr>
+      </w:pPr>
+    </w:p>
+    <w:p>
+      <w:pPr>
+        <w:ind w:left="720"/>
+      </w:pPr>
+      <w:r>
+        <w:t>Just to confirm that this all worked, I added a new poi and checked Android Studios App Inspecter to show my databases contents with which the poi I added had been successfully added to the database.</w:t>
+      </w:r>
+    </w:p>
+    <w:p>
+      <w:pPr>
+        <w:ind w:left="720"/>
+      </w:pPr>
+      <w:r>
+        <w:rPr>
+          <w:noProof/>
+        </w:rPr>
+        <w:drawing>
+          <wp:anchor distT="0" distB="0" distL="114300" distR="114300" simplePos="0" relativeHeight="251684864" behindDoc="0" locked="0" layoutInCell="1" allowOverlap="1" wp14:anchorId="071F14F2" wp14:editId="76623772">
+            <wp:simplePos x="0" y="0"/>
+            <wp:positionH relativeFrom="margin">
+              <wp:align>right</wp:align>
+            </wp:positionH>
+            <wp:positionV relativeFrom="paragraph">
+              <wp:posOffset>172085</wp:posOffset>
+            </wp:positionV>
+            <wp:extent cx="5943600" cy="470535"/>
+            <wp:effectExtent l="0" t="0" r="0" b="5715"/>
+            <wp:wrapTopAndBottom/>
+            <wp:docPr id="737827119" name="Picture 1"/>
+            <wp:cNvGraphicFramePr>
+              <a:graphicFrameLocks xmlns:a="http://schemas.openxmlformats.org/drawingml/2006/main" noChangeAspect="1"/>
+            </wp:cNvGraphicFramePr>
+            <a:graphic xmlns:a="http://schemas.openxmlformats.org/drawingml/2006/main">
+              <a:graphicData uri="http://schemas.openxmlformats.org/drawingml/2006/picture">
+                <pic:pic xmlns:pic="http://schemas.openxmlformats.org/drawingml/2006/picture">
+                  <pic:nvPicPr>
+                    <pic:cNvPr id="737827119" name=""/>
+                    <pic:cNvPicPr/>
+                  </pic:nvPicPr>
+                  <pic:blipFill>
+                    <a:blip r:embed="rId30">
+                      <a:extLst>
+                        <a:ext uri="{28A0092B-C50C-407E-A947-70E740481C1C}">
+                          <a14:useLocalDpi xmlns:a14="http://schemas.microsoft.com/office/drawing/2010/main" val="0"/>
+                        </a:ext>
+                      </a:extLst>
+                    </a:blip>
+                    <a:stretch>
+                      <a:fillRect/>
+                    </a:stretch>
+                  </pic:blipFill>
+                  <pic:spPr>
+                    <a:xfrm>
+                      <a:off x="0" y="0"/>
+                      <a:ext cx="5943600" cy="470535"/>
+                    </a:xfrm>
+                    <a:prstGeom prst="rect">
+                      <a:avLst/>
+                    </a:prstGeom>
+                  </pic:spPr>
+                </pic:pic>
+              </a:graphicData>
+            </a:graphic>
+          </wp:anchor>
+        </w:drawing>
+      </w:r>
     </w:p>
     <w:sectPr>
       <w:pgSz w:w="12240" w:h="15840"/>
@@ -3834,6 +4350,7 @@
   <w:style w:type="character" w:default="1" w:styleId="DefaultParagraphFont">
     <w:name w:val="Default Paragraph Font"/>
     <w:uiPriority w:val="1"/>
+    <w:semiHidden/>
     <w:unhideWhenUsed/>
   </w:style>
   <w:style w:type="table" w:default="1" w:styleId="TableNormal">

</xml_diff>

<commit_message>
Report updated - task 4
</commit_message>
<xml_diff>
--- a/MAD_Report.docx
+++ b/MAD_Report.docx
@@ -375,7 +375,6 @@
         </w:rPr>
         <w:t xml:space="preserve">I will first start with this task by setting up the dependencies in my </w:t>
       </w:r>
-      <w:proofErr w:type="spellStart"/>
       <w:proofErr w:type="gramStart"/>
       <w:r>
         <w:rPr>
@@ -385,7 +384,6 @@
         </w:rPr>
         <w:t>build.gradle</w:t>
       </w:r>
-      <w:proofErr w:type="spellEnd"/>
       <w:proofErr w:type="gramEnd"/>
       <w:r>
         <w:rPr>
@@ -395,7 +393,6 @@
         </w:rPr>
         <w:t xml:space="preserve"> and </w:t>
       </w:r>
-      <w:proofErr w:type="spellStart"/>
       <w:proofErr w:type="gramStart"/>
       <w:r>
         <w:rPr>
@@ -412,34 +409,7 @@
           <w:sz w:val="24"/>
           <w:szCs w:val="24"/>
         </w:rPr>
-        <w:t>.toml</w:t>
-      </w:r>
-      <w:proofErr w:type="spellEnd"/>
-      <w:r>
-        <w:rPr>
-          <w:rFonts w:ascii="Trebuchet MS" w:eastAsia="Trebuchet MS" w:hAnsi="Trebuchet MS" w:cs="Trebuchet MS"/>
-          <w:sz w:val="24"/>
-          <w:szCs w:val="24"/>
-        </w:rPr>
-        <w:t xml:space="preserve"> files. I will add </w:t>
-      </w:r>
-      <w:proofErr w:type="spellStart"/>
-      <w:r>
-        <w:rPr>
-          <w:rFonts w:ascii="Trebuchet MS" w:eastAsia="Trebuchet MS" w:hAnsi="Trebuchet MS" w:cs="Trebuchet MS"/>
-          <w:sz w:val="24"/>
-          <w:szCs w:val="24"/>
-        </w:rPr>
-        <w:t>MapLibre</w:t>
-      </w:r>
-      <w:proofErr w:type="spellEnd"/>
-      <w:r>
-        <w:rPr>
-          <w:rFonts w:ascii="Trebuchet MS" w:eastAsia="Trebuchet MS" w:hAnsi="Trebuchet MS" w:cs="Trebuchet MS"/>
-          <w:sz w:val="24"/>
-          <w:szCs w:val="24"/>
-        </w:rPr>
-        <w:t xml:space="preserve"> with Vulkan support, the Ramani Maps Compose wrapper, and the standard AndroidX libraries needed for Compose.</w:t>
+        <w:t>.toml files. I will add MapLibre with Vulkan support, the Ramani Maps Compose wrapper, and the standard AndroidX libraries needed for Compose.</w:t>
       </w:r>
       <w:r>
         <w:rPr>
@@ -572,25 +542,7 @@
           <w:sz w:val="24"/>
           <w:szCs w:val="24"/>
         </w:rPr>
-        <w:t xml:space="preserve">Then in the AndroidManifest.xml, I will set up the ACCESS_FINE_LOCATION and ACCESS_COARSE_LOCATION permissions, as well as INTERNET, since the map tiles will be gathered remotely from </w:t>
-      </w:r>
-      <w:proofErr w:type="spellStart"/>
-      <w:r>
-        <w:rPr>
-          <w:rFonts w:ascii="Trebuchet MS" w:eastAsia="Trebuchet MS" w:hAnsi="Trebuchet MS" w:cs="Trebuchet MS"/>
-          <w:sz w:val="24"/>
-          <w:szCs w:val="24"/>
-        </w:rPr>
-        <w:t>OpenFreeMap</w:t>
-      </w:r>
-      <w:proofErr w:type="spellEnd"/>
-      <w:r>
-        <w:rPr>
-          <w:rFonts w:ascii="Trebuchet MS" w:eastAsia="Trebuchet MS" w:hAnsi="Trebuchet MS" w:cs="Trebuchet MS"/>
-          <w:sz w:val="24"/>
-          <w:szCs w:val="24"/>
-        </w:rPr>
-        <w:t>.</w:t>
+        <w:t>Then in the AndroidManifest.xml, I will set up the ACCESS_FINE_LOCATION and ACCESS_COARSE_LOCATION permissions, as well as INTERNET, since the map tiles will be gathered remotely from OpenFreeMap.</w:t>
       </w:r>
       <w:r>
         <w:rPr>
@@ -736,43 +688,7 @@
           <w:sz w:val="24"/>
           <w:szCs w:val="24"/>
         </w:rPr>
-        <w:t xml:space="preserve">To manage the location state in both the activity and UI, I will need to add a </w:t>
-      </w:r>
-      <w:proofErr w:type="spellStart"/>
-      <w:r>
-        <w:rPr>
-          <w:rFonts w:ascii="Trebuchet MS" w:eastAsia="Trebuchet MS" w:hAnsi="Trebuchet MS" w:cs="Trebuchet MS"/>
-          <w:sz w:val="24"/>
-          <w:szCs w:val="24"/>
-        </w:rPr>
-        <w:t>LatLngViewModel</w:t>
-      </w:r>
-      <w:proofErr w:type="spellEnd"/>
-      <w:r>
-        <w:rPr>
-          <w:rFonts w:ascii="Trebuchet MS" w:eastAsia="Trebuchet MS" w:hAnsi="Trebuchet MS" w:cs="Trebuchet MS"/>
-          <w:sz w:val="24"/>
-          <w:szCs w:val="24"/>
-        </w:rPr>
-        <w:t xml:space="preserve"> class that will hold a </w:t>
-      </w:r>
-      <w:proofErr w:type="spellStart"/>
-      <w:r>
-        <w:rPr>
-          <w:rFonts w:ascii="Trebuchet MS" w:eastAsia="Trebuchet MS" w:hAnsi="Trebuchet MS" w:cs="Trebuchet MS"/>
-          <w:sz w:val="24"/>
-          <w:szCs w:val="24"/>
-        </w:rPr>
-        <w:t>latLng</w:t>
-      </w:r>
-      <w:proofErr w:type="spellEnd"/>
-      <w:r>
-        <w:rPr>
-          <w:rFonts w:ascii="Trebuchet MS" w:eastAsia="Trebuchet MS" w:hAnsi="Trebuchet MS" w:cs="Trebuchet MS"/>
-          <w:sz w:val="24"/>
-          <w:szCs w:val="24"/>
-        </w:rPr>
-        <w:t xml:space="preserve"> property backed by a MutableLiveData object. </w:t>
+        <w:t xml:space="preserve">To manage the location state in both the activity and UI, I will need to add a LatLngViewModel class that will hold a latLng property backed by a MutableLiveData object. </w:t>
       </w:r>
     </w:p>
     <w:p>
@@ -799,43 +715,7 @@
           <w:szCs w:val="24"/>
         </w:rPr>
         <w:lastRenderedPageBreak/>
-        <w:t xml:space="preserve">Whenever the </w:t>
-      </w:r>
-      <w:proofErr w:type="spellStart"/>
-      <w:r>
-        <w:rPr>
-          <w:rFonts w:ascii="Trebuchet MS" w:eastAsia="Trebuchet MS" w:hAnsi="Trebuchet MS" w:cs="Trebuchet MS"/>
-          <w:sz w:val="24"/>
-          <w:szCs w:val="24"/>
-        </w:rPr>
-        <w:t>latLng</w:t>
-      </w:r>
-      <w:proofErr w:type="spellEnd"/>
-      <w:r>
-        <w:rPr>
-          <w:rFonts w:ascii="Trebuchet MS" w:eastAsia="Trebuchet MS" w:hAnsi="Trebuchet MS" w:cs="Trebuchet MS"/>
-          <w:sz w:val="24"/>
-          <w:szCs w:val="24"/>
-        </w:rPr>
-        <w:t xml:space="preserve"> is updated, i.e. the user's location changes, it should automatically push the new value to </w:t>
-      </w:r>
-      <w:proofErr w:type="spellStart"/>
-      <w:r>
-        <w:rPr>
-          <w:rFonts w:ascii="Trebuchet MS" w:eastAsia="Trebuchet MS" w:hAnsi="Trebuchet MS" w:cs="Trebuchet MS"/>
-          <w:sz w:val="24"/>
-          <w:szCs w:val="24"/>
-        </w:rPr>
-        <w:t>latLngLiveData</w:t>
-      </w:r>
-      <w:proofErr w:type="spellEnd"/>
-      <w:r>
-        <w:rPr>
-          <w:rFonts w:ascii="Trebuchet MS" w:eastAsia="Trebuchet MS" w:hAnsi="Trebuchet MS" w:cs="Trebuchet MS"/>
-          <w:sz w:val="24"/>
-          <w:szCs w:val="24"/>
-        </w:rPr>
-        <w:t xml:space="preserve">, making it observable from the UI layer.  </w:t>
+        <w:t xml:space="preserve">Whenever the latLng is updated, i.e. the user's location changes, it should automatically push the new value to latLngLiveData, making it observable from the UI layer.  </w:t>
       </w:r>
     </w:p>
     <w:p>
@@ -927,79 +807,7 @@
           <w:sz w:val="24"/>
           <w:szCs w:val="24"/>
         </w:rPr>
-        <w:t xml:space="preserve">In the MainActivity, I will add the </w:t>
-      </w:r>
-      <w:proofErr w:type="spellStart"/>
-      <w:r>
-        <w:rPr>
-          <w:rFonts w:ascii="Trebuchet MS" w:eastAsia="Trebuchet MS" w:hAnsi="Trebuchet MS" w:cs="Trebuchet MS"/>
-          <w:sz w:val="24"/>
-          <w:szCs w:val="24"/>
-        </w:rPr>
-        <w:t>LocationListener</w:t>
-      </w:r>
-      <w:proofErr w:type="spellEnd"/>
-      <w:r>
-        <w:rPr>
-          <w:rFonts w:ascii="Trebuchet MS" w:eastAsia="Trebuchet MS" w:hAnsi="Trebuchet MS" w:cs="Trebuchet MS"/>
-          <w:sz w:val="24"/>
-          <w:szCs w:val="24"/>
-        </w:rPr>
-        <w:t xml:space="preserve"> interface. This will allow me to override the </w:t>
-      </w:r>
-      <w:proofErr w:type="spellStart"/>
-      <w:r>
-        <w:rPr>
-          <w:rFonts w:ascii="Trebuchet MS" w:eastAsia="Trebuchet MS" w:hAnsi="Trebuchet MS" w:cs="Trebuchet MS"/>
-          <w:sz w:val="24"/>
-          <w:szCs w:val="24"/>
-        </w:rPr>
-        <w:t>onLocationChanged</w:t>
-      </w:r>
-      <w:proofErr w:type="spellEnd"/>
-      <w:r>
-        <w:rPr>
-          <w:rFonts w:ascii="Trebuchet MS" w:eastAsia="Trebuchet MS" w:hAnsi="Trebuchet MS" w:cs="Trebuchet MS"/>
-          <w:sz w:val="24"/>
-          <w:szCs w:val="24"/>
-        </w:rPr>
-        <w:t xml:space="preserve"> function, where I will update the </w:t>
-      </w:r>
-      <w:proofErr w:type="spellStart"/>
-      <w:r>
-        <w:rPr>
-          <w:rFonts w:ascii="Trebuchet MS" w:eastAsia="Trebuchet MS" w:hAnsi="Trebuchet MS" w:cs="Trebuchet MS"/>
-          <w:sz w:val="24"/>
-          <w:szCs w:val="24"/>
-        </w:rPr>
-        <w:t>ViewModel's</w:t>
-      </w:r>
-      <w:proofErr w:type="spellEnd"/>
-      <w:r>
-        <w:rPr>
-          <w:rFonts w:ascii="Trebuchet MS" w:eastAsia="Trebuchet MS" w:hAnsi="Trebuchet MS" w:cs="Trebuchet MS"/>
-          <w:sz w:val="24"/>
-          <w:szCs w:val="24"/>
-        </w:rPr>
-        <w:t xml:space="preserve"> </w:t>
-      </w:r>
-      <w:proofErr w:type="spellStart"/>
-      <w:r>
-        <w:rPr>
-          <w:rFonts w:ascii="Trebuchet MS" w:eastAsia="Trebuchet MS" w:hAnsi="Trebuchet MS" w:cs="Trebuchet MS"/>
-          <w:sz w:val="24"/>
-          <w:szCs w:val="24"/>
-        </w:rPr>
-        <w:t>latLng</w:t>
-      </w:r>
-      <w:proofErr w:type="spellEnd"/>
-      <w:r>
-        <w:rPr>
-          <w:rFonts w:ascii="Trebuchet MS" w:eastAsia="Trebuchet MS" w:hAnsi="Trebuchet MS" w:cs="Trebuchet MS"/>
-          <w:sz w:val="24"/>
-          <w:szCs w:val="24"/>
-        </w:rPr>
-        <w:t xml:space="preserve"> with the current coordinates gathered by the device itself.</w:t>
+        <w:t>In the MainActivity, I will add the LocationListener interface. This will allow me to override the onLocationChanged function, where I will update the ViewModel's latLng with the current coordinates gathered by the device itself.</w:t>
       </w:r>
       <w:r>
         <w:rPr>
@@ -1139,61 +947,7 @@
           <w:sz w:val="24"/>
           <w:szCs w:val="24"/>
         </w:rPr>
-        <w:t xml:space="preserve">To start receiving GPS updates, I will create a GPS function that will retrieve the </w:t>
-      </w:r>
-      <w:proofErr w:type="spellStart"/>
-      <w:r>
-        <w:rPr>
-          <w:rFonts w:ascii="Trebuchet MS" w:eastAsia="Trebuchet MS" w:hAnsi="Trebuchet MS" w:cs="Trebuchet MS"/>
-          <w:sz w:val="24"/>
-          <w:szCs w:val="24"/>
-        </w:rPr>
-        <w:t>LocationManager</w:t>
-      </w:r>
-      <w:proofErr w:type="spellEnd"/>
-      <w:r>
-        <w:rPr>
-          <w:rFonts w:ascii="Trebuchet MS" w:eastAsia="Trebuchet MS" w:hAnsi="Trebuchet MS" w:cs="Trebuchet MS"/>
-          <w:sz w:val="24"/>
-          <w:szCs w:val="24"/>
-        </w:rPr>
-        <w:t xml:space="preserve"> system service and call </w:t>
-      </w:r>
-      <w:proofErr w:type="spellStart"/>
-      <w:r>
-        <w:rPr>
-          <w:rFonts w:ascii="Trebuchet MS" w:eastAsia="Trebuchet MS" w:hAnsi="Trebuchet MS" w:cs="Trebuchet MS"/>
-          <w:sz w:val="24"/>
-          <w:szCs w:val="24"/>
-        </w:rPr>
-        <w:t>requestLocationUpdates</w:t>
-      </w:r>
-      <w:proofErr w:type="spellEnd"/>
-      <w:r>
-        <w:rPr>
-          <w:rFonts w:ascii="Trebuchet MS" w:eastAsia="Trebuchet MS" w:hAnsi="Trebuchet MS" w:cs="Trebuchet MS"/>
-          <w:sz w:val="24"/>
-          <w:szCs w:val="24"/>
-        </w:rPr>
-        <w:t xml:space="preserve">, which I will set to update every 2 seconds or after 5 </w:t>
-      </w:r>
-      <w:proofErr w:type="spellStart"/>
-      <w:r>
-        <w:rPr>
-          <w:rFonts w:ascii="Trebuchet MS" w:eastAsia="Trebuchet MS" w:hAnsi="Trebuchet MS" w:cs="Trebuchet MS"/>
-          <w:sz w:val="24"/>
-          <w:szCs w:val="24"/>
-        </w:rPr>
-        <w:t>metres</w:t>
-      </w:r>
-      <w:proofErr w:type="spellEnd"/>
-      <w:r>
-        <w:rPr>
-          <w:rFonts w:ascii="Trebuchet MS" w:eastAsia="Trebuchet MS" w:hAnsi="Trebuchet MS" w:cs="Trebuchet MS"/>
-          <w:sz w:val="24"/>
-          <w:szCs w:val="24"/>
-        </w:rPr>
-        <w:t xml:space="preserve"> of movement. This will keep the GPS accurate without slowing the machine down too much.</w:t>
+        <w:t>To start receiving GPS updates, I will create a GPS function that will retrieve the LocationManager system service and call requestLocationUpdates, which I will set to update every 2 seconds or after 5 metres of movement. This will keep the GPS accurate without slowing the machine down too much.</w:t>
       </w:r>
       <w:r>
         <w:rPr>
@@ -1318,7 +1072,6 @@
         </w:rPr>
         <w:t xml:space="preserve">I will also write a </w:t>
       </w:r>
-      <w:proofErr w:type="spellStart"/>
       <w:proofErr w:type="gramStart"/>
       <w:r>
         <w:rPr>
@@ -1326,16 +1079,7 @@
           <w:sz w:val="24"/>
           <w:szCs w:val="24"/>
         </w:rPr>
-        <w:t>checkPermissions</w:t>
-      </w:r>
-      <w:proofErr w:type="spellEnd"/>
-      <w:r>
-        <w:rPr>
-          <w:rFonts w:ascii="Trebuchet MS" w:eastAsia="Trebuchet MS" w:hAnsi="Trebuchet MS" w:cs="Trebuchet MS"/>
-          <w:sz w:val="24"/>
-          <w:szCs w:val="24"/>
-        </w:rPr>
-        <w:t xml:space="preserve"> function</w:t>
+        <w:t>checkPermissions function</w:t>
       </w:r>
       <w:proofErr w:type="gramEnd"/>
       <w:r>
@@ -1475,151 +1219,7 @@
           <w:sz w:val="24"/>
           <w:szCs w:val="24"/>
         </w:rPr>
-        <w:t xml:space="preserve">Inside the </w:t>
-      </w:r>
-      <w:proofErr w:type="spellStart"/>
-      <w:r>
-        <w:rPr>
-          <w:rFonts w:ascii="Trebuchet MS" w:eastAsia="Trebuchet MS" w:hAnsi="Trebuchet MS" w:cs="Trebuchet MS"/>
-          <w:sz w:val="24"/>
-          <w:szCs w:val="24"/>
-        </w:rPr>
-        <w:t>setContent</w:t>
-      </w:r>
-      <w:proofErr w:type="spellEnd"/>
-      <w:r>
-        <w:rPr>
-          <w:rFonts w:ascii="Trebuchet MS" w:eastAsia="Trebuchet MS" w:hAnsi="Trebuchet MS" w:cs="Trebuchet MS"/>
-          <w:sz w:val="24"/>
-          <w:szCs w:val="24"/>
-        </w:rPr>
-        <w:t xml:space="preserve"> itself, I will use a </w:t>
-      </w:r>
-      <w:proofErr w:type="spellStart"/>
-      <w:r>
-        <w:rPr>
-          <w:rFonts w:ascii="Trebuchet MS" w:eastAsia="Trebuchet MS" w:hAnsi="Trebuchet MS" w:cs="Trebuchet MS"/>
-          <w:sz w:val="24"/>
-          <w:szCs w:val="24"/>
-        </w:rPr>
-        <w:t>mutablestate</w:t>
-      </w:r>
-      <w:proofErr w:type="spellEnd"/>
-      <w:r>
-        <w:rPr>
-          <w:rFonts w:ascii="Trebuchet MS" w:eastAsia="Trebuchet MS" w:hAnsi="Trebuchet MS" w:cs="Trebuchet MS"/>
-          <w:sz w:val="24"/>
-          <w:szCs w:val="24"/>
-        </w:rPr>
-        <w:t xml:space="preserve"> variable to hold the current LatLng and zoom level, observed the </w:t>
-      </w:r>
-      <w:proofErr w:type="spellStart"/>
-      <w:r>
-        <w:rPr>
-          <w:rFonts w:ascii="Trebuchet MS" w:eastAsia="Trebuchet MS" w:hAnsi="Trebuchet MS" w:cs="Trebuchet MS"/>
-          <w:sz w:val="24"/>
-          <w:szCs w:val="24"/>
-        </w:rPr>
-        <w:t>ViewModel's</w:t>
-      </w:r>
-      <w:proofErr w:type="spellEnd"/>
-      <w:r>
-        <w:rPr>
-          <w:rFonts w:ascii="Trebuchet MS" w:eastAsia="Trebuchet MS" w:hAnsi="Trebuchet MS" w:cs="Trebuchet MS"/>
-          <w:sz w:val="24"/>
-          <w:szCs w:val="24"/>
-        </w:rPr>
-        <w:t xml:space="preserve"> </w:t>
-      </w:r>
-      <w:proofErr w:type="spellStart"/>
-      <w:r>
-        <w:rPr>
-          <w:rFonts w:ascii="Trebuchet MS" w:eastAsia="Trebuchet MS" w:hAnsi="Trebuchet MS" w:cs="Trebuchet MS"/>
-          <w:sz w:val="24"/>
-          <w:szCs w:val="24"/>
-        </w:rPr>
-        <w:t>LiveData</w:t>
-      </w:r>
-      <w:proofErr w:type="spellEnd"/>
-      <w:r>
-        <w:rPr>
-          <w:rFonts w:ascii="Trebuchet MS" w:eastAsia="Trebuchet MS" w:hAnsi="Trebuchet MS" w:cs="Trebuchet MS"/>
-          <w:sz w:val="24"/>
-          <w:szCs w:val="24"/>
-        </w:rPr>
-        <w:t xml:space="preserve"> to keep that state updated, and pass the values into a </w:t>
-      </w:r>
-      <w:proofErr w:type="spellStart"/>
-      <w:r>
-        <w:rPr>
-          <w:rFonts w:ascii="Trebuchet MS" w:eastAsia="Trebuchet MS" w:hAnsi="Trebuchet MS" w:cs="Trebuchet MS"/>
-          <w:sz w:val="24"/>
-          <w:szCs w:val="24"/>
-        </w:rPr>
-        <w:t>MapLibre</w:t>
-      </w:r>
-      <w:proofErr w:type="spellEnd"/>
-      <w:r>
-        <w:rPr>
-          <w:rFonts w:ascii="Trebuchet MS" w:eastAsia="Trebuchet MS" w:hAnsi="Trebuchet MS" w:cs="Trebuchet MS"/>
-          <w:sz w:val="24"/>
-          <w:szCs w:val="24"/>
-        </w:rPr>
-        <w:t xml:space="preserve"> composable via a </w:t>
-      </w:r>
-      <w:proofErr w:type="spellStart"/>
-      <w:r>
-        <w:rPr>
-          <w:rFonts w:ascii="Trebuchet MS" w:eastAsia="Trebuchet MS" w:hAnsi="Trebuchet MS" w:cs="Trebuchet MS"/>
-          <w:sz w:val="24"/>
-          <w:szCs w:val="24"/>
-        </w:rPr>
-        <w:t>CameraPosition</w:t>
-      </w:r>
-      <w:proofErr w:type="spellEnd"/>
-      <w:r>
-        <w:rPr>
-          <w:rFonts w:ascii="Trebuchet MS" w:eastAsia="Trebuchet MS" w:hAnsi="Trebuchet MS" w:cs="Trebuchet MS"/>
-          <w:sz w:val="24"/>
-          <w:szCs w:val="24"/>
-        </w:rPr>
-        <w:t xml:space="preserve">, causing the map to </w:t>
-      </w:r>
-      <w:proofErr w:type="spellStart"/>
-      <w:r>
-        <w:rPr>
-          <w:rFonts w:ascii="Trebuchet MS" w:eastAsia="Trebuchet MS" w:hAnsi="Trebuchet MS" w:cs="Trebuchet MS"/>
-          <w:sz w:val="24"/>
-          <w:szCs w:val="24"/>
-        </w:rPr>
-        <w:t>recentre</w:t>
-      </w:r>
-      <w:proofErr w:type="spellEnd"/>
-      <w:r>
-        <w:rPr>
-          <w:rFonts w:ascii="Trebuchet MS" w:eastAsia="Trebuchet MS" w:hAnsi="Trebuchet MS" w:cs="Trebuchet MS"/>
-          <w:sz w:val="24"/>
-          <w:szCs w:val="24"/>
-        </w:rPr>
-        <w:t xml:space="preserve"> automatically whenever the user's location changed. This was all placed inside a Scaffold with </w:t>
-      </w:r>
-      <w:proofErr w:type="spellStart"/>
-      <w:r>
-        <w:rPr>
-          <w:rFonts w:ascii="Trebuchet MS" w:eastAsia="Trebuchet MS" w:hAnsi="Trebuchet MS" w:cs="Trebuchet MS"/>
-          <w:sz w:val="24"/>
-          <w:szCs w:val="24"/>
-        </w:rPr>
-        <w:t>innerpadding</w:t>
-      </w:r>
-      <w:proofErr w:type="spellEnd"/>
-      <w:r>
-        <w:rPr>
-          <w:rFonts w:ascii="Trebuchet MS" w:eastAsia="Trebuchet MS" w:hAnsi="Trebuchet MS" w:cs="Trebuchet MS"/>
-          <w:sz w:val="24"/>
-          <w:szCs w:val="24"/>
-        </w:rPr>
-        <w:t xml:space="preserve"> to prevent any overlap of the </w:t>
+        <w:t xml:space="preserve">Inside the setContent itself, I will use a mutablestate variable to hold the current LatLng and zoom level, observed the ViewModel's LiveData to keep that state updated, and pass the values into a MapLibre composable via a CameraPosition, causing the map to recentre automatically whenever the user's location changed. This was all placed inside a Scaffold with innerpadding to prevent any overlap of the </w:t>
       </w:r>
       <w:proofErr w:type="gramStart"/>
       <w:r>
@@ -1717,64 +1317,28 @@
           <w:sz w:val="24"/>
           <w:szCs w:val="24"/>
         </w:rPr>
-        <w:t xml:space="preserve">- </w:t>
-      </w:r>
-      <w:proofErr w:type="gramStart"/>
-      <w:r>
-        <w:rPr>
-          <w:rFonts w:ascii="Trebuchet MS" w:hAnsi="Trebuchet MS"/>
+        <w:t>- name;</w:t>
+      </w:r>
+    </w:p>
+    <w:p>
+      <w:pPr>
+        <w:rPr>
           <w:i/>
           <w:iCs/>
           <w:sz w:val="24"/>
           <w:szCs w:val="24"/>
         </w:rPr>
-        <w:t>name;</w:t>
-      </w:r>
-      <w:proofErr w:type="gramEnd"/>
-    </w:p>
-    <w:p>
-      <w:pPr>
-        <w:rPr>
+      </w:pPr>
+      <w:r>
+        <w:rPr>
+          <w:rFonts w:ascii="Trebuchet MS" w:hAnsi="Trebuchet MS"/>
           <w:i/>
           <w:iCs/>
           <w:sz w:val="24"/>
           <w:szCs w:val="24"/>
         </w:rPr>
-      </w:pPr>
-      <w:r>
-        <w:rPr>
-          <w:rFonts w:ascii="Trebuchet MS" w:hAnsi="Trebuchet MS"/>
-          <w:i/>
-          <w:iCs/>
-          <w:sz w:val="24"/>
-          <w:szCs w:val="24"/>
-        </w:rPr>
-        <w:t xml:space="preserve">- type (pub, restaurant, hotel, historical site, </w:t>
-      </w:r>
-      <w:proofErr w:type="spellStart"/>
-      <w:r>
-        <w:rPr>
-          <w:rFonts w:ascii="Trebuchet MS" w:hAnsi="Trebuchet MS"/>
-          <w:i/>
-          <w:iCs/>
-          <w:sz w:val="24"/>
-          <w:szCs w:val="24"/>
-        </w:rPr>
-        <w:t>etc</w:t>
-      </w:r>
-      <w:proofErr w:type="spellEnd"/>
-      <w:proofErr w:type="gramStart"/>
-      <w:r>
-        <w:rPr>
-          <w:rFonts w:ascii="Trebuchet MS" w:hAnsi="Trebuchet MS"/>
-          <w:i/>
-          <w:iCs/>
-          <w:sz w:val="24"/>
-          <w:szCs w:val="24"/>
-        </w:rPr>
-        <w:t>);</w:t>
-      </w:r>
-      <w:proofErr w:type="gramEnd"/>
+        <w:t>- type (pub, restaurant, hotel, historical site, etc);</w:t>
+      </w:r>
     </w:p>
     <w:p>
       <w:pPr>
@@ -2264,76 +1828,23 @@
         </w:drawing>
       </w:r>
       <w:r>
-        <w:t xml:space="preserve">I will finally update the main composable to include the map page and the add poi page using the compose navigation. I will add the </w:t>
-      </w:r>
-      <w:proofErr w:type="spellStart"/>
-      <w:r>
-        <w:t>NavHost</w:t>
-      </w:r>
-      <w:proofErr w:type="spellEnd"/>
-      <w:r>
-        <w:t xml:space="preserve"> which will contain the two routes for the map page and the add poi page. I will then be able to define the callback functions for the </w:t>
-      </w:r>
-      <w:proofErr w:type="spellStart"/>
-      <w:r>
-        <w:t>onPoiAdded</w:t>
-      </w:r>
-      <w:proofErr w:type="spellEnd"/>
-      <w:r>
-        <w:t xml:space="preserve"> and </w:t>
-      </w:r>
-      <w:proofErr w:type="spellStart"/>
-      <w:r>
-        <w:t>onNavigateBack</w:t>
-      </w:r>
-      <w:proofErr w:type="spellEnd"/>
+        <w:t xml:space="preserve">I will finally update the main composable to include the map page and the add poi page using the compose navigation. I will add the NavHost which will contain the two routes for the map page and the add poi page. I will then be able to define the callback functions for the onPoiAdded and onNavigateBack. onPoiAdded will add the new poi to the ViewModel and the onNavigateBack will return the user to the previous page they were on. </w:t>
+      </w:r>
+      <w:r>
+        <w:t xml:space="preserve">I will place a </w:t>
+      </w:r>
+      <w:r>
+        <w:t xml:space="preserve">Symbol marker inside </w:t>
+      </w:r>
+      <w:r>
+        <w:t xml:space="preserve">the </w:t>
+      </w:r>
+      <w:r>
+        <w:t>MapLibre lambda</w:t>
+      </w:r>
       <w:r>
         <w:t xml:space="preserve">. </w:t>
       </w:r>
-      <w:proofErr w:type="spellStart"/>
-      <w:r>
-        <w:t>onPoiAdded</w:t>
-      </w:r>
-      <w:proofErr w:type="spellEnd"/>
-      <w:r>
-        <w:t xml:space="preserve"> will add the new poi to the </w:t>
-      </w:r>
-      <w:proofErr w:type="spellStart"/>
-      <w:r>
-        <w:t>ViewModel</w:t>
-      </w:r>
-      <w:proofErr w:type="spellEnd"/>
-      <w:r>
-        <w:t xml:space="preserve"> and the </w:t>
-      </w:r>
-      <w:proofErr w:type="spellStart"/>
-      <w:r>
-        <w:t>onNavigateBack</w:t>
-      </w:r>
-      <w:proofErr w:type="spellEnd"/>
-      <w:r>
-        <w:t xml:space="preserve"> will return the user to the previous page they were on. </w:t>
-      </w:r>
-      <w:r>
-        <w:t xml:space="preserve">I will place a </w:t>
-      </w:r>
-      <w:r>
-        <w:t xml:space="preserve">Symbol marker inside </w:t>
-      </w:r>
-      <w:r>
-        <w:t xml:space="preserve">the </w:t>
-      </w:r>
-      <w:proofErr w:type="spellStart"/>
-      <w:r>
-        <w:t>MapLibre</w:t>
-      </w:r>
-      <w:proofErr w:type="spellEnd"/>
-      <w:r>
-        <w:t xml:space="preserve"> lambda</w:t>
-      </w:r>
-      <w:r>
-        <w:t xml:space="preserve">. </w:t>
-      </w:r>
       <w:r>
         <w:t xml:space="preserve">The map </w:t>
       </w:r>
@@ -2349,12 +1860,10 @@
       <w:r>
         <w:t xml:space="preserve"> </w:t>
       </w:r>
-      <w:proofErr w:type="spellStart"/>
       <w:proofErr w:type="gramStart"/>
       <w:r>
         <w:t>poisState</w:t>
       </w:r>
-      <w:proofErr w:type="spellEnd"/>
       <w:proofErr w:type="gramEnd"/>
       <w:r>
         <w:t xml:space="preserve"> changes</w:t>
@@ -2363,15 +1872,7 @@
         <w:t>. This will then</w:t>
       </w:r>
       <w:r>
-        <w:t xml:space="preserve"> loop through </w:t>
-      </w:r>
-      <w:proofErr w:type="spellStart"/>
-      <w:r>
-        <w:t>poisState</w:t>
-      </w:r>
-      <w:proofErr w:type="spellEnd"/>
-      <w:r>
-        <w:t xml:space="preserve"> and plac</w:t>
+        <w:t xml:space="preserve"> loop through poisState and plac</w:t>
       </w:r>
       <w:r>
         <w:t>e</w:t>
@@ -3029,7 +2530,6 @@
         </w:rPr>
         <w:t xml:space="preserve">for the database so it can be changed or searched. I plan to make it so that when the database returns all the POIs it contains, it will return it as a </w:t>
       </w:r>
-      <w:proofErr w:type="spellStart"/>
       <w:r>
         <w:rPr>
           <w:rFonts w:ascii="Trebuchet MS" w:hAnsi="Trebuchet MS"/>
@@ -3038,18 +2538,7 @@
           <w:sz w:val="24"/>
           <w:szCs w:val="24"/>
         </w:rPr>
-        <w:t>LiveData</w:t>
-      </w:r>
-      <w:proofErr w:type="spellEnd"/>
-      <w:r>
-        <w:rPr>
-          <w:rFonts w:ascii="Trebuchet MS" w:hAnsi="Trebuchet MS"/>
-          <w:i/>
-          <w:iCs/>
-          <w:sz w:val="24"/>
-          <w:szCs w:val="24"/>
-        </w:rPr>
-        <w:t>&lt;List&lt;Poi&gt;&gt;</w:t>
+        <w:t>LiveData&lt;List&lt;Poi&gt;&gt;</w:t>
       </w:r>
       <w:r>
         <w:rPr>
@@ -3225,7 +2714,6 @@
         </w:rPr>
         <w:t xml:space="preserve">I plan to next create the file for the database itself. This will be placed within an abstract function which allows my other files to access its DAO and all the database operations within it. Inside it I will put a </w:t>
       </w:r>
-      <w:proofErr w:type="spellStart"/>
       <w:proofErr w:type="gramStart"/>
       <w:r>
         <w:rPr>
@@ -3233,16 +2721,7 @@
           <w:sz w:val="24"/>
           <w:szCs w:val="24"/>
         </w:rPr>
-        <w:t>getDatabase</w:t>
-      </w:r>
-      <w:proofErr w:type="spellEnd"/>
-      <w:r>
-        <w:rPr>
-          <w:rFonts w:ascii="Trebuchet MS" w:hAnsi="Trebuchet MS"/>
-          <w:sz w:val="24"/>
-          <w:szCs w:val="24"/>
-        </w:rPr>
-        <w:t>(</w:t>
+        <w:t>getDatabase(</w:t>
       </w:r>
       <w:proofErr w:type="gramEnd"/>
       <w:r>
@@ -3348,51 +2827,15 @@
           <w:sz w:val="24"/>
           <w:szCs w:val="24"/>
         </w:rPr>
-        <w:t xml:space="preserve">I will next update my </w:t>
-      </w:r>
-      <w:proofErr w:type="spellStart"/>
-      <w:r>
-        <w:rPr>
-          <w:rFonts w:ascii="Trebuchet MS" w:hAnsi="Trebuchet MS"/>
-          <w:sz w:val="24"/>
-          <w:szCs w:val="24"/>
-        </w:rPr>
-        <w:t>Viewmodel</w:t>
-      </w:r>
-      <w:proofErr w:type="spellEnd"/>
-      <w:r>
-        <w:rPr>
-          <w:rFonts w:ascii="Trebuchet MS" w:hAnsi="Trebuchet MS"/>
-          <w:sz w:val="24"/>
-          <w:szCs w:val="24"/>
-        </w:rPr>
-        <w:t xml:space="preserve">. </w:t>
-      </w:r>
-      <w:r>
-        <w:rPr>
-          <w:rFonts w:ascii="Trebuchet MS" w:hAnsi="Trebuchet MS"/>
-          <w:sz w:val="24"/>
-          <w:szCs w:val="24"/>
-        </w:rPr>
-        <w:t xml:space="preserve">I will first change the </w:t>
-      </w:r>
-      <w:proofErr w:type="spellStart"/>
-      <w:r>
-        <w:rPr>
-          <w:rFonts w:ascii="Trebuchet MS" w:hAnsi="Trebuchet MS"/>
-          <w:sz w:val="24"/>
-          <w:szCs w:val="24"/>
-        </w:rPr>
-        <w:t>ViewModel</w:t>
-      </w:r>
-      <w:proofErr w:type="spellEnd"/>
-      <w:r>
-        <w:rPr>
-          <w:rFonts w:ascii="Trebuchet MS" w:hAnsi="Trebuchet MS"/>
-          <w:sz w:val="24"/>
-          <w:szCs w:val="24"/>
-        </w:rPr>
-        <w:t xml:space="preserve"> for </w:t>
+        <w:t xml:space="preserve">I will next update my Viewmodel. </w:t>
+      </w:r>
+      <w:r>
+        <w:rPr>
+          <w:rFonts w:ascii="Trebuchet MS" w:hAnsi="Trebuchet MS"/>
+          <w:sz w:val="24"/>
+          <w:szCs w:val="24"/>
+        </w:rPr>
+        <w:t xml:space="preserve">I will first change the ViewModel for </w:t>
       </w:r>
       <w:proofErr w:type="gramStart"/>
       <w:r>
@@ -3401,18 +2844,8 @@
           <w:sz w:val="24"/>
           <w:szCs w:val="24"/>
         </w:rPr>
-        <w:t xml:space="preserve">a </w:t>
-      </w:r>
-      <w:proofErr w:type="spellStart"/>
-      <w:r>
-        <w:rPr>
-          <w:rFonts w:ascii="Trebuchet MS" w:hAnsi="Trebuchet MS"/>
-          <w:sz w:val="24"/>
-          <w:szCs w:val="24"/>
-        </w:rPr>
-        <w:t>AndroidViewModel</w:t>
-      </w:r>
-      <w:proofErr w:type="spellEnd"/>
+        <w:t>a AndroidViewModel</w:t>
+      </w:r>
       <w:proofErr w:type="gramEnd"/>
       <w:r>
         <w:rPr>
@@ -3430,77 +2863,13 @@
         </w:rPr>
         <w:t xml:space="preserve">I plan to update the poi variable so that it gathers all the pois from the database as </w:t>
       </w:r>
-      <w:proofErr w:type="spellStart"/>
-      <w:r>
-        <w:rPr>
-          <w:rFonts w:ascii="Trebuchet MS" w:hAnsi="Trebuchet MS"/>
-          <w:sz w:val="24"/>
-          <w:szCs w:val="24"/>
-        </w:rPr>
-        <w:t>LiveData</w:t>
-      </w:r>
-      <w:proofErr w:type="spellEnd"/>
-      <w:r>
-        <w:rPr>
-          <w:rFonts w:ascii="Trebuchet MS" w:hAnsi="Trebuchet MS"/>
-          <w:sz w:val="24"/>
-          <w:szCs w:val="24"/>
-        </w:rPr>
-        <w:t xml:space="preserve"> allowing it to automatically update when a new POI is added. Because of this, I will also need to change the </w:t>
-      </w:r>
-      <w:proofErr w:type="spellStart"/>
-      <w:r>
-        <w:rPr>
-          <w:rFonts w:ascii="Trebuchet MS" w:hAnsi="Trebuchet MS"/>
-          <w:sz w:val="24"/>
-          <w:szCs w:val="24"/>
-        </w:rPr>
-        <w:t>addpoi</w:t>
-      </w:r>
-      <w:proofErr w:type="spellEnd"/>
-      <w:r>
-        <w:rPr>
-          <w:rFonts w:ascii="Trebuchet MS" w:hAnsi="Trebuchet MS"/>
-          <w:sz w:val="24"/>
-          <w:szCs w:val="24"/>
-        </w:rPr>
-        <w:t xml:space="preserve"> function in the </w:t>
-      </w:r>
-      <w:proofErr w:type="spellStart"/>
-      <w:r>
-        <w:rPr>
-          <w:rFonts w:ascii="Trebuchet MS" w:hAnsi="Trebuchet MS"/>
-          <w:sz w:val="24"/>
-          <w:szCs w:val="24"/>
-        </w:rPr>
-        <w:t>Viewmodel</w:t>
-      </w:r>
-      <w:proofErr w:type="spellEnd"/>
-      <w:r>
-        <w:rPr>
-          <w:rFonts w:ascii="Trebuchet MS" w:hAnsi="Trebuchet MS"/>
-          <w:sz w:val="24"/>
-          <w:szCs w:val="24"/>
-        </w:rPr>
-        <w:t xml:space="preserve"> so that it adds the poi to the database instead of list using the </w:t>
-      </w:r>
-      <w:proofErr w:type="spellStart"/>
-      <w:r>
-        <w:rPr>
-          <w:rFonts w:ascii="Trebuchet MS" w:hAnsi="Trebuchet MS"/>
-          <w:sz w:val="24"/>
-          <w:szCs w:val="24"/>
-        </w:rPr>
-        <w:t>poiDao’s</w:t>
-      </w:r>
-      <w:proofErr w:type="spellEnd"/>
-      <w:r>
-        <w:rPr>
-          <w:rFonts w:ascii="Trebuchet MS" w:hAnsi="Trebuchet MS"/>
-          <w:sz w:val="24"/>
-          <w:szCs w:val="24"/>
-        </w:rPr>
-        <w:t xml:space="preserve"> ins</w:t>
+      <w:r>
+        <w:rPr>
+          <w:rFonts w:ascii="Trebuchet MS" w:hAnsi="Trebuchet MS"/>
+          <w:sz w:val="24"/>
+          <w:szCs w:val="24"/>
+        </w:rPr>
+        <w:t>LiveData allowing it to automatically update when a new POI is added. Because of this, I will also need to change the addpoi function in the Viewmodel so that it adds the poi to the database instead of list using the poiDao’s ins</w:t>
       </w:r>
       <w:r>
         <w:rPr>
@@ -3606,25 +2975,7 @@
           <w:sz w:val="24"/>
           <w:szCs w:val="24"/>
         </w:rPr>
-        <w:t xml:space="preserve">I will then update the button for my </w:t>
-      </w:r>
-      <w:proofErr w:type="spellStart"/>
-      <w:r>
-        <w:rPr>
-          <w:rFonts w:ascii="Trebuchet MS" w:hAnsi="Trebuchet MS"/>
-          <w:sz w:val="24"/>
-          <w:szCs w:val="24"/>
-        </w:rPr>
-        <w:t>AddPoiScreen</w:t>
-      </w:r>
-      <w:proofErr w:type="spellEnd"/>
-      <w:r>
-        <w:rPr>
-          <w:rFonts w:ascii="Trebuchet MS" w:hAnsi="Trebuchet MS"/>
-          <w:sz w:val="24"/>
-          <w:szCs w:val="24"/>
-        </w:rPr>
-        <w:t>. I will simply change the Poi structure in the button so that it fits the databases poi structure since the latitude and longitude for the pois in the database are separate variables.</w:t>
+        <w:t>I will then update the button for my AddPoiScreen. I will simply change the Poi structure in the button so that it fits the databases poi structure since the latitude and longitude for the pois in the database are separate variables.</w:t>
       </w:r>
     </w:p>
     <w:p>
@@ -3697,43 +3048,7 @@
           <w:sz w:val="24"/>
           <w:szCs w:val="24"/>
         </w:rPr>
-        <w:t xml:space="preserve">I will then need to change the </w:t>
-      </w:r>
-      <w:proofErr w:type="spellStart"/>
-      <w:r>
-        <w:rPr>
-          <w:rFonts w:ascii="Trebuchet MS" w:hAnsi="Trebuchet MS"/>
-          <w:sz w:val="24"/>
-          <w:szCs w:val="24"/>
-        </w:rPr>
-        <w:t>MainActivity</w:t>
-      </w:r>
-      <w:proofErr w:type="spellEnd"/>
-      <w:r>
-        <w:rPr>
-          <w:rFonts w:ascii="Trebuchet MS" w:hAnsi="Trebuchet MS"/>
-          <w:sz w:val="24"/>
-          <w:szCs w:val="24"/>
-        </w:rPr>
-        <w:t xml:space="preserve"> so that the Poi is converted back into the </w:t>
-      </w:r>
-      <w:proofErr w:type="spellStart"/>
-      <w:r>
-        <w:rPr>
-          <w:rFonts w:ascii="Trebuchet MS" w:hAnsi="Trebuchet MS"/>
-          <w:sz w:val="24"/>
-          <w:szCs w:val="24"/>
-        </w:rPr>
-        <w:t>LatLng</w:t>
-      </w:r>
-      <w:proofErr w:type="spellEnd"/>
-      <w:r>
-        <w:rPr>
-          <w:rFonts w:ascii="Trebuchet MS" w:hAnsi="Trebuchet MS"/>
-          <w:sz w:val="24"/>
-          <w:szCs w:val="24"/>
-        </w:rPr>
-        <w:t xml:space="preserve"> so that the map can properly mark its location.</w:t>
+        <w:t>I will then need to change the MainActivity so that the Poi is converted back into the LatLng so that the map can properly mark its location.</w:t>
       </w:r>
     </w:p>
     <w:p>
@@ -3761,25 +3076,17 @@
         <w:ind w:left="720"/>
       </w:pPr>
       <w:r>
-        <w:t>Just to confirm that this all worked, I added a new poi and checked Android Studios App Inspecter to show my databases contents with which the poi I added had been successfully added to the database.</w:t>
-      </w:r>
-    </w:p>
-    <w:p>
-      <w:pPr>
-        <w:ind w:left="720"/>
-      </w:pPr>
-      <w:r>
         <w:rPr>
           <w:noProof/>
         </w:rPr>
         <w:drawing>
-          <wp:anchor distT="0" distB="0" distL="114300" distR="114300" simplePos="0" relativeHeight="251684864" behindDoc="0" locked="0" layoutInCell="1" allowOverlap="1" wp14:anchorId="071F14F2" wp14:editId="76623772">
+          <wp:anchor distT="0" distB="0" distL="114300" distR="114300" simplePos="0" relativeHeight="251684864" behindDoc="0" locked="0" layoutInCell="1" allowOverlap="1" wp14:anchorId="071F14F2" wp14:editId="3B520E16">
             <wp:simplePos x="0" y="0"/>
             <wp:positionH relativeFrom="margin">
               <wp:align>right</wp:align>
             </wp:positionH>
             <wp:positionV relativeFrom="paragraph">
-              <wp:posOffset>172085</wp:posOffset>
+              <wp:posOffset>632460</wp:posOffset>
             </wp:positionV>
             <wp:extent cx="5943600" cy="470535"/>
             <wp:effectExtent l="0" t="0" r="0" b="5715"/>
@@ -3822,6 +3129,142 @@
           </wp:anchor>
         </w:drawing>
       </w:r>
+      <w:r>
+        <w:t>Just to confirm that this all worked, I added a new poi and checked Android Studios App Inspecter to show my databases contents with which the poi I added had been successfully added to the database.</w:t>
+      </w:r>
+    </w:p>
+    <w:p/>
+    <w:p/>
+    <w:p>
+      <w:pPr>
+        <w:rPr>
+          <w:rFonts w:ascii="Trebuchet MS" w:hAnsi="Trebuchet MS"/>
+          <w:i/>
+          <w:iCs/>
+          <w:color w:val="000000"/>
+          <w:sz w:val="24"/>
+          <w:szCs w:val="24"/>
+        </w:rPr>
+      </w:pPr>
+      <w:r>
+        <w:rPr>
+          <w:rFonts w:ascii="Trebuchet MS" w:hAnsi="Trebuchet MS"/>
+          <w:color w:val="000000"/>
+          <w:sz w:val="24"/>
+          <w:szCs w:val="24"/>
+        </w:rPr>
+        <w:t xml:space="preserve">4. </w:t>
+      </w:r>
+      <w:r>
+        <w:rPr>
+          <w:rFonts w:ascii="Trebuchet MS" w:hAnsi="Trebuchet MS"/>
+          <w:color w:val="000000"/>
+          <w:sz w:val="24"/>
+          <w:szCs w:val="24"/>
+        </w:rPr>
+        <w:t>“</w:t>
+      </w:r>
+      <w:r>
+        <w:rPr>
+          <w:rFonts w:ascii="Trebuchet MS" w:hAnsi="Trebuchet MS"/>
+          <w:i/>
+          <w:iCs/>
+          <w:color w:val="000000"/>
+          <w:sz w:val="24"/>
+          <w:szCs w:val="24"/>
+        </w:rPr>
+        <w:t xml:space="preserve">A user should be able to load all existing points of interest from a local SQLite database. These should be displayed on the map as either markers (symbols) or circles. </w:t>
+      </w:r>
+      <w:r>
+        <w:rPr>
+          <w:rFonts w:ascii="Trebuchet MS" w:hAnsi="Trebuchet MS"/>
+          <w:i/>
+          <w:iCs/>
+          <w:color w:val="000000"/>
+          <w:sz w:val="24"/>
+          <w:szCs w:val="24"/>
+          <w:u w:val="single"/>
+        </w:rPr>
+        <w:t>When a user clicks on the marker a dialog box should appear containing details of the point of interest</w:t>
+      </w:r>
+      <w:r>
+        <w:rPr>
+          <w:rFonts w:ascii="Trebuchet MS" w:hAnsi="Trebuchet MS"/>
+          <w:i/>
+          <w:iCs/>
+          <w:color w:val="000000"/>
+          <w:sz w:val="24"/>
+          <w:szCs w:val="24"/>
+        </w:rPr>
+        <w:t>.</w:t>
+      </w:r>
+      <w:r>
+        <w:rPr>
+          <w:rFonts w:ascii="Trebuchet MS" w:hAnsi="Trebuchet MS"/>
+          <w:i/>
+          <w:iCs/>
+          <w:color w:val="000000"/>
+          <w:sz w:val="24"/>
+          <w:szCs w:val="24"/>
+        </w:rPr>
+        <w:t>”</w:t>
+      </w:r>
+    </w:p>
+    <w:p>
+      <w:pPr>
+        <w:rPr>
+          <w:rFonts w:ascii="Trebuchet MS" w:hAnsi="Trebuchet MS"/>
+          <w:i/>
+          <w:iCs/>
+          <w:color w:val="000000"/>
+          <w:sz w:val="24"/>
+          <w:szCs w:val="24"/>
+        </w:rPr>
+      </w:pPr>
+    </w:p>
+    <w:p>
+      <w:pPr>
+        <w:ind w:left="720"/>
+        <w:rPr>
+          <w:sz w:val="24"/>
+          <w:szCs w:val="24"/>
+        </w:rPr>
+      </w:pPr>
+      <w:r>
+        <w:rPr>
+          <w:rFonts w:ascii="Trebuchet MS" w:hAnsi="Trebuchet MS"/>
+          <w:color w:val="000000"/>
+          <w:sz w:val="24"/>
+          <w:szCs w:val="24"/>
+        </w:rPr>
+        <w:t xml:space="preserve">I have already set up the loading process for the POIs for task 3. This is done on </w:t>
+      </w:r>
+      <w:proofErr w:type="gramStart"/>
+      <w:r>
+        <w:rPr>
+          <w:rFonts w:ascii="Trebuchet MS" w:hAnsi="Trebuchet MS"/>
+          <w:color w:val="000000"/>
+          <w:sz w:val="24"/>
+          <w:szCs w:val="24"/>
+        </w:rPr>
+        <w:t>startup and</w:t>
+      </w:r>
+      <w:proofErr w:type="gramEnd"/>
+      <w:r>
+        <w:rPr>
+          <w:rFonts w:ascii="Trebuchet MS" w:hAnsi="Trebuchet MS"/>
+          <w:color w:val="000000"/>
+          <w:sz w:val="24"/>
+          <w:szCs w:val="24"/>
+        </w:rPr>
+        <w:t xml:space="preserve"> whenever the database is updated. This makes sure that all data on the system is always up to date with the database.</w:t>
+      </w:r>
+    </w:p>
+    <w:p/>
+    <w:p>
+      <w:pPr>
+        <w:ind w:left="720"/>
+      </w:pPr>
     </w:p>
     <w:sectPr>
       <w:pgSz w:w="12240" w:h="15840"/>

</xml_diff>

<commit_message>
Updated report for task 4
</commit_message>
<xml_diff>
--- a/MAD_Report.docx
+++ b/MAD_Report.docx
@@ -375,7 +375,7 @@
         </w:rPr>
         <w:t xml:space="preserve">I will first start with this task by setting up the dependencies in my </w:t>
       </w:r>
-      <w:proofErr w:type="gramStart"/>
+      <w:proofErr w:type="spellStart"/>
       <w:r>
         <w:rPr>
           <w:rFonts w:ascii="Trebuchet MS" w:eastAsia="Trebuchet MS" w:hAnsi="Trebuchet MS" w:cs="Trebuchet MS"/>
@@ -384,7 +384,7 @@
         </w:rPr>
         <w:t>build.gradle</w:t>
       </w:r>
-      <w:proofErr w:type="gramEnd"/>
+      <w:proofErr w:type="spellEnd"/>
       <w:r>
         <w:rPr>
           <w:rFonts w:ascii="Trebuchet MS" w:eastAsia="Trebuchet MS" w:hAnsi="Trebuchet MS" w:cs="Trebuchet MS"/>
@@ -393,23 +393,41 @@
         </w:rPr>
         <w:t xml:space="preserve"> and </w:t>
       </w:r>
-      <w:proofErr w:type="gramStart"/>
-      <w:r>
-        <w:rPr>
-          <w:rFonts w:ascii="Trebuchet MS" w:eastAsia="Trebuchet MS" w:hAnsi="Trebuchet MS" w:cs="Trebuchet MS"/>
-          <w:sz w:val="24"/>
-          <w:szCs w:val="24"/>
-        </w:rPr>
-        <w:t>libs.versions</w:t>
-      </w:r>
-      <w:proofErr w:type="gramEnd"/>
-      <w:r>
-        <w:rPr>
-          <w:rFonts w:ascii="Trebuchet MS" w:eastAsia="Trebuchet MS" w:hAnsi="Trebuchet MS" w:cs="Trebuchet MS"/>
-          <w:sz w:val="24"/>
-          <w:szCs w:val="24"/>
-        </w:rPr>
-        <w:t>.toml files. I will add MapLibre with Vulkan support, the Ramani Maps Compose wrapper, and the standard AndroidX libraries needed for Compose.</w:t>
+      <w:proofErr w:type="spellStart"/>
+      <w:r>
+        <w:rPr>
+          <w:rFonts w:ascii="Trebuchet MS" w:eastAsia="Trebuchet MS" w:hAnsi="Trebuchet MS" w:cs="Trebuchet MS"/>
+          <w:sz w:val="24"/>
+          <w:szCs w:val="24"/>
+        </w:rPr>
+        <w:t>libs.versions.toml</w:t>
+      </w:r>
+      <w:proofErr w:type="spellEnd"/>
+      <w:r>
+        <w:rPr>
+          <w:rFonts w:ascii="Trebuchet MS" w:eastAsia="Trebuchet MS" w:hAnsi="Trebuchet MS" w:cs="Trebuchet MS"/>
+          <w:sz w:val="24"/>
+          <w:szCs w:val="24"/>
+        </w:rPr>
+        <w:t xml:space="preserve"> files. I will add </w:t>
+      </w:r>
+      <w:proofErr w:type="spellStart"/>
+      <w:r>
+        <w:rPr>
+          <w:rFonts w:ascii="Trebuchet MS" w:eastAsia="Trebuchet MS" w:hAnsi="Trebuchet MS" w:cs="Trebuchet MS"/>
+          <w:sz w:val="24"/>
+          <w:szCs w:val="24"/>
+        </w:rPr>
+        <w:t>MapLibre</w:t>
+      </w:r>
+      <w:proofErr w:type="spellEnd"/>
+      <w:r>
+        <w:rPr>
+          <w:rFonts w:ascii="Trebuchet MS" w:eastAsia="Trebuchet MS" w:hAnsi="Trebuchet MS" w:cs="Trebuchet MS"/>
+          <w:sz w:val="24"/>
+          <w:szCs w:val="24"/>
+        </w:rPr>
+        <w:t xml:space="preserve"> with Vulkan support, the Ramani Maps Compose wrapper, and the standard AndroidX libraries needed for Compose.</w:t>
       </w:r>
       <w:r>
         <w:rPr>
@@ -542,7 +560,25 @@
           <w:sz w:val="24"/>
           <w:szCs w:val="24"/>
         </w:rPr>
-        <w:t>Then in the AndroidManifest.xml, I will set up the ACCESS_FINE_LOCATION and ACCESS_COARSE_LOCATION permissions, as well as INTERNET, since the map tiles will be gathered remotely from OpenFreeMap.</w:t>
+        <w:t xml:space="preserve">Then in the AndroidManifest.xml, I will set up the ACCESS_FINE_LOCATION and ACCESS_COARSE_LOCATION permissions, as well as INTERNET, since the map tiles will be gathered remotely from </w:t>
+      </w:r>
+      <w:proofErr w:type="spellStart"/>
+      <w:r>
+        <w:rPr>
+          <w:rFonts w:ascii="Trebuchet MS" w:eastAsia="Trebuchet MS" w:hAnsi="Trebuchet MS" w:cs="Trebuchet MS"/>
+          <w:sz w:val="24"/>
+          <w:szCs w:val="24"/>
+        </w:rPr>
+        <w:t>OpenFreeMap</w:t>
+      </w:r>
+      <w:proofErr w:type="spellEnd"/>
+      <w:r>
+        <w:rPr>
+          <w:rFonts w:ascii="Trebuchet MS" w:eastAsia="Trebuchet MS" w:hAnsi="Trebuchet MS" w:cs="Trebuchet MS"/>
+          <w:sz w:val="24"/>
+          <w:szCs w:val="24"/>
+        </w:rPr>
+        <w:t>.</w:t>
       </w:r>
       <w:r>
         <w:rPr>
@@ -688,7 +724,43 @@
           <w:sz w:val="24"/>
           <w:szCs w:val="24"/>
         </w:rPr>
-        <w:t xml:space="preserve">To manage the location state in both the activity and UI, I will need to add a LatLngViewModel class that will hold a latLng property backed by a MutableLiveData object. </w:t>
+        <w:t xml:space="preserve">To manage the location state in both the activity and UI, I will need to add a </w:t>
+      </w:r>
+      <w:proofErr w:type="spellStart"/>
+      <w:r>
+        <w:rPr>
+          <w:rFonts w:ascii="Trebuchet MS" w:eastAsia="Trebuchet MS" w:hAnsi="Trebuchet MS" w:cs="Trebuchet MS"/>
+          <w:sz w:val="24"/>
+          <w:szCs w:val="24"/>
+        </w:rPr>
+        <w:t>LatLngViewModel</w:t>
+      </w:r>
+      <w:proofErr w:type="spellEnd"/>
+      <w:r>
+        <w:rPr>
+          <w:rFonts w:ascii="Trebuchet MS" w:eastAsia="Trebuchet MS" w:hAnsi="Trebuchet MS" w:cs="Trebuchet MS"/>
+          <w:sz w:val="24"/>
+          <w:szCs w:val="24"/>
+        </w:rPr>
+        <w:t xml:space="preserve"> class that will hold a </w:t>
+      </w:r>
+      <w:proofErr w:type="spellStart"/>
+      <w:r>
+        <w:rPr>
+          <w:rFonts w:ascii="Trebuchet MS" w:eastAsia="Trebuchet MS" w:hAnsi="Trebuchet MS" w:cs="Trebuchet MS"/>
+          <w:sz w:val="24"/>
+          <w:szCs w:val="24"/>
+        </w:rPr>
+        <w:t>latLng</w:t>
+      </w:r>
+      <w:proofErr w:type="spellEnd"/>
+      <w:r>
+        <w:rPr>
+          <w:rFonts w:ascii="Trebuchet MS" w:eastAsia="Trebuchet MS" w:hAnsi="Trebuchet MS" w:cs="Trebuchet MS"/>
+          <w:sz w:val="24"/>
+          <w:szCs w:val="24"/>
+        </w:rPr>
+        <w:t xml:space="preserve"> property backed by a MutableLiveData object. </w:t>
       </w:r>
     </w:p>
     <w:p>
@@ -715,7 +787,43 @@
           <w:szCs w:val="24"/>
         </w:rPr>
         <w:lastRenderedPageBreak/>
-        <w:t xml:space="preserve">Whenever the latLng is updated, i.e. the user's location changes, it should automatically push the new value to latLngLiveData, making it observable from the UI layer.  </w:t>
+        <w:t xml:space="preserve">Whenever the </w:t>
+      </w:r>
+      <w:proofErr w:type="spellStart"/>
+      <w:r>
+        <w:rPr>
+          <w:rFonts w:ascii="Trebuchet MS" w:eastAsia="Trebuchet MS" w:hAnsi="Trebuchet MS" w:cs="Trebuchet MS"/>
+          <w:sz w:val="24"/>
+          <w:szCs w:val="24"/>
+        </w:rPr>
+        <w:t>latLng</w:t>
+      </w:r>
+      <w:proofErr w:type="spellEnd"/>
+      <w:r>
+        <w:rPr>
+          <w:rFonts w:ascii="Trebuchet MS" w:eastAsia="Trebuchet MS" w:hAnsi="Trebuchet MS" w:cs="Trebuchet MS"/>
+          <w:sz w:val="24"/>
+          <w:szCs w:val="24"/>
+        </w:rPr>
+        <w:t xml:space="preserve"> is updated, i.e. the user's location changes, it should automatically push the new value to </w:t>
+      </w:r>
+      <w:proofErr w:type="spellStart"/>
+      <w:r>
+        <w:rPr>
+          <w:rFonts w:ascii="Trebuchet MS" w:eastAsia="Trebuchet MS" w:hAnsi="Trebuchet MS" w:cs="Trebuchet MS"/>
+          <w:sz w:val="24"/>
+          <w:szCs w:val="24"/>
+        </w:rPr>
+        <w:t>latLngLiveData</w:t>
+      </w:r>
+      <w:proofErr w:type="spellEnd"/>
+      <w:r>
+        <w:rPr>
+          <w:rFonts w:ascii="Trebuchet MS" w:eastAsia="Trebuchet MS" w:hAnsi="Trebuchet MS" w:cs="Trebuchet MS"/>
+          <w:sz w:val="24"/>
+          <w:szCs w:val="24"/>
+        </w:rPr>
+        <w:t xml:space="preserve">, making it observable from the UI layer.  </w:t>
       </w:r>
     </w:p>
     <w:p>
@@ -807,7 +915,79 @@
           <w:sz w:val="24"/>
           <w:szCs w:val="24"/>
         </w:rPr>
-        <w:t>In the MainActivity, I will add the LocationListener interface. This will allow me to override the onLocationChanged function, where I will update the ViewModel's latLng with the current coordinates gathered by the device itself.</w:t>
+        <w:t xml:space="preserve">In the MainActivity, I will add the </w:t>
+      </w:r>
+      <w:proofErr w:type="spellStart"/>
+      <w:r>
+        <w:rPr>
+          <w:rFonts w:ascii="Trebuchet MS" w:eastAsia="Trebuchet MS" w:hAnsi="Trebuchet MS" w:cs="Trebuchet MS"/>
+          <w:sz w:val="24"/>
+          <w:szCs w:val="24"/>
+        </w:rPr>
+        <w:t>LocationListener</w:t>
+      </w:r>
+      <w:proofErr w:type="spellEnd"/>
+      <w:r>
+        <w:rPr>
+          <w:rFonts w:ascii="Trebuchet MS" w:eastAsia="Trebuchet MS" w:hAnsi="Trebuchet MS" w:cs="Trebuchet MS"/>
+          <w:sz w:val="24"/>
+          <w:szCs w:val="24"/>
+        </w:rPr>
+        <w:t xml:space="preserve"> interface. This will allow me to override the </w:t>
+      </w:r>
+      <w:proofErr w:type="spellStart"/>
+      <w:r>
+        <w:rPr>
+          <w:rFonts w:ascii="Trebuchet MS" w:eastAsia="Trebuchet MS" w:hAnsi="Trebuchet MS" w:cs="Trebuchet MS"/>
+          <w:sz w:val="24"/>
+          <w:szCs w:val="24"/>
+        </w:rPr>
+        <w:t>onLocationChanged</w:t>
+      </w:r>
+      <w:proofErr w:type="spellEnd"/>
+      <w:r>
+        <w:rPr>
+          <w:rFonts w:ascii="Trebuchet MS" w:eastAsia="Trebuchet MS" w:hAnsi="Trebuchet MS" w:cs="Trebuchet MS"/>
+          <w:sz w:val="24"/>
+          <w:szCs w:val="24"/>
+        </w:rPr>
+        <w:t xml:space="preserve"> function, where I will update the </w:t>
+      </w:r>
+      <w:proofErr w:type="spellStart"/>
+      <w:r>
+        <w:rPr>
+          <w:rFonts w:ascii="Trebuchet MS" w:eastAsia="Trebuchet MS" w:hAnsi="Trebuchet MS" w:cs="Trebuchet MS"/>
+          <w:sz w:val="24"/>
+          <w:szCs w:val="24"/>
+        </w:rPr>
+        <w:t>ViewModel's</w:t>
+      </w:r>
+      <w:proofErr w:type="spellEnd"/>
+      <w:r>
+        <w:rPr>
+          <w:rFonts w:ascii="Trebuchet MS" w:eastAsia="Trebuchet MS" w:hAnsi="Trebuchet MS" w:cs="Trebuchet MS"/>
+          <w:sz w:val="24"/>
+          <w:szCs w:val="24"/>
+        </w:rPr>
+        <w:t xml:space="preserve"> </w:t>
+      </w:r>
+      <w:proofErr w:type="spellStart"/>
+      <w:r>
+        <w:rPr>
+          <w:rFonts w:ascii="Trebuchet MS" w:eastAsia="Trebuchet MS" w:hAnsi="Trebuchet MS" w:cs="Trebuchet MS"/>
+          <w:sz w:val="24"/>
+          <w:szCs w:val="24"/>
+        </w:rPr>
+        <w:t>latLng</w:t>
+      </w:r>
+      <w:proofErr w:type="spellEnd"/>
+      <w:r>
+        <w:rPr>
+          <w:rFonts w:ascii="Trebuchet MS" w:eastAsia="Trebuchet MS" w:hAnsi="Trebuchet MS" w:cs="Trebuchet MS"/>
+          <w:sz w:val="24"/>
+          <w:szCs w:val="24"/>
+        </w:rPr>
+        <w:t xml:space="preserve"> with the current coordinates gathered by the device itself.</w:t>
       </w:r>
       <w:r>
         <w:rPr>
@@ -947,7 +1127,61 @@
           <w:sz w:val="24"/>
           <w:szCs w:val="24"/>
         </w:rPr>
-        <w:t>To start receiving GPS updates, I will create a GPS function that will retrieve the LocationManager system service and call requestLocationUpdates, which I will set to update every 2 seconds or after 5 metres of movement. This will keep the GPS accurate without slowing the machine down too much.</w:t>
+        <w:t xml:space="preserve">To start receiving GPS updates, I will create a GPS function that will retrieve the </w:t>
+      </w:r>
+      <w:proofErr w:type="spellStart"/>
+      <w:r>
+        <w:rPr>
+          <w:rFonts w:ascii="Trebuchet MS" w:eastAsia="Trebuchet MS" w:hAnsi="Trebuchet MS" w:cs="Trebuchet MS"/>
+          <w:sz w:val="24"/>
+          <w:szCs w:val="24"/>
+        </w:rPr>
+        <w:t>LocationManager</w:t>
+      </w:r>
+      <w:proofErr w:type="spellEnd"/>
+      <w:r>
+        <w:rPr>
+          <w:rFonts w:ascii="Trebuchet MS" w:eastAsia="Trebuchet MS" w:hAnsi="Trebuchet MS" w:cs="Trebuchet MS"/>
+          <w:sz w:val="24"/>
+          <w:szCs w:val="24"/>
+        </w:rPr>
+        <w:t xml:space="preserve"> system service and call </w:t>
+      </w:r>
+      <w:proofErr w:type="spellStart"/>
+      <w:r>
+        <w:rPr>
+          <w:rFonts w:ascii="Trebuchet MS" w:eastAsia="Trebuchet MS" w:hAnsi="Trebuchet MS" w:cs="Trebuchet MS"/>
+          <w:sz w:val="24"/>
+          <w:szCs w:val="24"/>
+        </w:rPr>
+        <w:t>requestLocationUpdates</w:t>
+      </w:r>
+      <w:proofErr w:type="spellEnd"/>
+      <w:r>
+        <w:rPr>
+          <w:rFonts w:ascii="Trebuchet MS" w:eastAsia="Trebuchet MS" w:hAnsi="Trebuchet MS" w:cs="Trebuchet MS"/>
+          <w:sz w:val="24"/>
+          <w:szCs w:val="24"/>
+        </w:rPr>
+        <w:t xml:space="preserve">, which I will set to update every 2 seconds or after 5 </w:t>
+      </w:r>
+      <w:proofErr w:type="spellStart"/>
+      <w:r>
+        <w:rPr>
+          <w:rFonts w:ascii="Trebuchet MS" w:eastAsia="Trebuchet MS" w:hAnsi="Trebuchet MS" w:cs="Trebuchet MS"/>
+          <w:sz w:val="24"/>
+          <w:szCs w:val="24"/>
+        </w:rPr>
+        <w:t>metres</w:t>
+      </w:r>
+      <w:proofErr w:type="spellEnd"/>
+      <w:r>
+        <w:rPr>
+          <w:rFonts w:ascii="Trebuchet MS" w:eastAsia="Trebuchet MS" w:hAnsi="Trebuchet MS" w:cs="Trebuchet MS"/>
+          <w:sz w:val="24"/>
+          <w:szCs w:val="24"/>
+        </w:rPr>
+        <w:t xml:space="preserve"> of movement. This will keep the GPS accurate without slowing the machine down too much.</w:t>
       </w:r>
       <w:r>
         <w:rPr>
@@ -1072,23 +1306,23 @@
         </w:rPr>
         <w:t xml:space="preserve">I will also write a </w:t>
       </w:r>
-      <w:proofErr w:type="gramStart"/>
-      <w:r>
-        <w:rPr>
-          <w:rFonts w:ascii="Trebuchet MS" w:eastAsia="Trebuchet MS" w:hAnsi="Trebuchet MS" w:cs="Trebuchet MS"/>
-          <w:sz w:val="24"/>
-          <w:szCs w:val="24"/>
-        </w:rPr>
-        <w:t>checkPermissions function</w:t>
-      </w:r>
-      <w:proofErr w:type="gramEnd"/>
-      <w:r>
-        <w:rPr>
-          <w:rFonts w:ascii="Trebuchet MS" w:eastAsia="Trebuchet MS" w:hAnsi="Trebuchet MS" w:cs="Trebuchet MS"/>
-          <w:sz w:val="24"/>
-          <w:szCs w:val="24"/>
-        </w:rPr>
-        <w:t xml:space="preserve"> that will check whether the location permission has already been granted. If they haven’t, then it will launch a permission request. This will make sure that the GPS function is only called if the user approves the use of their location. A Toast message was shown if they denied it.</w:t>
+      <w:proofErr w:type="spellStart"/>
+      <w:r>
+        <w:rPr>
+          <w:rFonts w:ascii="Trebuchet MS" w:eastAsia="Trebuchet MS" w:hAnsi="Trebuchet MS" w:cs="Trebuchet MS"/>
+          <w:sz w:val="24"/>
+          <w:szCs w:val="24"/>
+        </w:rPr>
+        <w:t>checkPermissions</w:t>
+      </w:r>
+      <w:proofErr w:type="spellEnd"/>
+      <w:r>
+        <w:rPr>
+          <w:rFonts w:ascii="Trebuchet MS" w:eastAsia="Trebuchet MS" w:hAnsi="Trebuchet MS" w:cs="Trebuchet MS"/>
+          <w:sz w:val="24"/>
+          <w:szCs w:val="24"/>
+        </w:rPr>
+        <w:t xml:space="preserve"> function that will check whether the location permission has already been granted. If they haven’t, then it will launch a permission request. This will make sure that the GPS function is only called if the user approves the use of their location. A Toast message was shown if they denied it.</w:t>
       </w:r>
     </w:p>
     <w:p>
@@ -1219,25 +1453,151 @@
           <w:sz w:val="24"/>
           <w:szCs w:val="24"/>
         </w:rPr>
-        <w:t xml:space="preserve">Inside the setContent itself, I will use a mutablestate variable to hold the current LatLng and zoom level, observed the ViewModel's LiveData to keep that state updated, and pass the values into a MapLibre composable via a CameraPosition, causing the map to recentre automatically whenever the user's location changed. This was all placed inside a Scaffold with innerpadding to prevent any overlap of the </w:t>
-      </w:r>
-      <w:proofErr w:type="gramStart"/>
-      <w:r>
-        <w:rPr>
-          <w:rFonts w:ascii="Trebuchet MS" w:eastAsia="Trebuchet MS" w:hAnsi="Trebuchet MS" w:cs="Trebuchet MS"/>
-          <w:sz w:val="24"/>
-          <w:szCs w:val="24"/>
-        </w:rPr>
-        <w:t>devices</w:t>
-      </w:r>
-      <w:proofErr w:type="gramEnd"/>
-      <w:r>
-        <w:rPr>
-          <w:rFonts w:ascii="Trebuchet MS" w:eastAsia="Trebuchet MS" w:hAnsi="Trebuchet MS" w:cs="Trebuchet MS"/>
-          <w:sz w:val="24"/>
-          <w:szCs w:val="24"/>
-        </w:rPr>
-        <w:t xml:space="preserve"> interfaces with the application itself.</w:t>
+        <w:t xml:space="preserve">Inside the </w:t>
+      </w:r>
+      <w:proofErr w:type="spellStart"/>
+      <w:r>
+        <w:rPr>
+          <w:rFonts w:ascii="Trebuchet MS" w:eastAsia="Trebuchet MS" w:hAnsi="Trebuchet MS" w:cs="Trebuchet MS"/>
+          <w:sz w:val="24"/>
+          <w:szCs w:val="24"/>
+        </w:rPr>
+        <w:t>setContent</w:t>
+      </w:r>
+      <w:proofErr w:type="spellEnd"/>
+      <w:r>
+        <w:rPr>
+          <w:rFonts w:ascii="Trebuchet MS" w:eastAsia="Trebuchet MS" w:hAnsi="Trebuchet MS" w:cs="Trebuchet MS"/>
+          <w:sz w:val="24"/>
+          <w:szCs w:val="24"/>
+        </w:rPr>
+        <w:t xml:space="preserve"> itself, I will use a </w:t>
+      </w:r>
+      <w:proofErr w:type="spellStart"/>
+      <w:r>
+        <w:rPr>
+          <w:rFonts w:ascii="Trebuchet MS" w:eastAsia="Trebuchet MS" w:hAnsi="Trebuchet MS" w:cs="Trebuchet MS"/>
+          <w:sz w:val="24"/>
+          <w:szCs w:val="24"/>
+        </w:rPr>
+        <w:t>mutablestate</w:t>
+      </w:r>
+      <w:proofErr w:type="spellEnd"/>
+      <w:r>
+        <w:rPr>
+          <w:rFonts w:ascii="Trebuchet MS" w:eastAsia="Trebuchet MS" w:hAnsi="Trebuchet MS" w:cs="Trebuchet MS"/>
+          <w:sz w:val="24"/>
+          <w:szCs w:val="24"/>
+        </w:rPr>
+        <w:t xml:space="preserve"> variable to hold the current LatLng and zoom level, observed the </w:t>
+      </w:r>
+      <w:proofErr w:type="spellStart"/>
+      <w:r>
+        <w:rPr>
+          <w:rFonts w:ascii="Trebuchet MS" w:eastAsia="Trebuchet MS" w:hAnsi="Trebuchet MS" w:cs="Trebuchet MS"/>
+          <w:sz w:val="24"/>
+          <w:szCs w:val="24"/>
+        </w:rPr>
+        <w:t>ViewModel's</w:t>
+      </w:r>
+      <w:proofErr w:type="spellEnd"/>
+      <w:r>
+        <w:rPr>
+          <w:rFonts w:ascii="Trebuchet MS" w:eastAsia="Trebuchet MS" w:hAnsi="Trebuchet MS" w:cs="Trebuchet MS"/>
+          <w:sz w:val="24"/>
+          <w:szCs w:val="24"/>
+        </w:rPr>
+        <w:t xml:space="preserve"> </w:t>
+      </w:r>
+      <w:proofErr w:type="spellStart"/>
+      <w:r>
+        <w:rPr>
+          <w:rFonts w:ascii="Trebuchet MS" w:eastAsia="Trebuchet MS" w:hAnsi="Trebuchet MS" w:cs="Trebuchet MS"/>
+          <w:sz w:val="24"/>
+          <w:szCs w:val="24"/>
+        </w:rPr>
+        <w:t>LiveData</w:t>
+      </w:r>
+      <w:proofErr w:type="spellEnd"/>
+      <w:r>
+        <w:rPr>
+          <w:rFonts w:ascii="Trebuchet MS" w:eastAsia="Trebuchet MS" w:hAnsi="Trebuchet MS" w:cs="Trebuchet MS"/>
+          <w:sz w:val="24"/>
+          <w:szCs w:val="24"/>
+        </w:rPr>
+        <w:t xml:space="preserve"> to keep that state updated, and pass the values into a </w:t>
+      </w:r>
+      <w:proofErr w:type="spellStart"/>
+      <w:r>
+        <w:rPr>
+          <w:rFonts w:ascii="Trebuchet MS" w:eastAsia="Trebuchet MS" w:hAnsi="Trebuchet MS" w:cs="Trebuchet MS"/>
+          <w:sz w:val="24"/>
+          <w:szCs w:val="24"/>
+        </w:rPr>
+        <w:t>MapLibre</w:t>
+      </w:r>
+      <w:proofErr w:type="spellEnd"/>
+      <w:r>
+        <w:rPr>
+          <w:rFonts w:ascii="Trebuchet MS" w:eastAsia="Trebuchet MS" w:hAnsi="Trebuchet MS" w:cs="Trebuchet MS"/>
+          <w:sz w:val="24"/>
+          <w:szCs w:val="24"/>
+        </w:rPr>
+        <w:t xml:space="preserve"> composable via a </w:t>
+      </w:r>
+      <w:proofErr w:type="spellStart"/>
+      <w:r>
+        <w:rPr>
+          <w:rFonts w:ascii="Trebuchet MS" w:eastAsia="Trebuchet MS" w:hAnsi="Trebuchet MS" w:cs="Trebuchet MS"/>
+          <w:sz w:val="24"/>
+          <w:szCs w:val="24"/>
+        </w:rPr>
+        <w:t>CameraPosition</w:t>
+      </w:r>
+      <w:proofErr w:type="spellEnd"/>
+      <w:r>
+        <w:rPr>
+          <w:rFonts w:ascii="Trebuchet MS" w:eastAsia="Trebuchet MS" w:hAnsi="Trebuchet MS" w:cs="Trebuchet MS"/>
+          <w:sz w:val="24"/>
+          <w:szCs w:val="24"/>
+        </w:rPr>
+        <w:t xml:space="preserve">, causing the map to </w:t>
+      </w:r>
+      <w:proofErr w:type="spellStart"/>
+      <w:r>
+        <w:rPr>
+          <w:rFonts w:ascii="Trebuchet MS" w:eastAsia="Trebuchet MS" w:hAnsi="Trebuchet MS" w:cs="Trebuchet MS"/>
+          <w:sz w:val="24"/>
+          <w:szCs w:val="24"/>
+        </w:rPr>
+        <w:t>recentre</w:t>
+      </w:r>
+      <w:proofErr w:type="spellEnd"/>
+      <w:r>
+        <w:rPr>
+          <w:rFonts w:ascii="Trebuchet MS" w:eastAsia="Trebuchet MS" w:hAnsi="Trebuchet MS" w:cs="Trebuchet MS"/>
+          <w:sz w:val="24"/>
+          <w:szCs w:val="24"/>
+        </w:rPr>
+        <w:t xml:space="preserve"> automatically whenever the user's location changed. This was all placed inside a Scaffold with </w:t>
+      </w:r>
+      <w:proofErr w:type="spellStart"/>
+      <w:r>
+        <w:rPr>
+          <w:rFonts w:ascii="Trebuchet MS" w:eastAsia="Trebuchet MS" w:hAnsi="Trebuchet MS" w:cs="Trebuchet MS"/>
+          <w:sz w:val="24"/>
+          <w:szCs w:val="24"/>
+        </w:rPr>
+        <w:t>innerpadding</w:t>
+      </w:r>
+      <w:proofErr w:type="spellEnd"/>
+      <w:r>
+        <w:rPr>
+          <w:rFonts w:ascii="Trebuchet MS" w:eastAsia="Trebuchet MS" w:hAnsi="Trebuchet MS" w:cs="Trebuchet MS"/>
+          <w:sz w:val="24"/>
+          <w:szCs w:val="24"/>
+        </w:rPr>
+        <w:t xml:space="preserve"> to prevent any overlap of the devices interfaces with the application itself.</w:t>
       </w:r>
     </w:p>
     <w:p>
@@ -1337,7 +1697,29 @@
           <w:sz w:val="24"/>
           <w:szCs w:val="24"/>
         </w:rPr>
-        <w:t>- type (pub, restaurant, hotel, historical site, etc);</w:t>
+        <w:t xml:space="preserve">- type (pub, restaurant, hotel, historical site, </w:t>
+      </w:r>
+      <w:proofErr w:type="spellStart"/>
+      <w:r>
+        <w:rPr>
+          <w:rFonts w:ascii="Trebuchet MS" w:hAnsi="Trebuchet MS"/>
+          <w:i/>
+          <w:iCs/>
+          <w:sz w:val="24"/>
+          <w:szCs w:val="24"/>
+        </w:rPr>
+        <w:t>etc</w:t>
+      </w:r>
+      <w:proofErr w:type="spellEnd"/>
+      <w:r>
+        <w:rPr>
+          <w:rFonts w:ascii="Trebuchet MS" w:hAnsi="Trebuchet MS"/>
+          <w:i/>
+          <w:iCs/>
+          <w:sz w:val="24"/>
+          <w:szCs w:val="24"/>
+        </w:rPr>
+        <w:t>);</w:t>
       </w:r>
     </w:p>
     <w:p>
@@ -1432,31 +1814,7 @@
           <w:sz w:val="24"/>
           <w:szCs w:val="24"/>
         </w:rPr>
-        <w:t xml:space="preserve">For </w:t>
-      </w:r>
-      <w:proofErr w:type="gramStart"/>
-      <w:r>
-        <w:rPr>
-          <w:rFonts w:ascii="Trebuchet MS" w:hAnsi="Trebuchet MS"/>
-          <w:i/>
-          <w:iCs/>
-          <w:color w:val="000000"/>
-          <w:sz w:val="24"/>
-          <w:szCs w:val="24"/>
-        </w:rPr>
-        <w:t>now</w:t>
-      </w:r>
-      <w:proofErr w:type="gramEnd"/>
-      <w:r>
-        <w:rPr>
-          <w:rFonts w:ascii="Trebuchet MS" w:hAnsi="Trebuchet MS"/>
-          <w:i/>
-          <w:iCs/>
-          <w:color w:val="000000"/>
-          <w:sz w:val="24"/>
-          <w:szCs w:val="24"/>
-        </w:rPr>
-        <w:t xml:space="preserve"> you can just use buttons for navigation – there is no need to use an app bar, a navigation bar, or the navigation drawer just yet.</w:t>
+        <w:t>For now you can just use buttons for navigation – there is no need to use an app bar, a navigation bar, or the navigation drawer just yet.</w:t>
       </w:r>
       <w:r>
         <w:rPr>
@@ -1828,7 +2186,55 @@
         </w:drawing>
       </w:r>
       <w:r>
-        <w:t xml:space="preserve">I will finally update the main composable to include the map page and the add poi page using the compose navigation. I will add the NavHost which will contain the two routes for the map page and the add poi page. I will then be able to define the callback functions for the onPoiAdded and onNavigateBack. onPoiAdded will add the new poi to the ViewModel and the onNavigateBack will return the user to the previous page they were on. </w:t>
+        <w:t xml:space="preserve">I will finally update the main composable to include the map page and the add poi page using the compose navigation. I will add the </w:t>
+      </w:r>
+      <w:proofErr w:type="spellStart"/>
+      <w:r>
+        <w:t>NavHost</w:t>
+      </w:r>
+      <w:proofErr w:type="spellEnd"/>
+      <w:r>
+        <w:t xml:space="preserve"> which will contain the two routes for the map page and the add poi page. I will then be able to define the callback functions for the </w:t>
+      </w:r>
+      <w:proofErr w:type="spellStart"/>
+      <w:r>
+        <w:t>onPoiAdded</w:t>
+      </w:r>
+      <w:proofErr w:type="spellEnd"/>
+      <w:r>
+        <w:t xml:space="preserve"> and </w:t>
+      </w:r>
+      <w:proofErr w:type="spellStart"/>
+      <w:r>
+        <w:t>onNavigateBack</w:t>
+      </w:r>
+      <w:proofErr w:type="spellEnd"/>
+      <w:r>
+        <w:t xml:space="preserve">. </w:t>
+      </w:r>
+      <w:proofErr w:type="spellStart"/>
+      <w:r>
+        <w:t>onPoiAdded</w:t>
+      </w:r>
+      <w:proofErr w:type="spellEnd"/>
+      <w:r>
+        <w:t xml:space="preserve"> will add the new poi to the </w:t>
+      </w:r>
+      <w:proofErr w:type="spellStart"/>
+      <w:r>
+        <w:t>ViewModel</w:t>
+      </w:r>
+      <w:proofErr w:type="spellEnd"/>
+      <w:r>
+        <w:t xml:space="preserve"> and the </w:t>
+      </w:r>
+      <w:proofErr w:type="spellStart"/>
+      <w:r>
+        <w:t>onNavigateBack</w:t>
+      </w:r>
+      <w:proofErr w:type="spellEnd"/>
+      <w:r>
+        <w:t xml:space="preserve"> will return the user to the previous page they were on. </w:t>
       </w:r>
       <w:r>
         <w:t xml:space="preserve">I will place a </w:t>
@@ -1839,8 +2245,13 @@
       <w:r>
         <w:t xml:space="preserve">the </w:t>
       </w:r>
-      <w:r>
-        <w:t>MapLibre lambda</w:t>
+      <w:proofErr w:type="spellStart"/>
+      <w:r>
+        <w:t>MapLibre</w:t>
+      </w:r>
+      <w:proofErr w:type="spellEnd"/>
+      <w:r>
+        <w:t xml:space="preserve"> lambda</w:t>
       </w:r>
       <w:r>
         <w:t xml:space="preserve">. </w:t>
@@ -1860,11 +2271,11 @@
       <w:r>
         <w:t xml:space="preserve"> </w:t>
       </w:r>
-      <w:proofErr w:type="gramStart"/>
+      <w:proofErr w:type="spellStart"/>
       <w:r>
         <w:t>poisState</w:t>
       </w:r>
-      <w:proofErr w:type="gramEnd"/>
+      <w:proofErr w:type="spellEnd"/>
       <w:r>
         <w:t xml:space="preserve"> changes</w:t>
       </w:r>
@@ -1872,7 +2283,15 @@
         <w:t>. This will then</w:t>
       </w:r>
       <w:r>
-        <w:t xml:space="preserve"> loop through poisState and plac</w:t>
+        <w:t xml:space="preserve"> loop through </w:t>
+      </w:r>
+      <w:proofErr w:type="spellStart"/>
+      <w:r>
+        <w:t>poisState</w:t>
+      </w:r>
+      <w:proofErr w:type="spellEnd"/>
+      <w:r>
+        <w:t xml:space="preserve"> and plac</w:t>
       </w:r>
       <w:r>
         <w:t>e</w:t>
@@ -1890,15 +2309,7 @@
         <w:t>.</w:t>
       </w:r>
       <w:r>
-        <w:t xml:space="preserve"> I will make </w:t>
-      </w:r>
-      <w:proofErr w:type="gramStart"/>
-      <w:r>
-        <w:t>it</w:t>
-      </w:r>
-      <w:proofErr w:type="gramEnd"/>
-      <w:r>
-        <w:t xml:space="preserve"> so an alert dialog appears when the marker is clicked on, displaying the markers details including its name, type and description. This allows me to test that the marker has been added correctly.</w:t>
+        <w:t xml:space="preserve"> I will make it so an alert dialog appears when the marker is clicked on, displaying the markers details including its name, type and description. This allows me to test that the marker has been added correctly.</w:t>
       </w:r>
     </w:p>
     <w:p>
@@ -2530,6 +2941,7 @@
         </w:rPr>
         <w:t xml:space="preserve">for the database so it can be changed or searched. I plan to make it so that when the database returns all the POIs it contains, it will return it as a </w:t>
       </w:r>
+      <w:proofErr w:type="spellStart"/>
       <w:r>
         <w:rPr>
           <w:rFonts w:ascii="Trebuchet MS" w:hAnsi="Trebuchet MS"/>
@@ -2538,7 +2950,18 @@
           <w:sz w:val="24"/>
           <w:szCs w:val="24"/>
         </w:rPr>
-        <w:t>LiveData&lt;List&lt;Poi&gt;&gt;</w:t>
+        <w:t>LiveData</w:t>
+      </w:r>
+      <w:proofErr w:type="spellEnd"/>
+      <w:r>
+        <w:rPr>
+          <w:rFonts w:ascii="Trebuchet MS" w:hAnsi="Trebuchet MS"/>
+          <w:i/>
+          <w:iCs/>
+          <w:sz w:val="24"/>
+          <w:szCs w:val="24"/>
+        </w:rPr>
+        <w:t>&lt;List&lt;Poi&gt;&gt;</w:t>
       </w:r>
       <w:r>
         <w:rPr>
@@ -2570,61 +2993,7 @@
           <w:sz w:val="24"/>
           <w:szCs w:val="24"/>
         </w:rPr>
-        <w:t xml:space="preserve"> For now, I will give it three functions, </w:t>
-      </w:r>
-      <w:proofErr w:type="gramStart"/>
-      <w:r>
-        <w:rPr>
-          <w:rFonts w:ascii="Trebuchet MS" w:hAnsi="Trebuchet MS"/>
-          <w:sz w:val="24"/>
-          <w:szCs w:val="24"/>
-        </w:rPr>
-        <w:t>getAllPois(</w:t>
-      </w:r>
-      <w:proofErr w:type="gramEnd"/>
-      <w:r>
-        <w:rPr>
-          <w:rFonts w:ascii="Trebuchet MS" w:hAnsi="Trebuchet MS"/>
-          <w:sz w:val="24"/>
-          <w:szCs w:val="24"/>
-        </w:rPr>
-        <w:t xml:space="preserve">), </w:t>
-      </w:r>
-      <w:proofErr w:type="gramStart"/>
-      <w:r>
-        <w:rPr>
-          <w:rFonts w:ascii="Trebuchet MS" w:hAnsi="Trebuchet MS"/>
-          <w:sz w:val="24"/>
-          <w:szCs w:val="24"/>
-        </w:rPr>
-        <w:t>insert(</w:t>
-      </w:r>
-      <w:proofErr w:type="gramEnd"/>
-      <w:r>
-        <w:rPr>
-          <w:rFonts w:ascii="Trebuchet MS" w:hAnsi="Trebuchet MS"/>
-          <w:sz w:val="24"/>
-          <w:szCs w:val="24"/>
-        </w:rPr>
-        <w:t xml:space="preserve">) and </w:t>
-      </w:r>
-      <w:proofErr w:type="gramStart"/>
-      <w:r>
-        <w:rPr>
-          <w:rFonts w:ascii="Trebuchet MS" w:hAnsi="Trebuchet MS"/>
-          <w:sz w:val="24"/>
-          <w:szCs w:val="24"/>
-        </w:rPr>
-        <w:t>delete(</w:t>
-      </w:r>
-      <w:proofErr w:type="gramEnd"/>
-      <w:r>
-        <w:rPr>
-          <w:rFonts w:ascii="Trebuchet MS" w:hAnsi="Trebuchet MS"/>
-          <w:sz w:val="24"/>
-          <w:szCs w:val="24"/>
-        </w:rPr>
-        <w:t>).</w:t>
+        <w:t xml:space="preserve"> For now, I will give it three functions, getAllPois(), insert() and delete().</w:t>
       </w:r>
     </w:p>
     <w:p>
@@ -2714,41 +3083,23 @@
         </w:rPr>
         <w:t xml:space="preserve">I plan to next create the file for the database itself. This will be placed within an abstract function which allows my other files to access its DAO and all the database operations within it. Inside it I will put a </w:t>
       </w:r>
-      <w:proofErr w:type="gramStart"/>
-      <w:r>
-        <w:rPr>
-          <w:rFonts w:ascii="Trebuchet MS" w:hAnsi="Trebuchet MS"/>
-          <w:sz w:val="24"/>
-          <w:szCs w:val="24"/>
-        </w:rPr>
-        <w:t>getDatabase(</w:t>
-      </w:r>
-      <w:proofErr w:type="gramEnd"/>
-      <w:r>
-        <w:rPr>
-          <w:rFonts w:ascii="Trebuchet MS" w:hAnsi="Trebuchet MS"/>
-          <w:sz w:val="24"/>
-          <w:szCs w:val="24"/>
-        </w:rPr>
-        <w:t xml:space="preserve">) function which will check that a database </w:t>
-      </w:r>
-      <w:proofErr w:type="gramStart"/>
-      <w:r>
-        <w:rPr>
-          <w:rFonts w:ascii="Trebuchet MS" w:hAnsi="Trebuchet MS"/>
-          <w:sz w:val="24"/>
-          <w:szCs w:val="24"/>
-        </w:rPr>
-        <w:t>doesn’t already</w:t>
-      </w:r>
-      <w:proofErr w:type="gramEnd"/>
-      <w:r>
-        <w:rPr>
-          <w:rFonts w:ascii="Trebuchet MS" w:hAnsi="Trebuchet MS"/>
-          <w:sz w:val="24"/>
-          <w:szCs w:val="24"/>
-        </w:rPr>
-        <w:t xml:space="preserve"> exist, if not it will create one and save it, otherwise it will simply return the one that already exists.</w:t>
+      <w:proofErr w:type="spellStart"/>
+      <w:r>
+        <w:rPr>
+          <w:rFonts w:ascii="Trebuchet MS" w:hAnsi="Trebuchet MS"/>
+          <w:sz w:val="24"/>
+          <w:szCs w:val="24"/>
+        </w:rPr>
+        <w:t>getDatabase</w:t>
+      </w:r>
+      <w:proofErr w:type="spellEnd"/>
+      <w:r>
+        <w:rPr>
+          <w:rFonts w:ascii="Trebuchet MS" w:hAnsi="Trebuchet MS"/>
+          <w:sz w:val="24"/>
+          <w:szCs w:val="24"/>
+        </w:rPr>
+        <w:t>() function which will check that a database doesn’t already exist, if not it will create one and save it, otherwise it will simply return the one that already exists.</w:t>
       </w:r>
     </w:p>
     <w:p>
@@ -2827,26 +3178,62 @@
           <w:sz w:val="24"/>
           <w:szCs w:val="24"/>
         </w:rPr>
-        <w:t xml:space="preserve">I will next update my Viewmodel. </w:t>
-      </w:r>
-      <w:r>
-        <w:rPr>
-          <w:rFonts w:ascii="Trebuchet MS" w:hAnsi="Trebuchet MS"/>
-          <w:sz w:val="24"/>
-          <w:szCs w:val="24"/>
-        </w:rPr>
-        <w:t xml:space="preserve">I will first change the ViewModel for </w:t>
-      </w:r>
-      <w:proofErr w:type="gramStart"/>
-      <w:r>
-        <w:rPr>
-          <w:rFonts w:ascii="Trebuchet MS" w:hAnsi="Trebuchet MS"/>
-          <w:sz w:val="24"/>
-          <w:szCs w:val="24"/>
-        </w:rPr>
-        <w:t>a AndroidViewModel</w:t>
-      </w:r>
-      <w:proofErr w:type="gramEnd"/>
+        <w:t xml:space="preserve">I will next update my </w:t>
+      </w:r>
+      <w:proofErr w:type="spellStart"/>
+      <w:r>
+        <w:rPr>
+          <w:rFonts w:ascii="Trebuchet MS" w:hAnsi="Trebuchet MS"/>
+          <w:sz w:val="24"/>
+          <w:szCs w:val="24"/>
+        </w:rPr>
+        <w:t>Viewmodel</w:t>
+      </w:r>
+      <w:proofErr w:type="spellEnd"/>
+      <w:r>
+        <w:rPr>
+          <w:rFonts w:ascii="Trebuchet MS" w:hAnsi="Trebuchet MS"/>
+          <w:sz w:val="24"/>
+          <w:szCs w:val="24"/>
+        </w:rPr>
+        <w:t xml:space="preserve">. </w:t>
+      </w:r>
+      <w:r>
+        <w:rPr>
+          <w:rFonts w:ascii="Trebuchet MS" w:hAnsi="Trebuchet MS"/>
+          <w:sz w:val="24"/>
+          <w:szCs w:val="24"/>
+        </w:rPr>
+        <w:t xml:space="preserve">I will first change the </w:t>
+      </w:r>
+      <w:proofErr w:type="spellStart"/>
+      <w:r>
+        <w:rPr>
+          <w:rFonts w:ascii="Trebuchet MS" w:hAnsi="Trebuchet MS"/>
+          <w:sz w:val="24"/>
+          <w:szCs w:val="24"/>
+        </w:rPr>
+        <w:t>ViewModel</w:t>
+      </w:r>
+      <w:proofErr w:type="spellEnd"/>
+      <w:r>
+        <w:rPr>
+          <w:rFonts w:ascii="Trebuchet MS" w:hAnsi="Trebuchet MS"/>
+          <w:sz w:val="24"/>
+          <w:szCs w:val="24"/>
+        </w:rPr>
+        <w:t xml:space="preserve"> for a </w:t>
+      </w:r>
+      <w:proofErr w:type="spellStart"/>
+      <w:r>
+        <w:rPr>
+          <w:rFonts w:ascii="Trebuchet MS" w:hAnsi="Trebuchet MS"/>
+          <w:sz w:val="24"/>
+          <w:szCs w:val="24"/>
+        </w:rPr>
+        <w:t>AndroidViewModel</w:t>
+      </w:r>
+      <w:proofErr w:type="spellEnd"/>
       <w:r>
         <w:rPr>
           <w:rFonts w:ascii="Trebuchet MS" w:hAnsi="Trebuchet MS"/>
@@ -2863,13 +3250,77 @@
         </w:rPr>
         <w:t xml:space="preserve">I plan to update the poi variable so that it gathers all the pois from the database as </w:t>
       </w:r>
-      <w:r>
-        <w:rPr>
-          <w:rFonts w:ascii="Trebuchet MS" w:hAnsi="Trebuchet MS"/>
-          <w:sz w:val="24"/>
-          <w:szCs w:val="24"/>
-        </w:rPr>
-        <w:t>LiveData allowing it to automatically update when a new POI is added. Because of this, I will also need to change the addpoi function in the Viewmodel so that it adds the poi to the database instead of list using the poiDao’s ins</w:t>
+      <w:proofErr w:type="spellStart"/>
+      <w:r>
+        <w:rPr>
+          <w:rFonts w:ascii="Trebuchet MS" w:hAnsi="Trebuchet MS"/>
+          <w:sz w:val="24"/>
+          <w:szCs w:val="24"/>
+        </w:rPr>
+        <w:t>LiveData</w:t>
+      </w:r>
+      <w:proofErr w:type="spellEnd"/>
+      <w:r>
+        <w:rPr>
+          <w:rFonts w:ascii="Trebuchet MS" w:hAnsi="Trebuchet MS"/>
+          <w:sz w:val="24"/>
+          <w:szCs w:val="24"/>
+        </w:rPr>
+        <w:t xml:space="preserve"> allowing it to automatically update when a new POI is added. Because of this, I will also need to change the </w:t>
+      </w:r>
+      <w:proofErr w:type="spellStart"/>
+      <w:r>
+        <w:rPr>
+          <w:rFonts w:ascii="Trebuchet MS" w:hAnsi="Trebuchet MS"/>
+          <w:sz w:val="24"/>
+          <w:szCs w:val="24"/>
+        </w:rPr>
+        <w:t>addpoi</w:t>
+      </w:r>
+      <w:proofErr w:type="spellEnd"/>
+      <w:r>
+        <w:rPr>
+          <w:rFonts w:ascii="Trebuchet MS" w:hAnsi="Trebuchet MS"/>
+          <w:sz w:val="24"/>
+          <w:szCs w:val="24"/>
+        </w:rPr>
+        <w:t xml:space="preserve"> function in the </w:t>
+      </w:r>
+      <w:proofErr w:type="spellStart"/>
+      <w:r>
+        <w:rPr>
+          <w:rFonts w:ascii="Trebuchet MS" w:hAnsi="Trebuchet MS"/>
+          <w:sz w:val="24"/>
+          <w:szCs w:val="24"/>
+        </w:rPr>
+        <w:t>Viewmodel</w:t>
+      </w:r>
+      <w:proofErr w:type="spellEnd"/>
+      <w:r>
+        <w:rPr>
+          <w:rFonts w:ascii="Trebuchet MS" w:hAnsi="Trebuchet MS"/>
+          <w:sz w:val="24"/>
+          <w:szCs w:val="24"/>
+        </w:rPr>
+        <w:t xml:space="preserve"> so that it adds the poi to the database instead of list using the </w:t>
+      </w:r>
+      <w:proofErr w:type="spellStart"/>
+      <w:r>
+        <w:rPr>
+          <w:rFonts w:ascii="Trebuchet MS" w:hAnsi="Trebuchet MS"/>
+          <w:sz w:val="24"/>
+          <w:szCs w:val="24"/>
+        </w:rPr>
+        <w:t>poiDao’s</w:t>
+      </w:r>
+      <w:proofErr w:type="spellEnd"/>
+      <w:r>
+        <w:rPr>
+          <w:rFonts w:ascii="Trebuchet MS" w:hAnsi="Trebuchet MS"/>
+          <w:sz w:val="24"/>
+          <w:szCs w:val="24"/>
+        </w:rPr>
+        <w:t xml:space="preserve"> ins</w:t>
       </w:r>
       <w:r>
         <w:rPr>
@@ -2975,7 +3426,25 @@
           <w:sz w:val="24"/>
           <w:szCs w:val="24"/>
         </w:rPr>
-        <w:t>I will then update the button for my AddPoiScreen. I will simply change the Poi structure in the button so that it fits the databases poi structure since the latitude and longitude for the pois in the database are separate variables.</w:t>
+        <w:t xml:space="preserve">I will then update the button for my </w:t>
+      </w:r>
+      <w:proofErr w:type="spellStart"/>
+      <w:r>
+        <w:rPr>
+          <w:rFonts w:ascii="Trebuchet MS" w:hAnsi="Trebuchet MS"/>
+          <w:sz w:val="24"/>
+          <w:szCs w:val="24"/>
+        </w:rPr>
+        <w:t>AddPoiScreen</w:t>
+      </w:r>
+      <w:proofErr w:type="spellEnd"/>
+      <w:r>
+        <w:rPr>
+          <w:rFonts w:ascii="Trebuchet MS" w:hAnsi="Trebuchet MS"/>
+          <w:sz w:val="24"/>
+          <w:szCs w:val="24"/>
+        </w:rPr>
+        <w:t>. I will simply change the Poi structure in the button so that it fits the databases poi structure since the latitude and longitude for the pois in the database are separate variables.</w:t>
       </w:r>
     </w:p>
     <w:p>
@@ -3048,7 +3517,43 @@
           <w:sz w:val="24"/>
           <w:szCs w:val="24"/>
         </w:rPr>
-        <w:t>I will then need to change the MainActivity so that the Poi is converted back into the LatLng so that the map can properly mark its location.</w:t>
+        <w:t xml:space="preserve">I will then need to change the </w:t>
+      </w:r>
+      <w:proofErr w:type="spellStart"/>
+      <w:r>
+        <w:rPr>
+          <w:rFonts w:ascii="Trebuchet MS" w:hAnsi="Trebuchet MS"/>
+          <w:sz w:val="24"/>
+          <w:szCs w:val="24"/>
+        </w:rPr>
+        <w:t>MainActivity</w:t>
+      </w:r>
+      <w:proofErr w:type="spellEnd"/>
+      <w:r>
+        <w:rPr>
+          <w:rFonts w:ascii="Trebuchet MS" w:hAnsi="Trebuchet MS"/>
+          <w:sz w:val="24"/>
+          <w:szCs w:val="24"/>
+        </w:rPr>
+        <w:t xml:space="preserve"> so that the Poi is converted back into the </w:t>
+      </w:r>
+      <w:proofErr w:type="spellStart"/>
+      <w:r>
+        <w:rPr>
+          <w:rFonts w:ascii="Trebuchet MS" w:hAnsi="Trebuchet MS"/>
+          <w:sz w:val="24"/>
+          <w:szCs w:val="24"/>
+        </w:rPr>
+        <w:t>LatLng</w:t>
+      </w:r>
+      <w:proofErr w:type="spellEnd"/>
+      <w:r>
+        <w:rPr>
+          <w:rFonts w:ascii="Trebuchet MS" w:hAnsi="Trebuchet MS"/>
+          <w:sz w:val="24"/>
+          <w:szCs w:val="24"/>
+        </w:rPr>
+        <w:t xml:space="preserve"> so that the map can properly mark its location.</w:t>
       </w:r>
     </w:p>
     <w:p>
@@ -3226,20 +3731,12 @@
       <w:pPr>
         <w:ind w:left="720"/>
         <w:rPr>
-          <w:sz w:val="24"/>
-          <w:szCs w:val="24"/>
-        </w:rPr>
-      </w:pPr>
-      <w:r>
-        <w:rPr>
           <w:rFonts w:ascii="Trebuchet MS" w:hAnsi="Trebuchet MS"/>
           <w:color w:val="000000"/>
           <w:sz w:val="24"/>
           <w:szCs w:val="24"/>
         </w:rPr>
-        <w:t xml:space="preserve">I have already set up the loading process for the POIs for task 3. This is done on </w:t>
-      </w:r>
-      <w:proofErr w:type="gramStart"/>
+      </w:pPr>
       <w:r>
         <w:rPr>
           <w:rFonts w:ascii="Trebuchet MS" w:hAnsi="Trebuchet MS"/>
@@ -3247,9 +3744,8 @@
           <w:sz w:val="24"/>
           <w:szCs w:val="24"/>
         </w:rPr>
-        <w:t>startup and</w:t>
-      </w:r>
-      <w:proofErr w:type="gramEnd"/>
+        <w:t xml:space="preserve">I have already set up the loading process for the POIs for task 3. This is done on startup and whenever the database is updated. </w:t>
+      </w:r>
       <w:r>
         <w:rPr>
           <w:rFonts w:ascii="Trebuchet MS" w:hAnsi="Trebuchet MS"/>
@@ -3257,8 +3753,341 @@
           <w:sz w:val="24"/>
           <w:szCs w:val="24"/>
         </w:rPr>
-        <w:t xml:space="preserve"> whenever the database is updated. This makes sure that all data on the system is always up to date with the database.</w:t>
-      </w:r>
+        <w:t>However, to fit this task better I will change the code to use a button instead, this will make testing easier and give the user more control.</w:t>
+      </w:r>
+    </w:p>
+    <w:p>
+      <w:pPr>
+        <w:ind w:left="720"/>
+        <w:rPr>
+          <w:rFonts w:ascii="Trebuchet MS" w:hAnsi="Trebuchet MS"/>
+          <w:color w:val="000000"/>
+          <w:sz w:val="24"/>
+          <w:szCs w:val="24"/>
+        </w:rPr>
+      </w:pPr>
+    </w:p>
+    <w:p>
+      <w:pPr>
+        <w:ind w:left="720"/>
+        <w:rPr>
+          <w:rFonts w:ascii="Trebuchet MS" w:hAnsi="Trebuchet MS"/>
+          <w:color w:val="000000"/>
+          <w:sz w:val="24"/>
+          <w:szCs w:val="24"/>
+        </w:rPr>
+      </w:pPr>
+      <w:r>
+        <w:rPr>
+          <w:rFonts w:ascii="Trebuchet MS" w:hAnsi="Trebuchet MS"/>
+          <w:color w:val="000000"/>
+          <w:sz w:val="24"/>
+          <w:szCs w:val="24"/>
+        </w:rPr>
+        <w:t xml:space="preserve">I will start this by changing the DAO to return a plain list instead of </w:t>
+      </w:r>
+      <w:r>
+        <w:rPr>
+          <w:rFonts w:ascii="Trebuchet MS" w:hAnsi="Trebuchet MS"/>
+          <w:color w:val="000000"/>
+          <w:sz w:val="24"/>
+          <w:szCs w:val="24"/>
+        </w:rPr>
+        <w:t xml:space="preserve">the </w:t>
+      </w:r>
+      <w:proofErr w:type="spellStart"/>
+      <w:r>
+        <w:rPr>
+          <w:rFonts w:ascii="Trebuchet MS" w:hAnsi="Trebuchet MS"/>
+          <w:color w:val="000000"/>
+          <w:sz w:val="24"/>
+          <w:szCs w:val="24"/>
+        </w:rPr>
+        <w:t>LiveData</w:t>
+      </w:r>
+      <w:proofErr w:type="spellEnd"/>
+      <w:r>
+        <w:rPr>
+          <w:rFonts w:ascii="Trebuchet MS" w:hAnsi="Trebuchet MS"/>
+          <w:color w:val="000000"/>
+          <w:sz w:val="24"/>
+          <w:szCs w:val="24"/>
+        </w:rPr>
+        <w:t xml:space="preserve"> since the POIs will no longer be automatically loaded. </w:t>
+      </w:r>
+    </w:p>
+    <w:p>
+      <w:pPr>
+        <w:ind w:left="720"/>
+        <w:rPr>
+          <w:rFonts w:ascii="Trebuchet MS" w:hAnsi="Trebuchet MS"/>
+          <w:color w:val="000000"/>
+          <w:sz w:val="24"/>
+          <w:szCs w:val="24"/>
+        </w:rPr>
+      </w:pPr>
+    </w:p>
+    <w:p>
+      <w:pPr>
+        <w:ind w:left="720"/>
+        <w:rPr>
+          <w:rFonts w:ascii="Trebuchet MS" w:hAnsi="Trebuchet MS"/>
+          <w:color w:val="000000"/>
+          <w:sz w:val="24"/>
+          <w:szCs w:val="24"/>
+        </w:rPr>
+      </w:pPr>
+      <w:r>
+        <w:rPr>
+          <w:rFonts w:ascii="Trebuchet MS" w:hAnsi="Trebuchet MS"/>
+          <w:color w:val="000000"/>
+          <w:sz w:val="24"/>
+          <w:szCs w:val="24"/>
+        </w:rPr>
+        <w:t xml:space="preserve">I will also need to add a new function to the </w:t>
+      </w:r>
+      <w:proofErr w:type="spellStart"/>
+      <w:r>
+        <w:rPr>
+          <w:rFonts w:ascii="Trebuchet MS" w:hAnsi="Trebuchet MS"/>
+          <w:color w:val="000000"/>
+          <w:sz w:val="24"/>
+          <w:szCs w:val="24"/>
+        </w:rPr>
+        <w:t>ViewModel</w:t>
+      </w:r>
+      <w:proofErr w:type="spellEnd"/>
+      <w:r>
+        <w:rPr>
+          <w:rFonts w:ascii="Trebuchet MS" w:hAnsi="Trebuchet MS"/>
+          <w:color w:val="000000"/>
+          <w:sz w:val="24"/>
+          <w:szCs w:val="24"/>
+        </w:rPr>
+        <w:t xml:space="preserve"> which will load all the POIs from the database. It will run </w:t>
+      </w:r>
+      <w:r>
+        <w:rPr>
+          <w:rFonts w:ascii="Trebuchet MS" w:hAnsi="Trebuchet MS"/>
+          <w:color w:val="000000"/>
+          <w:sz w:val="24"/>
+          <w:szCs w:val="24"/>
+        </w:rPr>
+        <w:t xml:space="preserve">the database query on Dispatchers.IO in the background, then </w:t>
+      </w:r>
+      <w:r>
+        <w:rPr>
+          <w:rFonts w:ascii="Trebuchet MS" w:hAnsi="Trebuchet MS"/>
+          <w:color w:val="000000"/>
+          <w:sz w:val="24"/>
+          <w:szCs w:val="24"/>
+        </w:rPr>
+        <w:t>set</w:t>
+      </w:r>
+      <w:r>
+        <w:rPr>
+          <w:rFonts w:ascii="Trebuchet MS" w:hAnsi="Trebuchet MS"/>
+          <w:color w:val="000000"/>
+          <w:sz w:val="24"/>
+          <w:szCs w:val="24"/>
+        </w:rPr>
+        <w:t xml:space="preserve"> the result to </w:t>
+      </w:r>
+      <w:proofErr w:type="spellStart"/>
+      <w:r>
+        <w:rPr>
+          <w:rFonts w:ascii="Trebuchet MS" w:hAnsi="Trebuchet MS"/>
+          <w:color w:val="000000"/>
+          <w:sz w:val="24"/>
+          <w:szCs w:val="24"/>
+        </w:rPr>
+        <w:t>pois.value</w:t>
+      </w:r>
+      <w:proofErr w:type="spellEnd"/>
+      <w:r>
+        <w:rPr>
+          <w:rFonts w:ascii="Trebuchet MS" w:hAnsi="Trebuchet MS"/>
+          <w:color w:val="000000"/>
+          <w:sz w:val="24"/>
+          <w:szCs w:val="24"/>
+        </w:rPr>
+        <w:t xml:space="preserve"> which </w:t>
+      </w:r>
+      <w:r>
+        <w:rPr>
+          <w:rFonts w:ascii="Trebuchet MS" w:hAnsi="Trebuchet MS"/>
+          <w:color w:val="000000"/>
+          <w:sz w:val="24"/>
+          <w:szCs w:val="24"/>
+        </w:rPr>
+        <w:t xml:space="preserve">should </w:t>
+      </w:r>
+      <w:r>
+        <w:rPr>
+          <w:rFonts w:ascii="Trebuchet MS" w:hAnsi="Trebuchet MS"/>
+          <w:color w:val="000000"/>
+          <w:sz w:val="24"/>
+          <w:szCs w:val="24"/>
+        </w:rPr>
+        <w:t xml:space="preserve">triggers the observer in </w:t>
+      </w:r>
+      <w:proofErr w:type="spellStart"/>
+      <w:r>
+        <w:rPr>
+          <w:rFonts w:ascii="Trebuchet MS" w:hAnsi="Trebuchet MS"/>
+          <w:color w:val="000000"/>
+          <w:sz w:val="24"/>
+          <w:szCs w:val="24"/>
+        </w:rPr>
+        <w:t>MainActivity</w:t>
+      </w:r>
+      <w:proofErr w:type="spellEnd"/>
+      <w:r>
+        <w:rPr>
+          <w:rFonts w:ascii="Trebuchet MS" w:hAnsi="Trebuchet MS"/>
+          <w:color w:val="000000"/>
+          <w:sz w:val="24"/>
+          <w:szCs w:val="24"/>
+        </w:rPr>
+        <w:t xml:space="preserve"> </w:t>
+      </w:r>
+      <w:r>
+        <w:rPr>
+          <w:rFonts w:ascii="Trebuchet MS" w:hAnsi="Trebuchet MS"/>
+          <w:color w:val="000000"/>
+          <w:sz w:val="24"/>
+          <w:szCs w:val="24"/>
+        </w:rPr>
+        <w:t xml:space="preserve">which will then </w:t>
+      </w:r>
+      <w:r>
+        <w:rPr>
+          <w:rFonts w:ascii="Trebuchet MS" w:hAnsi="Trebuchet MS"/>
+          <w:color w:val="000000"/>
+          <w:sz w:val="24"/>
+          <w:szCs w:val="24"/>
+        </w:rPr>
+        <w:t>update the map.</w:t>
+      </w:r>
+    </w:p>
+    <w:p>
+      <w:pPr>
+        <w:ind w:left="720"/>
+        <w:rPr>
+          <w:rFonts w:ascii="Trebuchet MS" w:hAnsi="Trebuchet MS"/>
+          <w:color w:val="000000"/>
+          <w:sz w:val="24"/>
+          <w:szCs w:val="24"/>
+        </w:rPr>
+      </w:pPr>
+    </w:p>
+    <w:p>
+      <w:pPr>
+        <w:ind w:left="720"/>
+        <w:rPr>
+          <w:rFonts w:ascii="Trebuchet MS" w:hAnsi="Trebuchet MS"/>
+          <w:color w:val="000000"/>
+          <w:sz w:val="24"/>
+          <w:szCs w:val="24"/>
+        </w:rPr>
+      </w:pPr>
+      <w:r>
+        <w:rPr>
+          <w:rFonts w:ascii="Trebuchet MS" w:hAnsi="Trebuchet MS"/>
+          <w:color w:val="000000"/>
+          <w:sz w:val="24"/>
+          <w:szCs w:val="24"/>
+        </w:rPr>
+        <w:t xml:space="preserve">I will then also need to change the poi variable so that </w:t>
+      </w:r>
+      <w:r>
+        <w:rPr>
+          <w:rFonts w:ascii="Trebuchet MS" w:hAnsi="Trebuchet MS"/>
+          <w:color w:val="000000"/>
+          <w:sz w:val="24"/>
+          <w:szCs w:val="24"/>
+        </w:rPr>
+        <w:t>it</w:t>
+      </w:r>
+      <w:r>
+        <w:rPr>
+          <w:rFonts w:ascii="Trebuchet MS" w:hAnsi="Trebuchet MS"/>
+          <w:color w:val="000000"/>
+          <w:sz w:val="24"/>
+          <w:szCs w:val="24"/>
+        </w:rPr>
+        <w:t xml:space="preserve"> holds a plain list of pois instead of being assigned directly from the DAO’s live data since it no longer returns </w:t>
+      </w:r>
+      <w:proofErr w:type="spellStart"/>
+      <w:r>
+        <w:rPr>
+          <w:rFonts w:ascii="Trebuchet MS" w:hAnsi="Trebuchet MS"/>
+          <w:color w:val="000000"/>
+          <w:sz w:val="24"/>
+          <w:szCs w:val="24"/>
+        </w:rPr>
+        <w:t>LiveData</w:t>
+      </w:r>
+      <w:proofErr w:type="spellEnd"/>
+      <w:r>
+        <w:rPr>
+          <w:rFonts w:ascii="Trebuchet MS" w:hAnsi="Trebuchet MS"/>
+          <w:color w:val="000000"/>
+          <w:sz w:val="24"/>
+          <w:szCs w:val="24"/>
+        </w:rPr>
+        <w:t>.</w:t>
+      </w:r>
+    </w:p>
+    <w:p>
+      <w:pPr>
+        <w:ind w:left="720"/>
+        <w:rPr>
+          <w:rFonts w:ascii="Trebuchet MS" w:hAnsi="Trebuchet MS"/>
+          <w:color w:val="000000"/>
+          <w:sz w:val="24"/>
+          <w:szCs w:val="24"/>
+        </w:rPr>
+      </w:pPr>
+      <w:r>
+        <w:rPr>
+          <w:rFonts w:ascii="Trebuchet MS" w:hAnsi="Trebuchet MS"/>
+          <w:color w:val="000000"/>
+          <w:sz w:val="24"/>
+          <w:szCs w:val="24"/>
+        </w:rPr>
+        <w:lastRenderedPageBreak/>
+        <w:t xml:space="preserve">I will then lastly need to add the load buttons to the </w:t>
+      </w:r>
+      <w:proofErr w:type="spellStart"/>
+      <w:r>
+        <w:rPr>
+          <w:rFonts w:ascii="Trebuchet MS" w:hAnsi="Trebuchet MS"/>
+          <w:color w:val="000000"/>
+          <w:sz w:val="24"/>
+          <w:szCs w:val="24"/>
+        </w:rPr>
+        <w:t>MainActivity</w:t>
+      </w:r>
+      <w:proofErr w:type="spellEnd"/>
+      <w:r>
+        <w:rPr>
+          <w:rFonts w:ascii="Trebuchet MS" w:hAnsi="Trebuchet MS"/>
+          <w:color w:val="000000"/>
+          <w:sz w:val="24"/>
+          <w:szCs w:val="24"/>
+        </w:rPr>
+        <w:t>. This will call the load poi function in the view model, loading all the pois from the database into the UI.</w:t>
+      </w:r>
+    </w:p>
+    <w:p>
+      <w:pPr>
+        <w:ind w:left="720"/>
+        <w:rPr>
+          <w:sz w:val="24"/>
+          <w:szCs w:val="24"/>
+        </w:rPr>
+      </w:pPr>
     </w:p>
     <w:p/>
     <w:p>
@@ -3793,7 +4622,6 @@
   <w:style w:type="character" w:default="1" w:styleId="DefaultParagraphFont">
     <w:name w:val="Default Paragraph Font"/>
     <w:uiPriority w:val="1"/>
-    <w:semiHidden/>
     <w:unhideWhenUsed/>
   </w:style>
   <w:style w:type="table" w:default="1" w:styleId="TableNormal">

</xml_diff>

<commit_message>
Added code snippets to report - task 4
</commit_message>
<xml_diff>
--- a/MAD_Report.docx
+++ b/MAD_Report.docx
@@ -376,6 +376,7 @@
         <w:t xml:space="preserve">I will first start with this task by setting up the dependencies in my </w:t>
       </w:r>
       <w:proofErr w:type="spellStart"/>
+      <w:proofErr w:type="gramStart"/>
       <w:r>
         <w:rPr>
           <w:rFonts w:ascii="Trebuchet MS" w:eastAsia="Trebuchet MS" w:hAnsi="Trebuchet MS" w:cs="Trebuchet MS"/>
@@ -385,6 +386,7 @@
         <w:t>build.gradle</w:t>
       </w:r>
       <w:proofErr w:type="spellEnd"/>
+      <w:proofErr w:type="gramEnd"/>
       <w:r>
         <w:rPr>
           <w:rFonts w:ascii="Trebuchet MS" w:eastAsia="Trebuchet MS" w:hAnsi="Trebuchet MS" w:cs="Trebuchet MS"/>
@@ -394,13 +396,23 @@
         <w:t xml:space="preserve"> and </w:t>
       </w:r>
       <w:proofErr w:type="spellStart"/>
-      <w:r>
-        <w:rPr>
-          <w:rFonts w:ascii="Trebuchet MS" w:eastAsia="Trebuchet MS" w:hAnsi="Trebuchet MS" w:cs="Trebuchet MS"/>
-          <w:sz w:val="24"/>
-          <w:szCs w:val="24"/>
-        </w:rPr>
-        <w:t>libs.versions.toml</w:t>
+      <w:proofErr w:type="gramStart"/>
+      <w:r>
+        <w:rPr>
+          <w:rFonts w:ascii="Trebuchet MS" w:eastAsia="Trebuchet MS" w:hAnsi="Trebuchet MS" w:cs="Trebuchet MS"/>
+          <w:sz w:val="24"/>
+          <w:szCs w:val="24"/>
+        </w:rPr>
+        <w:t>libs.versions</w:t>
+      </w:r>
+      <w:proofErr w:type="gramEnd"/>
+      <w:r>
+        <w:rPr>
+          <w:rFonts w:ascii="Trebuchet MS" w:eastAsia="Trebuchet MS" w:hAnsi="Trebuchet MS" w:cs="Trebuchet MS"/>
+          <w:sz w:val="24"/>
+          <w:szCs w:val="24"/>
+        </w:rPr>
+        <w:t>.toml</w:t>
       </w:r>
       <w:proofErr w:type="spellEnd"/>
       <w:r>
@@ -1307,6 +1319,7 @@
         <w:t xml:space="preserve">I will also write a </w:t>
       </w:r>
       <w:proofErr w:type="spellStart"/>
+      <w:proofErr w:type="gramStart"/>
       <w:r>
         <w:rPr>
           <w:rFonts w:ascii="Trebuchet MS" w:eastAsia="Trebuchet MS" w:hAnsi="Trebuchet MS" w:cs="Trebuchet MS"/>
@@ -1322,7 +1335,16 @@
           <w:sz w:val="24"/>
           <w:szCs w:val="24"/>
         </w:rPr>
-        <w:t xml:space="preserve"> function that will check whether the location permission has already been granted. If they haven’t, then it will launch a permission request. This will make sure that the GPS function is only called if the user approves the use of their location. A Toast message was shown if they denied it.</w:t>
+        <w:t xml:space="preserve"> function</w:t>
+      </w:r>
+      <w:proofErr w:type="gramEnd"/>
+      <w:r>
+        <w:rPr>
+          <w:rFonts w:ascii="Trebuchet MS" w:eastAsia="Trebuchet MS" w:hAnsi="Trebuchet MS" w:cs="Trebuchet MS"/>
+          <w:sz w:val="24"/>
+          <w:szCs w:val="24"/>
+        </w:rPr>
+        <w:t xml:space="preserve"> that will check whether the location permission has already been granted. If they haven’t, then it will launch a permission request. This will make sure that the GPS function is only called if the user approves the use of their location. A Toast message was shown if they denied it.</w:t>
       </w:r>
     </w:p>
     <w:p>
@@ -1597,7 +1619,25 @@
           <w:sz w:val="24"/>
           <w:szCs w:val="24"/>
         </w:rPr>
-        <w:t xml:space="preserve"> to prevent any overlap of the devices interfaces with the application itself.</w:t>
+        <w:t xml:space="preserve"> to prevent any overlap of the </w:t>
+      </w:r>
+      <w:proofErr w:type="gramStart"/>
+      <w:r>
+        <w:rPr>
+          <w:rFonts w:ascii="Trebuchet MS" w:eastAsia="Trebuchet MS" w:hAnsi="Trebuchet MS" w:cs="Trebuchet MS"/>
+          <w:sz w:val="24"/>
+          <w:szCs w:val="24"/>
+        </w:rPr>
+        <w:t>devices</w:t>
+      </w:r>
+      <w:proofErr w:type="gramEnd"/>
+      <w:r>
+        <w:rPr>
+          <w:rFonts w:ascii="Trebuchet MS" w:eastAsia="Trebuchet MS" w:hAnsi="Trebuchet MS" w:cs="Trebuchet MS"/>
+          <w:sz w:val="24"/>
+          <w:szCs w:val="24"/>
+        </w:rPr>
+        <w:t xml:space="preserve"> interfaces with the application itself.</w:t>
       </w:r>
     </w:p>
     <w:p>
@@ -1814,7 +1854,31 @@
           <w:sz w:val="24"/>
           <w:szCs w:val="24"/>
         </w:rPr>
-        <w:t>For now you can just use buttons for navigation – there is no need to use an app bar, a navigation bar, or the navigation drawer just yet.</w:t>
+        <w:t xml:space="preserve">For </w:t>
+      </w:r>
+      <w:proofErr w:type="gramStart"/>
+      <w:r>
+        <w:rPr>
+          <w:rFonts w:ascii="Trebuchet MS" w:hAnsi="Trebuchet MS"/>
+          <w:i/>
+          <w:iCs/>
+          <w:color w:val="000000"/>
+          <w:sz w:val="24"/>
+          <w:szCs w:val="24"/>
+        </w:rPr>
+        <w:t>now</w:t>
+      </w:r>
+      <w:proofErr w:type="gramEnd"/>
+      <w:r>
+        <w:rPr>
+          <w:rFonts w:ascii="Trebuchet MS" w:hAnsi="Trebuchet MS"/>
+          <w:i/>
+          <w:iCs/>
+          <w:color w:val="000000"/>
+          <w:sz w:val="24"/>
+          <w:szCs w:val="24"/>
+        </w:rPr>
+        <w:t xml:space="preserve"> you can just use buttons for navigation – there is no need to use an app bar, a navigation bar, or the navigation drawer just yet.</w:t>
       </w:r>
       <w:r>
         <w:rPr>
@@ -2272,10 +2336,12 @@
         <w:t xml:space="preserve"> </w:t>
       </w:r>
       <w:proofErr w:type="spellStart"/>
+      <w:proofErr w:type="gramStart"/>
       <w:r>
         <w:t>poisState</w:t>
       </w:r>
       <w:proofErr w:type="spellEnd"/>
+      <w:proofErr w:type="gramEnd"/>
       <w:r>
         <w:t xml:space="preserve"> changes</w:t>
       </w:r>
@@ -2309,7 +2375,15 @@
         <w:t>.</w:t>
       </w:r>
       <w:r>
-        <w:t xml:space="preserve"> I will make it so an alert dialog appears when the marker is clicked on, displaying the markers details including its name, type and description. This allows me to test that the marker has been added correctly.</w:t>
+        <w:t xml:space="preserve"> I will make </w:t>
+      </w:r>
+      <w:proofErr w:type="gramStart"/>
+      <w:r>
+        <w:t>it</w:t>
+      </w:r>
+      <w:proofErr w:type="gramEnd"/>
+      <w:r>
+        <w:t xml:space="preserve"> so an alert dialog appears when the marker is clicked on, displaying the markers details including its name, type and description. This allows me to test that the marker has been added correctly.</w:t>
       </w:r>
     </w:p>
     <w:p>
@@ -2372,11 +2446,7 @@
     </w:p>
     <w:p>
       <w:pPr>
-        <w:rPr>
-          <w:rFonts w:ascii="Trebuchet MS" w:hAnsi="Trebuchet MS"/>
-          <w:sz w:val="24"/>
-          <w:szCs w:val="24"/>
-        </w:rPr>
+        <w:ind w:left="720"/>
       </w:pPr>
       <w:r>
         <w:rPr>
@@ -2662,40 +2732,27 @@
           <w:sz w:val="24"/>
           <w:szCs w:val="24"/>
         </w:rPr>
-        <w:t>I will first begin this task by adding the dependencies for Room.</w:t>
-      </w:r>
-    </w:p>
-    <w:p>
-      <w:pPr>
-        <w:rPr>
-          <w:rFonts w:ascii="Trebuchet MS" w:hAnsi="Trebuchet MS"/>
-          <w:sz w:val="24"/>
-          <w:szCs w:val="24"/>
-        </w:rPr>
-      </w:pPr>
-    </w:p>
-    <w:p>
-      <w:pPr>
-        <w:rPr>
-          <w:rFonts w:ascii="Trebuchet MS" w:hAnsi="Trebuchet MS"/>
-          <w:sz w:val="24"/>
-          <w:szCs w:val="24"/>
-        </w:rPr>
-      </w:pPr>
-    </w:p>
-    <w:p>
-      <w:pPr>
-        <w:ind w:left="720"/>
-        <w:rPr>
-          <w:rFonts w:ascii="Trebuchet MS" w:hAnsi="Trebuchet MS"/>
-          <w:sz w:val="24"/>
-          <w:szCs w:val="24"/>
-        </w:rPr>
-      </w:pPr>
-      <w:r>
-        <w:rPr>
-          <w:noProof/>
-        </w:rPr>
+        <w:t xml:space="preserve">I </w:t>
+      </w:r>
+      <w:r>
+        <w:t>will first begin this task by adding the dependencies for Room.</w:t>
+      </w:r>
+    </w:p>
+    <w:p>
+      <w:pPr>
+        <w:ind w:left="720"/>
+      </w:pPr>
+    </w:p>
+    <w:p>
+      <w:pPr>
+        <w:ind w:left="720"/>
+      </w:pPr>
+    </w:p>
+    <w:p>
+      <w:pPr>
+        <w:ind w:left="720"/>
+      </w:pPr>
+      <w:r>
         <w:drawing>
           <wp:anchor distT="0" distB="0" distL="114300" distR="114300" simplePos="0" relativeHeight="251678720" behindDoc="0" locked="0" layoutInCell="1" allowOverlap="1" wp14:anchorId="321F7754" wp14:editId="057EDCBE">
             <wp:simplePos x="0" y="0"/>
@@ -2753,106 +2810,58 @@
         </w:drawing>
       </w:r>
       <w:r>
-        <w:rPr>
-          <w:rFonts w:ascii="Trebuchet MS" w:hAnsi="Trebuchet MS"/>
-          <w:sz w:val="24"/>
-          <w:szCs w:val="24"/>
-        </w:rPr>
         <w:t>I will then update my POI data class to be a room entity instead. This will allow me to easily save any POI to the local database.</w:t>
       </w:r>
     </w:p>
     <w:p>
       <w:pPr>
         <w:ind w:left="720"/>
-        <w:rPr>
-          <w:rFonts w:ascii="Trebuchet MS" w:hAnsi="Trebuchet MS"/>
-          <w:sz w:val="24"/>
-          <w:szCs w:val="24"/>
-        </w:rPr>
-      </w:pPr>
-    </w:p>
-    <w:p>
-      <w:pPr>
-        <w:ind w:left="720"/>
-        <w:rPr>
-          <w:rFonts w:ascii="Trebuchet MS" w:hAnsi="Trebuchet MS"/>
-          <w:sz w:val="24"/>
-          <w:szCs w:val="24"/>
-        </w:rPr>
-      </w:pPr>
-    </w:p>
-    <w:p>
-      <w:pPr>
-        <w:ind w:left="720"/>
-        <w:rPr>
-          <w:rFonts w:ascii="Trebuchet MS" w:hAnsi="Trebuchet MS"/>
-          <w:sz w:val="24"/>
-          <w:szCs w:val="24"/>
-        </w:rPr>
-      </w:pPr>
-    </w:p>
-    <w:p>
-      <w:pPr>
-        <w:ind w:left="720"/>
-        <w:rPr>
-          <w:rFonts w:ascii="Trebuchet MS" w:hAnsi="Trebuchet MS"/>
-          <w:sz w:val="24"/>
-          <w:szCs w:val="24"/>
-        </w:rPr>
-      </w:pPr>
-    </w:p>
-    <w:p>
-      <w:pPr>
-        <w:ind w:left="720"/>
-        <w:rPr>
-          <w:rFonts w:ascii="Trebuchet MS" w:hAnsi="Trebuchet MS"/>
-          <w:sz w:val="24"/>
-          <w:szCs w:val="24"/>
-        </w:rPr>
-      </w:pPr>
-    </w:p>
-    <w:p>
-      <w:pPr>
-        <w:ind w:left="720"/>
-        <w:rPr>
-          <w:rFonts w:ascii="Trebuchet MS" w:hAnsi="Trebuchet MS"/>
-          <w:sz w:val="24"/>
-          <w:szCs w:val="24"/>
-        </w:rPr>
-      </w:pPr>
-    </w:p>
-    <w:p>
-      <w:pPr>
-        <w:ind w:left="720"/>
-        <w:rPr>
-          <w:rFonts w:ascii="Trebuchet MS" w:hAnsi="Trebuchet MS"/>
-          <w:sz w:val="24"/>
-          <w:szCs w:val="24"/>
-        </w:rPr>
-      </w:pPr>
-    </w:p>
-    <w:p>
-      <w:pPr>
-        <w:ind w:left="720"/>
-        <w:rPr>
-          <w:rFonts w:ascii="Trebuchet MS" w:hAnsi="Trebuchet MS"/>
-          <w:sz w:val="24"/>
-          <w:szCs w:val="24"/>
-        </w:rPr>
-      </w:pPr>
-      <w:r>
-        <w:rPr>
-          <w:noProof/>
-        </w:rPr>
+      </w:pPr>
+    </w:p>
+    <w:p>
+      <w:pPr>
+        <w:ind w:left="720"/>
+      </w:pPr>
+    </w:p>
+    <w:p>
+      <w:pPr>
+        <w:ind w:left="720"/>
+      </w:pPr>
+    </w:p>
+    <w:p>
+      <w:pPr>
+        <w:ind w:left="720"/>
+      </w:pPr>
+    </w:p>
+    <w:p>
+      <w:pPr>
+        <w:ind w:left="720"/>
+      </w:pPr>
+    </w:p>
+    <w:p>
+      <w:pPr>
+        <w:ind w:left="720"/>
+      </w:pPr>
+    </w:p>
+    <w:p>
+      <w:pPr>
+        <w:ind w:left="720"/>
+      </w:pPr>
+    </w:p>
+    <w:p>
+      <w:pPr>
+        <w:ind w:left="720"/>
+      </w:pPr>
+      <w:r>
         <w:lastRenderedPageBreak/>
         <w:drawing>
-          <wp:anchor distT="0" distB="0" distL="114300" distR="114300" simplePos="0" relativeHeight="251679744" behindDoc="0" locked="0" layoutInCell="1" allowOverlap="1" wp14:anchorId="6B4D34FA" wp14:editId="45ED0183">
+          <wp:anchor distT="0" distB="0" distL="114300" distR="114300" simplePos="0" relativeHeight="251679744" behindDoc="0" locked="0" layoutInCell="1" allowOverlap="1" wp14:anchorId="6B4D34FA" wp14:editId="1EA47495">
             <wp:simplePos x="0" y="0"/>
             <wp:positionH relativeFrom="margin">
               <wp:align>center</wp:align>
             </wp:positionH>
             <wp:positionV relativeFrom="paragraph">
-              <wp:posOffset>1295400</wp:posOffset>
+              <wp:posOffset>933450</wp:posOffset>
             </wp:positionV>
             <wp:extent cx="2157730" cy="2305050"/>
             <wp:effectExtent l="0" t="0" r="0" b="0"/>
@@ -2902,125 +2911,74 @@
         </w:drawing>
       </w:r>
       <w:r>
-        <w:rPr>
-          <w:rFonts w:ascii="Trebuchet MS" w:hAnsi="Trebuchet MS"/>
-          <w:sz w:val="24"/>
-          <w:szCs w:val="24"/>
-        </w:rPr>
         <w:t xml:space="preserve">I will next add the POI </w:t>
       </w:r>
       <w:r>
-        <w:rPr>
-          <w:rFonts w:ascii="Trebuchet MS" w:hAnsi="Trebuchet MS"/>
-          <w:sz w:val="24"/>
-          <w:szCs w:val="24"/>
-        </w:rPr>
         <w:t>Data Access Object (DAO)</w:t>
       </w:r>
       <w:r>
-        <w:rPr>
-          <w:rFonts w:ascii="Trebuchet MS" w:hAnsi="Trebuchet MS"/>
-          <w:sz w:val="24"/>
-          <w:szCs w:val="24"/>
-        </w:rPr>
         <w:t xml:space="preserve">, this will set the </w:t>
       </w:r>
       <w:r>
-        <w:rPr>
-          <w:rFonts w:ascii="Trebuchet MS" w:hAnsi="Trebuchet MS"/>
-          <w:sz w:val="24"/>
-          <w:szCs w:val="24"/>
-        </w:rPr>
         <w:t xml:space="preserve">methods </w:t>
       </w:r>
       <w:r>
-        <w:rPr>
-          <w:rFonts w:ascii="Trebuchet MS" w:hAnsi="Trebuchet MS"/>
-          <w:sz w:val="24"/>
-          <w:szCs w:val="24"/>
-        </w:rPr>
         <w:t xml:space="preserve">for the database so it can be changed or searched. I plan to make it so that when the database returns all the POIs it contains, it will return it as a </w:t>
       </w:r>
       <w:proofErr w:type="spellStart"/>
       <w:r>
-        <w:rPr>
-          <w:rFonts w:ascii="Trebuchet MS" w:hAnsi="Trebuchet MS"/>
-          <w:i/>
-          <w:iCs/>
-          <w:sz w:val="24"/>
-          <w:szCs w:val="24"/>
-        </w:rPr>
         <w:t>LiveData</w:t>
       </w:r>
       <w:proofErr w:type="spellEnd"/>
       <w:r>
-        <w:rPr>
-          <w:rFonts w:ascii="Trebuchet MS" w:hAnsi="Trebuchet MS"/>
-          <w:i/>
-          <w:iCs/>
-          <w:sz w:val="24"/>
-          <w:szCs w:val="24"/>
-        </w:rPr>
-        <w:t>&lt;List&lt;Poi&gt;&gt;</w:t>
-      </w:r>
-      <w:r>
-        <w:rPr>
-          <w:rFonts w:ascii="Trebuchet MS" w:hAnsi="Trebuchet MS"/>
-          <w:sz w:val="24"/>
-          <w:szCs w:val="24"/>
-        </w:rPr>
-        <w:t xml:space="preserve">. This will </w:t>
-      </w:r>
-      <w:r>
-        <w:rPr>
-          <w:rFonts w:ascii="Trebuchet MS" w:hAnsi="Trebuchet MS"/>
-          <w:sz w:val="24"/>
-          <w:szCs w:val="24"/>
-        </w:rPr>
+        <w:t xml:space="preserve">&lt;List&lt;Poi&gt;&gt;. This will </w:t>
+      </w:r>
+      <w:r>
         <w:t>make</w:t>
       </w:r>
       <w:r>
-        <w:rPr>
-          <w:rFonts w:ascii="Trebuchet MS" w:hAnsi="Trebuchet MS"/>
-          <w:sz w:val="24"/>
-          <w:szCs w:val="24"/>
-        </w:rPr>
         <w:t xml:space="preserve"> sure that the UI is automatically updated with a new list of POIs whenever the database is changed.</w:t>
       </w:r>
       <w:r>
-        <w:rPr>
-          <w:rFonts w:ascii="Trebuchet MS" w:hAnsi="Trebuchet MS"/>
-          <w:sz w:val="24"/>
-          <w:szCs w:val="24"/>
-        </w:rPr>
-        <w:t xml:space="preserve"> For now, I will give it three functions, getAllPois(), insert() and delete().</w:t>
-      </w:r>
-    </w:p>
-    <w:p>
-      <w:pPr>
-        <w:ind w:left="720"/>
-        <w:rPr>
-          <w:rFonts w:ascii="Trebuchet MS" w:hAnsi="Trebuchet MS"/>
-          <w:sz w:val="24"/>
-          <w:szCs w:val="24"/>
-        </w:rPr>
-      </w:pPr>
-    </w:p>
-    <w:p>
-      <w:pPr>
-        <w:ind w:left="720"/>
-        <w:rPr>
-          <w:rFonts w:ascii="Trebuchet MS" w:hAnsi="Trebuchet MS"/>
-          <w:sz w:val="24"/>
-          <w:szCs w:val="24"/>
-        </w:rPr>
-      </w:pPr>
-      <w:r>
-        <w:rPr>
-          <w:noProof/>
-        </w:rPr>
+        <w:t xml:space="preserve"> For now, I will give it three functions, </w:t>
+      </w:r>
+      <w:proofErr w:type="gramStart"/>
+      <w:r>
+        <w:t>getAllPois(</w:t>
+      </w:r>
+      <w:proofErr w:type="gramEnd"/>
+      <w:r>
+        <w:t xml:space="preserve">), </w:t>
+      </w:r>
+      <w:proofErr w:type="gramStart"/>
+      <w:r>
+        <w:t>insert(</w:t>
+      </w:r>
+      <w:proofErr w:type="gramEnd"/>
+      <w:r>
+        <w:t xml:space="preserve">) and </w:t>
+      </w:r>
+      <w:proofErr w:type="gramStart"/>
+      <w:r>
+        <w:t>delete(</w:t>
+      </w:r>
+      <w:proofErr w:type="gramEnd"/>
+      <w:r>
+        <w:t>).</w:t>
+      </w:r>
+    </w:p>
+    <w:p>
+      <w:pPr>
+        <w:ind w:left="720"/>
+      </w:pPr>
+    </w:p>
+    <w:p>
+      <w:pPr>
+        <w:ind w:left="720"/>
+      </w:pPr>
+      <w:r>
         <w:drawing>
-          <wp:anchor distT="0" distB="0" distL="114300" distR="114300" simplePos="0" relativeHeight="251680768" behindDoc="0" locked="0" layoutInCell="1" allowOverlap="1" wp14:anchorId="67BE6305" wp14:editId="71FA3EA6">
+          <wp:anchor distT="0" distB="0" distL="114300" distR="114300" simplePos="0" relativeHeight="251680768" behindDoc="0" locked="0" layoutInCell="1" allowOverlap="1" wp14:anchorId="67BE6305" wp14:editId="4E76A900">
             <wp:simplePos x="0" y="0"/>
             <wp:positionH relativeFrom="margin">
               <wp:align>center</wp:align>
@@ -3076,48 +3034,38 @@
         </w:drawing>
       </w:r>
       <w:r>
-        <w:rPr>
-          <w:rFonts w:ascii="Trebuchet MS" w:hAnsi="Trebuchet MS"/>
-          <w:sz w:val="24"/>
-          <w:szCs w:val="24"/>
-        </w:rPr>
         <w:t xml:space="preserve">I plan to next create the file for the database itself. This will be placed within an abstract function which allows my other files to access its DAO and all the database operations within it. Inside it I will put a </w:t>
       </w:r>
       <w:proofErr w:type="spellStart"/>
-      <w:r>
-        <w:rPr>
-          <w:rFonts w:ascii="Trebuchet MS" w:hAnsi="Trebuchet MS"/>
-          <w:sz w:val="24"/>
-          <w:szCs w:val="24"/>
-        </w:rPr>
+      <w:proofErr w:type="gramStart"/>
+      <w:r>
         <w:t>getDatabase</w:t>
       </w:r>
       <w:proofErr w:type="spellEnd"/>
       <w:r>
-        <w:rPr>
-          <w:rFonts w:ascii="Trebuchet MS" w:hAnsi="Trebuchet MS"/>
-          <w:sz w:val="24"/>
-          <w:szCs w:val="24"/>
-        </w:rPr>
-        <w:t>() function which will check that a database doesn’t already exist, if not it will create one and save it, otherwise it will simply return the one that already exists.</w:t>
-      </w:r>
-    </w:p>
-    <w:p>
-      <w:pPr>
-        <w:ind w:left="720"/>
-        <w:rPr>
-          <w:rFonts w:ascii="Trebuchet MS" w:hAnsi="Trebuchet MS"/>
-          <w:sz w:val="24"/>
-          <w:szCs w:val="24"/>
-        </w:rPr>
-      </w:pPr>
-      <w:r>
-        <w:rPr>
-          <w:noProof/>
-        </w:rPr>
+        <w:t>(</w:t>
+      </w:r>
+      <w:proofErr w:type="gramEnd"/>
+      <w:r>
+        <w:t xml:space="preserve">) function which will check that a database </w:t>
+      </w:r>
+      <w:proofErr w:type="gramStart"/>
+      <w:r>
+        <w:t>doesn’t already</w:t>
+      </w:r>
+      <w:proofErr w:type="gramEnd"/>
+      <w:r>
+        <w:t xml:space="preserve"> exist, if not it will create one and save it, otherwise it will simply return the one that already exists.</w:t>
+      </w:r>
+    </w:p>
+    <w:p>
+      <w:pPr>
+        <w:ind w:left="720"/>
+      </w:pPr>
+      <w:r>
         <w:lastRenderedPageBreak/>
         <w:drawing>
-          <wp:anchor distT="0" distB="0" distL="114300" distR="114300" simplePos="0" relativeHeight="251681792" behindDoc="0" locked="0" layoutInCell="1" allowOverlap="1" wp14:anchorId="7CE67090" wp14:editId="6D2F0C56">
+          <wp:anchor distT="0" distB="0" distL="114300" distR="114300" simplePos="0" relativeHeight="251681792" behindDoc="0" locked="0" layoutInCell="1" allowOverlap="1" wp14:anchorId="7CE67090" wp14:editId="532CADD5">
             <wp:simplePos x="0" y="0"/>
             <wp:positionH relativeFrom="margin">
               <wp:align>center</wp:align>
@@ -3173,205 +3121,102 @@
         </w:drawing>
       </w:r>
       <w:r>
-        <w:rPr>
-          <w:rFonts w:ascii="Trebuchet MS" w:hAnsi="Trebuchet MS"/>
-          <w:sz w:val="24"/>
-          <w:szCs w:val="24"/>
-        </w:rPr>
         <w:t xml:space="preserve">I will next update my </w:t>
       </w:r>
       <w:proofErr w:type="spellStart"/>
       <w:r>
-        <w:rPr>
-          <w:rFonts w:ascii="Trebuchet MS" w:hAnsi="Trebuchet MS"/>
-          <w:sz w:val="24"/>
-          <w:szCs w:val="24"/>
-        </w:rPr>
         <w:t>Viewmodel</w:t>
       </w:r>
       <w:proofErr w:type="spellEnd"/>
       <w:r>
-        <w:rPr>
-          <w:rFonts w:ascii="Trebuchet MS" w:hAnsi="Trebuchet MS"/>
-          <w:sz w:val="24"/>
-          <w:szCs w:val="24"/>
-        </w:rPr>
         <w:t xml:space="preserve">. </w:t>
       </w:r>
       <w:r>
-        <w:rPr>
-          <w:rFonts w:ascii="Trebuchet MS" w:hAnsi="Trebuchet MS"/>
-          <w:sz w:val="24"/>
-          <w:szCs w:val="24"/>
-        </w:rPr>
         <w:t xml:space="preserve">I will first change the </w:t>
       </w:r>
       <w:proofErr w:type="spellStart"/>
       <w:r>
-        <w:rPr>
-          <w:rFonts w:ascii="Trebuchet MS" w:hAnsi="Trebuchet MS"/>
-          <w:sz w:val="24"/>
-          <w:szCs w:val="24"/>
-        </w:rPr>
         <w:t>ViewModel</w:t>
       </w:r>
       <w:proofErr w:type="spellEnd"/>
       <w:r>
-        <w:rPr>
-          <w:rFonts w:ascii="Trebuchet MS" w:hAnsi="Trebuchet MS"/>
-          <w:sz w:val="24"/>
-          <w:szCs w:val="24"/>
-        </w:rPr>
-        <w:t xml:space="preserve"> for a </w:t>
-      </w:r>
-      <w:proofErr w:type="spellStart"/>
-      <w:r>
-        <w:rPr>
-          <w:rFonts w:ascii="Trebuchet MS" w:hAnsi="Trebuchet MS"/>
-          <w:sz w:val="24"/>
-          <w:szCs w:val="24"/>
-        </w:rPr>
+        <w:t xml:space="preserve"> for </w:t>
+      </w:r>
+      <w:proofErr w:type="gramStart"/>
+      <w:r>
+        <w:t xml:space="preserve">a </w:t>
+      </w:r>
+      <w:proofErr w:type="spellStart"/>
+      <w:r>
         <w:t>AndroidViewModel</w:t>
       </w:r>
       <w:proofErr w:type="spellEnd"/>
-      <w:r>
-        <w:rPr>
-          <w:rFonts w:ascii="Trebuchet MS" w:hAnsi="Trebuchet MS"/>
-          <w:sz w:val="24"/>
-          <w:szCs w:val="24"/>
-        </w:rPr>
+      <w:proofErr w:type="gramEnd"/>
+      <w:r>
         <w:t xml:space="preserve"> so that it can access the application context which will be needed to open the database. </w:t>
       </w:r>
       <w:r>
-        <w:rPr>
-          <w:rFonts w:ascii="Trebuchet MS" w:hAnsi="Trebuchet MS"/>
-          <w:sz w:val="24"/>
-          <w:szCs w:val="24"/>
-        </w:rPr>
         <w:t xml:space="preserve">I plan to update the poi variable so that it gathers all the pois from the database as </w:t>
       </w:r>
       <w:proofErr w:type="spellStart"/>
       <w:r>
-        <w:rPr>
-          <w:rFonts w:ascii="Trebuchet MS" w:hAnsi="Trebuchet MS"/>
-          <w:sz w:val="24"/>
-          <w:szCs w:val="24"/>
-        </w:rPr>
         <w:t>LiveData</w:t>
       </w:r>
       <w:proofErr w:type="spellEnd"/>
       <w:r>
-        <w:rPr>
-          <w:rFonts w:ascii="Trebuchet MS" w:hAnsi="Trebuchet MS"/>
-          <w:sz w:val="24"/>
-          <w:szCs w:val="24"/>
-        </w:rPr>
         <w:t xml:space="preserve"> allowing it to automatically update when a new POI is added. Because of this, I will also need to change the </w:t>
       </w:r>
       <w:proofErr w:type="spellStart"/>
       <w:r>
-        <w:rPr>
-          <w:rFonts w:ascii="Trebuchet MS" w:hAnsi="Trebuchet MS"/>
-          <w:sz w:val="24"/>
-          <w:szCs w:val="24"/>
-        </w:rPr>
         <w:t>addpoi</w:t>
       </w:r>
       <w:proofErr w:type="spellEnd"/>
       <w:r>
-        <w:rPr>
-          <w:rFonts w:ascii="Trebuchet MS" w:hAnsi="Trebuchet MS"/>
-          <w:sz w:val="24"/>
-          <w:szCs w:val="24"/>
-        </w:rPr>
         <w:t xml:space="preserve"> function in the </w:t>
       </w:r>
       <w:proofErr w:type="spellStart"/>
       <w:r>
-        <w:rPr>
-          <w:rFonts w:ascii="Trebuchet MS" w:hAnsi="Trebuchet MS"/>
-          <w:sz w:val="24"/>
-          <w:szCs w:val="24"/>
-        </w:rPr>
         <w:t>Viewmodel</w:t>
       </w:r>
       <w:proofErr w:type="spellEnd"/>
       <w:r>
-        <w:rPr>
-          <w:rFonts w:ascii="Trebuchet MS" w:hAnsi="Trebuchet MS"/>
-          <w:sz w:val="24"/>
-          <w:szCs w:val="24"/>
-        </w:rPr>
         <w:t xml:space="preserve"> so that it adds the poi to the database instead of list using the </w:t>
       </w:r>
       <w:proofErr w:type="spellStart"/>
       <w:r>
-        <w:rPr>
-          <w:rFonts w:ascii="Trebuchet MS" w:hAnsi="Trebuchet MS"/>
-          <w:sz w:val="24"/>
-          <w:szCs w:val="24"/>
-        </w:rPr>
         <w:t>poiDao’s</w:t>
       </w:r>
       <w:proofErr w:type="spellEnd"/>
       <w:r>
-        <w:rPr>
-          <w:rFonts w:ascii="Trebuchet MS" w:hAnsi="Trebuchet MS"/>
-          <w:sz w:val="24"/>
-          <w:szCs w:val="24"/>
-        </w:rPr>
         <w:t xml:space="preserve"> ins</w:t>
       </w:r>
       <w:r>
-        <w:rPr>
-          <w:rFonts w:ascii="Trebuchet MS" w:hAnsi="Trebuchet MS"/>
-          <w:sz w:val="24"/>
-          <w:szCs w:val="24"/>
-        </w:rPr>
         <w:t>ert function.</w:t>
       </w:r>
     </w:p>
     <w:p>
       <w:pPr>
         <w:ind w:left="720"/>
-        <w:rPr>
-          <w:rFonts w:ascii="Trebuchet MS" w:hAnsi="Trebuchet MS"/>
-          <w:sz w:val="24"/>
-          <w:szCs w:val="24"/>
-        </w:rPr>
-      </w:pPr>
-    </w:p>
-    <w:p>
-      <w:pPr>
-        <w:ind w:left="720"/>
-        <w:rPr>
-          <w:rFonts w:ascii="Trebuchet MS" w:hAnsi="Trebuchet MS"/>
-          <w:sz w:val="24"/>
-          <w:szCs w:val="24"/>
-        </w:rPr>
-      </w:pPr>
-    </w:p>
-    <w:p>
-      <w:pPr>
-        <w:ind w:left="720"/>
-        <w:rPr>
-          <w:rFonts w:ascii="Trebuchet MS" w:hAnsi="Trebuchet MS"/>
-          <w:sz w:val="24"/>
-          <w:szCs w:val="24"/>
-        </w:rPr>
-      </w:pPr>
-      <w:r>
-        <w:rPr>
-          <w:noProof/>
-        </w:rPr>
+      </w:pPr>
+    </w:p>
+    <w:p>
+      <w:pPr>
+        <w:ind w:left="720"/>
+      </w:pPr>
+    </w:p>
+    <w:p>
+      <w:pPr>
+        <w:ind w:left="720"/>
+      </w:pPr>
+      <w:r>
         <w:drawing>
-          <wp:anchor distT="0" distB="0" distL="114300" distR="114300" simplePos="0" relativeHeight="251682816" behindDoc="0" locked="0" layoutInCell="1" allowOverlap="1" wp14:anchorId="0ABF882C" wp14:editId="2E143B9C">
+          <wp:anchor distT="0" distB="0" distL="114300" distR="114300" simplePos="0" relativeHeight="251682816" behindDoc="0" locked="0" layoutInCell="1" allowOverlap="1" wp14:anchorId="0ABF882C" wp14:editId="7C324563">
             <wp:simplePos x="0" y="0"/>
             <wp:positionH relativeFrom="margin">
-              <wp:align>center</wp:align>
+              <wp:posOffset>1708150</wp:posOffset>
             </wp:positionH>
             <wp:positionV relativeFrom="paragraph">
-              <wp:posOffset>704215</wp:posOffset>
+              <wp:posOffset>4304030</wp:posOffset>
             </wp:positionV>
             <wp:extent cx="2543175" cy="1959610"/>
             <wp:effectExtent l="0" t="0" r="9525" b="2540"/>
@@ -3421,54 +3266,60 @@
         </w:drawing>
       </w:r>
       <w:r>
-        <w:rPr>
-          <w:rFonts w:ascii="Trebuchet MS" w:hAnsi="Trebuchet MS"/>
-          <w:sz w:val="24"/>
-          <w:szCs w:val="24"/>
-        </w:rPr>
         <w:t xml:space="preserve">I will then update the button for my </w:t>
       </w:r>
       <w:proofErr w:type="spellStart"/>
       <w:r>
-        <w:rPr>
-          <w:rFonts w:ascii="Trebuchet MS" w:hAnsi="Trebuchet MS"/>
-          <w:sz w:val="24"/>
-          <w:szCs w:val="24"/>
-        </w:rPr>
         <w:t>AddPoiScreen</w:t>
       </w:r>
       <w:proofErr w:type="spellEnd"/>
       <w:r>
-        <w:rPr>
-          <w:rFonts w:ascii="Trebuchet MS" w:hAnsi="Trebuchet MS"/>
-          <w:sz w:val="24"/>
-          <w:szCs w:val="24"/>
-        </w:rPr>
         <w:t>. I will simply change the Poi structure in the button so that it fits the databases poi structure since the latitude and longitude for the pois in the database are separate variables.</w:t>
       </w:r>
     </w:p>
     <w:p>
       <w:pPr>
         <w:ind w:left="720"/>
-        <w:rPr>
-          <w:rFonts w:ascii="Trebuchet MS" w:hAnsi="Trebuchet MS"/>
-          <w:sz w:val="24"/>
-          <w:szCs w:val="24"/>
-        </w:rPr>
-      </w:pPr>
-      <w:r>
-        <w:rPr>
-          <w:noProof/>
-        </w:rPr>
+      </w:pPr>
+    </w:p>
+    <w:p>
+      <w:pPr>
+        <w:ind w:left="720"/>
+      </w:pPr>
+      <w:r>
         <w:lastRenderedPageBreak/>
+        <w:t xml:space="preserve">I will then need to change the </w:t>
+      </w:r>
+      <w:proofErr w:type="spellStart"/>
+      <w:r>
+        <w:t>MainActivity</w:t>
+      </w:r>
+      <w:proofErr w:type="spellEnd"/>
+      <w:r>
+        <w:t xml:space="preserve"> so that the Poi is converted back into the </w:t>
+      </w:r>
+      <w:proofErr w:type="spellStart"/>
+      <w:r>
+        <w:t>LatLng</w:t>
+      </w:r>
+      <w:proofErr w:type="spellEnd"/>
+      <w:r>
+        <w:t xml:space="preserve"> so that the map can properly mark its location.</w:t>
+      </w:r>
+    </w:p>
+    <w:p>
+      <w:pPr>
+        <w:ind w:left="720"/>
+      </w:pPr>
+      <w:r>
         <w:drawing>
-          <wp:anchor distT="0" distB="0" distL="114300" distR="114300" simplePos="0" relativeHeight="251683840" behindDoc="0" locked="0" layoutInCell="1" allowOverlap="1" wp14:anchorId="3BBBDE1F" wp14:editId="235A82AC">
+          <wp:anchor distT="0" distB="0" distL="114300" distR="114300" simplePos="0" relativeHeight="251683840" behindDoc="0" locked="0" layoutInCell="1" allowOverlap="1" wp14:anchorId="3BBBDE1F" wp14:editId="3DD490B1">
             <wp:simplePos x="0" y="0"/>
             <wp:positionH relativeFrom="margin">
-              <wp:align>center</wp:align>
+              <wp:posOffset>908050</wp:posOffset>
             </wp:positionH>
             <wp:positionV relativeFrom="paragraph">
-              <wp:posOffset>495300</wp:posOffset>
+              <wp:posOffset>335280</wp:posOffset>
             </wp:positionV>
             <wp:extent cx="4257675" cy="1514475"/>
             <wp:effectExtent l="0" t="0" r="9525" b="9525"/>
@@ -3511,79 +3362,17 @@
           </wp:anchor>
         </w:drawing>
       </w:r>
-      <w:r>
-        <w:rPr>
-          <w:rFonts w:ascii="Trebuchet MS" w:hAnsi="Trebuchet MS"/>
-          <w:sz w:val="24"/>
-          <w:szCs w:val="24"/>
-        </w:rPr>
-        <w:t xml:space="preserve">I will then need to change the </w:t>
-      </w:r>
-      <w:proofErr w:type="spellStart"/>
-      <w:r>
-        <w:rPr>
-          <w:rFonts w:ascii="Trebuchet MS" w:hAnsi="Trebuchet MS"/>
-          <w:sz w:val="24"/>
-          <w:szCs w:val="24"/>
-        </w:rPr>
-        <w:t>MainActivity</w:t>
-      </w:r>
-      <w:proofErr w:type="spellEnd"/>
-      <w:r>
-        <w:rPr>
-          <w:rFonts w:ascii="Trebuchet MS" w:hAnsi="Trebuchet MS"/>
-          <w:sz w:val="24"/>
-          <w:szCs w:val="24"/>
-        </w:rPr>
-        <w:t xml:space="preserve"> so that the Poi is converted back into the </w:t>
-      </w:r>
-      <w:proofErr w:type="spellStart"/>
-      <w:r>
-        <w:rPr>
-          <w:rFonts w:ascii="Trebuchet MS" w:hAnsi="Trebuchet MS"/>
-          <w:sz w:val="24"/>
-          <w:szCs w:val="24"/>
-        </w:rPr>
-        <w:t>LatLng</w:t>
-      </w:r>
-      <w:proofErr w:type="spellEnd"/>
-      <w:r>
-        <w:rPr>
-          <w:rFonts w:ascii="Trebuchet MS" w:hAnsi="Trebuchet MS"/>
-          <w:sz w:val="24"/>
-          <w:szCs w:val="24"/>
-        </w:rPr>
-        <w:t xml:space="preserve"> so that the map can properly mark its location.</w:t>
-      </w:r>
-    </w:p>
-    <w:p>
-      <w:pPr>
-        <w:ind w:left="720"/>
-        <w:rPr>
-          <w:rFonts w:ascii="Trebuchet MS" w:hAnsi="Trebuchet MS"/>
-          <w:sz w:val="24"/>
-          <w:szCs w:val="24"/>
-        </w:rPr>
-      </w:pPr>
-    </w:p>
-    <w:p>
-      <w:pPr>
-        <w:ind w:left="720"/>
-        <w:rPr>
-          <w:rFonts w:ascii="Trebuchet MS" w:hAnsi="Trebuchet MS"/>
-          <w:sz w:val="24"/>
-          <w:szCs w:val="24"/>
-        </w:rPr>
-      </w:pPr>
-    </w:p>
-    <w:p>
-      <w:pPr>
-        <w:ind w:left="720"/>
-      </w:pPr>
-      <w:r>
-        <w:rPr>
-          <w:noProof/>
-        </w:rPr>
+    </w:p>
+    <w:p>
+      <w:pPr>
+        <w:ind w:left="720"/>
+      </w:pPr>
+    </w:p>
+    <w:p>
+      <w:pPr>
+        <w:ind w:left="720"/>
+      </w:pPr>
+      <w:r>
         <w:drawing>
           <wp:anchor distT="0" distB="0" distL="114300" distR="114300" simplePos="0" relativeHeight="251684864" behindDoc="0" locked="0" layoutInCell="1" allowOverlap="1" wp14:anchorId="071F14F2" wp14:editId="3B520E16">
             <wp:simplePos x="0" y="0"/>
@@ -3730,6 +3519,344 @@
     <w:p>
       <w:pPr>
         <w:ind w:left="720"/>
+      </w:pPr>
+      <w:r>
+        <w:t xml:space="preserve">I have already set up the loading process for the POIs for task 3. This is done on </w:t>
+      </w:r>
+      <w:proofErr w:type="gramStart"/>
+      <w:r>
+        <w:t>startup and</w:t>
+      </w:r>
+      <w:proofErr w:type="gramEnd"/>
+      <w:r>
+        <w:t xml:space="preserve"> whenever the database is updated. </w:t>
+      </w:r>
+      <w:r>
+        <w:t>However, to fit this task better I will change the code to use a button instead, this will make testing easier and give the user more control.</w:t>
+      </w:r>
+    </w:p>
+    <w:p>
+      <w:pPr>
+        <w:ind w:left="720"/>
+      </w:pPr>
+    </w:p>
+    <w:p>
+      <w:pPr>
+        <w:ind w:left="720"/>
+      </w:pPr>
+      <w:r>
+        <w:t xml:space="preserve">I will start this by changing the DAO to </w:t>
+      </w:r>
+      <w:proofErr w:type="gramStart"/>
+      <w:r>
+        <w:t>return</w:t>
+      </w:r>
+      <w:proofErr w:type="gramEnd"/>
+      <w:r>
+        <w:t xml:space="preserve"> a plain list instead of </w:t>
+      </w:r>
+      <w:proofErr w:type="gramStart"/>
+      <w:r>
+        <w:t xml:space="preserve">the </w:t>
+      </w:r>
+      <w:proofErr w:type="spellStart"/>
+      <w:r>
+        <w:t>LiveData</w:t>
+      </w:r>
+      <w:proofErr w:type="spellEnd"/>
+      <w:proofErr w:type="gramEnd"/>
+      <w:r>
+        <w:t xml:space="preserve"> since the POIs will no longer be automatically loaded. </w:t>
+      </w:r>
+    </w:p>
+    <w:p>
+      <w:pPr>
+        <w:ind w:left="720"/>
+      </w:pPr>
+    </w:p>
+    <w:p>
+      <w:pPr>
+        <w:ind w:left="720"/>
+      </w:pPr>
+      <w:r>
+        <w:drawing>
+          <wp:anchor distT="0" distB="0" distL="114300" distR="114300" simplePos="0" relativeHeight="251685888" behindDoc="0" locked="0" layoutInCell="1" allowOverlap="1" wp14:anchorId="4D5B797D" wp14:editId="7771ABD3">
+            <wp:simplePos x="0" y="0"/>
+            <wp:positionH relativeFrom="margin">
+              <wp:posOffset>1577975</wp:posOffset>
+            </wp:positionH>
+            <wp:positionV relativeFrom="paragraph">
+              <wp:posOffset>236855</wp:posOffset>
+            </wp:positionV>
+            <wp:extent cx="2825895" cy="425472"/>
+            <wp:effectExtent l="0" t="0" r="0" b="0"/>
+            <wp:wrapTopAndBottom/>
+            <wp:docPr id="2067830354" name="Picture 1"/>
+            <wp:cNvGraphicFramePr>
+              <a:graphicFrameLocks xmlns:a="http://schemas.openxmlformats.org/drawingml/2006/main" noChangeAspect="1"/>
+            </wp:cNvGraphicFramePr>
+            <a:graphic xmlns:a="http://schemas.openxmlformats.org/drawingml/2006/main">
+              <a:graphicData uri="http://schemas.openxmlformats.org/drawingml/2006/picture">
+                <pic:pic xmlns:pic="http://schemas.openxmlformats.org/drawingml/2006/picture">
+                  <pic:nvPicPr>
+                    <pic:cNvPr id="2067830354" name=""/>
+                    <pic:cNvPicPr/>
+                  </pic:nvPicPr>
+                  <pic:blipFill>
+                    <a:blip r:embed="rId31">
+                      <a:extLst>
+                        <a:ext uri="{28A0092B-C50C-407E-A947-70E740481C1C}">
+                          <a14:useLocalDpi xmlns:a14="http://schemas.microsoft.com/office/drawing/2010/main" val="0"/>
+                        </a:ext>
+                      </a:extLst>
+                    </a:blip>
+                    <a:stretch>
+                      <a:fillRect/>
+                    </a:stretch>
+                  </pic:blipFill>
+                  <pic:spPr>
+                    <a:xfrm>
+                      <a:off x="0" y="0"/>
+                      <a:ext cx="2825895" cy="425472"/>
+                    </a:xfrm>
+                    <a:prstGeom prst="rect">
+                      <a:avLst/>
+                    </a:prstGeom>
+                  </pic:spPr>
+                </pic:pic>
+              </a:graphicData>
+            </a:graphic>
+          </wp:anchor>
+        </w:drawing>
+      </w:r>
+    </w:p>
+    <w:p>
+      <w:pPr>
+        <w:ind w:left="720"/>
+      </w:pPr>
+    </w:p>
+    <w:p>
+      <w:pPr>
+        <w:ind w:left="720"/>
+      </w:pPr>
+    </w:p>
+    <w:p>
+      <w:pPr>
+        <w:ind w:left="720"/>
+      </w:pPr>
+    </w:p>
+    <w:p>
+      <w:pPr>
+        <w:ind w:left="720"/>
+      </w:pPr>
+      <w:r>
+        <w:lastRenderedPageBreak/>
+        <w:drawing>
+          <wp:anchor distT="0" distB="0" distL="114300" distR="114300" simplePos="0" relativeHeight="251686912" behindDoc="0" locked="0" layoutInCell="1" allowOverlap="1" wp14:anchorId="3EB7CA82" wp14:editId="7A3F647E">
+            <wp:simplePos x="0" y="0"/>
+            <wp:positionH relativeFrom="margin">
+              <wp:align>center</wp:align>
+            </wp:positionH>
+            <wp:positionV relativeFrom="paragraph">
+              <wp:posOffset>895350</wp:posOffset>
+            </wp:positionV>
+            <wp:extent cx="4464279" cy="1682836"/>
+            <wp:effectExtent l="0" t="0" r="0" b="0"/>
+            <wp:wrapTopAndBottom/>
+            <wp:docPr id="439480192" name="Picture 1"/>
+            <wp:cNvGraphicFramePr>
+              <a:graphicFrameLocks xmlns:a="http://schemas.openxmlformats.org/drawingml/2006/main" noChangeAspect="1"/>
+            </wp:cNvGraphicFramePr>
+            <a:graphic xmlns:a="http://schemas.openxmlformats.org/drawingml/2006/main">
+              <a:graphicData uri="http://schemas.openxmlformats.org/drawingml/2006/picture">
+                <pic:pic xmlns:pic="http://schemas.openxmlformats.org/drawingml/2006/picture">
+                  <pic:nvPicPr>
+                    <pic:cNvPr id="439480192" name=""/>
+                    <pic:cNvPicPr/>
+                  </pic:nvPicPr>
+                  <pic:blipFill>
+                    <a:blip r:embed="rId32">
+                      <a:extLst>
+                        <a:ext uri="{28A0092B-C50C-407E-A947-70E740481C1C}">
+                          <a14:useLocalDpi xmlns:a14="http://schemas.microsoft.com/office/drawing/2010/main" val="0"/>
+                        </a:ext>
+                      </a:extLst>
+                    </a:blip>
+                    <a:stretch>
+                      <a:fillRect/>
+                    </a:stretch>
+                  </pic:blipFill>
+                  <pic:spPr>
+                    <a:xfrm>
+                      <a:off x="0" y="0"/>
+                      <a:ext cx="4464279" cy="1682836"/>
+                    </a:xfrm>
+                    <a:prstGeom prst="rect">
+                      <a:avLst/>
+                    </a:prstGeom>
+                  </pic:spPr>
+                </pic:pic>
+              </a:graphicData>
+            </a:graphic>
+          </wp:anchor>
+        </w:drawing>
+      </w:r>
+      <w:r>
+        <w:t xml:space="preserve">I will also need to add a new function to the </w:t>
+      </w:r>
+      <w:proofErr w:type="spellStart"/>
+      <w:r>
+        <w:t>ViewModel</w:t>
+      </w:r>
+      <w:proofErr w:type="spellEnd"/>
+      <w:r>
+        <w:t xml:space="preserve"> which will load all the POIs from the database. It will run </w:t>
+      </w:r>
+      <w:r>
+        <w:t xml:space="preserve">the database query on Dispatchers.IO in the background, then </w:t>
+      </w:r>
+      <w:r>
+        <w:t>set</w:t>
+      </w:r>
+      <w:r>
+        <w:t xml:space="preserve"> the result to </w:t>
+      </w:r>
+      <w:proofErr w:type="spellStart"/>
+      <w:r>
+        <w:t>pois.value</w:t>
+      </w:r>
+      <w:proofErr w:type="spellEnd"/>
+      <w:r>
+        <w:t xml:space="preserve"> which </w:t>
+      </w:r>
+      <w:r>
+        <w:t xml:space="preserve">should </w:t>
+      </w:r>
+      <w:proofErr w:type="gramStart"/>
+      <w:r>
+        <w:t>triggers</w:t>
+      </w:r>
+      <w:proofErr w:type="gramEnd"/>
+      <w:r>
+        <w:t xml:space="preserve"> the observer in </w:t>
+      </w:r>
+      <w:proofErr w:type="spellStart"/>
+      <w:r>
+        <w:t>MainActivity</w:t>
+      </w:r>
+      <w:proofErr w:type="spellEnd"/>
+      <w:r>
+        <w:t xml:space="preserve"> </w:t>
+      </w:r>
+      <w:r>
+        <w:t xml:space="preserve">which will then </w:t>
+      </w:r>
+      <w:r>
+        <w:t>update the map.</w:t>
+      </w:r>
+    </w:p>
+    <w:p>
+      <w:pPr>
+        <w:ind w:left="720"/>
+      </w:pPr>
+    </w:p>
+    <w:p>
+      <w:pPr>
+        <w:ind w:left="720"/>
+      </w:pPr>
+      <w:r>
+        <w:drawing>
+          <wp:anchor distT="0" distB="0" distL="114300" distR="114300" simplePos="0" relativeHeight="251687936" behindDoc="0" locked="0" layoutInCell="1" allowOverlap="1" wp14:anchorId="5332FEEE" wp14:editId="570E690B">
+            <wp:simplePos x="0" y="0"/>
+            <wp:positionH relativeFrom="margin">
+              <wp:align>center</wp:align>
+            </wp:positionH>
+            <wp:positionV relativeFrom="paragraph">
+              <wp:posOffset>495300</wp:posOffset>
+            </wp:positionV>
+            <wp:extent cx="4476980" cy="273064"/>
+            <wp:effectExtent l="0" t="0" r="0" b="0"/>
+            <wp:wrapTopAndBottom/>
+            <wp:docPr id="692214188" name="Picture 1"/>
+            <wp:cNvGraphicFramePr>
+              <a:graphicFrameLocks xmlns:a="http://schemas.openxmlformats.org/drawingml/2006/main" noChangeAspect="1"/>
+            </wp:cNvGraphicFramePr>
+            <a:graphic xmlns:a="http://schemas.openxmlformats.org/drawingml/2006/main">
+              <a:graphicData uri="http://schemas.openxmlformats.org/drawingml/2006/picture">
+                <pic:pic xmlns:pic="http://schemas.openxmlformats.org/drawingml/2006/picture">
+                  <pic:nvPicPr>
+                    <pic:cNvPr id="692214188" name=""/>
+                    <pic:cNvPicPr/>
+                  </pic:nvPicPr>
+                  <pic:blipFill>
+                    <a:blip r:embed="rId33">
+                      <a:extLst>
+                        <a:ext uri="{28A0092B-C50C-407E-A947-70E740481C1C}">
+                          <a14:useLocalDpi xmlns:a14="http://schemas.microsoft.com/office/drawing/2010/main" val="0"/>
+                        </a:ext>
+                      </a:extLst>
+                    </a:blip>
+                    <a:stretch>
+                      <a:fillRect/>
+                    </a:stretch>
+                  </pic:blipFill>
+                  <pic:spPr>
+                    <a:xfrm>
+                      <a:off x="0" y="0"/>
+                      <a:ext cx="4476980" cy="273064"/>
+                    </a:xfrm>
+                    <a:prstGeom prst="rect">
+                      <a:avLst/>
+                    </a:prstGeom>
+                  </pic:spPr>
+                </pic:pic>
+              </a:graphicData>
+            </a:graphic>
+          </wp:anchor>
+        </w:drawing>
+      </w:r>
+      <w:r>
+        <w:t xml:space="preserve">I will then also need to change the poi variable so that </w:t>
+      </w:r>
+      <w:r>
+        <w:t>it</w:t>
+      </w:r>
+      <w:r>
+        <w:t xml:space="preserve"> holds a plain list of pois instead of being assigned directly from the DAO’s live data since it no longer returns </w:t>
+      </w:r>
+      <w:proofErr w:type="spellStart"/>
+      <w:r>
+        <w:t>LiveData</w:t>
+      </w:r>
+      <w:proofErr w:type="spellEnd"/>
+      <w:r>
+        <w:t>.</w:t>
+      </w:r>
+    </w:p>
+    <w:p>
+      <w:pPr>
+        <w:ind w:left="720"/>
+      </w:pPr>
+    </w:p>
+    <w:p>
+      <w:pPr>
+        <w:ind w:left="720"/>
+      </w:pPr>
+      <w:r>
+        <w:t xml:space="preserve">I will then lastly need to add the load buttons to the </w:t>
+      </w:r>
+      <w:proofErr w:type="spellStart"/>
+      <w:r>
+        <w:t>MainActivity</w:t>
+      </w:r>
+      <w:proofErr w:type="spellEnd"/>
+      <w:r>
+        <w:t>. This will call the load poi function in the view model, loading all the pois from the database into the UI.</w:t>
+      </w:r>
+    </w:p>
+    <w:p>
+      <w:pPr>
+        <w:ind w:left="720"/>
         <w:rPr>
           <w:rFonts w:ascii="Trebuchet MS" w:hAnsi="Trebuchet MS"/>
           <w:color w:val="000000"/>
@@ -3738,346 +3865,55 @@
         </w:rPr>
       </w:pPr>
       <w:r>
-        <w:rPr>
-          <w:rFonts w:ascii="Trebuchet MS" w:hAnsi="Trebuchet MS"/>
-          <w:color w:val="000000"/>
-          <w:sz w:val="24"/>
-          <w:szCs w:val="24"/>
-        </w:rPr>
-        <w:t xml:space="preserve">I have already set up the loading process for the POIs for task 3. This is done on startup and whenever the database is updated. </w:t>
-      </w:r>
-      <w:r>
-        <w:rPr>
-          <w:rFonts w:ascii="Trebuchet MS" w:hAnsi="Trebuchet MS"/>
-          <w:color w:val="000000"/>
-          <w:sz w:val="24"/>
-          <w:szCs w:val="24"/>
-        </w:rPr>
-        <w:t>However, to fit this task better I will change the code to use a button instead, this will make testing easier and give the user more control.</w:t>
-      </w:r>
-    </w:p>
-    <w:p>
-      <w:pPr>
-        <w:ind w:left="720"/>
-        <w:rPr>
-          <w:rFonts w:ascii="Trebuchet MS" w:hAnsi="Trebuchet MS"/>
-          <w:color w:val="000000"/>
-          <w:sz w:val="24"/>
-          <w:szCs w:val="24"/>
-        </w:rPr>
-      </w:pPr>
-    </w:p>
-    <w:p>
-      <w:pPr>
-        <w:ind w:left="720"/>
-        <w:rPr>
-          <w:rFonts w:ascii="Trebuchet MS" w:hAnsi="Trebuchet MS"/>
-          <w:color w:val="000000"/>
-          <w:sz w:val="24"/>
-          <w:szCs w:val="24"/>
-        </w:rPr>
-      </w:pPr>
-      <w:r>
-        <w:rPr>
-          <w:rFonts w:ascii="Trebuchet MS" w:hAnsi="Trebuchet MS"/>
-          <w:color w:val="000000"/>
-          <w:sz w:val="24"/>
-          <w:szCs w:val="24"/>
-        </w:rPr>
-        <w:t xml:space="preserve">I will start this by changing the DAO to return a plain list instead of </w:t>
-      </w:r>
-      <w:r>
-        <w:rPr>
-          <w:rFonts w:ascii="Trebuchet MS" w:hAnsi="Trebuchet MS"/>
-          <w:color w:val="000000"/>
-          <w:sz w:val="24"/>
-          <w:szCs w:val="24"/>
-        </w:rPr>
-        <w:t xml:space="preserve">the </w:t>
-      </w:r>
-      <w:proofErr w:type="spellStart"/>
-      <w:r>
-        <w:rPr>
-          <w:rFonts w:ascii="Trebuchet MS" w:hAnsi="Trebuchet MS"/>
-          <w:color w:val="000000"/>
-          <w:sz w:val="24"/>
-          <w:szCs w:val="24"/>
-        </w:rPr>
-        <w:t>LiveData</w:t>
-      </w:r>
-      <w:proofErr w:type="spellEnd"/>
-      <w:r>
-        <w:rPr>
-          <w:rFonts w:ascii="Trebuchet MS" w:hAnsi="Trebuchet MS"/>
-          <w:color w:val="000000"/>
-          <w:sz w:val="24"/>
-          <w:szCs w:val="24"/>
-        </w:rPr>
-        <w:t xml:space="preserve"> since the POIs will no longer be automatically loaded. </w:t>
-      </w:r>
-    </w:p>
-    <w:p>
-      <w:pPr>
-        <w:ind w:left="720"/>
-        <w:rPr>
-          <w:rFonts w:ascii="Trebuchet MS" w:hAnsi="Trebuchet MS"/>
-          <w:color w:val="000000"/>
-          <w:sz w:val="24"/>
-          <w:szCs w:val="24"/>
-        </w:rPr>
-      </w:pPr>
-    </w:p>
-    <w:p>
-      <w:pPr>
-        <w:ind w:left="720"/>
-        <w:rPr>
-          <w:rFonts w:ascii="Trebuchet MS" w:hAnsi="Trebuchet MS"/>
-          <w:color w:val="000000"/>
-          <w:sz w:val="24"/>
-          <w:szCs w:val="24"/>
-        </w:rPr>
-      </w:pPr>
-      <w:r>
-        <w:rPr>
-          <w:rFonts w:ascii="Trebuchet MS" w:hAnsi="Trebuchet MS"/>
-          <w:color w:val="000000"/>
-          <w:sz w:val="24"/>
-          <w:szCs w:val="24"/>
-        </w:rPr>
-        <w:t xml:space="preserve">I will also need to add a new function to the </w:t>
-      </w:r>
-      <w:proofErr w:type="spellStart"/>
-      <w:r>
-        <w:rPr>
-          <w:rFonts w:ascii="Trebuchet MS" w:hAnsi="Trebuchet MS"/>
-          <w:color w:val="000000"/>
-          <w:sz w:val="24"/>
-          <w:szCs w:val="24"/>
-        </w:rPr>
-        <w:t>ViewModel</w:t>
-      </w:r>
-      <w:proofErr w:type="spellEnd"/>
-      <w:r>
-        <w:rPr>
-          <w:rFonts w:ascii="Trebuchet MS" w:hAnsi="Trebuchet MS"/>
-          <w:color w:val="000000"/>
-          <w:sz w:val="24"/>
-          <w:szCs w:val="24"/>
-        </w:rPr>
-        <w:t xml:space="preserve"> which will load all the POIs from the database. It will run </w:t>
-      </w:r>
-      <w:r>
-        <w:rPr>
-          <w:rFonts w:ascii="Trebuchet MS" w:hAnsi="Trebuchet MS"/>
-          <w:color w:val="000000"/>
-          <w:sz w:val="24"/>
-          <w:szCs w:val="24"/>
-        </w:rPr>
-        <w:t xml:space="preserve">the database query on Dispatchers.IO in the background, then </w:t>
-      </w:r>
-      <w:r>
-        <w:rPr>
-          <w:rFonts w:ascii="Trebuchet MS" w:hAnsi="Trebuchet MS"/>
-          <w:color w:val="000000"/>
-          <w:sz w:val="24"/>
-          <w:szCs w:val="24"/>
-        </w:rPr>
-        <w:t>set</w:t>
-      </w:r>
-      <w:r>
-        <w:rPr>
-          <w:rFonts w:ascii="Trebuchet MS" w:hAnsi="Trebuchet MS"/>
-          <w:color w:val="000000"/>
-          <w:sz w:val="24"/>
-          <w:szCs w:val="24"/>
-        </w:rPr>
-        <w:t xml:space="preserve"> the result to </w:t>
-      </w:r>
-      <w:proofErr w:type="spellStart"/>
-      <w:r>
-        <w:rPr>
-          <w:rFonts w:ascii="Trebuchet MS" w:hAnsi="Trebuchet MS"/>
-          <w:color w:val="000000"/>
-          <w:sz w:val="24"/>
-          <w:szCs w:val="24"/>
-        </w:rPr>
-        <w:t>pois.value</w:t>
-      </w:r>
-      <w:proofErr w:type="spellEnd"/>
-      <w:r>
-        <w:rPr>
-          <w:rFonts w:ascii="Trebuchet MS" w:hAnsi="Trebuchet MS"/>
-          <w:color w:val="000000"/>
-          <w:sz w:val="24"/>
-          <w:szCs w:val="24"/>
-        </w:rPr>
-        <w:t xml:space="preserve"> which </w:t>
-      </w:r>
-      <w:r>
-        <w:rPr>
-          <w:rFonts w:ascii="Trebuchet MS" w:hAnsi="Trebuchet MS"/>
-          <w:color w:val="000000"/>
-          <w:sz w:val="24"/>
-          <w:szCs w:val="24"/>
-        </w:rPr>
-        <w:t xml:space="preserve">should </w:t>
-      </w:r>
-      <w:r>
-        <w:rPr>
-          <w:rFonts w:ascii="Trebuchet MS" w:hAnsi="Trebuchet MS"/>
-          <w:color w:val="000000"/>
-          <w:sz w:val="24"/>
-          <w:szCs w:val="24"/>
-        </w:rPr>
-        <w:t xml:space="preserve">triggers the observer in </w:t>
-      </w:r>
-      <w:proofErr w:type="spellStart"/>
-      <w:r>
-        <w:rPr>
-          <w:rFonts w:ascii="Trebuchet MS" w:hAnsi="Trebuchet MS"/>
-          <w:color w:val="000000"/>
-          <w:sz w:val="24"/>
-          <w:szCs w:val="24"/>
-        </w:rPr>
-        <w:t>MainActivity</w:t>
-      </w:r>
-      <w:proofErr w:type="spellEnd"/>
-      <w:r>
-        <w:rPr>
-          <w:rFonts w:ascii="Trebuchet MS" w:hAnsi="Trebuchet MS"/>
-          <w:color w:val="000000"/>
-          <w:sz w:val="24"/>
-          <w:szCs w:val="24"/>
-        </w:rPr>
-        <w:t xml:space="preserve"> </w:t>
-      </w:r>
-      <w:r>
-        <w:rPr>
-          <w:rFonts w:ascii="Trebuchet MS" w:hAnsi="Trebuchet MS"/>
-          <w:color w:val="000000"/>
-          <w:sz w:val="24"/>
-          <w:szCs w:val="24"/>
-        </w:rPr>
-        <w:t xml:space="preserve">which will then </w:t>
-      </w:r>
-      <w:r>
-        <w:rPr>
-          <w:rFonts w:ascii="Trebuchet MS" w:hAnsi="Trebuchet MS"/>
-          <w:color w:val="000000"/>
-          <w:sz w:val="24"/>
-          <w:szCs w:val="24"/>
-        </w:rPr>
-        <w:t>update the map.</w:t>
-      </w:r>
-    </w:p>
-    <w:p>
-      <w:pPr>
-        <w:ind w:left="720"/>
-        <w:rPr>
-          <w:rFonts w:ascii="Trebuchet MS" w:hAnsi="Trebuchet MS"/>
-          <w:color w:val="000000"/>
-          <w:sz w:val="24"/>
-          <w:szCs w:val="24"/>
-        </w:rPr>
-      </w:pPr>
-    </w:p>
-    <w:p>
-      <w:pPr>
-        <w:ind w:left="720"/>
-        <w:rPr>
-          <w:rFonts w:ascii="Trebuchet MS" w:hAnsi="Trebuchet MS"/>
-          <w:color w:val="000000"/>
-          <w:sz w:val="24"/>
-          <w:szCs w:val="24"/>
-        </w:rPr>
-      </w:pPr>
-      <w:r>
-        <w:rPr>
-          <w:rFonts w:ascii="Trebuchet MS" w:hAnsi="Trebuchet MS"/>
-          <w:color w:val="000000"/>
-          <w:sz w:val="24"/>
-          <w:szCs w:val="24"/>
-        </w:rPr>
-        <w:t xml:space="preserve">I will then also need to change the poi variable so that </w:t>
-      </w:r>
-      <w:r>
-        <w:rPr>
-          <w:rFonts w:ascii="Trebuchet MS" w:hAnsi="Trebuchet MS"/>
-          <w:color w:val="000000"/>
-          <w:sz w:val="24"/>
-          <w:szCs w:val="24"/>
-        </w:rPr>
-        <w:t>it</w:t>
-      </w:r>
-      <w:r>
-        <w:rPr>
-          <w:rFonts w:ascii="Trebuchet MS" w:hAnsi="Trebuchet MS"/>
-          <w:color w:val="000000"/>
-          <w:sz w:val="24"/>
-          <w:szCs w:val="24"/>
-        </w:rPr>
-        <w:t xml:space="preserve"> holds a plain list of pois instead of being assigned directly from the DAO’s live data since it no longer returns </w:t>
-      </w:r>
-      <w:proofErr w:type="spellStart"/>
-      <w:r>
-        <w:rPr>
-          <w:rFonts w:ascii="Trebuchet MS" w:hAnsi="Trebuchet MS"/>
-          <w:color w:val="000000"/>
-          <w:sz w:val="24"/>
-          <w:szCs w:val="24"/>
-        </w:rPr>
-        <w:t>LiveData</w:t>
-      </w:r>
-      <w:proofErr w:type="spellEnd"/>
-      <w:r>
-        <w:rPr>
-          <w:rFonts w:ascii="Trebuchet MS" w:hAnsi="Trebuchet MS"/>
-          <w:color w:val="000000"/>
-          <w:sz w:val="24"/>
-          <w:szCs w:val="24"/>
-        </w:rPr>
-        <w:t>.</w:t>
-      </w:r>
-    </w:p>
-    <w:p>
-      <w:pPr>
-        <w:ind w:left="720"/>
-        <w:rPr>
-          <w:rFonts w:ascii="Trebuchet MS" w:hAnsi="Trebuchet MS"/>
-          <w:color w:val="000000"/>
-          <w:sz w:val="24"/>
-          <w:szCs w:val="24"/>
-        </w:rPr>
-      </w:pPr>
-      <w:r>
-        <w:rPr>
-          <w:rFonts w:ascii="Trebuchet MS" w:hAnsi="Trebuchet MS"/>
-          <w:color w:val="000000"/>
-          <w:sz w:val="24"/>
-          <w:szCs w:val="24"/>
-        </w:rPr>
-        <w:lastRenderedPageBreak/>
-        <w:t xml:space="preserve">I will then lastly need to add the load buttons to the </w:t>
-      </w:r>
-      <w:proofErr w:type="spellStart"/>
-      <w:r>
-        <w:rPr>
-          <w:rFonts w:ascii="Trebuchet MS" w:hAnsi="Trebuchet MS"/>
-          <w:color w:val="000000"/>
-          <w:sz w:val="24"/>
-          <w:szCs w:val="24"/>
-        </w:rPr>
-        <w:t>MainActivity</w:t>
-      </w:r>
-      <w:proofErr w:type="spellEnd"/>
-      <w:r>
-        <w:rPr>
-          <w:rFonts w:ascii="Trebuchet MS" w:hAnsi="Trebuchet MS"/>
-          <w:color w:val="000000"/>
-          <w:sz w:val="24"/>
-          <w:szCs w:val="24"/>
-        </w:rPr>
-        <w:t>. This will call the load poi function in the view model, loading all the pois from the database into the UI.</w:t>
+        <w:drawing>
+          <wp:anchor distT="0" distB="0" distL="114300" distR="114300" simplePos="0" relativeHeight="251688960" behindDoc="0" locked="0" layoutInCell="1" allowOverlap="1" wp14:anchorId="560D152B" wp14:editId="7B346EED">
+            <wp:simplePos x="0" y="0"/>
+            <wp:positionH relativeFrom="margin">
+              <wp:align>center</wp:align>
+            </wp:positionH>
+            <wp:positionV relativeFrom="paragraph">
+              <wp:posOffset>163195</wp:posOffset>
+            </wp:positionV>
+            <wp:extent cx="3924502" cy="635033"/>
+            <wp:effectExtent l="0" t="0" r="0" b="0"/>
+            <wp:wrapTopAndBottom/>
+            <wp:docPr id="552437994" name="Picture 1"/>
+            <wp:cNvGraphicFramePr>
+              <a:graphicFrameLocks xmlns:a="http://schemas.openxmlformats.org/drawingml/2006/main" noChangeAspect="1"/>
+            </wp:cNvGraphicFramePr>
+            <a:graphic xmlns:a="http://schemas.openxmlformats.org/drawingml/2006/main">
+              <a:graphicData uri="http://schemas.openxmlformats.org/drawingml/2006/picture">
+                <pic:pic xmlns:pic="http://schemas.openxmlformats.org/drawingml/2006/picture">
+                  <pic:nvPicPr>
+                    <pic:cNvPr id="552437994" name=""/>
+                    <pic:cNvPicPr/>
+                  </pic:nvPicPr>
+                  <pic:blipFill>
+                    <a:blip r:embed="rId34">
+                      <a:extLst>
+                        <a:ext uri="{28A0092B-C50C-407E-A947-70E740481C1C}">
+                          <a14:useLocalDpi xmlns:a14="http://schemas.microsoft.com/office/drawing/2010/main" val="0"/>
+                        </a:ext>
+                      </a:extLst>
+                    </a:blip>
+                    <a:stretch>
+                      <a:fillRect/>
+                    </a:stretch>
+                  </pic:blipFill>
+                  <pic:spPr>
+                    <a:xfrm>
+                      <a:off x="0" y="0"/>
+                      <a:ext cx="3924502" cy="635033"/>
+                    </a:xfrm>
+                    <a:prstGeom prst="rect">
+                      <a:avLst/>
+                    </a:prstGeom>
+                  </pic:spPr>
+                </pic:pic>
+              </a:graphicData>
+            </a:graphic>
+          </wp:anchor>
+        </w:drawing>
       </w:r>
     </w:p>
     <w:p>

</xml_diff>

<commit_message>
Updated report for task 5
</commit_message>
<xml_diff>
--- a/MAD_Report.docx
+++ b/MAD_Report.docx
@@ -373,73 +373,7 @@
           <w:sz w:val="24"/>
           <w:szCs w:val="24"/>
         </w:rPr>
-        <w:t xml:space="preserve">I will first start with this task by setting up the dependencies in my </w:t>
-      </w:r>
-      <w:proofErr w:type="spellStart"/>
-      <w:proofErr w:type="gramStart"/>
-      <w:r>
-        <w:rPr>
-          <w:rFonts w:ascii="Trebuchet MS" w:eastAsia="Trebuchet MS" w:hAnsi="Trebuchet MS" w:cs="Trebuchet MS"/>
-          <w:sz w:val="24"/>
-          <w:szCs w:val="24"/>
-        </w:rPr>
-        <w:t>build.gradle</w:t>
-      </w:r>
-      <w:proofErr w:type="spellEnd"/>
-      <w:proofErr w:type="gramEnd"/>
-      <w:r>
-        <w:rPr>
-          <w:rFonts w:ascii="Trebuchet MS" w:eastAsia="Trebuchet MS" w:hAnsi="Trebuchet MS" w:cs="Trebuchet MS"/>
-          <w:sz w:val="24"/>
-          <w:szCs w:val="24"/>
-        </w:rPr>
-        <w:t xml:space="preserve"> and </w:t>
-      </w:r>
-      <w:proofErr w:type="spellStart"/>
-      <w:proofErr w:type="gramStart"/>
-      <w:r>
-        <w:rPr>
-          <w:rFonts w:ascii="Trebuchet MS" w:eastAsia="Trebuchet MS" w:hAnsi="Trebuchet MS" w:cs="Trebuchet MS"/>
-          <w:sz w:val="24"/>
-          <w:szCs w:val="24"/>
-        </w:rPr>
-        <w:t>libs.versions</w:t>
-      </w:r>
-      <w:proofErr w:type="gramEnd"/>
-      <w:r>
-        <w:rPr>
-          <w:rFonts w:ascii="Trebuchet MS" w:eastAsia="Trebuchet MS" w:hAnsi="Trebuchet MS" w:cs="Trebuchet MS"/>
-          <w:sz w:val="24"/>
-          <w:szCs w:val="24"/>
-        </w:rPr>
-        <w:t>.toml</w:t>
-      </w:r>
-      <w:proofErr w:type="spellEnd"/>
-      <w:r>
-        <w:rPr>
-          <w:rFonts w:ascii="Trebuchet MS" w:eastAsia="Trebuchet MS" w:hAnsi="Trebuchet MS" w:cs="Trebuchet MS"/>
-          <w:sz w:val="24"/>
-          <w:szCs w:val="24"/>
-        </w:rPr>
-        <w:t xml:space="preserve"> files. I will add </w:t>
-      </w:r>
-      <w:proofErr w:type="spellStart"/>
-      <w:r>
-        <w:rPr>
-          <w:rFonts w:ascii="Trebuchet MS" w:eastAsia="Trebuchet MS" w:hAnsi="Trebuchet MS" w:cs="Trebuchet MS"/>
-          <w:sz w:val="24"/>
-          <w:szCs w:val="24"/>
-        </w:rPr>
-        <w:t>MapLibre</w:t>
-      </w:r>
-      <w:proofErr w:type="spellEnd"/>
-      <w:r>
-        <w:rPr>
-          <w:rFonts w:ascii="Trebuchet MS" w:eastAsia="Trebuchet MS" w:hAnsi="Trebuchet MS" w:cs="Trebuchet MS"/>
-          <w:sz w:val="24"/>
-          <w:szCs w:val="24"/>
-        </w:rPr>
-        <w:t xml:space="preserve"> with Vulkan support, the Ramani Maps Compose wrapper, and the standard AndroidX libraries needed for Compose.</w:t>
+        <w:t>I will first start with this task by setting up the dependencies in my build.gradle and libs.versions.toml files. I will add MapLibre with Vulkan support, the Ramani Maps Compose wrapper, and the standard AndroidX libraries needed for Compose.</w:t>
       </w:r>
       <w:r>
         <w:rPr>
@@ -572,25 +506,7 @@
           <w:sz w:val="24"/>
           <w:szCs w:val="24"/>
         </w:rPr>
-        <w:t xml:space="preserve">Then in the AndroidManifest.xml, I will set up the ACCESS_FINE_LOCATION and ACCESS_COARSE_LOCATION permissions, as well as INTERNET, since the map tiles will be gathered remotely from </w:t>
-      </w:r>
-      <w:proofErr w:type="spellStart"/>
-      <w:r>
-        <w:rPr>
-          <w:rFonts w:ascii="Trebuchet MS" w:eastAsia="Trebuchet MS" w:hAnsi="Trebuchet MS" w:cs="Trebuchet MS"/>
-          <w:sz w:val="24"/>
-          <w:szCs w:val="24"/>
-        </w:rPr>
-        <w:t>OpenFreeMap</w:t>
-      </w:r>
-      <w:proofErr w:type="spellEnd"/>
-      <w:r>
-        <w:rPr>
-          <w:rFonts w:ascii="Trebuchet MS" w:eastAsia="Trebuchet MS" w:hAnsi="Trebuchet MS" w:cs="Trebuchet MS"/>
-          <w:sz w:val="24"/>
-          <w:szCs w:val="24"/>
-        </w:rPr>
-        <w:t>.</w:t>
+        <w:t>Then in the AndroidManifest.xml, I will set up the ACCESS_FINE_LOCATION and ACCESS_COARSE_LOCATION permissions, as well as INTERNET, since the map tiles will be gathered remotely from OpenFreeMap.</w:t>
       </w:r>
       <w:r>
         <w:rPr>
@@ -736,43 +652,7 @@
           <w:sz w:val="24"/>
           <w:szCs w:val="24"/>
         </w:rPr>
-        <w:t xml:space="preserve">To manage the location state in both the activity and UI, I will need to add a </w:t>
-      </w:r>
-      <w:proofErr w:type="spellStart"/>
-      <w:r>
-        <w:rPr>
-          <w:rFonts w:ascii="Trebuchet MS" w:eastAsia="Trebuchet MS" w:hAnsi="Trebuchet MS" w:cs="Trebuchet MS"/>
-          <w:sz w:val="24"/>
-          <w:szCs w:val="24"/>
-        </w:rPr>
-        <w:t>LatLngViewModel</w:t>
-      </w:r>
-      <w:proofErr w:type="spellEnd"/>
-      <w:r>
-        <w:rPr>
-          <w:rFonts w:ascii="Trebuchet MS" w:eastAsia="Trebuchet MS" w:hAnsi="Trebuchet MS" w:cs="Trebuchet MS"/>
-          <w:sz w:val="24"/>
-          <w:szCs w:val="24"/>
-        </w:rPr>
-        <w:t xml:space="preserve"> class that will hold a </w:t>
-      </w:r>
-      <w:proofErr w:type="spellStart"/>
-      <w:r>
-        <w:rPr>
-          <w:rFonts w:ascii="Trebuchet MS" w:eastAsia="Trebuchet MS" w:hAnsi="Trebuchet MS" w:cs="Trebuchet MS"/>
-          <w:sz w:val="24"/>
-          <w:szCs w:val="24"/>
-        </w:rPr>
-        <w:t>latLng</w:t>
-      </w:r>
-      <w:proofErr w:type="spellEnd"/>
-      <w:r>
-        <w:rPr>
-          <w:rFonts w:ascii="Trebuchet MS" w:eastAsia="Trebuchet MS" w:hAnsi="Trebuchet MS" w:cs="Trebuchet MS"/>
-          <w:sz w:val="24"/>
-          <w:szCs w:val="24"/>
-        </w:rPr>
-        <w:t xml:space="preserve"> property backed by a MutableLiveData object. </w:t>
+        <w:t xml:space="preserve">To manage the location state in both the activity and UI, I will need to add a LatLngViewModel class that will hold a latLng property backed by a MutableLiveData object. </w:t>
       </w:r>
     </w:p>
     <w:p>
@@ -799,43 +679,7 @@
           <w:szCs w:val="24"/>
         </w:rPr>
         <w:lastRenderedPageBreak/>
-        <w:t xml:space="preserve">Whenever the </w:t>
-      </w:r>
-      <w:proofErr w:type="spellStart"/>
-      <w:r>
-        <w:rPr>
-          <w:rFonts w:ascii="Trebuchet MS" w:eastAsia="Trebuchet MS" w:hAnsi="Trebuchet MS" w:cs="Trebuchet MS"/>
-          <w:sz w:val="24"/>
-          <w:szCs w:val="24"/>
-        </w:rPr>
-        <w:t>latLng</w:t>
-      </w:r>
-      <w:proofErr w:type="spellEnd"/>
-      <w:r>
-        <w:rPr>
-          <w:rFonts w:ascii="Trebuchet MS" w:eastAsia="Trebuchet MS" w:hAnsi="Trebuchet MS" w:cs="Trebuchet MS"/>
-          <w:sz w:val="24"/>
-          <w:szCs w:val="24"/>
-        </w:rPr>
-        <w:t xml:space="preserve"> is updated, i.e. the user's location changes, it should automatically push the new value to </w:t>
-      </w:r>
-      <w:proofErr w:type="spellStart"/>
-      <w:r>
-        <w:rPr>
-          <w:rFonts w:ascii="Trebuchet MS" w:eastAsia="Trebuchet MS" w:hAnsi="Trebuchet MS" w:cs="Trebuchet MS"/>
-          <w:sz w:val="24"/>
-          <w:szCs w:val="24"/>
-        </w:rPr>
-        <w:t>latLngLiveData</w:t>
-      </w:r>
-      <w:proofErr w:type="spellEnd"/>
-      <w:r>
-        <w:rPr>
-          <w:rFonts w:ascii="Trebuchet MS" w:eastAsia="Trebuchet MS" w:hAnsi="Trebuchet MS" w:cs="Trebuchet MS"/>
-          <w:sz w:val="24"/>
-          <w:szCs w:val="24"/>
-        </w:rPr>
-        <w:t xml:space="preserve">, making it observable from the UI layer.  </w:t>
+        <w:t xml:space="preserve">Whenever the latLng is updated, i.e. the user's location changes, it should automatically push the new value to latLngLiveData, making it observable from the UI layer.  </w:t>
       </w:r>
     </w:p>
     <w:p>
@@ -927,79 +771,7 @@
           <w:sz w:val="24"/>
           <w:szCs w:val="24"/>
         </w:rPr>
-        <w:t xml:space="preserve">In the MainActivity, I will add the </w:t>
-      </w:r>
-      <w:proofErr w:type="spellStart"/>
-      <w:r>
-        <w:rPr>
-          <w:rFonts w:ascii="Trebuchet MS" w:eastAsia="Trebuchet MS" w:hAnsi="Trebuchet MS" w:cs="Trebuchet MS"/>
-          <w:sz w:val="24"/>
-          <w:szCs w:val="24"/>
-        </w:rPr>
-        <w:t>LocationListener</w:t>
-      </w:r>
-      <w:proofErr w:type="spellEnd"/>
-      <w:r>
-        <w:rPr>
-          <w:rFonts w:ascii="Trebuchet MS" w:eastAsia="Trebuchet MS" w:hAnsi="Trebuchet MS" w:cs="Trebuchet MS"/>
-          <w:sz w:val="24"/>
-          <w:szCs w:val="24"/>
-        </w:rPr>
-        <w:t xml:space="preserve"> interface. This will allow me to override the </w:t>
-      </w:r>
-      <w:proofErr w:type="spellStart"/>
-      <w:r>
-        <w:rPr>
-          <w:rFonts w:ascii="Trebuchet MS" w:eastAsia="Trebuchet MS" w:hAnsi="Trebuchet MS" w:cs="Trebuchet MS"/>
-          <w:sz w:val="24"/>
-          <w:szCs w:val="24"/>
-        </w:rPr>
-        <w:t>onLocationChanged</w:t>
-      </w:r>
-      <w:proofErr w:type="spellEnd"/>
-      <w:r>
-        <w:rPr>
-          <w:rFonts w:ascii="Trebuchet MS" w:eastAsia="Trebuchet MS" w:hAnsi="Trebuchet MS" w:cs="Trebuchet MS"/>
-          <w:sz w:val="24"/>
-          <w:szCs w:val="24"/>
-        </w:rPr>
-        <w:t xml:space="preserve"> function, where I will update the </w:t>
-      </w:r>
-      <w:proofErr w:type="spellStart"/>
-      <w:r>
-        <w:rPr>
-          <w:rFonts w:ascii="Trebuchet MS" w:eastAsia="Trebuchet MS" w:hAnsi="Trebuchet MS" w:cs="Trebuchet MS"/>
-          <w:sz w:val="24"/>
-          <w:szCs w:val="24"/>
-        </w:rPr>
-        <w:t>ViewModel's</w:t>
-      </w:r>
-      <w:proofErr w:type="spellEnd"/>
-      <w:r>
-        <w:rPr>
-          <w:rFonts w:ascii="Trebuchet MS" w:eastAsia="Trebuchet MS" w:hAnsi="Trebuchet MS" w:cs="Trebuchet MS"/>
-          <w:sz w:val="24"/>
-          <w:szCs w:val="24"/>
-        </w:rPr>
-        <w:t xml:space="preserve"> </w:t>
-      </w:r>
-      <w:proofErr w:type="spellStart"/>
-      <w:r>
-        <w:rPr>
-          <w:rFonts w:ascii="Trebuchet MS" w:eastAsia="Trebuchet MS" w:hAnsi="Trebuchet MS" w:cs="Trebuchet MS"/>
-          <w:sz w:val="24"/>
-          <w:szCs w:val="24"/>
-        </w:rPr>
-        <w:t>latLng</w:t>
-      </w:r>
-      <w:proofErr w:type="spellEnd"/>
-      <w:r>
-        <w:rPr>
-          <w:rFonts w:ascii="Trebuchet MS" w:eastAsia="Trebuchet MS" w:hAnsi="Trebuchet MS" w:cs="Trebuchet MS"/>
-          <w:sz w:val="24"/>
-          <w:szCs w:val="24"/>
-        </w:rPr>
-        <w:t xml:space="preserve"> with the current coordinates gathered by the device itself.</w:t>
+        <w:t>In the MainActivity, I will add the LocationListener interface. This will allow me to override the onLocationChanged function, where I will update the ViewModel's latLng with the current coordinates gathered by the device itself.</w:t>
       </w:r>
       <w:r>
         <w:rPr>
@@ -1139,61 +911,7 @@
           <w:sz w:val="24"/>
           <w:szCs w:val="24"/>
         </w:rPr>
-        <w:t xml:space="preserve">To start receiving GPS updates, I will create a GPS function that will retrieve the </w:t>
-      </w:r>
-      <w:proofErr w:type="spellStart"/>
-      <w:r>
-        <w:rPr>
-          <w:rFonts w:ascii="Trebuchet MS" w:eastAsia="Trebuchet MS" w:hAnsi="Trebuchet MS" w:cs="Trebuchet MS"/>
-          <w:sz w:val="24"/>
-          <w:szCs w:val="24"/>
-        </w:rPr>
-        <w:t>LocationManager</w:t>
-      </w:r>
-      <w:proofErr w:type="spellEnd"/>
-      <w:r>
-        <w:rPr>
-          <w:rFonts w:ascii="Trebuchet MS" w:eastAsia="Trebuchet MS" w:hAnsi="Trebuchet MS" w:cs="Trebuchet MS"/>
-          <w:sz w:val="24"/>
-          <w:szCs w:val="24"/>
-        </w:rPr>
-        <w:t xml:space="preserve"> system service and call </w:t>
-      </w:r>
-      <w:proofErr w:type="spellStart"/>
-      <w:r>
-        <w:rPr>
-          <w:rFonts w:ascii="Trebuchet MS" w:eastAsia="Trebuchet MS" w:hAnsi="Trebuchet MS" w:cs="Trebuchet MS"/>
-          <w:sz w:val="24"/>
-          <w:szCs w:val="24"/>
-        </w:rPr>
-        <w:t>requestLocationUpdates</w:t>
-      </w:r>
-      <w:proofErr w:type="spellEnd"/>
-      <w:r>
-        <w:rPr>
-          <w:rFonts w:ascii="Trebuchet MS" w:eastAsia="Trebuchet MS" w:hAnsi="Trebuchet MS" w:cs="Trebuchet MS"/>
-          <w:sz w:val="24"/>
-          <w:szCs w:val="24"/>
-        </w:rPr>
-        <w:t xml:space="preserve">, which I will set to update every 2 seconds or after 5 </w:t>
-      </w:r>
-      <w:proofErr w:type="spellStart"/>
-      <w:r>
-        <w:rPr>
-          <w:rFonts w:ascii="Trebuchet MS" w:eastAsia="Trebuchet MS" w:hAnsi="Trebuchet MS" w:cs="Trebuchet MS"/>
-          <w:sz w:val="24"/>
-          <w:szCs w:val="24"/>
-        </w:rPr>
-        <w:t>metres</w:t>
-      </w:r>
-      <w:proofErr w:type="spellEnd"/>
-      <w:r>
-        <w:rPr>
-          <w:rFonts w:ascii="Trebuchet MS" w:eastAsia="Trebuchet MS" w:hAnsi="Trebuchet MS" w:cs="Trebuchet MS"/>
-          <w:sz w:val="24"/>
-          <w:szCs w:val="24"/>
-        </w:rPr>
-        <w:t xml:space="preserve"> of movement. This will keep the GPS accurate without slowing the machine down too much.</w:t>
+        <w:t>To start receiving GPS updates, I will create a GPS function that will retrieve the LocationManager system service and call requestLocationUpdates, which I will set to update every 2 seconds or after 5 metres of movement. This will keep the GPS accurate without slowing the machine down too much.</w:t>
       </w:r>
       <w:r>
         <w:rPr>
@@ -1316,35 +1034,7 @@
           <w:sz w:val="24"/>
           <w:szCs w:val="24"/>
         </w:rPr>
-        <w:t xml:space="preserve">I will also write a </w:t>
-      </w:r>
-      <w:proofErr w:type="spellStart"/>
-      <w:proofErr w:type="gramStart"/>
-      <w:r>
-        <w:rPr>
-          <w:rFonts w:ascii="Trebuchet MS" w:eastAsia="Trebuchet MS" w:hAnsi="Trebuchet MS" w:cs="Trebuchet MS"/>
-          <w:sz w:val="24"/>
-          <w:szCs w:val="24"/>
-        </w:rPr>
-        <w:t>checkPermissions</w:t>
-      </w:r>
-      <w:proofErr w:type="spellEnd"/>
-      <w:r>
-        <w:rPr>
-          <w:rFonts w:ascii="Trebuchet MS" w:eastAsia="Trebuchet MS" w:hAnsi="Trebuchet MS" w:cs="Trebuchet MS"/>
-          <w:sz w:val="24"/>
-          <w:szCs w:val="24"/>
-        </w:rPr>
-        <w:t xml:space="preserve"> function</w:t>
-      </w:r>
-      <w:proofErr w:type="gramEnd"/>
-      <w:r>
-        <w:rPr>
-          <w:rFonts w:ascii="Trebuchet MS" w:eastAsia="Trebuchet MS" w:hAnsi="Trebuchet MS" w:cs="Trebuchet MS"/>
-          <w:sz w:val="24"/>
-          <w:szCs w:val="24"/>
-        </w:rPr>
-        <w:t xml:space="preserve"> that will check whether the location permission has already been granted. If they haven’t, then it will launch a permission request. This will make sure that the GPS function is only called if the user approves the use of their location. A Toast message was shown if they denied it.</w:t>
+        <w:t>I will also write a checkPermissions function that will check whether the location permission has already been granted. If they haven’t, then it will launch a permission request. This will make sure that the GPS function is only called if the user approves the use of their location. A Toast message was shown if they denied it.</w:t>
       </w:r>
     </w:p>
     <w:p>
@@ -1475,169 +1165,7 @@
           <w:sz w:val="24"/>
           <w:szCs w:val="24"/>
         </w:rPr>
-        <w:t xml:space="preserve">Inside the </w:t>
-      </w:r>
-      <w:proofErr w:type="spellStart"/>
-      <w:r>
-        <w:rPr>
-          <w:rFonts w:ascii="Trebuchet MS" w:eastAsia="Trebuchet MS" w:hAnsi="Trebuchet MS" w:cs="Trebuchet MS"/>
-          <w:sz w:val="24"/>
-          <w:szCs w:val="24"/>
-        </w:rPr>
-        <w:t>setContent</w:t>
-      </w:r>
-      <w:proofErr w:type="spellEnd"/>
-      <w:r>
-        <w:rPr>
-          <w:rFonts w:ascii="Trebuchet MS" w:eastAsia="Trebuchet MS" w:hAnsi="Trebuchet MS" w:cs="Trebuchet MS"/>
-          <w:sz w:val="24"/>
-          <w:szCs w:val="24"/>
-        </w:rPr>
-        <w:t xml:space="preserve"> itself, I will use a </w:t>
-      </w:r>
-      <w:proofErr w:type="spellStart"/>
-      <w:r>
-        <w:rPr>
-          <w:rFonts w:ascii="Trebuchet MS" w:eastAsia="Trebuchet MS" w:hAnsi="Trebuchet MS" w:cs="Trebuchet MS"/>
-          <w:sz w:val="24"/>
-          <w:szCs w:val="24"/>
-        </w:rPr>
-        <w:t>mutablestate</w:t>
-      </w:r>
-      <w:proofErr w:type="spellEnd"/>
-      <w:r>
-        <w:rPr>
-          <w:rFonts w:ascii="Trebuchet MS" w:eastAsia="Trebuchet MS" w:hAnsi="Trebuchet MS" w:cs="Trebuchet MS"/>
-          <w:sz w:val="24"/>
-          <w:szCs w:val="24"/>
-        </w:rPr>
-        <w:t xml:space="preserve"> variable to hold the current LatLng and zoom level, observed the </w:t>
-      </w:r>
-      <w:proofErr w:type="spellStart"/>
-      <w:r>
-        <w:rPr>
-          <w:rFonts w:ascii="Trebuchet MS" w:eastAsia="Trebuchet MS" w:hAnsi="Trebuchet MS" w:cs="Trebuchet MS"/>
-          <w:sz w:val="24"/>
-          <w:szCs w:val="24"/>
-        </w:rPr>
-        <w:t>ViewModel's</w:t>
-      </w:r>
-      <w:proofErr w:type="spellEnd"/>
-      <w:r>
-        <w:rPr>
-          <w:rFonts w:ascii="Trebuchet MS" w:eastAsia="Trebuchet MS" w:hAnsi="Trebuchet MS" w:cs="Trebuchet MS"/>
-          <w:sz w:val="24"/>
-          <w:szCs w:val="24"/>
-        </w:rPr>
-        <w:t xml:space="preserve"> </w:t>
-      </w:r>
-      <w:proofErr w:type="spellStart"/>
-      <w:r>
-        <w:rPr>
-          <w:rFonts w:ascii="Trebuchet MS" w:eastAsia="Trebuchet MS" w:hAnsi="Trebuchet MS" w:cs="Trebuchet MS"/>
-          <w:sz w:val="24"/>
-          <w:szCs w:val="24"/>
-        </w:rPr>
-        <w:t>LiveData</w:t>
-      </w:r>
-      <w:proofErr w:type="spellEnd"/>
-      <w:r>
-        <w:rPr>
-          <w:rFonts w:ascii="Trebuchet MS" w:eastAsia="Trebuchet MS" w:hAnsi="Trebuchet MS" w:cs="Trebuchet MS"/>
-          <w:sz w:val="24"/>
-          <w:szCs w:val="24"/>
-        </w:rPr>
-        <w:t xml:space="preserve"> to keep that state updated, and pass the values into a </w:t>
-      </w:r>
-      <w:proofErr w:type="spellStart"/>
-      <w:r>
-        <w:rPr>
-          <w:rFonts w:ascii="Trebuchet MS" w:eastAsia="Trebuchet MS" w:hAnsi="Trebuchet MS" w:cs="Trebuchet MS"/>
-          <w:sz w:val="24"/>
-          <w:szCs w:val="24"/>
-        </w:rPr>
-        <w:t>MapLibre</w:t>
-      </w:r>
-      <w:proofErr w:type="spellEnd"/>
-      <w:r>
-        <w:rPr>
-          <w:rFonts w:ascii="Trebuchet MS" w:eastAsia="Trebuchet MS" w:hAnsi="Trebuchet MS" w:cs="Trebuchet MS"/>
-          <w:sz w:val="24"/>
-          <w:szCs w:val="24"/>
-        </w:rPr>
-        <w:t xml:space="preserve"> composable via a </w:t>
-      </w:r>
-      <w:proofErr w:type="spellStart"/>
-      <w:r>
-        <w:rPr>
-          <w:rFonts w:ascii="Trebuchet MS" w:eastAsia="Trebuchet MS" w:hAnsi="Trebuchet MS" w:cs="Trebuchet MS"/>
-          <w:sz w:val="24"/>
-          <w:szCs w:val="24"/>
-        </w:rPr>
-        <w:t>CameraPosition</w:t>
-      </w:r>
-      <w:proofErr w:type="spellEnd"/>
-      <w:r>
-        <w:rPr>
-          <w:rFonts w:ascii="Trebuchet MS" w:eastAsia="Trebuchet MS" w:hAnsi="Trebuchet MS" w:cs="Trebuchet MS"/>
-          <w:sz w:val="24"/>
-          <w:szCs w:val="24"/>
-        </w:rPr>
-        <w:t xml:space="preserve">, causing the map to </w:t>
-      </w:r>
-      <w:proofErr w:type="spellStart"/>
-      <w:r>
-        <w:rPr>
-          <w:rFonts w:ascii="Trebuchet MS" w:eastAsia="Trebuchet MS" w:hAnsi="Trebuchet MS" w:cs="Trebuchet MS"/>
-          <w:sz w:val="24"/>
-          <w:szCs w:val="24"/>
-        </w:rPr>
-        <w:t>recentre</w:t>
-      </w:r>
-      <w:proofErr w:type="spellEnd"/>
-      <w:r>
-        <w:rPr>
-          <w:rFonts w:ascii="Trebuchet MS" w:eastAsia="Trebuchet MS" w:hAnsi="Trebuchet MS" w:cs="Trebuchet MS"/>
-          <w:sz w:val="24"/>
-          <w:szCs w:val="24"/>
-        </w:rPr>
-        <w:t xml:space="preserve"> automatically whenever the user's location changed. This was all placed inside a Scaffold with </w:t>
-      </w:r>
-      <w:proofErr w:type="spellStart"/>
-      <w:r>
-        <w:rPr>
-          <w:rFonts w:ascii="Trebuchet MS" w:eastAsia="Trebuchet MS" w:hAnsi="Trebuchet MS" w:cs="Trebuchet MS"/>
-          <w:sz w:val="24"/>
-          <w:szCs w:val="24"/>
-        </w:rPr>
-        <w:t>innerpadding</w:t>
-      </w:r>
-      <w:proofErr w:type="spellEnd"/>
-      <w:r>
-        <w:rPr>
-          <w:rFonts w:ascii="Trebuchet MS" w:eastAsia="Trebuchet MS" w:hAnsi="Trebuchet MS" w:cs="Trebuchet MS"/>
-          <w:sz w:val="24"/>
-          <w:szCs w:val="24"/>
-        </w:rPr>
-        <w:t xml:space="preserve"> to prevent any overlap of the </w:t>
-      </w:r>
-      <w:proofErr w:type="gramStart"/>
-      <w:r>
-        <w:rPr>
-          <w:rFonts w:ascii="Trebuchet MS" w:eastAsia="Trebuchet MS" w:hAnsi="Trebuchet MS" w:cs="Trebuchet MS"/>
-          <w:sz w:val="24"/>
-          <w:szCs w:val="24"/>
-        </w:rPr>
-        <w:t>devices</w:t>
-      </w:r>
-      <w:proofErr w:type="gramEnd"/>
-      <w:r>
-        <w:rPr>
-          <w:rFonts w:ascii="Trebuchet MS" w:eastAsia="Trebuchet MS" w:hAnsi="Trebuchet MS" w:cs="Trebuchet MS"/>
-          <w:sz w:val="24"/>
-          <w:szCs w:val="24"/>
-        </w:rPr>
-        <w:t xml:space="preserve"> interfaces with the application itself.</w:t>
+        <w:t>Inside the setContent itself, I will use a mutablestate variable to hold the current LatLng and zoom level, observed the ViewModel's LiveData to keep that state updated, and pass the values into a MapLibre composable via a CameraPosition, causing the map to recentre automatically whenever the user's location changed. This was all placed inside a Scaffold with innerpadding to prevent any overlap of the devices interfaces with the application itself.</w:t>
       </w:r>
     </w:p>
     <w:p>
@@ -1737,29 +1265,7 @@
           <w:sz w:val="24"/>
           <w:szCs w:val="24"/>
         </w:rPr>
-        <w:t xml:space="preserve">- type (pub, restaurant, hotel, historical site, </w:t>
-      </w:r>
-      <w:proofErr w:type="spellStart"/>
-      <w:r>
-        <w:rPr>
-          <w:rFonts w:ascii="Trebuchet MS" w:hAnsi="Trebuchet MS"/>
-          <w:i/>
-          <w:iCs/>
-          <w:sz w:val="24"/>
-          <w:szCs w:val="24"/>
-        </w:rPr>
-        <w:t>etc</w:t>
-      </w:r>
-      <w:proofErr w:type="spellEnd"/>
-      <w:r>
-        <w:rPr>
-          <w:rFonts w:ascii="Trebuchet MS" w:hAnsi="Trebuchet MS"/>
-          <w:i/>
-          <w:iCs/>
-          <w:sz w:val="24"/>
-          <w:szCs w:val="24"/>
-        </w:rPr>
-        <w:t>);</w:t>
+        <w:t>- type (pub, restaurant, hotel, historical site, etc);</w:t>
       </w:r>
     </w:p>
     <w:p>
@@ -1854,31 +1360,7 @@
           <w:sz w:val="24"/>
           <w:szCs w:val="24"/>
         </w:rPr>
-        <w:t xml:space="preserve">For </w:t>
-      </w:r>
-      <w:proofErr w:type="gramStart"/>
-      <w:r>
-        <w:rPr>
-          <w:rFonts w:ascii="Trebuchet MS" w:hAnsi="Trebuchet MS"/>
-          <w:i/>
-          <w:iCs/>
-          <w:color w:val="000000"/>
-          <w:sz w:val="24"/>
-          <w:szCs w:val="24"/>
-        </w:rPr>
-        <w:t>now</w:t>
-      </w:r>
-      <w:proofErr w:type="gramEnd"/>
-      <w:r>
-        <w:rPr>
-          <w:rFonts w:ascii="Trebuchet MS" w:hAnsi="Trebuchet MS"/>
-          <w:i/>
-          <w:iCs/>
-          <w:color w:val="000000"/>
-          <w:sz w:val="24"/>
-          <w:szCs w:val="24"/>
-        </w:rPr>
-        <w:t xml:space="preserve"> you can just use buttons for navigation – there is no need to use an app bar, a navigation bar, or the navigation drawer just yet.</w:t>
+        <w:t>For now you can just use buttons for navigation – there is no need to use an app bar, a navigation bar, or the navigation drawer just yet.</w:t>
       </w:r>
       <w:r>
         <w:rPr>
@@ -2250,76 +1732,23 @@
         </w:drawing>
       </w:r>
       <w:r>
-        <w:t xml:space="preserve">I will finally update the main composable to include the map page and the add poi page using the compose navigation. I will add the </w:t>
-      </w:r>
-      <w:proofErr w:type="spellStart"/>
-      <w:r>
-        <w:t>NavHost</w:t>
-      </w:r>
-      <w:proofErr w:type="spellEnd"/>
-      <w:r>
-        <w:t xml:space="preserve"> which will contain the two routes for the map page and the add poi page. I will then be able to define the callback functions for the </w:t>
-      </w:r>
-      <w:proofErr w:type="spellStart"/>
-      <w:r>
-        <w:t>onPoiAdded</w:t>
-      </w:r>
-      <w:proofErr w:type="spellEnd"/>
-      <w:r>
-        <w:t xml:space="preserve"> and </w:t>
-      </w:r>
-      <w:proofErr w:type="spellStart"/>
-      <w:r>
-        <w:t>onNavigateBack</w:t>
-      </w:r>
-      <w:proofErr w:type="spellEnd"/>
+        <w:t xml:space="preserve">I will finally update the main composable to include the map page and the add poi page using the compose navigation. I will add the NavHost which will contain the two routes for the map page and the add poi page. I will then be able to define the callback functions for the onPoiAdded and onNavigateBack. onPoiAdded will add the new poi to the ViewModel and the onNavigateBack will return the user to the previous page they were on. </w:t>
+      </w:r>
+      <w:r>
+        <w:t xml:space="preserve">I will place a </w:t>
+      </w:r>
+      <w:r>
+        <w:t xml:space="preserve">Symbol marker inside </w:t>
+      </w:r>
+      <w:r>
+        <w:t xml:space="preserve">the </w:t>
+      </w:r>
+      <w:r>
+        <w:t>MapLibre lambda</w:t>
+      </w:r>
       <w:r>
         <w:t xml:space="preserve">. </w:t>
       </w:r>
-      <w:proofErr w:type="spellStart"/>
-      <w:r>
-        <w:t>onPoiAdded</w:t>
-      </w:r>
-      <w:proofErr w:type="spellEnd"/>
-      <w:r>
-        <w:t xml:space="preserve"> will add the new poi to the </w:t>
-      </w:r>
-      <w:proofErr w:type="spellStart"/>
-      <w:r>
-        <w:t>ViewModel</w:t>
-      </w:r>
-      <w:proofErr w:type="spellEnd"/>
-      <w:r>
-        <w:t xml:space="preserve"> and the </w:t>
-      </w:r>
-      <w:proofErr w:type="spellStart"/>
-      <w:r>
-        <w:t>onNavigateBack</w:t>
-      </w:r>
-      <w:proofErr w:type="spellEnd"/>
-      <w:r>
-        <w:t xml:space="preserve"> will return the user to the previous page they were on. </w:t>
-      </w:r>
-      <w:r>
-        <w:t xml:space="preserve">I will place a </w:t>
-      </w:r>
-      <w:r>
-        <w:t xml:space="preserve">Symbol marker inside </w:t>
-      </w:r>
-      <w:r>
-        <w:t xml:space="preserve">the </w:t>
-      </w:r>
-      <w:proofErr w:type="spellStart"/>
-      <w:r>
-        <w:t>MapLibre</w:t>
-      </w:r>
-      <w:proofErr w:type="spellEnd"/>
-      <w:r>
-        <w:t xml:space="preserve"> lambda</w:t>
-      </w:r>
-      <w:r>
-        <w:t xml:space="preserve">. </w:t>
-      </w:r>
       <w:r>
         <w:t xml:space="preserve">The map </w:t>
       </w:r>
@@ -2333,31 +1762,13 @@
         <w:t xml:space="preserve"> the</w:t>
       </w:r>
       <w:r>
-        <w:t xml:space="preserve"> </w:t>
-      </w:r>
-      <w:proofErr w:type="spellStart"/>
-      <w:proofErr w:type="gramStart"/>
-      <w:r>
-        <w:t>poisState</w:t>
-      </w:r>
-      <w:proofErr w:type="spellEnd"/>
-      <w:proofErr w:type="gramEnd"/>
-      <w:r>
-        <w:t xml:space="preserve"> changes</w:t>
+        <w:t xml:space="preserve"> poisState changes</w:t>
       </w:r>
       <w:r>
         <w:t>. This will then</w:t>
       </w:r>
       <w:r>
-        <w:t xml:space="preserve"> loop through </w:t>
-      </w:r>
-      <w:proofErr w:type="spellStart"/>
-      <w:r>
-        <w:t>poisState</w:t>
-      </w:r>
-      <w:proofErr w:type="spellEnd"/>
-      <w:r>
-        <w:t xml:space="preserve"> and plac</w:t>
+        <w:t xml:space="preserve"> loop through poisState and plac</w:t>
       </w:r>
       <w:r>
         <w:t>e</w:t>
@@ -2375,15 +1786,7 @@
         <w:t>.</w:t>
       </w:r>
       <w:r>
-        <w:t xml:space="preserve"> I will make </w:t>
-      </w:r>
-      <w:proofErr w:type="gramStart"/>
-      <w:r>
-        <w:t>it</w:t>
-      </w:r>
-      <w:proofErr w:type="gramEnd"/>
-      <w:r>
-        <w:t xml:space="preserve"> so an alert dialog appears when the marker is clicked on, displaying the markers details including its name, type and description. This allows me to test that the marker has been added correctly.</w:t>
+        <w:t xml:space="preserve"> I will make it so an alert dialog appears when the marker is clicked on, displaying the markers details including its name, type and description. This allows me to test that the marker has been added correctly.</w:t>
       </w:r>
     </w:p>
     <w:p>
@@ -2923,15 +2326,7 @@
         <w:t xml:space="preserve">methods </w:t>
       </w:r>
       <w:r>
-        <w:t xml:space="preserve">for the database so it can be changed or searched. I plan to make it so that when the database returns all the POIs it contains, it will return it as a </w:t>
-      </w:r>
-      <w:proofErr w:type="spellStart"/>
-      <w:r>
-        <w:t>LiveData</w:t>
-      </w:r>
-      <w:proofErr w:type="spellEnd"/>
-      <w:r>
-        <w:t xml:space="preserve">&lt;List&lt;Poi&gt;&gt;. This will </w:t>
+        <w:t xml:space="preserve">for the database so it can be changed or searched. I plan to make it so that when the database returns all the POIs it contains, it will return it as a LiveData&lt;List&lt;Poi&gt;&gt;. This will </w:t>
       </w:r>
       <w:r>
         <w:t>make</w:t>
@@ -2940,31 +2335,7 @@
         <w:t xml:space="preserve"> sure that the UI is automatically updated with a new list of POIs whenever the database is changed.</w:t>
       </w:r>
       <w:r>
-        <w:t xml:space="preserve"> For now, I will give it three functions, </w:t>
-      </w:r>
-      <w:proofErr w:type="gramStart"/>
-      <w:r>
-        <w:t>getAllPois(</w:t>
-      </w:r>
-      <w:proofErr w:type="gramEnd"/>
-      <w:r>
-        <w:t xml:space="preserve">), </w:t>
-      </w:r>
-      <w:proofErr w:type="gramStart"/>
-      <w:r>
-        <w:t>insert(</w:t>
-      </w:r>
-      <w:proofErr w:type="gramEnd"/>
-      <w:r>
-        <w:t xml:space="preserve">) and </w:t>
-      </w:r>
-      <w:proofErr w:type="gramStart"/>
-      <w:r>
-        <w:t>delete(</w:t>
-      </w:r>
-      <w:proofErr w:type="gramEnd"/>
-      <w:r>
-        <w:t>).</w:t>
+        <w:t xml:space="preserve"> For now, I will give it three functions, getAllPois(), insert() and delete().</w:t>
       </w:r>
     </w:p>
     <w:p>
@@ -3034,28 +2405,7 @@
         </w:drawing>
       </w:r>
       <w:r>
-        <w:t xml:space="preserve">I plan to next create the file for the database itself. This will be placed within an abstract function which allows my other files to access its DAO and all the database operations within it. Inside it I will put a </w:t>
-      </w:r>
-      <w:proofErr w:type="spellStart"/>
-      <w:proofErr w:type="gramStart"/>
-      <w:r>
-        <w:t>getDatabase</w:t>
-      </w:r>
-      <w:proofErr w:type="spellEnd"/>
-      <w:r>
-        <w:t>(</w:t>
-      </w:r>
-      <w:proofErr w:type="gramEnd"/>
-      <w:r>
-        <w:t xml:space="preserve">) function which will check that a database </w:t>
-      </w:r>
-      <w:proofErr w:type="gramStart"/>
-      <w:r>
-        <w:t>doesn’t already</w:t>
-      </w:r>
-      <w:proofErr w:type="gramEnd"/>
-      <w:r>
-        <w:t xml:space="preserve"> exist, if not it will create one and save it, otherwise it will simply return the one that already exists.</w:t>
+        <w:t>I plan to next create the file for the database itself. This will be placed within an abstract function which allows my other files to access its DAO and all the database operations within it. Inside it I will put a getDatabase() function which will check that a database doesn’t already exist, if not it will create one and save it, otherwise it will simply return the one that already exists.</w:t>
       </w:r>
     </w:p>
     <w:p>
@@ -3121,74 +2471,16 @@
         </w:drawing>
       </w:r>
       <w:r>
-        <w:t xml:space="preserve">I will next update my </w:t>
-      </w:r>
-      <w:proofErr w:type="spellStart"/>
-      <w:r>
-        <w:t>Viewmodel</w:t>
-      </w:r>
-      <w:proofErr w:type="spellEnd"/>
-      <w:r>
-        <w:t xml:space="preserve">. </w:t>
-      </w:r>
-      <w:r>
-        <w:t xml:space="preserve">I will first change the </w:t>
-      </w:r>
-      <w:proofErr w:type="spellStart"/>
-      <w:r>
-        <w:t>ViewModel</w:t>
-      </w:r>
-      <w:proofErr w:type="spellEnd"/>
-      <w:r>
-        <w:t xml:space="preserve"> for </w:t>
-      </w:r>
-      <w:proofErr w:type="gramStart"/>
-      <w:r>
-        <w:t xml:space="preserve">a </w:t>
-      </w:r>
-      <w:proofErr w:type="spellStart"/>
-      <w:r>
-        <w:t>AndroidViewModel</w:t>
-      </w:r>
-      <w:proofErr w:type="spellEnd"/>
-      <w:proofErr w:type="gramEnd"/>
-      <w:r>
-        <w:t xml:space="preserve"> so that it can access the application context which will be needed to open the database. </w:t>
+        <w:t xml:space="preserve">I will next update my Viewmodel. </w:t>
+      </w:r>
+      <w:r>
+        <w:t xml:space="preserve">I will first change the ViewModel for a AndroidViewModel so that it can access the application context which will be needed to open the database. </w:t>
       </w:r>
       <w:r>
         <w:t xml:space="preserve">I plan to update the poi variable so that it gathers all the pois from the database as </w:t>
       </w:r>
-      <w:proofErr w:type="spellStart"/>
-      <w:r>
-        <w:t>LiveData</w:t>
-      </w:r>
-      <w:proofErr w:type="spellEnd"/>
-      <w:r>
-        <w:t xml:space="preserve"> allowing it to automatically update when a new POI is added. Because of this, I will also need to change the </w:t>
-      </w:r>
-      <w:proofErr w:type="spellStart"/>
-      <w:r>
-        <w:t>addpoi</w:t>
-      </w:r>
-      <w:proofErr w:type="spellEnd"/>
-      <w:r>
-        <w:t xml:space="preserve"> function in the </w:t>
-      </w:r>
-      <w:proofErr w:type="spellStart"/>
-      <w:r>
-        <w:t>Viewmodel</w:t>
-      </w:r>
-      <w:proofErr w:type="spellEnd"/>
-      <w:r>
-        <w:t xml:space="preserve"> so that it adds the poi to the database instead of list using the </w:t>
-      </w:r>
-      <w:proofErr w:type="spellStart"/>
-      <w:r>
-        <w:t>poiDao’s</w:t>
-      </w:r>
-      <w:proofErr w:type="spellEnd"/>
-      <w:r>
-        <w:t xml:space="preserve"> ins</w:t>
+      <w:r>
+        <w:t>LiveData allowing it to automatically update when a new POI is added. Because of this, I will also need to change the addpoi function in the Viewmodel so that it adds the poi to the database instead of list using the poiDao’s ins</w:t>
       </w:r>
       <w:r>
         <w:t>ert function.</w:t>
@@ -3266,15 +2558,7 @@
         </w:drawing>
       </w:r>
       <w:r>
-        <w:t xml:space="preserve">I will then update the button for my </w:t>
-      </w:r>
-      <w:proofErr w:type="spellStart"/>
-      <w:r>
-        <w:t>AddPoiScreen</w:t>
-      </w:r>
-      <w:proofErr w:type="spellEnd"/>
-      <w:r>
-        <w:t>. I will simply change the Poi structure in the button so that it fits the databases poi structure since the latitude and longitude for the pois in the database are separate variables.</w:t>
+        <w:t>I will then update the button for my AddPoiScreen. I will simply change the Poi structure in the button so that it fits the databases poi structure since the latitude and longitude for the pois in the database are separate variables.</w:t>
       </w:r>
     </w:p>
     <w:p>
@@ -3288,23 +2572,7 @@
       </w:pPr>
       <w:r>
         <w:lastRenderedPageBreak/>
-        <w:t xml:space="preserve">I will then need to change the </w:t>
-      </w:r>
-      <w:proofErr w:type="spellStart"/>
-      <w:r>
-        <w:t>MainActivity</w:t>
-      </w:r>
-      <w:proofErr w:type="spellEnd"/>
-      <w:r>
-        <w:t xml:space="preserve"> so that the Poi is converted back into the </w:t>
-      </w:r>
-      <w:proofErr w:type="spellStart"/>
-      <w:r>
-        <w:t>LatLng</w:t>
-      </w:r>
-      <w:proofErr w:type="spellEnd"/>
-      <w:r>
-        <w:t xml:space="preserve"> so that the map can properly mark its location.</w:t>
+        <w:t>I will then need to change the MainActivity so that the Poi is converted back into the LatLng so that the map can properly mark its location.</w:t>
       </w:r>
     </w:p>
     <w:p>
@@ -3521,15 +2789,7 @@
         <w:ind w:left="720"/>
       </w:pPr>
       <w:r>
-        <w:t xml:space="preserve">I have already set up the loading process for the POIs for task 3. This is done on </w:t>
-      </w:r>
-      <w:proofErr w:type="gramStart"/>
-      <w:r>
-        <w:t>startup and</w:t>
-      </w:r>
-      <w:proofErr w:type="gramEnd"/>
-      <w:r>
-        <w:t xml:space="preserve"> whenever the database is updated. </w:t>
+        <w:t xml:space="preserve">I have already set up the loading process for the POIs for task 3. This is done on startup and whenever the database is updated. </w:t>
       </w:r>
       <w:r>
         <w:t>However, to fit this task better I will change the code to use a button instead, this will make testing easier and give the user more control.</w:t>
@@ -3545,26 +2805,14 @@
         <w:ind w:left="720"/>
       </w:pPr>
       <w:r>
-        <w:t xml:space="preserve">I will start this by changing the DAO to </w:t>
-      </w:r>
-      <w:proofErr w:type="gramStart"/>
-      <w:r>
-        <w:t>return</w:t>
-      </w:r>
-      <w:proofErr w:type="gramEnd"/>
-      <w:r>
-        <w:t xml:space="preserve"> a plain list instead of </w:t>
-      </w:r>
-      <w:proofErr w:type="gramStart"/>
+        <w:t xml:space="preserve">I will start this by changing the DAO to return a plain list instead of </w:t>
+      </w:r>
       <w:r>
         <w:t xml:space="preserve">the </w:t>
       </w:r>
-      <w:proofErr w:type="spellStart"/>
       <w:r>
         <w:t>LiveData</w:t>
       </w:r>
-      <w:proofErr w:type="spellEnd"/>
-      <w:proofErr w:type="gramEnd"/>
       <w:r>
         <w:t xml:space="preserve"> since the POIs will no longer be automatically loaded. </w:t>
       </w:r>
@@ -3702,15 +2950,7 @@
         </w:drawing>
       </w:r>
       <w:r>
-        <w:t xml:space="preserve">I will also need to add a new function to the </w:t>
-      </w:r>
-      <w:proofErr w:type="spellStart"/>
-      <w:r>
-        <w:t>ViewModel</w:t>
-      </w:r>
-      <w:proofErr w:type="spellEnd"/>
-      <w:r>
-        <w:t xml:space="preserve"> which will load all the POIs from the database. It will run </w:t>
+        <w:t xml:space="preserve">I will also need to add a new function to the ViewModel which will load all the POIs from the database. It will run </w:t>
       </w:r>
       <w:r>
         <w:t xml:space="preserve">the database query on Dispatchers.IO in the background, then </w:t>
@@ -3719,34 +2959,13 @@
         <w:t>set</w:t>
       </w:r>
       <w:r>
-        <w:t xml:space="preserve"> the result to </w:t>
-      </w:r>
-      <w:proofErr w:type="spellStart"/>
-      <w:r>
-        <w:t>pois.value</w:t>
-      </w:r>
-      <w:proofErr w:type="spellEnd"/>
-      <w:r>
-        <w:t xml:space="preserve"> which </w:t>
+        <w:t xml:space="preserve"> the result to pois.value which </w:t>
       </w:r>
       <w:r>
         <w:t xml:space="preserve">should </w:t>
       </w:r>
-      <w:proofErr w:type="gramStart"/>
-      <w:r>
-        <w:t>triggers</w:t>
-      </w:r>
-      <w:proofErr w:type="gramEnd"/>
-      <w:r>
-        <w:t xml:space="preserve"> the observer in </w:t>
-      </w:r>
-      <w:proofErr w:type="spellStart"/>
-      <w:r>
-        <w:t>MainActivity</w:t>
-      </w:r>
-      <w:proofErr w:type="spellEnd"/>
-      <w:r>
-        <w:t xml:space="preserve"> </w:t>
+      <w:r>
+        <w:t xml:space="preserve">triggers the observer in MainActivity </w:t>
       </w:r>
       <w:r>
         <w:t xml:space="preserve">which will then </w:t>
@@ -3822,36 +3041,20 @@
         <w:t>it</w:t>
       </w:r>
       <w:r>
-        <w:t xml:space="preserve"> holds a plain list of pois instead of being assigned directly from the DAO’s live data since it no longer returns </w:t>
-      </w:r>
-      <w:proofErr w:type="spellStart"/>
-      <w:r>
-        <w:t>LiveData</w:t>
-      </w:r>
-      <w:proofErr w:type="spellEnd"/>
-      <w:r>
-        <w:t>.</w:t>
-      </w:r>
-    </w:p>
-    <w:p>
-      <w:pPr>
-        <w:ind w:left="720"/>
-      </w:pPr>
-    </w:p>
-    <w:p>
-      <w:pPr>
-        <w:ind w:left="720"/>
-      </w:pPr>
-      <w:r>
-        <w:t xml:space="preserve">I will then lastly need to add the load buttons to the </w:t>
-      </w:r>
-      <w:proofErr w:type="spellStart"/>
-      <w:r>
-        <w:t>MainActivity</w:t>
-      </w:r>
-      <w:proofErr w:type="spellEnd"/>
-      <w:r>
-        <w:t>. This will call the load poi function in the view model, loading all the pois from the database into the UI.</w:t>
+        <w:t xml:space="preserve"> holds a plain list of pois instead of being assigned directly from the DAO’s live data since it no longer returns LiveData.</w:t>
+      </w:r>
+    </w:p>
+    <w:p>
+      <w:pPr>
+        <w:ind w:left="720"/>
+      </w:pPr>
+    </w:p>
+    <w:p>
+      <w:pPr>
+        <w:ind w:left="720"/>
+      </w:pPr>
+      <w:r>
+        <w:t>I will then lastly need to add the load buttons to the MainActivity. This will call the load poi function in the view model, loading all the pois from the database into the UI.</w:t>
       </w:r>
     </w:p>
     <w:p>
@@ -3928,9 +3131,133 @@
     <w:p/>
     <w:p>
       <w:pPr>
-        <w:ind w:left="720"/>
-      </w:pPr>
-    </w:p>
+        <w:rPr>
+          <w:rFonts w:ascii="Trebuchet MS" w:hAnsi="Trebuchet MS"/>
+          <w:i/>
+          <w:iCs/>
+          <w:color w:val="000000"/>
+          <w:sz w:val="24"/>
+          <w:szCs w:val="24"/>
+        </w:rPr>
+      </w:pPr>
+      <w:r>
+        <w:rPr>
+          <w:rFonts w:ascii="Trebuchet MS" w:hAnsi="Trebuchet MS"/>
+          <w:color w:val="000000"/>
+          <w:sz w:val="24"/>
+          <w:szCs w:val="24"/>
+        </w:rPr>
+        <w:t xml:space="preserve">5. </w:t>
+      </w:r>
+      <w:r>
+        <w:rPr>
+          <w:rFonts w:ascii="Trebuchet MS" w:hAnsi="Trebuchet MS"/>
+          <w:i/>
+          <w:iCs/>
+          <w:color w:val="000000"/>
+          <w:sz w:val="24"/>
+          <w:szCs w:val="24"/>
+        </w:rPr>
+        <w:t>“</w:t>
+      </w:r>
+      <w:r>
+        <w:rPr>
+          <w:rFonts w:ascii="Trebuchet MS" w:hAnsi="Trebuchet MS"/>
+          <w:i/>
+          <w:iCs/>
+          <w:color w:val="000000"/>
+          <w:sz w:val="24"/>
+          <w:szCs w:val="24"/>
+        </w:rPr>
+        <w:t xml:space="preserve">Allow the user to search for points of interest by TYPE, by inputting the </w:t>
+      </w:r>
+      <w:r>
+        <w:rPr>
+          <w:rFonts w:ascii="Trebuchet MS" w:hAnsi="Trebuchet MS"/>
+          <w:i/>
+          <w:iCs/>
+          <w:color w:val="000000"/>
+          <w:sz w:val="24"/>
+          <w:szCs w:val="24"/>
+          <w:u w:val="single"/>
+        </w:rPr>
+        <w:t>TYPE</w:t>
+      </w:r>
+      <w:r>
+        <w:rPr>
+          <w:rFonts w:ascii="Trebuchet MS" w:hAnsi="Trebuchet MS"/>
+          <w:i/>
+          <w:iCs/>
+          <w:color w:val="000000"/>
+          <w:sz w:val="24"/>
+          <w:szCs w:val="24"/>
+        </w:rPr>
+        <w:t xml:space="preserve"> in a text field. This should search the local database. The matching places should appear on the map as markers or circles. Again a dialog box should appear when the user clicks on each place.</w:t>
+      </w:r>
+      <w:r>
+        <w:rPr>
+          <w:rFonts w:ascii="Trebuchet MS" w:hAnsi="Trebuchet MS"/>
+          <w:i/>
+          <w:iCs/>
+          <w:color w:val="000000"/>
+          <w:sz w:val="24"/>
+          <w:szCs w:val="24"/>
+        </w:rPr>
+        <w:t>”</w:t>
+      </w:r>
+    </w:p>
+    <w:p>
+      <w:pPr>
+        <w:ind w:left="720"/>
+      </w:pPr>
+    </w:p>
+    <w:p>
+      <w:pPr>
+        <w:ind w:left="720"/>
+      </w:pPr>
+      <w:r>
+        <w:t xml:space="preserve">I will start this task by adding new query to my DAO. This will search the poi database using a given type to find any pois with that match that type. </w:t>
+      </w:r>
+      <w:r>
+        <w:t>This will then return a list of all the matching pois found.</w:t>
+      </w:r>
+    </w:p>
+    <w:p>
+      <w:pPr>
+        <w:ind w:left="720"/>
+      </w:pPr>
+    </w:p>
+    <w:p>
+      <w:pPr>
+        <w:ind w:left="720"/>
+      </w:pPr>
+      <w:r>
+        <w:t>I will next create</w:t>
+      </w:r>
+      <w:r>
+        <w:t xml:space="preserve"> a new function in the ViewModel. This will use the search by type function from the DAO. This will have the type as a parameter to search with and add the results to the pois.value.</w:t>
+      </w:r>
+    </w:p>
+    <w:p>
+      <w:pPr>
+        <w:ind w:left="720"/>
+      </w:pPr>
+    </w:p>
+    <w:p>
+      <w:pPr>
+        <w:ind w:left="720"/>
+      </w:pPr>
+    </w:p>
+    <w:p>
+      <w:pPr>
+        <w:ind w:left="720"/>
+      </w:pPr>
+      <w:r>
+        <w:lastRenderedPageBreak/>
+        <w:t>Then I will add an outlined text field to my MainActivity which will be used by the user to input the accommodation type that they are searching for. This will then be followed by a button which, when clicked, will take the inputted data and call the search pois by type function using the inputted data as the parameter.</w:t>
+      </w:r>
+    </w:p>
+    <w:p/>
     <w:sectPr>
       <w:pgSz w:w="12240" w:h="15840"/>
       <w:pgMar w:top="1440" w:right="1440" w:bottom="1440" w:left="1440" w:header="720" w:footer="720" w:gutter="0"/>

</xml_diff>

<commit_message>
Added search by type function
</commit_message>
<xml_diff>
--- a/MAD_Report.docx
+++ b/MAD_Report.docx
@@ -373,7 +373,73 @@
           <w:sz w:val="24"/>
           <w:szCs w:val="24"/>
         </w:rPr>
-        <w:t>I will first start with this task by setting up the dependencies in my build.gradle and libs.versions.toml files. I will add MapLibre with Vulkan support, the Ramani Maps Compose wrapper, and the standard AndroidX libraries needed for Compose.</w:t>
+        <w:t xml:space="preserve">I will first start with this task by setting up the dependencies in my </w:t>
+      </w:r>
+      <w:proofErr w:type="spellStart"/>
+      <w:proofErr w:type="gramStart"/>
+      <w:r>
+        <w:rPr>
+          <w:rFonts w:ascii="Trebuchet MS" w:eastAsia="Trebuchet MS" w:hAnsi="Trebuchet MS" w:cs="Trebuchet MS"/>
+          <w:sz w:val="24"/>
+          <w:szCs w:val="24"/>
+        </w:rPr>
+        <w:t>build.gradle</w:t>
+      </w:r>
+      <w:proofErr w:type="spellEnd"/>
+      <w:proofErr w:type="gramEnd"/>
+      <w:r>
+        <w:rPr>
+          <w:rFonts w:ascii="Trebuchet MS" w:eastAsia="Trebuchet MS" w:hAnsi="Trebuchet MS" w:cs="Trebuchet MS"/>
+          <w:sz w:val="24"/>
+          <w:szCs w:val="24"/>
+        </w:rPr>
+        <w:t xml:space="preserve"> and </w:t>
+      </w:r>
+      <w:proofErr w:type="spellStart"/>
+      <w:proofErr w:type="gramStart"/>
+      <w:r>
+        <w:rPr>
+          <w:rFonts w:ascii="Trebuchet MS" w:eastAsia="Trebuchet MS" w:hAnsi="Trebuchet MS" w:cs="Trebuchet MS"/>
+          <w:sz w:val="24"/>
+          <w:szCs w:val="24"/>
+        </w:rPr>
+        <w:t>libs.versions</w:t>
+      </w:r>
+      <w:proofErr w:type="gramEnd"/>
+      <w:r>
+        <w:rPr>
+          <w:rFonts w:ascii="Trebuchet MS" w:eastAsia="Trebuchet MS" w:hAnsi="Trebuchet MS" w:cs="Trebuchet MS"/>
+          <w:sz w:val="24"/>
+          <w:szCs w:val="24"/>
+        </w:rPr>
+        <w:t>.toml</w:t>
+      </w:r>
+      <w:proofErr w:type="spellEnd"/>
+      <w:r>
+        <w:rPr>
+          <w:rFonts w:ascii="Trebuchet MS" w:eastAsia="Trebuchet MS" w:hAnsi="Trebuchet MS" w:cs="Trebuchet MS"/>
+          <w:sz w:val="24"/>
+          <w:szCs w:val="24"/>
+        </w:rPr>
+        <w:t xml:space="preserve"> files. I will add </w:t>
+      </w:r>
+      <w:proofErr w:type="spellStart"/>
+      <w:r>
+        <w:rPr>
+          <w:rFonts w:ascii="Trebuchet MS" w:eastAsia="Trebuchet MS" w:hAnsi="Trebuchet MS" w:cs="Trebuchet MS"/>
+          <w:sz w:val="24"/>
+          <w:szCs w:val="24"/>
+        </w:rPr>
+        <w:t>MapLibre</w:t>
+      </w:r>
+      <w:proofErr w:type="spellEnd"/>
+      <w:r>
+        <w:rPr>
+          <w:rFonts w:ascii="Trebuchet MS" w:eastAsia="Trebuchet MS" w:hAnsi="Trebuchet MS" w:cs="Trebuchet MS"/>
+          <w:sz w:val="24"/>
+          <w:szCs w:val="24"/>
+        </w:rPr>
+        <w:t xml:space="preserve"> with Vulkan support, the Ramani Maps Compose wrapper, and the standard AndroidX libraries needed for Compose.</w:t>
       </w:r>
       <w:r>
         <w:rPr>
@@ -506,7 +572,25 @@
           <w:sz w:val="24"/>
           <w:szCs w:val="24"/>
         </w:rPr>
-        <w:t>Then in the AndroidManifest.xml, I will set up the ACCESS_FINE_LOCATION and ACCESS_COARSE_LOCATION permissions, as well as INTERNET, since the map tiles will be gathered remotely from OpenFreeMap.</w:t>
+        <w:t xml:space="preserve">Then in the AndroidManifest.xml, I will set up the ACCESS_FINE_LOCATION and ACCESS_COARSE_LOCATION permissions, as well as INTERNET, since the map tiles will be gathered remotely from </w:t>
+      </w:r>
+      <w:proofErr w:type="spellStart"/>
+      <w:r>
+        <w:rPr>
+          <w:rFonts w:ascii="Trebuchet MS" w:eastAsia="Trebuchet MS" w:hAnsi="Trebuchet MS" w:cs="Trebuchet MS"/>
+          <w:sz w:val="24"/>
+          <w:szCs w:val="24"/>
+        </w:rPr>
+        <w:t>OpenFreeMap</w:t>
+      </w:r>
+      <w:proofErr w:type="spellEnd"/>
+      <w:r>
+        <w:rPr>
+          <w:rFonts w:ascii="Trebuchet MS" w:eastAsia="Trebuchet MS" w:hAnsi="Trebuchet MS" w:cs="Trebuchet MS"/>
+          <w:sz w:val="24"/>
+          <w:szCs w:val="24"/>
+        </w:rPr>
+        <w:t>.</w:t>
       </w:r>
       <w:r>
         <w:rPr>
@@ -652,7 +736,61 @@
           <w:sz w:val="24"/>
           <w:szCs w:val="24"/>
         </w:rPr>
-        <w:t xml:space="preserve">To manage the location state in both the activity and UI, I will need to add a LatLngViewModel class that will hold a latLng property backed by a MutableLiveData object. </w:t>
+        <w:t xml:space="preserve">To manage the location state in both the activity and UI, I will need to add a </w:t>
+      </w:r>
+      <w:proofErr w:type="spellStart"/>
+      <w:r>
+        <w:rPr>
+          <w:rFonts w:ascii="Trebuchet MS" w:eastAsia="Trebuchet MS" w:hAnsi="Trebuchet MS" w:cs="Trebuchet MS"/>
+          <w:sz w:val="24"/>
+          <w:szCs w:val="24"/>
+        </w:rPr>
+        <w:t>LatLngViewModel</w:t>
+      </w:r>
+      <w:proofErr w:type="spellEnd"/>
+      <w:r>
+        <w:rPr>
+          <w:rFonts w:ascii="Trebuchet MS" w:eastAsia="Trebuchet MS" w:hAnsi="Trebuchet MS" w:cs="Trebuchet MS"/>
+          <w:sz w:val="24"/>
+          <w:szCs w:val="24"/>
+        </w:rPr>
+        <w:t xml:space="preserve"> class that will hold a </w:t>
+      </w:r>
+      <w:proofErr w:type="spellStart"/>
+      <w:r>
+        <w:rPr>
+          <w:rFonts w:ascii="Trebuchet MS" w:eastAsia="Trebuchet MS" w:hAnsi="Trebuchet MS" w:cs="Trebuchet MS"/>
+          <w:sz w:val="24"/>
+          <w:szCs w:val="24"/>
+        </w:rPr>
+        <w:t>latLng</w:t>
+      </w:r>
+      <w:proofErr w:type="spellEnd"/>
+      <w:r>
+        <w:rPr>
+          <w:rFonts w:ascii="Trebuchet MS" w:eastAsia="Trebuchet MS" w:hAnsi="Trebuchet MS" w:cs="Trebuchet MS"/>
+          <w:sz w:val="24"/>
+          <w:szCs w:val="24"/>
+        </w:rPr>
+        <w:t xml:space="preserve"> property backed by a </w:t>
+      </w:r>
+      <w:proofErr w:type="spellStart"/>
+      <w:r>
+        <w:rPr>
+          <w:rFonts w:ascii="Trebuchet MS" w:eastAsia="Trebuchet MS" w:hAnsi="Trebuchet MS" w:cs="Trebuchet MS"/>
+          <w:sz w:val="24"/>
+          <w:szCs w:val="24"/>
+        </w:rPr>
+        <w:t>MutableLiveData</w:t>
+      </w:r>
+      <w:proofErr w:type="spellEnd"/>
+      <w:r>
+        <w:rPr>
+          <w:rFonts w:ascii="Trebuchet MS" w:eastAsia="Trebuchet MS" w:hAnsi="Trebuchet MS" w:cs="Trebuchet MS"/>
+          <w:sz w:val="24"/>
+          <w:szCs w:val="24"/>
+        </w:rPr>
+        <w:t xml:space="preserve"> object. </w:t>
       </w:r>
     </w:p>
     <w:p>
@@ -679,7 +817,43 @@
           <w:szCs w:val="24"/>
         </w:rPr>
         <w:lastRenderedPageBreak/>
-        <w:t xml:space="preserve">Whenever the latLng is updated, i.e. the user's location changes, it should automatically push the new value to latLngLiveData, making it observable from the UI layer.  </w:t>
+        <w:t xml:space="preserve">Whenever the </w:t>
+      </w:r>
+      <w:proofErr w:type="spellStart"/>
+      <w:r>
+        <w:rPr>
+          <w:rFonts w:ascii="Trebuchet MS" w:eastAsia="Trebuchet MS" w:hAnsi="Trebuchet MS" w:cs="Trebuchet MS"/>
+          <w:sz w:val="24"/>
+          <w:szCs w:val="24"/>
+        </w:rPr>
+        <w:t>latLng</w:t>
+      </w:r>
+      <w:proofErr w:type="spellEnd"/>
+      <w:r>
+        <w:rPr>
+          <w:rFonts w:ascii="Trebuchet MS" w:eastAsia="Trebuchet MS" w:hAnsi="Trebuchet MS" w:cs="Trebuchet MS"/>
+          <w:sz w:val="24"/>
+          <w:szCs w:val="24"/>
+        </w:rPr>
+        <w:t xml:space="preserve"> is updated, i.e. the user's location changes, it should automatically push the new value to </w:t>
+      </w:r>
+      <w:proofErr w:type="spellStart"/>
+      <w:r>
+        <w:rPr>
+          <w:rFonts w:ascii="Trebuchet MS" w:eastAsia="Trebuchet MS" w:hAnsi="Trebuchet MS" w:cs="Trebuchet MS"/>
+          <w:sz w:val="24"/>
+          <w:szCs w:val="24"/>
+        </w:rPr>
+        <w:t>latLngLiveData</w:t>
+      </w:r>
+      <w:proofErr w:type="spellEnd"/>
+      <w:r>
+        <w:rPr>
+          <w:rFonts w:ascii="Trebuchet MS" w:eastAsia="Trebuchet MS" w:hAnsi="Trebuchet MS" w:cs="Trebuchet MS"/>
+          <w:sz w:val="24"/>
+          <w:szCs w:val="24"/>
+        </w:rPr>
+        <w:t xml:space="preserve">, making it observable from the UI layer.  </w:t>
       </w:r>
     </w:p>
     <w:p>
@@ -771,7 +945,97 @@
           <w:sz w:val="24"/>
           <w:szCs w:val="24"/>
         </w:rPr>
-        <w:t>In the MainActivity, I will add the LocationListener interface. This will allow me to override the onLocationChanged function, where I will update the ViewModel's latLng with the current coordinates gathered by the device itself.</w:t>
+        <w:t xml:space="preserve">In the </w:t>
+      </w:r>
+      <w:proofErr w:type="spellStart"/>
+      <w:r>
+        <w:rPr>
+          <w:rFonts w:ascii="Trebuchet MS" w:eastAsia="Trebuchet MS" w:hAnsi="Trebuchet MS" w:cs="Trebuchet MS"/>
+          <w:sz w:val="24"/>
+          <w:szCs w:val="24"/>
+        </w:rPr>
+        <w:t>MainActivity</w:t>
+      </w:r>
+      <w:proofErr w:type="spellEnd"/>
+      <w:r>
+        <w:rPr>
+          <w:rFonts w:ascii="Trebuchet MS" w:eastAsia="Trebuchet MS" w:hAnsi="Trebuchet MS" w:cs="Trebuchet MS"/>
+          <w:sz w:val="24"/>
+          <w:szCs w:val="24"/>
+        </w:rPr>
+        <w:t xml:space="preserve">, I will add the </w:t>
+      </w:r>
+      <w:proofErr w:type="spellStart"/>
+      <w:r>
+        <w:rPr>
+          <w:rFonts w:ascii="Trebuchet MS" w:eastAsia="Trebuchet MS" w:hAnsi="Trebuchet MS" w:cs="Trebuchet MS"/>
+          <w:sz w:val="24"/>
+          <w:szCs w:val="24"/>
+        </w:rPr>
+        <w:t>LocationListener</w:t>
+      </w:r>
+      <w:proofErr w:type="spellEnd"/>
+      <w:r>
+        <w:rPr>
+          <w:rFonts w:ascii="Trebuchet MS" w:eastAsia="Trebuchet MS" w:hAnsi="Trebuchet MS" w:cs="Trebuchet MS"/>
+          <w:sz w:val="24"/>
+          <w:szCs w:val="24"/>
+        </w:rPr>
+        <w:t xml:space="preserve"> interface. This will allow me to override the </w:t>
+      </w:r>
+      <w:proofErr w:type="spellStart"/>
+      <w:r>
+        <w:rPr>
+          <w:rFonts w:ascii="Trebuchet MS" w:eastAsia="Trebuchet MS" w:hAnsi="Trebuchet MS" w:cs="Trebuchet MS"/>
+          <w:sz w:val="24"/>
+          <w:szCs w:val="24"/>
+        </w:rPr>
+        <w:t>onLocationChanged</w:t>
+      </w:r>
+      <w:proofErr w:type="spellEnd"/>
+      <w:r>
+        <w:rPr>
+          <w:rFonts w:ascii="Trebuchet MS" w:eastAsia="Trebuchet MS" w:hAnsi="Trebuchet MS" w:cs="Trebuchet MS"/>
+          <w:sz w:val="24"/>
+          <w:szCs w:val="24"/>
+        </w:rPr>
+        <w:t xml:space="preserve"> function, where I will update the </w:t>
+      </w:r>
+      <w:proofErr w:type="spellStart"/>
+      <w:r>
+        <w:rPr>
+          <w:rFonts w:ascii="Trebuchet MS" w:eastAsia="Trebuchet MS" w:hAnsi="Trebuchet MS" w:cs="Trebuchet MS"/>
+          <w:sz w:val="24"/>
+          <w:szCs w:val="24"/>
+        </w:rPr>
+        <w:t>ViewModel's</w:t>
+      </w:r>
+      <w:proofErr w:type="spellEnd"/>
+      <w:r>
+        <w:rPr>
+          <w:rFonts w:ascii="Trebuchet MS" w:eastAsia="Trebuchet MS" w:hAnsi="Trebuchet MS" w:cs="Trebuchet MS"/>
+          <w:sz w:val="24"/>
+          <w:szCs w:val="24"/>
+        </w:rPr>
+        <w:t xml:space="preserve"> </w:t>
+      </w:r>
+      <w:proofErr w:type="spellStart"/>
+      <w:r>
+        <w:rPr>
+          <w:rFonts w:ascii="Trebuchet MS" w:eastAsia="Trebuchet MS" w:hAnsi="Trebuchet MS" w:cs="Trebuchet MS"/>
+          <w:sz w:val="24"/>
+          <w:szCs w:val="24"/>
+        </w:rPr>
+        <w:t>latLng</w:t>
+      </w:r>
+      <w:proofErr w:type="spellEnd"/>
+      <w:r>
+        <w:rPr>
+          <w:rFonts w:ascii="Trebuchet MS" w:eastAsia="Trebuchet MS" w:hAnsi="Trebuchet MS" w:cs="Trebuchet MS"/>
+          <w:sz w:val="24"/>
+          <w:szCs w:val="24"/>
+        </w:rPr>
+        <w:t xml:space="preserve"> with the current coordinates gathered by the device itself.</w:t>
       </w:r>
       <w:r>
         <w:rPr>
@@ -911,7 +1175,61 @@
           <w:sz w:val="24"/>
           <w:szCs w:val="24"/>
         </w:rPr>
-        <w:t>To start receiving GPS updates, I will create a GPS function that will retrieve the LocationManager system service and call requestLocationUpdates, which I will set to update every 2 seconds or after 5 metres of movement. This will keep the GPS accurate without slowing the machine down too much.</w:t>
+        <w:t xml:space="preserve">To start receiving GPS updates, I will create a GPS function that will retrieve the </w:t>
+      </w:r>
+      <w:proofErr w:type="spellStart"/>
+      <w:r>
+        <w:rPr>
+          <w:rFonts w:ascii="Trebuchet MS" w:eastAsia="Trebuchet MS" w:hAnsi="Trebuchet MS" w:cs="Trebuchet MS"/>
+          <w:sz w:val="24"/>
+          <w:szCs w:val="24"/>
+        </w:rPr>
+        <w:t>LocationManager</w:t>
+      </w:r>
+      <w:proofErr w:type="spellEnd"/>
+      <w:r>
+        <w:rPr>
+          <w:rFonts w:ascii="Trebuchet MS" w:eastAsia="Trebuchet MS" w:hAnsi="Trebuchet MS" w:cs="Trebuchet MS"/>
+          <w:sz w:val="24"/>
+          <w:szCs w:val="24"/>
+        </w:rPr>
+        <w:t xml:space="preserve"> system service and call </w:t>
+      </w:r>
+      <w:proofErr w:type="spellStart"/>
+      <w:r>
+        <w:rPr>
+          <w:rFonts w:ascii="Trebuchet MS" w:eastAsia="Trebuchet MS" w:hAnsi="Trebuchet MS" w:cs="Trebuchet MS"/>
+          <w:sz w:val="24"/>
+          <w:szCs w:val="24"/>
+        </w:rPr>
+        <w:t>requestLocationUpdates</w:t>
+      </w:r>
+      <w:proofErr w:type="spellEnd"/>
+      <w:r>
+        <w:rPr>
+          <w:rFonts w:ascii="Trebuchet MS" w:eastAsia="Trebuchet MS" w:hAnsi="Trebuchet MS" w:cs="Trebuchet MS"/>
+          <w:sz w:val="24"/>
+          <w:szCs w:val="24"/>
+        </w:rPr>
+        <w:t xml:space="preserve">, which I will set to update every 2 seconds or after 5 </w:t>
+      </w:r>
+      <w:proofErr w:type="spellStart"/>
+      <w:r>
+        <w:rPr>
+          <w:rFonts w:ascii="Trebuchet MS" w:eastAsia="Trebuchet MS" w:hAnsi="Trebuchet MS" w:cs="Trebuchet MS"/>
+          <w:sz w:val="24"/>
+          <w:szCs w:val="24"/>
+        </w:rPr>
+        <w:t>metres</w:t>
+      </w:r>
+      <w:proofErr w:type="spellEnd"/>
+      <w:r>
+        <w:rPr>
+          <w:rFonts w:ascii="Trebuchet MS" w:eastAsia="Trebuchet MS" w:hAnsi="Trebuchet MS" w:cs="Trebuchet MS"/>
+          <w:sz w:val="24"/>
+          <w:szCs w:val="24"/>
+        </w:rPr>
+        <w:t xml:space="preserve"> of movement. This will keep the GPS accurate without slowing the machine down too much.</w:t>
       </w:r>
       <w:r>
         <w:rPr>
@@ -1034,7 +1352,35 @@
           <w:sz w:val="24"/>
           <w:szCs w:val="24"/>
         </w:rPr>
-        <w:t>I will also write a checkPermissions function that will check whether the location permission has already been granted. If they haven’t, then it will launch a permission request. This will make sure that the GPS function is only called if the user approves the use of their location. A Toast message was shown if they denied it.</w:t>
+        <w:t xml:space="preserve">I will also write a </w:t>
+      </w:r>
+      <w:proofErr w:type="spellStart"/>
+      <w:proofErr w:type="gramStart"/>
+      <w:r>
+        <w:rPr>
+          <w:rFonts w:ascii="Trebuchet MS" w:eastAsia="Trebuchet MS" w:hAnsi="Trebuchet MS" w:cs="Trebuchet MS"/>
+          <w:sz w:val="24"/>
+          <w:szCs w:val="24"/>
+        </w:rPr>
+        <w:t>checkPermissions</w:t>
+      </w:r>
+      <w:proofErr w:type="spellEnd"/>
+      <w:r>
+        <w:rPr>
+          <w:rFonts w:ascii="Trebuchet MS" w:eastAsia="Trebuchet MS" w:hAnsi="Trebuchet MS" w:cs="Trebuchet MS"/>
+          <w:sz w:val="24"/>
+          <w:szCs w:val="24"/>
+        </w:rPr>
+        <w:t xml:space="preserve"> function</w:t>
+      </w:r>
+      <w:proofErr w:type="gramEnd"/>
+      <w:r>
+        <w:rPr>
+          <w:rFonts w:ascii="Trebuchet MS" w:eastAsia="Trebuchet MS" w:hAnsi="Trebuchet MS" w:cs="Trebuchet MS"/>
+          <w:sz w:val="24"/>
+          <w:szCs w:val="24"/>
+        </w:rPr>
+        <w:t xml:space="preserve"> that will check whether the location permission has already been granted. If they haven’t, then it will launch a permission request. This will make sure that the GPS function is only called if the user approves the use of their location. A Toast message was shown if they denied it.</w:t>
       </w:r>
     </w:p>
     <w:p>
@@ -1165,7 +1511,187 @@
           <w:sz w:val="24"/>
           <w:szCs w:val="24"/>
         </w:rPr>
-        <w:t>Inside the setContent itself, I will use a mutablestate variable to hold the current LatLng and zoom level, observed the ViewModel's LiveData to keep that state updated, and pass the values into a MapLibre composable via a CameraPosition, causing the map to recentre automatically whenever the user's location changed. This was all placed inside a Scaffold with innerpadding to prevent any overlap of the devices interfaces with the application itself.</w:t>
+        <w:t xml:space="preserve">Inside the </w:t>
+      </w:r>
+      <w:proofErr w:type="spellStart"/>
+      <w:r>
+        <w:rPr>
+          <w:rFonts w:ascii="Trebuchet MS" w:eastAsia="Trebuchet MS" w:hAnsi="Trebuchet MS" w:cs="Trebuchet MS"/>
+          <w:sz w:val="24"/>
+          <w:szCs w:val="24"/>
+        </w:rPr>
+        <w:t>setContent</w:t>
+      </w:r>
+      <w:proofErr w:type="spellEnd"/>
+      <w:r>
+        <w:rPr>
+          <w:rFonts w:ascii="Trebuchet MS" w:eastAsia="Trebuchet MS" w:hAnsi="Trebuchet MS" w:cs="Trebuchet MS"/>
+          <w:sz w:val="24"/>
+          <w:szCs w:val="24"/>
+        </w:rPr>
+        <w:t xml:space="preserve"> itself, I will use a </w:t>
+      </w:r>
+      <w:proofErr w:type="spellStart"/>
+      <w:r>
+        <w:rPr>
+          <w:rFonts w:ascii="Trebuchet MS" w:eastAsia="Trebuchet MS" w:hAnsi="Trebuchet MS" w:cs="Trebuchet MS"/>
+          <w:sz w:val="24"/>
+          <w:szCs w:val="24"/>
+        </w:rPr>
+        <w:t>mutablestate</w:t>
+      </w:r>
+      <w:proofErr w:type="spellEnd"/>
+      <w:r>
+        <w:rPr>
+          <w:rFonts w:ascii="Trebuchet MS" w:eastAsia="Trebuchet MS" w:hAnsi="Trebuchet MS" w:cs="Trebuchet MS"/>
+          <w:sz w:val="24"/>
+          <w:szCs w:val="24"/>
+        </w:rPr>
+        <w:t xml:space="preserve"> variable to hold the current </w:t>
+      </w:r>
+      <w:proofErr w:type="spellStart"/>
+      <w:r>
+        <w:rPr>
+          <w:rFonts w:ascii="Trebuchet MS" w:eastAsia="Trebuchet MS" w:hAnsi="Trebuchet MS" w:cs="Trebuchet MS"/>
+          <w:sz w:val="24"/>
+          <w:szCs w:val="24"/>
+        </w:rPr>
+        <w:t>LatLng</w:t>
+      </w:r>
+      <w:proofErr w:type="spellEnd"/>
+      <w:r>
+        <w:rPr>
+          <w:rFonts w:ascii="Trebuchet MS" w:eastAsia="Trebuchet MS" w:hAnsi="Trebuchet MS" w:cs="Trebuchet MS"/>
+          <w:sz w:val="24"/>
+          <w:szCs w:val="24"/>
+        </w:rPr>
+        <w:t xml:space="preserve"> and zoom level, observed the </w:t>
+      </w:r>
+      <w:proofErr w:type="spellStart"/>
+      <w:r>
+        <w:rPr>
+          <w:rFonts w:ascii="Trebuchet MS" w:eastAsia="Trebuchet MS" w:hAnsi="Trebuchet MS" w:cs="Trebuchet MS"/>
+          <w:sz w:val="24"/>
+          <w:szCs w:val="24"/>
+        </w:rPr>
+        <w:t>ViewModel's</w:t>
+      </w:r>
+      <w:proofErr w:type="spellEnd"/>
+      <w:r>
+        <w:rPr>
+          <w:rFonts w:ascii="Trebuchet MS" w:eastAsia="Trebuchet MS" w:hAnsi="Trebuchet MS" w:cs="Trebuchet MS"/>
+          <w:sz w:val="24"/>
+          <w:szCs w:val="24"/>
+        </w:rPr>
+        <w:t xml:space="preserve"> </w:t>
+      </w:r>
+      <w:proofErr w:type="spellStart"/>
+      <w:r>
+        <w:rPr>
+          <w:rFonts w:ascii="Trebuchet MS" w:eastAsia="Trebuchet MS" w:hAnsi="Trebuchet MS" w:cs="Trebuchet MS"/>
+          <w:sz w:val="24"/>
+          <w:szCs w:val="24"/>
+        </w:rPr>
+        <w:t>LiveData</w:t>
+      </w:r>
+      <w:proofErr w:type="spellEnd"/>
+      <w:r>
+        <w:rPr>
+          <w:rFonts w:ascii="Trebuchet MS" w:eastAsia="Trebuchet MS" w:hAnsi="Trebuchet MS" w:cs="Trebuchet MS"/>
+          <w:sz w:val="24"/>
+          <w:szCs w:val="24"/>
+        </w:rPr>
+        <w:t xml:space="preserve"> to keep that state updated, and pass the values into a </w:t>
+      </w:r>
+      <w:proofErr w:type="spellStart"/>
+      <w:r>
+        <w:rPr>
+          <w:rFonts w:ascii="Trebuchet MS" w:eastAsia="Trebuchet MS" w:hAnsi="Trebuchet MS" w:cs="Trebuchet MS"/>
+          <w:sz w:val="24"/>
+          <w:szCs w:val="24"/>
+        </w:rPr>
+        <w:t>MapLibre</w:t>
+      </w:r>
+      <w:proofErr w:type="spellEnd"/>
+      <w:r>
+        <w:rPr>
+          <w:rFonts w:ascii="Trebuchet MS" w:eastAsia="Trebuchet MS" w:hAnsi="Trebuchet MS" w:cs="Trebuchet MS"/>
+          <w:sz w:val="24"/>
+          <w:szCs w:val="24"/>
+        </w:rPr>
+        <w:t xml:space="preserve"> composable via a </w:t>
+      </w:r>
+      <w:proofErr w:type="spellStart"/>
+      <w:r>
+        <w:rPr>
+          <w:rFonts w:ascii="Trebuchet MS" w:eastAsia="Trebuchet MS" w:hAnsi="Trebuchet MS" w:cs="Trebuchet MS"/>
+          <w:sz w:val="24"/>
+          <w:szCs w:val="24"/>
+        </w:rPr>
+        <w:t>CameraPosition</w:t>
+      </w:r>
+      <w:proofErr w:type="spellEnd"/>
+      <w:r>
+        <w:rPr>
+          <w:rFonts w:ascii="Trebuchet MS" w:eastAsia="Trebuchet MS" w:hAnsi="Trebuchet MS" w:cs="Trebuchet MS"/>
+          <w:sz w:val="24"/>
+          <w:szCs w:val="24"/>
+        </w:rPr>
+        <w:t xml:space="preserve">, causing the map to </w:t>
+      </w:r>
+      <w:proofErr w:type="spellStart"/>
+      <w:r>
+        <w:rPr>
+          <w:rFonts w:ascii="Trebuchet MS" w:eastAsia="Trebuchet MS" w:hAnsi="Trebuchet MS" w:cs="Trebuchet MS"/>
+          <w:sz w:val="24"/>
+          <w:szCs w:val="24"/>
+        </w:rPr>
+        <w:t>recentre</w:t>
+      </w:r>
+      <w:proofErr w:type="spellEnd"/>
+      <w:r>
+        <w:rPr>
+          <w:rFonts w:ascii="Trebuchet MS" w:eastAsia="Trebuchet MS" w:hAnsi="Trebuchet MS" w:cs="Trebuchet MS"/>
+          <w:sz w:val="24"/>
+          <w:szCs w:val="24"/>
+        </w:rPr>
+        <w:t xml:space="preserve"> automatically whenever the user's location changed. This was all placed inside a Scaffold with </w:t>
+      </w:r>
+      <w:proofErr w:type="spellStart"/>
+      <w:r>
+        <w:rPr>
+          <w:rFonts w:ascii="Trebuchet MS" w:eastAsia="Trebuchet MS" w:hAnsi="Trebuchet MS" w:cs="Trebuchet MS"/>
+          <w:sz w:val="24"/>
+          <w:szCs w:val="24"/>
+        </w:rPr>
+        <w:t>innerpadding</w:t>
+      </w:r>
+      <w:proofErr w:type="spellEnd"/>
+      <w:r>
+        <w:rPr>
+          <w:rFonts w:ascii="Trebuchet MS" w:eastAsia="Trebuchet MS" w:hAnsi="Trebuchet MS" w:cs="Trebuchet MS"/>
+          <w:sz w:val="24"/>
+          <w:szCs w:val="24"/>
+        </w:rPr>
+        <w:t xml:space="preserve"> to prevent any overlap of the </w:t>
+      </w:r>
+      <w:proofErr w:type="gramStart"/>
+      <w:r>
+        <w:rPr>
+          <w:rFonts w:ascii="Trebuchet MS" w:eastAsia="Trebuchet MS" w:hAnsi="Trebuchet MS" w:cs="Trebuchet MS"/>
+          <w:sz w:val="24"/>
+          <w:szCs w:val="24"/>
+        </w:rPr>
+        <w:t>devices</w:t>
+      </w:r>
+      <w:proofErr w:type="gramEnd"/>
+      <w:r>
+        <w:rPr>
+          <w:rFonts w:ascii="Trebuchet MS" w:eastAsia="Trebuchet MS" w:hAnsi="Trebuchet MS" w:cs="Trebuchet MS"/>
+          <w:sz w:val="24"/>
+          <w:szCs w:val="24"/>
+        </w:rPr>
+        <w:t xml:space="preserve"> interfaces with the application itself.</w:t>
       </w:r>
     </w:p>
     <w:p>
@@ -1265,7 +1791,29 @@
           <w:sz w:val="24"/>
           <w:szCs w:val="24"/>
         </w:rPr>
-        <w:t>- type (pub, restaurant, hotel, historical site, etc);</w:t>
+        <w:t xml:space="preserve">- type (pub, restaurant, hotel, historical site, </w:t>
+      </w:r>
+      <w:proofErr w:type="spellStart"/>
+      <w:r>
+        <w:rPr>
+          <w:rFonts w:ascii="Trebuchet MS" w:hAnsi="Trebuchet MS"/>
+          <w:i/>
+          <w:iCs/>
+          <w:sz w:val="24"/>
+          <w:szCs w:val="24"/>
+        </w:rPr>
+        <w:t>etc</w:t>
+      </w:r>
+      <w:proofErr w:type="spellEnd"/>
+      <w:r>
+        <w:rPr>
+          <w:rFonts w:ascii="Trebuchet MS" w:hAnsi="Trebuchet MS"/>
+          <w:i/>
+          <w:iCs/>
+          <w:sz w:val="24"/>
+          <w:szCs w:val="24"/>
+        </w:rPr>
+        <w:t>);</w:t>
       </w:r>
     </w:p>
     <w:p>
@@ -1360,7 +1908,31 @@
           <w:sz w:val="24"/>
           <w:szCs w:val="24"/>
         </w:rPr>
-        <w:t>For now you can just use buttons for navigation – there is no need to use an app bar, a navigation bar, or the navigation drawer just yet.</w:t>
+        <w:t xml:space="preserve">For </w:t>
+      </w:r>
+      <w:proofErr w:type="gramStart"/>
+      <w:r>
+        <w:rPr>
+          <w:rFonts w:ascii="Trebuchet MS" w:hAnsi="Trebuchet MS"/>
+          <w:i/>
+          <w:iCs/>
+          <w:color w:val="000000"/>
+          <w:sz w:val="24"/>
+          <w:szCs w:val="24"/>
+        </w:rPr>
+        <w:t>now</w:t>
+      </w:r>
+      <w:proofErr w:type="gramEnd"/>
+      <w:r>
+        <w:rPr>
+          <w:rFonts w:ascii="Trebuchet MS" w:hAnsi="Trebuchet MS"/>
+          <w:i/>
+          <w:iCs/>
+          <w:color w:val="000000"/>
+          <w:sz w:val="24"/>
+          <w:szCs w:val="24"/>
+        </w:rPr>
+        <w:t xml:space="preserve"> you can just use buttons for navigation – there is no need to use an app bar, a navigation bar, or the navigation drawer just yet.</w:t>
       </w:r>
       <w:r>
         <w:rPr>
@@ -1480,8 +2052,13 @@
       <w:r>
         <w:t xml:space="preserve"> </w:t>
       </w:r>
-      <w:r>
-        <w:t>ViewModel.</w:t>
+      <w:proofErr w:type="spellStart"/>
+      <w:r>
+        <w:t>ViewModel</w:t>
+      </w:r>
+      <w:proofErr w:type="spellEnd"/>
+      <w:r>
+        <w:t>.</w:t>
       </w:r>
     </w:p>
     <w:p>
@@ -1499,13 +2076,58 @@
         <w:ind w:left="720"/>
       </w:pPr>
       <w:r>
-        <w:t xml:space="preserve">I then plan to update my LatLng ViewModel to also include the POI list rather than adding a second ViewModel as this already holds the GPS location. I will add </w:t>
-      </w:r>
-      <w:r>
-        <w:t>MutableLiveData&lt;List&lt;Poi&gt;&gt;</w:t>
-      </w:r>
-      <w:r>
-        <w:t xml:space="preserve"> so that the MainActivity can observe the list, meaning that whenever a POI is added the UI can then automatically know to redraw any makers on the map. I will then add a function to the ViewModel which will add a </w:t>
+        <w:t xml:space="preserve">I then plan to update my </w:t>
+      </w:r>
+      <w:proofErr w:type="spellStart"/>
+      <w:r>
+        <w:t>LatLng</w:t>
+      </w:r>
+      <w:proofErr w:type="spellEnd"/>
+      <w:r>
+        <w:t xml:space="preserve"> </w:t>
+      </w:r>
+      <w:proofErr w:type="spellStart"/>
+      <w:r>
+        <w:t>ViewModel</w:t>
+      </w:r>
+      <w:proofErr w:type="spellEnd"/>
+      <w:r>
+        <w:t xml:space="preserve"> to also include the POI list rather than adding a second </w:t>
+      </w:r>
+      <w:proofErr w:type="spellStart"/>
+      <w:r>
+        <w:t>ViewModel</w:t>
+      </w:r>
+      <w:proofErr w:type="spellEnd"/>
+      <w:r>
+        <w:t xml:space="preserve"> as this already holds the GPS location. I will add </w:t>
+      </w:r>
+      <w:proofErr w:type="spellStart"/>
+      <w:r>
+        <w:t>MutableLiveData</w:t>
+      </w:r>
+      <w:proofErr w:type="spellEnd"/>
+      <w:r>
+        <w:t>&lt;List&lt;Poi&gt;&gt;</w:t>
+      </w:r>
+      <w:r>
+        <w:t xml:space="preserve"> so that the </w:t>
+      </w:r>
+      <w:proofErr w:type="spellStart"/>
+      <w:r>
+        <w:t>MainActivity</w:t>
+      </w:r>
+      <w:proofErr w:type="spellEnd"/>
+      <w:r>
+        <w:t xml:space="preserve"> can observe the list, meaning that whenever a POI is added the UI can then automatically know to redraw any makers on the map. I will then add a function to the </w:t>
+      </w:r>
+      <w:proofErr w:type="spellStart"/>
+      <w:r>
+        <w:t>ViewModel</w:t>
+      </w:r>
+      <w:proofErr w:type="spellEnd"/>
+      <w:r>
+        <w:t xml:space="preserve"> which will add a </w:t>
       </w:r>
       <w:r>
         <w:t xml:space="preserve">given </w:t>
@@ -1651,13 +2273,29 @@
         <w:t>I will then add a separate composable for the POI screen</w:t>
       </w:r>
       <w:r>
-        <w:t>. I plan to put this in its own separate file to prevent code from clustering in the MainActivity.</w:t>
+        <w:t xml:space="preserve">. I plan to put this in its own separate file to prevent code from clustering in the </w:t>
+      </w:r>
+      <w:proofErr w:type="spellStart"/>
+      <w:r>
+        <w:t>MainActivity</w:t>
+      </w:r>
+      <w:proofErr w:type="spellEnd"/>
+      <w:r>
+        <w:t>.</w:t>
       </w:r>
       <w:r>
         <w:t xml:space="preserve"> I will add two callback functions to the parameter of the composable. One will be for when a POI I added and the other will be for when the user wishes to navigate back to the home screen.</w:t>
       </w:r>
       <w:r>
-        <w:t xml:space="preserve"> I will also make it so the users current LatLng is also passed as a parameter for the POIs location.</w:t>
+        <w:t xml:space="preserve"> I will also make it so the users current </w:t>
+      </w:r>
+      <w:proofErr w:type="spellStart"/>
+      <w:r>
+        <w:t>LatLng</w:t>
+      </w:r>
+      <w:proofErr w:type="spellEnd"/>
+      <w:r>
+        <w:t xml:space="preserve"> is also passed as a parameter for the POIs location.</w:t>
       </w:r>
       <w:r>
         <w:t xml:space="preserve"> </w:t>
@@ -1732,7 +2370,55 @@
         </w:drawing>
       </w:r>
       <w:r>
-        <w:t xml:space="preserve">I will finally update the main composable to include the map page and the add poi page using the compose navigation. I will add the NavHost which will contain the two routes for the map page and the add poi page. I will then be able to define the callback functions for the onPoiAdded and onNavigateBack. onPoiAdded will add the new poi to the ViewModel and the onNavigateBack will return the user to the previous page they were on. </w:t>
+        <w:t xml:space="preserve">I will finally update the main composable to include the map page and the add poi page using the compose navigation. I will add the </w:t>
+      </w:r>
+      <w:proofErr w:type="spellStart"/>
+      <w:r>
+        <w:t>NavHost</w:t>
+      </w:r>
+      <w:proofErr w:type="spellEnd"/>
+      <w:r>
+        <w:t xml:space="preserve"> which will contain the two routes for the map page and the add poi page. I will then be able to define the callback functions for the </w:t>
+      </w:r>
+      <w:proofErr w:type="spellStart"/>
+      <w:r>
+        <w:t>onPoiAdded</w:t>
+      </w:r>
+      <w:proofErr w:type="spellEnd"/>
+      <w:r>
+        <w:t xml:space="preserve"> and </w:t>
+      </w:r>
+      <w:proofErr w:type="spellStart"/>
+      <w:r>
+        <w:t>onNavigateBack</w:t>
+      </w:r>
+      <w:proofErr w:type="spellEnd"/>
+      <w:r>
+        <w:t xml:space="preserve">. </w:t>
+      </w:r>
+      <w:proofErr w:type="spellStart"/>
+      <w:r>
+        <w:t>onPoiAdded</w:t>
+      </w:r>
+      <w:proofErr w:type="spellEnd"/>
+      <w:r>
+        <w:t xml:space="preserve"> will add the new poi to the </w:t>
+      </w:r>
+      <w:proofErr w:type="spellStart"/>
+      <w:r>
+        <w:t>ViewModel</w:t>
+      </w:r>
+      <w:proofErr w:type="spellEnd"/>
+      <w:r>
+        <w:t xml:space="preserve"> and the </w:t>
+      </w:r>
+      <w:proofErr w:type="spellStart"/>
+      <w:r>
+        <w:t>onNavigateBack</w:t>
+      </w:r>
+      <w:proofErr w:type="spellEnd"/>
+      <w:r>
+        <w:t xml:space="preserve"> will return the user to the previous page they were on. </w:t>
       </w:r>
       <w:r>
         <w:t xml:space="preserve">I will place a </w:t>
@@ -1743,8 +2429,13 @@
       <w:r>
         <w:t xml:space="preserve">the </w:t>
       </w:r>
-      <w:r>
-        <w:t>MapLibre lambda</w:t>
+      <w:proofErr w:type="spellStart"/>
+      <w:r>
+        <w:t>MapLibre</w:t>
+      </w:r>
+      <w:proofErr w:type="spellEnd"/>
+      <w:r>
+        <w:t xml:space="preserve"> lambda</w:t>
       </w:r>
       <w:r>
         <w:t xml:space="preserve">. </w:t>
@@ -1762,20 +2453,43 @@
         <w:t xml:space="preserve"> the</w:t>
       </w:r>
       <w:r>
-        <w:t xml:space="preserve"> poisState changes</w:t>
+        <w:t xml:space="preserve"> </w:t>
+      </w:r>
+      <w:proofErr w:type="spellStart"/>
+      <w:proofErr w:type="gramStart"/>
+      <w:r>
+        <w:t>poisState</w:t>
+      </w:r>
+      <w:proofErr w:type="spellEnd"/>
+      <w:proofErr w:type="gramEnd"/>
+      <w:r>
+        <w:t xml:space="preserve"> changes</w:t>
       </w:r>
       <w:r>
         <w:t>. This will then</w:t>
       </w:r>
       <w:r>
-        <w:t xml:space="preserve"> loop through poisState and plac</w:t>
+        <w:t xml:space="preserve"> loop through </w:t>
+      </w:r>
+      <w:proofErr w:type="spellStart"/>
+      <w:r>
+        <w:t>poisState</w:t>
+      </w:r>
+      <w:proofErr w:type="spellEnd"/>
+      <w:r>
+        <w:t xml:space="preserve"> and plac</w:t>
       </w:r>
       <w:r>
         <w:t>e</w:t>
       </w:r>
       <w:r>
-        <w:t xml:space="preserve"> a Symbol at each POI's LatLng</w:t>
-      </w:r>
+        <w:t xml:space="preserve"> a Symbol at each POI's </w:t>
+      </w:r>
+      <w:proofErr w:type="spellStart"/>
+      <w:r>
+        <w:t>LatLng</w:t>
+      </w:r>
+      <w:proofErr w:type="spellEnd"/>
       <w:r>
         <w:t>. This makes it so</w:t>
       </w:r>
@@ -1786,7 +2500,15 @@
         <w:t>.</w:t>
       </w:r>
       <w:r>
-        <w:t xml:space="preserve"> I will make it so an alert dialog appears when the marker is clicked on, displaying the markers details including its name, type and description. This allows me to test that the marker has been added correctly.</w:t>
+        <w:t xml:space="preserve"> I will make </w:t>
+      </w:r>
+      <w:proofErr w:type="gramStart"/>
+      <w:r>
+        <w:t>it</w:t>
+      </w:r>
+      <w:proofErr w:type="gramEnd"/>
+      <w:r>
+        <w:t xml:space="preserve"> so an alert dialog appears when the marker is clicked on, displaying the markers details including its name, type and description. This allows me to test that the marker has been added correctly.</w:t>
       </w:r>
     </w:p>
     <w:p>
@@ -2156,6 +2878,9 @@
         <w:ind w:left="720"/>
       </w:pPr>
       <w:r>
+        <w:rPr>
+          <w:noProof/>
+        </w:rPr>
         <w:drawing>
           <wp:anchor distT="0" distB="0" distL="114300" distR="114300" simplePos="0" relativeHeight="251678720" behindDoc="0" locked="0" layoutInCell="1" allowOverlap="1" wp14:anchorId="321F7754" wp14:editId="057EDCBE">
             <wp:simplePos x="0" y="0"/>
@@ -2256,6 +2981,9 @@
         <w:ind w:left="720"/>
       </w:pPr>
       <w:r>
+        <w:rPr>
+          <w:noProof/>
+        </w:rPr>
         <w:lastRenderedPageBreak/>
         <w:drawing>
           <wp:anchor distT="0" distB="0" distL="114300" distR="114300" simplePos="0" relativeHeight="251679744" behindDoc="0" locked="0" layoutInCell="1" allowOverlap="1" wp14:anchorId="6B4D34FA" wp14:editId="1EA47495">
@@ -2326,7 +3054,15 @@
         <w:t xml:space="preserve">methods </w:t>
       </w:r>
       <w:r>
-        <w:t xml:space="preserve">for the database so it can be changed or searched. I plan to make it so that when the database returns all the POIs it contains, it will return it as a LiveData&lt;List&lt;Poi&gt;&gt;. This will </w:t>
+        <w:t xml:space="preserve">for the database so it can be changed or searched. I plan to make it so that when the database returns all the POIs it contains, it will return it as a </w:t>
+      </w:r>
+      <w:proofErr w:type="spellStart"/>
+      <w:r>
+        <w:t>LiveData</w:t>
+      </w:r>
+      <w:proofErr w:type="spellEnd"/>
+      <w:r>
+        <w:t xml:space="preserve">&lt;List&lt;Poi&gt;&gt;. This will </w:t>
       </w:r>
       <w:r>
         <w:t>make</w:t>
@@ -2335,19 +3071,51 @@
         <w:t xml:space="preserve"> sure that the UI is automatically updated with a new list of POIs whenever the database is changed.</w:t>
       </w:r>
       <w:r>
-        <w:t xml:space="preserve"> For now, I will give it three functions, getAllPois(), insert() and delete().</w:t>
-      </w:r>
-    </w:p>
-    <w:p>
-      <w:pPr>
-        <w:ind w:left="720"/>
-      </w:pPr>
-    </w:p>
-    <w:p>
-      <w:pPr>
-        <w:ind w:left="720"/>
-      </w:pPr>
-      <w:r>
+        <w:t xml:space="preserve"> For now, I will give it three functions, </w:t>
+      </w:r>
+      <w:proofErr w:type="spellStart"/>
+      <w:proofErr w:type="gramStart"/>
+      <w:r>
+        <w:t>getAllPois</w:t>
+      </w:r>
+      <w:proofErr w:type="spellEnd"/>
+      <w:r>
+        <w:t>(</w:t>
+      </w:r>
+      <w:proofErr w:type="gramEnd"/>
+      <w:r>
+        <w:t xml:space="preserve">), </w:t>
+      </w:r>
+      <w:proofErr w:type="gramStart"/>
+      <w:r>
+        <w:t>insert(</w:t>
+      </w:r>
+      <w:proofErr w:type="gramEnd"/>
+      <w:r>
+        <w:t xml:space="preserve">) and </w:t>
+      </w:r>
+      <w:proofErr w:type="gramStart"/>
+      <w:r>
+        <w:t>delete(</w:t>
+      </w:r>
+      <w:proofErr w:type="gramEnd"/>
+      <w:r>
+        <w:t>).</w:t>
+      </w:r>
+    </w:p>
+    <w:p>
+      <w:pPr>
+        <w:ind w:left="720"/>
+      </w:pPr>
+    </w:p>
+    <w:p>
+      <w:pPr>
+        <w:ind w:left="720"/>
+      </w:pPr>
+      <w:r>
+        <w:rPr>
+          <w:noProof/>
+        </w:rPr>
         <w:drawing>
           <wp:anchor distT="0" distB="0" distL="114300" distR="114300" simplePos="0" relativeHeight="251680768" behindDoc="0" locked="0" layoutInCell="1" allowOverlap="1" wp14:anchorId="67BE6305" wp14:editId="4E76A900">
             <wp:simplePos x="0" y="0"/>
@@ -2405,14 +3173,38 @@
         </w:drawing>
       </w:r>
       <w:r>
-        <w:t>I plan to next create the file for the database itself. This will be placed within an abstract function which allows my other files to access its DAO and all the database operations within it. Inside it I will put a getDatabase() function which will check that a database doesn’t already exist, if not it will create one and save it, otherwise it will simply return the one that already exists.</w:t>
-      </w:r>
-    </w:p>
-    <w:p>
-      <w:pPr>
-        <w:ind w:left="720"/>
-      </w:pPr>
-      <w:r>
+        <w:t xml:space="preserve">I plan to next create the file for the database itself. This will be placed within an abstract function which allows my other files to access its DAO and all the database operations within it. Inside it I will put a </w:t>
+      </w:r>
+      <w:proofErr w:type="spellStart"/>
+      <w:proofErr w:type="gramStart"/>
+      <w:r>
+        <w:t>getDatabase</w:t>
+      </w:r>
+      <w:proofErr w:type="spellEnd"/>
+      <w:r>
+        <w:t>(</w:t>
+      </w:r>
+      <w:proofErr w:type="gramEnd"/>
+      <w:r>
+        <w:t xml:space="preserve">) function which will check that a database </w:t>
+      </w:r>
+      <w:proofErr w:type="gramStart"/>
+      <w:r>
+        <w:t>doesn’t already</w:t>
+      </w:r>
+      <w:proofErr w:type="gramEnd"/>
+      <w:r>
+        <w:t xml:space="preserve"> exist, if not it will create one and save it, otherwise it will simply return the one that already exists.</w:t>
+      </w:r>
+    </w:p>
+    <w:p>
+      <w:pPr>
+        <w:ind w:left="720"/>
+      </w:pPr>
+      <w:r>
+        <w:rPr>
+          <w:noProof/>
+        </w:rPr>
         <w:lastRenderedPageBreak/>
         <w:drawing>
           <wp:anchor distT="0" distB="0" distL="114300" distR="114300" simplePos="0" relativeHeight="251681792" behindDoc="0" locked="0" layoutInCell="1" allowOverlap="1" wp14:anchorId="7CE67090" wp14:editId="532CADD5">
@@ -2471,16 +3263,74 @@
         </w:drawing>
       </w:r>
       <w:r>
-        <w:t xml:space="preserve">I will next update my Viewmodel. </w:t>
-      </w:r>
-      <w:r>
-        <w:t xml:space="preserve">I will first change the ViewModel for a AndroidViewModel so that it can access the application context which will be needed to open the database. </w:t>
+        <w:t xml:space="preserve">I will next update my </w:t>
+      </w:r>
+      <w:proofErr w:type="spellStart"/>
+      <w:r>
+        <w:t>Viewmodel</w:t>
+      </w:r>
+      <w:proofErr w:type="spellEnd"/>
+      <w:r>
+        <w:t xml:space="preserve">. </w:t>
+      </w:r>
+      <w:r>
+        <w:t xml:space="preserve">I will first change the </w:t>
+      </w:r>
+      <w:proofErr w:type="spellStart"/>
+      <w:r>
+        <w:t>ViewModel</w:t>
+      </w:r>
+      <w:proofErr w:type="spellEnd"/>
+      <w:r>
+        <w:t xml:space="preserve"> for </w:t>
+      </w:r>
+      <w:proofErr w:type="gramStart"/>
+      <w:r>
+        <w:t xml:space="preserve">a </w:t>
+      </w:r>
+      <w:proofErr w:type="spellStart"/>
+      <w:r>
+        <w:t>AndroidViewModel</w:t>
+      </w:r>
+      <w:proofErr w:type="spellEnd"/>
+      <w:proofErr w:type="gramEnd"/>
+      <w:r>
+        <w:t xml:space="preserve"> so that it can access the application context which will be needed to open the database. </w:t>
       </w:r>
       <w:r>
         <w:t xml:space="preserve">I plan to update the poi variable so that it gathers all the pois from the database as </w:t>
       </w:r>
-      <w:r>
-        <w:t>LiveData allowing it to automatically update when a new POI is added. Because of this, I will also need to change the addpoi function in the Viewmodel so that it adds the poi to the database instead of list using the poiDao’s ins</w:t>
+      <w:proofErr w:type="spellStart"/>
+      <w:r>
+        <w:t>LiveData</w:t>
+      </w:r>
+      <w:proofErr w:type="spellEnd"/>
+      <w:r>
+        <w:t xml:space="preserve"> allowing it to automatically update when a new POI is added. Because of this, I will also need to change the </w:t>
+      </w:r>
+      <w:proofErr w:type="spellStart"/>
+      <w:r>
+        <w:t>addpoi</w:t>
+      </w:r>
+      <w:proofErr w:type="spellEnd"/>
+      <w:r>
+        <w:t xml:space="preserve"> function in the </w:t>
+      </w:r>
+      <w:proofErr w:type="spellStart"/>
+      <w:r>
+        <w:t>Viewmodel</w:t>
+      </w:r>
+      <w:proofErr w:type="spellEnd"/>
+      <w:r>
+        <w:t xml:space="preserve"> so that it adds the poi to the database instead of list using the </w:t>
+      </w:r>
+      <w:proofErr w:type="spellStart"/>
+      <w:r>
+        <w:t>poiDao’s</w:t>
+      </w:r>
+      <w:proofErr w:type="spellEnd"/>
+      <w:r>
+        <w:t xml:space="preserve"> ins</w:t>
       </w:r>
       <w:r>
         <w:t>ert function.</w:t>
@@ -2501,6 +3351,9 @@
         <w:ind w:left="720"/>
       </w:pPr>
       <w:r>
+        <w:rPr>
+          <w:noProof/>
+        </w:rPr>
         <w:drawing>
           <wp:anchor distT="0" distB="0" distL="114300" distR="114300" simplePos="0" relativeHeight="251682816" behindDoc="0" locked="0" layoutInCell="1" allowOverlap="1" wp14:anchorId="0ABF882C" wp14:editId="7C324563">
             <wp:simplePos x="0" y="0"/>
@@ -2558,7 +3411,15 @@
         </w:drawing>
       </w:r>
       <w:r>
-        <w:t>I will then update the button for my AddPoiScreen. I will simply change the Poi structure in the button so that it fits the databases poi structure since the latitude and longitude for the pois in the database are separate variables.</w:t>
+        <w:t xml:space="preserve">I will then update the button for my </w:t>
+      </w:r>
+      <w:proofErr w:type="spellStart"/>
+      <w:r>
+        <w:t>AddPoiScreen</w:t>
+      </w:r>
+      <w:proofErr w:type="spellEnd"/>
+      <w:r>
+        <w:t>. I will simply change the Poi structure in the button so that it fits the databases poi structure since the latitude and longitude for the pois in the database are separate variables.</w:t>
       </w:r>
     </w:p>
     <w:p>
@@ -2572,14 +3433,33 @@
       </w:pPr>
       <w:r>
         <w:lastRenderedPageBreak/>
-        <w:t>I will then need to change the MainActivity so that the Poi is converted back into the LatLng so that the map can properly mark its location.</w:t>
-      </w:r>
-    </w:p>
-    <w:p>
-      <w:pPr>
-        <w:ind w:left="720"/>
-      </w:pPr>
-      <w:r>
+        <w:t xml:space="preserve">I will then need to change the </w:t>
+      </w:r>
+      <w:proofErr w:type="spellStart"/>
+      <w:r>
+        <w:t>MainActivity</w:t>
+      </w:r>
+      <w:proofErr w:type="spellEnd"/>
+      <w:r>
+        <w:t xml:space="preserve"> so that the Poi is converted back into the </w:t>
+      </w:r>
+      <w:proofErr w:type="spellStart"/>
+      <w:r>
+        <w:t>LatLng</w:t>
+      </w:r>
+      <w:proofErr w:type="spellEnd"/>
+      <w:r>
+        <w:t xml:space="preserve"> so that the map can properly mark its location.</w:t>
+      </w:r>
+    </w:p>
+    <w:p>
+      <w:pPr>
+        <w:ind w:left="720"/>
+      </w:pPr>
+      <w:r>
+        <w:rPr>
+          <w:noProof/>
+        </w:rPr>
         <w:drawing>
           <wp:anchor distT="0" distB="0" distL="114300" distR="114300" simplePos="0" relativeHeight="251683840" behindDoc="0" locked="0" layoutInCell="1" allowOverlap="1" wp14:anchorId="3BBBDE1F" wp14:editId="3DD490B1">
             <wp:simplePos x="0" y="0"/>
@@ -2641,6 +3521,9 @@
         <w:ind w:left="720"/>
       </w:pPr>
       <w:r>
+        <w:rPr>
+          <w:noProof/>
+        </w:rPr>
         <w:drawing>
           <wp:anchor distT="0" distB="0" distL="114300" distR="114300" simplePos="0" relativeHeight="251684864" behindDoc="0" locked="0" layoutInCell="1" allowOverlap="1" wp14:anchorId="071F14F2" wp14:editId="3B520E16">
             <wp:simplePos x="0" y="0"/>
@@ -2715,16 +3598,7 @@
           <w:sz w:val="24"/>
           <w:szCs w:val="24"/>
         </w:rPr>
-        <w:t xml:space="preserve">4. </w:t>
-      </w:r>
-      <w:r>
-        <w:rPr>
-          <w:rFonts w:ascii="Trebuchet MS" w:hAnsi="Trebuchet MS"/>
-          <w:color w:val="000000"/>
-          <w:sz w:val="24"/>
-          <w:szCs w:val="24"/>
-        </w:rPr>
-        <w:t>“</w:t>
+        <w:t>4. “</w:t>
       </w:r>
       <w:r>
         <w:rPr>
@@ -2789,7 +3663,15 @@
         <w:ind w:left="720"/>
       </w:pPr>
       <w:r>
-        <w:t xml:space="preserve">I have already set up the loading process for the POIs for task 3. This is done on startup and whenever the database is updated. </w:t>
+        <w:t xml:space="preserve">I have already set up the loading process for the POIs for task 3. This is done on </w:t>
+      </w:r>
+      <w:proofErr w:type="gramStart"/>
+      <w:r>
+        <w:t>startup and</w:t>
+      </w:r>
+      <w:proofErr w:type="gramEnd"/>
+      <w:r>
+        <w:t xml:space="preserve"> whenever the database is updated. </w:t>
       </w:r>
       <w:r>
         <w:t>However, to fit this task better I will change the code to use a button instead, this will make testing easier and give the user more control.</w:t>
@@ -2805,14 +3687,26 @@
         <w:ind w:left="720"/>
       </w:pPr>
       <w:r>
-        <w:t xml:space="preserve">I will start this by changing the DAO to return a plain list instead of </w:t>
-      </w:r>
+        <w:t xml:space="preserve">I will start this by changing the DAO to </w:t>
+      </w:r>
+      <w:proofErr w:type="gramStart"/>
+      <w:r>
+        <w:t>return</w:t>
+      </w:r>
+      <w:proofErr w:type="gramEnd"/>
+      <w:r>
+        <w:t xml:space="preserve"> a plain list instead of </w:t>
+      </w:r>
+      <w:proofErr w:type="gramStart"/>
       <w:r>
         <w:t xml:space="preserve">the </w:t>
       </w:r>
+      <w:proofErr w:type="spellStart"/>
       <w:r>
         <w:t>LiveData</w:t>
       </w:r>
+      <w:proofErr w:type="spellEnd"/>
+      <w:proofErr w:type="gramEnd"/>
       <w:r>
         <w:t xml:space="preserve"> since the POIs will no longer be automatically loaded. </w:t>
       </w:r>
@@ -2827,6 +3721,9 @@
         <w:ind w:left="720"/>
       </w:pPr>
       <w:r>
+        <w:rPr>
+          <w:noProof/>
+        </w:rPr>
         <w:drawing>
           <wp:anchor distT="0" distB="0" distL="114300" distR="114300" simplePos="0" relativeHeight="251685888" behindDoc="0" locked="0" layoutInCell="1" allowOverlap="1" wp14:anchorId="4D5B797D" wp14:editId="7771ABD3">
             <wp:simplePos x="0" y="0"/>
@@ -2898,6 +3795,9 @@
         <w:ind w:left="720"/>
       </w:pPr>
       <w:r>
+        <w:rPr>
+          <w:noProof/>
+        </w:rPr>
         <w:lastRenderedPageBreak/>
         <w:drawing>
           <wp:anchor distT="0" distB="0" distL="114300" distR="114300" simplePos="0" relativeHeight="251686912" behindDoc="0" locked="0" layoutInCell="1" allowOverlap="1" wp14:anchorId="3EB7CA82" wp14:editId="7A3F647E">
@@ -2950,40 +3850,54 @@
         </w:drawing>
       </w:r>
       <w:r>
-        <w:t xml:space="preserve">I will also need to add a new function to the ViewModel which will load all the POIs from the database. It will run </w:t>
-      </w:r>
-      <w:r>
-        <w:t xml:space="preserve">the database query on Dispatchers.IO in the background, then </w:t>
-      </w:r>
-      <w:r>
-        <w:t>set</w:t>
-      </w:r>
-      <w:r>
-        <w:t xml:space="preserve"> the result to pois.value which </w:t>
-      </w:r>
-      <w:r>
-        <w:t xml:space="preserve">should </w:t>
-      </w:r>
-      <w:r>
-        <w:t xml:space="preserve">triggers the observer in MainActivity </w:t>
-      </w:r>
-      <w:r>
-        <w:t xml:space="preserve">which will then </w:t>
-      </w:r>
-      <w:r>
-        <w:t>update the map.</w:t>
-      </w:r>
-    </w:p>
-    <w:p>
-      <w:pPr>
-        <w:ind w:left="720"/>
-      </w:pPr>
-    </w:p>
-    <w:p>
-      <w:pPr>
-        <w:ind w:left="720"/>
-      </w:pPr>
-      <w:r>
+        <w:t xml:space="preserve">I will also need to add a new function to the </w:t>
+      </w:r>
+      <w:proofErr w:type="spellStart"/>
+      <w:r>
+        <w:t>ViewModel</w:t>
+      </w:r>
+      <w:proofErr w:type="spellEnd"/>
+      <w:r>
+        <w:t xml:space="preserve"> which will load all the POIs from the database. It will run the database query on Dispatchers.IO in the background, then set the result to </w:t>
+      </w:r>
+      <w:proofErr w:type="spellStart"/>
+      <w:r>
+        <w:t>pois.value</w:t>
+      </w:r>
+      <w:proofErr w:type="spellEnd"/>
+      <w:r>
+        <w:t xml:space="preserve"> which should </w:t>
+      </w:r>
+      <w:proofErr w:type="gramStart"/>
+      <w:r>
+        <w:t>triggers</w:t>
+      </w:r>
+      <w:proofErr w:type="gramEnd"/>
+      <w:r>
+        <w:t xml:space="preserve"> the observer in </w:t>
+      </w:r>
+      <w:proofErr w:type="spellStart"/>
+      <w:r>
+        <w:t>MainActivity</w:t>
+      </w:r>
+      <w:proofErr w:type="spellEnd"/>
+      <w:r>
+        <w:t xml:space="preserve"> which will then update the map.</w:t>
+      </w:r>
+    </w:p>
+    <w:p>
+      <w:pPr>
+        <w:ind w:left="720"/>
+      </w:pPr>
+    </w:p>
+    <w:p>
+      <w:pPr>
+        <w:ind w:left="720"/>
+      </w:pPr>
+      <w:r>
+        <w:rPr>
+          <w:noProof/>
+        </w:rPr>
         <w:drawing>
           <wp:anchor distT="0" distB="0" distL="114300" distR="114300" simplePos="0" relativeHeight="251687936" behindDoc="0" locked="0" layoutInCell="1" allowOverlap="1" wp14:anchorId="5332FEEE" wp14:editId="570E690B">
             <wp:simplePos x="0" y="0"/>
@@ -3041,20 +3955,36 @@
         <w:t>it</w:t>
       </w:r>
       <w:r>
-        <w:t xml:space="preserve"> holds a plain list of pois instead of being assigned directly from the DAO’s live data since it no longer returns LiveData.</w:t>
-      </w:r>
-    </w:p>
-    <w:p>
-      <w:pPr>
-        <w:ind w:left="720"/>
-      </w:pPr>
-    </w:p>
-    <w:p>
-      <w:pPr>
-        <w:ind w:left="720"/>
-      </w:pPr>
-      <w:r>
-        <w:t>I will then lastly need to add the load buttons to the MainActivity. This will call the load poi function in the view model, loading all the pois from the database into the UI.</w:t>
+        <w:t xml:space="preserve"> holds a plain list of pois instead of being assigned directly from the DAO’s live data since it no longer returns </w:t>
+      </w:r>
+      <w:proofErr w:type="spellStart"/>
+      <w:r>
+        <w:t>LiveData</w:t>
+      </w:r>
+      <w:proofErr w:type="spellEnd"/>
+      <w:r>
+        <w:t>.</w:t>
+      </w:r>
+    </w:p>
+    <w:p>
+      <w:pPr>
+        <w:ind w:left="720"/>
+      </w:pPr>
+    </w:p>
+    <w:p>
+      <w:pPr>
+        <w:ind w:left="720"/>
+      </w:pPr>
+      <w:r>
+        <w:t xml:space="preserve">I will then lastly need to add the load buttons to the </w:t>
+      </w:r>
+      <w:proofErr w:type="spellStart"/>
+      <w:r>
+        <w:t>MainActivity</w:t>
+      </w:r>
+      <w:proofErr w:type="spellEnd"/>
+      <w:r>
+        <w:t>. This will call the load poi function in the view model, loading all the pois from the database into the UI.</w:t>
       </w:r>
     </w:p>
     <w:p>
@@ -3068,6 +3998,9 @@
         </w:rPr>
       </w:pPr>
       <w:r>
+        <w:rPr>
+          <w:noProof/>
+        </w:rPr>
         <w:drawing>
           <wp:anchor distT="0" distB="0" distL="114300" distR="114300" simplePos="0" relativeHeight="251688960" behindDoc="0" locked="0" layoutInCell="1" allowOverlap="1" wp14:anchorId="560D152B" wp14:editId="7B346EED">
             <wp:simplePos x="0" y="0"/>
@@ -3158,7 +4091,7 @@
           <w:sz w:val="24"/>
           <w:szCs w:val="24"/>
         </w:rPr>
-        <w:t>“</w:t>
+        <w:t xml:space="preserve">“Allow the user to search for points of interest by TYPE, by inputting the </w:t>
       </w:r>
       <w:r>
         <w:rPr>
@@ -3168,8 +4101,9 @@
           <w:color w:val="000000"/>
           <w:sz w:val="24"/>
           <w:szCs w:val="24"/>
-        </w:rPr>
-        <w:t xml:space="preserve">Allow the user to search for points of interest by TYPE, by inputting the </w:t>
+          <w:u w:val="single"/>
+        </w:rPr>
+        <w:t>TYPE</w:t>
       </w:r>
       <w:r>
         <w:rPr>
@@ -3179,10 +4113,10 @@
           <w:color w:val="000000"/>
           <w:sz w:val="24"/>
           <w:szCs w:val="24"/>
-          <w:u w:val="single"/>
-        </w:rPr>
-        <w:t>TYPE</w:t>
-      </w:r>
+        </w:rPr>
+        <w:t xml:space="preserve"> in a text field. This should search the local database. The matching places should appear on the map as markers or circles. </w:t>
+      </w:r>
+      <w:proofErr w:type="gramStart"/>
       <w:r>
         <w:rPr>
           <w:rFonts w:ascii="Trebuchet MS" w:hAnsi="Trebuchet MS"/>
@@ -3192,8 +4126,9 @@
           <w:sz w:val="24"/>
           <w:szCs w:val="24"/>
         </w:rPr>
-        <w:t xml:space="preserve"> in a text field. This should search the local database. The matching places should appear on the map as markers or circles. Again a dialog box should appear when the user clicks on each place.</w:t>
-      </w:r>
+        <w:t>Again</w:t>
+      </w:r>
+      <w:proofErr w:type="gramEnd"/>
       <w:r>
         <w:rPr>
           <w:rFonts w:ascii="Trebuchet MS" w:hAnsi="Trebuchet MS"/>
@@ -3203,18 +4138,72 @@
           <w:sz w:val="24"/>
           <w:szCs w:val="24"/>
         </w:rPr>
-        <w:t>”</w:t>
-      </w:r>
-    </w:p>
-    <w:p>
-      <w:pPr>
-        <w:ind w:left="720"/>
-      </w:pPr>
-    </w:p>
-    <w:p>
-      <w:pPr>
-        <w:ind w:left="720"/>
-      </w:pPr>
+        <w:t xml:space="preserve"> a dialog box should appear when the user clicks on each place.”</w:t>
+      </w:r>
+    </w:p>
+    <w:p>
+      <w:pPr>
+        <w:ind w:left="720"/>
+      </w:pPr>
+    </w:p>
+    <w:p>
+      <w:pPr>
+        <w:ind w:left="720"/>
+      </w:pPr>
+      <w:r>
+        <w:rPr>
+          <w:noProof/>
+        </w:rPr>
+        <w:drawing>
+          <wp:anchor distT="0" distB="0" distL="114300" distR="114300" simplePos="0" relativeHeight="251689984" behindDoc="0" locked="0" layoutInCell="1" allowOverlap="1" wp14:anchorId="078EF1E4" wp14:editId="0668681B">
+            <wp:simplePos x="0" y="0"/>
+            <wp:positionH relativeFrom="margin">
+              <wp:align>center</wp:align>
+            </wp:positionH>
+            <wp:positionV relativeFrom="paragraph">
+              <wp:posOffset>605155</wp:posOffset>
+            </wp:positionV>
+            <wp:extent cx="5010150" cy="495300"/>
+            <wp:effectExtent l="0" t="0" r="0" b="0"/>
+            <wp:wrapTopAndBottom/>
+            <wp:docPr id="21484269" name="Picture 1"/>
+            <wp:cNvGraphicFramePr>
+              <a:graphicFrameLocks xmlns:a="http://schemas.openxmlformats.org/drawingml/2006/main" noChangeAspect="1"/>
+            </wp:cNvGraphicFramePr>
+            <a:graphic xmlns:a="http://schemas.openxmlformats.org/drawingml/2006/main">
+              <a:graphicData uri="http://schemas.openxmlformats.org/drawingml/2006/picture">
+                <pic:pic xmlns:pic="http://schemas.openxmlformats.org/drawingml/2006/picture">
+                  <pic:nvPicPr>
+                    <pic:cNvPr id="21484269" name=""/>
+                    <pic:cNvPicPr/>
+                  </pic:nvPicPr>
+                  <pic:blipFill>
+                    <a:blip r:embed="rId35">
+                      <a:extLst>
+                        <a:ext uri="{28A0092B-C50C-407E-A947-70E740481C1C}">
+                          <a14:useLocalDpi xmlns:a14="http://schemas.microsoft.com/office/drawing/2010/main" val="0"/>
+                        </a:ext>
+                      </a:extLst>
+                    </a:blip>
+                    <a:stretch>
+                      <a:fillRect/>
+                    </a:stretch>
+                  </pic:blipFill>
+                  <pic:spPr>
+                    <a:xfrm>
+                      <a:off x="0" y="0"/>
+                      <a:ext cx="5010150" cy="495300"/>
+                    </a:xfrm>
+                    <a:prstGeom prst="rect">
+                      <a:avLst/>
+                    </a:prstGeom>
+                  </pic:spPr>
+                </pic:pic>
+              </a:graphicData>
+            </a:graphic>
+          </wp:anchor>
+        </w:drawing>
+      </w:r>
       <w:r>
         <w:t xml:space="preserve">I will start this task by adding new query to my DAO. This will search the poi database using a given type to find any pois with that match that type. </w:t>
       </w:r>
@@ -3231,30 +4220,132 @@
       <w:pPr>
         <w:ind w:left="720"/>
       </w:pPr>
+    </w:p>
+    <w:p>
+      <w:pPr>
+        <w:ind w:left="720"/>
+      </w:pPr>
+      <w:r>
+        <w:rPr>
+          <w:noProof/>
+        </w:rPr>
+        <w:lastRenderedPageBreak/>
+        <w:drawing>
+          <wp:anchor distT="0" distB="0" distL="114300" distR="114300" simplePos="0" relativeHeight="251691008" behindDoc="0" locked="0" layoutInCell="1" allowOverlap="1" wp14:anchorId="35F846E8" wp14:editId="25798B46">
+            <wp:simplePos x="0" y="0"/>
+            <wp:positionH relativeFrom="margin">
+              <wp:align>center</wp:align>
+            </wp:positionH>
+            <wp:positionV relativeFrom="paragraph">
+              <wp:posOffset>619125</wp:posOffset>
+            </wp:positionV>
+            <wp:extent cx="4391025" cy="1724025"/>
+            <wp:effectExtent l="0" t="0" r="9525" b="9525"/>
+            <wp:wrapTopAndBottom/>
+            <wp:docPr id="14841726" name="Picture 1"/>
+            <wp:cNvGraphicFramePr>
+              <a:graphicFrameLocks xmlns:a="http://schemas.openxmlformats.org/drawingml/2006/main" noChangeAspect="1"/>
+            </wp:cNvGraphicFramePr>
+            <a:graphic xmlns:a="http://schemas.openxmlformats.org/drawingml/2006/main">
+              <a:graphicData uri="http://schemas.openxmlformats.org/drawingml/2006/picture">
+                <pic:pic xmlns:pic="http://schemas.openxmlformats.org/drawingml/2006/picture">
+                  <pic:nvPicPr>
+                    <pic:cNvPr id="14841726" name=""/>
+                    <pic:cNvPicPr/>
+                  </pic:nvPicPr>
+                  <pic:blipFill>
+                    <a:blip r:embed="rId36">
+                      <a:extLst>
+                        <a:ext uri="{28A0092B-C50C-407E-A947-70E740481C1C}">
+                          <a14:useLocalDpi xmlns:a14="http://schemas.microsoft.com/office/drawing/2010/main" val="0"/>
+                        </a:ext>
+                      </a:extLst>
+                    </a:blip>
+                    <a:stretch>
+                      <a:fillRect/>
+                    </a:stretch>
+                  </pic:blipFill>
+                  <pic:spPr>
+                    <a:xfrm>
+                      <a:off x="0" y="0"/>
+                      <a:ext cx="4391025" cy="1724025"/>
+                    </a:xfrm>
+                    <a:prstGeom prst="rect">
+                      <a:avLst/>
+                    </a:prstGeom>
+                  </pic:spPr>
+                </pic:pic>
+              </a:graphicData>
+            </a:graphic>
+          </wp:anchor>
+        </w:drawing>
+      </w:r>
       <w:r>
         <w:t>I will next create</w:t>
       </w:r>
       <w:r>
-        <w:t xml:space="preserve"> a new function in the ViewModel. This will use the search by type function from the DAO. This will have the type as a parameter to search with and add the results to the pois.value.</w:t>
-      </w:r>
-    </w:p>
-    <w:p>
-      <w:pPr>
-        <w:ind w:left="720"/>
-      </w:pPr>
-    </w:p>
-    <w:p>
-      <w:pPr>
-        <w:ind w:left="720"/>
-      </w:pPr>
-    </w:p>
-    <w:p>
-      <w:pPr>
-        <w:ind w:left="720"/>
-      </w:pPr>
-      <w:r>
-        <w:lastRenderedPageBreak/>
-        <w:t>Then I will add an outlined text field to my MainActivity which will be used by the user to input the accommodation type that they are searching for. This will then be followed by a button which, when clicked, will take the inputted data and call the search pois by type function using the inputted data as the parameter.</w:t>
+        <w:t xml:space="preserve"> a new function in the </w:t>
+      </w:r>
+      <w:proofErr w:type="spellStart"/>
+      <w:r>
+        <w:t>ViewModel</w:t>
+      </w:r>
+      <w:proofErr w:type="spellEnd"/>
+      <w:r>
+        <w:t xml:space="preserve">. This will </w:t>
+      </w:r>
+      <w:proofErr w:type="gramStart"/>
+      <w:r>
+        <w:t>use the search</w:t>
+      </w:r>
+      <w:proofErr w:type="gramEnd"/>
+      <w:r>
+        <w:t xml:space="preserve"> by type function from the DAO. This will have the type as a parameter to search with and add the results to the </w:t>
+      </w:r>
+      <w:proofErr w:type="spellStart"/>
+      <w:r>
+        <w:t>pois.value</w:t>
+      </w:r>
+      <w:proofErr w:type="spellEnd"/>
+      <w:r>
+        <w:t>.</w:t>
+      </w:r>
+    </w:p>
+    <w:p>
+      <w:pPr>
+        <w:ind w:left="720"/>
+      </w:pPr>
+    </w:p>
+    <w:p>
+      <w:pPr>
+        <w:ind w:left="720"/>
+      </w:pPr>
+      <w:r>
+        <w:t xml:space="preserve">Then I will add an outlined text field to my </w:t>
+      </w:r>
+      <w:proofErr w:type="spellStart"/>
+      <w:r>
+        <w:t>MainActivity</w:t>
+      </w:r>
+      <w:proofErr w:type="spellEnd"/>
+      <w:r>
+        <w:t xml:space="preserve"> which will be used by the user to input the accommodation type that they are searching for. This will then be followed by a button which, when clicked, will take the </w:t>
+      </w:r>
+      <w:proofErr w:type="gramStart"/>
+      <w:r>
+        <w:t>inputted</w:t>
+      </w:r>
+      <w:proofErr w:type="gramEnd"/>
+      <w:r>
+        <w:t xml:space="preserve"> data and call the search pois by type function using the </w:t>
+      </w:r>
+      <w:proofErr w:type="gramStart"/>
+      <w:r>
+        <w:t>inputted</w:t>
+      </w:r>
+      <w:proofErr w:type="gramEnd"/>
+      <w:r>
+        <w:t xml:space="preserve"> data as the parameter.</w:t>
       </w:r>
     </w:p>
     <w:p/>
@@ -3785,6 +4876,7 @@
   <w:style w:type="character" w:default="1" w:styleId="DefaultParagraphFont">
     <w:name w:val="Default Paragraph Font"/>
     <w:uiPriority w:val="1"/>
+    <w:semiHidden/>
     <w:unhideWhenUsed/>
   </w:style>
   <w:style w:type="table" w:default="1" w:styleId="TableNormal">

</xml_diff>

<commit_message>
Updated report for task 6
</commit_message>
<xml_diff>
--- a/MAD_Report.docx
+++ b/MAD_Report.docx
@@ -373,73 +373,7 @@
           <w:sz w:val="24"/>
           <w:szCs w:val="24"/>
         </w:rPr>
-        <w:t xml:space="preserve">I will first start with this task by setting up the dependencies in my </w:t>
-      </w:r>
-      <w:proofErr w:type="spellStart"/>
-      <w:proofErr w:type="gramStart"/>
-      <w:r>
-        <w:rPr>
-          <w:rFonts w:ascii="Trebuchet MS" w:eastAsia="Trebuchet MS" w:hAnsi="Trebuchet MS" w:cs="Trebuchet MS"/>
-          <w:sz w:val="24"/>
-          <w:szCs w:val="24"/>
-        </w:rPr>
-        <w:t>build.gradle</w:t>
-      </w:r>
-      <w:proofErr w:type="spellEnd"/>
-      <w:proofErr w:type="gramEnd"/>
-      <w:r>
-        <w:rPr>
-          <w:rFonts w:ascii="Trebuchet MS" w:eastAsia="Trebuchet MS" w:hAnsi="Trebuchet MS" w:cs="Trebuchet MS"/>
-          <w:sz w:val="24"/>
-          <w:szCs w:val="24"/>
-        </w:rPr>
-        <w:t xml:space="preserve"> and </w:t>
-      </w:r>
-      <w:proofErr w:type="spellStart"/>
-      <w:proofErr w:type="gramStart"/>
-      <w:r>
-        <w:rPr>
-          <w:rFonts w:ascii="Trebuchet MS" w:eastAsia="Trebuchet MS" w:hAnsi="Trebuchet MS" w:cs="Trebuchet MS"/>
-          <w:sz w:val="24"/>
-          <w:szCs w:val="24"/>
-        </w:rPr>
-        <w:t>libs.versions</w:t>
-      </w:r>
-      <w:proofErr w:type="gramEnd"/>
-      <w:r>
-        <w:rPr>
-          <w:rFonts w:ascii="Trebuchet MS" w:eastAsia="Trebuchet MS" w:hAnsi="Trebuchet MS" w:cs="Trebuchet MS"/>
-          <w:sz w:val="24"/>
-          <w:szCs w:val="24"/>
-        </w:rPr>
-        <w:t>.toml</w:t>
-      </w:r>
-      <w:proofErr w:type="spellEnd"/>
-      <w:r>
-        <w:rPr>
-          <w:rFonts w:ascii="Trebuchet MS" w:eastAsia="Trebuchet MS" w:hAnsi="Trebuchet MS" w:cs="Trebuchet MS"/>
-          <w:sz w:val="24"/>
-          <w:szCs w:val="24"/>
-        </w:rPr>
-        <w:t xml:space="preserve"> files. I will add </w:t>
-      </w:r>
-      <w:proofErr w:type="spellStart"/>
-      <w:r>
-        <w:rPr>
-          <w:rFonts w:ascii="Trebuchet MS" w:eastAsia="Trebuchet MS" w:hAnsi="Trebuchet MS" w:cs="Trebuchet MS"/>
-          <w:sz w:val="24"/>
-          <w:szCs w:val="24"/>
-        </w:rPr>
-        <w:t>MapLibre</w:t>
-      </w:r>
-      <w:proofErr w:type="spellEnd"/>
-      <w:r>
-        <w:rPr>
-          <w:rFonts w:ascii="Trebuchet MS" w:eastAsia="Trebuchet MS" w:hAnsi="Trebuchet MS" w:cs="Trebuchet MS"/>
-          <w:sz w:val="24"/>
-          <w:szCs w:val="24"/>
-        </w:rPr>
-        <w:t xml:space="preserve"> with Vulkan support, the Ramani Maps Compose wrapper, and the standard AndroidX libraries needed for Compose.</w:t>
+        <w:t>I will first start with this task by setting up the dependencies in my build.gradle and libs.versions.toml files. I will add MapLibre with Vulkan support, the Ramani Maps Compose wrapper, and the standard AndroidX libraries needed for Compose.</w:t>
       </w:r>
       <w:r>
         <w:rPr>
@@ -572,25 +506,7 @@
           <w:sz w:val="24"/>
           <w:szCs w:val="24"/>
         </w:rPr>
-        <w:t xml:space="preserve">Then in the AndroidManifest.xml, I will set up the ACCESS_FINE_LOCATION and ACCESS_COARSE_LOCATION permissions, as well as INTERNET, since the map tiles will be gathered remotely from </w:t>
-      </w:r>
-      <w:proofErr w:type="spellStart"/>
-      <w:r>
-        <w:rPr>
-          <w:rFonts w:ascii="Trebuchet MS" w:eastAsia="Trebuchet MS" w:hAnsi="Trebuchet MS" w:cs="Trebuchet MS"/>
-          <w:sz w:val="24"/>
-          <w:szCs w:val="24"/>
-        </w:rPr>
-        <w:t>OpenFreeMap</w:t>
-      </w:r>
-      <w:proofErr w:type="spellEnd"/>
-      <w:r>
-        <w:rPr>
-          <w:rFonts w:ascii="Trebuchet MS" w:eastAsia="Trebuchet MS" w:hAnsi="Trebuchet MS" w:cs="Trebuchet MS"/>
-          <w:sz w:val="24"/>
-          <w:szCs w:val="24"/>
-        </w:rPr>
-        <w:t>.</w:t>
+        <w:t>Then in the AndroidManifest.xml, I will set up the ACCESS_FINE_LOCATION and ACCESS_COARSE_LOCATION permissions, as well as INTERNET, since the map tiles will be gathered remotely from OpenFreeMap.</w:t>
       </w:r>
       <w:r>
         <w:rPr>
@@ -736,61 +652,7 @@
           <w:sz w:val="24"/>
           <w:szCs w:val="24"/>
         </w:rPr>
-        <w:t xml:space="preserve">To manage the location state in both the activity and UI, I will need to add a </w:t>
-      </w:r>
-      <w:proofErr w:type="spellStart"/>
-      <w:r>
-        <w:rPr>
-          <w:rFonts w:ascii="Trebuchet MS" w:eastAsia="Trebuchet MS" w:hAnsi="Trebuchet MS" w:cs="Trebuchet MS"/>
-          <w:sz w:val="24"/>
-          <w:szCs w:val="24"/>
-        </w:rPr>
-        <w:t>LatLngViewModel</w:t>
-      </w:r>
-      <w:proofErr w:type="spellEnd"/>
-      <w:r>
-        <w:rPr>
-          <w:rFonts w:ascii="Trebuchet MS" w:eastAsia="Trebuchet MS" w:hAnsi="Trebuchet MS" w:cs="Trebuchet MS"/>
-          <w:sz w:val="24"/>
-          <w:szCs w:val="24"/>
-        </w:rPr>
-        <w:t xml:space="preserve"> class that will hold a </w:t>
-      </w:r>
-      <w:proofErr w:type="spellStart"/>
-      <w:r>
-        <w:rPr>
-          <w:rFonts w:ascii="Trebuchet MS" w:eastAsia="Trebuchet MS" w:hAnsi="Trebuchet MS" w:cs="Trebuchet MS"/>
-          <w:sz w:val="24"/>
-          <w:szCs w:val="24"/>
-        </w:rPr>
-        <w:t>latLng</w:t>
-      </w:r>
-      <w:proofErr w:type="spellEnd"/>
-      <w:r>
-        <w:rPr>
-          <w:rFonts w:ascii="Trebuchet MS" w:eastAsia="Trebuchet MS" w:hAnsi="Trebuchet MS" w:cs="Trebuchet MS"/>
-          <w:sz w:val="24"/>
-          <w:szCs w:val="24"/>
-        </w:rPr>
-        <w:t xml:space="preserve"> property backed by a </w:t>
-      </w:r>
-      <w:proofErr w:type="spellStart"/>
-      <w:r>
-        <w:rPr>
-          <w:rFonts w:ascii="Trebuchet MS" w:eastAsia="Trebuchet MS" w:hAnsi="Trebuchet MS" w:cs="Trebuchet MS"/>
-          <w:sz w:val="24"/>
-          <w:szCs w:val="24"/>
-        </w:rPr>
-        <w:t>MutableLiveData</w:t>
-      </w:r>
-      <w:proofErr w:type="spellEnd"/>
-      <w:r>
-        <w:rPr>
-          <w:rFonts w:ascii="Trebuchet MS" w:eastAsia="Trebuchet MS" w:hAnsi="Trebuchet MS" w:cs="Trebuchet MS"/>
-          <w:sz w:val="24"/>
-          <w:szCs w:val="24"/>
-        </w:rPr>
-        <w:t xml:space="preserve"> object. </w:t>
+        <w:t xml:space="preserve">To manage the location state in both the activity and UI, I will need to add a LatLngViewModel class that will hold a latLng property backed by a MutableLiveData object. </w:t>
       </w:r>
     </w:p>
     <w:p>
@@ -817,43 +679,7 @@
           <w:szCs w:val="24"/>
         </w:rPr>
         <w:lastRenderedPageBreak/>
-        <w:t xml:space="preserve">Whenever the </w:t>
-      </w:r>
-      <w:proofErr w:type="spellStart"/>
-      <w:r>
-        <w:rPr>
-          <w:rFonts w:ascii="Trebuchet MS" w:eastAsia="Trebuchet MS" w:hAnsi="Trebuchet MS" w:cs="Trebuchet MS"/>
-          <w:sz w:val="24"/>
-          <w:szCs w:val="24"/>
-        </w:rPr>
-        <w:t>latLng</w:t>
-      </w:r>
-      <w:proofErr w:type="spellEnd"/>
-      <w:r>
-        <w:rPr>
-          <w:rFonts w:ascii="Trebuchet MS" w:eastAsia="Trebuchet MS" w:hAnsi="Trebuchet MS" w:cs="Trebuchet MS"/>
-          <w:sz w:val="24"/>
-          <w:szCs w:val="24"/>
-        </w:rPr>
-        <w:t xml:space="preserve"> is updated, i.e. the user's location changes, it should automatically push the new value to </w:t>
-      </w:r>
-      <w:proofErr w:type="spellStart"/>
-      <w:r>
-        <w:rPr>
-          <w:rFonts w:ascii="Trebuchet MS" w:eastAsia="Trebuchet MS" w:hAnsi="Trebuchet MS" w:cs="Trebuchet MS"/>
-          <w:sz w:val="24"/>
-          <w:szCs w:val="24"/>
-        </w:rPr>
-        <w:t>latLngLiveData</w:t>
-      </w:r>
-      <w:proofErr w:type="spellEnd"/>
-      <w:r>
-        <w:rPr>
-          <w:rFonts w:ascii="Trebuchet MS" w:eastAsia="Trebuchet MS" w:hAnsi="Trebuchet MS" w:cs="Trebuchet MS"/>
-          <w:sz w:val="24"/>
-          <w:szCs w:val="24"/>
-        </w:rPr>
-        <w:t xml:space="preserve">, making it observable from the UI layer.  </w:t>
+        <w:t xml:space="preserve">Whenever the latLng is updated, i.e. the user's location changes, it should automatically push the new value to latLngLiveData, making it observable from the UI layer.  </w:t>
       </w:r>
     </w:p>
     <w:p>
@@ -945,97 +771,7 @@
           <w:sz w:val="24"/>
           <w:szCs w:val="24"/>
         </w:rPr>
-        <w:t xml:space="preserve">In the </w:t>
-      </w:r>
-      <w:proofErr w:type="spellStart"/>
-      <w:r>
-        <w:rPr>
-          <w:rFonts w:ascii="Trebuchet MS" w:eastAsia="Trebuchet MS" w:hAnsi="Trebuchet MS" w:cs="Trebuchet MS"/>
-          <w:sz w:val="24"/>
-          <w:szCs w:val="24"/>
-        </w:rPr>
-        <w:t>MainActivity</w:t>
-      </w:r>
-      <w:proofErr w:type="spellEnd"/>
-      <w:r>
-        <w:rPr>
-          <w:rFonts w:ascii="Trebuchet MS" w:eastAsia="Trebuchet MS" w:hAnsi="Trebuchet MS" w:cs="Trebuchet MS"/>
-          <w:sz w:val="24"/>
-          <w:szCs w:val="24"/>
-        </w:rPr>
-        <w:t xml:space="preserve">, I will add the </w:t>
-      </w:r>
-      <w:proofErr w:type="spellStart"/>
-      <w:r>
-        <w:rPr>
-          <w:rFonts w:ascii="Trebuchet MS" w:eastAsia="Trebuchet MS" w:hAnsi="Trebuchet MS" w:cs="Trebuchet MS"/>
-          <w:sz w:val="24"/>
-          <w:szCs w:val="24"/>
-        </w:rPr>
-        <w:t>LocationListener</w:t>
-      </w:r>
-      <w:proofErr w:type="spellEnd"/>
-      <w:r>
-        <w:rPr>
-          <w:rFonts w:ascii="Trebuchet MS" w:eastAsia="Trebuchet MS" w:hAnsi="Trebuchet MS" w:cs="Trebuchet MS"/>
-          <w:sz w:val="24"/>
-          <w:szCs w:val="24"/>
-        </w:rPr>
-        <w:t xml:space="preserve"> interface. This will allow me to override the </w:t>
-      </w:r>
-      <w:proofErr w:type="spellStart"/>
-      <w:r>
-        <w:rPr>
-          <w:rFonts w:ascii="Trebuchet MS" w:eastAsia="Trebuchet MS" w:hAnsi="Trebuchet MS" w:cs="Trebuchet MS"/>
-          <w:sz w:val="24"/>
-          <w:szCs w:val="24"/>
-        </w:rPr>
-        <w:t>onLocationChanged</w:t>
-      </w:r>
-      <w:proofErr w:type="spellEnd"/>
-      <w:r>
-        <w:rPr>
-          <w:rFonts w:ascii="Trebuchet MS" w:eastAsia="Trebuchet MS" w:hAnsi="Trebuchet MS" w:cs="Trebuchet MS"/>
-          <w:sz w:val="24"/>
-          <w:szCs w:val="24"/>
-        </w:rPr>
-        <w:t xml:space="preserve"> function, where I will update the </w:t>
-      </w:r>
-      <w:proofErr w:type="spellStart"/>
-      <w:r>
-        <w:rPr>
-          <w:rFonts w:ascii="Trebuchet MS" w:eastAsia="Trebuchet MS" w:hAnsi="Trebuchet MS" w:cs="Trebuchet MS"/>
-          <w:sz w:val="24"/>
-          <w:szCs w:val="24"/>
-        </w:rPr>
-        <w:t>ViewModel's</w:t>
-      </w:r>
-      <w:proofErr w:type="spellEnd"/>
-      <w:r>
-        <w:rPr>
-          <w:rFonts w:ascii="Trebuchet MS" w:eastAsia="Trebuchet MS" w:hAnsi="Trebuchet MS" w:cs="Trebuchet MS"/>
-          <w:sz w:val="24"/>
-          <w:szCs w:val="24"/>
-        </w:rPr>
-        <w:t xml:space="preserve"> </w:t>
-      </w:r>
-      <w:proofErr w:type="spellStart"/>
-      <w:r>
-        <w:rPr>
-          <w:rFonts w:ascii="Trebuchet MS" w:eastAsia="Trebuchet MS" w:hAnsi="Trebuchet MS" w:cs="Trebuchet MS"/>
-          <w:sz w:val="24"/>
-          <w:szCs w:val="24"/>
-        </w:rPr>
-        <w:t>latLng</w:t>
-      </w:r>
-      <w:proofErr w:type="spellEnd"/>
-      <w:r>
-        <w:rPr>
-          <w:rFonts w:ascii="Trebuchet MS" w:eastAsia="Trebuchet MS" w:hAnsi="Trebuchet MS" w:cs="Trebuchet MS"/>
-          <w:sz w:val="24"/>
-          <w:szCs w:val="24"/>
-        </w:rPr>
-        <w:t xml:space="preserve"> with the current coordinates gathered by the device itself.</w:t>
+        <w:t>In the MainActivity, I will add the LocationListener interface. This will allow me to override the onLocationChanged function, where I will update the ViewModel's latLng with the current coordinates gathered by the device itself.</w:t>
       </w:r>
       <w:r>
         <w:rPr>
@@ -1175,61 +911,7 @@
           <w:sz w:val="24"/>
           <w:szCs w:val="24"/>
         </w:rPr>
-        <w:t xml:space="preserve">To start receiving GPS updates, I will create a GPS function that will retrieve the </w:t>
-      </w:r>
-      <w:proofErr w:type="spellStart"/>
-      <w:r>
-        <w:rPr>
-          <w:rFonts w:ascii="Trebuchet MS" w:eastAsia="Trebuchet MS" w:hAnsi="Trebuchet MS" w:cs="Trebuchet MS"/>
-          <w:sz w:val="24"/>
-          <w:szCs w:val="24"/>
-        </w:rPr>
-        <w:t>LocationManager</w:t>
-      </w:r>
-      <w:proofErr w:type="spellEnd"/>
-      <w:r>
-        <w:rPr>
-          <w:rFonts w:ascii="Trebuchet MS" w:eastAsia="Trebuchet MS" w:hAnsi="Trebuchet MS" w:cs="Trebuchet MS"/>
-          <w:sz w:val="24"/>
-          <w:szCs w:val="24"/>
-        </w:rPr>
-        <w:t xml:space="preserve"> system service and call </w:t>
-      </w:r>
-      <w:proofErr w:type="spellStart"/>
-      <w:r>
-        <w:rPr>
-          <w:rFonts w:ascii="Trebuchet MS" w:eastAsia="Trebuchet MS" w:hAnsi="Trebuchet MS" w:cs="Trebuchet MS"/>
-          <w:sz w:val="24"/>
-          <w:szCs w:val="24"/>
-        </w:rPr>
-        <w:t>requestLocationUpdates</w:t>
-      </w:r>
-      <w:proofErr w:type="spellEnd"/>
-      <w:r>
-        <w:rPr>
-          <w:rFonts w:ascii="Trebuchet MS" w:eastAsia="Trebuchet MS" w:hAnsi="Trebuchet MS" w:cs="Trebuchet MS"/>
-          <w:sz w:val="24"/>
-          <w:szCs w:val="24"/>
-        </w:rPr>
-        <w:t xml:space="preserve">, which I will set to update every 2 seconds or after 5 </w:t>
-      </w:r>
-      <w:proofErr w:type="spellStart"/>
-      <w:r>
-        <w:rPr>
-          <w:rFonts w:ascii="Trebuchet MS" w:eastAsia="Trebuchet MS" w:hAnsi="Trebuchet MS" w:cs="Trebuchet MS"/>
-          <w:sz w:val="24"/>
-          <w:szCs w:val="24"/>
-        </w:rPr>
-        <w:t>metres</w:t>
-      </w:r>
-      <w:proofErr w:type="spellEnd"/>
-      <w:r>
-        <w:rPr>
-          <w:rFonts w:ascii="Trebuchet MS" w:eastAsia="Trebuchet MS" w:hAnsi="Trebuchet MS" w:cs="Trebuchet MS"/>
-          <w:sz w:val="24"/>
-          <w:szCs w:val="24"/>
-        </w:rPr>
-        <w:t xml:space="preserve"> of movement. This will keep the GPS accurate without slowing the machine down too much.</w:t>
+        <w:t>To start receiving GPS updates, I will create a GPS function that will retrieve the LocationManager system service and call requestLocationUpdates, which I will set to update every 2 seconds or after 5 metres of movement. This will keep the GPS accurate without slowing the machine down too much.</w:t>
       </w:r>
       <w:r>
         <w:rPr>
@@ -1352,35 +1034,7 @@
           <w:sz w:val="24"/>
           <w:szCs w:val="24"/>
         </w:rPr>
-        <w:t xml:space="preserve">I will also write a </w:t>
-      </w:r>
-      <w:proofErr w:type="spellStart"/>
-      <w:proofErr w:type="gramStart"/>
-      <w:r>
-        <w:rPr>
-          <w:rFonts w:ascii="Trebuchet MS" w:eastAsia="Trebuchet MS" w:hAnsi="Trebuchet MS" w:cs="Trebuchet MS"/>
-          <w:sz w:val="24"/>
-          <w:szCs w:val="24"/>
-        </w:rPr>
-        <w:t>checkPermissions</w:t>
-      </w:r>
-      <w:proofErr w:type="spellEnd"/>
-      <w:r>
-        <w:rPr>
-          <w:rFonts w:ascii="Trebuchet MS" w:eastAsia="Trebuchet MS" w:hAnsi="Trebuchet MS" w:cs="Trebuchet MS"/>
-          <w:sz w:val="24"/>
-          <w:szCs w:val="24"/>
-        </w:rPr>
-        <w:t xml:space="preserve"> function</w:t>
-      </w:r>
-      <w:proofErr w:type="gramEnd"/>
-      <w:r>
-        <w:rPr>
-          <w:rFonts w:ascii="Trebuchet MS" w:eastAsia="Trebuchet MS" w:hAnsi="Trebuchet MS" w:cs="Trebuchet MS"/>
-          <w:sz w:val="24"/>
-          <w:szCs w:val="24"/>
-        </w:rPr>
-        <w:t xml:space="preserve"> that will check whether the location permission has already been granted. If they haven’t, then it will launch a permission request. This will make sure that the GPS function is only called if the user approves the use of their location. A Toast message was shown if they denied it.</w:t>
+        <w:t>I will also write a checkPermissions function that will check whether the location permission has already been granted. If they haven’t, then it will launch a permission request. This will make sure that the GPS function is only called if the user approves the use of their location. A Toast message was shown if they denied it.</w:t>
       </w:r>
     </w:p>
     <w:p>
@@ -1511,187 +1165,7 @@
           <w:sz w:val="24"/>
           <w:szCs w:val="24"/>
         </w:rPr>
-        <w:t xml:space="preserve">Inside the </w:t>
-      </w:r>
-      <w:proofErr w:type="spellStart"/>
-      <w:r>
-        <w:rPr>
-          <w:rFonts w:ascii="Trebuchet MS" w:eastAsia="Trebuchet MS" w:hAnsi="Trebuchet MS" w:cs="Trebuchet MS"/>
-          <w:sz w:val="24"/>
-          <w:szCs w:val="24"/>
-        </w:rPr>
-        <w:t>setContent</w:t>
-      </w:r>
-      <w:proofErr w:type="spellEnd"/>
-      <w:r>
-        <w:rPr>
-          <w:rFonts w:ascii="Trebuchet MS" w:eastAsia="Trebuchet MS" w:hAnsi="Trebuchet MS" w:cs="Trebuchet MS"/>
-          <w:sz w:val="24"/>
-          <w:szCs w:val="24"/>
-        </w:rPr>
-        <w:t xml:space="preserve"> itself, I will use a </w:t>
-      </w:r>
-      <w:proofErr w:type="spellStart"/>
-      <w:r>
-        <w:rPr>
-          <w:rFonts w:ascii="Trebuchet MS" w:eastAsia="Trebuchet MS" w:hAnsi="Trebuchet MS" w:cs="Trebuchet MS"/>
-          <w:sz w:val="24"/>
-          <w:szCs w:val="24"/>
-        </w:rPr>
-        <w:t>mutablestate</w:t>
-      </w:r>
-      <w:proofErr w:type="spellEnd"/>
-      <w:r>
-        <w:rPr>
-          <w:rFonts w:ascii="Trebuchet MS" w:eastAsia="Trebuchet MS" w:hAnsi="Trebuchet MS" w:cs="Trebuchet MS"/>
-          <w:sz w:val="24"/>
-          <w:szCs w:val="24"/>
-        </w:rPr>
-        <w:t xml:space="preserve"> variable to hold the current </w:t>
-      </w:r>
-      <w:proofErr w:type="spellStart"/>
-      <w:r>
-        <w:rPr>
-          <w:rFonts w:ascii="Trebuchet MS" w:eastAsia="Trebuchet MS" w:hAnsi="Trebuchet MS" w:cs="Trebuchet MS"/>
-          <w:sz w:val="24"/>
-          <w:szCs w:val="24"/>
-        </w:rPr>
-        <w:t>LatLng</w:t>
-      </w:r>
-      <w:proofErr w:type="spellEnd"/>
-      <w:r>
-        <w:rPr>
-          <w:rFonts w:ascii="Trebuchet MS" w:eastAsia="Trebuchet MS" w:hAnsi="Trebuchet MS" w:cs="Trebuchet MS"/>
-          <w:sz w:val="24"/>
-          <w:szCs w:val="24"/>
-        </w:rPr>
-        <w:t xml:space="preserve"> and zoom level, observed the </w:t>
-      </w:r>
-      <w:proofErr w:type="spellStart"/>
-      <w:r>
-        <w:rPr>
-          <w:rFonts w:ascii="Trebuchet MS" w:eastAsia="Trebuchet MS" w:hAnsi="Trebuchet MS" w:cs="Trebuchet MS"/>
-          <w:sz w:val="24"/>
-          <w:szCs w:val="24"/>
-        </w:rPr>
-        <w:t>ViewModel's</w:t>
-      </w:r>
-      <w:proofErr w:type="spellEnd"/>
-      <w:r>
-        <w:rPr>
-          <w:rFonts w:ascii="Trebuchet MS" w:eastAsia="Trebuchet MS" w:hAnsi="Trebuchet MS" w:cs="Trebuchet MS"/>
-          <w:sz w:val="24"/>
-          <w:szCs w:val="24"/>
-        </w:rPr>
-        <w:t xml:space="preserve"> </w:t>
-      </w:r>
-      <w:proofErr w:type="spellStart"/>
-      <w:r>
-        <w:rPr>
-          <w:rFonts w:ascii="Trebuchet MS" w:eastAsia="Trebuchet MS" w:hAnsi="Trebuchet MS" w:cs="Trebuchet MS"/>
-          <w:sz w:val="24"/>
-          <w:szCs w:val="24"/>
-        </w:rPr>
-        <w:t>LiveData</w:t>
-      </w:r>
-      <w:proofErr w:type="spellEnd"/>
-      <w:r>
-        <w:rPr>
-          <w:rFonts w:ascii="Trebuchet MS" w:eastAsia="Trebuchet MS" w:hAnsi="Trebuchet MS" w:cs="Trebuchet MS"/>
-          <w:sz w:val="24"/>
-          <w:szCs w:val="24"/>
-        </w:rPr>
-        <w:t xml:space="preserve"> to keep that state updated, and pass the values into a </w:t>
-      </w:r>
-      <w:proofErr w:type="spellStart"/>
-      <w:r>
-        <w:rPr>
-          <w:rFonts w:ascii="Trebuchet MS" w:eastAsia="Trebuchet MS" w:hAnsi="Trebuchet MS" w:cs="Trebuchet MS"/>
-          <w:sz w:val="24"/>
-          <w:szCs w:val="24"/>
-        </w:rPr>
-        <w:t>MapLibre</w:t>
-      </w:r>
-      <w:proofErr w:type="spellEnd"/>
-      <w:r>
-        <w:rPr>
-          <w:rFonts w:ascii="Trebuchet MS" w:eastAsia="Trebuchet MS" w:hAnsi="Trebuchet MS" w:cs="Trebuchet MS"/>
-          <w:sz w:val="24"/>
-          <w:szCs w:val="24"/>
-        </w:rPr>
-        <w:t xml:space="preserve"> composable via a </w:t>
-      </w:r>
-      <w:proofErr w:type="spellStart"/>
-      <w:r>
-        <w:rPr>
-          <w:rFonts w:ascii="Trebuchet MS" w:eastAsia="Trebuchet MS" w:hAnsi="Trebuchet MS" w:cs="Trebuchet MS"/>
-          <w:sz w:val="24"/>
-          <w:szCs w:val="24"/>
-        </w:rPr>
-        <w:t>CameraPosition</w:t>
-      </w:r>
-      <w:proofErr w:type="spellEnd"/>
-      <w:r>
-        <w:rPr>
-          <w:rFonts w:ascii="Trebuchet MS" w:eastAsia="Trebuchet MS" w:hAnsi="Trebuchet MS" w:cs="Trebuchet MS"/>
-          <w:sz w:val="24"/>
-          <w:szCs w:val="24"/>
-        </w:rPr>
-        <w:t xml:space="preserve">, causing the map to </w:t>
-      </w:r>
-      <w:proofErr w:type="spellStart"/>
-      <w:r>
-        <w:rPr>
-          <w:rFonts w:ascii="Trebuchet MS" w:eastAsia="Trebuchet MS" w:hAnsi="Trebuchet MS" w:cs="Trebuchet MS"/>
-          <w:sz w:val="24"/>
-          <w:szCs w:val="24"/>
-        </w:rPr>
-        <w:t>recentre</w:t>
-      </w:r>
-      <w:proofErr w:type="spellEnd"/>
-      <w:r>
-        <w:rPr>
-          <w:rFonts w:ascii="Trebuchet MS" w:eastAsia="Trebuchet MS" w:hAnsi="Trebuchet MS" w:cs="Trebuchet MS"/>
-          <w:sz w:val="24"/>
-          <w:szCs w:val="24"/>
-        </w:rPr>
-        <w:t xml:space="preserve"> automatically whenever the user's location changed. This was all placed inside a Scaffold with </w:t>
-      </w:r>
-      <w:proofErr w:type="spellStart"/>
-      <w:r>
-        <w:rPr>
-          <w:rFonts w:ascii="Trebuchet MS" w:eastAsia="Trebuchet MS" w:hAnsi="Trebuchet MS" w:cs="Trebuchet MS"/>
-          <w:sz w:val="24"/>
-          <w:szCs w:val="24"/>
-        </w:rPr>
-        <w:t>innerpadding</w:t>
-      </w:r>
-      <w:proofErr w:type="spellEnd"/>
-      <w:r>
-        <w:rPr>
-          <w:rFonts w:ascii="Trebuchet MS" w:eastAsia="Trebuchet MS" w:hAnsi="Trebuchet MS" w:cs="Trebuchet MS"/>
-          <w:sz w:val="24"/>
-          <w:szCs w:val="24"/>
-        </w:rPr>
-        <w:t xml:space="preserve"> to prevent any overlap of the </w:t>
-      </w:r>
-      <w:proofErr w:type="gramStart"/>
-      <w:r>
-        <w:rPr>
-          <w:rFonts w:ascii="Trebuchet MS" w:eastAsia="Trebuchet MS" w:hAnsi="Trebuchet MS" w:cs="Trebuchet MS"/>
-          <w:sz w:val="24"/>
-          <w:szCs w:val="24"/>
-        </w:rPr>
-        <w:t>devices</w:t>
-      </w:r>
-      <w:proofErr w:type="gramEnd"/>
-      <w:r>
-        <w:rPr>
-          <w:rFonts w:ascii="Trebuchet MS" w:eastAsia="Trebuchet MS" w:hAnsi="Trebuchet MS" w:cs="Trebuchet MS"/>
-          <w:sz w:val="24"/>
-          <w:szCs w:val="24"/>
-        </w:rPr>
-        <w:t xml:space="preserve"> interfaces with the application itself.</w:t>
+        <w:t>Inside the setContent itself, I will use a mutablestate variable to hold the current LatLng and zoom level, observed the ViewModel's LiveData to keep that state updated, and pass the values into a MapLibre composable via a CameraPosition, causing the map to recentre automatically whenever the user's location changed. This was all placed inside a Scaffold with innerpadding to prevent any overlap of the devices interfaces with the application itself.</w:t>
       </w:r>
     </w:p>
     <w:p>
@@ -1791,29 +1265,7 @@
           <w:sz w:val="24"/>
           <w:szCs w:val="24"/>
         </w:rPr>
-        <w:t xml:space="preserve">- type (pub, restaurant, hotel, historical site, </w:t>
-      </w:r>
-      <w:proofErr w:type="spellStart"/>
-      <w:r>
-        <w:rPr>
-          <w:rFonts w:ascii="Trebuchet MS" w:hAnsi="Trebuchet MS"/>
-          <w:i/>
-          <w:iCs/>
-          <w:sz w:val="24"/>
-          <w:szCs w:val="24"/>
-        </w:rPr>
-        <w:t>etc</w:t>
-      </w:r>
-      <w:proofErr w:type="spellEnd"/>
-      <w:r>
-        <w:rPr>
-          <w:rFonts w:ascii="Trebuchet MS" w:hAnsi="Trebuchet MS"/>
-          <w:i/>
-          <w:iCs/>
-          <w:sz w:val="24"/>
-          <w:szCs w:val="24"/>
-        </w:rPr>
-        <w:t>);</w:t>
+        <w:t>- type (pub, restaurant, hotel, historical site, etc);</w:t>
       </w:r>
     </w:p>
     <w:p>
@@ -1908,31 +1360,7 @@
           <w:sz w:val="24"/>
           <w:szCs w:val="24"/>
         </w:rPr>
-        <w:t xml:space="preserve">For </w:t>
-      </w:r>
-      <w:proofErr w:type="gramStart"/>
-      <w:r>
-        <w:rPr>
-          <w:rFonts w:ascii="Trebuchet MS" w:hAnsi="Trebuchet MS"/>
-          <w:i/>
-          <w:iCs/>
-          <w:color w:val="000000"/>
-          <w:sz w:val="24"/>
-          <w:szCs w:val="24"/>
-        </w:rPr>
-        <w:t>now</w:t>
-      </w:r>
-      <w:proofErr w:type="gramEnd"/>
-      <w:r>
-        <w:rPr>
-          <w:rFonts w:ascii="Trebuchet MS" w:hAnsi="Trebuchet MS"/>
-          <w:i/>
-          <w:iCs/>
-          <w:color w:val="000000"/>
-          <w:sz w:val="24"/>
-          <w:szCs w:val="24"/>
-        </w:rPr>
-        <w:t xml:space="preserve"> you can just use buttons for navigation – there is no need to use an app bar, a navigation bar, or the navigation drawer just yet.</w:t>
+        <w:t>For now you can just use buttons for navigation – there is no need to use an app bar, a navigation bar, or the navigation drawer just yet.</w:t>
       </w:r>
       <w:r>
         <w:rPr>
@@ -2052,13 +1480,8 @@
       <w:r>
         <w:t xml:space="preserve"> </w:t>
       </w:r>
-      <w:proofErr w:type="spellStart"/>
-      <w:r>
-        <w:t>ViewModel</w:t>
-      </w:r>
-      <w:proofErr w:type="spellEnd"/>
-      <w:r>
-        <w:t>.</w:t>
+      <w:r>
+        <w:t>ViewModel.</w:t>
       </w:r>
     </w:p>
     <w:p>
@@ -2076,58 +1499,13 @@
         <w:ind w:left="720"/>
       </w:pPr>
       <w:r>
-        <w:t xml:space="preserve">I then plan to update my </w:t>
-      </w:r>
-      <w:proofErr w:type="spellStart"/>
-      <w:r>
-        <w:t>LatLng</w:t>
-      </w:r>
-      <w:proofErr w:type="spellEnd"/>
-      <w:r>
-        <w:t xml:space="preserve"> </w:t>
-      </w:r>
-      <w:proofErr w:type="spellStart"/>
-      <w:r>
-        <w:t>ViewModel</w:t>
-      </w:r>
-      <w:proofErr w:type="spellEnd"/>
-      <w:r>
-        <w:t xml:space="preserve"> to also include the POI list rather than adding a second </w:t>
-      </w:r>
-      <w:proofErr w:type="spellStart"/>
-      <w:r>
-        <w:t>ViewModel</w:t>
-      </w:r>
-      <w:proofErr w:type="spellEnd"/>
-      <w:r>
-        <w:t xml:space="preserve"> as this already holds the GPS location. I will add </w:t>
-      </w:r>
-      <w:proofErr w:type="spellStart"/>
-      <w:r>
-        <w:t>MutableLiveData</w:t>
-      </w:r>
-      <w:proofErr w:type="spellEnd"/>
-      <w:r>
-        <w:t>&lt;List&lt;Poi&gt;&gt;</w:t>
-      </w:r>
-      <w:r>
-        <w:t xml:space="preserve"> so that the </w:t>
-      </w:r>
-      <w:proofErr w:type="spellStart"/>
-      <w:r>
-        <w:t>MainActivity</w:t>
-      </w:r>
-      <w:proofErr w:type="spellEnd"/>
-      <w:r>
-        <w:t xml:space="preserve"> can observe the list, meaning that whenever a POI is added the UI can then automatically know to redraw any makers on the map. I will then add a function to the </w:t>
-      </w:r>
-      <w:proofErr w:type="spellStart"/>
-      <w:r>
-        <w:t>ViewModel</w:t>
-      </w:r>
-      <w:proofErr w:type="spellEnd"/>
-      <w:r>
-        <w:t xml:space="preserve"> which will add a </w:t>
+        <w:t xml:space="preserve">I then plan to update my LatLng ViewModel to also include the POI list rather than adding a second ViewModel as this already holds the GPS location. I will add </w:t>
+      </w:r>
+      <w:r>
+        <w:t>MutableLiveData&lt;List&lt;Poi&gt;&gt;</w:t>
+      </w:r>
+      <w:r>
+        <w:t xml:space="preserve"> so that the MainActivity can observe the list, meaning that whenever a POI is added the UI can then automatically know to redraw any makers on the map. I will then add a function to the ViewModel which will add a </w:t>
       </w:r>
       <w:r>
         <w:t xml:space="preserve">given </w:t>
@@ -2273,29 +1651,13 @@
         <w:t>I will then add a separate composable for the POI screen</w:t>
       </w:r>
       <w:r>
-        <w:t xml:space="preserve">. I plan to put this in its own separate file to prevent code from clustering in the </w:t>
-      </w:r>
-      <w:proofErr w:type="spellStart"/>
-      <w:r>
-        <w:t>MainActivity</w:t>
-      </w:r>
-      <w:proofErr w:type="spellEnd"/>
-      <w:r>
-        <w:t>.</w:t>
+        <w:t>. I plan to put this in its own separate file to prevent code from clustering in the MainActivity.</w:t>
       </w:r>
       <w:r>
         <w:t xml:space="preserve"> I will add two callback functions to the parameter of the composable. One will be for when a POI I added and the other will be for when the user wishes to navigate back to the home screen.</w:t>
       </w:r>
       <w:r>
-        <w:t xml:space="preserve"> I will also make it so the users current </w:t>
-      </w:r>
-      <w:proofErr w:type="spellStart"/>
-      <w:r>
-        <w:t>LatLng</w:t>
-      </w:r>
-      <w:proofErr w:type="spellEnd"/>
-      <w:r>
-        <w:t xml:space="preserve"> is also passed as a parameter for the POIs location.</w:t>
+        <w:t xml:space="preserve"> I will also make it so the users current LatLng is also passed as a parameter for the POIs location.</w:t>
       </w:r>
       <w:r>
         <w:t xml:space="preserve"> </w:t>
@@ -2370,76 +1732,23 @@
         </w:drawing>
       </w:r>
       <w:r>
-        <w:t xml:space="preserve">I will finally update the main composable to include the map page and the add poi page using the compose navigation. I will add the </w:t>
-      </w:r>
-      <w:proofErr w:type="spellStart"/>
-      <w:r>
-        <w:t>NavHost</w:t>
-      </w:r>
-      <w:proofErr w:type="spellEnd"/>
-      <w:r>
-        <w:t xml:space="preserve"> which will contain the two routes for the map page and the add poi page. I will then be able to define the callback functions for the </w:t>
-      </w:r>
-      <w:proofErr w:type="spellStart"/>
-      <w:r>
-        <w:t>onPoiAdded</w:t>
-      </w:r>
-      <w:proofErr w:type="spellEnd"/>
-      <w:r>
-        <w:t xml:space="preserve"> and </w:t>
-      </w:r>
-      <w:proofErr w:type="spellStart"/>
-      <w:r>
-        <w:t>onNavigateBack</w:t>
-      </w:r>
-      <w:proofErr w:type="spellEnd"/>
+        <w:t xml:space="preserve">I will finally update the main composable to include the map page and the add poi page using the compose navigation. I will add the NavHost which will contain the two routes for the map page and the add poi page. I will then be able to define the callback functions for the onPoiAdded and onNavigateBack. onPoiAdded will add the new poi to the ViewModel and the onNavigateBack will return the user to the previous page they were on. </w:t>
+      </w:r>
+      <w:r>
+        <w:t xml:space="preserve">I will place a </w:t>
+      </w:r>
+      <w:r>
+        <w:t xml:space="preserve">Symbol marker inside </w:t>
+      </w:r>
+      <w:r>
+        <w:t xml:space="preserve">the </w:t>
+      </w:r>
+      <w:r>
+        <w:t>MapLibre lambda</w:t>
+      </w:r>
       <w:r>
         <w:t xml:space="preserve">. </w:t>
       </w:r>
-      <w:proofErr w:type="spellStart"/>
-      <w:r>
-        <w:t>onPoiAdded</w:t>
-      </w:r>
-      <w:proofErr w:type="spellEnd"/>
-      <w:r>
-        <w:t xml:space="preserve"> will add the new poi to the </w:t>
-      </w:r>
-      <w:proofErr w:type="spellStart"/>
-      <w:r>
-        <w:t>ViewModel</w:t>
-      </w:r>
-      <w:proofErr w:type="spellEnd"/>
-      <w:r>
-        <w:t xml:space="preserve"> and the </w:t>
-      </w:r>
-      <w:proofErr w:type="spellStart"/>
-      <w:r>
-        <w:t>onNavigateBack</w:t>
-      </w:r>
-      <w:proofErr w:type="spellEnd"/>
-      <w:r>
-        <w:t xml:space="preserve"> will return the user to the previous page they were on. </w:t>
-      </w:r>
-      <w:r>
-        <w:t xml:space="preserve">I will place a </w:t>
-      </w:r>
-      <w:r>
-        <w:t xml:space="preserve">Symbol marker inside </w:t>
-      </w:r>
-      <w:r>
-        <w:t xml:space="preserve">the </w:t>
-      </w:r>
-      <w:proofErr w:type="spellStart"/>
-      <w:r>
-        <w:t>MapLibre</w:t>
-      </w:r>
-      <w:proofErr w:type="spellEnd"/>
-      <w:r>
-        <w:t xml:space="preserve"> lambda</w:t>
-      </w:r>
-      <w:r>
-        <w:t xml:space="preserve">. </w:t>
-      </w:r>
       <w:r>
         <w:t xml:space="preserve">The map </w:t>
       </w:r>
@@ -2453,43 +1762,20 @@
         <w:t xml:space="preserve"> the</w:t>
       </w:r>
       <w:r>
-        <w:t xml:space="preserve"> </w:t>
-      </w:r>
-      <w:proofErr w:type="spellStart"/>
-      <w:proofErr w:type="gramStart"/>
-      <w:r>
-        <w:t>poisState</w:t>
-      </w:r>
-      <w:proofErr w:type="spellEnd"/>
-      <w:proofErr w:type="gramEnd"/>
-      <w:r>
-        <w:t xml:space="preserve"> changes</w:t>
+        <w:t xml:space="preserve"> poisState changes</w:t>
       </w:r>
       <w:r>
         <w:t>. This will then</w:t>
       </w:r>
       <w:r>
-        <w:t xml:space="preserve"> loop through </w:t>
-      </w:r>
-      <w:proofErr w:type="spellStart"/>
-      <w:r>
-        <w:t>poisState</w:t>
-      </w:r>
-      <w:proofErr w:type="spellEnd"/>
-      <w:r>
-        <w:t xml:space="preserve"> and plac</w:t>
+        <w:t xml:space="preserve"> loop through poisState and plac</w:t>
       </w:r>
       <w:r>
         <w:t>e</w:t>
       </w:r>
       <w:r>
-        <w:t xml:space="preserve"> a Symbol at each POI's </w:t>
-      </w:r>
-      <w:proofErr w:type="spellStart"/>
-      <w:r>
-        <w:t>LatLng</w:t>
-      </w:r>
-      <w:proofErr w:type="spellEnd"/>
+        <w:t xml:space="preserve"> a Symbol at each POI's LatLng</w:t>
+      </w:r>
       <w:r>
         <w:t>. This makes it so</w:t>
       </w:r>
@@ -2500,15 +1786,7 @@
         <w:t>.</w:t>
       </w:r>
       <w:r>
-        <w:t xml:space="preserve"> I will make </w:t>
-      </w:r>
-      <w:proofErr w:type="gramStart"/>
-      <w:r>
-        <w:t>it</w:t>
-      </w:r>
-      <w:proofErr w:type="gramEnd"/>
-      <w:r>
-        <w:t xml:space="preserve"> so an alert dialog appears when the marker is clicked on, displaying the markers details including its name, type and description. This allows me to test that the marker has been added correctly.</w:t>
+        <w:t xml:space="preserve"> I will make it so an alert dialog appears when the marker is clicked on, displaying the markers details including its name, type and description. This allows me to test that the marker has been added correctly.</w:t>
       </w:r>
     </w:p>
     <w:p>
@@ -3054,15 +2332,7 @@
         <w:t xml:space="preserve">methods </w:t>
       </w:r>
       <w:r>
-        <w:t xml:space="preserve">for the database so it can be changed or searched. I plan to make it so that when the database returns all the POIs it contains, it will return it as a </w:t>
-      </w:r>
-      <w:proofErr w:type="spellStart"/>
-      <w:r>
-        <w:t>LiveData</w:t>
-      </w:r>
-      <w:proofErr w:type="spellEnd"/>
-      <w:r>
-        <w:t xml:space="preserve">&lt;List&lt;Poi&gt;&gt;. This will </w:t>
+        <w:t xml:space="preserve">for the database so it can be changed or searched. I plan to make it so that when the database returns all the POIs it contains, it will return it as a LiveData&lt;List&lt;Poi&gt;&gt;. This will </w:t>
       </w:r>
       <w:r>
         <w:t>make</w:t>
@@ -3071,36 +2341,7 @@
         <w:t xml:space="preserve"> sure that the UI is automatically updated with a new list of POIs whenever the database is changed.</w:t>
       </w:r>
       <w:r>
-        <w:t xml:space="preserve"> For now, I will give it three functions, </w:t>
-      </w:r>
-      <w:proofErr w:type="spellStart"/>
-      <w:proofErr w:type="gramStart"/>
-      <w:r>
-        <w:t>getAllPois</w:t>
-      </w:r>
-      <w:proofErr w:type="spellEnd"/>
-      <w:r>
-        <w:t>(</w:t>
-      </w:r>
-      <w:proofErr w:type="gramEnd"/>
-      <w:r>
-        <w:t xml:space="preserve">), </w:t>
-      </w:r>
-      <w:proofErr w:type="gramStart"/>
-      <w:r>
-        <w:t>insert(</w:t>
-      </w:r>
-      <w:proofErr w:type="gramEnd"/>
-      <w:r>
-        <w:t xml:space="preserve">) and </w:t>
-      </w:r>
-      <w:proofErr w:type="gramStart"/>
-      <w:r>
-        <w:t>delete(</w:t>
-      </w:r>
-      <w:proofErr w:type="gramEnd"/>
-      <w:r>
-        <w:t>).</w:t>
+        <w:t xml:space="preserve"> For now, I will give it three functions, getAllPois(), insert() and delete().</w:t>
       </w:r>
     </w:p>
     <w:p>
@@ -3173,28 +2414,7 @@
         </w:drawing>
       </w:r>
       <w:r>
-        <w:t xml:space="preserve">I plan to next create the file for the database itself. This will be placed within an abstract function which allows my other files to access its DAO and all the database operations within it. Inside it I will put a </w:t>
-      </w:r>
-      <w:proofErr w:type="spellStart"/>
-      <w:proofErr w:type="gramStart"/>
-      <w:r>
-        <w:t>getDatabase</w:t>
-      </w:r>
-      <w:proofErr w:type="spellEnd"/>
-      <w:r>
-        <w:t>(</w:t>
-      </w:r>
-      <w:proofErr w:type="gramEnd"/>
-      <w:r>
-        <w:t xml:space="preserve">) function which will check that a database </w:t>
-      </w:r>
-      <w:proofErr w:type="gramStart"/>
-      <w:r>
-        <w:t>doesn’t already</w:t>
-      </w:r>
-      <w:proofErr w:type="gramEnd"/>
-      <w:r>
-        <w:t xml:space="preserve"> exist, if not it will create one and save it, otherwise it will simply return the one that already exists.</w:t>
+        <w:t>I plan to next create the file for the database itself. This will be placed within an abstract function which allows my other files to access its DAO and all the database operations within it. Inside it I will put a getDatabase() function which will check that a database doesn’t already exist, if not it will create one and save it, otherwise it will simply return the one that already exists.</w:t>
       </w:r>
     </w:p>
     <w:p>
@@ -3263,74 +2483,16 @@
         </w:drawing>
       </w:r>
       <w:r>
-        <w:t xml:space="preserve">I will next update my </w:t>
-      </w:r>
-      <w:proofErr w:type="spellStart"/>
-      <w:r>
-        <w:t>Viewmodel</w:t>
-      </w:r>
-      <w:proofErr w:type="spellEnd"/>
-      <w:r>
-        <w:t xml:space="preserve">. </w:t>
-      </w:r>
-      <w:r>
-        <w:t xml:space="preserve">I will first change the </w:t>
-      </w:r>
-      <w:proofErr w:type="spellStart"/>
-      <w:r>
-        <w:t>ViewModel</w:t>
-      </w:r>
-      <w:proofErr w:type="spellEnd"/>
-      <w:r>
-        <w:t xml:space="preserve"> for </w:t>
-      </w:r>
-      <w:proofErr w:type="gramStart"/>
-      <w:r>
-        <w:t xml:space="preserve">a </w:t>
-      </w:r>
-      <w:proofErr w:type="spellStart"/>
-      <w:r>
-        <w:t>AndroidViewModel</w:t>
-      </w:r>
-      <w:proofErr w:type="spellEnd"/>
-      <w:proofErr w:type="gramEnd"/>
-      <w:r>
-        <w:t xml:space="preserve"> so that it can access the application context which will be needed to open the database. </w:t>
+        <w:t xml:space="preserve">I will next update my Viewmodel. </w:t>
+      </w:r>
+      <w:r>
+        <w:t xml:space="preserve">I will first change the ViewModel for a AndroidViewModel so that it can access the application context which will be needed to open the database. </w:t>
       </w:r>
       <w:r>
         <w:t xml:space="preserve">I plan to update the poi variable so that it gathers all the pois from the database as </w:t>
       </w:r>
-      <w:proofErr w:type="spellStart"/>
-      <w:r>
-        <w:t>LiveData</w:t>
-      </w:r>
-      <w:proofErr w:type="spellEnd"/>
-      <w:r>
-        <w:t xml:space="preserve"> allowing it to automatically update when a new POI is added. Because of this, I will also need to change the </w:t>
-      </w:r>
-      <w:proofErr w:type="spellStart"/>
-      <w:r>
-        <w:t>addpoi</w:t>
-      </w:r>
-      <w:proofErr w:type="spellEnd"/>
-      <w:r>
-        <w:t xml:space="preserve"> function in the </w:t>
-      </w:r>
-      <w:proofErr w:type="spellStart"/>
-      <w:r>
-        <w:t>Viewmodel</w:t>
-      </w:r>
-      <w:proofErr w:type="spellEnd"/>
-      <w:r>
-        <w:t xml:space="preserve"> so that it adds the poi to the database instead of list using the </w:t>
-      </w:r>
-      <w:proofErr w:type="spellStart"/>
-      <w:r>
-        <w:t>poiDao’s</w:t>
-      </w:r>
-      <w:proofErr w:type="spellEnd"/>
-      <w:r>
-        <w:t xml:space="preserve"> ins</w:t>
+      <w:r>
+        <w:t>LiveData allowing it to automatically update when a new POI is added. Because of this, I will also need to change the addpoi function in the Viewmodel so that it adds the poi to the database instead of list using the poiDao’s ins</w:t>
       </w:r>
       <w:r>
         <w:t>ert function.</w:t>
@@ -3411,15 +2573,7 @@
         </w:drawing>
       </w:r>
       <w:r>
-        <w:t xml:space="preserve">I will then update the button for my </w:t>
-      </w:r>
-      <w:proofErr w:type="spellStart"/>
-      <w:r>
-        <w:t>AddPoiScreen</w:t>
-      </w:r>
-      <w:proofErr w:type="spellEnd"/>
-      <w:r>
-        <w:t>. I will simply change the Poi structure in the button so that it fits the databases poi structure since the latitude and longitude for the pois in the database are separate variables.</w:t>
+        <w:t>I will then update the button for my AddPoiScreen. I will simply change the Poi structure in the button so that it fits the databases poi structure since the latitude and longitude for the pois in the database are separate variables.</w:t>
       </w:r>
     </w:p>
     <w:p>
@@ -3433,23 +2587,7 @@
       </w:pPr>
       <w:r>
         <w:lastRenderedPageBreak/>
-        <w:t xml:space="preserve">I will then need to change the </w:t>
-      </w:r>
-      <w:proofErr w:type="spellStart"/>
-      <w:r>
-        <w:t>MainActivity</w:t>
-      </w:r>
-      <w:proofErr w:type="spellEnd"/>
-      <w:r>
-        <w:t xml:space="preserve"> so that the Poi is converted back into the </w:t>
-      </w:r>
-      <w:proofErr w:type="spellStart"/>
-      <w:r>
-        <w:t>LatLng</w:t>
-      </w:r>
-      <w:proofErr w:type="spellEnd"/>
-      <w:r>
-        <w:t xml:space="preserve"> so that the map can properly mark its location.</w:t>
+        <w:t>I will then need to change the MainActivity so that the Poi is converted back into the LatLng so that the map can properly mark its location.</w:t>
       </w:r>
     </w:p>
     <w:p>
@@ -3663,15 +2801,7 @@
         <w:ind w:left="720"/>
       </w:pPr>
       <w:r>
-        <w:t xml:space="preserve">I have already set up the loading process for the POIs for task 3. This is done on </w:t>
-      </w:r>
-      <w:proofErr w:type="gramStart"/>
-      <w:r>
-        <w:t>startup and</w:t>
-      </w:r>
-      <w:proofErr w:type="gramEnd"/>
-      <w:r>
-        <w:t xml:space="preserve"> whenever the database is updated. </w:t>
+        <w:t xml:space="preserve">I have already set up the loading process for the POIs for task 3. This is done on startup and whenever the database is updated. </w:t>
       </w:r>
       <w:r>
         <w:t>However, to fit this task better I will change the code to use a button instead, this will make testing easier and give the user more control.</w:t>
@@ -3687,26 +2817,14 @@
         <w:ind w:left="720"/>
       </w:pPr>
       <w:r>
-        <w:t xml:space="preserve">I will start this by changing the DAO to </w:t>
-      </w:r>
-      <w:proofErr w:type="gramStart"/>
-      <w:r>
-        <w:t>return</w:t>
-      </w:r>
-      <w:proofErr w:type="gramEnd"/>
-      <w:r>
-        <w:t xml:space="preserve"> a plain list instead of </w:t>
-      </w:r>
-      <w:proofErr w:type="gramStart"/>
+        <w:t xml:space="preserve">I will start this by changing the DAO to return a plain list instead of </w:t>
+      </w:r>
       <w:r>
         <w:t xml:space="preserve">the </w:t>
       </w:r>
-      <w:proofErr w:type="spellStart"/>
       <w:r>
         <w:t>LiveData</w:t>
       </w:r>
-      <w:proofErr w:type="spellEnd"/>
-      <w:proofErr w:type="gramEnd"/>
       <w:r>
         <w:t xml:space="preserve"> since the POIs will no longer be automatically loaded. </w:t>
       </w:r>
@@ -3850,39 +2968,7 @@
         </w:drawing>
       </w:r>
       <w:r>
-        <w:t xml:space="preserve">I will also need to add a new function to the </w:t>
-      </w:r>
-      <w:proofErr w:type="spellStart"/>
-      <w:r>
-        <w:t>ViewModel</w:t>
-      </w:r>
-      <w:proofErr w:type="spellEnd"/>
-      <w:r>
-        <w:t xml:space="preserve"> which will load all the POIs from the database. It will run the database query on Dispatchers.IO in the background, then set the result to </w:t>
-      </w:r>
-      <w:proofErr w:type="spellStart"/>
-      <w:r>
-        <w:t>pois.value</w:t>
-      </w:r>
-      <w:proofErr w:type="spellEnd"/>
-      <w:r>
-        <w:t xml:space="preserve"> which should </w:t>
-      </w:r>
-      <w:proofErr w:type="gramStart"/>
-      <w:r>
-        <w:t>triggers</w:t>
-      </w:r>
-      <w:proofErr w:type="gramEnd"/>
-      <w:r>
-        <w:t xml:space="preserve"> the observer in </w:t>
-      </w:r>
-      <w:proofErr w:type="spellStart"/>
-      <w:r>
-        <w:t>MainActivity</w:t>
-      </w:r>
-      <w:proofErr w:type="spellEnd"/>
-      <w:r>
-        <w:t xml:space="preserve"> which will then update the map.</w:t>
+        <w:t>I will also need to add a new function to the ViewModel which will load all the POIs from the database. It will run the database query on Dispatchers.IO in the background, then set the result to pois.value which should triggers the observer in MainActivity which will then update the map.</w:t>
       </w:r>
     </w:p>
     <w:p>
@@ -3955,36 +3041,20 @@
         <w:t>it</w:t>
       </w:r>
       <w:r>
-        <w:t xml:space="preserve"> holds a plain list of pois instead of being assigned directly from the DAO’s live data since it no longer returns </w:t>
-      </w:r>
-      <w:proofErr w:type="spellStart"/>
-      <w:r>
-        <w:t>LiveData</w:t>
-      </w:r>
-      <w:proofErr w:type="spellEnd"/>
-      <w:r>
-        <w:t>.</w:t>
-      </w:r>
-    </w:p>
-    <w:p>
-      <w:pPr>
-        <w:ind w:left="720"/>
-      </w:pPr>
-    </w:p>
-    <w:p>
-      <w:pPr>
-        <w:ind w:left="720"/>
-      </w:pPr>
-      <w:r>
-        <w:t xml:space="preserve">I will then lastly need to add the load buttons to the </w:t>
-      </w:r>
-      <w:proofErr w:type="spellStart"/>
-      <w:r>
-        <w:t>MainActivity</w:t>
-      </w:r>
-      <w:proofErr w:type="spellEnd"/>
-      <w:r>
-        <w:t>. This will call the load poi function in the view model, loading all the pois from the database into the UI.</w:t>
+        <w:t xml:space="preserve"> holds a plain list of pois instead of being assigned directly from the DAO’s live data since it no longer returns LiveData.</w:t>
+      </w:r>
+    </w:p>
+    <w:p>
+      <w:pPr>
+        <w:ind w:left="720"/>
+      </w:pPr>
+    </w:p>
+    <w:p>
+      <w:pPr>
+        <w:ind w:left="720"/>
+      </w:pPr>
+      <w:r>
+        <w:t>I will then lastly need to add the load buttons to the MainActivity. This will call the load poi function in the view model, loading all the pois from the database into the UI.</w:t>
       </w:r>
     </w:p>
     <w:p>
@@ -4114,31 +3184,7 @@
           <w:sz w:val="24"/>
           <w:szCs w:val="24"/>
         </w:rPr>
-        <w:t xml:space="preserve"> in a text field. This should search the local database. The matching places should appear on the map as markers or circles. </w:t>
-      </w:r>
-      <w:proofErr w:type="gramStart"/>
-      <w:r>
-        <w:rPr>
-          <w:rFonts w:ascii="Trebuchet MS" w:hAnsi="Trebuchet MS"/>
-          <w:i/>
-          <w:iCs/>
-          <w:color w:val="000000"/>
-          <w:sz w:val="24"/>
-          <w:szCs w:val="24"/>
-        </w:rPr>
-        <w:t>Again</w:t>
-      </w:r>
-      <w:proofErr w:type="gramEnd"/>
-      <w:r>
-        <w:rPr>
-          <w:rFonts w:ascii="Trebuchet MS" w:hAnsi="Trebuchet MS"/>
-          <w:i/>
-          <w:iCs/>
-          <w:color w:val="000000"/>
-          <w:sz w:val="24"/>
-          <w:szCs w:val="24"/>
-        </w:rPr>
-        <w:t xml:space="preserve"> a dialog box should appear when the user clicks on each place.”</w:t>
+        <w:t xml:space="preserve"> in a text field. This should search the local database. The matching places should appear on the map as markers or circles. Again a dialog box should appear when the user clicks on each place.”</w:t>
       </w:r>
     </w:p>
     <w:p>
@@ -4231,13 +3277,13 @@
         </w:rPr>
         <w:lastRenderedPageBreak/>
         <w:drawing>
-          <wp:anchor distT="0" distB="0" distL="114300" distR="114300" simplePos="0" relativeHeight="251691008" behindDoc="0" locked="0" layoutInCell="1" allowOverlap="1" wp14:anchorId="35F846E8" wp14:editId="25798B46">
+          <wp:anchor distT="0" distB="0" distL="114300" distR="114300" simplePos="0" relativeHeight="251691008" behindDoc="0" locked="0" layoutInCell="1" allowOverlap="1" wp14:anchorId="35F846E8" wp14:editId="49F4980B">
             <wp:simplePos x="0" y="0"/>
             <wp:positionH relativeFrom="margin">
               <wp:align>center</wp:align>
             </wp:positionH>
             <wp:positionV relativeFrom="paragraph">
-              <wp:posOffset>619125</wp:posOffset>
+              <wp:posOffset>952500</wp:posOffset>
             </wp:positionV>
             <wp:extent cx="4391025" cy="1724025"/>
             <wp:effectExtent l="0" t="0" r="9525" b="9525"/>
@@ -4284,69 +3330,514 @@
         <w:t>I will next create</w:t>
       </w:r>
       <w:r>
-        <w:t xml:space="preserve"> a new function in the </w:t>
-      </w:r>
-      <w:proofErr w:type="spellStart"/>
-      <w:r>
-        <w:t>ViewModel</w:t>
-      </w:r>
-      <w:proofErr w:type="spellEnd"/>
-      <w:r>
-        <w:t xml:space="preserve">. This will </w:t>
-      </w:r>
-      <w:proofErr w:type="gramStart"/>
-      <w:r>
-        <w:t>use the search</w:t>
-      </w:r>
-      <w:proofErr w:type="gramEnd"/>
-      <w:r>
-        <w:t xml:space="preserve"> by type function from the DAO. This will have the type as a parameter to search with and add the results to the </w:t>
-      </w:r>
-      <w:proofErr w:type="spellStart"/>
-      <w:r>
-        <w:t>pois.value</w:t>
-      </w:r>
-      <w:proofErr w:type="spellEnd"/>
-      <w:r>
-        <w:t>.</w:t>
-      </w:r>
-    </w:p>
-    <w:p>
-      <w:pPr>
-        <w:ind w:left="720"/>
-      </w:pPr>
-    </w:p>
-    <w:p>
-      <w:pPr>
-        <w:ind w:left="720"/>
-      </w:pPr>
-      <w:r>
-        <w:t xml:space="preserve">Then I will add an outlined text field to my </w:t>
-      </w:r>
-      <w:proofErr w:type="spellStart"/>
-      <w:r>
-        <w:t>MainActivity</w:t>
-      </w:r>
-      <w:proofErr w:type="spellEnd"/>
-      <w:r>
-        <w:t xml:space="preserve"> which will be used by the user to input the accommodation type that they are searching for. This will then be followed by a button which, when clicked, will take the </w:t>
-      </w:r>
-      <w:proofErr w:type="gramStart"/>
-      <w:r>
-        <w:t>inputted</w:t>
-      </w:r>
-      <w:proofErr w:type="gramEnd"/>
-      <w:r>
-        <w:t xml:space="preserve"> data and call the search pois by type function using the </w:t>
-      </w:r>
-      <w:proofErr w:type="gramStart"/>
-      <w:r>
-        <w:t>inputted</w:t>
-      </w:r>
-      <w:proofErr w:type="gramEnd"/>
-      <w:r>
-        <w:t xml:space="preserve"> data as the parameter.</w:t>
-      </w:r>
+        <w:t xml:space="preserve"> a new function in the ViewModel. This will use the search by type function from the DAO. This will have the type as a parameter to search with and add the results to the pois.value.</w:t>
+      </w:r>
+      <w:r>
+        <w:t xml:space="preserve"> This makes it so when a user searches a type, it only displays markers relating to that type. Then to display all the pois again the user will simply need to load the pois again.</w:t>
+      </w:r>
+    </w:p>
+    <w:p>
+      <w:pPr>
+        <w:ind w:left="720"/>
+      </w:pPr>
+    </w:p>
+    <w:p>
+      <w:pPr>
+        <w:ind w:left="720"/>
+      </w:pPr>
+      <w:r>
+        <w:rPr>
+          <w:noProof/>
+        </w:rPr>
+        <w:drawing>
+          <wp:anchor distT="0" distB="0" distL="114300" distR="114300" simplePos="0" relativeHeight="251692032" behindDoc="0" locked="0" layoutInCell="1" allowOverlap="1" wp14:anchorId="3E54EA0A" wp14:editId="57FD919E">
+            <wp:simplePos x="0" y="0"/>
+            <wp:positionH relativeFrom="margin">
+              <wp:align>center</wp:align>
+            </wp:positionH>
+            <wp:positionV relativeFrom="paragraph">
+              <wp:posOffset>836930</wp:posOffset>
+            </wp:positionV>
+            <wp:extent cx="4143375" cy="2187575"/>
+            <wp:effectExtent l="0" t="0" r="9525" b="3175"/>
+            <wp:wrapTopAndBottom/>
+            <wp:docPr id="325105596" name="Picture 1"/>
+            <wp:cNvGraphicFramePr>
+              <a:graphicFrameLocks xmlns:a="http://schemas.openxmlformats.org/drawingml/2006/main" noChangeAspect="1"/>
+            </wp:cNvGraphicFramePr>
+            <a:graphic xmlns:a="http://schemas.openxmlformats.org/drawingml/2006/main">
+              <a:graphicData uri="http://schemas.openxmlformats.org/drawingml/2006/picture">
+                <pic:pic xmlns:pic="http://schemas.openxmlformats.org/drawingml/2006/picture">
+                  <pic:nvPicPr>
+                    <pic:cNvPr id="325105596" name=""/>
+                    <pic:cNvPicPr/>
+                  </pic:nvPicPr>
+                  <pic:blipFill>
+                    <a:blip r:embed="rId37">
+                      <a:extLst>
+                        <a:ext uri="{28A0092B-C50C-407E-A947-70E740481C1C}">
+                          <a14:useLocalDpi xmlns:a14="http://schemas.microsoft.com/office/drawing/2010/main" val="0"/>
+                        </a:ext>
+                      </a:extLst>
+                    </a:blip>
+                    <a:stretch>
+                      <a:fillRect/>
+                    </a:stretch>
+                  </pic:blipFill>
+                  <pic:spPr>
+                    <a:xfrm>
+                      <a:off x="0" y="0"/>
+                      <a:ext cx="4143375" cy="2187575"/>
+                    </a:xfrm>
+                    <a:prstGeom prst="rect">
+                      <a:avLst/>
+                    </a:prstGeom>
+                  </pic:spPr>
+                </pic:pic>
+              </a:graphicData>
+            </a:graphic>
+            <wp14:sizeRelH relativeFrom="margin">
+              <wp14:pctWidth>0</wp14:pctWidth>
+            </wp14:sizeRelH>
+            <wp14:sizeRelV relativeFrom="margin">
+              <wp14:pctHeight>0</wp14:pctHeight>
+            </wp14:sizeRelV>
+          </wp:anchor>
+        </w:drawing>
+      </w:r>
+      <w:r>
+        <w:t>Then I will add an outlined text field to my MainActivity which will be used by the user to input the accommodation type that they are searching for. This will then be followed by a button which, when clicked, will take the inputted data and call the search pois by type function using the inputted data as the parameter.</w:t>
+      </w:r>
+    </w:p>
+    <w:p/>
+    <w:p>
+      <w:pPr>
+        <w:rPr>
+          <w:rFonts w:ascii="Trebuchet MS" w:hAnsi="Trebuchet MS"/>
+          <w:sz w:val="24"/>
+          <w:szCs w:val="24"/>
+        </w:rPr>
+      </w:pPr>
+    </w:p>
+    <w:p>
+      <w:pPr>
+        <w:rPr>
+          <w:rFonts w:ascii="Trebuchet MS" w:hAnsi="Trebuchet MS"/>
+          <w:sz w:val="24"/>
+          <w:szCs w:val="24"/>
+        </w:rPr>
+      </w:pPr>
+    </w:p>
+    <w:p>
+      <w:pPr>
+        <w:rPr>
+          <w:rFonts w:ascii="Trebuchet MS" w:hAnsi="Trebuchet MS"/>
+          <w:sz w:val="24"/>
+          <w:szCs w:val="24"/>
+        </w:rPr>
+      </w:pPr>
+    </w:p>
+    <w:p>
+      <w:pPr>
+        <w:rPr>
+          <w:rFonts w:ascii="Trebuchet MS" w:hAnsi="Trebuchet MS"/>
+          <w:sz w:val="24"/>
+          <w:szCs w:val="24"/>
+        </w:rPr>
+      </w:pPr>
+    </w:p>
+    <w:p>
+      <w:pPr>
+        <w:rPr>
+          <w:rFonts w:ascii="Trebuchet MS" w:hAnsi="Trebuchet MS"/>
+          <w:sz w:val="24"/>
+          <w:szCs w:val="24"/>
+        </w:rPr>
+      </w:pPr>
+    </w:p>
+    <w:p>
+      <w:pPr>
+        <w:rPr>
+          <w:rFonts w:ascii="Trebuchet MS" w:hAnsi="Trebuchet MS"/>
+          <w:sz w:val="24"/>
+          <w:szCs w:val="24"/>
+        </w:rPr>
+      </w:pPr>
+    </w:p>
+    <w:p>
+      <w:pPr>
+        <w:rPr>
+          <w:rFonts w:ascii="Trebuchet MS" w:hAnsi="Trebuchet MS"/>
+          <w:sz w:val="24"/>
+          <w:szCs w:val="24"/>
+        </w:rPr>
+      </w:pPr>
+    </w:p>
+    <w:p>
+      <w:pPr>
+        <w:rPr>
+          <w:rFonts w:ascii="Trebuchet MS" w:hAnsi="Trebuchet MS"/>
+          <w:sz w:val="24"/>
+          <w:szCs w:val="24"/>
+        </w:rPr>
+      </w:pPr>
+    </w:p>
+    <w:p>
+      <w:pPr>
+        <w:rPr>
+          <w:i/>
+          <w:iCs/>
+          <w:sz w:val="24"/>
+          <w:szCs w:val="24"/>
+        </w:rPr>
+      </w:pPr>
+      <w:r>
+        <w:rPr>
+          <w:rFonts w:ascii="Trebuchet MS" w:hAnsi="Trebuchet MS"/>
+          <w:sz w:val="24"/>
+          <w:szCs w:val="24"/>
+        </w:rPr>
+        <w:lastRenderedPageBreak/>
+        <w:t xml:space="preserve">6. </w:t>
+      </w:r>
+      <w:r>
+        <w:rPr>
+          <w:rFonts w:ascii="Trebuchet MS" w:hAnsi="Trebuchet MS"/>
+          <w:i/>
+          <w:iCs/>
+          <w:sz w:val="24"/>
+          <w:szCs w:val="24"/>
+        </w:rPr>
+        <w:t>“</w:t>
+      </w:r>
+      <w:r>
+        <w:rPr>
+          <w:rFonts w:ascii="Trebuchet MS" w:hAnsi="Trebuchet MS"/>
+          <w:i/>
+          <w:iCs/>
+          <w:sz w:val="24"/>
+          <w:szCs w:val="24"/>
+        </w:rPr>
+        <w:t>The user should be able to load points of interest from the web. You should connect to the following web service (</w:t>
+      </w:r>
+      <w:r>
+        <w:rPr>
+          <w:rFonts w:ascii="Trebuchet MS" w:hAnsi="Trebuchet MS"/>
+          <w:i/>
+          <w:iCs/>
+          <w:sz w:val="24"/>
+          <w:szCs w:val="24"/>
+          <w:u w:val="single"/>
+        </w:rPr>
+        <w:t>use the supplied Node server and access from the emulator</w:t>
+      </w:r>
+      <w:r>
+        <w:rPr>
+          <w:rFonts w:ascii="Trebuchet MS" w:hAnsi="Trebuchet MS"/>
+          <w:i/>
+          <w:iCs/>
+          <w:sz w:val="24"/>
+          <w:szCs w:val="24"/>
+        </w:rPr>
+        <w:t>):</w:t>
+      </w:r>
+    </w:p>
+    <w:p>
+      <w:pPr>
+        <w:rPr>
+          <w:i/>
+          <w:iCs/>
+          <w:sz w:val="24"/>
+          <w:szCs w:val="24"/>
+        </w:rPr>
+      </w:pPr>
+      <w:r>
+        <w:rPr>
+          <w:rFonts w:ascii="DejaVu Sans Mono" w:hAnsi="DejaVu Sans Mono"/>
+          <w:i/>
+          <w:iCs/>
+          <w:sz w:val="24"/>
+          <w:szCs w:val="24"/>
+        </w:rPr>
+        <w:t>http://10.0.2.2:3000/poi/all</w:t>
+      </w:r>
+    </w:p>
+    <w:p>
+      <w:pPr>
+        <w:rPr>
+          <w:i/>
+          <w:iCs/>
+          <w:sz w:val="24"/>
+          <w:szCs w:val="24"/>
+        </w:rPr>
+      </w:pPr>
+      <w:r>
+        <w:rPr>
+          <w:rFonts w:ascii="Trebuchet MS" w:hAnsi="Trebuchet MS"/>
+          <w:i/>
+          <w:iCs/>
+          <w:sz w:val="24"/>
+          <w:szCs w:val="24"/>
+        </w:rPr>
+        <w:t>A database of POIs, sourced from OpenStreetMap (copyright OpenStreetMap contributors and licensed under the Open Database License) will be provided.</w:t>
+      </w:r>
+    </w:p>
+    <w:p>
+      <w:pPr>
+        <w:rPr>
+          <w:rFonts w:ascii="Trebuchet MS" w:hAnsi="Trebuchet MS"/>
+          <w:i/>
+          <w:iCs/>
+          <w:sz w:val="24"/>
+          <w:szCs w:val="24"/>
+        </w:rPr>
+      </w:pPr>
+      <w:r>
+        <w:rPr>
+          <w:rFonts w:ascii="Trebuchet MS" w:hAnsi="Trebuchet MS"/>
+          <w:i/>
+          <w:iCs/>
+          <w:sz w:val="24"/>
+          <w:szCs w:val="24"/>
+        </w:rPr>
+        <w:t>When the POIs are loaded they should be shown on the map as markers and saved to the database. To avoid duplicate entries in the database, check whether the point of interest with that ID is already present before adding it.</w:t>
+      </w:r>
+      <w:r>
+        <w:rPr>
+          <w:rFonts w:ascii="Trebuchet MS" w:hAnsi="Trebuchet MS"/>
+          <w:i/>
+          <w:iCs/>
+          <w:sz w:val="24"/>
+          <w:szCs w:val="24"/>
+        </w:rPr>
+        <w:t>”</w:t>
+      </w:r>
+    </w:p>
+    <w:p>
+      <w:pPr>
+        <w:rPr>
+          <w:rFonts w:ascii="Trebuchet MS" w:hAnsi="Trebuchet MS"/>
+          <w:i/>
+          <w:iCs/>
+          <w:sz w:val="24"/>
+          <w:szCs w:val="24"/>
+        </w:rPr>
+      </w:pPr>
+    </w:p>
+    <w:p>
+      <w:pPr>
+        <w:ind w:left="720"/>
+        <w:rPr>
+          <w:rFonts w:ascii="Trebuchet MS" w:hAnsi="Trebuchet MS"/>
+          <w:sz w:val="24"/>
+          <w:szCs w:val="24"/>
+        </w:rPr>
+      </w:pPr>
+      <w:r>
+        <w:rPr>
+          <w:rFonts w:ascii="Trebuchet MS" w:hAnsi="Trebuchet MS"/>
+          <w:sz w:val="24"/>
+          <w:szCs w:val="24"/>
+        </w:rPr>
+        <w:t>To complete task I will be using f</w:t>
+      </w:r>
+      <w:r>
+        <w:rPr>
+          <w:rFonts w:ascii="Trebuchet MS" w:hAnsi="Trebuchet MS"/>
+          <w:sz w:val="24"/>
+          <w:szCs w:val="24"/>
+        </w:rPr>
+        <w:t>uel so that my application can communicate across the web. To begin with I will need to add all the dependencies relating to fuel and import it where it is needed.</w:t>
+      </w:r>
+    </w:p>
+    <w:p>
+      <w:pPr>
+        <w:ind w:left="720"/>
+        <w:rPr>
+          <w:rFonts w:ascii="Trebuchet MS" w:hAnsi="Trebuchet MS"/>
+          <w:sz w:val="24"/>
+          <w:szCs w:val="24"/>
+        </w:rPr>
+      </w:pPr>
+    </w:p>
+    <w:p>
+      <w:pPr>
+        <w:ind w:left="720"/>
+        <w:rPr>
+          <w:rFonts w:ascii="Trebuchet MS" w:hAnsi="Trebuchet MS"/>
+          <w:sz w:val="24"/>
+          <w:szCs w:val="24"/>
+        </w:rPr>
+      </w:pPr>
+      <w:r>
+        <w:rPr>
+          <w:rFonts w:ascii="Trebuchet MS" w:hAnsi="Trebuchet MS"/>
+          <w:sz w:val="24"/>
+          <w:szCs w:val="24"/>
+        </w:rPr>
+        <w:t>On top of this I will need to add usesCleartextTraffic=”true” to my application. This is because Android doesn’t allow access to insecure servers (HTTP) which my server is. By using this it disables the restriction allowing my app to communicate with the server.</w:t>
+      </w:r>
+    </w:p>
+    <w:p>
+      <w:pPr>
+        <w:ind w:left="720"/>
+        <w:rPr>
+          <w:rFonts w:ascii="Trebuchet MS" w:hAnsi="Trebuchet MS"/>
+          <w:sz w:val="24"/>
+          <w:szCs w:val="24"/>
+        </w:rPr>
+      </w:pPr>
+    </w:p>
+    <w:p>
+      <w:pPr>
+        <w:ind w:left="720"/>
+        <w:rPr>
+          <w:rFonts w:ascii="Trebuchet MS" w:hAnsi="Trebuchet MS"/>
+          <w:sz w:val="24"/>
+          <w:szCs w:val="24"/>
+        </w:rPr>
+      </w:pPr>
+      <w:r>
+        <w:rPr>
+          <w:rFonts w:ascii="Trebuchet MS" w:hAnsi="Trebuchet MS"/>
+          <w:sz w:val="24"/>
+          <w:szCs w:val="24"/>
+        </w:rPr>
+        <w:t xml:space="preserve">I will then create a new data class for the pois coming from the web. </w:t>
+      </w:r>
+      <w:r>
+        <w:rPr>
+          <w:rFonts w:ascii="Trebuchet MS" w:hAnsi="Trebuchet MS"/>
+          <w:sz w:val="24"/>
+          <w:szCs w:val="24"/>
+        </w:rPr>
+        <w:t>This will be a separate class to my poi entity class. GSON will parse the JSON from the web into this new data class’s objects which will then be converted into my Poi entity to then be saved on the local database.</w:t>
+      </w:r>
+    </w:p>
+    <w:p>
+      <w:pPr>
+        <w:ind w:left="720"/>
+        <w:rPr>
+          <w:rFonts w:ascii="Trebuchet MS" w:hAnsi="Trebuchet MS"/>
+          <w:sz w:val="24"/>
+          <w:szCs w:val="24"/>
+        </w:rPr>
+      </w:pPr>
+    </w:p>
+    <w:p>
+      <w:pPr>
+        <w:ind w:left="720"/>
+        <w:rPr>
+          <w:rFonts w:ascii="Trebuchet MS" w:hAnsi="Trebuchet MS"/>
+          <w:sz w:val="24"/>
+          <w:szCs w:val="24"/>
+        </w:rPr>
+      </w:pPr>
+      <w:r>
+        <w:rPr>
+          <w:rFonts w:ascii="Trebuchet MS" w:hAnsi="Trebuchet MS"/>
+          <w:sz w:val="24"/>
+          <w:szCs w:val="24"/>
+        </w:rPr>
+        <w:t xml:space="preserve">This will need a new function which I will store within my ViewModel. </w:t>
+      </w:r>
+      <w:r>
+        <w:rPr>
+          <w:rFonts w:ascii="Trebuchet MS" w:hAnsi="Trebuchet MS"/>
+          <w:sz w:val="24"/>
+          <w:szCs w:val="24"/>
+        </w:rPr>
+        <w:t>This will use the web servers get request using the “</w:t>
+      </w:r>
+      <w:r>
+        <w:rPr>
+          <w:rFonts w:ascii="Trebuchet MS" w:hAnsi="Trebuchet MS"/>
+          <w:sz w:val="24"/>
+          <w:szCs w:val="24"/>
+        </w:rPr>
+        <w:t>http://10.0.2.2:3000/poi/all</w:t>
+      </w:r>
+      <w:r>
+        <w:rPr>
+          <w:rFonts w:ascii="Trebuchet MS" w:hAnsi="Trebuchet MS"/>
+          <w:sz w:val="24"/>
+          <w:szCs w:val="24"/>
+        </w:rPr>
+        <w:t xml:space="preserve">” url which will gather all the pois in the web data base. The function will then, within a coroutine so it can handle the database operations, check each poi in the web database and compare its id with the ones in the local database. The ones that have an id which already exists in the local database are skipped to prevent duplicates. </w:t>
+      </w:r>
+    </w:p>
+    <w:p>
+      <w:pPr>
+        <w:ind w:left="720"/>
+        <w:rPr>
+          <w:rFonts w:ascii="Trebuchet MS" w:hAnsi="Trebuchet MS"/>
+          <w:sz w:val="24"/>
+          <w:szCs w:val="24"/>
+        </w:rPr>
+      </w:pPr>
+    </w:p>
+    <w:p>
+      <w:pPr>
+        <w:ind w:left="720"/>
+        <w:rPr>
+          <w:rFonts w:ascii="Trebuchet MS" w:hAnsi="Trebuchet MS"/>
+          <w:sz w:val="24"/>
+          <w:szCs w:val="24"/>
+        </w:rPr>
+      </w:pPr>
+      <w:r>
+        <w:rPr>
+          <w:rFonts w:ascii="Trebuchet MS" w:hAnsi="Trebuchet MS"/>
+          <w:sz w:val="24"/>
+          <w:szCs w:val="24"/>
+        </w:rPr>
+        <w:t>Then finally for this task I will need to add a new button in the MainActivity which uses the new function.</w:t>
+      </w:r>
+      <w:r>
+        <w:rPr>
+          <w:rFonts w:ascii="Trebuchet MS" w:hAnsi="Trebuchet MS"/>
+          <w:sz w:val="24"/>
+          <w:szCs w:val="24"/>
+        </w:rPr>
+        <w:t xml:space="preserve"> </w:t>
+      </w:r>
+    </w:p>
+    <w:p>
+      <w:pPr>
+        <w:ind w:left="720"/>
+        <w:rPr>
+          <w:rFonts w:ascii="Trebuchet MS" w:hAnsi="Trebuchet MS"/>
+          <w:sz w:val="24"/>
+          <w:szCs w:val="24"/>
+        </w:rPr>
+      </w:pPr>
+      <w:r>
+        <w:rPr>
+          <w:rFonts w:ascii="Trebuchet MS" w:hAnsi="Trebuchet MS"/>
+          <w:sz w:val="24"/>
+          <w:szCs w:val="24"/>
+        </w:rPr>
+        <w:t xml:space="preserve"> </w:t>
+      </w:r>
+    </w:p>
+    <w:p>
+      <w:pPr>
+        <w:ind w:left="720"/>
+        <w:rPr>
+          <w:rFonts w:ascii="Trebuchet MS" w:hAnsi="Trebuchet MS"/>
+          <w:sz w:val="24"/>
+          <w:szCs w:val="24"/>
+        </w:rPr>
+      </w:pPr>
+    </w:p>
+    <w:p>
+      <w:pPr>
+        <w:ind w:left="720"/>
+        <w:rPr>
+          <w:sz w:val="24"/>
+          <w:szCs w:val="24"/>
+        </w:rPr>
+      </w:pPr>
     </w:p>
     <w:p/>
     <w:sectPr>
@@ -4876,7 +4367,6 @@
   <w:style w:type="character" w:default="1" w:styleId="DefaultParagraphFont">
     <w:name w:val="Default Paragraph Font"/>
     <w:uiPriority w:val="1"/>
-    <w:semiHidden/>
     <w:unhideWhenUsed/>
   </w:style>
   <w:style w:type="table" w:default="1" w:styleId="TableNormal">
@@ -4942,6 +4432,29 @@
       <w:color w:val="666666"/>
       <w:sz w:val="30"/>
       <w:szCs w:val="30"/>
+    </w:rPr>
+  </w:style>
+  <w:style w:type="character" w:styleId="Hyperlink">
+    <w:name w:val="Hyperlink"/>
+    <w:basedOn w:val="DefaultParagraphFont"/>
+    <w:uiPriority w:val="99"/>
+    <w:unhideWhenUsed/>
+    <w:rsid w:val="0059728D"/>
+    <w:rPr>
+      <w:color w:val="0000FF" w:themeColor="hyperlink"/>
+      <w:u w:val="single"/>
+    </w:rPr>
+  </w:style>
+  <w:style w:type="character" w:styleId="UnresolvedMention">
+    <w:name w:val="Unresolved Mention"/>
+    <w:basedOn w:val="DefaultParagraphFont"/>
+    <w:uiPriority w:val="99"/>
+    <w:semiHidden/>
+    <w:unhideWhenUsed/>
+    <w:rsid w:val="0059728D"/>
+    <w:rPr>
+      <w:color w:val="605E5C"/>
+      <w:shd w:val="clear" w:color="auto" w:fill="E1DFDD"/>
     </w:rPr>
   </w:style>
 </w:styles>

</xml_diff>

<commit_message>
Changes made to report for task 6
</commit_message>
<xml_diff>
--- a/MAD_Report.docx
+++ b/MAD_Report.docx
@@ -3635,6 +3635,168 @@
       </w:pPr>
       <w:r>
         <w:rPr>
+          <w:noProof/>
+        </w:rPr>
+        <w:drawing>
+          <wp:anchor distT="0" distB="0" distL="114300" distR="114300" simplePos="0" relativeHeight="251695104" behindDoc="0" locked="0" layoutInCell="1" allowOverlap="1" wp14:anchorId="39F8E661" wp14:editId="61845E68">
+            <wp:simplePos x="0" y="0"/>
+            <wp:positionH relativeFrom="margin">
+              <wp:align>center</wp:align>
+            </wp:positionH>
+            <wp:positionV relativeFrom="paragraph">
+              <wp:posOffset>1508125</wp:posOffset>
+            </wp:positionV>
+            <wp:extent cx="2600325" cy="695325"/>
+            <wp:effectExtent l="0" t="0" r="9525" b="9525"/>
+            <wp:wrapTopAndBottom/>
+            <wp:docPr id="737850652" name="Picture 1"/>
+            <wp:cNvGraphicFramePr>
+              <a:graphicFrameLocks xmlns:a="http://schemas.openxmlformats.org/drawingml/2006/main" noChangeAspect="1"/>
+            </wp:cNvGraphicFramePr>
+            <a:graphic xmlns:a="http://schemas.openxmlformats.org/drawingml/2006/main">
+              <a:graphicData uri="http://schemas.openxmlformats.org/drawingml/2006/picture">
+                <pic:pic xmlns:pic="http://schemas.openxmlformats.org/drawingml/2006/picture">
+                  <pic:nvPicPr>
+                    <pic:cNvPr id="737850652" name=""/>
+                    <pic:cNvPicPr/>
+                  </pic:nvPicPr>
+                  <pic:blipFill>
+                    <a:blip r:embed="rId38">
+                      <a:extLst>
+                        <a:ext uri="{28A0092B-C50C-407E-A947-70E740481C1C}">
+                          <a14:useLocalDpi xmlns:a14="http://schemas.microsoft.com/office/drawing/2010/main" val="0"/>
+                        </a:ext>
+                      </a:extLst>
+                    </a:blip>
+                    <a:stretch>
+                      <a:fillRect/>
+                    </a:stretch>
+                  </pic:blipFill>
+                  <pic:spPr>
+                    <a:xfrm>
+                      <a:off x="0" y="0"/>
+                      <a:ext cx="2600325" cy="695325"/>
+                    </a:xfrm>
+                    <a:prstGeom prst="rect">
+                      <a:avLst/>
+                    </a:prstGeom>
+                  </pic:spPr>
+                </pic:pic>
+              </a:graphicData>
+            </a:graphic>
+          </wp:anchor>
+        </w:drawing>
+      </w:r>
+      <w:r>
+        <w:rPr>
+          <w:noProof/>
+        </w:rPr>
+        <w:drawing>
+          <wp:anchor distT="0" distB="0" distL="114300" distR="114300" simplePos="0" relativeHeight="251694080" behindDoc="0" locked="0" layoutInCell="1" allowOverlap="1" wp14:anchorId="685C3AB3" wp14:editId="2063751C">
+            <wp:simplePos x="0" y="0"/>
+            <wp:positionH relativeFrom="margin">
+              <wp:align>right</wp:align>
+            </wp:positionH>
+            <wp:positionV relativeFrom="paragraph">
+              <wp:posOffset>927100</wp:posOffset>
+            </wp:positionV>
+            <wp:extent cx="5943600" cy="549275"/>
+            <wp:effectExtent l="0" t="0" r="0" b="3175"/>
+            <wp:wrapTopAndBottom/>
+            <wp:docPr id="1893359750" name="Picture 1"/>
+            <wp:cNvGraphicFramePr>
+              <a:graphicFrameLocks xmlns:a="http://schemas.openxmlformats.org/drawingml/2006/main" noChangeAspect="1"/>
+            </wp:cNvGraphicFramePr>
+            <a:graphic xmlns:a="http://schemas.openxmlformats.org/drawingml/2006/main">
+              <a:graphicData uri="http://schemas.openxmlformats.org/drawingml/2006/picture">
+                <pic:pic xmlns:pic="http://schemas.openxmlformats.org/drawingml/2006/picture">
+                  <pic:nvPicPr>
+                    <pic:cNvPr id="1893359750" name=""/>
+                    <pic:cNvPicPr/>
+                  </pic:nvPicPr>
+                  <pic:blipFill>
+                    <a:blip r:embed="rId39">
+                      <a:extLst>
+                        <a:ext uri="{28A0092B-C50C-407E-A947-70E740481C1C}">
+                          <a14:useLocalDpi xmlns:a14="http://schemas.microsoft.com/office/drawing/2010/main" val="0"/>
+                        </a:ext>
+                      </a:extLst>
+                    </a:blip>
+                    <a:stretch>
+                      <a:fillRect/>
+                    </a:stretch>
+                  </pic:blipFill>
+                  <pic:spPr>
+                    <a:xfrm>
+                      <a:off x="0" y="0"/>
+                      <a:ext cx="5943600" cy="549275"/>
+                    </a:xfrm>
+                    <a:prstGeom prst="rect">
+                      <a:avLst/>
+                    </a:prstGeom>
+                  </pic:spPr>
+                </pic:pic>
+              </a:graphicData>
+            </a:graphic>
+          </wp:anchor>
+        </w:drawing>
+      </w:r>
+      <w:r>
+        <w:rPr>
+          <w:noProof/>
+        </w:rPr>
+        <w:drawing>
+          <wp:anchor distT="0" distB="0" distL="114300" distR="114300" simplePos="0" relativeHeight="251693056" behindDoc="0" locked="0" layoutInCell="1" allowOverlap="1" wp14:anchorId="6130C0BE" wp14:editId="01FE4C59">
+            <wp:simplePos x="0" y="0"/>
+            <wp:positionH relativeFrom="margin">
+              <wp:align>center</wp:align>
+            </wp:positionH>
+            <wp:positionV relativeFrom="paragraph">
+              <wp:posOffset>650875</wp:posOffset>
+            </wp:positionV>
+            <wp:extent cx="1162050" cy="238125"/>
+            <wp:effectExtent l="0" t="0" r="0" b="9525"/>
+            <wp:wrapTopAndBottom/>
+            <wp:docPr id="2020264675" name="Picture 1"/>
+            <wp:cNvGraphicFramePr>
+              <a:graphicFrameLocks xmlns:a="http://schemas.openxmlformats.org/drawingml/2006/main" noChangeAspect="1"/>
+            </wp:cNvGraphicFramePr>
+            <a:graphic xmlns:a="http://schemas.openxmlformats.org/drawingml/2006/main">
+              <a:graphicData uri="http://schemas.openxmlformats.org/drawingml/2006/picture">
+                <pic:pic xmlns:pic="http://schemas.openxmlformats.org/drawingml/2006/picture">
+                  <pic:nvPicPr>
+                    <pic:cNvPr id="2020264675" name=""/>
+                    <pic:cNvPicPr/>
+                  </pic:nvPicPr>
+                  <pic:blipFill>
+                    <a:blip r:embed="rId40">
+                      <a:extLst>
+                        <a:ext uri="{28A0092B-C50C-407E-A947-70E740481C1C}">
+                          <a14:useLocalDpi xmlns:a14="http://schemas.microsoft.com/office/drawing/2010/main" val="0"/>
+                        </a:ext>
+                      </a:extLst>
+                    </a:blip>
+                    <a:stretch>
+                      <a:fillRect/>
+                    </a:stretch>
+                  </pic:blipFill>
+                  <pic:spPr>
+                    <a:xfrm>
+                      <a:off x="0" y="0"/>
+                      <a:ext cx="1162050" cy="238125"/>
+                    </a:xfrm>
+                    <a:prstGeom prst="rect">
+                      <a:avLst/>
+                    </a:prstGeom>
+                  </pic:spPr>
+                </pic:pic>
+              </a:graphicData>
+            </a:graphic>
+          </wp:anchor>
+        </w:drawing>
+      </w:r>
+      <w:r>
+        <w:rPr>
           <w:rFonts w:ascii="Trebuchet MS" w:hAnsi="Trebuchet MS"/>
           <w:sz w:val="24"/>
           <w:szCs w:val="24"/>
@@ -3671,6 +3833,60 @@
       </w:pPr>
       <w:r>
         <w:rPr>
+          <w:noProof/>
+        </w:rPr>
+        <w:drawing>
+          <wp:anchor distT="0" distB="0" distL="114300" distR="114300" simplePos="0" relativeHeight="251696128" behindDoc="0" locked="0" layoutInCell="1" allowOverlap="1" wp14:anchorId="5104556A" wp14:editId="742CA2EC">
+            <wp:simplePos x="0" y="0"/>
+            <wp:positionH relativeFrom="margin">
+              <wp:align>center</wp:align>
+            </wp:positionH>
+            <wp:positionV relativeFrom="paragraph">
+              <wp:posOffset>873125</wp:posOffset>
+            </wp:positionV>
+            <wp:extent cx="2838450" cy="209550"/>
+            <wp:effectExtent l="0" t="0" r="0" b="0"/>
+            <wp:wrapTopAndBottom/>
+            <wp:docPr id="887610539" name="Picture 1"/>
+            <wp:cNvGraphicFramePr>
+              <a:graphicFrameLocks xmlns:a="http://schemas.openxmlformats.org/drawingml/2006/main" noChangeAspect="1"/>
+            </wp:cNvGraphicFramePr>
+            <a:graphic xmlns:a="http://schemas.openxmlformats.org/drawingml/2006/main">
+              <a:graphicData uri="http://schemas.openxmlformats.org/drawingml/2006/picture">
+                <pic:pic xmlns:pic="http://schemas.openxmlformats.org/drawingml/2006/picture">
+                  <pic:nvPicPr>
+                    <pic:cNvPr id="887610539" name=""/>
+                    <pic:cNvPicPr/>
+                  </pic:nvPicPr>
+                  <pic:blipFill>
+                    <a:blip r:embed="rId41">
+                      <a:extLst>
+                        <a:ext uri="{28A0092B-C50C-407E-A947-70E740481C1C}">
+                          <a14:useLocalDpi xmlns:a14="http://schemas.microsoft.com/office/drawing/2010/main" val="0"/>
+                        </a:ext>
+                      </a:extLst>
+                    </a:blip>
+                    <a:stretch>
+                      <a:fillRect/>
+                    </a:stretch>
+                  </pic:blipFill>
+                  <pic:spPr>
+                    <a:xfrm>
+                      <a:off x="0" y="0"/>
+                      <a:ext cx="2838450" cy="209550"/>
+                    </a:xfrm>
+                    <a:prstGeom prst="rect">
+                      <a:avLst/>
+                    </a:prstGeom>
+                  </pic:spPr>
+                </pic:pic>
+              </a:graphicData>
+            </a:graphic>
+          </wp:anchor>
+        </w:drawing>
+      </w:r>
+      <w:r>
+        <w:rPr>
           <w:rFonts w:ascii="Trebuchet MS" w:hAnsi="Trebuchet MS"/>
           <w:sz w:val="24"/>
           <w:szCs w:val="24"/>
@@ -3703,6 +3919,34 @@
           <w:sz w:val="24"/>
           <w:szCs w:val="24"/>
         </w:rPr>
+        <w:t>I will update my poi entity to include a separate ID. This is because currently room automatically designates IDs to the pois which have been added, so to match the web pois IDs, a new id field should be added to prevent IDs from being mistakenly rewritten.</w:t>
+      </w:r>
+    </w:p>
+    <w:p>
+      <w:pPr>
+        <w:ind w:left="720"/>
+        <w:rPr>
+          <w:rFonts w:ascii="Trebuchet MS" w:hAnsi="Trebuchet MS"/>
+          <w:sz w:val="24"/>
+          <w:szCs w:val="24"/>
+        </w:rPr>
+      </w:pPr>
+    </w:p>
+    <w:p>
+      <w:pPr>
+        <w:ind w:left="720"/>
+        <w:rPr>
+          <w:rFonts w:ascii="Trebuchet MS" w:hAnsi="Trebuchet MS"/>
+          <w:sz w:val="24"/>
+          <w:szCs w:val="24"/>
+        </w:rPr>
+      </w:pPr>
+      <w:r>
+        <w:rPr>
+          <w:rFonts w:ascii="Trebuchet MS" w:hAnsi="Trebuchet MS"/>
+          <w:sz w:val="24"/>
+          <w:szCs w:val="24"/>
+        </w:rPr>
         <w:t xml:space="preserve">I will then create a new data class for the pois coming from the web. </w:t>
       </w:r>
       <w:r>
@@ -3711,7 +3955,52 @@
           <w:sz w:val="24"/>
           <w:szCs w:val="24"/>
         </w:rPr>
-        <w:t>This will be a separate class to my poi entity class. GSON will parse the JSON from the web into this new data class’s objects which will then be converted into my Poi entity to then be saved on the local database.</w:t>
+        <w:t>This will be a separate class to my poi entity class</w:t>
+      </w:r>
+      <w:r>
+        <w:rPr>
+          <w:rFonts w:ascii="Trebuchet MS" w:hAnsi="Trebuchet MS"/>
+          <w:sz w:val="24"/>
+          <w:szCs w:val="24"/>
+        </w:rPr>
+        <w:t xml:space="preserve"> as they both currently have different feilds</w:t>
+      </w:r>
+      <w:r>
+        <w:rPr>
+          <w:rFonts w:ascii="Trebuchet MS" w:hAnsi="Trebuchet MS"/>
+          <w:sz w:val="24"/>
+          <w:szCs w:val="24"/>
+        </w:rPr>
+        <w:t>. GSON will parse the JSON from the web into this new data class’s objects which will then be converted into my Poi entity to then be saved on the local database.</w:t>
+      </w:r>
+    </w:p>
+    <w:p>
+      <w:pPr>
+        <w:ind w:left="720"/>
+        <w:rPr>
+          <w:rFonts w:ascii="Trebuchet MS" w:hAnsi="Trebuchet MS"/>
+          <w:sz w:val="24"/>
+          <w:szCs w:val="24"/>
+        </w:rPr>
+      </w:pPr>
+    </w:p>
+    <w:p>
+      <w:pPr>
+        <w:ind w:left="720"/>
+        <w:rPr>
+          <w:rFonts w:ascii="Trebuchet MS" w:hAnsi="Trebuchet MS"/>
+          <w:sz w:val="24"/>
+          <w:szCs w:val="24"/>
+        </w:rPr>
+      </w:pPr>
+      <w:r>
+        <w:rPr>
+          <w:rFonts w:ascii="Trebuchet MS" w:hAnsi="Trebuchet MS"/>
+          <w:sz w:val="24"/>
+          <w:szCs w:val="24"/>
+        </w:rPr>
+        <w:lastRenderedPageBreak/>
+        <w:t>I will also then need to add a new DAO method which will be used for duplicate checking. This will gather all the secondary IDs to be used for comparison.</w:t>
       </w:r>
     </w:p>
     <w:p>

</xml_diff>

<commit_message>
Added code snippets to report
</commit_message>
<xml_diff>
--- a/MAD_Report.docx
+++ b/MAD_Report.docx
@@ -373,7 +373,73 @@
           <w:sz w:val="24"/>
           <w:szCs w:val="24"/>
         </w:rPr>
-        <w:t>I will first start with this task by setting up the dependencies in my build.gradle and libs.versions.toml files. I will add MapLibre with Vulkan support, the Ramani Maps Compose wrapper, and the standard AndroidX libraries needed for Compose.</w:t>
+        <w:t xml:space="preserve">I will first start with this task by setting up the dependencies in my </w:t>
+      </w:r>
+      <w:proofErr w:type="spellStart"/>
+      <w:proofErr w:type="gramStart"/>
+      <w:r>
+        <w:rPr>
+          <w:rFonts w:ascii="Trebuchet MS" w:eastAsia="Trebuchet MS" w:hAnsi="Trebuchet MS" w:cs="Trebuchet MS"/>
+          <w:sz w:val="24"/>
+          <w:szCs w:val="24"/>
+        </w:rPr>
+        <w:t>build.gradle</w:t>
+      </w:r>
+      <w:proofErr w:type="spellEnd"/>
+      <w:proofErr w:type="gramEnd"/>
+      <w:r>
+        <w:rPr>
+          <w:rFonts w:ascii="Trebuchet MS" w:eastAsia="Trebuchet MS" w:hAnsi="Trebuchet MS" w:cs="Trebuchet MS"/>
+          <w:sz w:val="24"/>
+          <w:szCs w:val="24"/>
+        </w:rPr>
+        <w:t xml:space="preserve"> and </w:t>
+      </w:r>
+      <w:proofErr w:type="spellStart"/>
+      <w:proofErr w:type="gramStart"/>
+      <w:r>
+        <w:rPr>
+          <w:rFonts w:ascii="Trebuchet MS" w:eastAsia="Trebuchet MS" w:hAnsi="Trebuchet MS" w:cs="Trebuchet MS"/>
+          <w:sz w:val="24"/>
+          <w:szCs w:val="24"/>
+        </w:rPr>
+        <w:t>libs.versions</w:t>
+      </w:r>
+      <w:proofErr w:type="gramEnd"/>
+      <w:r>
+        <w:rPr>
+          <w:rFonts w:ascii="Trebuchet MS" w:eastAsia="Trebuchet MS" w:hAnsi="Trebuchet MS" w:cs="Trebuchet MS"/>
+          <w:sz w:val="24"/>
+          <w:szCs w:val="24"/>
+        </w:rPr>
+        <w:t>.toml</w:t>
+      </w:r>
+      <w:proofErr w:type="spellEnd"/>
+      <w:r>
+        <w:rPr>
+          <w:rFonts w:ascii="Trebuchet MS" w:eastAsia="Trebuchet MS" w:hAnsi="Trebuchet MS" w:cs="Trebuchet MS"/>
+          <w:sz w:val="24"/>
+          <w:szCs w:val="24"/>
+        </w:rPr>
+        <w:t xml:space="preserve"> files. I will add </w:t>
+      </w:r>
+      <w:proofErr w:type="spellStart"/>
+      <w:r>
+        <w:rPr>
+          <w:rFonts w:ascii="Trebuchet MS" w:eastAsia="Trebuchet MS" w:hAnsi="Trebuchet MS" w:cs="Trebuchet MS"/>
+          <w:sz w:val="24"/>
+          <w:szCs w:val="24"/>
+        </w:rPr>
+        <w:t>MapLibre</w:t>
+      </w:r>
+      <w:proofErr w:type="spellEnd"/>
+      <w:r>
+        <w:rPr>
+          <w:rFonts w:ascii="Trebuchet MS" w:eastAsia="Trebuchet MS" w:hAnsi="Trebuchet MS" w:cs="Trebuchet MS"/>
+          <w:sz w:val="24"/>
+          <w:szCs w:val="24"/>
+        </w:rPr>
+        <w:t xml:space="preserve"> with Vulkan support, the Ramani Maps Compose wrapper, and the standard AndroidX libraries needed for Compose.</w:t>
       </w:r>
       <w:r>
         <w:rPr>
@@ -506,7 +572,25 @@
           <w:sz w:val="24"/>
           <w:szCs w:val="24"/>
         </w:rPr>
-        <w:t>Then in the AndroidManifest.xml, I will set up the ACCESS_FINE_LOCATION and ACCESS_COARSE_LOCATION permissions, as well as INTERNET, since the map tiles will be gathered remotely from OpenFreeMap.</w:t>
+        <w:t xml:space="preserve">Then in the AndroidManifest.xml, I will set up the ACCESS_FINE_LOCATION and ACCESS_COARSE_LOCATION permissions, as well as INTERNET, since the map tiles will be gathered remotely from </w:t>
+      </w:r>
+      <w:proofErr w:type="spellStart"/>
+      <w:r>
+        <w:rPr>
+          <w:rFonts w:ascii="Trebuchet MS" w:eastAsia="Trebuchet MS" w:hAnsi="Trebuchet MS" w:cs="Trebuchet MS"/>
+          <w:sz w:val="24"/>
+          <w:szCs w:val="24"/>
+        </w:rPr>
+        <w:t>OpenFreeMap</w:t>
+      </w:r>
+      <w:proofErr w:type="spellEnd"/>
+      <w:r>
+        <w:rPr>
+          <w:rFonts w:ascii="Trebuchet MS" w:eastAsia="Trebuchet MS" w:hAnsi="Trebuchet MS" w:cs="Trebuchet MS"/>
+          <w:sz w:val="24"/>
+          <w:szCs w:val="24"/>
+        </w:rPr>
+        <w:t>.</w:t>
       </w:r>
       <w:r>
         <w:rPr>
@@ -652,7 +736,61 @@
           <w:sz w:val="24"/>
           <w:szCs w:val="24"/>
         </w:rPr>
-        <w:t xml:space="preserve">To manage the location state in both the activity and UI, I will need to add a LatLngViewModel class that will hold a latLng property backed by a MutableLiveData object. </w:t>
+        <w:t xml:space="preserve">To manage the location state in both the activity and UI, I will need to add a </w:t>
+      </w:r>
+      <w:proofErr w:type="spellStart"/>
+      <w:r>
+        <w:rPr>
+          <w:rFonts w:ascii="Trebuchet MS" w:eastAsia="Trebuchet MS" w:hAnsi="Trebuchet MS" w:cs="Trebuchet MS"/>
+          <w:sz w:val="24"/>
+          <w:szCs w:val="24"/>
+        </w:rPr>
+        <w:t>LatLngViewModel</w:t>
+      </w:r>
+      <w:proofErr w:type="spellEnd"/>
+      <w:r>
+        <w:rPr>
+          <w:rFonts w:ascii="Trebuchet MS" w:eastAsia="Trebuchet MS" w:hAnsi="Trebuchet MS" w:cs="Trebuchet MS"/>
+          <w:sz w:val="24"/>
+          <w:szCs w:val="24"/>
+        </w:rPr>
+        <w:t xml:space="preserve"> class that will hold a </w:t>
+      </w:r>
+      <w:proofErr w:type="spellStart"/>
+      <w:r>
+        <w:rPr>
+          <w:rFonts w:ascii="Trebuchet MS" w:eastAsia="Trebuchet MS" w:hAnsi="Trebuchet MS" w:cs="Trebuchet MS"/>
+          <w:sz w:val="24"/>
+          <w:szCs w:val="24"/>
+        </w:rPr>
+        <w:t>latLng</w:t>
+      </w:r>
+      <w:proofErr w:type="spellEnd"/>
+      <w:r>
+        <w:rPr>
+          <w:rFonts w:ascii="Trebuchet MS" w:eastAsia="Trebuchet MS" w:hAnsi="Trebuchet MS" w:cs="Trebuchet MS"/>
+          <w:sz w:val="24"/>
+          <w:szCs w:val="24"/>
+        </w:rPr>
+        <w:t xml:space="preserve"> property backed by a </w:t>
+      </w:r>
+      <w:proofErr w:type="spellStart"/>
+      <w:r>
+        <w:rPr>
+          <w:rFonts w:ascii="Trebuchet MS" w:eastAsia="Trebuchet MS" w:hAnsi="Trebuchet MS" w:cs="Trebuchet MS"/>
+          <w:sz w:val="24"/>
+          <w:szCs w:val="24"/>
+        </w:rPr>
+        <w:t>MutableLiveData</w:t>
+      </w:r>
+      <w:proofErr w:type="spellEnd"/>
+      <w:r>
+        <w:rPr>
+          <w:rFonts w:ascii="Trebuchet MS" w:eastAsia="Trebuchet MS" w:hAnsi="Trebuchet MS" w:cs="Trebuchet MS"/>
+          <w:sz w:val="24"/>
+          <w:szCs w:val="24"/>
+        </w:rPr>
+        <w:t xml:space="preserve"> object. </w:t>
       </w:r>
     </w:p>
     <w:p>
@@ -679,7 +817,43 @@
           <w:szCs w:val="24"/>
         </w:rPr>
         <w:lastRenderedPageBreak/>
-        <w:t xml:space="preserve">Whenever the latLng is updated, i.e. the user's location changes, it should automatically push the new value to latLngLiveData, making it observable from the UI layer.  </w:t>
+        <w:t xml:space="preserve">Whenever the </w:t>
+      </w:r>
+      <w:proofErr w:type="spellStart"/>
+      <w:r>
+        <w:rPr>
+          <w:rFonts w:ascii="Trebuchet MS" w:eastAsia="Trebuchet MS" w:hAnsi="Trebuchet MS" w:cs="Trebuchet MS"/>
+          <w:sz w:val="24"/>
+          <w:szCs w:val="24"/>
+        </w:rPr>
+        <w:t>latLng</w:t>
+      </w:r>
+      <w:proofErr w:type="spellEnd"/>
+      <w:r>
+        <w:rPr>
+          <w:rFonts w:ascii="Trebuchet MS" w:eastAsia="Trebuchet MS" w:hAnsi="Trebuchet MS" w:cs="Trebuchet MS"/>
+          <w:sz w:val="24"/>
+          <w:szCs w:val="24"/>
+        </w:rPr>
+        <w:t xml:space="preserve"> is updated, i.e. the user's location changes, it should automatically push the new value to </w:t>
+      </w:r>
+      <w:proofErr w:type="spellStart"/>
+      <w:r>
+        <w:rPr>
+          <w:rFonts w:ascii="Trebuchet MS" w:eastAsia="Trebuchet MS" w:hAnsi="Trebuchet MS" w:cs="Trebuchet MS"/>
+          <w:sz w:val="24"/>
+          <w:szCs w:val="24"/>
+        </w:rPr>
+        <w:t>latLngLiveData</w:t>
+      </w:r>
+      <w:proofErr w:type="spellEnd"/>
+      <w:r>
+        <w:rPr>
+          <w:rFonts w:ascii="Trebuchet MS" w:eastAsia="Trebuchet MS" w:hAnsi="Trebuchet MS" w:cs="Trebuchet MS"/>
+          <w:sz w:val="24"/>
+          <w:szCs w:val="24"/>
+        </w:rPr>
+        <w:t xml:space="preserve">, making it observable from the UI layer.  </w:t>
       </w:r>
     </w:p>
     <w:p>
@@ -771,7 +945,97 @@
           <w:sz w:val="24"/>
           <w:szCs w:val="24"/>
         </w:rPr>
-        <w:t>In the MainActivity, I will add the LocationListener interface. This will allow me to override the onLocationChanged function, where I will update the ViewModel's latLng with the current coordinates gathered by the device itself.</w:t>
+        <w:t xml:space="preserve">In the </w:t>
+      </w:r>
+      <w:proofErr w:type="spellStart"/>
+      <w:r>
+        <w:rPr>
+          <w:rFonts w:ascii="Trebuchet MS" w:eastAsia="Trebuchet MS" w:hAnsi="Trebuchet MS" w:cs="Trebuchet MS"/>
+          <w:sz w:val="24"/>
+          <w:szCs w:val="24"/>
+        </w:rPr>
+        <w:t>MainActivity</w:t>
+      </w:r>
+      <w:proofErr w:type="spellEnd"/>
+      <w:r>
+        <w:rPr>
+          <w:rFonts w:ascii="Trebuchet MS" w:eastAsia="Trebuchet MS" w:hAnsi="Trebuchet MS" w:cs="Trebuchet MS"/>
+          <w:sz w:val="24"/>
+          <w:szCs w:val="24"/>
+        </w:rPr>
+        <w:t xml:space="preserve">, I will add the </w:t>
+      </w:r>
+      <w:proofErr w:type="spellStart"/>
+      <w:r>
+        <w:rPr>
+          <w:rFonts w:ascii="Trebuchet MS" w:eastAsia="Trebuchet MS" w:hAnsi="Trebuchet MS" w:cs="Trebuchet MS"/>
+          <w:sz w:val="24"/>
+          <w:szCs w:val="24"/>
+        </w:rPr>
+        <w:t>LocationListener</w:t>
+      </w:r>
+      <w:proofErr w:type="spellEnd"/>
+      <w:r>
+        <w:rPr>
+          <w:rFonts w:ascii="Trebuchet MS" w:eastAsia="Trebuchet MS" w:hAnsi="Trebuchet MS" w:cs="Trebuchet MS"/>
+          <w:sz w:val="24"/>
+          <w:szCs w:val="24"/>
+        </w:rPr>
+        <w:t xml:space="preserve"> interface. This will allow me to override the </w:t>
+      </w:r>
+      <w:proofErr w:type="spellStart"/>
+      <w:r>
+        <w:rPr>
+          <w:rFonts w:ascii="Trebuchet MS" w:eastAsia="Trebuchet MS" w:hAnsi="Trebuchet MS" w:cs="Trebuchet MS"/>
+          <w:sz w:val="24"/>
+          <w:szCs w:val="24"/>
+        </w:rPr>
+        <w:t>onLocationChanged</w:t>
+      </w:r>
+      <w:proofErr w:type="spellEnd"/>
+      <w:r>
+        <w:rPr>
+          <w:rFonts w:ascii="Trebuchet MS" w:eastAsia="Trebuchet MS" w:hAnsi="Trebuchet MS" w:cs="Trebuchet MS"/>
+          <w:sz w:val="24"/>
+          <w:szCs w:val="24"/>
+        </w:rPr>
+        <w:t xml:space="preserve"> function, where I will update the </w:t>
+      </w:r>
+      <w:proofErr w:type="spellStart"/>
+      <w:r>
+        <w:rPr>
+          <w:rFonts w:ascii="Trebuchet MS" w:eastAsia="Trebuchet MS" w:hAnsi="Trebuchet MS" w:cs="Trebuchet MS"/>
+          <w:sz w:val="24"/>
+          <w:szCs w:val="24"/>
+        </w:rPr>
+        <w:t>ViewModel's</w:t>
+      </w:r>
+      <w:proofErr w:type="spellEnd"/>
+      <w:r>
+        <w:rPr>
+          <w:rFonts w:ascii="Trebuchet MS" w:eastAsia="Trebuchet MS" w:hAnsi="Trebuchet MS" w:cs="Trebuchet MS"/>
+          <w:sz w:val="24"/>
+          <w:szCs w:val="24"/>
+        </w:rPr>
+        <w:t xml:space="preserve"> </w:t>
+      </w:r>
+      <w:proofErr w:type="spellStart"/>
+      <w:r>
+        <w:rPr>
+          <w:rFonts w:ascii="Trebuchet MS" w:eastAsia="Trebuchet MS" w:hAnsi="Trebuchet MS" w:cs="Trebuchet MS"/>
+          <w:sz w:val="24"/>
+          <w:szCs w:val="24"/>
+        </w:rPr>
+        <w:t>latLng</w:t>
+      </w:r>
+      <w:proofErr w:type="spellEnd"/>
+      <w:r>
+        <w:rPr>
+          <w:rFonts w:ascii="Trebuchet MS" w:eastAsia="Trebuchet MS" w:hAnsi="Trebuchet MS" w:cs="Trebuchet MS"/>
+          <w:sz w:val="24"/>
+          <w:szCs w:val="24"/>
+        </w:rPr>
+        <w:t xml:space="preserve"> with the current coordinates gathered by the device itself.</w:t>
       </w:r>
       <w:r>
         <w:rPr>
@@ -911,7 +1175,61 @@
           <w:sz w:val="24"/>
           <w:szCs w:val="24"/>
         </w:rPr>
-        <w:t>To start receiving GPS updates, I will create a GPS function that will retrieve the LocationManager system service and call requestLocationUpdates, which I will set to update every 2 seconds or after 5 metres of movement. This will keep the GPS accurate without slowing the machine down too much.</w:t>
+        <w:t xml:space="preserve">To start receiving GPS updates, I will create a GPS function that will retrieve the </w:t>
+      </w:r>
+      <w:proofErr w:type="spellStart"/>
+      <w:r>
+        <w:rPr>
+          <w:rFonts w:ascii="Trebuchet MS" w:eastAsia="Trebuchet MS" w:hAnsi="Trebuchet MS" w:cs="Trebuchet MS"/>
+          <w:sz w:val="24"/>
+          <w:szCs w:val="24"/>
+        </w:rPr>
+        <w:t>LocationManager</w:t>
+      </w:r>
+      <w:proofErr w:type="spellEnd"/>
+      <w:r>
+        <w:rPr>
+          <w:rFonts w:ascii="Trebuchet MS" w:eastAsia="Trebuchet MS" w:hAnsi="Trebuchet MS" w:cs="Trebuchet MS"/>
+          <w:sz w:val="24"/>
+          <w:szCs w:val="24"/>
+        </w:rPr>
+        <w:t xml:space="preserve"> system service and call </w:t>
+      </w:r>
+      <w:proofErr w:type="spellStart"/>
+      <w:r>
+        <w:rPr>
+          <w:rFonts w:ascii="Trebuchet MS" w:eastAsia="Trebuchet MS" w:hAnsi="Trebuchet MS" w:cs="Trebuchet MS"/>
+          <w:sz w:val="24"/>
+          <w:szCs w:val="24"/>
+        </w:rPr>
+        <w:t>requestLocationUpdates</w:t>
+      </w:r>
+      <w:proofErr w:type="spellEnd"/>
+      <w:r>
+        <w:rPr>
+          <w:rFonts w:ascii="Trebuchet MS" w:eastAsia="Trebuchet MS" w:hAnsi="Trebuchet MS" w:cs="Trebuchet MS"/>
+          <w:sz w:val="24"/>
+          <w:szCs w:val="24"/>
+        </w:rPr>
+        <w:t xml:space="preserve">, which I will set to update every 2 seconds or after 5 </w:t>
+      </w:r>
+      <w:proofErr w:type="spellStart"/>
+      <w:r>
+        <w:rPr>
+          <w:rFonts w:ascii="Trebuchet MS" w:eastAsia="Trebuchet MS" w:hAnsi="Trebuchet MS" w:cs="Trebuchet MS"/>
+          <w:sz w:val="24"/>
+          <w:szCs w:val="24"/>
+        </w:rPr>
+        <w:t>metres</w:t>
+      </w:r>
+      <w:proofErr w:type="spellEnd"/>
+      <w:r>
+        <w:rPr>
+          <w:rFonts w:ascii="Trebuchet MS" w:eastAsia="Trebuchet MS" w:hAnsi="Trebuchet MS" w:cs="Trebuchet MS"/>
+          <w:sz w:val="24"/>
+          <w:szCs w:val="24"/>
+        </w:rPr>
+        <w:t xml:space="preserve"> of movement. This will keep the GPS accurate without slowing the machine down too much.</w:t>
       </w:r>
       <w:r>
         <w:rPr>
@@ -1034,7 +1352,35 @@
           <w:sz w:val="24"/>
           <w:szCs w:val="24"/>
         </w:rPr>
-        <w:t>I will also write a checkPermissions function that will check whether the location permission has already been granted. If they haven’t, then it will launch a permission request. This will make sure that the GPS function is only called if the user approves the use of their location. A Toast message was shown if they denied it.</w:t>
+        <w:t xml:space="preserve">I will also write a </w:t>
+      </w:r>
+      <w:proofErr w:type="spellStart"/>
+      <w:proofErr w:type="gramStart"/>
+      <w:r>
+        <w:rPr>
+          <w:rFonts w:ascii="Trebuchet MS" w:eastAsia="Trebuchet MS" w:hAnsi="Trebuchet MS" w:cs="Trebuchet MS"/>
+          <w:sz w:val="24"/>
+          <w:szCs w:val="24"/>
+        </w:rPr>
+        <w:t>checkPermissions</w:t>
+      </w:r>
+      <w:proofErr w:type="spellEnd"/>
+      <w:r>
+        <w:rPr>
+          <w:rFonts w:ascii="Trebuchet MS" w:eastAsia="Trebuchet MS" w:hAnsi="Trebuchet MS" w:cs="Trebuchet MS"/>
+          <w:sz w:val="24"/>
+          <w:szCs w:val="24"/>
+        </w:rPr>
+        <w:t xml:space="preserve"> function</w:t>
+      </w:r>
+      <w:proofErr w:type="gramEnd"/>
+      <w:r>
+        <w:rPr>
+          <w:rFonts w:ascii="Trebuchet MS" w:eastAsia="Trebuchet MS" w:hAnsi="Trebuchet MS" w:cs="Trebuchet MS"/>
+          <w:sz w:val="24"/>
+          <w:szCs w:val="24"/>
+        </w:rPr>
+        <w:t xml:space="preserve"> that will check whether the location permission has already been granted. If they haven’t, then it will launch a permission request. This will make sure that the GPS function is only called if the user approves the use of their location. A Toast message was shown if they denied it.</w:t>
       </w:r>
     </w:p>
     <w:p>
@@ -1165,7 +1511,187 @@
           <w:sz w:val="24"/>
           <w:szCs w:val="24"/>
         </w:rPr>
-        <w:t>Inside the setContent itself, I will use a mutablestate variable to hold the current LatLng and zoom level, observed the ViewModel's LiveData to keep that state updated, and pass the values into a MapLibre composable via a CameraPosition, causing the map to recentre automatically whenever the user's location changed. This was all placed inside a Scaffold with innerpadding to prevent any overlap of the devices interfaces with the application itself.</w:t>
+        <w:t xml:space="preserve">Inside the </w:t>
+      </w:r>
+      <w:proofErr w:type="spellStart"/>
+      <w:r>
+        <w:rPr>
+          <w:rFonts w:ascii="Trebuchet MS" w:eastAsia="Trebuchet MS" w:hAnsi="Trebuchet MS" w:cs="Trebuchet MS"/>
+          <w:sz w:val="24"/>
+          <w:szCs w:val="24"/>
+        </w:rPr>
+        <w:t>setContent</w:t>
+      </w:r>
+      <w:proofErr w:type="spellEnd"/>
+      <w:r>
+        <w:rPr>
+          <w:rFonts w:ascii="Trebuchet MS" w:eastAsia="Trebuchet MS" w:hAnsi="Trebuchet MS" w:cs="Trebuchet MS"/>
+          <w:sz w:val="24"/>
+          <w:szCs w:val="24"/>
+        </w:rPr>
+        <w:t xml:space="preserve"> itself, I will use a </w:t>
+      </w:r>
+      <w:proofErr w:type="spellStart"/>
+      <w:r>
+        <w:rPr>
+          <w:rFonts w:ascii="Trebuchet MS" w:eastAsia="Trebuchet MS" w:hAnsi="Trebuchet MS" w:cs="Trebuchet MS"/>
+          <w:sz w:val="24"/>
+          <w:szCs w:val="24"/>
+        </w:rPr>
+        <w:t>mutablestate</w:t>
+      </w:r>
+      <w:proofErr w:type="spellEnd"/>
+      <w:r>
+        <w:rPr>
+          <w:rFonts w:ascii="Trebuchet MS" w:eastAsia="Trebuchet MS" w:hAnsi="Trebuchet MS" w:cs="Trebuchet MS"/>
+          <w:sz w:val="24"/>
+          <w:szCs w:val="24"/>
+        </w:rPr>
+        <w:t xml:space="preserve"> variable to hold the current </w:t>
+      </w:r>
+      <w:proofErr w:type="spellStart"/>
+      <w:r>
+        <w:rPr>
+          <w:rFonts w:ascii="Trebuchet MS" w:eastAsia="Trebuchet MS" w:hAnsi="Trebuchet MS" w:cs="Trebuchet MS"/>
+          <w:sz w:val="24"/>
+          <w:szCs w:val="24"/>
+        </w:rPr>
+        <w:t>LatLng</w:t>
+      </w:r>
+      <w:proofErr w:type="spellEnd"/>
+      <w:r>
+        <w:rPr>
+          <w:rFonts w:ascii="Trebuchet MS" w:eastAsia="Trebuchet MS" w:hAnsi="Trebuchet MS" w:cs="Trebuchet MS"/>
+          <w:sz w:val="24"/>
+          <w:szCs w:val="24"/>
+        </w:rPr>
+        <w:t xml:space="preserve"> and zoom level, observed the </w:t>
+      </w:r>
+      <w:proofErr w:type="spellStart"/>
+      <w:r>
+        <w:rPr>
+          <w:rFonts w:ascii="Trebuchet MS" w:eastAsia="Trebuchet MS" w:hAnsi="Trebuchet MS" w:cs="Trebuchet MS"/>
+          <w:sz w:val="24"/>
+          <w:szCs w:val="24"/>
+        </w:rPr>
+        <w:t>ViewModel's</w:t>
+      </w:r>
+      <w:proofErr w:type="spellEnd"/>
+      <w:r>
+        <w:rPr>
+          <w:rFonts w:ascii="Trebuchet MS" w:eastAsia="Trebuchet MS" w:hAnsi="Trebuchet MS" w:cs="Trebuchet MS"/>
+          <w:sz w:val="24"/>
+          <w:szCs w:val="24"/>
+        </w:rPr>
+        <w:t xml:space="preserve"> </w:t>
+      </w:r>
+      <w:proofErr w:type="spellStart"/>
+      <w:r>
+        <w:rPr>
+          <w:rFonts w:ascii="Trebuchet MS" w:eastAsia="Trebuchet MS" w:hAnsi="Trebuchet MS" w:cs="Trebuchet MS"/>
+          <w:sz w:val="24"/>
+          <w:szCs w:val="24"/>
+        </w:rPr>
+        <w:t>LiveData</w:t>
+      </w:r>
+      <w:proofErr w:type="spellEnd"/>
+      <w:r>
+        <w:rPr>
+          <w:rFonts w:ascii="Trebuchet MS" w:eastAsia="Trebuchet MS" w:hAnsi="Trebuchet MS" w:cs="Trebuchet MS"/>
+          <w:sz w:val="24"/>
+          <w:szCs w:val="24"/>
+        </w:rPr>
+        <w:t xml:space="preserve"> to keep that state updated, and pass the values into a </w:t>
+      </w:r>
+      <w:proofErr w:type="spellStart"/>
+      <w:r>
+        <w:rPr>
+          <w:rFonts w:ascii="Trebuchet MS" w:eastAsia="Trebuchet MS" w:hAnsi="Trebuchet MS" w:cs="Trebuchet MS"/>
+          <w:sz w:val="24"/>
+          <w:szCs w:val="24"/>
+        </w:rPr>
+        <w:t>MapLibre</w:t>
+      </w:r>
+      <w:proofErr w:type="spellEnd"/>
+      <w:r>
+        <w:rPr>
+          <w:rFonts w:ascii="Trebuchet MS" w:eastAsia="Trebuchet MS" w:hAnsi="Trebuchet MS" w:cs="Trebuchet MS"/>
+          <w:sz w:val="24"/>
+          <w:szCs w:val="24"/>
+        </w:rPr>
+        <w:t xml:space="preserve"> composable via a </w:t>
+      </w:r>
+      <w:proofErr w:type="spellStart"/>
+      <w:r>
+        <w:rPr>
+          <w:rFonts w:ascii="Trebuchet MS" w:eastAsia="Trebuchet MS" w:hAnsi="Trebuchet MS" w:cs="Trebuchet MS"/>
+          <w:sz w:val="24"/>
+          <w:szCs w:val="24"/>
+        </w:rPr>
+        <w:t>CameraPosition</w:t>
+      </w:r>
+      <w:proofErr w:type="spellEnd"/>
+      <w:r>
+        <w:rPr>
+          <w:rFonts w:ascii="Trebuchet MS" w:eastAsia="Trebuchet MS" w:hAnsi="Trebuchet MS" w:cs="Trebuchet MS"/>
+          <w:sz w:val="24"/>
+          <w:szCs w:val="24"/>
+        </w:rPr>
+        <w:t xml:space="preserve">, causing the map to </w:t>
+      </w:r>
+      <w:proofErr w:type="spellStart"/>
+      <w:r>
+        <w:rPr>
+          <w:rFonts w:ascii="Trebuchet MS" w:eastAsia="Trebuchet MS" w:hAnsi="Trebuchet MS" w:cs="Trebuchet MS"/>
+          <w:sz w:val="24"/>
+          <w:szCs w:val="24"/>
+        </w:rPr>
+        <w:t>recentre</w:t>
+      </w:r>
+      <w:proofErr w:type="spellEnd"/>
+      <w:r>
+        <w:rPr>
+          <w:rFonts w:ascii="Trebuchet MS" w:eastAsia="Trebuchet MS" w:hAnsi="Trebuchet MS" w:cs="Trebuchet MS"/>
+          <w:sz w:val="24"/>
+          <w:szCs w:val="24"/>
+        </w:rPr>
+        <w:t xml:space="preserve"> automatically whenever the user's location changed. This was all placed inside a Scaffold with </w:t>
+      </w:r>
+      <w:proofErr w:type="spellStart"/>
+      <w:r>
+        <w:rPr>
+          <w:rFonts w:ascii="Trebuchet MS" w:eastAsia="Trebuchet MS" w:hAnsi="Trebuchet MS" w:cs="Trebuchet MS"/>
+          <w:sz w:val="24"/>
+          <w:szCs w:val="24"/>
+        </w:rPr>
+        <w:t>innerpadding</w:t>
+      </w:r>
+      <w:proofErr w:type="spellEnd"/>
+      <w:r>
+        <w:rPr>
+          <w:rFonts w:ascii="Trebuchet MS" w:eastAsia="Trebuchet MS" w:hAnsi="Trebuchet MS" w:cs="Trebuchet MS"/>
+          <w:sz w:val="24"/>
+          <w:szCs w:val="24"/>
+        </w:rPr>
+        <w:t xml:space="preserve"> to prevent any overlap of the </w:t>
+      </w:r>
+      <w:proofErr w:type="gramStart"/>
+      <w:r>
+        <w:rPr>
+          <w:rFonts w:ascii="Trebuchet MS" w:eastAsia="Trebuchet MS" w:hAnsi="Trebuchet MS" w:cs="Trebuchet MS"/>
+          <w:sz w:val="24"/>
+          <w:szCs w:val="24"/>
+        </w:rPr>
+        <w:t>devices</w:t>
+      </w:r>
+      <w:proofErr w:type="gramEnd"/>
+      <w:r>
+        <w:rPr>
+          <w:rFonts w:ascii="Trebuchet MS" w:eastAsia="Trebuchet MS" w:hAnsi="Trebuchet MS" w:cs="Trebuchet MS"/>
+          <w:sz w:val="24"/>
+          <w:szCs w:val="24"/>
+        </w:rPr>
+        <w:t xml:space="preserve"> interfaces with the application itself.</w:t>
       </w:r>
     </w:p>
     <w:p>
@@ -1265,7 +1791,29 @@
           <w:sz w:val="24"/>
           <w:szCs w:val="24"/>
         </w:rPr>
-        <w:t>- type (pub, restaurant, hotel, historical site, etc);</w:t>
+        <w:t xml:space="preserve">- type (pub, restaurant, hotel, historical site, </w:t>
+      </w:r>
+      <w:proofErr w:type="spellStart"/>
+      <w:r>
+        <w:rPr>
+          <w:rFonts w:ascii="Trebuchet MS" w:hAnsi="Trebuchet MS"/>
+          <w:i/>
+          <w:iCs/>
+          <w:sz w:val="24"/>
+          <w:szCs w:val="24"/>
+        </w:rPr>
+        <w:t>etc</w:t>
+      </w:r>
+      <w:proofErr w:type="spellEnd"/>
+      <w:r>
+        <w:rPr>
+          <w:rFonts w:ascii="Trebuchet MS" w:hAnsi="Trebuchet MS"/>
+          <w:i/>
+          <w:iCs/>
+          <w:sz w:val="24"/>
+          <w:szCs w:val="24"/>
+        </w:rPr>
+        <w:t>);</w:t>
       </w:r>
     </w:p>
     <w:p>
@@ -1360,7 +1908,31 @@
           <w:sz w:val="24"/>
           <w:szCs w:val="24"/>
         </w:rPr>
-        <w:t>For now you can just use buttons for navigation – there is no need to use an app bar, a navigation bar, or the navigation drawer just yet.</w:t>
+        <w:t xml:space="preserve">For </w:t>
+      </w:r>
+      <w:proofErr w:type="gramStart"/>
+      <w:r>
+        <w:rPr>
+          <w:rFonts w:ascii="Trebuchet MS" w:hAnsi="Trebuchet MS"/>
+          <w:i/>
+          <w:iCs/>
+          <w:color w:val="000000"/>
+          <w:sz w:val="24"/>
+          <w:szCs w:val="24"/>
+        </w:rPr>
+        <w:t>now</w:t>
+      </w:r>
+      <w:proofErr w:type="gramEnd"/>
+      <w:r>
+        <w:rPr>
+          <w:rFonts w:ascii="Trebuchet MS" w:hAnsi="Trebuchet MS"/>
+          <w:i/>
+          <w:iCs/>
+          <w:color w:val="000000"/>
+          <w:sz w:val="24"/>
+          <w:szCs w:val="24"/>
+        </w:rPr>
+        <w:t xml:space="preserve"> you can just use buttons for navigation – there is no need to use an app bar, a navigation bar, or the navigation drawer just yet.</w:t>
       </w:r>
       <w:r>
         <w:rPr>
@@ -1480,8 +2052,13 @@
       <w:r>
         <w:t xml:space="preserve"> </w:t>
       </w:r>
-      <w:r>
-        <w:t>ViewModel.</w:t>
+      <w:proofErr w:type="spellStart"/>
+      <w:r>
+        <w:t>ViewModel</w:t>
+      </w:r>
+      <w:proofErr w:type="spellEnd"/>
+      <w:r>
+        <w:t>.</w:t>
       </w:r>
     </w:p>
     <w:p>
@@ -1499,13 +2076,58 @@
         <w:ind w:left="720"/>
       </w:pPr>
       <w:r>
-        <w:t xml:space="preserve">I then plan to update my LatLng ViewModel to also include the POI list rather than adding a second ViewModel as this already holds the GPS location. I will add </w:t>
-      </w:r>
-      <w:r>
-        <w:t>MutableLiveData&lt;List&lt;Poi&gt;&gt;</w:t>
-      </w:r>
-      <w:r>
-        <w:t xml:space="preserve"> so that the MainActivity can observe the list, meaning that whenever a POI is added the UI can then automatically know to redraw any makers on the map. I will then add a function to the ViewModel which will add a </w:t>
+        <w:t xml:space="preserve">I then plan to update my </w:t>
+      </w:r>
+      <w:proofErr w:type="spellStart"/>
+      <w:r>
+        <w:t>LatLng</w:t>
+      </w:r>
+      <w:proofErr w:type="spellEnd"/>
+      <w:r>
+        <w:t xml:space="preserve"> </w:t>
+      </w:r>
+      <w:proofErr w:type="spellStart"/>
+      <w:r>
+        <w:t>ViewModel</w:t>
+      </w:r>
+      <w:proofErr w:type="spellEnd"/>
+      <w:r>
+        <w:t xml:space="preserve"> to also include the POI list rather than adding a second </w:t>
+      </w:r>
+      <w:proofErr w:type="spellStart"/>
+      <w:r>
+        <w:t>ViewModel</w:t>
+      </w:r>
+      <w:proofErr w:type="spellEnd"/>
+      <w:r>
+        <w:t xml:space="preserve"> as this already holds the GPS location. I will add </w:t>
+      </w:r>
+      <w:proofErr w:type="spellStart"/>
+      <w:r>
+        <w:t>MutableLiveData</w:t>
+      </w:r>
+      <w:proofErr w:type="spellEnd"/>
+      <w:r>
+        <w:t>&lt;List&lt;Poi&gt;&gt;</w:t>
+      </w:r>
+      <w:r>
+        <w:t xml:space="preserve"> so that the </w:t>
+      </w:r>
+      <w:proofErr w:type="spellStart"/>
+      <w:r>
+        <w:t>MainActivity</w:t>
+      </w:r>
+      <w:proofErr w:type="spellEnd"/>
+      <w:r>
+        <w:t xml:space="preserve"> can observe the list, meaning that whenever a POI is added the UI can then automatically know to redraw any makers on the map. I will then add a function to the </w:t>
+      </w:r>
+      <w:proofErr w:type="spellStart"/>
+      <w:r>
+        <w:t>ViewModel</w:t>
+      </w:r>
+      <w:proofErr w:type="spellEnd"/>
+      <w:r>
+        <w:t xml:space="preserve"> which will add a </w:t>
       </w:r>
       <w:r>
         <w:t xml:space="preserve">given </w:t>
@@ -1651,13 +2273,29 @@
         <w:t>I will then add a separate composable for the POI screen</w:t>
       </w:r>
       <w:r>
-        <w:t>. I plan to put this in its own separate file to prevent code from clustering in the MainActivity.</w:t>
+        <w:t xml:space="preserve">. I plan to put this in its own separate file to prevent code from clustering in the </w:t>
+      </w:r>
+      <w:proofErr w:type="spellStart"/>
+      <w:r>
+        <w:t>MainActivity</w:t>
+      </w:r>
+      <w:proofErr w:type="spellEnd"/>
+      <w:r>
+        <w:t>.</w:t>
       </w:r>
       <w:r>
         <w:t xml:space="preserve"> I will add two callback functions to the parameter of the composable. One will be for when a POI I added and the other will be for when the user wishes to navigate back to the home screen.</w:t>
       </w:r>
       <w:r>
-        <w:t xml:space="preserve"> I will also make it so the users current LatLng is also passed as a parameter for the POIs location.</w:t>
+        <w:t xml:space="preserve"> I will also make it so the users current </w:t>
+      </w:r>
+      <w:proofErr w:type="spellStart"/>
+      <w:r>
+        <w:t>LatLng</w:t>
+      </w:r>
+      <w:proofErr w:type="spellEnd"/>
+      <w:r>
+        <w:t xml:space="preserve"> is also passed as a parameter for the POIs location.</w:t>
       </w:r>
       <w:r>
         <w:t xml:space="preserve"> </w:t>
@@ -1732,7 +2370,55 @@
         </w:drawing>
       </w:r>
       <w:r>
-        <w:t xml:space="preserve">I will finally update the main composable to include the map page and the add poi page using the compose navigation. I will add the NavHost which will contain the two routes for the map page and the add poi page. I will then be able to define the callback functions for the onPoiAdded and onNavigateBack. onPoiAdded will add the new poi to the ViewModel and the onNavigateBack will return the user to the previous page they were on. </w:t>
+        <w:t xml:space="preserve">I will finally update the main composable to include the map page and the add poi page using the compose navigation. I will add the </w:t>
+      </w:r>
+      <w:proofErr w:type="spellStart"/>
+      <w:r>
+        <w:t>NavHost</w:t>
+      </w:r>
+      <w:proofErr w:type="spellEnd"/>
+      <w:r>
+        <w:t xml:space="preserve"> which will contain the two routes for the map page and the add poi page. I will then be able to define the callback functions for the </w:t>
+      </w:r>
+      <w:proofErr w:type="spellStart"/>
+      <w:r>
+        <w:t>onPoiAdded</w:t>
+      </w:r>
+      <w:proofErr w:type="spellEnd"/>
+      <w:r>
+        <w:t xml:space="preserve"> and </w:t>
+      </w:r>
+      <w:proofErr w:type="spellStart"/>
+      <w:r>
+        <w:t>onNavigateBack</w:t>
+      </w:r>
+      <w:proofErr w:type="spellEnd"/>
+      <w:r>
+        <w:t xml:space="preserve">. </w:t>
+      </w:r>
+      <w:proofErr w:type="spellStart"/>
+      <w:r>
+        <w:t>onPoiAdded</w:t>
+      </w:r>
+      <w:proofErr w:type="spellEnd"/>
+      <w:r>
+        <w:t xml:space="preserve"> will add the new poi to the </w:t>
+      </w:r>
+      <w:proofErr w:type="spellStart"/>
+      <w:r>
+        <w:t>ViewModel</w:t>
+      </w:r>
+      <w:proofErr w:type="spellEnd"/>
+      <w:r>
+        <w:t xml:space="preserve"> and the </w:t>
+      </w:r>
+      <w:proofErr w:type="spellStart"/>
+      <w:r>
+        <w:t>onNavigateBack</w:t>
+      </w:r>
+      <w:proofErr w:type="spellEnd"/>
+      <w:r>
+        <w:t xml:space="preserve"> will return the user to the previous page they were on. </w:t>
       </w:r>
       <w:r>
         <w:t xml:space="preserve">I will place a </w:t>
@@ -1743,8 +2429,13 @@
       <w:r>
         <w:t xml:space="preserve">the </w:t>
       </w:r>
-      <w:r>
-        <w:t>MapLibre lambda</w:t>
+      <w:proofErr w:type="spellStart"/>
+      <w:r>
+        <w:t>MapLibre</w:t>
+      </w:r>
+      <w:proofErr w:type="spellEnd"/>
+      <w:r>
+        <w:t xml:space="preserve"> lambda</w:t>
       </w:r>
       <w:r>
         <w:t xml:space="preserve">. </w:t>
@@ -1762,20 +2453,43 @@
         <w:t xml:space="preserve"> the</w:t>
       </w:r>
       <w:r>
-        <w:t xml:space="preserve"> poisState changes</w:t>
+        <w:t xml:space="preserve"> </w:t>
+      </w:r>
+      <w:proofErr w:type="spellStart"/>
+      <w:proofErr w:type="gramStart"/>
+      <w:r>
+        <w:t>poisState</w:t>
+      </w:r>
+      <w:proofErr w:type="spellEnd"/>
+      <w:proofErr w:type="gramEnd"/>
+      <w:r>
+        <w:t xml:space="preserve"> changes</w:t>
       </w:r>
       <w:r>
         <w:t>. This will then</w:t>
       </w:r>
       <w:r>
-        <w:t xml:space="preserve"> loop through poisState and plac</w:t>
+        <w:t xml:space="preserve"> loop through </w:t>
+      </w:r>
+      <w:proofErr w:type="spellStart"/>
+      <w:r>
+        <w:t>poisState</w:t>
+      </w:r>
+      <w:proofErr w:type="spellEnd"/>
+      <w:r>
+        <w:t xml:space="preserve"> and plac</w:t>
       </w:r>
       <w:r>
         <w:t>e</w:t>
       </w:r>
       <w:r>
-        <w:t xml:space="preserve"> a Symbol at each POI's LatLng</w:t>
-      </w:r>
+        <w:t xml:space="preserve"> a Symbol at each POI's </w:t>
+      </w:r>
+      <w:proofErr w:type="spellStart"/>
+      <w:r>
+        <w:t>LatLng</w:t>
+      </w:r>
+      <w:proofErr w:type="spellEnd"/>
       <w:r>
         <w:t>. This makes it so</w:t>
       </w:r>
@@ -1786,7 +2500,15 @@
         <w:t>.</w:t>
       </w:r>
       <w:r>
-        <w:t xml:space="preserve"> I will make it so an alert dialog appears when the marker is clicked on, displaying the markers details including its name, type and description. This allows me to test that the marker has been added correctly.</w:t>
+        <w:t xml:space="preserve"> I will make </w:t>
+      </w:r>
+      <w:proofErr w:type="gramStart"/>
+      <w:r>
+        <w:t>it</w:t>
+      </w:r>
+      <w:proofErr w:type="gramEnd"/>
+      <w:r>
+        <w:t xml:space="preserve"> so an alert dialog appears when the marker is clicked on, displaying the markers details including its name, type and description. This allows me to test that the marker has been added correctly.</w:t>
       </w:r>
     </w:p>
     <w:p>
@@ -2332,7 +3054,15 @@
         <w:t xml:space="preserve">methods </w:t>
       </w:r>
       <w:r>
-        <w:t xml:space="preserve">for the database so it can be changed or searched. I plan to make it so that when the database returns all the POIs it contains, it will return it as a LiveData&lt;List&lt;Poi&gt;&gt;. This will </w:t>
+        <w:t xml:space="preserve">for the database so it can be changed or searched. I plan to make it so that when the database returns all the POIs it contains, it will return it as a </w:t>
+      </w:r>
+      <w:proofErr w:type="spellStart"/>
+      <w:r>
+        <w:t>LiveData</w:t>
+      </w:r>
+      <w:proofErr w:type="spellEnd"/>
+      <w:r>
+        <w:t xml:space="preserve">&lt;List&lt;Poi&gt;&gt;. This will </w:t>
       </w:r>
       <w:r>
         <w:t>make</w:t>
@@ -2341,7 +3071,36 @@
         <w:t xml:space="preserve"> sure that the UI is automatically updated with a new list of POIs whenever the database is changed.</w:t>
       </w:r>
       <w:r>
-        <w:t xml:space="preserve"> For now, I will give it three functions, getAllPois(), insert() and delete().</w:t>
+        <w:t xml:space="preserve"> For now, I will give it three functions, </w:t>
+      </w:r>
+      <w:proofErr w:type="spellStart"/>
+      <w:proofErr w:type="gramStart"/>
+      <w:r>
+        <w:t>getAllPois</w:t>
+      </w:r>
+      <w:proofErr w:type="spellEnd"/>
+      <w:r>
+        <w:t>(</w:t>
+      </w:r>
+      <w:proofErr w:type="gramEnd"/>
+      <w:r>
+        <w:t xml:space="preserve">), </w:t>
+      </w:r>
+      <w:proofErr w:type="gramStart"/>
+      <w:r>
+        <w:t>insert(</w:t>
+      </w:r>
+      <w:proofErr w:type="gramEnd"/>
+      <w:r>
+        <w:t xml:space="preserve">) and </w:t>
+      </w:r>
+      <w:proofErr w:type="gramStart"/>
+      <w:r>
+        <w:t>delete(</w:t>
+      </w:r>
+      <w:proofErr w:type="gramEnd"/>
+      <w:r>
+        <w:t>).</w:t>
       </w:r>
     </w:p>
     <w:p>
@@ -2414,7 +3173,28 @@
         </w:drawing>
       </w:r>
       <w:r>
-        <w:t>I plan to next create the file for the database itself. This will be placed within an abstract function which allows my other files to access its DAO and all the database operations within it. Inside it I will put a getDatabase() function which will check that a database doesn’t already exist, if not it will create one and save it, otherwise it will simply return the one that already exists.</w:t>
+        <w:t xml:space="preserve">I plan to next create the file for the database itself. This will be placed within an abstract function which allows my other files to access its DAO and all the database operations within it. Inside it I will put a </w:t>
+      </w:r>
+      <w:proofErr w:type="spellStart"/>
+      <w:proofErr w:type="gramStart"/>
+      <w:r>
+        <w:t>getDatabase</w:t>
+      </w:r>
+      <w:proofErr w:type="spellEnd"/>
+      <w:r>
+        <w:t>(</w:t>
+      </w:r>
+      <w:proofErr w:type="gramEnd"/>
+      <w:r>
+        <w:t xml:space="preserve">) function which will check that a database </w:t>
+      </w:r>
+      <w:proofErr w:type="gramStart"/>
+      <w:r>
+        <w:t>doesn’t already</w:t>
+      </w:r>
+      <w:proofErr w:type="gramEnd"/>
+      <w:r>
+        <w:t xml:space="preserve"> exist, if not it will create one and save it, otherwise it will simply return the one that already exists.</w:t>
       </w:r>
     </w:p>
     <w:p>
@@ -2483,16 +3263,74 @@
         </w:drawing>
       </w:r>
       <w:r>
-        <w:t xml:space="preserve">I will next update my Viewmodel. </w:t>
-      </w:r>
-      <w:r>
-        <w:t xml:space="preserve">I will first change the ViewModel for a AndroidViewModel so that it can access the application context which will be needed to open the database. </w:t>
+        <w:t xml:space="preserve">I will next update my </w:t>
+      </w:r>
+      <w:proofErr w:type="spellStart"/>
+      <w:r>
+        <w:t>Viewmodel</w:t>
+      </w:r>
+      <w:proofErr w:type="spellEnd"/>
+      <w:r>
+        <w:t xml:space="preserve">. </w:t>
+      </w:r>
+      <w:r>
+        <w:t xml:space="preserve">I will first change the </w:t>
+      </w:r>
+      <w:proofErr w:type="spellStart"/>
+      <w:r>
+        <w:t>ViewModel</w:t>
+      </w:r>
+      <w:proofErr w:type="spellEnd"/>
+      <w:r>
+        <w:t xml:space="preserve"> for </w:t>
+      </w:r>
+      <w:proofErr w:type="gramStart"/>
+      <w:r>
+        <w:t xml:space="preserve">a </w:t>
+      </w:r>
+      <w:proofErr w:type="spellStart"/>
+      <w:r>
+        <w:t>AndroidViewModel</w:t>
+      </w:r>
+      <w:proofErr w:type="spellEnd"/>
+      <w:proofErr w:type="gramEnd"/>
+      <w:r>
+        <w:t xml:space="preserve"> so that it can access the application context which will be needed to open the database. </w:t>
       </w:r>
       <w:r>
         <w:t xml:space="preserve">I plan to update the poi variable so that it gathers all the pois from the database as </w:t>
       </w:r>
-      <w:r>
-        <w:t>LiveData allowing it to automatically update when a new POI is added. Because of this, I will also need to change the addpoi function in the Viewmodel so that it adds the poi to the database instead of list using the poiDao’s ins</w:t>
+      <w:proofErr w:type="spellStart"/>
+      <w:r>
+        <w:t>LiveData</w:t>
+      </w:r>
+      <w:proofErr w:type="spellEnd"/>
+      <w:r>
+        <w:t xml:space="preserve"> allowing it to automatically update when a new POI is added. Because of this, I will also need to change the </w:t>
+      </w:r>
+      <w:proofErr w:type="spellStart"/>
+      <w:r>
+        <w:t>addpoi</w:t>
+      </w:r>
+      <w:proofErr w:type="spellEnd"/>
+      <w:r>
+        <w:t xml:space="preserve"> function in the </w:t>
+      </w:r>
+      <w:proofErr w:type="spellStart"/>
+      <w:r>
+        <w:t>Viewmodel</w:t>
+      </w:r>
+      <w:proofErr w:type="spellEnd"/>
+      <w:r>
+        <w:t xml:space="preserve"> so that it adds the poi to the database instead of list using the </w:t>
+      </w:r>
+      <w:proofErr w:type="spellStart"/>
+      <w:r>
+        <w:t>poiDao’s</w:t>
+      </w:r>
+      <w:proofErr w:type="spellEnd"/>
+      <w:r>
+        <w:t xml:space="preserve"> ins</w:t>
       </w:r>
       <w:r>
         <w:t>ert function.</w:t>
@@ -2573,7 +3411,15 @@
         </w:drawing>
       </w:r>
       <w:r>
-        <w:t>I will then update the button for my AddPoiScreen. I will simply change the Poi structure in the button so that it fits the databases poi structure since the latitude and longitude for the pois in the database are separate variables.</w:t>
+        <w:t xml:space="preserve">I will then update the button for my </w:t>
+      </w:r>
+      <w:proofErr w:type="spellStart"/>
+      <w:r>
+        <w:t>AddPoiScreen</w:t>
+      </w:r>
+      <w:proofErr w:type="spellEnd"/>
+      <w:r>
+        <w:t>. I will simply change the Poi structure in the button so that it fits the databases poi structure since the latitude and longitude for the pois in the database are separate variables.</w:t>
       </w:r>
     </w:p>
     <w:p>
@@ -2587,7 +3433,23 @@
       </w:pPr>
       <w:r>
         <w:lastRenderedPageBreak/>
-        <w:t>I will then need to change the MainActivity so that the Poi is converted back into the LatLng so that the map can properly mark its location.</w:t>
+        <w:t xml:space="preserve">I will then need to change the </w:t>
+      </w:r>
+      <w:proofErr w:type="spellStart"/>
+      <w:r>
+        <w:t>MainActivity</w:t>
+      </w:r>
+      <w:proofErr w:type="spellEnd"/>
+      <w:r>
+        <w:t xml:space="preserve"> so that the Poi is converted back into the </w:t>
+      </w:r>
+      <w:proofErr w:type="spellStart"/>
+      <w:r>
+        <w:t>LatLng</w:t>
+      </w:r>
+      <w:proofErr w:type="spellEnd"/>
+      <w:r>
+        <w:t xml:space="preserve"> so that the map can properly mark its location.</w:t>
       </w:r>
     </w:p>
     <w:p>
@@ -2801,7 +3663,15 @@
         <w:ind w:left="720"/>
       </w:pPr>
       <w:r>
-        <w:t xml:space="preserve">I have already set up the loading process for the POIs for task 3. This is done on startup and whenever the database is updated. </w:t>
+        <w:t xml:space="preserve">I have already set up the loading process for the POIs for task 3. This is done on </w:t>
+      </w:r>
+      <w:proofErr w:type="gramStart"/>
+      <w:r>
+        <w:t>startup and</w:t>
+      </w:r>
+      <w:proofErr w:type="gramEnd"/>
+      <w:r>
+        <w:t xml:space="preserve"> whenever the database is updated. </w:t>
       </w:r>
       <w:r>
         <w:t>However, to fit this task better I will change the code to use a button instead, this will make testing easier and give the user more control.</w:t>
@@ -2817,14 +3687,26 @@
         <w:ind w:left="720"/>
       </w:pPr>
       <w:r>
-        <w:t xml:space="preserve">I will start this by changing the DAO to return a plain list instead of </w:t>
-      </w:r>
+        <w:t xml:space="preserve">I will start this by changing the DAO to </w:t>
+      </w:r>
+      <w:proofErr w:type="gramStart"/>
+      <w:r>
+        <w:t>return</w:t>
+      </w:r>
+      <w:proofErr w:type="gramEnd"/>
+      <w:r>
+        <w:t xml:space="preserve"> a plain list instead of </w:t>
+      </w:r>
+      <w:proofErr w:type="gramStart"/>
       <w:r>
         <w:t xml:space="preserve">the </w:t>
       </w:r>
+      <w:proofErr w:type="spellStart"/>
       <w:r>
         <w:t>LiveData</w:t>
       </w:r>
+      <w:proofErr w:type="spellEnd"/>
+      <w:proofErr w:type="gramEnd"/>
       <w:r>
         <w:t xml:space="preserve"> since the POIs will no longer be automatically loaded. </w:t>
       </w:r>
@@ -2968,7 +3850,39 @@
         </w:drawing>
       </w:r>
       <w:r>
-        <w:t>I will also need to add a new function to the ViewModel which will load all the POIs from the database. It will run the database query on Dispatchers.IO in the background, then set the result to pois.value which should triggers the observer in MainActivity which will then update the map.</w:t>
+        <w:t xml:space="preserve">I will also need to add a new function to the </w:t>
+      </w:r>
+      <w:proofErr w:type="spellStart"/>
+      <w:r>
+        <w:t>ViewModel</w:t>
+      </w:r>
+      <w:proofErr w:type="spellEnd"/>
+      <w:r>
+        <w:t xml:space="preserve"> which will load all the POIs from the database. It will run the database query on Dispatchers.IO in the background, then set the result to </w:t>
+      </w:r>
+      <w:proofErr w:type="spellStart"/>
+      <w:r>
+        <w:t>pois.value</w:t>
+      </w:r>
+      <w:proofErr w:type="spellEnd"/>
+      <w:r>
+        <w:t xml:space="preserve"> which should </w:t>
+      </w:r>
+      <w:proofErr w:type="gramStart"/>
+      <w:r>
+        <w:t>triggers</w:t>
+      </w:r>
+      <w:proofErr w:type="gramEnd"/>
+      <w:r>
+        <w:t xml:space="preserve"> the observer in </w:t>
+      </w:r>
+      <w:proofErr w:type="spellStart"/>
+      <w:r>
+        <w:t>MainActivity</w:t>
+      </w:r>
+      <w:proofErr w:type="spellEnd"/>
+      <w:r>
+        <w:t xml:space="preserve"> which will then update the map.</w:t>
       </w:r>
     </w:p>
     <w:p>
@@ -3041,20 +3955,36 @@
         <w:t>it</w:t>
       </w:r>
       <w:r>
-        <w:t xml:space="preserve"> holds a plain list of pois instead of being assigned directly from the DAO’s live data since it no longer returns LiveData.</w:t>
-      </w:r>
-    </w:p>
-    <w:p>
-      <w:pPr>
-        <w:ind w:left="720"/>
-      </w:pPr>
-    </w:p>
-    <w:p>
-      <w:pPr>
-        <w:ind w:left="720"/>
-      </w:pPr>
-      <w:r>
-        <w:t>I will then lastly need to add the load buttons to the MainActivity. This will call the load poi function in the view model, loading all the pois from the database into the UI.</w:t>
+        <w:t xml:space="preserve"> holds a plain list of pois instead of being assigned directly from the DAO’s live data since it no longer returns </w:t>
+      </w:r>
+      <w:proofErr w:type="spellStart"/>
+      <w:r>
+        <w:t>LiveData</w:t>
+      </w:r>
+      <w:proofErr w:type="spellEnd"/>
+      <w:r>
+        <w:t>.</w:t>
+      </w:r>
+    </w:p>
+    <w:p>
+      <w:pPr>
+        <w:ind w:left="720"/>
+      </w:pPr>
+    </w:p>
+    <w:p>
+      <w:pPr>
+        <w:ind w:left="720"/>
+      </w:pPr>
+      <w:r>
+        <w:t xml:space="preserve">I will then lastly need to add the load buttons to the </w:t>
+      </w:r>
+      <w:proofErr w:type="spellStart"/>
+      <w:r>
+        <w:t>MainActivity</w:t>
+      </w:r>
+      <w:proofErr w:type="spellEnd"/>
+      <w:r>
+        <w:t>. This will call the load poi function in the view model, loading all the pois from the database into the UI.</w:t>
       </w:r>
     </w:p>
     <w:p>
@@ -3184,7 +4114,31 @@
           <w:sz w:val="24"/>
           <w:szCs w:val="24"/>
         </w:rPr>
-        <w:t xml:space="preserve"> in a text field. This should search the local database. The matching places should appear on the map as markers or circles. Again a dialog box should appear when the user clicks on each place.”</w:t>
+        <w:t xml:space="preserve"> in a text field. This should search the local database. The matching places should appear on the map as markers or circles. </w:t>
+      </w:r>
+      <w:proofErr w:type="gramStart"/>
+      <w:r>
+        <w:rPr>
+          <w:rFonts w:ascii="Trebuchet MS" w:hAnsi="Trebuchet MS"/>
+          <w:i/>
+          <w:iCs/>
+          <w:color w:val="000000"/>
+          <w:sz w:val="24"/>
+          <w:szCs w:val="24"/>
+        </w:rPr>
+        <w:t>Again</w:t>
+      </w:r>
+      <w:proofErr w:type="gramEnd"/>
+      <w:r>
+        <w:rPr>
+          <w:rFonts w:ascii="Trebuchet MS" w:hAnsi="Trebuchet MS"/>
+          <w:i/>
+          <w:iCs/>
+          <w:color w:val="000000"/>
+          <w:sz w:val="24"/>
+          <w:szCs w:val="24"/>
+        </w:rPr>
+        <w:t xml:space="preserve"> a dialog box should appear when the user clicks on each place.”</w:t>
       </w:r>
     </w:p>
     <w:p>
@@ -3330,7 +4284,31 @@
         <w:t>I will next create</w:t>
       </w:r>
       <w:r>
-        <w:t xml:space="preserve"> a new function in the ViewModel. This will use the search by type function from the DAO. This will have the type as a parameter to search with and add the results to the pois.value.</w:t>
+        <w:t xml:space="preserve"> a new function in the </w:t>
+      </w:r>
+      <w:proofErr w:type="spellStart"/>
+      <w:r>
+        <w:t>ViewModel</w:t>
+      </w:r>
+      <w:proofErr w:type="spellEnd"/>
+      <w:r>
+        <w:t xml:space="preserve">. This will </w:t>
+      </w:r>
+      <w:proofErr w:type="gramStart"/>
+      <w:r>
+        <w:t>use the search</w:t>
+      </w:r>
+      <w:proofErr w:type="gramEnd"/>
+      <w:r>
+        <w:t xml:space="preserve"> by type function from the DAO. This will have the type as a parameter to search with and add the results to the </w:t>
+      </w:r>
+      <w:proofErr w:type="spellStart"/>
+      <w:r>
+        <w:t>pois.value</w:t>
+      </w:r>
+      <w:proofErr w:type="spellEnd"/>
+      <w:r>
+        <w:t>.</w:t>
       </w:r>
       <w:r>
         <w:t xml:space="preserve"> This makes it so when a user searches a type, it only displays markers relating to that type. Then to display all the pois again the user will simply need to load the pois again.</w:t>
@@ -3406,7 +4384,31 @@
         </w:drawing>
       </w:r>
       <w:r>
-        <w:t>Then I will add an outlined text field to my MainActivity which will be used by the user to input the accommodation type that they are searching for. This will then be followed by a button which, when clicked, will take the inputted data and call the search pois by type function using the inputted data as the parameter.</w:t>
+        <w:t xml:space="preserve">Then I will add an outlined text field to my </w:t>
+      </w:r>
+      <w:proofErr w:type="spellStart"/>
+      <w:r>
+        <w:t>MainActivity</w:t>
+      </w:r>
+      <w:proofErr w:type="spellEnd"/>
+      <w:r>
+        <w:t xml:space="preserve"> which will be used by the user to input the accommodation type that they are searching for. This will then be followed by a button which, when clicked, will take the </w:t>
+      </w:r>
+      <w:proofErr w:type="gramStart"/>
+      <w:r>
+        <w:t>inputted</w:t>
+      </w:r>
+      <w:proofErr w:type="gramEnd"/>
+      <w:r>
+        <w:t xml:space="preserve"> data and call the search pois by type function using the </w:t>
+      </w:r>
+      <w:proofErr w:type="gramStart"/>
+      <w:r>
+        <w:t>inputted</w:t>
+      </w:r>
+      <w:proofErr w:type="gramEnd"/>
+      <w:r>
+        <w:t xml:space="preserve"> data as the parameter.</w:t>
       </w:r>
     </w:p>
     <w:p/>
@@ -3600,7 +4602,29 @@
           <w:sz w:val="24"/>
           <w:szCs w:val="24"/>
         </w:rPr>
-        <w:t>When the POIs are loaded they should be shown on the map as markers and saved to the database. To avoid duplicate entries in the database, check whether the point of interest with that ID is already present before adding it.</w:t>
+        <w:t xml:space="preserve">When the POIs are </w:t>
+      </w:r>
+      <w:proofErr w:type="gramStart"/>
+      <w:r>
+        <w:rPr>
+          <w:rFonts w:ascii="Trebuchet MS" w:hAnsi="Trebuchet MS"/>
+          <w:i/>
+          <w:iCs/>
+          <w:sz w:val="24"/>
+          <w:szCs w:val="24"/>
+        </w:rPr>
+        <w:t>loaded</w:t>
+      </w:r>
+      <w:proofErr w:type="gramEnd"/>
+      <w:r>
+        <w:rPr>
+          <w:rFonts w:ascii="Trebuchet MS" w:hAnsi="Trebuchet MS"/>
+          <w:i/>
+          <w:iCs/>
+          <w:sz w:val="24"/>
+          <w:szCs w:val="24"/>
+        </w:rPr>
+        <w:t xml:space="preserve"> they should be shown on the map as markers and saved to the database. To avoid duplicate entries in the database, check whether the point of interest with that ID is already present before adding it.</w:t>
       </w:r>
       <w:r>
         <w:rPr>
@@ -3891,28 +4915,116 @@
           <w:sz w:val="24"/>
           <w:szCs w:val="24"/>
         </w:rPr>
-        <w:t>On top of this I will need to add usesCleartextTraffic=”true” to my application. This is because Android doesn’t allow access to insecure servers (HTTP) which my server is. By using this it disables the restriction allowing my app to communicate with the server.</w:t>
-      </w:r>
-    </w:p>
-    <w:p>
-      <w:pPr>
-        <w:ind w:left="720"/>
-        <w:rPr>
-          <w:rFonts w:ascii="Trebuchet MS" w:hAnsi="Trebuchet MS"/>
-          <w:sz w:val="24"/>
-          <w:szCs w:val="24"/>
-        </w:rPr>
-      </w:pPr>
-    </w:p>
-    <w:p>
-      <w:pPr>
-        <w:ind w:left="720"/>
-        <w:rPr>
-          <w:rFonts w:ascii="Trebuchet MS" w:hAnsi="Trebuchet MS"/>
-          <w:sz w:val="24"/>
-          <w:szCs w:val="24"/>
-        </w:rPr>
-      </w:pPr>
+        <w:t xml:space="preserve">On top of this I will need to add </w:t>
+      </w:r>
+      <w:proofErr w:type="spellStart"/>
+      <w:r>
+        <w:rPr>
+          <w:rFonts w:ascii="Trebuchet MS" w:hAnsi="Trebuchet MS"/>
+          <w:sz w:val="24"/>
+          <w:szCs w:val="24"/>
+        </w:rPr>
+        <w:t>usesCleartextTraffic</w:t>
+      </w:r>
+      <w:proofErr w:type="spellEnd"/>
+      <w:proofErr w:type="gramStart"/>
+      <w:r>
+        <w:rPr>
+          <w:rFonts w:ascii="Trebuchet MS" w:hAnsi="Trebuchet MS"/>
+          <w:sz w:val="24"/>
+          <w:szCs w:val="24"/>
+        </w:rPr>
+        <w:t>=”true</w:t>
+      </w:r>
+      <w:proofErr w:type="gramEnd"/>
+      <w:r>
+        <w:rPr>
+          <w:rFonts w:ascii="Trebuchet MS" w:hAnsi="Trebuchet MS"/>
+          <w:sz w:val="24"/>
+          <w:szCs w:val="24"/>
+        </w:rPr>
+        <w:t>” to my application. This is because Android doesn’t allow access to insecure servers (HTTP) which my server is. By using this it disables the restriction allowing my app to communicate with the server.</w:t>
+      </w:r>
+    </w:p>
+    <w:p>
+      <w:pPr>
+        <w:ind w:left="720"/>
+        <w:rPr>
+          <w:rFonts w:ascii="Trebuchet MS" w:hAnsi="Trebuchet MS"/>
+          <w:sz w:val="24"/>
+          <w:szCs w:val="24"/>
+        </w:rPr>
+      </w:pPr>
+    </w:p>
+    <w:p>
+      <w:pPr>
+        <w:ind w:left="720"/>
+        <w:rPr>
+          <w:rFonts w:ascii="Trebuchet MS" w:hAnsi="Trebuchet MS"/>
+          <w:sz w:val="24"/>
+          <w:szCs w:val="24"/>
+        </w:rPr>
+      </w:pPr>
+      <w:r>
+        <w:rPr>
+          <w:noProof/>
+        </w:rPr>
+        <w:drawing>
+          <wp:anchor distT="0" distB="0" distL="114300" distR="114300" simplePos="0" relativeHeight="251697152" behindDoc="0" locked="0" layoutInCell="1" allowOverlap="1" wp14:anchorId="6C27627D" wp14:editId="1494ABAB">
+            <wp:simplePos x="0" y="0"/>
+            <wp:positionH relativeFrom="margin">
+              <wp:align>center</wp:align>
+            </wp:positionH>
+            <wp:positionV relativeFrom="paragraph">
+              <wp:posOffset>895350</wp:posOffset>
+            </wp:positionV>
+            <wp:extent cx="3124200" cy="1583690"/>
+            <wp:effectExtent l="0" t="0" r="0" b="0"/>
+            <wp:wrapTopAndBottom/>
+            <wp:docPr id="545997916" name="Picture 1"/>
+            <wp:cNvGraphicFramePr>
+              <a:graphicFrameLocks xmlns:a="http://schemas.openxmlformats.org/drawingml/2006/main" noChangeAspect="1"/>
+            </wp:cNvGraphicFramePr>
+            <a:graphic xmlns:a="http://schemas.openxmlformats.org/drawingml/2006/main">
+              <a:graphicData uri="http://schemas.openxmlformats.org/drawingml/2006/picture">
+                <pic:pic xmlns:pic="http://schemas.openxmlformats.org/drawingml/2006/picture">
+                  <pic:nvPicPr>
+                    <pic:cNvPr id="545997916" name=""/>
+                    <pic:cNvPicPr/>
+                  </pic:nvPicPr>
+                  <pic:blipFill>
+                    <a:blip r:embed="rId42">
+                      <a:extLst>
+                        <a:ext uri="{28A0092B-C50C-407E-A947-70E740481C1C}">
+                          <a14:useLocalDpi xmlns:a14="http://schemas.microsoft.com/office/drawing/2010/main" val="0"/>
+                        </a:ext>
+                      </a:extLst>
+                    </a:blip>
+                    <a:stretch>
+                      <a:fillRect/>
+                    </a:stretch>
+                  </pic:blipFill>
+                  <pic:spPr>
+                    <a:xfrm>
+                      <a:off x="0" y="0"/>
+                      <a:ext cx="3124200" cy="1583690"/>
+                    </a:xfrm>
+                    <a:prstGeom prst="rect">
+                      <a:avLst/>
+                    </a:prstGeom>
+                  </pic:spPr>
+                </pic:pic>
+              </a:graphicData>
+            </a:graphic>
+            <wp14:sizeRelH relativeFrom="margin">
+              <wp14:pctWidth>0</wp14:pctWidth>
+            </wp14:sizeRelH>
+            <wp14:sizeRelV relativeFrom="margin">
+              <wp14:pctHeight>0</wp14:pctHeight>
+            </wp14:sizeRelV>
+          </wp:anchor>
+        </w:drawing>
+      </w:r>
       <w:r>
         <w:rPr>
           <w:rFonts w:ascii="Trebuchet MS" w:hAnsi="Trebuchet MS"/>
@@ -3943,6 +5055,60 @@
       </w:pPr>
       <w:r>
         <w:rPr>
+          <w:noProof/>
+        </w:rPr>
+        <w:drawing>
+          <wp:anchor distT="0" distB="0" distL="114300" distR="114300" simplePos="0" relativeHeight="251698176" behindDoc="0" locked="0" layoutInCell="1" allowOverlap="1" wp14:anchorId="5F8E0E0B" wp14:editId="1BA632CC">
+            <wp:simplePos x="0" y="0"/>
+            <wp:positionH relativeFrom="margin">
+              <wp:align>center</wp:align>
+            </wp:positionH>
+            <wp:positionV relativeFrom="paragraph">
+              <wp:posOffset>1101725</wp:posOffset>
+            </wp:positionV>
+            <wp:extent cx="2600325" cy="2314575"/>
+            <wp:effectExtent l="0" t="0" r="9525" b="9525"/>
+            <wp:wrapTopAndBottom/>
+            <wp:docPr id="604252780" name="Picture 1"/>
+            <wp:cNvGraphicFramePr>
+              <a:graphicFrameLocks xmlns:a="http://schemas.openxmlformats.org/drawingml/2006/main" noChangeAspect="1"/>
+            </wp:cNvGraphicFramePr>
+            <a:graphic xmlns:a="http://schemas.openxmlformats.org/drawingml/2006/main">
+              <a:graphicData uri="http://schemas.openxmlformats.org/drawingml/2006/picture">
+                <pic:pic xmlns:pic="http://schemas.openxmlformats.org/drawingml/2006/picture">
+                  <pic:nvPicPr>
+                    <pic:cNvPr id="604252780" name=""/>
+                    <pic:cNvPicPr/>
+                  </pic:nvPicPr>
+                  <pic:blipFill>
+                    <a:blip r:embed="rId43">
+                      <a:extLst>
+                        <a:ext uri="{28A0092B-C50C-407E-A947-70E740481C1C}">
+                          <a14:useLocalDpi xmlns:a14="http://schemas.microsoft.com/office/drawing/2010/main" val="0"/>
+                        </a:ext>
+                      </a:extLst>
+                    </a:blip>
+                    <a:stretch>
+                      <a:fillRect/>
+                    </a:stretch>
+                  </pic:blipFill>
+                  <pic:spPr>
+                    <a:xfrm>
+                      <a:off x="0" y="0"/>
+                      <a:ext cx="2600325" cy="2314575"/>
+                    </a:xfrm>
+                    <a:prstGeom prst="rect">
+                      <a:avLst/>
+                    </a:prstGeom>
+                  </pic:spPr>
+                </pic:pic>
+              </a:graphicData>
+            </a:graphic>
+          </wp:anchor>
+        </w:drawing>
+      </w:r>
+      <w:r>
+        <w:rPr>
           <w:rFonts w:ascii="Trebuchet MS" w:hAnsi="Trebuchet MS"/>
           <w:sz w:val="24"/>
           <w:szCs w:val="24"/>
@@ -3963,8 +5129,18 @@
           <w:sz w:val="24"/>
           <w:szCs w:val="24"/>
         </w:rPr>
-        <w:t xml:space="preserve"> as they both currently have different feilds</w:t>
-      </w:r>
+        <w:t xml:space="preserve"> as they both currently have different </w:t>
+      </w:r>
+      <w:proofErr w:type="spellStart"/>
+      <w:r>
+        <w:rPr>
+          <w:rFonts w:ascii="Trebuchet MS" w:hAnsi="Trebuchet MS"/>
+          <w:sz w:val="24"/>
+          <w:szCs w:val="24"/>
+        </w:rPr>
+        <w:t>feilds</w:t>
+      </w:r>
+      <w:proofErr w:type="spellEnd"/>
       <w:r>
         <w:rPr>
           <w:rFonts w:ascii="Trebuchet MS" w:hAnsi="Trebuchet MS"/>
@@ -3993,6 +5169,227 @@
           <w:szCs w:val="24"/>
         </w:rPr>
       </w:pPr>
+    </w:p>
+    <w:p>
+      <w:pPr>
+        <w:ind w:left="720"/>
+        <w:rPr>
+          <w:rFonts w:ascii="Trebuchet MS" w:hAnsi="Trebuchet MS"/>
+          <w:sz w:val="24"/>
+          <w:szCs w:val="24"/>
+        </w:rPr>
+      </w:pPr>
+      <w:r>
+        <w:rPr>
+          <w:noProof/>
+        </w:rPr>
+        <w:drawing>
+          <wp:anchor distT="0" distB="0" distL="114300" distR="114300" simplePos="0" relativeHeight="251699200" behindDoc="0" locked="0" layoutInCell="1" allowOverlap="1" wp14:anchorId="4DF248D6" wp14:editId="7024FA16">
+            <wp:simplePos x="0" y="0"/>
+            <wp:positionH relativeFrom="margin">
+              <wp:align>center</wp:align>
+            </wp:positionH>
+            <wp:positionV relativeFrom="paragraph">
+              <wp:posOffset>574040</wp:posOffset>
+            </wp:positionV>
+            <wp:extent cx="4400550" cy="504825"/>
+            <wp:effectExtent l="0" t="0" r="0" b="9525"/>
+            <wp:wrapTopAndBottom/>
+            <wp:docPr id="262837957" name="Picture 1"/>
+            <wp:cNvGraphicFramePr>
+              <a:graphicFrameLocks xmlns:a="http://schemas.openxmlformats.org/drawingml/2006/main" noChangeAspect="1"/>
+            </wp:cNvGraphicFramePr>
+            <a:graphic xmlns:a="http://schemas.openxmlformats.org/drawingml/2006/main">
+              <a:graphicData uri="http://schemas.openxmlformats.org/drawingml/2006/picture">
+                <pic:pic xmlns:pic="http://schemas.openxmlformats.org/drawingml/2006/picture">
+                  <pic:nvPicPr>
+                    <pic:cNvPr id="262837957" name=""/>
+                    <pic:cNvPicPr/>
+                  </pic:nvPicPr>
+                  <pic:blipFill>
+                    <a:blip r:embed="rId44">
+                      <a:extLst>
+                        <a:ext uri="{28A0092B-C50C-407E-A947-70E740481C1C}">
+                          <a14:useLocalDpi xmlns:a14="http://schemas.microsoft.com/office/drawing/2010/main" val="0"/>
+                        </a:ext>
+                      </a:extLst>
+                    </a:blip>
+                    <a:stretch>
+                      <a:fillRect/>
+                    </a:stretch>
+                  </pic:blipFill>
+                  <pic:spPr>
+                    <a:xfrm>
+                      <a:off x="0" y="0"/>
+                      <a:ext cx="4400550" cy="504825"/>
+                    </a:xfrm>
+                    <a:prstGeom prst="rect">
+                      <a:avLst/>
+                    </a:prstGeom>
+                  </pic:spPr>
+                </pic:pic>
+              </a:graphicData>
+            </a:graphic>
+          </wp:anchor>
+        </w:drawing>
+      </w:r>
+      <w:r>
+        <w:rPr>
+          <w:rFonts w:ascii="Trebuchet MS" w:hAnsi="Trebuchet MS"/>
+          <w:sz w:val="24"/>
+          <w:szCs w:val="24"/>
+        </w:rPr>
+        <w:t>I will also then need to add a new DAO method which will be used for duplicate checking. This will gather all the secondary IDs to be used for comparison.</w:t>
+      </w:r>
+    </w:p>
+    <w:p>
+      <w:pPr>
+        <w:rPr>
+          <w:rFonts w:ascii="Trebuchet MS" w:hAnsi="Trebuchet MS"/>
+          <w:sz w:val="24"/>
+          <w:szCs w:val="24"/>
+        </w:rPr>
+      </w:pPr>
+    </w:p>
+    <w:p>
+      <w:pPr>
+        <w:ind w:left="720"/>
+        <w:rPr>
+          <w:rFonts w:ascii="Trebuchet MS" w:hAnsi="Trebuchet MS"/>
+          <w:sz w:val="24"/>
+          <w:szCs w:val="24"/>
+        </w:rPr>
+      </w:pPr>
+    </w:p>
+    <w:p>
+      <w:pPr>
+        <w:ind w:left="720"/>
+        <w:rPr>
+          <w:rFonts w:ascii="Trebuchet MS" w:hAnsi="Trebuchet MS"/>
+          <w:sz w:val="24"/>
+          <w:szCs w:val="24"/>
+        </w:rPr>
+      </w:pPr>
+    </w:p>
+    <w:p>
+      <w:pPr>
+        <w:ind w:left="720"/>
+        <w:rPr>
+          <w:rFonts w:ascii="Trebuchet MS" w:hAnsi="Trebuchet MS"/>
+          <w:sz w:val="24"/>
+          <w:szCs w:val="24"/>
+        </w:rPr>
+      </w:pPr>
+    </w:p>
+    <w:p>
+      <w:pPr>
+        <w:ind w:left="720"/>
+        <w:rPr>
+          <w:rFonts w:ascii="Trebuchet MS" w:hAnsi="Trebuchet MS"/>
+          <w:sz w:val="24"/>
+          <w:szCs w:val="24"/>
+        </w:rPr>
+      </w:pPr>
+    </w:p>
+    <w:p>
+      <w:pPr>
+        <w:ind w:left="720"/>
+        <w:rPr>
+          <w:rFonts w:ascii="Trebuchet MS" w:hAnsi="Trebuchet MS"/>
+          <w:sz w:val="24"/>
+          <w:szCs w:val="24"/>
+        </w:rPr>
+      </w:pPr>
+    </w:p>
+    <w:p>
+      <w:pPr>
+        <w:ind w:left="720"/>
+        <w:rPr>
+          <w:rFonts w:ascii="Trebuchet MS" w:hAnsi="Trebuchet MS"/>
+          <w:sz w:val="24"/>
+          <w:szCs w:val="24"/>
+        </w:rPr>
+      </w:pPr>
+    </w:p>
+    <w:p>
+      <w:pPr>
+        <w:ind w:left="720"/>
+        <w:rPr>
+          <w:rFonts w:ascii="Trebuchet MS" w:hAnsi="Trebuchet MS"/>
+          <w:sz w:val="24"/>
+          <w:szCs w:val="24"/>
+        </w:rPr>
+      </w:pPr>
+    </w:p>
+    <w:p>
+      <w:pPr>
+        <w:ind w:left="720"/>
+        <w:rPr>
+          <w:rFonts w:ascii="Trebuchet MS" w:hAnsi="Trebuchet MS"/>
+          <w:sz w:val="24"/>
+          <w:szCs w:val="24"/>
+        </w:rPr>
+      </w:pPr>
+    </w:p>
+    <w:p>
+      <w:pPr>
+        <w:ind w:left="720"/>
+        <w:rPr>
+          <w:rFonts w:ascii="Trebuchet MS" w:hAnsi="Trebuchet MS"/>
+          <w:sz w:val="24"/>
+          <w:szCs w:val="24"/>
+        </w:rPr>
+      </w:pPr>
+    </w:p>
+    <w:p>
+      <w:pPr>
+        <w:ind w:left="720"/>
+        <w:rPr>
+          <w:rFonts w:ascii="Trebuchet MS" w:hAnsi="Trebuchet MS"/>
+          <w:sz w:val="24"/>
+          <w:szCs w:val="24"/>
+        </w:rPr>
+      </w:pPr>
+    </w:p>
+    <w:p>
+      <w:pPr>
+        <w:ind w:left="720"/>
+        <w:rPr>
+          <w:rFonts w:ascii="Trebuchet MS" w:hAnsi="Trebuchet MS"/>
+          <w:sz w:val="24"/>
+          <w:szCs w:val="24"/>
+        </w:rPr>
+      </w:pPr>
+    </w:p>
+    <w:p>
+      <w:pPr>
+        <w:ind w:left="720"/>
+        <w:rPr>
+          <w:rFonts w:ascii="Trebuchet MS" w:hAnsi="Trebuchet MS"/>
+          <w:sz w:val="24"/>
+          <w:szCs w:val="24"/>
+        </w:rPr>
+      </w:pPr>
+    </w:p>
+    <w:p>
+      <w:pPr>
+        <w:ind w:left="720"/>
+        <w:rPr>
+          <w:rFonts w:ascii="Trebuchet MS" w:hAnsi="Trebuchet MS"/>
+          <w:sz w:val="24"/>
+          <w:szCs w:val="24"/>
+        </w:rPr>
+      </w:pPr>
+    </w:p>
+    <w:p>
+      <w:pPr>
+        <w:ind w:left="720"/>
+        <w:rPr>
+          <w:rFonts w:ascii="Trebuchet MS" w:hAnsi="Trebuchet MS"/>
+          <w:sz w:val="24"/>
+          <w:szCs w:val="24"/>
+        </w:rPr>
+      </w:pPr>
       <w:r>
         <w:rPr>
           <w:rFonts w:ascii="Trebuchet MS" w:hAnsi="Trebuchet MS"/>
@@ -4000,35 +5397,25 @@
           <w:szCs w:val="24"/>
         </w:rPr>
         <w:lastRenderedPageBreak/>
-        <w:t>I will also then need to add a new DAO method which will be used for duplicate checking. This will gather all the secondary IDs to be used for comparison.</w:t>
-      </w:r>
-    </w:p>
-    <w:p>
-      <w:pPr>
-        <w:ind w:left="720"/>
-        <w:rPr>
-          <w:rFonts w:ascii="Trebuchet MS" w:hAnsi="Trebuchet MS"/>
-          <w:sz w:val="24"/>
-          <w:szCs w:val="24"/>
-        </w:rPr>
-      </w:pPr>
-    </w:p>
-    <w:p>
-      <w:pPr>
-        <w:ind w:left="720"/>
-        <w:rPr>
-          <w:rFonts w:ascii="Trebuchet MS" w:hAnsi="Trebuchet MS"/>
-          <w:sz w:val="24"/>
-          <w:szCs w:val="24"/>
-        </w:rPr>
-      </w:pPr>
-      <w:r>
-        <w:rPr>
-          <w:rFonts w:ascii="Trebuchet MS" w:hAnsi="Trebuchet MS"/>
-          <w:sz w:val="24"/>
-          <w:szCs w:val="24"/>
-        </w:rPr>
-        <w:t xml:space="preserve">This will need a new function which I will store within my ViewModel. </w:t>
+        <w:t xml:space="preserve">This will need a new function which I will store within my </w:t>
+      </w:r>
+      <w:proofErr w:type="spellStart"/>
+      <w:r>
+        <w:rPr>
+          <w:rFonts w:ascii="Trebuchet MS" w:hAnsi="Trebuchet MS"/>
+          <w:sz w:val="24"/>
+          <w:szCs w:val="24"/>
+        </w:rPr>
+        <w:t>ViewModel</w:t>
+      </w:r>
+      <w:proofErr w:type="spellEnd"/>
+      <w:r>
+        <w:rPr>
+          <w:rFonts w:ascii="Trebuchet MS" w:hAnsi="Trebuchet MS"/>
+          <w:sz w:val="24"/>
+          <w:szCs w:val="24"/>
+        </w:rPr>
+        <w:t xml:space="preserve">. </w:t>
       </w:r>
       <w:r>
         <w:rPr>
@@ -4052,35 +5439,242 @@
           <w:sz w:val="24"/>
           <w:szCs w:val="24"/>
         </w:rPr>
-        <w:t xml:space="preserve">” url which will gather all the pois in the web data base. The function will then, within a coroutine so it can handle the database operations, check each poi in the web database and compare its id with the ones in the local database. The ones that have an id which already exists in the local database are skipped to prevent duplicates. </w:t>
-      </w:r>
-    </w:p>
-    <w:p>
-      <w:pPr>
-        <w:ind w:left="720"/>
-        <w:rPr>
-          <w:rFonts w:ascii="Trebuchet MS" w:hAnsi="Trebuchet MS"/>
-          <w:sz w:val="24"/>
-          <w:szCs w:val="24"/>
-        </w:rPr>
-      </w:pPr>
-    </w:p>
-    <w:p>
-      <w:pPr>
-        <w:ind w:left="720"/>
-        <w:rPr>
-          <w:rFonts w:ascii="Trebuchet MS" w:hAnsi="Trebuchet MS"/>
-          <w:sz w:val="24"/>
-          <w:szCs w:val="24"/>
-        </w:rPr>
-      </w:pPr>
-      <w:r>
-        <w:rPr>
-          <w:rFonts w:ascii="Trebuchet MS" w:hAnsi="Trebuchet MS"/>
-          <w:sz w:val="24"/>
-          <w:szCs w:val="24"/>
-        </w:rPr>
-        <w:t>Then finally for this task I will need to add a new button in the MainActivity which uses the new function.</w:t>
+        <w:t xml:space="preserve">” </w:t>
+      </w:r>
+      <w:proofErr w:type="spellStart"/>
+      <w:r>
+        <w:rPr>
+          <w:rFonts w:ascii="Trebuchet MS" w:hAnsi="Trebuchet MS"/>
+          <w:sz w:val="24"/>
+          <w:szCs w:val="24"/>
+        </w:rPr>
+        <w:t>url</w:t>
+      </w:r>
+      <w:proofErr w:type="spellEnd"/>
+      <w:r>
+        <w:rPr>
+          <w:rFonts w:ascii="Trebuchet MS" w:hAnsi="Trebuchet MS"/>
+          <w:sz w:val="24"/>
+          <w:szCs w:val="24"/>
+        </w:rPr>
+        <w:t xml:space="preserve"> which will gather all the pois in the web data base. The function will then, within a coroutine so it can handle the database operations, check each poi in the web database and compare its id with the ones in the local database. The ones that have an id which already exists in the local database are skipped to prevent duplicates. </w:t>
+      </w:r>
+      <w:r>
+        <w:rPr>
+          <w:rFonts w:ascii="Trebuchet MS" w:hAnsi="Trebuchet MS"/>
+          <w:sz w:val="24"/>
+          <w:szCs w:val="24"/>
+        </w:rPr>
+        <w:t>For those that are not skipped will be added to the local database.</w:t>
+      </w:r>
+    </w:p>
+    <w:p>
+      <w:pPr>
+        <w:ind w:left="720"/>
+        <w:rPr>
+          <w:rFonts w:ascii="Trebuchet MS" w:hAnsi="Trebuchet MS"/>
+          <w:sz w:val="24"/>
+          <w:szCs w:val="24"/>
+        </w:rPr>
+      </w:pPr>
+      <w:r>
+        <w:rPr>
+          <w:noProof/>
+        </w:rPr>
+        <w:drawing>
+          <wp:inline distT="0" distB="0" distL="0" distR="0" wp14:anchorId="652EC7BA" wp14:editId="206F0AAC">
+            <wp:extent cx="5943600" cy="5210810"/>
+            <wp:effectExtent l="0" t="0" r="0" b="8890"/>
+            <wp:docPr id="1067130332" name="Picture 1"/>
+            <wp:cNvGraphicFramePr>
+              <a:graphicFrameLocks xmlns:a="http://schemas.openxmlformats.org/drawingml/2006/main" noChangeAspect="1"/>
+            </wp:cNvGraphicFramePr>
+            <a:graphic xmlns:a="http://schemas.openxmlformats.org/drawingml/2006/main">
+              <a:graphicData uri="http://schemas.openxmlformats.org/drawingml/2006/picture">
+                <pic:pic xmlns:pic="http://schemas.openxmlformats.org/drawingml/2006/picture">
+                  <pic:nvPicPr>
+                    <pic:cNvPr id="1067130332" name=""/>
+                    <pic:cNvPicPr/>
+                  </pic:nvPicPr>
+                  <pic:blipFill>
+                    <a:blip r:embed="rId45"/>
+                    <a:stretch>
+                      <a:fillRect/>
+                    </a:stretch>
+                  </pic:blipFill>
+                  <pic:spPr>
+                    <a:xfrm>
+                      <a:off x="0" y="0"/>
+                      <a:ext cx="5943600" cy="5210810"/>
+                    </a:xfrm>
+                    <a:prstGeom prst="rect">
+                      <a:avLst/>
+                    </a:prstGeom>
+                  </pic:spPr>
+                </pic:pic>
+              </a:graphicData>
+            </a:graphic>
+          </wp:inline>
+        </w:drawing>
+      </w:r>
+    </w:p>
+    <w:p>
+      <w:pPr>
+        <w:ind w:left="720"/>
+        <w:rPr>
+          <w:rFonts w:ascii="Trebuchet MS" w:hAnsi="Trebuchet MS"/>
+          <w:sz w:val="24"/>
+          <w:szCs w:val="24"/>
+        </w:rPr>
+      </w:pPr>
+    </w:p>
+    <w:p>
+      <w:pPr>
+        <w:ind w:left="720"/>
+        <w:rPr>
+          <w:rFonts w:ascii="Trebuchet MS" w:hAnsi="Trebuchet MS"/>
+          <w:sz w:val="24"/>
+          <w:szCs w:val="24"/>
+        </w:rPr>
+      </w:pPr>
+    </w:p>
+    <w:p>
+      <w:pPr>
+        <w:ind w:left="720"/>
+        <w:rPr>
+          <w:rFonts w:ascii="Trebuchet MS" w:hAnsi="Trebuchet MS"/>
+          <w:sz w:val="24"/>
+          <w:szCs w:val="24"/>
+        </w:rPr>
+      </w:pPr>
+    </w:p>
+    <w:p>
+      <w:pPr>
+        <w:ind w:left="720"/>
+        <w:rPr>
+          <w:rFonts w:ascii="Trebuchet MS" w:hAnsi="Trebuchet MS"/>
+          <w:sz w:val="24"/>
+          <w:szCs w:val="24"/>
+        </w:rPr>
+      </w:pPr>
+    </w:p>
+    <w:p>
+      <w:pPr>
+        <w:ind w:left="720"/>
+        <w:rPr>
+          <w:rFonts w:ascii="Trebuchet MS" w:hAnsi="Trebuchet MS"/>
+          <w:sz w:val="24"/>
+          <w:szCs w:val="24"/>
+        </w:rPr>
+      </w:pPr>
+    </w:p>
+    <w:p>
+      <w:pPr>
+        <w:ind w:left="720"/>
+        <w:rPr>
+          <w:rFonts w:ascii="Trebuchet MS" w:hAnsi="Trebuchet MS"/>
+          <w:sz w:val="24"/>
+          <w:szCs w:val="24"/>
+        </w:rPr>
+      </w:pPr>
+      <w:r>
+        <w:rPr>
+          <w:noProof/>
+        </w:rPr>
+        <w:lastRenderedPageBreak/>
+        <w:drawing>
+          <wp:anchor distT="0" distB="0" distL="114300" distR="114300" simplePos="0" relativeHeight="251700224" behindDoc="0" locked="0" layoutInCell="1" allowOverlap="1" wp14:anchorId="4B422035" wp14:editId="5A08A4DA">
+            <wp:simplePos x="0" y="0"/>
+            <wp:positionH relativeFrom="margin">
+              <wp:align>center</wp:align>
+            </wp:positionH>
+            <wp:positionV relativeFrom="paragraph">
+              <wp:posOffset>523875</wp:posOffset>
+            </wp:positionV>
+            <wp:extent cx="4171950" cy="1304925"/>
+            <wp:effectExtent l="0" t="0" r="0" b="9525"/>
+            <wp:wrapTopAndBottom/>
+            <wp:docPr id="1813035469" name="Picture 1"/>
+            <wp:cNvGraphicFramePr>
+              <a:graphicFrameLocks xmlns:a="http://schemas.openxmlformats.org/drawingml/2006/main" noChangeAspect="1"/>
+            </wp:cNvGraphicFramePr>
+            <a:graphic xmlns:a="http://schemas.openxmlformats.org/drawingml/2006/main">
+              <a:graphicData uri="http://schemas.openxmlformats.org/drawingml/2006/picture">
+                <pic:pic xmlns:pic="http://schemas.openxmlformats.org/drawingml/2006/picture">
+                  <pic:nvPicPr>
+                    <pic:cNvPr id="1813035469" name=""/>
+                    <pic:cNvPicPr/>
+                  </pic:nvPicPr>
+                  <pic:blipFill>
+                    <a:blip r:embed="rId46">
+                      <a:extLst>
+                        <a:ext uri="{28A0092B-C50C-407E-A947-70E740481C1C}">
+                          <a14:useLocalDpi xmlns:a14="http://schemas.microsoft.com/office/drawing/2010/main" val="0"/>
+                        </a:ext>
+                      </a:extLst>
+                    </a:blip>
+                    <a:stretch>
+                      <a:fillRect/>
+                    </a:stretch>
+                  </pic:blipFill>
+                  <pic:spPr>
+                    <a:xfrm>
+                      <a:off x="0" y="0"/>
+                      <a:ext cx="4171950" cy="1304925"/>
+                    </a:xfrm>
+                    <a:prstGeom prst="rect">
+                      <a:avLst/>
+                    </a:prstGeom>
+                  </pic:spPr>
+                </pic:pic>
+              </a:graphicData>
+            </a:graphic>
+          </wp:anchor>
+        </w:drawing>
+      </w:r>
+      <w:r>
+        <w:rPr>
+          <w:rFonts w:ascii="Trebuchet MS" w:hAnsi="Trebuchet MS"/>
+          <w:sz w:val="24"/>
+          <w:szCs w:val="24"/>
+        </w:rPr>
+        <w:t xml:space="preserve">Then finally for this task I will need to add a new button </w:t>
+      </w:r>
+      <w:proofErr w:type="gramStart"/>
+      <w:r>
+        <w:rPr>
+          <w:rFonts w:ascii="Trebuchet MS" w:hAnsi="Trebuchet MS"/>
+          <w:sz w:val="24"/>
+          <w:szCs w:val="24"/>
+        </w:rPr>
+        <w:t>in</w:t>
+      </w:r>
+      <w:proofErr w:type="gramEnd"/>
+      <w:r>
+        <w:rPr>
+          <w:rFonts w:ascii="Trebuchet MS" w:hAnsi="Trebuchet MS"/>
+          <w:sz w:val="24"/>
+          <w:szCs w:val="24"/>
+        </w:rPr>
+        <w:t xml:space="preserve"> the </w:t>
+      </w:r>
+      <w:proofErr w:type="spellStart"/>
+      <w:r>
+        <w:rPr>
+          <w:rFonts w:ascii="Trebuchet MS" w:hAnsi="Trebuchet MS"/>
+          <w:sz w:val="24"/>
+          <w:szCs w:val="24"/>
+        </w:rPr>
+        <w:t>MainActivity</w:t>
+      </w:r>
+      <w:proofErr w:type="spellEnd"/>
+      <w:r>
+        <w:rPr>
+          <w:rFonts w:ascii="Trebuchet MS" w:hAnsi="Trebuchet MS"/>
+          <w:sz w:val="24"/>
+          <w:szCs w:val="24"/>
+        </w:rPr>
+        <w:t xml:space="preserve"> which uses the new function.</w:t>
       </w:r>
       <w:r>
         <w:rPr>
@@ -4090,6 +5684,16 @@
         </w:rPr>
         <w:t xml:space="preserve"> </w:t>
       </w:r>
+    </w:p>
+    <w:p>
+      <w:pPr>
+        <w:ind w:left="720"/>
+        <w:rPr>
+          <w:rFonts w:ascii="Trebuchet MS" w:hAnsi="Trebuchet MS"/>
+          <w:sz w:val="24"/>
+          <w:szCs w:val="24"/>
+        </w:rPr>
+      </w:pPr>
     </w:p>
     <w:p>
       <w:pPr>

</xml_diff>

<commit_message>
Report updated for task 7
</commit_message>
<xml_diff>
--- a/MAD_Report.docx
+++ b/MAD_Report.docx
@@ -4510,17 +4510,7 @@
           <w:sz w:val="24"/>
           <w:szCs w:val="24"/>
         </w:rPr>
-        <w:t>“</w:t>
-      </w:r>
-      <w:r>
-        <w:rPr>
-          <w:rFonts w:ascii="Trebuchet MS" w:hAnsi="Trebuchet MS"/>
-          <w:i/>
-          <w:iCs/>
-          <w:sz w:val="24"/>
-          <w:szCs w:val="24"/>
-        </w:rPr>
-        <w:t>The user should be able to load points of interest from the web. You should connect to the following web service (</w:t>
+        <w:t>“The user should be able to load points of interest from the web. You should connect to the following web service (</w:t>
       </w:r>
       <w:r>
         <w:rPr>
@@ -4624,17 +4614,7 @@
           <w:sz w:val="24"/>
           <w:szCs w:val="24"/>
         </w:rPr>
-        <w:t xml:space="preserve"> they should be shown on the map as markers and saved to the database. To avoid duplicate entries in the database, check whether the point of interest with that ID is already present before adding it.</w:t>
-      </w:r>
-      <w:r>
-        <w:rPr>
-          <w:rFonts w:ascii="Trebuchet MS" w:hAnsi="Trebuchet MS"/>
-          <w:i/>
-          <w:iCs/>
-          <w:sz w:val="24"/>
-          <w:szCs w:val="24"/>
-        </w:rPr>
-        <w:t>”</w:t>
+        <w:t xml:space="preserve"> they should be shown on the map as markers and saved to the database. To avoid duplicate entries in the database, check whether the point of interest with that ID is already present before adding it.”</w:t>
       </w:r>
     </w:p>
     <w:p>
@@ -5725,13 +5705,481 @@
     </w:p>
     <w:p>
       <w:pPr>
-        <w:ind w:left="720"/>
-        <w:rPr>
-          <w:sz w:val="24"/>
-          <w:szCs w:val="24"/>
-        </w:rPr>
-      </w:pPr>
-    </w:p>
+        <w:rPr>
+          <w:i/>
+          <w:iCs/>
+          <w:sz w:val="24"/>
+          <w:szCs w:val="24"/>
+        </w:rPr>
+      </w:pPr>
+      <w:r>
+        <w:rPr>
+          <w:rFonts w:ascii="Trebuchet MS" w:hAnsi="Trebuchet MS"/>
+          <w:sz w:val="24"/>
+          <w:szCs w:val="24"/>
+        </w:rPr>
+        <w:t xml:space="preserve">7. </w:t>
+      </w:r>
+      <w:r>
+        <w:rPr>
+          <w:rFonts w:ascii="Trebuchet MS" w:hAnsi="Trebuchet MS"/>
+          <w:i/>
+          <w:iCs/>
+          <w:sz w:val="24"/>
+          <w:szCs w:val="24"/>
+        </w:rPr>
+        <w:t>“</w:t>
+      </w:r>
+      <w:r>
+        <w:rPr>
+          <w:rFonts w:ascii="Trebuchet MS" w:hAnsi="Trebuchet MS"/>
+          <w:i/>
+          <w:iCs/>
+          <w:sz w:val="24"/>
+          <w:szCs w:val="24"/>
+        </w:rPr>
+        <w:t xml:space="preserve">A point of interest should be saved to the web after it has been added to the map and </w:t>
+      </w:r>
+      <w:r>
+        <w:rPr>
+          <w:rFonts w:ascii="Trebuchet MS" w:hAnsi="Trebuchet MS"/>
+          <w:i/>
+          <w:iCs/>
+          <w:sz w:val="24"/>
+          <w:szCs w:val="24"/>
+          <w:u w:val="single"/>
+        </w:rPr>
+        <w:t>before</w:t>
+      </w:r>
+      <w:r>
+        <w:rPr>
+          <w:rFonts w:ascii="Trebuchet MS" w:hAnsi="Trebuchet MS"/>
+          <w:i/>
+          <w:iCs/>
+          <w:sz w:val="24"/>
+          <w:szCs w:val="24"/>
+        </w:rPr>
+        <w:t xml:space="preserve"> it is added to the database.</w:t>
+      </w:r>
+    </w:p>
+    <w:p>
+      <w:pPr>
+        <w:rPr>
+          <w:i/>
+          <w:iCs/>
+          <w:sz w:val="24"/>
+          <w:szCs w:val="24"/>
+        </w:rPr>
+      </w:pPr>
+      <w:r>
+        <w:rPr>
+          <w:rFonts w:ascii="Trebuchet MS" w:hAnsi="Trebuchet MS"/>
+          <w:i/>
+          <w:iCs/>
+          <w:sz w:val="24"/>
+          <w:szCs w:val="24"/>
+          <w:u w:val="single"/>
+        </w:rPr>
+        <w:t>Again, use the supplied Node server</w:t>
+      </w:r>
+      <w:r>
+        <w:rPr>
+          <w:rFonts w:ascii="Trebuchet MS" w:hAnsi="Trebuchet MS"/>
+          <w:i/>
+          <w:iCs/>
+          <w:sz w:val="24"/>
+          <w:szCs w:val="24"/>
+        </w:rPr>
+        <w:t>) with a method of POST:</w:t>
+      </w:r>
+    </w:p>
+    <w:p>
+      <w:pPr>
+        <w:rPr>
+          <w:i/>
+          <w:iCs/>
+          <w:sz w:val="24"/>
+          <w:szCs w:val="24"/>
+        </w:rPr>
+      </w:pPr>
+      <w:r>
+        <w:rPr>
+          <w:rFonts w:ascii="DejaVu Sans Mono" w:hAnsi="DejaVu Sans Mono"/>
+          <w:i/>
+          <w:iCs/>
+          <w:sz w:val="24"/>
+          <w:szCs w:val="24"/>
+        </w:rPr>
+        <w:t>http://10.0.2.2:3000/poi/create</w:t>
+      </w:r>
+    </w:p>
+    <w:p>
+      <w:pPr>
+        <w:rPr>
+          <w:i/>
+          <w:iCs/>
+          <w:sz w:val="24"/>
+          <w:szCs w:val="24"/>
+        </w:rPr>
+      </w:pPr>
+      <w:r>
+        <w:rPr>
+          <w:rFonts w:ascii="Trebuchet MS" w:hAnsi="Trebuchet MS"/>
+          <w:i/>
+          <w:iCs/>
+          <w:sz w:val="24"/>
+          <w:szCs w:val="24"/>
+        </w:rPr>
+        <w:t>The following POST parameters must be specified:</w:t>
+      </w:r>
+    </w:p>
+    <w:p>
+      <w:pPr>
+        <w:rPr>
+          <w:i/>
+          <w:iCs/>
+          <w:sz w:val="24"/>
+          <w:szCs w:val="24"/>
+        </w:rPr>
+      </w:pPr>
+      <w:r>
+        <w:rPr>
+          <w:rFonts w:ascii="Trebuchet MS" w:hAnsi="Trebuchet MS"/>
+          <w:i/>
+          <w:iCs/>
+          <w:sz w:val="24"/>
+          <w:szCs w:val="24"/>
+        </w:rPr>
+        <w:t>- name (the point of interest name)</w:t>
+      </w:r>
+    </w:p>
+    <w:p>
+      <w:pPr>
+        <w:rPr>
+          <w:i/>
+          <w:iCs/>
+          <w:sz w:val="24"/>
+          <w:szCs w:val="24"/>
+        </w:rPr>
+      </w:pPr>
+      <w:r>
+        <w:rPr>
+          <w:rFonts w:ascii="Trebuchet MS" w:hAnsi="Trebuchet MS"/>
+          <w:i/>
+          <w:iCs/>
+          <w:sz w:val="24"/>
+          <w:szCs w:val="24"/>
+        </w:rPr>
+        <w:t>- type (the point of interest type)</w:t>
+      </w:r>
+    </w:p>
+    <w:p>
+      <w:pPr>
+        <w:rPr>
+          <w:i/>
+          <w:iCs/>
+          <w:sz w:val="24"/>
+          <w:szCs w:val="24"/>
+        </w:rPr>
+      </w:pPr>
+      <w:r>
+        <w:rPr>
+          <w:rFonts w:ascii="Trebuchet MS" w:hAnsi="Trebuchet MS"/>
+          <w:i/>
+          <w:iCs/>
+          <w:sz w:val="24"/>
+          <w:szCs w:val="24"/>
+        </w:rPr>
+        <w:t>- description (the point of interest description)</w:t>
+      </w:r>
+    </w:p>
+    <w:p>
+      <w:pPr>
+        <w:rPr>
+          <w:i/>
+          <w:iCs/>
+          <w:sz w:val="24"/>
+          <w:szCs w:val="24"/>
+        </w:rPr>
+      </w:pPr>
+      <w:r>
+        <w:rPr>
+          <w:rFonts w:ascii="Trebuchet MS" w:hAnsi="Trebuchet MS"/>
+          <w:i/>
+          <w:iCs/>
+          <w:sz w:val="24"/>
+          <w:szCs w:val="24"/>
+        </w:rPr>
+        <w:t xml:space="preserve">- </w:t>
+      </w:r>
+      <w:proofErr w:type="spellStart"/>
+      <w:r>
+        <w:rPr>
+          <w:rFonts w:ascii="Trebuchet MS" w:hAnsi="Trebuchet MS"/>
+          <w:i/>
+          <w:iCs/>
+          <w:sz w:val="24"/>
+          <w:szCs w:val="24"/>
+        </w:rPr>
+        <w:t>lat</w:t>
+      </w:r>
+      <w:proofErr w:type="spellEnd"/>
+      <w:r>
+        <w:rPr>
+          <w:rFonts w:ascii="Trebuchet MS" w:hAnsi="Trebuchet MS"/>
+          <w:i/>
+          <w:iCs/>
+          <w:sz w:val="24"/>
+          <w:szCs w:val="24"/>
+        </w:rPr>
+        <w:t xml:space="preserve"> (the latitude)</w:t>
+      </w:r>
+    </w:p>
+    <w:p>
+      <w:pPr>
+        <w:rPr>
+          <w:i/>
+          <w:iCs/>
+          <w:sz w:val="24"/>
+          <w:szCs w:val="24"/>
+        </w:rPr>
+      </w:pPr>
+      <w:r>
+        <w:rPr>
+          <w:rFonts w:ascii="Trebuchet MS" w:hAnsi="Trebuchet MS"/>
+          <w:i/>
+          <w:iCs/>
+          <w:sz w:val="24"/>
+          <w:szCs w:val="24"/>
+        </w:rPr>
+        <w:t xml:space="preserve">- </w:t>
+      </w:r>
+      <w:proofErr w:type="spellStart"/>
+      <w:r>
+        <w:rPr>
+          <w:rFonts w:ascii="Trebuchet MS" w:hAnsi="Trebuchet MS"/>
+          <w:i/>
+          <w:iCs/>
+          <w:sz w:val="24"/>
+          <w:szCs w:val="24"/>
+        </w:rPr>
+        <w:t>lon</w:t>
+      </w:r>
+      <w:proofErr w:type="spellEnd"/>
+      <w:r>
+        <w:rPr>
+          <w:rFonts w:ascii="Trebuchet MS" w:hAnsi="Trebuchet MS"/>
+          <w:i/>
+          <w:iCs/>
+          <w:sz w:val="24"/>
+          <w:szCs w:val="24"/>
+        </w:rPr>
+        <w:t xml:space="preserve"> (the longitude).</w:t>
+      </w:r>
+    </w:p>
+    <w:p>
+      <w:pPr>
+        <w:rPr>
+          <w:i/>
+          <w:iCs/>
+          <w:color w:val="FFFFFF"/>
+          <w:sz w:val="4"/>
+          <w:szCs w:val="4"/>
+        </w:rPr>
+      </w:pPr>
+      <w:r>
+        <w:rPr>
+          <w:rFonts w:ascii="Trebuchet MS" w:hAnsi="Trebuchet MS"/>
+          <w:i/>
+          <w:iCs/>
+          <w:color w:val="FFFFFF"/>
+          <w:sz w:val="4"/>
+          <w:szCs w:val="4"/>
+        </w:rPr>
+        <w:t>- API ID. This should be set to the value 0x4d4144</w:t>
+      </w:r>
+    </w:p>
+    <w:p>
+      <w:pPr>
+        <w:rPr>
+          <w:i/>
+          <w:iCs/>
+          <w:sz w:val="24"/>
+          <w:szCs w:val="24"/>
+        </w:rPr>
+      </w:pPr>
+      <w:r>
+        <w:rPr>
+          <w:rFonts w:ascii="Trebuchet MS" w:hAnsi="Trebuchet MS"/>
+          <w:i/>
+          <w:iCs/>
+          <w:sz w:val="24"/>
+          <w:szCs w:val="24"/>
+        </w:rPr>
+        <w:t xml:space="preserve">The server will return an ID, and you should use </w:t>
+      </w:r>
+      <w:r>
+        <w:rPr>
+          <w:rFonts w:ascii="Trebuchet MS" w:hAnsi="Trebuchet MS"/>
+          <w:i/>
+          <w:iCs/>
+          <w:sz w:val="24"/>
+          <w:szCs w:val="24"/>
+          <w:u w:val="single"/>
+        </w:rPr>
+        <w:t>this</w:t>
+      </w:r>
+      <w:r>
+        <w:rPr>
+          <w:rFonts w:ascii="Trebuchet MS" w:hAnsi="Trebuchet MS"/>
+          <w:i/>
+          <w:iCs/>
+          <w:sz w:val="24"/>
+          <w:szCs w:val="24"/>
+        </w:rPr>
+        <w:t xml:space="preserve"> ID to save it in the database.</w:t>
+      </w:r>
+      <w:r>
+        <w:rPr>
+          <w:rFonts w:ascii="Trebuchet MS" w:hAnsi="Trebuchet MS"/>
+          <w:i/>
+          <w:iCs/>
+          <w:sz w:val="24"/>
+          <w:szCs w:val="24"/>
+        </w:rPr>
+        <w:t>”</w:t>
+      </w:r>
+    </w:p>
+    <w:p>
+      <w:pPr>
+        <w:rPr>
+          <w:sz w:val="24"/>
+          <w:szCs w:val="24"/>
+        </w:rPr>
+      </w:pPr>
+    </w:p>
+    <w:p>
+      <w:r>
+        <w:t xml:space="preserve">To start this task, I will need to change my </w:t>
+      </w:r>
+      <w:proofErr w:type="spellStart"/>
+      <w:proofErr w:type="gramStart"/>
+      <w:r>
+        <w:t>addPoi</w:t>
+      </w:r>
+      <w:proofErr w:type="spellEnd"/>
+      <w:r>
+        <w:t>(</w:t>
+      </w:r>
+      <w:proofErr w:type="gramEnd"/>
+      <w:r>
+        <w:t xml:space="preserve">) function in the </w:t>
+      </w:r>
+      <w:proofErr w:type="spellStart"/>
+      <w:r>
+        <w:t>Viewmodel</w:t>
+      </w:r>
+      <w:proofErr w:type="spellEnd"/>
+      <w:r>
+        <w:t xml:space="preserve">. I will change the function so that instead of inserting the poi into the local database straight away it will first POST to the server using </w:t>
+      </w:r>
+      <w:r>
+        <w:t xml:space="preserve">the </w:t>
+      </w:r>
+      <w:hyperlink r:id="rId47" w:history="1">
+        <w:r>
+          <w:rPr>
+            <w:rStyle w:val="Hyperlink"/>
+          </w:rPr>
+          <w:t>http://10.0.2.2:3000/poi/creat</w:t>
+        </w:r>
+        <w:r>
+          <w:rPr>
+            <w:rStyle w:val="Hyperlink"/>
+          </w:rPr>
+          <w:t>e</w:t>
+        </w:r>
+      </w:hyperlink>
+      <w:r>
+        <w:t xml:space="preserve"> </w:t>
+      </w:r>
+      <w:proofErr w:type="spellStart"/>
+      <w:r>
+        <w:t>url</w:t>
+      </w:r>
+      <w:proofErr w:type="spellEnd"/>
+      <w:r>
+        <w:t xml:space="preserve">, which will return the ID, then the function will use this ID as the </w:t>
+      </w:r>
+      <w:proofErr w:type="spellStart"/>
+      <w:r>
+        <w:t>webId</w:t>
+      </w:r>
+      <w:proofErr w:type="spellEnd"/>
+      <w:r>
+        <w:t xml:space="preserve"> then save it locally using the poi DAO insert function.. This makes sure that the poi is only added to the local database if it is successfully added to the web data base. This prevents any misalignment between the two databases.</w:t>
+      </w:r>
+    </w:p>
+    <w:p/>
+    <w:p>
+      <w:r>
+        <w:t xml:space="preserve">I will need to make sure to decode the returned ID to a string and then to a long to make sure it matches the typing in the local database. </w:t>
+      </w:r>
+    </w:p>
+    <w:p/>
+    <w:p>
+      <w:r>
+        <w:t xml:space="preserve">Since the original poi has </w:t>
+      </w:r>
+      <w:proofErr w:type="spellStart"/>
+      <w:r>
+        <w:t>webId</w:t>
+      </w:r>
+      <w:proofErr w:type="spellEnd"/>
+      <w:r>
+        <w:t xml:space="preserve"> set to null, I will </w:t>
+      </w:r>
+      <w:proofErr w:type="gramStart"/>
+      <w:r>
+        <w:t>use .copy</w:t>
+      </w:r>
+      <w:proofErr w:type="gramEnd"/>
+      <w:r>
+        <w:t xml:space="preserve">() to create a new Poi object with the same fields but with the null </w:t>
+      </w:r>
+      <w:proofErr w:type="spellStart"/>
+      <w:r>
+        <w:t>webId</w:t>
+      </w:r>
+      <w:proofErr w:type="spellEnd"/>
+      <w:r>
+        <w:t xml:space="preserve"> replaced by the ID returned by the server. The original poi </w:t>
+      </w:r>
+      <w:r>
+        <w:t>will then be removed</w:t>
+      </w:r>
+      <w:r>
+        <w:t xml:space="preserve">. This </w:t>
+      </w:r>
+      <w:r>
+        <w:t xml:space="preserve">makes sure </w:t>
+      </w:r>
+      <w:r>
+        <w:t xml:space="preserve">that the record saved to the local database has a </w:t>
+      </w:r>
+      <w:proofErr w:type="spellStart"/>
+      <w:r>
+        <w:t>webId</w:t>
+      </w:r>
+      <w:proofErr w:type="spellEnd"/>
+      <w:r>
+        <w:t xml:space="preserve"> that matches the server</w:t>
+      </w:r>
+      <w:r>
+        <w:t>.</w:t>
+      </w:r>
+    </w:p>
+    <w:p/>
     <w:p/>
     <w:sectPr>
       <w:pgSz w:w="12240" w:h="15840"/>
@@ -6142,6 +6590,7 @@
   <w:style w:type="paragraph" w:default="1" w:styleId="Normal">
     <w:name w:val="Normal"/>
     <w:qFormat/>
+    <w:rsid w:val="004F208C"/>
   </w:style>
   <w:style w:type="paragraph" w:styleId="Heading1">
     <w:name w:val="heading 1"/>

</xml_diff>

<commit_message>
Added code snippets to report for task 7
</commit_message>
<xml_diff>
--- a/MAD_Report.docx
+++ b/MAD_Report.docx
@@ -373,73 +373,7 @@
           <w:sz w:val="24"/>
           <w:szCs w:val="24"/>
         </w:rPr>
-        <w:t xml:space="preserve">I will first start with this task by setting up the dependencies in my </w:t>
-      </w:r>
-      <w:proofErr w:type="spellStart"/>
-      <w:proofErr w:type="gramStart"/>
-      <w:r>
-        <w:rPr>
-          <w:rFonts w:ascii="Trebuchet MS" w:eastAsia="Trebuchet MS" w:hAnsi="Trebuchet MS" w:cs="Trebuchet MS"/>
-          <w:sz w:val="24"/>
-          <w:szCs w:val="24"/>
-        </w:rPr>
-        <w:t>build.gradle</w:t>
-      </w:r>
-      <w:proofErr w:type="spellEnd"/>
-      <w:proofErr w:type="gramEnd"/>
-      <w:r>
-        <w:rPr>
-          <w:rFonts w:ascii="Trebuchet MS" w:eastAsia="Trebuchet MS" w:hAnsi="Trebuchet MS" w:cs="Trebuchet MS"/>
-          <w:sz w:val="24"/>
-          <w:szCs w:val="24"/>
-        </w:rPr>
-        <w:t xml:space="preserve"> and </w:t>
-      </w:r>
-      <w:proofErr w:type="spellStart"/>
-      <w:proofErr w:type="gramStart"/>
-      <w:r>
-        <w:rPr>
-          <w:rFonts w:ascii="Trebuchet MS" w:eastAsia="Trebuchet MS" w:hAnsi="Trebuchet MS" w:cs="Trebuchet MS"/>
-          <w:sz w:val="24"/>
-          <w:szCs w:val="24"/>
-        </w:rPr>
-        <w:t>libs.versions</w:t>
-      </w:r>
-      <w:proofErr w:type="gramEnd"/>
-      <w:r>
-        <w:rPr>
-          <w:rFonts w:ascii="Trebuchet MS" w:eastAsia="Trebuchet MS" w:hAnsi="Trebuchet MS" w:cs="Trebuchet MS"/>
-          <w:sz w:val="24"/>
-          <w:szCs w:val="24"/>
-        </w:rPr>
-        <w:t>.toml</w:t>
-      </w:r>
-      <w:proofErr w:type="spellEnd"/>
-      <w:r>
-        <w:rPr>
-          <w:rFonts w:ascii="Trebuchet MS" w:eastAsia="Trebuchet MS" w:hAnsi="Trebuchet MS" w:cs="Trebuchet MS"/>
-          <w:sz w:val="24"/>
-          <w:szCs w:val="24"/>
-        </w:rPr>
-        <w:t xml:space="preserve"> files. I will add </w:t>
-      </w:r>
-      <w:proofErr w:type="spellStart"/>
-      <w:r>
-        <w:rPr>
-          <w:rFonts w:ascii="Trebuchet MS" w:eastAsia="Trebuchet MS" w:hAnsi="Trebuchet MS" w:cs="Trebuchet MS"/>
-          <w:sz w:val="24"/>
-          <w:szCs w:val="24"/>
-        </w:rPr>
-        <w:t>MapLibre</w:t>
-      </w:r>
-      <w:proofErr w:type="spellEnd"/>
-      <w:r>
-        <w:rPr>
-          <w:rFonts w:ascii="Trebuchet MS" w:eastAsia="Trebuchet MS" w:hAnsi="Trebuchet MS" w:cs="Trebuchet MS"/>
-          <w:sz w:val="24"/>
-          <w:szCs w:val="24"/>
-        </w:rPr>
-        <w:t xml:space="preserve"> with Vulkan support, the Ramani Maps Compose wrapper, and the standard AndroidX libraries needed for Compose.</w:t>
+        <w:t>I will first start with this task by setting up the dependencies in my build.gradle and libs.versions.toml files. I will add MapLibre with Vulkan support, the Ramani Maps Compose wrapper, and the standard AndroidX libraries needed for Compose.</w:t>
       </w:r>
       <w:r>
         <w:rPr>
@@ -572,25 +506,7 @@
           <w:sz w:val="24"/>
           <w:szCs w:val="24"/>
         </w:rPr>
-        <w:t xml:space="preserve">Then in the AndroidManifest.xml, I will set up the ACCESS_FINE_LOCATION and ACCESS_COARSE_LOCATION permissions, as well as INTERNET, since the map tiles will be gathered remotely from </w:t>
-      </w:r>
-      <w:proofErr w:type="spellStart"/>
-      <w:r>
-        <w:rPr>
-          <w:rFonts w:ascii="Trebuchet MS" w:eastAsia="Trebuchet MS" w:hAnsi="Trebuchet MS" w:cs="Trebuchet MS"/>
-          <w:sz w:val="24"/>
-          <w:szCs w:val="24"/>
-        </w:rPr>
-        <w:t>OpenFreeMap</w:t>
-      </w:r>
-      <w:proofErr w:type="spellEnd"/>
-      <w:r>
-        <w:rPr>
-          <w:rFonts w:ascii="Trebuchet MS" w:eastAsia="Trebuchet MS" w:hAnsi="Trebuchet MS" w:cs="Trebuchet MS"/>
-          <w:sz w:val="24"/>
-          <w:szCs w:val="24"/>
-        </w:rPr>
-        <w:t>.</w:t>
+        <w:t>Then in the AndroidManifest.xml, I will set up the ACCESS_FINE_LOCATION and ACCESS_COARSE_LOCATION permissions, as well as INTERNET, since the map tiles will be gathered remotely from OpenFreeMap.</w:t>
       </w:r>
       <w:r>
         <w:rPr>
@@ -736,61 +652,7 @@
           <w:sz w:val="24"/>
           <w:szCs w:val="24"/>
         </w:rPr>
-        <w:t xml:space="preserve">To manage the location state in both the activity and UI, I will need to add a </w:t>
-      </w:r>
-      <w:proofErr w:type="spellStart"/>
-      <w:r>
-        <w:rPr>
-          <w:rFonts w:ascii="Trebuchet MS" w:eastAsia="Trebuchet MS" w:hAnsi="Trebuchet MS" w:cs="Trebuchet MS"/>
-          <w:sz w:val="24"/>
-          <w:szCs w:val="24"/>
-        </w:rPr>
-        <w:t>LatLngViewModel</w:t>
-      </w:r>
-      <w:proofErr w:type="spellEnd"/>
-      <w:r>
-        <w:rPr>
-          <w:rFonts w:ascii="Trebuchet MS" w:eastAsia="Trebuchet MS" w:hAnsi="Trebuchet MS" w:cs="Trebuchet MS"/>
-          <w:sz w:val="24"/>
-          <w:szCs w:val="24"/>
-        </w:rPr>
-        <w:t xml:space="preserve"> class that will hold a </w:t>
-      </w:r>
-      <w:proofErr w:type="spellStart"/>
-      <w:r>
-        <w:rPr>
-          <w:rFonts w:ascii="Trebuchet MS" w:eastAsia="Trebuchet MS" w:hAnsi="Trebuchet MS" w:cs="Trebuchet MS"/>
-          <w:sz w:val="24"/>
-          <w:szCs w:val="24"/>
-        </w:rPr>
-        <w:t>latLng</w:t>
-      </w:r>
-      <w:proofErr w:type="spellEnd"/>
-      <w:r>
-        <w:rPr>
-          <w:rFonts w:ascii="Trebuchet MS" w:eastAsia="Trebuchet MS" w:hAnsi="Trebuchet MS" w:cs="Trebuchet MS"/>
-          <w:sz w:val="24"/>
-          <w:szCs w:val="24"/>
-        </w:rPr>
-        <w:t xml:space="preserve"> property backed by a </w:t>
-      </w:r>
-      <w:proofErr w:type="spellStart"/>
-      <w:r>
-        <w:rPr>
-          <w:rFonts w:ascii="Trebuchet MS" w:eastAsia="Trebuchet MS" w:hAnsi="Trebuchet MS" w:cs="Trebuchet MS"/>
-          <w:sz w:val="24"/>
-          <w:szCs w:val="24"/>
-        </w:rPr>
-        <w:t>MutableLiveData</w:t>
-      </w:r>
-      <w:proofErr w:type="spellEnd"/>
-      <w:r>
-        <w:rPr>
-          <w:rFonts w:ascii="Trebuchet MS" w:eastAsia="Trebuchet MS" w:hAnsi="Trebuchet MS" w:cs="Trebuchet MS"/>
-          <w:sz w:val="24"/>
-          <w:szCs w:val="24"/>
-        </w:rPr>
-        <w:t xml:space="preserve"> object. </w:t>
+        <w:t xml:space="preserve">To manage the location state in both the activity and UI, I will need to add a LatLngViewModel class that will hold a latLng property backed by a MutableLiveData object. </w:t>
       </w:r>
     </w:p>
     <w:p>
@@ -817,43 +679,7 @@
           <w:szCs w:val="24"/>
         </w:rPr>
         <w:lastRenderedPageBreak/>
-        <w:t xml:space="preserve">Whenever the </w:t>
-      </w:r>
-      <w:proofErr w:type="spellStart"/>
-      <w:r>
-        <w:rPr>
-          <w:rFonts w:ascii="Trebuchet MS" w:eastAsia="Trebuchet MS" w:hAnsi="Trebuchet MS" w:cs="Trebuchet MS"/>
-          <w:sz w:val="24"/>
-          <w:szCs w:val="24"/>
-        </w:rPr>
-        <w:t>latLng</w:t>
-      </w:r>
-      <w:proofErr w:type="spellEnd"/>
-      <w:r>
-        <w:rPr>
-          <w:rFonts w:ascii="Trebuchet MS" w:eastAsia="Trebuchet MS" w:hAnsi="Trebuchet MS" w:cs="Trebuchet MS"/>
-          <w:sz w:val="24"/>
-          <w:szCs w:val="24"/>
-        </w:rPr>
-        <w:t xml:space="preserve"> is updated, i.e. the user's location changes, it should automatically push the new value to </w:t>
-      </w:r>
-      <w:proofErr w:type="spellStart"/>
-      <w:r>
-        <w:rPr>
-          <w:rFonts w:ascii="Trebuchet MS" w:eastAsia="Trebuchet MS" w:hAnsi="Trebuchet MS" w:cs="Trebuchet MS"/>
-          <w:sz w:val="24"/>
-          <w:szCs w:val="24"/>
-        </w:rPr>
-        <w:t>latLngLiveData</w:t>
-      </w:r>
-      <w:proofErr w:type="spellEnd"/>
-      <w:r>
-        <w:rPr>
-          <w:rFonts w:ascii="Trebuchet MS" w:eastAsia="Trebuchet MS" w:hAnsi="Trebuchet MS" w:cs="Trebuchet MS"/>
-          <w:sz w:val="24"/>
-          <w:szCs w:val="24"/>
-        </w:rPr>
-        <w:t xml:space="preserve">, making it observable from the UI layer.  </w:t>
+        <w:t xml:space="preserve">Whenever the latLng is updated, i.e. the user's location changes, it should automatically push the new value to latLngLiveData, making it observable from the UI layer.  </w:t>
       </w:r>
     </w:p>
     <w:p>
@@ -945,97 +771,7 @@
           <w:sz w:val="24"/>
           <w:szCs w:val="24"/>
         </w:rPr>
-        <w:t xml:space="preserve">In the </w:t>
-      </w:r>
-      <w:proofErr w:type="spellStart"/>
-      <w:r>
-        <w:rPr>
-          <w:rFonts w:ascii="Trebuchet MS" w:eastAsia="Trebuchet MS" w:hAnsi="Trebuchet MS" w:cs="Trebuchet MS"/>
-          <w:sz w:val="24"/>
-          <w:szCs w:val="24"/>
-        </w:rPr>
-        <w:t>MainActivity</w:t>
-      </w:r>
-      <w:proofErr w:type="spellEnd"/>
-      <w:r>
-        <w:rPr>
-          <w:rFonts w:ascii="Trebuchet MS" w:eastAsia="Trebuchet MS" w:hAnsi="Trebuchet MS" w:cs="Trebuchet MS"/>
-          <w:sz w:val="24"/>
-          <w:szCs w:val="24"/>
-        </w:rPr>
-        <w:t xml:space="preserve">, I will add the </w:t>
-      </w:r>
-      <w:proofErr w:type="spellStart"/>
-      <w:r>
-        <w:rPr>
-          <w:rFonts w:ascii="Trebuchet MS" w:eastAsia="Trebuchet MS" w:hAnsi="Trebuchet MS" w:cs="Trebuchet MS"/>
-          <w:sz w:val="24"/>
-          <w:szCs w:val="24"/>
-        </w:rPr>
-        <w:t>LocationListener</w:t>
-      </w:r>
-      <w:proofErr w:type="spellEnd"/>
-      <w:r>
-        <w:rPr>
-          <w:rFonts w:ascii="Trebuchet MS" w:eastAsia="Trebuchet MS" w:hAnsi="Trebuchet MS" w:cs="Trebuchet MS"/>
-          <w:sz w:val="24"/>
-          <w:szCs w:val="24"/>
-        </w:rPr>
-        <w:t xml:space="preserve"> interface. This will allow me to override the </w:t>
-      </w:r>
-      <w:proofErr w:type="spellStart"/>
-      <w:r>
-        <w:rPr>
-          <w:rFonts w:ascii="Trebuchet MS" w:eastAsia="Trebuchet MS" w:hAnsi="Trebuchet MS" w:cs="Trebuchet MS"/>
-          <w:sz w:val="24"/>
-          <w:szCs w:val="24"/>
-        </w:rPr>
-        <w:t>onLocationChanged</w:t>
-      </w:r>
-      <w:proofErr w:type="spellEnd"/>
-      <w:r>
-        <w:rPr>
-          <w:rFonts w:ascii="Trebuchet MS" w:eastAsia="Trebuchet MS" w:hAnsi="Trebuchet MS" w:cs="Trebuchet MS"/>
-          <w:sz w:val="24"/>
-          <w:szCs w:val="24"/>
-        </w:rPr>
-        <w:t xml:space="preserve"> function, where I will update the </w:t>
-      </w:r>
-      <w:proofErr w:type="spellStart"/>
-      <w:r>
-        <w:rPr>
-          <w:rFonts w:ascii="Trebuchet MS" w:eastAsia="Trebuchet MS" w:hAnsi="Trebuchet MS" w:cs="Trebuchet MS"/>
-          <w:sz w:val="24"/>
-          <w:szCs w:val="24"/>
-        </w:rPr>
-        <w:t>ViewModel's</w:t>
-      </w:r>
-      <w:proofErr w:type="spellEnd"/>
-      <w:r>
-        <w:rPr>
-          <w:rFonts w:ascii="Trebuchet MS" w:eastAsia="Trebuchet MS" w:hAnsi="Trebuchet MS" w:cs="Trebuchet MS"/>
-          <w:sz w:val="24"/>
-          <w:szCs w:val="24"/>
-        </w:rPr>
-        <w:t xml:space="preserve"> </w:t>
-      </w:r>
-      <w:proofErr w:type="spellStart"/>
-      <w:r>
-        <w:rPr>
-          <w:rFonts w:ascii="Trebuchet MS" w:eastAsia="Trebuchet MS" w:hAnsi="Trebuchet MS" w:cs="Trebuchet MS"/>
-          <w:sz w:val="24"/>
-          <w:szCs w:val="24"/>
-        </w:rPr>
-        <w:t>latLng</w:t>
-      </w:r>
-      <w:proofErr w:type="spellEnd"/>
-      <w:r>
-        <w:rPr>
-          <w:rFonts w:ascii="Trebuchet MS" w:eastAsia="Trebuchet MS" w:hAnsi="Trebuchet MS" w:cs="Trebuchet MS"/>
-          <w:sz w:val="24"/>
-          <w:szCs w:val="24"/>
-        </w:rPr>
-        <w:t xml:space="preserve"> with the current coordinates gathered by the device itself.</w:t>
+        <w:t>In the MainActivity, I will add the LocationListener interface. This will allow me to override the onLocationChanged function, where I will update the ViewModel's latLng with the current coordinates gathered by the device itself.</w:t>
       </w:r>
       <w:r>
         <w:rPr>
@@ -1175,61 +911,7 @@
           <w:sz w:val="24"/>
           <w:szCs w:val="24"/>
         </w:rPr>
-        <w:t xml:space="preserve">To start receiving GPS updates, I will create a GPS function that will retrieve the </w:t>
-      </w:r>
-      <w:proofErr w:type="spellStart"/>
-      <w:r>
-        <w:rPr>
-          <w:rFonts w:ascii="Trebuchet MS" w:eastAsia="Trebuchet MS" w:hAnsi="Trebuchet MS" w:cs="Trebuchet MS"/>
-          <w:sz w:val="24"/>
-          <w:szCs w:val="24"/>
-        </w:rPr>
-        <w:t>LocationManager</w:t>
-      </w:r>
-      <w:proofErr w:type="spellEnd"/>
-      <w:r>
-        <w:rPr>
-          <w:rFonts w:ascii="Trebuchet MS" w:eastAsia="Trebuchet MS" w:hAnsi="Trebuchet MS" w:cs="Trebuchet MS"/>
-          <w:sz w:val="24"/>
-          <w:szCs w:val="24"/>
-        </w:rPr>
-        <w:t xml:space="preserve"> system service and call </w:t>
-      </w:r>
-      <w:proofErr w:type="spellStart"/>
-      <w:r>
-        <w:rPr>
-          <w:rFonts w:ascii="Trebuchet MS" w:eastAsia="Trebuchet MS" w:hAnsi="Trebuchet MS" w:cs="Trebuchet MS"/>
-          <w:sz w:val="24"/>
-          <w:szCs w:val="24"/>
-        </w:rPr>
-        <w:t>requestLocationUpdates</w:t>
-      </w:r>
-      <w:proofErr w:type="spellEnd"/>
-      <w:r>
-        <w:rPr>
-          <w:rFonts w:ascii="Trebuchet MS" w:eastAsia="Trebuchet MS" w:hAnsi="Trebuchet MS" w:cs="Trebuchet MS"/>
-          <w:sz w:val="24"/>
-          <w:szCs w:val="24"/>
-        </w:rPr>
-        <w:t xml:space="preserve">, which I will set to update every 2 seconds or after 5 </w:t>
-      </w:r>
-      <w:proofErr w:type="spellStart"/>
-      <w:r>
-        <w:rPr>
-          <w:rFonts w:ascii="Trebuchet MS" w:eastAsia="Trebuchet MS" w:hAnsi="Trebuchet MS" w:cs="Trebuchet MS"/>
-          <w:sz w:val="24"/>
-          <w:szCs w:val="24"/>
-        </w:rPr>
-        <w:t>metres</w:t>
-      </w:r>
-      <w:proofErr w:type="spellEnd"/>
-      <w:r>
-        <w:rPr>
-          <w:rFonts w:ascii="Trebuchet MS" w:eastAsia="Trebuchet MS" w:hAnsi="Trebuchet MS" w:cs="Trebuchet MS"/>
-          <w:sz w:val="24"/>
-          <w:szCs w:val="24"/>
-        </w:rPr>
-        <w:t xml:space="preserve"> of movement. This will keep the GPS accurate without slowing the machine down too much.</w:t>
+        <w:t>To start receiving GPS updates, I will create a GPS function that will retrieve the LocationManager system service and call requestLocationUpdates, which I will set to update every 2 seconds or after 5 metres of movement. This will keep the GPS accurate without slowing the machine down too much.</w:t>
       </w:r>
       <w:r>
         <w:rPr>
@@ -1352,35 +1034,7 @@
           <w:sz w:val="24"/>
           <w:szCs w:val="24"/>
         </w:rPr>
-        <w:t xml:space="preserve">I will also write a </w:t>
-      </w:r>
-      <w:proofErr w:type="spellStart"/>
-      <w:proofErr w:type="gramStart"/>
-      <w:r>
-        <w:rPr>
-          <w:rFonts w:ascii="Trebuchet MS" w:eastAsia="Trebuchet MS" w:hAnsi="Trebuchet MS" w:cs="Trebuchet MS"/>
-          <w:sz w:val="24"/>
-          <w:szCs w:val="24"/>
-        </w:rPr>
-        <w:t>checkPermissions</w:t>
-      </w:r>
-      <w:proofErr w:type="spellEnd"/>
-      <w:r>
-        <w:rPr>
-          <w:rFonts w:ascii="Trebuchet MS" w:eastAsia="Trebuchet MS" w:hAnsi="Trebuchet MS" w:cs="Trebuchet MS"/>
-          <w:sz w:val="24"/>
-          <w:szCs w:val="24"/>
-        </w:rPr>
-        <w:t xml:space="preserve"> function</w:t>
-      </w:r>
-      <w:proofErr w:type="gramEnd"/>
-      <w:r>
-        <w:rPr>
-          <w:rFonts w:ascii="Trebuchet MS" w:eastAsia="Trebuchet MS" w:hAnsi="Trebuchet MS" w:cs="Trebuchet MS"/>
-          <w:sz w:val="24"/>
-          <w:szCs w:val="24"/>
-        </w:rPr>
-        <w:t xml:space="preserve"> that will check whether the location permission has already been granted. If they haven’t, then it will launch a permission request. This will make sure that the GPS function is only called if the user approves the use of their location. A Toast message was shown if they denied it.</w:t>
+        <w:t>I will also write a checkPermissions function that will check whether the location permission has already been granted. If they haven’t, then it will launch a permission request. This will make sure that the GPS function is only called if the user approves the use of their location. A Toast message was shown if they denied it.</w:t>
       </w:r>
     </w:p>
     <w:p>
@@ -1511,187 +1165,7 @@
           <w:sz w:val="24"/>
           <w:szCs w:val="24"/>
         </w:rPr>
-        <w:t xml:space="preserve">Inside the </w:t>
-      </w:r>
-      <w:proofErr w:type="spellStart"/>
-      <w:r>
-        <w:rPr>
-          <w:rFonts w:ascii="Trebuchet MS" w:eastAsia="Trebuchet MS" w:hAnsi="Trebuchet MS" w:cs="Trebuchet MS"/>
-          <w:sz w:val="24"/>
-          <w:szCs w:val="24"/>
-        </w:rPr>
-        <w:t>setContent</w:t>
-      </w:r>
-      <w:proofErr w:type="spellEnd"/>
-      <w:r>
-        <w:rPr>
-          <w:rFonts w:ascii="Trebuchet MS" w:eastAsia="Trebuchet MS" w:hAnsi="Trebuchet MS" w:cs="Trebuchet MS"/>
-          <w:sz w:val="24"/>
-          <w:szCs w:val="24"/>
-        </w:rPr>
-        <w:t xml:space="preserve"> itself, I will use a </w:t>
-      </w:r>
-      <w:proofErr w:type="spellStart"/>
-      <w:r>
-        <w:rPr>
-          <w:rFonts w:ascii="Trebuchet MS" w:eastAsia="Trebuchet MS" w:hAnsi="Trebuchet MS" w:cs="Trebuchet MS"/>
-          <w:sz w:val="24"/>
-          <w:szCs w:val="24"/>
-        </w:rPr>
-        <w:t>mutablestate</w:t>
-      </w:r>
-      <w:proofErr w:type="spellEnd"/>
-      <w:r>
-        <w:rPr>
-          <w:rFonts w:ascii="Trebuchet MS" w:eastAsia="Trebuchet MS" w:hAnsi="Trebuchet MS" w:cs="Trebuchet MS"/>
-          <w:sz w:val="24"/>
-          <w:szCs w:val="24"/>
-        </w:rPr>
-        <w:t xml:space="preserve"> variable to hold the current </w:t>
-      </w:r>
-      <w:proofErr w:type="spellStart"/>
-      <w:r>
-        <w:rPr>
-          <w:rFonts w:ascii="Trebuchet MS" w:eastAsia="Trebuchet MS" w:hAnsi="Trebuchet MS" w:cs="Trebuchet MS"/>
-          <w:sz w:val="24"/>
-          <w:szCs w:val="24"/>
-        </w:rPr>
-        <w:t>LatLng</w:t>
-      </w:r>
-      <w:proofErr w:type="spellEnd"/>
-      <w:r>
-        <w:rPr>
-          <w:rFonts w:ascii="Trebuchet MS" w:eastAsia="Trebuchet MS" w:hAnsi="Trebuchet MS" w:cs="Trebuchet MS"/>
-          <w:sz w:val="24"/>
-          <w:szCs w:val="24"/>
-        </w:rPr>
-        <w:t xml:space="preserve"> and zoom level, observed the </w:t>
-      </w:r>
-      <w:proofErr w:type="spellStart"/>
-      <w:r>
-        <w:rPr>
-          <w:rFonts w:ascii="Trebuchet MS" w:eastAsia="Trebuchet MS" w:hAnsi="Trebuchet MS" w:cs="Trebuchet MS"/>
-          <w:sz w:val="24"/>
-          <w:szCs w:val="24"/>
-        </w:rPr>
-        <w:t>ViewModel's</w:t>
-      </w:r>
-      <w:proofErr w:type="spellEnd"/>
-      <w:r>
-        <w:rPr>
-          <w:rFonts w:ascii="Trebuchet MS" w:eastAsia="Trebuchet MS" w:hAnsi="Trebuchet MS" w:cs="Trebuchet MS"/>
-          <w:sz w:val="24"/>
-          <w:szCs w:val="24"/>
-        </w:rPr>
-        <w:t xml:space="preserve"> </w:t>
-      </w:r>
-      <w:proofErr w:type="spellStart"/>
-      <w:r>
-        <w:rPr>
-          <w:rFonts w:ascii="Trebuchet MS" w:eastAsia="Trebuchet MS" w:hAnsi="Trebuchet MS" w:cs="Trebuchet MS"/>
-          <w:sz w:val="24"/>
-          <w:szCs w:val="24"/>
-        </w:rPr>
-        <w:t>LiveData</w:t>
-      </w:r>
-      <w:proofErr w:type="spellEnd"/>
-      <w:r>
-        <w:rPr>
-          <w:rFonts w:ascii="Trebuchet MS" w:eastAsia="Trebuchet MS" w:hAnsi="Trebuchet MS" w:cs="Trebuchet MS"/>
-          <w:sz w:val="24"/>
-          <w:szCs w:val="24"/>
-        </w:rPr>
-        <w:t xml:space="preserve"> to keep that state updated, and pass the values into a </w:t>
-      </w:r>
-      <w:proofErr w:type="spellStart"/>
-      <w:r>
-        <w:rPr>
-          <w:rFonts w:ascii="Trebuchet MS" w:eastAsia="Trebuchet MS" w:hAnsi="Trebuchet MS" w:cs="Trebuchet MS"/>
-          <w:sz w:val="24"/>
-          <w:szCs w:val="24"/>
-        </w:rPr>
-        <w:t>MapLibre</w:t>
-      </w:r>
-      <w:proofErr w:type="spellEnd"/>
-      <w:r>
-        <w:rPr>
-          <w:rFonts w:ascii="Trebuchet MS" w:eastAsia="Trebuchet MS" w:hAnsi="Trebuchet MS" w:cs="Trebuchet MS"/>
-          <w:sz w:val="24"/>
-          <w:szCs w:val="24"/>
-        </w:rPr>
-        <w:t xml:space="preserve"> composable via a </w:t>
-      </w:r>
-      <w:proofErr w:type="spellStart"/>
-      <w:r>
-        <w:rPr>
-          <w:rFonts w:ascii="Trebuchet MS" w:eastAsia="Trebuchet MS" w:hAnsi="Trebuchet MS" w:cs="Trebuchet MS"/>
-          <w:sz w:val="24"/>
-          <w:szCs w:val="24"/>
-        </w:rPr>
-        <w:t>CameraPosition</w:t>
-      </w:r>
-      <w:proofErr w:type="spellEnd"/>
-      <w:r>
-        <w:rPr>
-          <w:rFonts w:ascii="Trebuchet MS" w:eastAsia="Trebuchet MS" w:hAnsi="Trebuchet MS" w:cs="Trebuchet MS"/>
-          <w:sz w:val="24"/>
-          <w:szCs w:val="24"/>
-        </w:rPr>
-        <w:t xml:space="preserve">, causing the map to </w:t>
-      </w:r>
-      <w:proofErr w:type="spellStart"/>
-      <w:r>
-        <w:rPr>
-          <w:rFonts w:ascii="Trebuchet MS" w:eastAsia="Trebuchet MS" w:hAnsi="Trebuchet MS" w:cs="Trebuchet MS"/>
-          <w:sz w:val="24"/>
-          <w:szCs w:val="24"/>
-        </w:rPr>
-        <w:t>recentre</w:t>
-      </w:r>
-      <w:proofErr w:type="spellEnd"/>
-      <w:r>
-        <w:rPr>
-          <w:rFonts w:ascii="Trebuchet MS" w:eastAsia="Trebuchet MS" w:hAnsi="Trebuchet MS" w:cs="Trebuchet MS"/>
-          <w:sz w:val="24"/>
-          <w:szCs w:val="24"/>
-        </w:rPr>
-        <w:t xml:space="preserve"> automatically whenever the user's location changed. This was all placed inside a Scaffold with </w:t>
-      </w:r>
-      <w:proofErr w:type="spellStart"/>
-      <w:r>
-        <w:rPr>
-          <w:rFonts w:ascii="Trebuchet MS" w:eastAsia="Trebuchet MS" w:hAnsi="Trebuchet MS" w:cs="Trebuchet MS"/>
-          <w:sz w:val="24"/>
-          <w:szCs w:val="24"/>
-        </w:rPr>
-        <w:t>innerpadding</w:t>
-      </w:r>
-      <w:proofErr w:type="spellEnd"/>
-      <w:r>
-        <w:rPr>
-          <w:rFonts w:ascii="Trebuchet MS" w:eastAsia="Trebuchet MS" w:hAnsi="Trebuchet MS" w:cs="Trebuchet MS"/>
-          <w:sz w:val="24"/>
-          <w:szCs w:val="24"/>
-        </w:rPr>
-        <w:t xml:space="preserve"> to prevent any overlap of the </w:t>
-      </w:r>
-      <w:proofErr w:type="gramStart"/>
-      <w:r>
-        <w:rPr>
-          <w:rFonts w:ascii="Trebuchet MS" w:eastAsia="Trebuchet MS" w:hAnsi="Trebuchet MS" w:cs="Trebuchet MS"/>
-          <w:sz w:val="24"/>
-          <w:szCs w:val="24"/>
-        </w:rPr>
-        <w:t>devices</w:t>
-      </w:r>
-      <w:proofErr w:type="gramEnd"/>
-      <w:r>
-        <w:rPr>
-          <w:rFonts w:ascii="Trebuchet MS" w:eastAsia="Trebuchet MS" w:hAnsi="Trebuchet MS" w:cs="Trebuchet MS"/>
-          <w:sz w:val="24"/>
-          <w:szCs w:val="24"/>
-        </w:rPr>
-        <w:t xml:space="preserve"> interfaces with the application itself.</w:t>
+        <w:t>Inside the setContent itself, I will use a mutablestate variable to hold the current LatLng and zoom level, observed the ViewModel's LiveData to keep that state updated, and pass the values into a MapLibre composable via a CameraPosition, causing the map to recentre automatically whenever the user's location changed. This was all placed inside a Scaffold with innerpadding to prevent any overlap of the devices interfaces with the application itself.</w:t>
       </w:r>
     </w:p>
     <w:p>
@@ -1791,29 +1265,7 @@
           <w:sz w:val="24"/>
           <w:szCs w:val="24"/>
         </w:rPr>
-        <w:t xml:space="preserve">- type (pub, restaurant, hotel, historical site, </w:t>
-      </w:r>
-      <w:proofErr w:type="spellStart"/>
-      <w:r>
-        <w:rPr>
-          <w:rFonts w:ascii="Trebuchet MS" w:hAnsi="Trebuchet MS"/>
-          <w:i/>
-          <w:iCs/>
-          <w:sz w:val="24"/>
-          <w:szCs w:val="24"/>
-        </w:rPr>
-        <w:t>etc</w:t>
-      </w:r>
-      <w:proofErr w:type="spellEnd"/>
-      <w:r>
-        <w:rPr>
-          <w:rFonts w:ascii="Trebuchet MS" w:hAnsi="Trebuchet MS"/>
-          <w:i/>
-          <w:iCs/>
-          <w:sz w:val="24"/>
-          <w:szCs w:val="24"/>
-        </w:rPr>
-        <w:t>);</w:t>
+        <w:t>- type (pub, restaurant, hotel, historical site, etc);</w:t>
       </w:r>
     </w:p>
     <w:p>
@@ -1908,31 +1360,7 @@
           <w:sz w:val="24"/>
           <w:szCs w:val="24"/>
         </w:rPr>
-        <w:t xml:space="preserve">For </w:t>
-      </w:r>
-      <w:proofErr w:type="gramStart"/>
-      <w:r>
-        <w:rPr>
-          <w:rFonts w:ascii="Trebuchet MS" w:hAnsi="Trebuchet MS"/>
-          <w:i/>
-          <w:iCs/>
-          <w:color w:val="000000"/>
-          <w:sz w:val="24"/>
-          <w:szCs w:val="24"/>
-        </w:rPr>
-        <w:t>now</w:t>
-      </w:r>
-      <w:proofErr w:type="gramEnd"/>
-      <w:r>
-        <w:rPr>
-          <w:rFonts w:ascii="Trebuchet MS" w:hAnsi="Trebuchet MS"/>
-          <w:i/>
-          <w:iCs/>
-          <w:color w:val="000000"/>
-          <w:sz w:val="24"/>
-          <w:szCs w:val="24"/>
-        </w:rPr>
-        <w:t xml:space="preserve"> you can just use buttons for navigation – there is no need to use an app bar, a navigation bar, or the navigation drawer just yet.</w:t>
+        <w:t>For now you can just use buttons for navigation – there is no need to use an app bar, a navigation bar, or the navigation drawer just yet.</w:t>
       </w:r>
       <w:r>
         <w:rPr>
@@ -2052,13 +1480,8 @@
       <w:r>
         <w:t xml:space="preserve"> </w:t>
       </w:r>
-      <w:proofErr w:type="spellStart"/>
-      <w:r>
-        <w:t>ViewModel</w:t>
-      </w:r>
-      <w:proofErr w:type="spellEnd"/>
-      <w:r>
-        <w:t>.</w:t>
+      <w:r>
+        <w:t>ViewModel.</w:t>
       </w:r>
     </w:p>
     <w:p>
@@ -2076,58 +1499,13 @@
         <w:ind w:left="720"/>
       </w:pPr>
       <w:r>
-        <w:t xml:space="preserve">I then plan to update my </w:t>
-      </w:r>
-      <w:proofErr w:type="spellStart"/>
-      <w:r>
-        <w:t>LatLng</w:t>
-      </w:r>
-      <w:proofErr w:type="spellEnd"/>
-      <w:r>
-        <w:t xml:space="preserve"> </w:t>
-      </w:r>
-      <w:proofErr w:type="spellStart"/>
-      <w:r>
-        <w:t>ViewModel</w:t>
-      </w:r>
-      <w:proofErr w:type="spellEnd"/>
-      <w:r>
-        <w:t xml:space="preserve"> to also include the POI list rather than adding a second </w:t>
-      </w:r>
-      <w:proofErr w:type="spellStart"/>
-      <w:r>
-        <w:t>ViewModel</w:t>
-      </w:r>
-      <w:proofErr w:type="spellEnd"/>
-      <w:r>
-        <w:t xml:space="preserve"> as this already holds the GPS location. I will add </w:t>
-      </w:r>
-      <w:proofErr w:type="spellStart"/>
-      <w:r>
-        <w:t>MutableLiveData</w:t>
-      </w:r>
-      <w:proofErr w:type="spellEnd"/>
-      <w:r>
-        <w:t>&lt;List&lt;Poi&gt;&gt;</w:t>
-      </w:r>
-      <w:r>
-        <w:t xml:space="preserve"> so that the </w:t>
-      </w:r>
-      <w:proofErr w:type="spellStart"/>
-      <w:r>
-        <w:t>MainActivity</w:t>
-      </w:r>
-      <w:proofErr w:type="spellEnd"/>
-      <w:r>
-        <w:t xml:space="preserve"> can observe the list, meaning that whenever a POI is added the UI can then automatically know to redraw any makers on the map. I will then add a function to the </w:t>
-      </w:r>
-      <w:proofErr w:type="spellStart"/>
-      <w:r>
-        <w:t>ViewModel</w:t>
-      </w:r>
-      <w:proofErr w:type="spellEnd"/>
-      <w:r>
-        <w:t xml:space="preserve"> which will add a </w:t>
+        <w:t xml:space="preserve">I then plan to update my LatLng ViewModel to also include the POI list rather than adding a second ViewModel as this already holds the GPS location. I will add </w:t>
+      </w:r>
+      <w:r>
+        <w:t>MutableLiveData&lt;List&lt;Poi&gt;&gt;</w:t>
+      </w:r>
+      <w:r>
+        <w:t xml:space="preserve"> so that the MainActivity can observe the list, meaning that whenever a POI is added the UI can then automatically know to redraw any makers on the map. I will then add a function to the ViewModel which will add a </w:t>
       </w:r>
       <w:r>
         <w:t xml:space="preserve">given </w:t>
@@ -2273,29 +1651,13 @@
         <w:t>I will then add a separate composable for the POI screen</w:t>
       </w:r>
       <w:r>
-        <w:t xml:space="preserve">. I plan to put this in its own separate file to prevent code from clustering in the </w:t>
-      </w:r>
-      <w:proofErr w:type="spellStart"/>
-      <w:r>
-        <w:t>MainActivity</w:t>
-      </w:r>
-      <w:proofErr w:type="spellEnd"/>
-      <w:r>
-        <w:t>.</w:t>
+        <w:t>. I plan to put this in its own separate file to prevent code from clustering in the MainActivity.</w:t>
       </w:r>
       <w:r>
         <w:t xml:space="preserve"> I will add two callback functions to the parameter of the composable. One will be for when a POI I added and the other will be for when the user wishes to navigate back to the home screen.</w:t>
       </w:r>
       <w:r>
-        <w:t xml:space="preserve"> I will also make it so the users current </w:t>
-      </w:r>
-      <w:proofErr w:type="spellStart"/>
-      <w:r>
-        <w:t>LatLng</w:t>
-      </w:r>
-      <w:proofErr w:type="spellEnd"/>
-      <w:r>
-        <w:t xml:space="preserve"> is also passed as a parameter for the POIs location.</w:t>
+        <w:t xml:space="preserve"> I will also make it so the users current LatLng is also passed as a parameter for the POIs location.</w:t>
       </w:r>
       <w:r>
         <w:t xml:space="preserve"> </w:t>
@@ -2370,76 +1732,23 @@
         </w:drawing>
       </w:r>
       <w:r>
-        <w:t xml:space="preserve">I will finally update the main composable to include the map page and the add poi page using the compose navigation. I will add the </w:t>
-      </w:r>
-      <w:proofErr w:type="spellStart"/>
-      <w:r>
-        <w:t>NavHost</w:t>
-      </w:r>
-      <w:proofErr w:type="spellEnd"/>
-      <w:r>
-        <w:t xml:space="preserve"> which will contain the two routes for the map page and the add poi page. I will then be able to define the callback functions for the </w:t>
-      </w:r>
-      <w:proofErr w:type="spellStart"/>
-      <w:r>
-        <w:t>onPoiAdded</w:t>
-      </w:r>
-      <w:proofErr w:type="spellEnd"/>
-      <w:r>
-        <w:t xml:space="preserve"> and </w:t>
-      </w:r>
-      <w:proofErr w:type="spellStart"/>
-      <w:r>
-        <w:t>onNavigateBack</w:t>
-      </w:r>
-      <w:proofErr w:type="spellEnd"/>
+        <w:t xml:space="preserve">I will finally update the main composable to include the map page and the add poi page using the compose navigation. I will add the NavHost which will contain the two routes for the map page and the add poi page. I will then be able to define the callback functions for the onPoiAdded and onNavigateBack. onPoiAdded will add the new poi to the ViewModel and the onNavigateBack will return the user to the previous page they were on. </w:t>
+      </w:r>
+      <w:r>
+        <w:t xml:space="preserve">I will place a </w:t>
+      </w:r>
+      <w:r>
+        <w:t xml:space="preserve">Symbol marker inside </w:t>
+      </w:r>
+      <w:r>
+        <w:t xml:space="preserve">the </w:t>
+      </w:r>
+      <w:r>
+        <w:t>MapLibre lambda</w:t>
+      </w:r>
       <w:r>
         <w:t xml:space="preserve">. </w:t>
       </w:r>
-      <w:proofErr w:type="spellStart"/>
-      <w:r>
-        <w:t>onPoiAdded</w:t>
-      </w:r>
-      <w:proofErr w:type="spellEnd"/>
-      <w:r>
-        <w:t xml:space="preserve"> will add the new poi to the </w:t>
-      </w:r>
-      <w:proofErr w:type="spellStart"/>
-      <w:r>
-        <w:t>ViewModel</w:t>
-      </w:r>
-      <w:proofErr w:type="spellEnd"/>
-      <w:r>
-        <w:t xml:space="preserve"> and the </w:t>
-      </w:r>
-      <w:proofErr w:type="spellStart"/>
-      <w:r>
-        <w:t>onNavigateBack</w:t>
-      </w:r>
-      <w:proofErr w:type="spellEnd"/>
-      <w:r>
-        <w:t xml:space="preserve"> will return the user to the previous page they were on. </w:t>
-      </w:r>
-      <w:r>
-        <w:t xml:space="preserve">I will place a </w:t>
-      </w:r>
-      <w:r>
-        <w:t xml:space="preserve">Symbol marker inside </w:t>
-      </w:r>
-      <w:r>
-        <w:t xml:space="preserve">the </w:t>
-      </w:r>
-      <w:proofErr w:type="spellStart"/>
-      <w:r>
-        <w:t>MapLibre</w:t>
-      </w:r>
-      <w:proofErr w:type="spellEnd"/>
-      <w:r>
-        <w:t xml:space="preserve"> lambda</w:t>
-      </w:r>
-      <w:r>
-        <w:t xml:space="preserve">. </w:t>
-      </w:r>
       <w:r>
         <w:t xml:space="preserve">The map </w:t>
       </w:r>
@@ -2453,43 +1762,20 @@
         <w:t xml:space="preserve"> the</w:t>
       </w:r>
       <w:r>
-        <w:t xml:space="preserve"> </w:t>
-      </w:r>
-      <w:proofErr w:type="spellStart"/>
-      <w:proofErr w:type="gramStart"/>
-      <w:r>
-        <w:t>poisState</w:t>
-      </w:r>
-      <w:proofErr w:type="spellEnd"/>
-      <w:proofErr w:type="gramEnd"/>
-      <w:r>
-        <w:t xml:space="preserve"> changes</w:t>
+        <w:t xml:space="preserve"> poisState changes</w:t>
       </w:r>
       <w:r>
         <w:t>. This will then</w:t>
       </w:r>
       <w:r>
-        <w:t xml:space="preserve"> loop through </w:t>
-      </w:r>
-      <w:proofErr w:type="spellStart"/>
-      <w:r>
-        <w:t>poisState</w:t>
-      </w:r>
-      <w:proofErr w:type="spellEnd"/>
-      <w:r>
-        <w:t xml:space="preserve"> and plac</w:t>
+        <w:t xml:space="preserve"> loop through poisState and plac</w:t>
       </w:r>
       <w:r>
         <w:t>e</w:t>
       </w:r>
       <w:r>
-        <w:t xml:space="preserve"> a Symbol at each POI's </w:t>
-      </w:r>
-      <w:proofErr w:type="spellStart"/>
-      <w:r>
-        <w:t>LatLng</w:t>
-      </w:r>
-      <w:proofErr w:type="spellEnd"/>
+        <w:t xml:space="preserve"> a Symbol at each POI's LatLng</w:t>
+      </w:r>
       <w:r>
         <w:t>. This makes it so</w:t>
       </w:r>
@@ -2500,15 +1786,7 @@
         <w:t>.</w:t>
       </w:r>
       <w:r>
-        <w:t xml:space="preserve"> I will make </w:t>
-      </w:r>
-      <w:proofErr w:type="gramStart"/>
-      <w:r>
-        <w:t>it</w:t>
-      </w:r>
-      <w:proofErr w:type="gramEnd"/>
-      <w:r>
-        <w:t xml:space="preserve"> so an alert dialog appears when the marker is clicked on, displaying the markers details including its name, type and description. This allows me to test that the marker has been added correctly.</w:t>
+        <w:t xml:space="preserve"> I will make it so an alert dialog appears when the marker is clicked on, displaying the markers details including its name, type and description. This allows me to test that the marker has been added correctly.</w:t>
       </w:r>
     </w:p>
     <w:p>
@@ -3054,15 +2332,7 @@
         <w:t xml:space="preserve">methods </w:t>
       </w:r>
       <w:r>
-        <w:t xml:space="preserve">for the database so it can be changed or searched. I plan to make it so that when the database returns all the POIs it contains, it will return it as a </w:t>
-      </w:r>
-      <w:proofErr w:type="spellStart"/>
-      <w:r>
-        <w:t>LiveData</w:t>
-      </w:r>
-      <w:proofErr w:type="spellEnd"/>
-      <w:r>
-        <w:t xml:space="preserve">&lt;List&lt;Poi&gt;&gt;. This will </w:t>
+        <w:t xml:space="preserve">for the database so it can be changed or searched. I plan to make it so that when the database returns all the POIs it contains, it will return it as a LiveData&lt;List&lt;Poi&gt;&gt;. This will </w:t>
       </w:r>
       <w:r>
         <w:t>make</w:t>
@@ -3071,36 +2341,7 @@
         <w:t xml:space="preserve"> sure that the UI is automatically updated with a new list of POIs whenever the database is changed.</w:t>
       </w:r>
       <w:r>
-        <w:t xml:space="preserve"> For now, I will give it three functions, </w:t>
-      </w:r>
-      <w:proofErr w:type="spellStart"/>
-      <w:proofErr w:type="gramStart"/>
-      <w:r>
-        <w:t>getAllPois</w:t>
-      </w:r>
-      <w:proofErr w:type="spellEnd"/>
-      <w:r>
-        <w:t>(</w:t>
-      </w:r>
-      <w:proofErr w:type="gramEnd"/>
-      <w:r>
-        <w:t xml:space="preserve">), </w:t>
-      </w:r>
-      <w:proofErr w:type="gramStart"/>
-      <w:r>
-        <w:t>insert(</w:t>
-      </w:r>
-      <w:proofErr w:type="gramEnd"/>
-      <w:r>
-        <w:t xml:space="preserve">) and </w:t>
-      </w:r>
-      <w:proofErr w:type="gramStart"/>
-      <w:r>
-        <w:t>delete(</w:t>
-      </w:r>
-      <w:proofErr w:type="gramEnd"/>
-      <w:r>
-        <w:t>).</w:t>
+        <w:t xml:space="preserve"> For now, I will give it three functions, getAllPois(), insert() and delete().</w:t>
       </w:r>
     </w:p>
     <w:p>
@@ -3173,28 +2414,7 @@
         </w:drawing>
       </w:r>
       <w:r>
-        <w:t xml:space="preserve">I plan to next create the file for the database itself. This will be placed within an abstract function which allows my other files to access its DAO and all the database operations within it. Inside it I will put a </w:t>
-      </w:r>
-      <w:proofErr w:type="spellStart"/>
-      <w:proofErr w:type="gramStart"/>
-      <w:r>
-        <w:t>getDatabase</w:t>
-      </w:r>
-      <w:proofErr w:type="spellEnd"/>
-      <w:r>
-        <w:t>(</w:t>
-      </w:r>
-      <w:proofErr w:type="gramEnd"/>
-      <w:r>
-        <w:t xml:space="preserve">) function which will check that a database </w:t>
-      </w:r>
-      <w:proofErr w:type="gramStart"/>
-      <w:r>
-        <w:t>doesn’t already</w:t>
-      </w:r>
-      <w:proofErr w:type="gramEnd"/>
-      <w:r>
-        <w:t xml:space="preserve"> exist, if not it will create one and save it, otherwise it will simply return the one that already exists.</w:t>
+        <w:t>I plan to next create the file for the database itself. This will be placed within an abstract function which allows my other files to access its DAO and all the database operations within it. Inside it I will put a getDatabase() function which will check that a database doesn’t already exist, if not it will create one and save it, otherwise it will simply return the one that already exists.</w:t>
       </w:r>
     </w:p>
     <w:p>
@@ -3263,74 +2483,16 @@
         </w:drawing>
       </w:r>
       <w:r>
-        <w:t xml:space="preserve">I will next update my </w:t>
-      </w:r>
-      <w:proofErr w:type="spellStart"/>
-      <w:r>
-        <w:t>Viewmodel</w:t>
-      </w:r>
-      <w:proofErr w:type="spellEnd"/>
-      <w:r>
-        <w:t xml:space="preserve">. </w:t>
-      </w:r>
-      <w:r>
-        <w:t xml:space="preserve">I will first change the </w:t>
-      </w:r>
-      <w:proofErr w:type="spellStart"/>
-      <w:r>
-        <w:t>ViewModel</w:t>
-      </w:r>
-      <w:proofErr w:type="spellEnd"/>
-      <w:r>
-        <w:t xml:space="preserve"> for </w:t>
-      </w:r>
-      <w:proofErr w:type="gramStart"/>
-      <w:r>
-        <w:t xml:space="preserve">a </w:t>
-      </w:r>
-      <w:proofErr w:type="spellStart"/>
-      <w:r>
-        <w:t>AndroidViewModel</w:t>
-      </w:r>
-      <w:proofErr w:type="spellEnd"/>
-      <w:proofErr w:type="gramEnd"/>
-      <w:r>
-        <w:t xml:space="preserve"> so that it can access the application context which will be needed to open the database. </w:t>
+        <w:t xml:space="preserve">I will next update my Viewmodel. </w:t>
+      </w:r>
+      <w:r>
+        <w:t xml:space="preserve">I will first change the ViewModel for a AndroidViewModel so that it can access the application context which will be needed to open the database. </w:t>
       </w:r>
       <w:r>
         <w:t xml:space="preserve">I plan to update the poi variable so that it gathers all the pois from the database as </w:t>
       </w:r>
-      <w:proofErr w:type="spellStart"/>
-      <w:r>
-        <w:t>LiveData</w:t>
-      </w:r>
-      <w:proofErr w:type="spellEnd"/>
-      <w:r>
-        <w:t xml:space="preserve"> allowing it to automatically update when a new POI is added. Because of this, I will also need to change the </w:t>
-      </w:r>
-      <w:proofErr w:type="spellStart"/>
-      <w:r>
-        <w:t>addpoi</w:t>
-      </w:r>
-      <w:proofErr w:type="spellEnd"/>
-      <w:r>
-        <w:t xml:space="preserve"> function in the </w:t>
-      </w:r>
-      <w:proofErr w:type="spellStart"/>
-      <w:r>
-        <w:t>Viewmodel</w:t>
-      </w:r>
-      <w:proofErr w:type="spellEnd"/>
-      <w:r>
-        <w:t xml:space="preserve"> so that it adds the poi to the database instead of list using the </w:t>
-      </w:r>
-      <w:proofErr w:type="spellStart"/>
-      <w:r>
-        <w:t>poiDao’s</w:t>
-      </w:r>
-      <w:proofErr w:type="spellEnd"/>
-      <w:r>
-        <w:t xml:space="preserve"> ins</w:t>
+      <w:r>
+        <w:t>LiveData allowing it to automatically update when a new POI is added. Because of this, I will also need to change the addpoi function in the Viewmodel so that it adds the poi to the database instead of list using the poiDao’s ins</w:t>
       </w:r>
       <w:r>
         <w:t>ert function.</w:t>
@@ -3411,15 +2573,7 @@
         </w:drawing>
       </w:r>
       <w:r>
-        <w:t xml:space="preserve">I will then update the button for my </w:t>
-      </w:r>
-      <w:proofErr w:type="spellStart"/>
-      <w:r>
-        <w:t>AddPoiScreen</w:t>
-      </w:r>
-      <w:proofErr w:type="spellEnd"/>
-      <w:r>
-        <w:t>. I will simply change the Poi structure in the button so that it fits the databases poi structure since the latitude and longitude for the pois in the database are separate variables.</w:t>
+        <w:t>I will then update the button for my AddPoiScreen. I will simply change the Poi structure in the button so that it fits the databases poi structure since the latitude and longitude for the pois in the database are separate variables.</w:t>
       </w:r>
     </w:p>
     <w:p>
@@ -3433,23 +2587,7 @@
       </w:pPr>
       <w:r>
         <w:lastRenderedPageBreak/>
-        <w:t xml:space="preserve">I will then need to change the </w:t>
-      </w:r>
-      <w:proofErr w:type="spellStart"/>
-      <w:r>
-        <w:t>MainActivity</w:t>
-      </w:r>
-      <w:proofErr w:type="spellEnd"/>
-      <w:r>
-        <w:t xml:space="preserve"> so that the Poi is converted back into the </w:t>
-      </w:r>
-      <w:proofErr w:type="spellStart"/>
-      <w:r>
-        <w:t>LatLng</w:t>
-      </w:r>
-      <w:proofErr w:type="spellEnd"/>
-      <w:r>
-        <w:t xml:space="preserve"> so that the map can properly mark its location.</w:t>
+        <w:t>I will then need to change the MainActivity so that the Poi is converted back into the LatLng so that the map can properly mark its location.</w:t>
       </w:r>
     </w:p>
     <w:p>
@@ -3663,15 +2801,7 @@
         <w:ind w:left="720"/>
       </w:pPr>
       <w:r>
-        <w:t xml:space="preserve">I have already set up the loading process for the POIs for task 3. This is done on </w:t>
-      </w:r>
-      <w:proofErr w:type="gramStart"/>
-      <w:r>
-        <w:t>startup and</w:t>
-      </w:r>
-      <w:proofErr w:type="gramEnd"/>
-      <w:r>
-        <w:t xml:space="preserve"> whenever the database is updated. </w:t>
+        <w:t xml:space="preserve">I have already set up the loading process for the POIs for task 3. This is done on startup and whenever the database is updated. </w:t>
       </w:r>
       <w:r>
         <w:t>However, to fit this task better I will change the code to use a button instead, this will make testing easier and give the user more control.</w:t>
@@ -3687,26 +2817,14 @@
         <w:ind w:left="720"/>
       </w:pPr>
       <w:r>
-        <w:t xml:space="preserve">I will start this by changing the DAO to </w:t>
-      </w:r>
-      <w:proofErr w:type="gramStart"/>
-      <w:r>
-        <w:t>return</w:t>
-      </w:r>
-      <w:proofErr w:type="gramEnd"/>
-      <w:r>
-        <w:t xml:space="preserve"> a plain list instead of </w:t>
-      </w:r>
-      <w:proofErr w:type="gramStart"/>
+        <w:t xml:space="preserve">I will start this by changing the DAO to return a plain list instead of </w:t>
+      </w:r>
       <w:r>
         <w:t xml:space="preserve">the </w:t>
       </w:r>
-      <w:proofErr w:type="spellStart"/>
       <w:r>
         <w:t>LiveData</w:t>
       </w:r>
-      <w:proofErr w:type="spellEnd"/>
-      <w:proofErr w:type="gramEnd"/>
       <w:r>
         <w:t xml:space="preserve"> since the POIs will no longer be automatically loaded. </w:t>
       </w:r>
@@ -3850,39 +2968,7 @@
         </w:drawing>
       </w:r>
       <w:r>
-        <w:t xml:space="preserve">I will also need to add a new function to the </w:t>
-      </w:r>
-      <w:proofErr w:type="spellStart"/>
-      <w:r>
-        <w:t>ViewModel</w:t>
-      </w:r>
-      <w:proofErr w:type="spellEnd"/>
-      <w:r>
-        <w:t xml:space="preserve"> which will load all the POIs from the database. It will run the database query on Dispatchers.IO in the background, then set the result to </w:t>
-      </w:r>
-      <w:proofErr w:type="spellStart"/>
-      <w:r>
-        <w:t>pois.value</w:t>
-      </w:r>
-      <w:proofErr w:type="spellEnd"/>
-      <w:r>
-        <w:t xml:space="preserve"> which should </w:t>
-      </w:r>
-      <w:proofErr w:type="gramStart"/>
-      <w:r>
-        <w:t>triggers</w:t>
-      </w:r>
-      <w:proofErr w:type="gramEnd"/>
-      <w:r>
-        <w:t xml:space="preserve"> the observer in </w:t>
-      </w:r>
-      <w:proofErr w:type="spellStart"/>
-      <w:r>
-        <w:t>MainActivity</w:t>
-      </w:r>
-      <w:proofErr w:type="spellEnd"/>
-      <w:r>
-        <w:t xml:space="preserve"> which will then update the map.</w:t>
+        <w:t>I will also need to add a new function to the ViewModel which will load all the POIs from the database. It will run the database query on Dispatchers.IO in the background, then set the result to pois.value which should triggers the observer in MainActivity which will then update the map.</w:t>
       </w:r>
     </w:p>
     <w:p>
@@ -3955,36 +3041,20 @@
         <w:t>it</w:t>
       </w:r>
       <w:r>
-        <w:t xml:space="preserve"> holds a plain list of pois instead of being assigned directly from the DAO’s live data since it no longer returns </w:t>
-      </w:r>
-      <w:proofErr w:type="spellStart"/>
-      <w:r>
-        <w:t>LiveData</w:t>
-      </w:r>
-      <w:proofErr w:type="spellEnd"/>
-      <w:r>
-        <w:t>.</w:t>
-      </w:r>
-    </w:p>
-    <w:p>
-      <w:pPr>
-        <w:ind w:left="720"/>
-      </w:pPr>
-    </w:p>
-    <w:p>
-      <w:pPr>
-        <w:ind w:left="720"/>
-      </w:pPr>
-      <w:r>
-        <w:t xml:space="preserve">I will then lastly need to add the load buttons to the </w:t>
-      </w:r>
-      <w:proofErr w:type="spellStart"/>
-      <w:r>
-        <w:t>MainActivity</w:t>
-      </w:r>
-      <w:proofErr w:type="spellEnd"/>
-      <w:r>
-        <w:t>. This will call the load poi function in the view model, loading all the pois from the database into the UI.</w:t>
+        <w:t xml:space="preserve"> holds a plain list of pois instead of being assigned directly from the DAO’s live data since it no longer returns LiveData.</w:t>
+      </w:r>
+    </w:p>
+    <w:p>
+      <w:pPr>
+        <w:ind w:left="720"/>
+      </w:pPr>
+    </w:p>
+    <w:p>
+      <w:pPr>
+        <w:ind w:left="720"/>
+      </w:pPr>
+      <w:r>
+        <w:t>I will then lastly need to add the load buttons to the MainActivity. This will call the load poi function in the view model, loading all the pois from the database into the UI.</w:t>
       </w:r>
     </w:p>
     <w:p>
@@ -4114,31 +3184,7 @@
           <w:sz w:val="24"/>
           <w:szCs w:val="24"/>
         </w:rPr>
-        <w:t xml:space="preserve"> in a text field. This should search the local database. The matching places should appear on the map as markers or circles. </w:t>
-      </w:r>
-      <w:proofErr w:type="gramStart"/>
-      <w:r>
-        <w:rPr>
-          <w:rFonts w:ascii="Trebuchet MS" w:hAnsi="Trebuchet MS"/>
-          <w:i/>
-          <w:iCs/>
-          <w:color w:val="000000"/>
-          <w:sz w:val="24"/>
-          <w:szCs w:val="24"/>
-        </w:rPr>
-        <w:t>Again</w:t>
-      </w:r>
-      <w:proofErr w:type="gramEnd"/>
-      <w:r>
-        <w:rPr>
-          <w:rFonts w:ascii="Trebuchet MS" w:hAnsi="Trebuchet MS"/>
-          <w:i/>
-          <w:iCs/>
-          <w:color w:val="000000"/>
-          <w:sz w:val="24"/>
-          <w:szCs w:val="24"/>
-        </w:rPr>
-        <w:t xml:space="preserve"> a dialog box should appear when the user clicks on each place.”</w:t>
+        <w:t xml:space="preserve"> in a text field. This should search the local database. The matching places should appear on the map as markers or circles. Again a dialog box should appear when the user clicks on each place.”</w:t>
       </w:r>
     </w:p>
     <w:p>
@@ -4284,31 +3330,7 @@
         <w:t>I will next create</w:t>
       </w:r>
       <w:r>
-        <w:t xml:space="preserve"> a new function in the </w:t>
-      </w:r>
-      <w:proofErr w:type="spellStart"/>
-      <w:r>
-        <w:t>ViewModel</w:t>
-      </w:r>
-      <w:proofErr w:type="spellEnd"/>
-      <w:r>
-        <w:t xml:space="preserve">. This will </w:t>
-      </w:r>
-      <w:proofErr w:type="gramStart"/>
-      <w:r>
-        <w:t>use the search</w:t>
-      </w:r>
-      <w:proofErr w:type="gramEnd"/>
-      <w:r>
-        <w:t xml:space="preserve"> by type function from the DAO. This will have the type as a parameter to search with and add the results to the </w:t>
-      </w:r>
-      <w:proofErr w:type="spellStart"/>
-      <w:r>
-        <w:t>pois.value</w:t>
-      </w:r>
-      <w:proofErr w:type="spellEnd"/>
-      <w:r>
-        <w:t>.</w:t>
+        <w:t xml:space="preserve"> a new function in the ViewModel. This will use the search by type function from the DAO. This will have the type as a parameter to search with and add the results to the pois.value.</w:t>
       </w:r>
       <w:r>
         <w:t xml:space="preserve"> This makes it so when a user searches a type, it only displays markers relating to that type. Then to display all the pois again the user will simply need to load the pois again.</w:t>
@@ -4384,31 +3406,7 @@
         </w:drawing>
       </w:r>
       <w:r>
-        <w:t xml:space="preserve">Then I will add an outlined text field to my </w:t>
-      </w:r>
-      <w:proofErr w:type="spellStart"/>
-      <w:r>
-        <w:t>MainActivity</w:t>
-      </w:r>
-      <w:proofErr w:type="spellEnd"/>
-      <w:r>
-        <w:t xml:space="preserve"> which will be used by the user to input the accommodation type that they are searching for. This will then be followed by a button which, when clicked, will take the </w:t>
-      </w:r>
-      <w:proofErr w:type="gramStart"/>
-      <w:r>
-        <w:t>inputted</w:t>
-      </w:r>
-      <w:proofErr w:type="gramEnd"/>
-      <w:r>
-        <w:t xml:space="preserve"> data and call the search pois by type function using the </w:t>
-      </w:r>
-      <w:proofErr w:type="gramStart"/>
-      <w:r>
-        <w:t>inputted</w:t>
-      </w:r>
-      <w:proofErr w:type="gramEnd"/>
-      <w:r>
-        <w:t xml:space="preserve"> data as the parameter.</w:t>
+        <w:t>Then I will add an outlined text field to my MainActivity which will be used by the user to input the accommodation type that they are searching for. This will then be followed by a button which, when clicked, will take the inputted data and call the search pois by type function using the inputted data as the parameter.</w:t>
       </w:r>
     </w:p>
     <w:p/>
@@ -4592,29 +3590,7 @@
           <w:sz w:val="24"/>
           <w:szCs w:val="24"/>
         </w:rPr>
-        <w:t xml:space="preserve">When the POIs are </w:t>
-      </w:r>
-      <w:proofErr w:type="gramStart"/>
-      <w:r>
-        <w:rPr>
-          <w:rFonts w:ascii="Trebuchet MS" w:hAnsi="Trebuchet MS"/>
-          <w:i/>
-          <w:iCs/>
-          <w:sz w:val="24"/>
-          <w:szCs w:val="24"/>
-        </w:rPr>
-        <w:t>loaded</w:t>
-      </w:r>
-      <w:proofErr w:type="gramEnd"/>
-      <w:r>
-        <w:rPr>
-          <w:rFonts w:ascii="Trebuchet MS" w:hAnsi="Trebuchet MS"/>
-          <w:i/>
-          <w:iCs/>
-          <w:sz w:val="24"/>
-          <w:szCs w:val="24"/>
-        </w:rPr>
-        <w:t xml:space="preserve"> they should be shown on the map as markers and saved to the database. To avoid duplicate entries in the database, check whether the point of interest with that ID is already present before adding it.”</w:t>
+        <w:t>When the POIs are loaded they should be shown on the map as markers and saved to the database. To avoid duplicate entries in the database, check whether the point of interest with that ID is already present before adding it.”</w:t>
       </w:r>
     </w:p>
     <w:p>
@@ -4895,35 +3871,7 @@
           <w:sz w:val="24"/>
           <w:szCs w:val="24"/>
         </w:rPr>
-        <w:t xml:space="preserve">On top of this I will need to add </w:t>
-      </w:r>
-      <w:proofErr w:type="spellStart"/>
-      <w:r>
-        <w:rPr>
-          <w:rFonts w:ascii="Trebuchet MS" w:hAnsi="Trebuchet MS"/>
-          <w:sz w:val="24"/>
-          <w:szCs w:val="24"/>
-        </w:rPr>
-        <w:t>usesCleartextTraffic</w:t>
-      </w:r>
-      <w:proofErr w:type="spellEnd"/>
-      <w:proofErr w:type="gramStart"/>
-      <w:r>
-        <w:rPr>
-          <w:rFonts w:ascii="Trebuchet MS" w:hAnsi="Trebuchet MS"/>
-          <w:sz w:val="24"/>
-          <w:szCs w:val="24"/>
-        </w:rPr>
-        <w:t>=”true</w:t>
-      </w:r>
-      <w:proofErr w:type="gramEnd"/>
-      <w:r>
-        <w:rPr>
-          <w:rFonts w:ascii="Trebuchet MS" w:hAnsi="Trebuchet MS"/>
-          <w:sz w:val="24"/>
-          <w:szCs w:val="24"/>
-        </w:rPr>
-        <w:t>” to my application. This is because Android doesn’t allow access to insecure servers (HTTP) which my server is. By using this it disables the restriction allowing my app to communicate with the server.</w:t>
+        <w:t>On top of this I will need to add usesCleartextTraffic=”true” to my application. This is because Android doesn’t allow access to insecure servers (HTTP) which my server is. By using this it disables the restriction allowing my app to communicate with the server.</w:t>
       </w:r>
     </w:p>
     <w:p>
@@ -5109,18 +4057,8 @@
           <w:sz w:val="24"/>
           <w:szCs w:val="24"/>
         </w:rPr>
-        <w:t xml:space="preserve"> as they both currently have different </w:t>
-      </w:r>
-      <w:proofErr w:type="spellStart"/>
-      <w:r>
-        <w:rPr>
-          <w:rFonts w:ascii="Trebuchet MS" w:hAnsi="Trebuchet MS"/>
-          <w:sz w:val="24"/>
-          <w:szCs w:val="24"/>
-        </w:rPr>
-        <w:t>feilds</w:t>
-      </w:r>
-      <w:proofErr w:type="spellEnd"/>
+        <w:t xml:space="preserve"> as they both currently have different feilds</w:t>
+      </w:r>
       <w:r>
         <w:rPr>
           <w:rFonts w:ascii="Trebuchet MS" w:hAnsi="Trebuchet MS"/>
@@ -5377,25 +4315,7 @@
           <w:szCs w:val="24"/>
         </w:rPr>
         <w:lastRenderedPageBreak/>
-        <w:t xml:space="preserve">This will need a new function which I will store within my </w:t>
-      </w:r>
-      <w:proofErr w:type="spellStart"/>
-      <w:r>
-        <w:rPr>
-          <w:rFonts w:ascii="Trebuchet MS" w:hAnsi="Trebuchet MS"/>
-          <w:sz w:val="24"/>
-          <w:szCs w:val="24"/>
-        </w:rPr>
-        <w:t>ViewModel</w:t>
-      </w:r>
-      <w:proofErr w:type="spellEnd"/>
-      <w:r>
-        <w:rPr>
-          <w:rFonts w:ascii="Trebuchet MS" w:hAnsi="Trebuchet MS"/>
-          <w:sz w:val="24"/>
-          <w:szCs w:val="24"/>
-        </w:rPr>
-        <w:t xml:space="preserve">. </w:t>
+        <w:t xml:space="preserve">This will need a new function which I will store within my ViewModel. </w:t>
       </w:r>
       <w:r>
         <w:rPr>
@@ -5419,25 +4339,7 @@
           <w:sz w:val="24"/>
           <w:szCs w:val="24"/>
         </w:rPr>
-        <w:t xml:space="preserve">” </w:t>
-      </w:r>
-      <w:proofErr w:type="spellStart"/>
-      <w:r>
-        <w:rPr>
-          <w:rFonts w:ascii="Trebuchet MS" w:hAnsi="Trebuchet MS"/>
-          <w:sz w:val="24"/>
-          <w:szCs w:val="24"/>
-        </w:rPr>
-        <w:t>url</w:t>
-      </w:r>
-      <w:proofErr w:type="spellEnd"/>
-      <w:r>
-        <w:rPr>
-          <w:rFonts w:ascii="Trebuchet MS" w:hAnsi="Trebuchet MS"/>
-          <w:sz w:val="24"/>
-          <w:szCs w:val="24"/>
-        </w:rPr>
-        <w:t xml:space="preserve"> which will gather all the pois in the web data base. The function will then, within a coroutine so it can handle the database operations, check each poi in the web database and compare its id with the ones in the local database. The ones that have an id which already exists in the local database are skipped to prevent duplicates. </w:t>
+        <w:t xml:space="preserve">” url which will gather all the pois in the web data base. The function will then, within a coroutine so it can handle the database operations, check each poi in the web database and compare its id with the ones in the local database. The ones that have an id which already exists in the local database are skipped to prevent duplicates. </w:t>
       </w:r>
       <w:r>
         <w:rPr>
@@ -5618,43 +4520,7 @@
           <w:sz w:val="24"/>
           <w:szCs w:val="24"/>
         </w:rPr>
-        <w:t xml:space="preserve">Then finally for this task I will need to add a new button </w:t>
-      </w:r>
-      <w:proofErr w:type="gramStart"/>
-      <w:r>
-        <w:rPr>
-          <w:rFonts w:ascii="Trebuchet MS" w:hAnsi="Trebuchet MS"/>
-          <w:sz w:val="24"/>
-          <w:szCs w:val="24"/>
-        </w:rPr>
-        <w:t>in</w:t>
-      </w:r>
-      <w:proofErr w:type="gramEnd"/>
-      <w:r>
-        <w:rPr>
-          <w:rFonts w:ascii="Trebuchet MS" w:hAnsi="Trebuchet MS"/>
-          <w:sz w:val="24"/>
-          <w:szCs w:val="24"/>
-        </w:rPr>
-        <w:t xml:space="preserve"> the </w:t>
-      </w:r>
-      <w:proofErr w:type="spellStart"/>
-      <w:r>
-        <w:rPr>
-          <w:rFonts w:ascii="Trebuchet MS" w:hAnsi="Trebuchet MS"/>
-          <w:sz w:val="24"/>
-          <w:szCs w:val="24"/>
-        </w:rPr>
-        <w:t>MainActivity</w:t>
-      </w:r>
-      <w:proofErr w:type="spellEnd"/>
-      <w:r>
-        <w:rPr>
-          <w:rFonts w:ascii="Trebuchet MS" w:hAnsi="Trebuchet MS"/>
-          <w:sz w:val="24"/>
-          <w:szCs w:val="24"/>
-        </w:rPr>
-        <w:t xml:space="preserve"> which uses the new function.</w:t>
+        <w:t>Then finally for this task I will need to add a new button in the MainActivity which uses the new function.</w:t>
       </w:r>
       <w:r>
         <w:rPr>
@@ -5910,71 +4776,27 @@
           <w:sz w:val="24"/>
           <w:szCs w:val="24"/>
         </w:rPr>
-        <w:t xml:space="preserve">- </w:t>
-      </w:r>
-      <w:proofErr w:type="spellStart"/>
-      <w:r>
-        <w:rPr>
-          <w:rFonts w:ascii="Trebuchet MS" w:hAnsi="Trebuchet MS"/>
-          <w:i/>
-          <w:iCs/>
-          <w:sz w:val="24"/>
-          <w:szCs w:val="24"/>
-        </w:rPr>
-        <w:t>lat</w:t>
-      </w:r>
-      <w:proofErr w:type="spellEnd"/>
-      <w:r>
-        <w:rPr>
-          <w:rFonts w:ascii="Trebuchet MS" w:hAnsi="Trebuchet MS"/>
-          <w:i/>
-          <w:iCs/>
-          <w:sz w:val="24"/>
-          <w:szCs w:val="24"/>
-        </w:rPr>
-        <w:t xml:space="preserve"> (the latitude)</w:t>
-      </w:r>
-    </w:p>
-    <w:p>
-      <w:pPr>
-        <w:rPr>
-          <w:i/>
-          <w:iCs/>
-          <w:sz w:val="24"/>
-          <w:szCs w:val="24"/>
-        </w:rPr>
-      </w:pPr>
-      <w:r>
-        <w:rPr>
-          <w:rFonts w:ascii="Trebuchet MS" w:hAnsi="Trebuchet MS"/>
-          <w:i/>
-          <w:iCs/>
-          <w:sz w:val="24"/>
-          <w:szCs w:val="24"/>
-        </w:rPr>
-        <w:t xml:space="preserve">- </w:t>
-      </w:r>
-      <w:proofErr w:type="spellStart"/>
-      <w:r>
-        <w:rPr>
-          <w:rFonts w:ascii="Trebuchet MS" w:hAnsi="Trebuchet MS"/>
-          <w:i/>
-          <w:iCs/>
-          <w:sz w:val="24"/>
-          <w:szCs w:val="24"/>
-        </w:rPr>
-        <w:t>lon</w:t>
-      </w:r>
-      <w:proofErr w:type="spellEnd"/>
-      <w:r>
-        <w:rPr>
-          <w:rFonts w:ascii="Trebuchet MS" w:hAnsi="Trebuchet MS"/>
-          <w:i/>
-          <w:iCs/>
-          <w:sz w:val="24"/>
-          <w:szCs w:val="24"/>
-        </w:rPr>
-        <w:t xml:space="preserve"> (the longitude).</w:t>
+        <w:t>- lat (the latitude)</w:t>
+      </w:r>
+    </w:p>
+    <w:p>
+      <w:pPr>
+        <w:rPr>
+          <w:i/>
+          <w:iCs/>
+          <w:sz w:val="24"/>
+          <w:szCs w:val="24"/>
+        </w:rPr>
+      </w:pPr>
+      <w:r>
+        <w:rPr>
+          <w:rFonts w:ascii="Trebuchet MS" w:hAnsi="Trebuchet MS"/>
+          <w:i/>
+          <w:iCs/>
+          <w:sz w:val="24"/>
+          <w:szCs w:val="24"/>
+        </w:rPr>
+        <w:t>- lon (the longitude).</w:t>
       </w:r>
     </w:p>
     <w:p>
@@ -6060,28 +4882,7 @@
     </w:p>
     <w:p>
       <w:r>
-        <w:t xml:space="preserve">To start this task, I will need to change my </w:t>
-      </w:r>
-      <w:proofErr w:type="spellStart"/>
-      <w:proofErr w:type="gramStart"/>
-      <w:r>
-        <w:t>addPoi</w:t>
-      </w:r>
-      <w:proofErr w:type="spellEnd"/>
-      <w:r>
-        <w:t>(</w:t>
-      </w:r>
-      <w:proofErr w:type="gramEnd"/>
-      <w:r>
-        <w:t xml:space="preserve">) function in the </w:t>
-      </w:r>
-      <w:proofErr w:type="spellStart"/>
-      <w:r>
-        <w:t>Viewmodel</w:t>
-      </w:r>
-      <w:proofErr w:type="spellEnd"/>
-      <w:r>
-        <w:t xml:space="preserve">. I will change the function so that instead of inserting the poi into the local database straight away it will first POST to the server using </w:t>
+        <w:t xml:space="preserve">To start this task, I will need to change my addPoi() function in the Viewmodel. I will change the function so that instead of inserting the poi into the local database straight away it will first POST to the server using </w:t>
       </w:r>
       <w:r>
         <w:t xml:space="preserve">the </w:t>
@@ -6101,23 +4902,7 @@
         </w:r>
       </w:hyperlink>
       <w:r>
-        <w:t xml:space="preserve"> </w:t>
-      </w:r>
-      <w:proofErr w:type="spellStart"/>
-      <w:r>
-        <w:t>url</w:t>
-      </w:r>
-      <w:proofErr w:type="spellEnd"/>
-      <w:r>
-        <w:t xml:space="preserve">, which will return the ID, then the function will use this ID as the </w:t>
-      </w:r>
-      <w:proofErr w:type="spellStart"/>
-      <w:r>
-        <w:t>webId</w:t>
-      </w:r>
-      <w:proofErr w:type="spellEnd"/>
-      <w:r>
-        <w:t xml:space="preserve"> then save it locally using the poi DAO insert function.. This makes sure that the poi is only added to the local database if it is successfully added to the web data base. This prevents any misalignment between the two databases.</w:t>
+        <w:t xml:space="preserve"> url, which will return the ID, then the function will use this ID as the webId then save it locally using the poi DAO insert function.. This makes sure that the poi is only added to the local database if it is successfully added to the web data base. This prevents any misalignment between the two databases.</w:t>
       </w:r>
     </w:p>
     <w:p/>
@@ -6129,31 +4914,7 @@
     <w:p/>
     <w:p>
       <w:r>
-        <w:t xml:space="preserve">Since the original poi has </w:t>
-      </w:r>
-      <w:proofErr w:type="spellStart"/>
-      <w:r>
-        <w:t>webId</w:t>
-      </w:r>
-      <w:proofErr w:type="spellEnd"/>
-      <w:r>
-        <w:t xml:space="preserve"> set to null, I will </w:t>
-      </w:r>
-      <w:proofErr w:type="gramStart"/>
-      <w:r>
-        <w:t>use .copy</w:t>
-      </w:r>
-      <w:proofErr w:type="gramEnd"/>
-      <w:r>
-        <w:t xml:space="preserve">() to create a new Poi object with the same fields but with the null </w:t>
-      </w:r>
-      <w:proofErr w:type="spellStart"/>
-      <w:r>
-        <w:t>webId</w:t>
-      </w:r>
-      <w:proofErr w:type="spellEnd"/>
-      <w:r>
-        <w:t xml:space="preserve"> replaced by the ID returned by the server. The original poi </w:t>
+        <w:t xml:space="preserve">Since the original poi has webId set to null, I will use .copy() to create a new Poi object with the same fields but with the null webId replaced by the ID returned by the server. The original poi </w:t>
       </w:r>
       <w:r>
         <w:t>will then be removed</w:t>
@@ -6165,22 +4926,70 @@
         <w:t xml:space="preserve">makes sure </w:t>
       </w:r>
       <w:r>
-        <w:t xml:space="preserve">that the record saved to the local database has a </w:t>
-      </w:r>
-      <w:proofErr w:type="spellStart"/>
-      <w:r>
-        <w:t>webId</w:t>
-      </w:r>
-      <w:proofErr w:type="spellEnd"/>
-      <w:r>
-        <w:t xml:space="preserve"> that matches the server</w:t>
+        <w:t>that the record saved to the local database has a webId that matches the server</w:t>
       </w:r>
       <w:r>
         <w:t>.</w:t>
       </w:r>
     </w:p>
     <w:p/>
-    <w:p/>
+    <w:p>
+      <w:r>
+        <w:rPr>
+          <w:noProof/>
+        </w:rPr>
+        <w:lastRenderedPageBreak/>
+        <w:drawing>
+          <wp:anchor distT="0" distB="0" distL="114300" distR="114300" simplePos="0" relativeHeight="251701248" behindDoc="0" locked="0" layoutInCell="1" allowOverlap="1" wp14:anchorId="3138F24F" wp14:editId="2D463B72">
+            <wp:simplePos x="0" y="0"/>
+            <wp:positionH relativeFrom="margin">
+              <wp:align>right</wp:align>
+            </wp:positionH>
+            <wp:positionV relativeFrom="paragraph">
+              <wp:posOffset>0</wp:posOffset>
+            </wp:positionV>
+            <wp:extent cx="5943600" cy="4288155"/>
+            <wp:effectExtent l="0" t="0" r="0" b="0"/>
+            <wp:wrapTopAndBottom/>
+            <wp:docPr id="1371669528" name="Picture 1"/>
+            <wp:cNvGraphicFramePr>
+              <a:graphicFrameLocks xmlns:a="http://schemas.openxmlformats.org/drawingml/2006/main" noChangeAspect="1"/>
+            </wp:cNvGraphicFramePr>
+            <a:graphic xmlns:a="http://schemas.openxmlformats.org/drawingml/2006/main">
+              <a:graphicData uri="http://schemas.openxmlformats.org/drawingml/2006/picture">
+                <pic:pic xmlns:pic="http://schemas.openxmlformats.org/drawingml/2006/picture">
+                  <pic:nvPicPr>
+                    <pic:cNvPr id="1371669528" name=""/>
+                    <pic:cNvPicPr/>
+                  </pic:nvPicPr>
+                  <pic:blipFill>
+                    <a:blip r:embed="rId48">
+                      <a:extLst>
+                        <a:ext uri="{28A0092B-C50C-407E-A947-70E740481C1C}">
+                          <a14:useLocalDpi xmlns:a14="http://schemas.microsoft.com/office/drawing/2010/main" val="0"/>
+                        </a:ext>
+                      </a:extLst>
+                    </a:blip>
+                    <a:stretch>
+                      <a:fillRect/>
+                    </a:stretch>
+                  </pic:blipFill>
+                  <pic:spPr>
+                    <a:xfrm>
+                      <a:off x="0" y="0"/>
+                      <a:ext cx="5943600" cy="4288155"/>
+                    </a:xfrm>
+                    <a:prstGeom prst="rect">
+                      <a:avLst/>
+                    </a:prstGeom>
+                  </pic:spPr>
+                </pic:pic>
+              </a:graphicData>
+            </a:graphic>
+          </wp:anchor>
+        </w:drawing>
+      </w:r>
+    </w:p>
     <w:sectPr>
       <w:pgSz w:w="12240" w:h="15840"/>
       <w:pgMar w:top="1440" w:right="1440" w:bottom="1440" w:left="1440" w:header="720" w:footer="720" w:gutter="0"/>

</xml_diff>

<commit_message>
Updated report for task 8
</commit_message>
<xml_diff>
--- a/MAD_Report.docx
+++ b/MAD_Report.docx
@@ -373,7 +373,73 @@
           <w:sz w:val="24"/>
           <w:szCs w:val="24"/>
         </w:rPr>
-        <w:t>I will first start with this task by setting up the dependencies in my build.gradle and libs.versions.toml files. I will add MapLibre with Vulkan support, the Ramani Maps Compose wrapper, and the standard AndroidX libraries needed for Compose.</w:t>
+        <w:t xml:space="preserve">I will first start with this task by setting up the dependencies in my </w:t>
+      </w:r>
+      <w:proofErr w:type="spellStart"/>
+      <w:proofErr w:type="gramStart"/>
+      <w:r>
+        <w:rPr>
+          <w:rFonts w:ascii="Trebuchet MS" w:eastAsia="Trebuchet MS" w:hAnsi="Trebuchet MS" w:cs="Trebuchet MS"/>
+          <w:sz w:val="24"/>
+          <w:szCs w:val="24"/>
+        </w:rPr>
+        <w:t>build.gradle</w:t>
+      </w:r>
+      <w:proofErr w:type="spellEnd"/>
+      <w:proofErr w:type="gramEnd"/>
+      <w:r>
+        <w:rPr>
+          <w:rFonts w:ascii="Trebuchet MS" w:eastAsia="Trebuchet MS" w:hAnsi="Trebuchet MS" w:cs="Trebuchet MS"/>
+          <w:sz w:val="24"/>
+          <w:szCs w:val="24"/>
+        </w:rPr>
+        <w:t xml:space="preserve"> and </w:t>
+      </w:r>
+      <w:proofErr w:type="spellStart"/>
+      <w:proofErr w:type="gramStart"/>
+      <w:r>
+        <w:rPr>
+          <w:rFonts w:ascii="Trebuchet MS" w:eastAsia="Trebuchet MS" w:hAnsi="Trebuchet MS" w:cs="Trebuchet MS"/>
+          <w:sz w:val="24"/>
+          <w:szCs w:val="24"/>
+        </w:rPr>
+        <w:t>libs.versions</w:t>
+      </w:r>
+      <w:proofErr w:type="gramEnd"/>
+      <w:r>
+        <w:rPr>
+          <w:rFonts w:ascii="Trebuchet MS" w:eastAsia="Trebuchet MS" w:hAnsi="Trebuchet MS" w:cs="Trebuchet MS"/>
+          <w:sz w:val="24"/>
+          <w:szCs w:val="24"/>
+        </w:rPr>
+        <w:t>.toml</w:t>
+      </w:r>
+      <w:proofErr w:type="spellEnd"/>
+      <w:r>
+        <w:rPr>
+          <w:rFonts w:ascii="Trebuchet MS" w:eastAsia="Trebuchet MS" w:hAnsi="Trebuchet MS" w:cs="Trebuchet MS"/>
+          <w:sz w:val="24"/>
+          <w:szCs w:val="24"/>
+        </w:rPr>
+        <w:t xml:space="preserve"> files. I will add </w:t>
+      </w:r>
+      <w:proofErr w:type="spellStart"/>
+      <w:r>
+        <w:rPr>
+          <w:rFonts w:ascii="Trebuchet MS" w:eastAsia="Trebuchet MS" w:hAnsi="Trebuchet MS" w:cs="Trebuchet MS"/>
+          <w:sz w:val="24"/>
+          <w:szCs w:val="24"/>
+        </w:rPr>
+        <w:t>MapLibre</w:t>
+      </w:r>
+      <w:proofErr w:type="spellEnd"/>
+      <w:r>
+        <w:rPr>
+          <w:rFonts w:ascii="Trebuchet MS" w:eastAsia="Trebuchet MS" w:hAnsi="Trebuchet MS" w:cs="Trebuchet MS"/>
+          <w:sz w:val="24"/>
+          <w:szCs w:val="24"/>
+        </w:rPr>
+        <w:t xml:space="preserve"> with Vulkan support, the Ramani Maps Compose wrapper, and the standard AndroidX libraries needed for Compose.</w:t>
       </w:r>
       <w:r>
         <w:rPr>
@@ -506,7 +572,25 @@
           <w:sz w:val="24"/>
           <w:szCs w:val="24"/>
         </w:rPr>
-        <w:t>Then in the AndroidManifest.xml, I will set up the ACCESS_FINE_LOCATION and ACCESS_COARSE_LOCATION permissions, as well as INTERNET, since the map tiles will be gathered remotely from OpenFreeMap.</w:t>
+        <w:t xml:space="preserve">Then in the AndroidManifest.xml, I will set up the ACCESS_FINE_LOCATION and ACCESS_COARSE_LOCATION permissions, as well as INTERNET, since the map tiles will be gathered remotely from </w:t>
+      </w:r>
+      <w:proofErr w:type="spellStart"/>
+      <w:r>
+        <w:rPr>
+          <w:rFonts w:ascii="Trebuchet MS" w:eastAsia="Trebuchet MS" w:hAnsi="Trebuchet MS" w:cs="Trebuchet MS"/>
+          <w:sz w:val="24"/>
+          <w:szCs w:val="24"/>
+        </w:rPr>
+        <w:t>OpenFreeMap</w:t>
+      </w:r>
+      <w:proofErr w:type="spellEnd"/>
+      <w:r>
+        <w:rPr>
+          <w:rFonts w:ascii="Trebuchet MS" w:eastAsia="Trebuchet MS" w:hAnsi="Trebuchet MS" w:cs="Trebuchet MS"/>
+          <w:sz w:val="24"/>
+          <w:szCs w:val="24"/>
+        </w:rPr>
+        <w:t>.</w:t>
       </w:r>
       <w:r>
         <w:rPr>
@@ -652,7 +736,61 @@
           <w:sz w:val="24"/>
           <w:szCs w:val="24"/>
         </w:rPr>
-        <w:t xml:space="preserve">To manage the location state in both the activity and UI, I will need to add a LatLngViewModel class that will hold a latLng property backed by a MutableLiveData object. </w:t>
+        <w:t xml:space="preserve">To manage the location state in both the activity and UI, I will need to add a </w:t>
+      </w:r>
+      <w:proofErr w:type="spellStart"/>
+      <w:r>
+        <w:rPr>
+          <w:rFonts w:ascii="Trebuchet MS" w:eastAsia="Trebuchet MS" w:hAnsi="Trebuchet MS" w:cs="Trebuchet MS"/>
+          <w:sz w:val="24"/>
+          <w:szCs w:val="24"/>
+        </w:rPr>
+        <w:t>LatLngViewModel</w:t>
+      </w:r>
+      <w:proofErr w:type="spellEnd"/>
+      <w:r>
+        <w:rPr>
+          <w:rFonts w:ascii="Trebuchet MS" w:eastAsia="Trebuchet MS" w:hAnsi="Trebuchet MS" w:cs="Trebuchet MS"/>
+          <w:sz w:val="24"/>
+          <w:szCs w:val="24"/>
+        </w:rPr>
+        <w:t xml:space="preserve"> class that will hold a </w:t>
+      </w:r>
+      <w:proofErr w:type="spellStart"/>
+      <w:r>
+        <w:rPr>
+          <w:rFonts w:ascii="Trebuchet MS" w:eastAsia="Trebuchet MS" w:hAnsi="Trebuchet MS" w:cs="Trebuchet MS"/>
+          <w:sz w:val="24"/>
+          <w:szCs w:val="24"/>
+        </w:rPr>
+        <w:t>latLng</w:t>
+      </w:r>
+      <w:proofErr w:type="spellEnd"/>
+      <w:r>
+        <w:rPr>
+          <w:rFonts w:ascii="Trebuchet MS" w:eastAsia="Trebuchet MS" w:hAnsi="Trebuchet MS" w:cs="Trebuchet MS"/>
+          <w:sz w:val="24"/>
+          <w:szCs w:val="24"/>
+        </w:rPr>
+        <w:t xml:space="preserve"> property backed by a </w:t>
+      </w:r>
+      <w:proofErr w:type="spellStart"/>
+      <w:r>
+        <w:rPr>
+          <w:rFonts w:ascii="Trebuchet MS" w:eastAsia="Trebuchet MS" w:hAnsi="Trebuchet MS" w:cs="Trebuchet MS"/>
+          <w:sz w:val="24"/>
+          <w:szCs w:val="24"/>
+        </w:rPr>
+        <w:t>MutableLiveData</w:t>
+      </w:r>
+      <w:proofErr w:type="spellEnd"/>
+      <w:r>
+        <w:rPr>
+          <w:rFonts w:ascii="Trebuchet MS" w:eastAsia="Trebuchet MS" w:hAnsi="Trebuchet MS" w:cs="Trebuchet MS"/>
+          <w:sz w:val="24"/>
+          <w:szCs w:val="24"/>
+        </w:rPr>
+        <w:t xml:space="preserve"> object. </w:t>
       </w:r>
     </w:p>
     <w:p>
@@ -679,7 +817,43 @@
           <w:szCs w:val="24"/>
         </w:rPr>
         <w:lastRenderedPageBreak/>
-        <w:t xml:space="preserve">Whenever the latLng is updated, i.e. the user's location changes, it should automatically push the new value to latLngLiveData, making it observable from the UI layer.  </w:t>
+        <w:t xml:space="preserve">Whenever the </w:t>
+      </w:r>
+      <w:proofErr w:type="spellStart"/>
+      <w:r>
+        <w:rPr>
+          <w:rFonts w:ascii="Trebuchet MS" w:eastAsia="Trebuchet MS" w:hAnsi="Trebuchet MS" w:cs="Trebuchet MS"/>
+          <w:sz w:val="24"/>
+          <w:szCs w:val="24"/>
+        </w:rPr>
+        <w:t>latLng</w:t>
+      </w:r>
+      <w:proofErr w:type="spellEnd"/>
+      <w:r>
+        <w:rPr>
+          <w:rFonts w:ascii="Trebuchet MS" w:eastAsia="Trebuchet MS" w:hAnsi="Trebuchet MS" w:cs="Trebuchet MS"/>
+          <w:sz w:val="24"/>
+          <w:szCs w:val="24"/>
+        </w:rPr>
+        <w:t xml:space="preserve"> is updated, i.e. the user's location changes, it should automatically push the new value to </w:t>
+      </w:r>
+      <w:proofErr w:type="spellStart"/>
+      <w:r>
+        <w:rPr>
+          <w:rFonts w:ascii="Trebuchet MS" w:eastAsia="Trebuchet MS" w:hAnsi="Trebuchet MS" w:cs="Trebuchet MS"/>
+          <w:sz w:val="24"/>
+          <w:szCs w:val="24"/>
+        </w:rPr>
+        <w:t>latLngLiveData</w:t>
+      </w:r>
+      <w:proofErr w:type="spellEnd"/>
+      <w:r>
+        <w:rPr>
+          <w:rFonts w:ascii="Trebuchet MS" w:eastAsia="Trebuchet MS" w:hAnsi="Trebuchet MS" w:cs="Trebuchet MS"/>
+          <w:sz w:val="24"/>
+          <w:szCs w:val="24"/>
+        </w:rPr>
+        <w:t xml:space="preserve">, making it observable from the UI layer.  </w:t>
       </w:r>
     </w:p>
     <w:p>
@@ -771,7 +945,97 @@
           <w:sz w:val="24"/>
           <w:szCs w:val="24"/>
         </w:rPr>
-        <w:t>In the MainActivity, I will add the LocationListener interface. This will allow me to override the onLocationChanged function, where I will update the ViewModel's latLng with the current coordinates gathered by the device itself.</w:t>
+        <w:t xml:space="preserve">In the </w:t>
+      </w:r>
+      <w:proofErr w:type="spellStart"/>
+      <w:r>
+        <w:rPr>
+          <w:rFonts w:ascii="Trebuchet MS" w:eastAsia="Trebuchet MS" w:hAnsi="Trebuchet MS" w:cs="Trebuchet MS"/>
+          <w:sz w:val="24"/>
+          <w:szCs w:val="24"/>
+        </w:rPr>
+        <w:t>MainActivity</w:t>
+      </w:r>
+      <w:proofErr w:type="spellEnd"/>
+      <w:r>
+        <w:rPr>
+          <w:rFonts w:ascii="Trebuchet MS" w:eastAsia="Trebuchet MS" w:hAnsi="Trebuchet MS" w:cs="Trebuchet MS"/>
+          <w:sz w:val="24"/>
+          <w:szCs w:val="24"/>
+        </w:rPr>
+        <w:t xml:space="preserve">, I will add the </w:t>
+      </w:r>
+      <w:proofErr w:type="spellStart"/>
+      <w:r>
+        <w:rPr>
+          <w:rFonts w:ascii="Trebuchet MS" w:eastAsia="Trebuchet MS" w:hAnsi="Trebuchet MS" w:cs="Trebuchet MS"/>
+          <w:sz w:val="24"/>
+          <w:szCs w:val="24"/>
+        </w:rPr>
+        <w:t>LocationListener</w:t>
+      </w:r>
+      <w:proofErr w:type="spellEnd"/>
+      <w:r>
+        <w:rPr>
+          <w:rFonts w:ascii="Trebuchet MS" w:eastAsia="Trebuchet MS" w:hAnsi="Trebuchet MS" w:cs="Trebuchet MS"/>
+          <w:sz w:val="24"/>
+          <w:szCs w:val="24"/>
+        </w:rPr>
+        <w:t xml:space="preserve"> interface. This will allow me to override the </w:t>
+      </w:r>
+      <w:proofErr w:type="spellStart"/>
+      <w:r>
+        <w:rPr>
+          <w:rFonts w:ascii="Trebuchet MS" w:eastAsia="Trebuchet MS" w:hAnsi="Trebuchet MS" w:cs="Trebuchet MS"/>
+          <w:sz w:val="24"/>
+          <w:szCs w:val="24"/>
+        </w:rPr>
+        <w:t>onLocationChanged</w:t>
+      </w:r>
+      <w:proofErr w:type="spellEnd"/>
+      <w:r>
+        <w:rPr>
+          <w:rFonts w:ascii="Trebuchet MS" w:eastAsia="Trebuchet MS" w:hAnsi="Trebuchet MS" w:cs="Trebuchet MS"/>
+          <w:sz w:val="24"/>
+          <w:szCs w:val="24"/>
+        </w:rPr>
+        <w:t xml:space="preserve"> function, where I will update the </w:t>
+      </w:r>
+      <w:proofErr w:type="spellStart"/>
+      <w:r>
+        <w:rPr>
+          <w:rFonts w:ascii="Trebuchet MS" w:eastAsia="Trebuchet MS" w:hAnsi="Trebuchet MS" w:cs="Trebuchet MS"/>
+          <w:sz w:val="24"/>
+          <w:szCs w:val="24"/>
+        </w:rPr>
+        <w:t>ViewModel's</w:t>
+      </w:r>
+      <w:proofErr w:type="spellEnd"/>
+      <w:r>
+        <w:rPr>
+          <w:rFonts w:ascii="Trebuchet MS" w:eastAsia="Trebuchet MS" w:hAnsi="Trebuchet MS" w:cs="Trebuchet MS"/>
+          <w:sz w:val="24"/>
+          <w:szCs w:val="24"/>
+        </w:rPr>
+        <w:t xml:space="preserve"> </w:t>
+      </w:r>
+      <w:proofErr w:type="spellStart"/>
+      <w:r>
+        <w:rPr>
+          <w:rFonts w:ascii="Trebuchet MS" w:eastAsia="Trebuchet MS" w:hAnsi="Trebuchet MS" w:cs="Trebuchet MS"/>
+          <w:sz w:val="24"/>
+          <w:szCs w:val="24"/>
+        </w:rPr>
+        <w:t>latLng</w:t>
+      </w:r>
+      <w:proofErr w:type="spellEnd"/>
+      <w:r>
+        <w:rPr>
+          <w:rFonts w:ascii="Trebuchet MS" w:eastAsia="Trebuchet MS" w:hAnsi="Trebuchet MS" w:cs="Trebuchet MS"/>
+          <w:sz w:val="24"/>
+          <w:szCs w:val="24"/>
+        </w:rPr>
+        <w:t xml:space="preserve"> with the current coordinates gathered by the device itself.</w:t>
       </w:r>
       <w:r>
         <w:rPr>
@@ -911,7 +1175,61 @@
           <w:sz w:val="24"/>
           <w:szCs w:val="24"/>
         </w:rPr>
-        <w:t>To start receiving GPS updates, I will create a GPS function that will retrieve the LocationManager system service and call requestLocationUpdates, which I will set to update every 2 seconds or after 5 metres of movement. This will keep the GPS accurate without slowing the machine down too much.</w:t>
+        <w:t xml:space="preserve">To start receiving GPS updates, I will create a GPS function that will retrieve the </w:t>
+      </w:r>
+      <w:proofErr w:type="spellStart"/>
+      <w:r>
+        <w:rPr>
+          <w:rFonts w:ascii="Trebuchet MS" w:eastAsia="Trebuchet MS" w:hAnsi="Trebuchet MS" w:cs="Trebuchet MS"/>
+          <w:sz w:val="24"/>
+          <w:szCs w:val="24"/>
+        </w:rPr>
+        <w:t>LocationManager</w:t>
+      </w:r>
+      <w:proofErr w:type="spellEnd"/>
+      <w:r>
+        <w:rPr>
+          <w:rFonts w:ascii="Trebuchet MS" w:eastAsia="Trebuchet MS" w:hAnsi="Trebuchet MS" w:cs="Trebuchet MS"/>
+          <w:sz w:val="24"/>
+          <w:szCs w:val="24"/>
+        </w:rPr>
+        <w:t xml:space="preserve"> system service and call </w:t>
+      </w:r>
+      <w:proofErr w:type="spellStart"/>
+      <w:r>
+        <w:rPr>
+          <w:rFonts w:ascii="Trebuchet MS" w:eastAsia="Trebuchet MS" w:hAnsi="Trebuchet MS" w:cs="Trebuchet MS"/>
+          <w:sz w:val="24"/>
+          <w:szCs w:val="24"/>
+        </w:rPr>
+        <w:t>requestLocationUpdates</w:t>
+      </w:r>
+      <w:proofErr w:type="spellEnd"/>
+      <w:r>
+        <w:rPr>
+          <w:rFonts w:ascii="Trebuchet MS" w:eastAsia="Trebuchet MS" w:hAnsi="Trebuchet MS" w:cs="Trebuchet MS"/>
+          <w:sz w:val="24"/>
+          <w:szCs w:val="24"/>
+        </w:rPr>
+        <w:t xml:space="preserve">, which I will set to update every 2 seconds or after 5 </w:t>
+      </w:r>
+      <w:proofErr w:type="spellStart"/>
+      <w:r>
+        <w:rPr>
+          <w:rFonts w:ascii="Trebuchet MS" w:eastAsia="Trebuchet MS" w:hAnsi="Trebuchet MS" w:cs="Trebuchet MS"/>
+          <w:sz w:val="24"/>
+          <w:szCs w:val="24"/>
+        </w:rPr>
+        <w:t>metres</w:t>
+      </w:r>
+      <w:proofErr w:type="spellEnd"/>
+      <w:r>
+        <w:rPr>
+          <w:rFonts w:ascii="Trebuchet MS" w:eastAsia="Trebuchet MS" w:hAnsi="Trebuchet MS" w:cs="Trebuchet MS"/>
+          <w:sz w:val="24"/>
+          <w:szCs w:val="24"/>
+        </w:rPr>
+        <w:t xml:space="preserve"> of movement. This will keep the GPS accurate without slowing the machine down too much.</w:t>
       </w:r>
       <w:r>
         <w:rPr>
@@ -1034,7 +1352,35 @@
           <w:sz w:val="24"/>
           <w:szCs w:val="24"/>
         </w:rPr>
-        <w:t>I will also write a checkPermissions function that will check whether the location permission has already been granted. If they haven’t, then it will launch a permission request. This will make sure that the GPS function is only called if the user approves the use of their location. A Toast message was shown if they denied it.</w:t>
+        <w:t xml:space="preserve">I will also write a </w:t>
+      </w:r>
+      <w:proofErr w:type="spellStart"/>
+      <w:proofErr w:type="gramStart"/>
+      <w:r>
+        <w:rPr>
+          <w:rFonts w:ascii="Trebuchet MS" w:eastAsia="Trebuchet MS" w:hAnsi="Trebuchet MS" w:cs="Trebuchet MS"/>
+          <w:sz w:val="24"/>
+          <w:szCs w:val="24"/>
+        </w:rPr>
+        <w:t>checkPermissions</w:t>
+      </w:r>
+      <w:proofErr w:type="spellEnd"/>
+      <w:r>
+        <w:rPr>
+          <w:rFonts w:ascii="Trebuchet MS" w:eastAsia="Trebuchet MS" w:hAnsi="Trebuchet MS" w:cs="Trebuchet MS"/>
+          <w:sz w:val="24"/>
+          <w:szCs w:val="24"/>
+        </w:rPr>
+        <w:t xml:space="preserve"> function</w:t>
+      </w:r>
+      <w:proofErr w:type="gramEnd"/>
+      <w:r>
+        <w:rPr>
+          <w:rFonts w:ascii="Trebuchet MS" w:eastAsia="Trebuchet MS" w:hAnsi="Trebuchet MS" w:cs="Trebuchet MS"/>
+          <w:sz w:val="24"/>
+          <w:szCs w:val="24"/>
+        </w:rPr>
+        <w:t xml:space="preserve"> that will check whether the location permission has already been granted. If they haven’t, then it will launch a permission request. This will make sure that the GPS function is only called if the user approves the use of their location. A Toast message was shown if they denied it.</w:t>
       </w:r>
     </w:p>
     <w:p>
@@ -1165,7 +1511,187 @@
           <w:sz w:val="24"/>
           <w:szCs w:val="24"/>
         </w:rPr>
-        <w:t>Inside the setContent itself, I will use a mutablestate variable to hold the current LatLng and zoom level, observed the ViewModel's LiveData to keep that state updated, and pass the values into a MapLibre composable via a CameraPosition, causing the map to recentre automatically whenever the user's location changed. This was all placed inside a Scaffold with innerpadding to prevent any overlap of the devices interfaces with the application itself.</w:t>
+        <w:t xml:space="preserve">Inside the </w:t>
+      </w:r>
+      <w:proofErr w:type="spellStart"/>
+      <w:r>
+        <w:rPr>
+          <w:rFonts w:ascii="Trebuchet MS" w:eastAsia="Trebuchet MS" w:hAnsi="Trebuchet MS" w:cs="Trebuchet MS"/>
+          <w:sz w:val="24"/>
+          <w:szCs w:val="24"/>
+        </w:rPr>
+        <w:t>setContent</w:t>
+      </w:r>
+      <w:proofErr w:type="spellEnd"/>
+      <w:r>
+        <w:rPr>
+          <w:rFonts w:ascii="Trebuchet MS" w:eastAsia="Trebuchet MS" w:hAnsi="Trebuchet MS" w:cs="Trebuchet MS"/>
+          <w:sz w:val="24"/>
+          <w:szCs w:val="24"/>
+        </w:rPr>
+        <w:t xml:space="preserve"> itself, I will use a </w:t>
+      </w:r>
+      <w:proofErr w:type="spellStart"/>
+      <w:r>
+        <w:rPr>
+          <w:rFonts w:ascii="Trebuchet MS" w:eastAsia="Trebuchet MS" w:hAnsi="Trebuchet MS" w:cs="Trebuchet MS"/>
+          <w:sz w:val="24"/>
+          <w:szCs w:val="24"/>
+        </w:rPr>
+        <w:t>mutablestate</w:t>
+      </w:r>
+      <w:proofErr w:type="spellEnd"/>
+      <w:r>
+        <w:rPr>
+          <w:rFonts w:ascii="Trebuchet MS" w:eastAsia="Trebuchet MS" w:hAnsi="Trebuchet MS" w:cs="Trebuchet MS"/>
+          <w:sz w:val="24"/>
+          <w:szCs w:val="24"/>
+        </w:rPr>
+        <w:t xml:space="preserve"> variable to hold the current </w:t>
+      </w:r>
+      <w:proofErr w:type="spellStart"/>
+      <w:r>
+        <w:rPr>
+          <w:rFonts w:ascii="Trebuchet MS" w:eastAsia="Trebuchet MS" w:hAnsi="Trebuchet MS" w:cs="Trebuchet MS"/>
+          <w:sz w:val="24"/>
+          <w:szCs w:val="24"/>
+        </w:rPr>
+        <w:t>LatLng</w:t>
+      </w:r>
+      <w:proofErr w:type="spellEnd"/>
+      <w:r>
+        <w:rPr>
+          <w:rFonts w:ascii="Trebuchet MS" w:eastAsia="Trebuchet MS" w:hAnsi="Trebuchet MS" w:cs="Trebuchet MS"/>
+          <w:sz w:val="24"/>
+          <w:szCs w:val="24"/>
+        </w:rPr>
+        <w:t xml:space="preserve"> and zoom level, observed the </w:t>
+      </w:r>
+      <w:proofErr w:type="spellStart"/>
+      <w:r>
+        <w:rPr>
+          <w:rFonts w:ascii="Trebuchet MS" w:eastAsia="Trebuchet MS" w:hAnsi="Trebuchet MS" w:cs="Trebuchet MS"/>
+          <w:sz w:val="24"/>
+          <w:szCs w:val="24"/>
+        </w:rPr>
+        <w:t>ViewModel's</w:t>
+      </w:r>
+      <w:proofErr w:type="spellEnd"/>
+      <w:r>
+        <w:rPr>
+          <w:rFonts w:ascii="Trebuchet MS" w:eastAsia="Trebuchet MS" w:hAnsi="Trebuchet MS" w:cs="Trebuchet MS"/>
+          <w:sz w:val="24"/>
+          <w:szCs w:val="24"/>
+        </w:rPr>
+        <w:t xml:space="preserve"> </w:t>
+      </w:r>
+      <w:proofErr w:type="spellStart"/>
+      <w:r>
+        <w:rPr>
+          <w:rFonts w:ascii="Trebuchet MS" w:eastAsia="Trebuchet MS" w:hAnsi="Trebuchet MS" w:cs="Trebuchet MS"/>
+          <w:sz w:val="24"/>
+          <w:szCs w:val="24"/>
+        </w:rPr>
+        <w:t>LiveData</w:t>
+      </w:r>
+      <w:proofErr w:type="spellEnd"/>
+      <w:r>
+        <w:rPr>
+          <w:rFonts w:ascii="Trebuchet MS" w:eastAsia="Trebuchet MS" w:hAnsi="Trebuchet MS" w:cs="Trebuchet MS"/>
+          <w:sz w:val="24"/>
+          <w:szCs w:val="24"/>
+        </w:rPr>
+        <w:t xml:space="preserve"> to keep that state updated, and pass the values into a </w:t>
+      </w:r>
+      <w:proofErr w:type="spellStart"/>
+      <w:r>
+        <w:rPr>
+          <w:rFonts w:ascii="Trebuchet MS" w:eastAsia="Trebuchet MS" w:hAnsi="Trebuchet MS" w:cs="Trebuchet MS"/>
+          <w:sz w:val="24"/>
+          <w:szCs w:val="24"/>
+        </w:rPr>
+        <w:t>MapLibre</w:t>
+      </w:r>
+      <w:proofErr w:type="spellEnd"/>
+      <w:r>
+        <w:rPr>
+          <w:rFonts w:ascii="Trebuchet MS" w:eastAsia="Trebuchet MS" w:hAnsi="Trebuchet MS" w:cs="Trebuchet MS"/>
+          <w:sz w:val="24"/>
+          <w:szCs w:val="24"/>
+        </w:rPr>
+        <w:t xml:space="preserve"> composable via a </w:t>
+      </w:r>
+      <w:proofErr w:type="spellStart"/>
+      <w:r>
+        <w:rPr>
+          <w:rFonts w:ascii="Trebuchet MS" w:eastAsia="Trebuchet MS" w:hAnsi="Trebuchet MS" w:cs="Trebuchet MS"/>
+          <w:sz w:val="24"/>
+          <w:szCs w:val="24"/>
+        </w:rPr>
+        <w:t>CameraPosition</w:t>
+      </w:r>
+      <w:proofErr w:type="spellEnd"/>
+      <w:r>
+        <w:rPr>
+          <w:rFonts w:ascii="Trebuchet MS" w:eastAsia="Trebuchet MS" w:hAnsi="Trebuchet MS" w:cs="Trebuchet MS"/>
+          <w:sz w:val="24"/>
+          <w:szCs w:val="24"/>
+        </w:rPr>
+        <w:t xml:space="preserve">, causing the map to </w:t>
+      </w:r>
+      <w:proofErr w:type="spellStart"/>
+      <w:r>
+        <w:rPr>
+          <w:rFonts w:ascii="Trebuchet MS" w:eastAsia="Trebuchet MS" w:hAnsi="Trebuchet MS" w:cs="Trebuchet MS"/>
+          <w:sz w:val="24"/>
+          <w:szCs w:val="24"/>
+        </w:rPr>
+        <w:t>recentre</w:t>
+      </w:r>
+      <w:proofErr w:type="spellEnd"/>
+      <w:r>
+        <w:rPr>
+          <w:rFonts w:ascii="Trebuchet MS" w:eastAsia="Trebuchet MS" w:hAnsi="Trebuchet MS" w:cs="Trebuchet MS"/>
+          <w:sz w:val="24"/>
+          <w:szCs w:val="24"/>
+        </w:rPr>
+        <w:t xml:space="preserve"> automatically whenever the user's location changed. This was all placed inside a Scaffold with </w:t>
+      </w:r>
+      <w:proofErr w:type="spellStart"/>
+      <w:r>
+        <w:rPr>
+          <w:rFonts w:ascii="Trebuchet MS" w:eastAsia="Trebuchet MS" w:hAnsi="Trebuchet MS" w:cs="Trebuchet MS"/>
+          <w:sz w:val="24"/>
+          <w:szCs w:val="24"/>
+        </w:rPr>
+        <w:t>innerpadding</w:t>
+      </w:r>
+      <w:proofErr w:type="spellEnd"/>
+      <w:r>
+        <w:rPr>
+          <w:rFonts w:ascii="Trebuchet MS" w:eastAsia="Trebuchet MS" w:hAnsi="Trebuchet MS" w:cs="Trebuchet MS"/>
+          <w:sz w:val="24"/>
+          <w:szCs w:val="24"/>
+        </w:rPr>
+        <w:t xml:space="preserve"> to prevent any overlap of the </w:t>
+      </w:r>
+      <w:proofErr w:type="gramStart"/>
+      <w:r>
+        <w:rPr>
+          <w:rFonts w:ascii="Trebuchet MS" w:eastAsia="Trebuchet MS" w:hAnsi="Trebuchet MS" w:cs="Trebuchet MS"/>
+          <w:sz w:val="24"/>
+          <w:szCs w:val="24"/>
+        </w:rPr>
+        <w:t>devices</w:t>
+      </w:r>
+      <w:proofErr w:type="gramEnd"/>
+      <w:r>
+        <w:rPr>
+          <w:rFonts w:ascii="Trebuchet MS" w:eastAsia="Trebuchet MS" w:hAnsi="Trebuchet MS" w:cs="Trebuchet MS"/>
+          <w:sz w:val="24"/>
+          <w:szCs w:val="24"/>
+        </w:rPr>
+        <w:t xml:space="preserve"> interfaces with the application itself.</w:t>
       </w:r>
     </w:p>
     <w:p>
@@ -1265,7 +1791,29 @@
           <w:sz w:val="24"/>
           <w:szCs w:val="24"/>
         </w:rPr>
-        <w:t>- type (pub, restaurant, hotel, historical site, etc);</w:t>
+        <w:t xml:space="preserve">- type (pub, restaurant, hotel, historical site, </w:t>
+      </w:r>
+      <w:proofErr w:type="spellStart"/>
+      <w:r>
+        <w:rPr>
+          <w:rFonts w:ascii="Trebuchet MS" w:hAnsi="Trebuchet MS"/>
+          <w:i/>
+          <w:iCs/>
+          <w:sz w:val="24"/>
+          <w:szCs w:val="24"/>
+        </w:rPr>
+        <w:t>etc</w:t>
+      </w:r>
+      <w:proofErr w:type="spellEnd"/>
+      <w:r>
+        <w:rPr>
+          <w:rFonts w:ascii="Trebuchet MS" w:hAnsi="Trebuchet MS"/>
+          <w:i/>
+          <w:iCs/>
+          <w:sz w:val="24"/>
+          <w:szCs w:val="24"/>
+        </w:rPr>
+        <w:t>);</w:t>
       </w:r>
     </w:p>
     <w:p>
@@ -1360,7 +1908,31 @@
           <w:sz w:val="24"/>
           <w:szCs w:val="24"/>
         </w:rPr>
-        <w:t>For now you can just use buttons for navigation – there is no need to use an app bar, a navigation bar, or the navigation drawer just yet.</w:t>
+        <w:t xml:space="preserve">For </w:t>
+      </w:r>
+      <w:proofErr w:type="gramStart"/>
+      <w:r>
+        <w:rPr>
+          <w:rFonts w:ascii="Trebuchet MS" w:hAnsi="Trebuchet MS"/>
+          <w:i/>
+          <w:iCs/>
+          <w:color w:val="000000"/>
+          <w:sz w:val="24"/>
+          <w:szCs w:val="24"/>
+        </w:rPr>
+        <w:t>now</w:t>
+      </w:r>
+      <w:proofErr w:type="gramEnd"/>
+      <w:r>
+        <w:rPr>
+          <w:rFonts w:ascii="Trebuchet MS" w:hAnsi="Trebuchet MS"/>
+          <w:i/>
+          <w:iCs/>
+          <w:color w:val="000000"/>
+          <w:sz w:val="24"/>
+          <w:szCs w:val="24"/>
+        </w:rPr>
+        <w:t xml:space="preserve"> you can just use buttons for navigation – there is no need to use an app bar, a navigation bar, or the navigation drawer just yet.</w:t>
       </w:r>
       <w:r>
         <w:rPr>
@@ -1480,8 +2052,13 @@
       <w:r>
         <w:t xml:space="preserve"> </w:t>
       </w:r>
-      <w:r>
-        <w:t>ViewModel.</w:t>
+      <w:proofErr w:type="spellStart"/>
+      <w:r>
+        <w:t>ViewModel</w:t>
+      </w:r>
+      <w:proofErr w:type="spellEnd"/>
+      <w:r>
+        <w:t>.</w:t>
       </w:r>
     </w:p>
     <w:p>
@@ -1499,13 +2076,58 @@
         <w:ind w:left="720"/>
       </w:pPr>
       <w:r>
-        <w:t xml:space="preserve">I then plan to update my LatLng ViewModel to also include the POI list rather than adding a second ViewModel as this already holds the GPS location. I will add </w:t>
-      </w:r>
-      <w:r>
-        <w:t>MutableLiveData&lt;List&lt;Poi&gt;&gt;</w:t>
-      </w:r>
-      <w:r>
-        <w:t xml:space="preserve"> so that the MainActivity can observe the list, meaning that whenever a POI is added the UI can then automatically know to redraw any makers on the map. I will then add a function to the ViewModel which will add a </w:t>
+        <w:t xml:space="preserve">I then plan to update my </w:t>
+      </w:r>
+      <w:proofErr w:type="spellStart"/>
+      <w:r>
+        <w:t>LatLng</w:t>
+      </w:r>
+      <w:proofErr w:type="spellEnd"/>
+      <w:r>
+        <w:t xml:space="preserve"> </w:t>
+      </w:r>
+      <w:proofErr w:type="spellStart"/>
+      <w:r>
+        <w:t>ViewModel</w:t>
+      </w:r>
+      <w:proofErr w:type="spellEnd"/>
+      <w:r>
+        <w:t xml:space="preserve"> to also include the POI list rather than adding a second </w:t>
+      </w:r>
+      <w:proofErr w:type="spellStart"/>
+      <w:r>
+        <w:t>ViewModel</w:t>
+      </w:r>
+      <w:proofErr w:type="spellEnd"/>
+      <w:r>
+        <w:t xml:space="preserve"> as this already holds the GPS location. I will add </w:t>
+      </w:r>
+      <w:proofErr w:type="spellStart"/>
+      <w:r>
+        <w:t>MutableLiveData</w:t>
+      </w:r>
+      <w:proofErr w:type="spellEnd"/>
+      <w:r>
+        <w:t>&lt;List&lt;Poi&gt;&gt;</w:t>
+      </w:r>
+      <w:r>
+        <w:t xml:space="preserve"> so that the </w:t>
+      </w:r>
+      <w:proofErr w:type="spellStart"/>
+      <w:r>
+        <w:t>MainActivity</w:t>
+      </w:r>
+      <w:proofErr w:type="spellEnd"/>
+      <w:r>
+        <w:t xml:space="preserve"> can observe the list, meaning that whenever a POI is added the UI can then automatically know to redraw any makers on the map. I will then add a function to the </w:t>
+      </w:r>
+      <w:proofErr w:type="spellStart"/>
+      <w:r>
+        <w:t>ViewModel</w:t>
+      </w:r>
+      <w:proofErr w:type="spellEnd"/>
+      <w:r>
+        <w:t xml:space="preserve"> which will add a </w:t>
       </w:r>
       <w:r>
         <w:t xml:space="preserve">given </w:t>
@@ -1651,13 +2273,29 @@
         <w:t>I will then add a separate composable for the POI screen</w:t>
       </w:r>
       <w:r>
-        <w:t>. I plan to put this in its own separate file to prevent code from clustering in the MainActivity.</w:t>
+        <w:t xml:space="preserve">. I plan to put this in its own separate file to prevent code from clustering in the </w:t>
+      </w:r>
+      <w:proofErr w:type="spellStart"/>
+      <w:r>
+        <w:t>MainActivity</w:t>
+      </w:r>
+      <w:proofErr w:type="spellEnd"/>
+      <w:r>
+        <w:t>.</w:t>
       </w:r>
       <w:r>
         <w:t xml:space="preserve"> I will add two callback functions to the parameter of the composable. One will be for when a POI I added and the other will be for when the user wishes to navigate back to the home screen.</w:t>
       </w:r>
       <w:r>
-        <w:t xml:space="preserve"> I will also make it so the users current LatLng is also passed as a parameter for the POIs location.</w:t>
+        <w:t xml:space="preserve"> I will also make it so the users current </w:t>
+      </w:r>
+      <w:proofErr w:type="spellStart"/>
+      <w:r>
+        <w:t>LatLng</w:t>
+      </w:r>
+      <w:proofErr w:type="spellEnd"/>
+      <w:r>
+        <w:t xml:space="preserve"> is also passed as a parameter for the POIs location.</w:t>
       </w:r>
       <w:r>
         <w:t xml:space="preserve"> </w:t>
@@ -1732,7 +2370,55 @@
         </w:drawing>
       </w:r>
       <w:r>
-        <w:t xml:space="preserve">I will finally update the main composable to include the map page and the add poi page using the compose navigation. I will add the NavHost which will contain the two routes for the map page and the add poi page. I will then be able to define the callback functions for the onPoiAdded and onNavigateBack. onPoiAdded will add the new poi to the ViewModel and the onNavigateBack will return the user to the previous page they were on. </w:t>
+        <w:t xml:space="preserve">I will finally update the main composable to include the map page and the add poi page using the compose navigation. I will add the </w:t>
+      </w:r>
+      <w:proofErr w:type="spellStart"/>
+      <w:r>
+        <w:t>NavHost</w:t>
+      </w:r>
+      <w:proofErr w:type="spellEnd"/>
+      <w:r>
+        <w:t xml:space="preserve"> which will contain the two routes for the map page and the add poi page. I will then be able to define the callback functions for the </w:t>
+      </w:r>
+      <w:proofErr w:type="spellStart"/>
+      <w:r>
+        <w:t>onPoiAdded</w:t>
+      </w:r>
+      <w:proofErr w:type="spellEnd"/>
+      <w:r>
+        <w:t xml:space="preserve"> and </w:t>
+      </w:r>
+      <w:proofErr w:type="spellStart"/>
+      <w:r>
+        <w:t>onNavigateBack</w:t>
+      </w:r>
+      <w:proofErr w:type="spellEnd"/>
+      <w:r>
+        <w:t xml:space="preserve">. </w:t>
+      </w:r>
+      <w:proofErr w:type="spellStart"/>
+      <w:r>
+        <w:t>onPoiAdded</w:t>
+      </w:r>
+      <w:proofErr w:type="spellEnd"/>
+      <w:r>
+        <w:t xml:space="preserve"> will add the new poi to the </w:t>
+      </w:r>
+      <w:proofErr w:type="spellStart"/>
+      <w:r>
+        <w:t>ViewModel</w:t>
+      </w:r>
+      <w:proofErr w:type="spellEnd"/>
+      <w:r>
+        <w:t xml:space="preserve"> and the </w:t>
+      </w:r>
+      <w:proofErr w:type="spellStart"/>
+      <w:r>
+        <w:t>onNavigateBack</w:t>
+      </w:r>
+      <w:proofErr w:type="spellEnd"/>
+      <w:r>
+        <w:t xml:space="preserve"> will return the user to the previous page they were on. </w:t>
       </w:r>
       <w:r>
         <w:t xml:space="preserve">I will place a </w:t>
@@ -1743,8 +2429,13 @@
       <w:r>
         <w:t xml:space="preserve">the </w:t>
       </w:r>
-      <w:r>
-        <w:t>MapLibre lambda</w:t>
+      <w:proofErr w:type="spellStart"/>
+      <w:r>
+        <w:t>MapLibre</w:t>
+      </w:r>
+      <w:proofErr w:type="spellEnd"/>
+      <w:r>
+        <w:t xml:space="preserve"> lambda</w:t>
       </w:r>
       <w:r>
         <w:t xml:space="preserve">. </w:t>
@@ -1762,20 +2453,43 @@
         <w:t xml:space="preserve"> the</w:t>
       </w:r>
       <w:r>
-        <w:t xml:space="preserve"> poisState changes</w:t>
+        <w:t xml:space="preserve"> </w:t>
+      </w:r>
+      <w:proofErr w:type="spellStart"/>
+      <w:proofErr w:type="gramStart"/>
+      <w:r>
+        <w:t>poisState</w:t>
+      </w:r>
+      <w:proofErr w:type="spellEnd"/>
+      <w:proofErr w:type="gramEnd"/>
+      <w:r>
+        <w:t xml:space="preserve"> changes</w:t>
       </w:r>
       <w:r>
         <w:t>. This will then</w:t>
       </w:r>
       <w:r>
-        <w:t xml:space="preserve"> loop through poisState and plac</w:t>
+        <w:t xml:space="preserve"> loop through </w:t>
+      </w:r>
+      <w:proofErr w:type="spellStart"/>
+      <w:r>
+        <w:t>poisState</w:t>
+      </w:r>
+      <w:proofErr w:type="spellEnd"/>
+      <w:r>
+        <w:t xml:space="preserve"> and plac</w:t>
       </w:r>
       <w:r>
         <w:t>e</w:t>
       </w:r>
       <w:r>
-        <w:t xml:space="preserve"> a Symbol at each POI's LatLng</w:t>
-      </w:r>
+        <w:t xml:space="preserve"> a Symbol at each POI's </w:t>
+      </w:r>
+      <w:proofErr w:type="spellStart"/>
+      <w:r>
+        <w:t>LatLng</w:t>
+      </w:r>
+      <w:proofErr w:type="spellEnd"/>
       <w:r>
         <w:t>. This makes it so</w:t>
       </w:r>
@@ -1786,7 +2500,15 @@
         <w:t>.</w:t>
       </w:r>
       <w:r>
-        <w:t xml:space="preserve"> I will make it so an alert dialog appears when the marker is clicked on, displaying the markers details including its name, type and description. This allows me to test that the marker has been added correctly.</w:t>
+        <w:t xml:space="preserve"> I will make </w:t>
+      </w:r>
+      <w:proofErr w:type="gramStart"/>
+      <w:r>
+        <w:t>it</w:t>
+      </w:r>
+      <w:proofErr w:type="gramEnd"/>
+      <w:r>
+        <w:t xml:space="preserve"> so an alert dialog appears when the marker is clicked on, displaying the markers details including its name, type and description. This allows me to test that the marker has been added correctly.</w:t>
       </w:r>
     </w:p>
     <w:p>
@@ -2332,7 +3054,15 @@
         <w:t xml:space="preserve">methods </w:t>
       </w:r>
       <w:r>
-        <w:t xml:space="preserve">for the database so it can be changed or searched. I plan to make it so that when the database returns all the POIs it contains, it will return it as a LiveData&lt;List&lt;Poi&gt;&gt;. This will </w:t>
+        <w:t xml:space="preserve">for the database so it can be changed or searched. I plan to make it so that when the database returns all the POIs it contains, it will return it as a </w:t>
+      </w:r>
+      <w:proofErr w:type="spellStart"/>
+      <w:r>
+        <w:t>LiveData</w:t>
+      </w:r>
+      <w:proofErr w:type="spellEnd"/>
+      <w:r>
+        <w:t xml:space="preserve">&lt;List&lt;Poi&gt;&gt;. This will </w:t>
       </w:r>
       <w:r>
         <w:t>make</w:t>
@@ -2341,7 +3071,36 @@
         <w:t xml:space="preserve"> sure that the UI is automatically updated with a new list of POIs whenever the database is changed.</w:t>
       </w:r>
       <w:r>
-        <w:t xml:space="preserve"> For now, I will give it three functions, getAllPois(), insert() and delete().</w:t>
+        <w:t xml:space="preserve"> For now, I will give it three functions, </w:t>
+      </w:r>
+      <w:proofErr w:type="spellStart"/>
+      <w:proofErr w:type="gramStart"/>
+      <w:r>
+        <w:t>getAllPois</w:t>
+      </w:r>
+      <w:proofErr w:type="spellEnd"/>
+      <w:r>
+        <w:t>(</w:t>
+      </w:r>
+      <w:proofErr w:type="gramEnd"/>
+      <w:r>
+        <w:t xml:space="preserve">), </w:t>
+      </w:r>
+      <w:proofErr w:type="gramStart"/>
+      <w:r>
+        <w:t>insert(</w:t>
+      </w:r>
+      <w:proofErr w:type="gramEnd"/>
+      <w:r>
+        <w:t xml:space="preserve">) and </w:t>
+      </w:r>
+      <w:proofErr w:type="gramStart"/>
+      <w:r>
+        <w:t>delete(</w:t>
+      </w:r>
+      <w:proofErr w:type="gramEnd"/>
+      <w:r>
+        <w:t>).</w:t>
       </w:r>
     </w:p>
     <w:p>
@@ -2414,7 +3173,28 @@
         </w:drawing>
       </w:r>
       <w:r>
-        <w:t>I plan to next create the file for the database itself. This will be placed within an abstract function which allows my other files to access its DAO and all the database operations within it. Inside it I will put a getDatabase() function which will check that a database doesn’t already exist, if not it will create one and save it, otherwise it will simply return the one that already exists.</w:t>
+        <w:t xml:space="preserve">I plan to next create the file for the database itself. This will be placed within an abstract function which allows my other files to access its DAO and all the database operations within it. Inside it I will put a </w:t>
+      </w:r>
+      <w:proofErr w:type="spellStart"/>
+      <w:proofErr w:type="gramStart"/>
+      <w:r>
+        <w:t>getDatabase</w:t>
+      </w:r>
+      <w:proofErr w:type="spellEnd"/>
+      <w:r>
+        <w:t>(</w:t>
+      </w:r>
+      <w:proofErr w:type="gramEnd"/>
+      <w:r>
+        <w:t xml:space="preserve">) function which will check that a database </w:t>
+      </w:r>
+      <w:proofErr w:type="gramStart"/>
+      <w:r>
+        <w:t>doesn’t already</w:t>
+      </w:r>
+      <w:proofErr w:type="gramEnd"/>
+      <w:r>
+        <w:t xml:space="preserve"> exist, if not it will create one and save it, otherwise it will simply return the one that already exists.</w:t>
       </w:r>
     </w:p>
     <w:p>
@@ -2483,16 +3263,74 @@
         </w:drawing>
       </w:r>
       <w:r>
-        <w:t xml:space="preserve">I will next update my Viewmodel. </w:t>
-      </w:r>
-      <w:r>
-        <w:t xml:space="preserve">I will first change the ViewModel for a AndroidViewModel so that it can access the application context which will be needed to open the database. </w:t>
+        <w:t xml:space="preserve">I will next update my </w:t>
+      </w:r>
+      <w:proofErr w:type="spellStart"/>
+      <w:r>
+        <w:t>Viewmodel</w:t>
+      </w:r>
+      <w:proofErr w:type="spellEnd"/>
+      <w:r>
+        <w:t xml:space="preserve">. </w:t>
+      </w:r>
+      <w:r>
+        <w:t xml:space="preserve">I will first change the </w:t>
+      </w:r>
+      <w:proofErr w:type="spellStart"/>
+      <w:r>
+        <w:t>ViewModel</w:t>
+      </w:r>
+      <w:proofErr w:type="spellEnd"/>
+      <w:r>
+        <w:t xml:space="preserve"> for </w:t>
+      </w:r>
+      <w:proofErr w:type="gramStart"/>
+      <w:r>
+        <w:t xml:space="preserve">a </w:t>
+      </w:r>
+      <w:proofErr w:type="spellStart"/>
+      <w:r>
+        <w:t>AndroidViewModel</w:t>
+      </w:r>
+      <w:proofErr w:type="spellEnd"/>
+      <w:proofErr w:type="gramEnd"/>
+      <w:r>
+        <w:t xml:space="preserve"> so that it can access the application context which will be needed to open the database. </w:t>
       </w:r>
       <w:r>
         <w:t xml:space="preserve">I plan to update the poi variable so that it gathers all the pois from the database as </w:t>
       </w:r>
-      <w:r>
-        <w:t>LiveData allowing it to automatically update when a new POI is added. Because of this, I will also need to change the addpoi function in the Viewmodel so that it adds the poi to the database instead of list using the poiDao’s ins</w:t>
+      <w:proofErr w:type="spellStart"/>
+      <w:r>
+        <w:t>LiveData</w:t>
+      </w:r>
+      <w:proofErr w:type="spellEnd"/>
+      <w:r>
+        <w:t xml:space="preserve"> allowing it to automatically update when a new POI is added. Because of this, I will also need to change the </w:t>
+      </w:r>
+      <w:proofErr w:type="spellStart"/>
+      <w:r>
+        <w:t>addpoi</w:t>
+      </w:r>
+      <w:proofErr w:type="spellEnd"/>
+      <w:r>
+        <w:t xml:space="preserve"> function in the </w:t>
+      </w:r>
+      <w:proofErr w:type="spellStart"/>
+      <w:r>
+        <w:t>Viewmodel</w:t>
+      </w:r>
+      <w:proofErr w:type="spellEnd"/>
+      <w:r>
+        <w:t xml:space="preserve"> so that it adds the poi to the database instead of list using the </w:t>
+      </w:r>
+      <w:proofErr w:type="spellStart"/>
+      <w:r>
+        <w:t>poiDao’s</w:t>
+      </w:r>
+      <w:proofErr w:type="spellEnd"/>
+      <w:r>
+        <w:t xml:space="preserve"> ins</w:t>
       </w:r>
       <w:r>
         <w:t>ert function.</w:t>
@@ -2573,7 +3411,15 @@
         </w:drawing>
       </w:r>
       <w:r>
-        <w:t>I will then update the button for my AddPoiScreen. I will simply change the Poi structure in the button so that it fits the databases poi structure since the latitude and longitude for the pois in the database are separate variables.</w:t>
+        <w:t xml:space="preserve">I will then update the button for my </w:t>
+      </w:r>
+      <w:proofErr w:type="spellStart"/>
+      <w:r>
+        <w:t>AddPoiScreen</w:t>
+      </w:r>
+      <w:proofErr w:type="spellEnd"/>
+      <w:r>
+        <w:t>. I will simply change the Poi structure in the button so that it fits the databases poi structure since the latitude and longitude for the pois in the database are separate variables.</w:t>
       </w:r>
     </w:p>
     <w:p>
@@ -2587,7 +3433,23 @@
       </w:pPr>
       <w:r>
         <w:lastRenderedPageBreak/>
-        <w:t>I will then need to change the MainActivity so that the Poi is converted back into the LatLng so that the map can properly mark its location.</w:t>
+        <w:t xml:space="preserve">I will then need to change the </w:t>
+      </w:r>
+      <w:proofErr w:type="spellStart"/>
+      <w:r>
+        <w:t>MainActivity</w:t>
+      </w:r>
+      <w:proofErr w:type="spellEnd"/>
+      <w:r>
+        <w:t xml:space="preserve"> so that the Poi is converted back into the </w:t>
+      </w:r>
+      <w:proofErr w:type="spellStart"/>
+      <w:r>
+        <w:t>LatLng</w:t>
+      </w:r>
+      <w:proofErr w:type="spellEnd"/>
+      <w:r>
+        <w:t xml:space="preserve"> so that the map can properly mark its location.</w:t>
       </w:r>
     </w:p>
     <w:p>
@@ -2801,7 +3663,15 @@
         <w:ind w:left="720"/>
       </w:pPr>
       <w:r>
-        <w:t xml:space="preserve">I have already set up the loading process for the POIs for task 3. This is done on startup and whenever the database is updated. </w:t>
+        <w:t xml:space="preserve">I have already set up the loading process for the POIs for task 3. This is done on </w:t>
+      </w:r>
+      <w:proofErr w:type="gramStart"/>
+      <w:r>
+        <w:t>startup and</w:t>
+      </w:r>
+      <w:proofErr w:type="gramEnd"/>
+      <w:r>
+        <w:t xml:space="preserve"> whenever the database is updated. </w:t>
       </w:r>
       <w:r>
         <w:t>However, to fit this task better I will change the code to use a button instead, this will make testing easier and give the user more control.</w:t>
@@ -2817,14 +3687,26 @@
         <w:ind w:left="720"/>
       </w:pPr>
       <w:r>
-        <w:t xml:space="preserve">I will start this by changing the DAO to return a plain list instead of </w:t>
-      </w:r>
+        <w:t xml:space="preserve">I will start this by changing the DAO to </w:t>
+      </w:r>
+      <w:proofErr w:type="gramStart"/>
+      <w:r>
+        <w:t>return</w:t>
+      </w:r>
+      <w:proofErr w:type="gramEnd"/>
+      <w:r>
+        <w:t xml:space="preserve"> a plain list instead of </w:t>
+      </w:r>
+      <w:proofErr w:type="gramStart"/>
       <w:r>
         <w:t xml:space="preserve">the </w:t>
       </w:r>
+      <w:proofErr w:type="spellStart"/>
       <w:r>
         <w:t>LiveData</w:t>
       </w:r>
+      <w:proofErr w:type="spellEnd"/>
+      <w:proofErr w:type="gramEnd"/>
       <w:r>
         <w:t xml:space="preserve"> since the POIs will no longer be automatically loaded. </w:t>
       </w:r>
@@ -2968,7 +3850,39 @@
         </w:drawing>
       </w:r>
       <w:r>
-        <w:t>I will also need to add a new function to the ViewModel which will load all the POIs from the database. It will run the database query on Dispatchers.IO in the background, then set the result to pois.value which should triggers the observer in MainActivity which will then update the map.</w:t>
+        <w:t xml:space="preserve">I will also need to add a new function to the </w:t>
+      </w:r>
+      <w:proofErr w:type="spellStart"/>
+      <w:r>
+        <w:t>ViewModel</w:t>
+      </w:r>
+      <w:proofErr w:type="spellEnd"/>
+      <w:r>
+        <w:t xml:space="preserve"> which will load all the POIs from the database. It will run the database query on Dispatchers.IO in the background, then set the result to </w:t>
+      </w:r>
+      <w:proofErr w:type="spellStart"/>
+      <w:r>
+        <w:t>pois.value</w:t>
+      </w:r>
+      <w:proofErr w:type="spellEnd"/>
+      <w:r>
+        <w:t xml:space="preserve"> which should </w:t>
+      </w:r>
+      <w:proofErr w:type="gramStart"/>
+      <w:r>
+        <w:t>triggers</w:t>
+      </w:r>
+      <w:proofErr w:type="gramEnd"/>
+      <w:r>
+        <w:t xml:space="preserve"> the observer in </w:t>
+      </w:r>
+      <w:proofErr w:type="spellStart"/>
+      <w:r>
+        <w:t>MainActivity</w:t>
+      </w:r>
+      <w:proofErr w:type="spellEnd"/>
+      <w:r>
+        <w:t xml:space="preserve"> which will then update the map.</w:t>
       </w:r>
     </w:p>
     <w:p>
@@ -3041,20 +3955,36 @@
         <w:t>it</w:t>
       </w:r>
       <w:r>
-        <w:t xml:space="preserve"> holds a plain list of pois instead of being assigned directly from the DAO’s live data since it no longer returns LiveData.</w:t>
-      </w:r>
-    </w:p>
-    <w:p>
-      <w:pPr>
-        <w:ind w:left="720"/>
-      </w:pPr>
-    </w:p>
-    <w:p>
-      <w:pPr>
-        <w:ind w:left="720"/>
-      </w:pPr>
-      <w:r>
-        <w:t>I will then lastly need to add the load buttons to the MainActivity. This will call the load poi function in the view model, loading all the pois from the database into the UI.</w:t>
+        <w:t xml:space="preserve"> holds a plain list of pois instead of being assigned directly from the DAO’s live data since it no longer returns </w:t>
+      </w:r>
+      <w:proofErr w:type="spellStart"/>
+      <w:r>
+        <w:t>LiveData</w:t>
+      </w:r>
+      <w:proofErr w:type="spellEnd"/>
+      <w:r>
+        <w:t>.</w:t>
+      </w:r>
+    </w:p>
+    <w:p>
+      <w:pPr>
+        <w:ind w:left="720"/>
+      </w:pPr>
+    </w:p>
+    <w:p>
+      <w:pPr>
+        <w:ind w:left="720"/>
+      </w:pPr>
+      <w:r>
+        <w:t xml:space="preserve">I will then lastly need to add the load buttons to the </w:t>
+      </w:r>
+      <w:proofErr w:type="spellStart"/>
+      <w:r>
+        <w:t>MainActivity</w:t>
+      </w:r>
+      <w:proofErr w:type="spellEnd"/>
+      <w:r>
+        <w:t>. This will call the load poi function in the view model, loading all the pois from the database into the UI.</w:t>
       </w:r>
     </w:p>
     <w:p>
@@ -3184,7 +4114,31 @@
           <w:sz w:val="24"/>
           <w:szCs w:val="24"/>
         </w:rPr>
-        <w:t xml:space="preserve"> in a text field. This should search the local database. The matching places should appear on the map as markers or circles. Again a dialog box should appear when the user clicks on each place.”</w:t>
+        <w:t xml:space="preserve"> in a text field. This should search the local database. The matching places should appear on the map as markers or circles. </w:t>
+      </w:r>
+      <w:proofErr w:type="gramStart"/>
+      <w:r>
+        <w:rPr>
+          <w:rFonts w:ascii="Trebuchet MS" w:hAnsi="Trebuchet MS"/>
+          <w:i/>
+          <w:iCs/>
+          <w:color w:val="000000"/>
+          <w:sz w:val="24"/>
+          <w:szCs w:val="24"/>
+        </w:rPr>
+        <w:t>Again</w:t>
+      </w:r>
+      <w:proofErr w:type="gramEnd"/>
+      <w:r>
+        <w:rPr>
+          <w:rFonts w:ascii="Trebuchet MS" w:hAnsi="Trebuchet MS"/>
+          <w:i/>
+          <w:iCs/>
+          <w:color w:val="000000"/>
+          <w:sz w:val="24"/>
+          <w:szCs w:val="24"/>
+        </w:rPr>
+        <w:t xml:space="preserve"> a dialog box should appear when the user clicks on each place.”</w:t>
       </w:r>
     </w:p>
     <w:p>
@@ -3330,7 +4284,31 @@
         <w:t>I will next create</w:t>
       </w:r>
       <w:r>
-        <w:t xml:space="preserve"> a new function in the ViewModel. This will use the search by type function from the DAO. This will have the type as a parameter to search with and add the results to the pois.value.</w:t>
+        <w:t xml:space="preserve"> a new function in the </w:t>
+      </w:r>
+      <w:proofErr w:type="spellStart"/>
+      <w:r>
+        <w:t>ViewModel</w:t>
+      </w:r>
+      <w:proofErr w:type="spellEnd"/>
+      <w:r>
+        <w:t xml:space="preserve">. This will </w:t>
+      </w:r>
+      <w:proofErr w:type="gramStart"/>
+      <w:r>
+        <w:t>use the search</w:t>
+      </w:r>
+      <w:proofErr w:type="gramEnd"/>
+      <w:r>
+        <w:t xml:space="preserve"> by type function from the DAO. This will have the type as a parameter to search with and add the results to the </w:t>
+      </w:r>
+      <w:proofErr w:type="spellStart"/>
+      <w:r>
+        <w:t>pois.value</w:t>
+      </w:r>
+      <w:proofErr w:type="spellEnd"/>
+      <w:r>
+        <w:t>.</w:t>
       </w:r>
       <w:r>
         <w:t xml:space="preserve"> This makes it so when a user searches a type, it only displays markers relating to that type. Then to display all the pois again the user will simply need to load the pois again.</w:t>
@@ -3406,7 +4384,31 @@
         </w:drawing>
       </w:r>
       <w:r>
-        <w:t>Then I will add an outlined text field to my MainActivity which will be used by the user to input the accommodation type that they are searching for. This will then be followed by a button which, when clicked, will take the inputted data and call the search pois by type function using the inputted data as the parameter.</w:t>
+        <w:t xml:space="preserve">Then I will add an outlined text field to my </w:t>
+      </w:r>
+      <w:proofErr w:type="spellStart"/>
+      <w:r>
+        <w:t>MainActivity</w:t>
+      </w:r>
+      <w:proofErr w:type="spellEnd"/>
+      <w:r>
+        <w:t xml:space="preserve"> which will be used by the user to input the accommodation type that they are searching for. This will then be followed by a button which, when clicked, will take the </w:t>
+      </w:r>
+      <w:proofErr w:type="gramStart"/>
+      <w:r>
+        <w:t>inputted</w:t>
+      </w:r>
+      <w:proofErr w:type="gramEnd"/>
+      <w:r>
+        <w:t xml:space="preserve"> data and call the search pois by type function using the </w:t>
+      </w:r>
+      <w:proofErr w:type="gramStart"/>
+      <w:r>
+        <w:t>inputted</w:t>
+      </w:r>
+      <w:proofErr w:type="gramEnd"/>
+      <w:r>
+        <w:t xml:space="preserve"> data as the parameter.</w:t>
       </w:r>
     </w:p>
     <w:p/>
@@ -3590,7 +4592,29 @@
           <w:sz w:val="24"/>
           <w:szCs w:val="24"/>
         </w:rPr>
-        <w:t>When the POIs are loaded they should be shown on the map as markers and saved to the database. To avoid duplicate entries in the database, check whether the point of interest with that ID is already present before adding it.”</w:t>
+        <w:t xml:space="preserve">When the POIs are </w:t>
+      </w:r>
+      <w:proofErr w:type="gramStart"/>
+      <w:r>
+        <w:rPr>
+          <w:rFonts w:ascii="Trebuchet MS" w:hAnsi="Trebuchet MS"/>
+          <w:i/>
+          <w:iCs/>
+          <w:sz w:val="24"/>
+          <w:szCs w:val="24"/>
+        </w:rPr>
+        <w:t>loaded</w:t>
+      </w:r>
+      <w:proofErr w:type="gramEnd"/>
+      <w:r>
+        <w:rPr>
+          <w:rFonts w:ascii="Trebuchet MS" w:hAnsi="Trebuchet MS"/>
+          <w:i/>
+          <w:iCs/>
+          <w:sz w:val="24"/>
+          <w:szCs w:val="24"/>
+        </w:rPr>
+        <w:t xml:space="preserve"> they should be shown on the map as markers and saved to the database. To avoid duplicate entries in the database, check whether the point of interest with that ID is already present before adding it.”</w:t>
       </w:r>
     </w:p>
     <w:p>
@@ -3871,7 +4895,35 @@
           <w:sz w:val="24"/>
           <w:szCs w:val="24"/>
         </w:rPr>
-        <w:t>On top of this I will need to add usesCleartextTraffic=”true” to my application. This is because Android doesn’t allow access to insecure servers (HTTP) which my server is. By using this it disables the restriction allowing my app to communicate with the server.</w:t>
+        <w:t xml:space="preserve">On top of this I will need to add </w:t>
+      </w:r>
+      <w:proofErr w:type="spellStart"/>
+      <w:r>
+        <w:rPr>
+          <w:rFonts w:ascii="Trebuchet MS" w:hAnsi="Trebuchet MS"/>
+          <w:sz w:val="24"/>
+          <w:szCs w:val="24"/>
+        </w:rPr>
+        <w:t>usesCleartextTraffic</w:t>
+      </w:r>
+      <w:proofErr w:type="spellEnd"/>
+      <w:proofErr w:type="gramStart"/>
+      <w:r>
+        <w:rPr>
+          <w:rFonts w:ascii="Trebuchet MS" w:hAnsi="Trebuchet MS"/>
+          <w:sz w:val="24"/>
+          <w:szCs w:val="24"/>
+        </w:rPr>
+        <w:t>=”true</w:t>
+      </w:r>
+      <w:proofErr w:type="gramEnd"/>
+      <w:r>
+        <w:rPr>
+          <w:rFonts w:ascii="Trebuchet MS" w:hAnsi="Trebuchet MS"/>
+          <w:sz w:val="24"/>
+          <w:szCs w:val="24"/>
+        </w:rPr>
+        <w:t>” to my application. This is because Android doesn’t allow access to insecure servers (HTTP) which my server is. By using this it disables the restriction allowing my app to communicate with the server.</w:t>
       </w:r>
     </w:p>
     <w:p>
@@ -4057,8 +5109,18 @@
           <w:sz w:val="24"/>
           <w:szCs w:val="24"/>
         </w:rPr>
-        <w:t xml:space="preserve"> as they both currently have different feilds</w:t>
-      </w:r>
+        <w:t xml:space="preserve"> as they both currently have different </w:t>
+      </w:r>
+      <w:proofErr w:type="spellStart"/>
+      <w:r>
+        <w:rPr>
+          <w:rFonts w:ascii="Trebuchet MS" w:hAnsi="Trebuchet MS"/>
+          <w:sz w:val="24"/>
+          <w:szCs w:val="24"/>
+        </w:rPr>
+        <w:t>feilds</w:t>
+      </w:r>
+      <w:proofErr w:type="spellEnd"/>
       <w:r>
         <w:rPr>
           <w:rFonts w:ascii="Trebuchet MS" w:hAnsi="Trebuchet MS"/>
@@ -4315,7 +5377,25 @@
           <w:szCs w:val="24"/>
         </w:rPr>
         <w:lastRenderedPageBreak/>
-        <w:t xml:space="preserve">This will need a new function which I will store within my ViewModel. </w:t>
+        <w:t xml:space="preserve">This will need a new function which I will store within my </w:t>
+      </w:r>
+      <w:proofErr w:type="spellStart"/>
+      <w:r>
+        <w:rPr>
+          <w:rFonts w:ascii="Trebuchet MS" w:hAnsi="Trebuchet MS"/>
+          <w:sz w:val="24"/>
+          <w:szCs w:val="24"/>
+        </w:rPr>
+        <w:t>ViewModel</w:t>
+      </w:r>
+      <w:proofErr w:type="spellEnd"/>
+      <w:r>
+        <w:rPr>
+          <w:rFonts w:ascii="Trebuchet MS" w:hAnsi="Trebuchet MS"/>
+          <w:sz w:val="24"/>
+          <w:szCs w:val="24"/>
+        </w:rPr>
+        <w:t xml:space="preserve">. </w:t>
       </w:r>
       <w:r>
         <w:rPr>
@@ -4339,7 +5419,25 @@
           <w:sz w:val="24"/>
           <w:szCs w:val="24"/>
         </w:rPr>
-        <w:t xml:space="preserve">” url which will gather all the pois in the web data base. The function will then, within a coroutine so it can handle the database operations, check each poi in the web database and compare its id with the ones in the local database. The ones that have an id which already exists in the local database are skipped to prevent duplicates. </w:t>
+        <w:t xml:space="preserve">” </w:t>
+      </w:r>
+      <w:proofErr w:type="spellStart"/>
+      <w:r>
+        <w:rPr>
+          <w:rFonts w:ascii="Trebuchet MS" w:hAnsi="Trebuchet MS"/>
+          <w:sz w:val="24"/>
+          <w:szCs w:val="24"/>
+        </w:rPr>
+        <w:t>url</w:t>
+      </w:r>
+      <w:proofErr w:type="spellEnd"/>
+      <w:r>
+        <w:rPr>
+          <w:rFonts w:ascii="Trebuchet MS" w:hAnsi="Trebuchet MS"/>
+          <w:sz w:val="24"/>
+          <w:szCs w:val="24"/>
+        </w:rPr>
+        <w:t xml:space="preserve"> which will gather all the pois in the web data base. The function will then, within a coroutine so it can handle the database operations, check each poi in the web database and compare its id with the ones in the local database. The ones that have an id which already exists in the local database are skipped to prevent duplicates. </w:t>
       </w:r>
       <w:r>
         <w:rPr>
@@ -4520,7 +5618,43 @@
           <w:sz w:val="24"/>
           <w:szCs w:val="24"/>
         </w:rPr>
-        <w:t>Then finally for this task I will need to add a new button in the MainActivity which uses the new function.</w:t>
+        <w:t xml:space="preserve">Then finally for this task I will need to add a new button </w:t>
+      </w:r>
+      <w:proofErr w:type="gramStart"/>
+      <w:r>
+        <w:rPr>
+          <w:rFonts w:ascii="Trebuchet MS" w:hAnsi="Trebuchet MS"/>
+          <w:sz w:val="24"/>
+          <w:szCs w:val="24"/>
+        </w:rPr>
+        <w:t>in</w:t>
+      </w:r>
+      <w:proofErr w:type="gramEnd"/>
+      <w:r>
+        <w:rPr>
+          <w:rFonts w:ascii="Trebuchet MS" w:hAnsi="Trebuchet MS"/>
+          <w:sz w:val="24"/>
+          <w:szCs w:val="24"/>
+        </w:rPr>
+        <w:t xml:space="preserve"> the </w:t>
+      </w:r>
+      <w:proofErr w:type="spellStart"/>
+      <w:r>
+        <w:rPr>
+          <w:rFonts w:ascii="Trebuchet MS" w:hAnsi="Trebuchet MS"/>
+          <w:sz w:val="24"/>
+          <w:szCs w:val="24"/>
+        </w:rPr>
+        <w:t>MainActivity</w:t>
+      </w:r>
+      <w:proofErr w:type="spellEnd"/>
+      <w:r>
+        <w:rPr>
+          <w:rFonts w:ascii="Trebuchet MS" w:hAnsi="Trebuchet MS"/>
+          <w:sz w:val="24"/>
+          <w:szCs w:val="24"/>
+        </w:rPr>
+        <w:t xml:space="preserve"> which uses the new function.</w:t>
       </w:r>
       <w:r>
         <w:rPr>
@@ -4594,17 +5728,7 @@
           <w:sz w:val="24"/>
           <w:szCs w:val="24"/>
         </w:rPr>
-        <w:t>“</w:t>
-      </w:r>
-      <w:r>
-        <w:rPr>
-          <w:rFonts w:ascii="Trebuchet MS" w:hAnsi="Trebuchet MS"/>
-          <w:i/>
-          <w:iCs/>
-          <w:sz w:val="24"/>
-          <w:szCs w:val="24"/>
-        </w:rPr>
-        <w:t xml:space="preserve">A point of interest should be saved to the web after it has been added to the map and </w:t>
+        <w:t xml:space="preserve">“A point of interest should be saved to the web after it has been added to the map and </w:t>
       </w:r>
       <w:r>
         <w:rPr>
@@ -4776,27 +5900,71 @@
           <w:sz w:val="24"/>
           <w:szCs w:val="24"/>
         </w:rPr>
-        <w:t>- lat (the latitude)</w:t>
-      </w:r>
-    </w:p>
-    <w:p>
-      <w:pPr>
-        <w:rPr>
-          <w:i/>
-          <w:iCs/>
-          <w:sz w:val="24"/>
-          <w:szCs w:val="24"/>
-        </w:rPr>
-      </w:pPr>
-      <w:r>
-        <w:rPr>
-          <w:rFonts w:ascii="Trebuchet MS" w:hAnsi="Trebuchet MS"/>
-          <w:i/>
-          <w:iCs/>
-          <w:sz w:val="24"/>
-          <w:szCs w:val="24"/>
-        </w:rPr>
-        <w:t>- lon (the longitude).</w:t>
+        <w:t xml:space="preserve">- </w:t>
+      </w:r>
+      <w:proofErr w:type="spellStart"/>
+      <w:r>
+        <w:rPr>
+          <w:rFonts w:ascii="Trebuchet MS" w:hAnsi="Trebuchet MS"/>
+          <w:i/>
+          <w:iCs/>
+          <w:sz w:val="24"/>
+          <w:szCs w:val="24"/>
+        </w:rPr>
+        <w:t>lat</w:t>
+      </w:r>
+      <w:proofErr w:type="spellEnd"/>
+      <w:r>
+        <w:rPr>
+          <w:rFonts w:ascii="Trebuchet MS" w:hAnsi="Trebuchet MS"/>
+          <w:i/>
+          <w:iCs/>
+          <w:sz w:val="24"/>
+          <w:szCs w:val="24"/>
+        </w:rPr>
+        <w:t xml:space="preserve"> (the latitude)</w:t>
+      </w:r>
+    </w:p>
+    <w:p>
+      <w:pPr>
+        <w:rPr>
+          <w:i/>
+          <w:iCs/>
+          <w:sz w:val="24"/>
+          <w:szCs w:val="24"/>
+        </w:rPr>
+      </w:pPr>
+      <w:r>
+        <w:rPr>
+          <w:rFonts w:ascii="Trebuchet MS" w:hAnsi="Trebuchet MS"/>
+          <w:i/>
+          <w:iCs/>
+          <w:sz w:val="24"/>
+          <w:szCs w:val="24"/>
+        </w:rPr>
+        <w:t xml:space="preserve">- </w:t>
+      </w:r>
+      <w:proofErr w:type="spellStart"/>
+      <w:r>
+        <w:rPr>
+          <w:rFonts w:ascii="Trebuchet MS" w:hAnsi="Trebuchet MS"/>
+          <w:i/>
+          <w:iCs/>
+          <w:sz w:val="24"/>
+          <w:szCs w:val="24"/>
+        </w:rPr>
+        <w:t>lon</w:t>
+      </w:r>
+      <w:proofErr w:type="spellEnd"/>
+      <w:r>
+        <w:rPr>
+          <w:rFonts w:ascii="Trebuchet MS" w:hAnsi="Trebuchet MS"/>
+          <w:i/>
+          <w:iCs/>
+          <w:sz w:val="24"/>
+          <w:szCs w:val="24"/>
+        </w:rPr>
+        <w:t xml:space="preserve"> (the longitude).</w:t>
       </w:r>
     </w:p>
     <w:p>
@@ -4859,30 +6027,41 @@
           <w:sz w:val="24"/>
           <w:szCs w:val="24"/>
         </w:rPr>
-        <w:t xml:space="preserve"> ID to save it in the database.</w:t>
-      </w:r>
-      <w:r>
-        <w:rPr>
-          <w:rFonts w:ascii="Trebuchet MS" w:hAnsi="Trebuchet MS"/>
-          <w:i/>
-          <w:iCs/>
-          <w:sz w:val="24"/>
-          <w:szCs w:val="24"/>
-        </w:rPr>
-        <w:t>”</w:t>
-      </w:r>
-    </w:p>
-    <w:p>
-      <w:pPr>
-        <w:rPr>
-          <w:sz w:val="24"/>
-          <w:szCs w:val="24"/>
-        </w:rPr>
-      </w:pPr>
-    </w:p>
-    <w:p>
-      <w:r>
-        <w:t xml:space="preserve">To start this task, I will need to change my addPoi() function in the Viewmodel. I will change the function so that instead of inserting the poi into the local database straight away it will first POST to the server using </w:t>
+        <w:t xml:space="preserve"> ID to save it in the database.”</w:t>
+      </w:r>
+    </w:p>
+    <w:p>
+      <w:pPr>
+        <w:rPr>
+          <w:sz w:val="24"/>
+          <w:szCs w:val="24"/>
+        </w:rPr>
+      </w:pPr>
+    </w:p>
+    <w:p>
+      <w:r>
+        <w:t xml:space="preserve">To start this task, I will need to change my </w:t>
+      </w:r>
+      <w:proofErr w:type="spellStart"/>
+      <w:proofErr w:type="gramStart"/>
+      <w:r>
+        <w:t>addPoi</w:t>
+      </w:r>
+      <w:proofErr w:type="spellEnd"/>
+      <w:r>
+        <w:t>(</w:t>
+      </w:r>
+      <w:proofErr w:type="gramEnd"/>
+      <w:r>
+        <w:t xml:space="preserve">) function in the </w:t>
+      </w:r>
+      <w:proofErr w:type="spellStart"/>
+      <w:r>
+        <w:t>Viewmodel</w:t>
+      </w:r>
+      <w:proofErr w:type="spellEnd"/>
+      <w:r>
+        <w:t xml:space="preserve">. I will change the function so that instead of inserting the poi into the local database straight away it will first POST to the server using </w:t>
       </w:r>
       <w:r>
         <w:t xml:space="preserve">the </w:t>
@@ -4892,17 +6071,27 @@
           <w:rPr>
             <w:rStyle w:val="Hyperlink"/>
           </w:rPr>
-          <w:t>http://10.0.2.2:3000/poi/creat</w:t>
-        </w:r>
-        <w:r>
-          <w:rPr>
-            <w:rStyle w:val="Hyperlink"/>
-          </w:rPr>
-          <w:t>e</w:t>
+          <w:t>http://10.0.2.2:3000/poi/create</w:t>
         </w:r>
       </w:hyperlink>
       <w:r>
-        <w:t xml:space="preserve"> url, which will return the ID, then the function will use this ID as the webId then save it locally using the poi DAO insert function.. This makes sure that the poi is only added to the local database if it is successfully added to the web data base. This prevents any misalignment between the two databases.</w:t>
+        <w:t xml:space="preserve"> </w:t>
+      </w:r>
+      <w:proofErr w:type="spellStart"/>
+      <w:r>
+        <w:t>url</w:t>
+      </w:r>
+      <w:proofErr w:type="spellEnd"/>
+      <w:r>
+        <w:t xml:space="preserve">, which will return the ID, then the function will use this ID as the </w:t>
+      </w:r>
+      <w:proofErr w:type="spellStart"/>
+      <w:r>
+        <w:t>webId</w:t>
+      </w:r>
+      <w:proofErr w:type="spellEnd"/>
+      <w:r>
+        <w:t xml:space="preserve"> then save it locally using the poi DAO insert function.. This makes sure that the poi is only added to the local database if it is successfully added to the web data base. This prevents any misalignment between the two databases.</w:t>
       </w:r>
     </w:p>
     <w:p/>
@@ -4914,7 +6103,31 @@
     <w:p/>
     <w:p>
       <w:r>
-        <w:t xml:space="preserve">Since the original poi has webId set to null, I will use .copy() to create a new Poi object with the same fields but with the null webId replaced by the ID returned by the server. The original poi </w:t>
+        <w:t xml:space="preserve">Since the original poi has </w:t>
+      </w:r>
+      <w:proofErr w:type="spellStart"/>
+      <w:r>
+        <w:t>webId</w:t>
+      </w:r>
+      <w:proofErr w:type="spellEnd"/>
+      <w:r>
+        <w:t xml:space="preserve"> set to null, I will </w:t>
+      </w:r>
+      <w:proofErr w:type="gramStart"/>
+      <w:r>
+        <w:t>use .copy</w:t>
+      </w:r>
+      <w:proofErr w:type="gramEnd"/>
+      <w:r>
+        <w:t xml:space="preserve">() to create a new Poi object with the same fields but with the null </w:t>
+      </w:r>
+      <w:proofErr w:type="spellStart"/>
+      <w:r>
+        <w:t>webId</w:t>
+      </w:r>
+      <w:proofErr w:type="spellEnd"/>
+      <w:r>
+        <w:t xml:space="preserve"> replaced by the ID returned by the server. The original poi </w:t>
       </w:r>
       <w:r>
         <w:t>will then be removed</w:t>
@@ -4926,12 +6139,22 @@
         <w:t xml:space="preserve">makes sure </w:t>
       </w:r>
       <w:r>
-        <w:t>that the record saved to the local database has a webId that matches the server</w:t>
+        <w:t xml:space="preserve">that the record saved to the local database has a </w:t>
+      </w:r>
+      <w:proofErr w:type="spellStart"/>
+      <w:r>
+        <w:t>webId</w:t>
+      </w:r>
+      <w:proofErr w:type="spellEnd"/>
+      <w:r>
+        <w:t xml:space="preserve"> that matches the server</w:t>
       </w:r>
       <w:r>
         <w:t>.</w:t>
       </w:r>
     </w:p>
+    <w:p/>
+    <w:p/>
     <w:p/>
     <w:p>
       <w:r>
@@ -4940,7 +6163,7 @@
         </w:rPr>
         <w:lastRenderedPageBreak/>
         <w:drawing>
-          <wp:anchor distT="0" distB="0" distL="114300" distR="114300" simplePos="0" relativeHeight="251701248" behindDoc="0" locked="0" layoutInCell="1" allowOverlap="1" wp14:anchorId="3138F24F" wp14:editId="2D463B72">
+          <wp:anchor distT="0" distB="0" distL="114300" distR="114300" simplePos="0" relativeHeight="251701248" behindDoc="0" locked="0" layoutInCell="1" allowOverlap="1" wp14:anchorId="3138F24F" wp14:editId="457CD58D">
             <wp:simplePos x="0" y="0"/>
             <wp:positionH relativeFrom="margin">
               <wp:align>right</wp:align>
@@ -4989,6 +6212,445 @@
           </wp:anchor>
         </w:drawing>
       </w:r>
+    </w:p>
+    <w:p/>
+    <w:p/>
+    <w:p/>
+    <w:p>
+      <w:pPr>
+        <w:rPr>
+          <w:rFonts w:ascii="Trebuchet MS" w:hAnsi="Trebuchet MS"/>
+          <w:i/>
+          <w:iCs/>
+          <w:color w:val="000000"/>
+          <w:sz w:val="24"/>
+          <w:szCs w:val="24"/>
+        </w:rPr>
+      </w:pPr>
+      <w:r>
+        <w:rPr>
+          <w:rFonts w:ascii="Trebuchet MS" w:hAnsi="Trebuchet MS"/>
+          <w:color w:val="000000"/>
+          <w:sz w:val="24"/>
+          <w:szCs w:val="24"/>
+        </w:rPr>
+        <w:t xml:space="preserve">8. </w:t>
+      </w:r>
+      <w:r>
+        <w:rPr>
+          <w:rFonts w:ascii="Trebuchet MS" w:hAnsi="Trebuchet MS"/>
+          <w:i/>
+          <w:iCs/>
+          <w:color w:val="000000"/>
+          <w:sz w:val="24"/>
+          <w:szCs w:val="24"/>
+        </w:rPr>
+        <w:t>“</w:t>
+      </w:r>
+      <w:r>
+        <w:rPr>
+          <w:rFonts w:ascii="Trebuchet MS" w:hAnsi="Trebuchet MS"/>
+          <w:i/>
+          <w:iCs/>
+          <w:color w:val="000000"/>
+          <w:sz w:val="24"/>
+          <w:szCs w:val="24"/>
+        </w:rPr>
+        <w:t>Add a full navigation UI including a bottom navigation bar, and a top app bar with a “hamburger menu” icon which opens a navigation drawer when clicked. The bottom navigation bar and navigation drawer should link to all screens added so far.  The navigation drawer should also contain a menu item allowing the user to download POIs from the web. Additionally, create a floating action button to link to the “add a new point of interest” screen.</w:t>
+      </w:r>
+      <w:r>
+        <w:rPr>
+          <w:rFonts w:ascii="Trebuchet MS" w:hAnsi="Trebuchet MS"/>
+          <w:i/>
+          <w:iCs/>
+          <w:color w:val="000000"/>
+          <w:sz w:val="24"/>
+          <w:szCs w:val="24"/>
+        </w:rPr>
+        <w:t>”</w:t>
+      </w:r>
+    </w:p>
+    <w:p>
+      <w:pPr>
+        <w:rPr>
+          <w:rFonts w:ascii="Trebuchet MS" w:hAnsi="Trebuchet MS"/>
+          <w:color w:val="000000"/>
+          <w:sz w:val="24"/>
+          <w:szCs w:val="24"/>
+        </w:rPr>
+      </w:pPr>
+    </w:p>
+    <w:p>
+      <w:pPr>
+        <w:ind w:left="720"/>
+      </w:pPr>
+      <w:r>
+        <w:t xml:space="preserve">I will begin by adding </w:t>
+      </w:r>
+      <w:r>
+        <w:t>a Scaffold</w:t>
+      </w:r>
+      <w:r>
+        <w:t xml:space="preserve"> which will have</w:t>
+      </w:r>
+      <w:r>
+        <w:t xml:space="preserve"> three navigation parameters. </w:t>
+      </w:r>
+      <w:r>
+        <w:t>These will be t</w:t>
+      </w:r>
+      <w:r>
+        <w:t xml:space="preserve">he </w:t>
+      </w:r>
+      <w:proofErr w:type="spellStart"/>
+      <w:r>
+        <w:t>topBar</w:t>
+      </w:r>
+      <w:proofErr w:type="spellEnd"/>
+      <w:r>
+        <w:t xml:space="preserve"> parameter </w:t>
+      </w:r>
+      <w:r>
+        <w:t xml:space="preserve">which </w:t>
+      </w:r>
+      <w:r>
+        <w:t xml:space="preserve">will contain a </w:t>
+      </w:r>
+      <w:proofErr w:type="spellStart"/>
+      <w:r>
+        <w:t>TopAppBar</w:t>
+      </w:r>
+      <w:proofErr w:type="spellEnd"/>
+      <w:r>
+        <w:t xml:space="preserve"> composable </w:t>
+      </w:r>
+      <w:r>
+        <w:t>showing</w:t>
+      </w:r>
+      <w:r>
+        <w:t xml:space="preserve"> the app name and a hamburger menu </w:t>
+      </w:r>
+      <w:proofErr w:type="spellStart"/>
+      <w:r>
+        <w:t>IconButton</w:t>
+      </w:r>
+      <w:proofErr w:type="spellEnd"/>
+      <w:r>
+        <w:t xml:space="preserve"> </w:t>
+      </w:r>
+      <w:r>
+        <w:t xml:space="preserve">which </w:t>
+      </w:r>
+      <w:r>
+        <w:t xml:space="preserve">when clicked will use </w:t>
+      </w:r>
+      <w:r>
+        <w:t xml:space="preserve">a </w:t>
+      </w:r>
+      <w:proofErr w:type="spellStart"/>
+      <w:r>
+        <w:t>coroutineScope.launch</w:t>
+      </w:r>
+      <w:proofErr w:type="spellEnd"/>
+      <w:r>
+        <w:t xml:space="preserve"> to call </w:t>
+      </w:r>
+      <w:proofErr w:type="spellStart"/>
+      <w:r>
+        <w:t>drawerState.open</w:t>
+      </w:r>
+      <w:proofErr w:type="spellEnd"/>
+      <w:r>
+        <w:t>(), which will</w:t>
+      </w:r>
+      <w:r>
+        <w:t xml:space="preserve"> then</w:t>
+      </w:r>
+      <w:r>
+        <w:t xml:space="preserve"> open the </w:t>
+      </w:r>
+      <w:proofErr w:type="spellStart"/>
+      <w:r>
+        <w:t>ModalNavigationDrawer</w:t>
+      </w:r>
+      <w:proofErr w:type="spellEnd"/>
+      <w:r>
+        <w:t xml:space="preserve">. </w:t>
+      </w:r>
+      <w:r>
+        <w:t>I will wrap t</w:t>
+      </w:r>
+      <w:r>
+        <w:t xml:space="preserve">he drawer around the entire </w:t>
+      </w:r>
+      <w:proofErr w:type="spellStart"/>
+      <w:r>
+        <w:t>NavHost</w:t>
+      </w:r>
+      <w:proofErr w:type="spellEnd"/>
+      <w:r>
+        <w:t xml:space="preserve"> block rather than just the map screen's Scaffold, because it needs to be able to slide over all content.</w:t>
+      </w:r>
+    </w:p>
+    <w:p>
+      <w:pPr>
+        <w:ind w:left="720"/>
+      </w:pPr>
+      <w:r>
+        <w:t>I will make it so</w:t>
+      </w:r>
+      <w:r>
+        <w:t xml:space="preserve"> </w:t>
+      </w:r>
+      <w:r>
+        <w:t>e</w:t>
+      </w:r>
+      <w:r>
+        <w:t>ach N</w:t>
+      </w:r>
+      <w:proofErr w:type="spellStart"/>
+      <w:r>
+        <w:t>avigationDrawerItem</w:t>
+      </w:r>
+      <w:proofErr w:type="spellEnd"/>
+      <w:r>
+        <w:t xml:space="preserve"> inside the </w:t>
+      </w:r>
+      <w:proofErr w:type="spellStart"/>
+      <w:r>
+        <w:t>ModalDrawerSheet</w:t>
+      </w:r>
+      <w:proofErr w:type="spellEnd"/>
+      <w:r>
+        <w:t xml:space="preserve"> will call </w:t>
+      </w:r>
+      <w:proofErr w:type="spellStart"/>
+      <w:r>
+        <w:t>drawerState.close</w:t>
+      </w:r>
+      <w:proofErr w:type="spellEnd"/>
+      <w:r>
+        <w:t xml:space="preserve">() in a coroutine before navigating, </w:t>
+      </w:r>
+      <w:r>
+        <w:t xml:space="preserve">this is </w:t>
+      </w:r>
+      <w:r>
+        <w:t>so the drawer slides shut before the screen changes.</w:t>
+      </w:r>
+    </w:p>
+    <w:p>
+      <w:pPr>
+        <w:ind w:left="720"/>
+      </w:pPr>
+      <w:r>
+        <w:lastRenderedPageBreak/>
+        <w:t>The next parameter will be the</w:t>
+      </w:r>
+      <w:r>
+        <w:t xml:space="preserve"> </w:t>
+      </w:r>
+      <w:proofErr w:type="spellStart"/>
+      <w:r>
+        <w:t>bottomBar</w:t>
+      </w:r>
+      <w:proofErr w:type="spellEnd"/>
+      <w:r>
+        <w:t xml:space="preserve"> parameter </w:t>
+      </w:r>
+      <w:r>
+        <w:t xml:space="preserve">which </w:t>
+      </w:r>
+      <w:r>
+        <w:t xml:space="preserve">will contain a </w:t>
+      </w:r>
+      <w:proofErr w:type="spellStart"/>
+      <w:r>
+        <w:t>NavigationBar</w:t>
+      </w:r>
+      <w:proofErr w:type="spellEnd"/>
+      <w:r>
+        <w:t xml:space="preserve"> with two </w:t>
+      </w:r>
+      <w:proofErr w:type="spellStart"/>
+      <w:r>
+        <w:t>NavigationBarItem</w:t>
+      </w:r>
+      <w:proofErr w:type="spellEnd"/>
+      <w:r>
+        <w:t xml:space="preserve"> </w:t>
+      </w:r>
+      <w:proofErr w:type="spellStart"/>
+      <w:r>
+        <w:t>composables</w:t>
+      </w:r>
+      <w:proofErr w:type="spellEnd"/>
+      <w:r>
+        <w:t>,</w:t>
+      </w:r>
+      <w:r>
+        <w:t xml:space="preserve"> one for the map screen and one for the add POI screen each with an icon and a label. </w:t>
+      </w:r>
+    </w:p>
+    <w:p>
+      <w:pPr>
+        <w:ind w:left="720"/>
+      </w:pPr>
+    </w:p>
+    <w:p>
+      <w:pPr>
+        <w:ind w:left="720"/>
+      </w:pPr>
+      <w:r>
+        <w:t>I will then add a</w:t>
+      </w:r>
+      <w:r>
+        <w:t xml:space="preserve"> </w:t>
+      </w:r>
+      <w:proofErr w:type="spellStart"/>
+      <w:r>
+        <w:t>floatingActionButton</w:t>
+      </w:r>
+      <w:proofErr w:type="spellEnd"/>
+      <w:r>
+        <w:t xml:space="preserve"> </w:t>
+      </w:r>
+      <w:r>
+        <w:t xml:space="preserve">as the last </w:t>
+      </w:r>
+      <w:r>
+        <w:t xml:space="preserve">parameter </w:t>
+      </w:r>
+      <w:r>
+        <w:t xml:space="preserve">which </w:t>
+      </w:r>
+      <w:r>
+        <w:t xml:space="preserve">will contain a </w:t>
+      </w:r>
+      <w:proofErr w:type="spellStart"/>
+      <w:r>
+        <w:t>FloatingActionButton</w:t>
+      </w:r>
+      <w:proofErr w:type="spellEnd"/>
+      <w:r>
+        <w:t xml:space="preserve"> with </w:t>
+      </w:r>
+      <w:r>
+        <w:t>an</w:t>
+      </w:r>
+      <w:r>
+        <w:t xml:space="preserve"> </w:t>
+      </w:r>
+      <w:proofErr w:type="spellStart"/>
+      <w:proofErr w:type="gramStart"/>
+      <w:r>
+        <w:t>Icons.Filled.Add</w:t>
+      </w:r>
+      <w:proofErr w:type="spellEnd"/>
+      <w:proofErr w:type="gramEnd"/>
+      <w:r>
+        <w:t xml:space="preserve"> icon that </w:t>
+      </w:r>
+      <w:r>
+        <w:t xml:space="preserve">will </w:t>
+      </w:r>
+      <w:r>
+        <w:t>navigate</w:t>
+      </w:r>
+      <w:r>
+        <w:t xml:space="preserve"> the user</w:t>
+      </w:r>
+      <w:r>
+        <w:t xml:space="preserve"> to the </w:t>
+      </w:r>
+      <w:proofErr w:type="spellStart"/>
+      <w:r>
+        <w:t>addPoi</w:t>
+      </w:r>
+      <w:proofErr w:type="spellEnd"/>
+      <w:r>
+        <w:t xml:space="preserve"> route</w:t>
+      </w:r>
+      <w:r>
+        <w:t>.</w:t>
+      </w:r>
+    </w:p>
+    <w:p>
+      <w:pPr>
+        <w:ind w:left="720"/>
+      </w:pPr>
+    </w:p>
+    <w:p>
+      <w:pPr>
+        <w:ind w:left="720"/>
+      </w:pPr>
+      <w:r>
+        <w:t xml:space="preserve">I will need to make sure to add </w:t>
+      </w:r>
+      <w:r>
+        <w:t>the</w:t>
+      </w:r>
+      <w:r>
+        <w:t xml:space="preserve"> </w:t>
+      </w:r>
+      <w:proofErr w:type="spellStart"/>
+      <w:proofErr w:type="gramStart"/>
+      <w:r>
+        <w:t>OptIn</w:t>
+      </w:r>
+      <w:proofErr w:type="spellEnd"/>
+      <w:r>
+        <w:t>(</w:t>
+      </w:r>
+      <w:proofErr w:type="gramEnd"/>
+      <w:r>
+        <w:t>ExperimentalMaterial3</w:t>
+      </w:r>
+      <w:proofErr w:type="gramStart"/>
+      <w:r>
+        <w:t>Api::</w:t>
+      </w:r>
+      <w:proofErr w:type="gramEnd"/>
+      <w:r>
+        <w:t>class)</w:t>
+      </w:r>
+      <w:r>
+        <w:t xml:space="preserve"> before the </w:t>
+      </w:r>
+      <w:proofErr w:type="spellStart"/>
+      <w:proofErr w:type="gramStart"/>
+      <w:r>
+        <w:t>onCreate</w:t>
+      </w:r>
+      <w:proofErr w:type="spellEnd"/>
+      <w:r>
+        <w:t>(</w:t>
+      </w:r>
+      <w:proofErr w:type="gramEnd"/>
+      <w:r>
+        <w:t xml:space="preserve">) as </w:t>
+      </w:r>
+      <w:r>
+        <w:t xml:space="preserve">the </w:t>
+      </w:r>
+      <w:proofErr w:type="spellStart"/>
+      <w:r>
+        <w:t>TopAppBar</w:t>
+      </w:r>
+      <w:proofErr w:type="spellEnd"/>
+      <w:r>
+        <w:t xml:space="preserve"> is still experimental</w:t>
+      </w:r>
+      <w:r>
+        <w:t>.</w:t>
+      </w:r>
+    </w:p>
+    <w:p>
+      <w:pPr>
+        <w:rPr>
+          <w:lang w:val="en-GB"/>
+        </w:rPr>
+      </w:pPr>
     </w:p>
     <w:sectPr>
       <w:pgSz w:w="12240" w:h="15840"/>

</xml_diff>

<commit_message>
Updated report for task 9
</commit_message>
<xml_diff>
--- a/MAD_Report.docx
+++ b/MAD_Report.docx
@@ -6997,10 +6997,270 @@
     <w:p>
       <w:pPr>
         <w:rPr>
-          <w:lang w:val="en-GB"/>
-        </w:rPr>
-      </w:pPr>
-    </w:p>
+          <w:rFonts w:ascii="Trebuchet MS" w:hAnsi="Trebuchet MS"/>
+          <w:color w:val="000000"/>
+          <w:sz w:val="24"/>
+          <w:szCs w:val="24"/>
+        </w:rPr>
+      </w:pPr>
+    </w:p>
+    <w:p>
+      <w:pPr>
+        <w:rPr>
+          <w:rFonts w:ascii="Trebuchet MS" w:hAnsi="Trebuchet MS"/>
+          <w:i/>
+          <w:iCs/>
+          <w:color w:val="000000"/>
+          <w:sz w:val="24"/>
+          <w:szCs w:val="24"/>
+        </w:rPr>
+      </w:pPr>
+      <w:r>
+        <w:rPr>
+          <w:rFonts w:ascii="Trebuchet MS" w:hAnsi="Trebuchet MS"/>
+          <w:color w:val="000000"/>
+          <w:sz w:val="24"/>
+          <w:szCs w:val="24"/>
+        </w:rPr>
+        <w:t>9.</w:t>
+      </w:r>
+      <w:r>
+        <w:rPr>
+          <w:rFonts w:ascii="Trebuchet MS" w:hAnsi="Trebuchet MS"/>
+          <w:i/>
+          <w:iCs/>
+          <w:color w:val="000000"/>
+          <w:sz w:val="24"/>
+          <w:szCs w:val="24"/>
+        </w:rPr>
+        <w:t xml:space="preserve"> </w:t>
+      </w:r>
+      <w:r>
+        <w:rPr>
+          <w:rFonts w:ascii="Trebuchet MS" w:hAnsi="Trebuchet MS"/>
+          <w:i/>
+          <w:iCs/>
+          <w:color w:val="000000"/>
+          <w:sz w:val="24"/>
+          <w:szCs w:val="24"/>
+        </w:rPr>
+        <w:t>“</w:t>
+      </w:r>
+      <w:r>
+        <w:rPr>
+          <w:rFonts w:ascii="Trebuchet MS" w:hAnsi="Trebuchet MS"/>
+          <w:i/>
+          <w:iCs/>
+          <w:color w:val="000000"/>
+          <w:sz w:val="24"/>
+          <w:szCs w:val="24"/>
+        </w:rPr>
+        <w:t>Enhance your UI to allow the user to review a point of interest, within the dialog which appears when the user clicks a marker or circle on the map. There should be a review text field and review button on the dialog.</w:t>
+      </w:r>
+      <w:r>
+        <w:rPr>
+          <w:rFonts w:ascii="Trebuchet MS" w:hAnsi="Trebuchet MS"/>
+          <w:i/>
+          <w:iCs/>
+          <w:color w:val="000000"/>
+          <w:sz w:val="24"/>
+          <w:szCs w:val="24"/>
+        </w:rPr>
+        <w:t>”</w:t>
+      </w:r>
+    </w:p>
+    <w:p>
+      <w:pPr>
+        <w:rPr>
+          <w:rFonts w:ascii="Trebuchet MS" w:hAnsi="Trebuchet MS"/>
+          <w:color w:val="000000"/>
+          <w:sz w:val="24"/>
+          <w:szCs w:val="24"/>
+        </w:rPr>
+      </w:pPr>
+    </w:p>
+    <w:p>
+      <w:pPr>
+        <w:ind w:left="720"/>
+        <w:rPr>
+          <w:rFonts w:ascii="Trebuchet MS" w:hAnsi="Trebuchet MS"/>
+          <w:color w:val="000000"/>
+          <w:sz w:val="24"/>
+          <w:szCs w:val="24"/>
+        </w:rPr>
+      </w:pPr>
+      <w:r>
+        <w:rPr>
+          <w:rFonts w:ascii="Trebuchet MS" w:hAnsi="Trebuchet MS"/>
+          <w:color w:val="000000"/>
+          <w:sz w:val="24"/>
+          <w:szCs w:val="24"/>
+        </w:rPr>
+        <w:t xml:space="preserve">I will begin by adding a new function to my </w:t>
+      </w:r>
+      <w:proofErr w:type="spellStart"/>
+      <w:r>
+        <w:rPr>
+          <w:rFonts w:ascii="Trebuchet MS" w:hAnsi="Trebuchet MS"/>
+          <w:color w:val="000000"/>
+          <w:sz w:val="24"/>
+          <w:szCs w:val="24"/>
+        </w:rPr>
+        <w:t>ViewModel</w:t>
+      </w:r>
+      <w:proofErr w:type="spellEnd"/>
+      <w:r>
+        <w:rPr>
+          <w:rFonts w:ascii="Trebuchet MS" w:hAnsi="Trebuchet MS"/>
+          <w:color w:val="000000"/>
+          <w:sz w:val="24"/>
+          <w:szCs w:val="24"/>
+        </w:rPr>
+        <w:t xml:space="preserve"> which will use the /review/create </w:t>
+      </w:r>
+      <w:r>
+        <w:rPr>
+          <w:rFonts w:ascii="Trebuchet MS" w:hAnsi="Trebuchet MS"/>
+          <w:color w:val="000000"/>
+          <w:sz w:val="24"/>
+          <w:szCs w:val="24"/>
+        </w:rPr>
+        <w:t>POST route sending the POI web ID and the review. This should display an error in the console if one has occurred and should also display a message indicating that the review had been added successfully.</w:t>
+      </w:r>
+    </w:p>
+    <w:p>
+      <w:pPr>
+        <w:ind w:left="720"/>
+        <w:rPr>
+          <w:rFonts w:ascii="Trebuchet MS" w:hAnsi="Trebuchet MS"/>
+          <w:color w:val="000000"/>
+          <w:sz w:val="24"/>
+          <w:szCs w:val="24"/>
+        </w:rPr>
+      </w:pPr>
+    </w:p>
+    <w:p>
+      <w:pPr>
+        <w:ind w:left="720"/>
+        <w:rPr>
+          <w:sz w:val="24"/>
+          <w:szCs w:val="24"/>
+        </w:rPr>
+      </w:pPr>
+      <w:r>
+        <w:rPr>
+          <w:rFonts w:ascii="Trebuchet MS" w:hAnsi="Trebuchet MS"/>
+          <w:color w:val="000000"/>
+          <w:sz w:val="24"/>
+          <w:szCs w:val="24"/>
+        </w:rPr>
+        <w:t xml:space="preserve">I will then update the </w:t>
+      </w:r>
+      <w:proofErr w:type="spellStart"/>
+      <w:r>
+        <w:rPr>
+          <w:rFonts w:ascii="Trebuchet MS" w:hAnsi="Trebuchet MS"/>
+          <w:color w:val="000000"/>
+          <w:sz w:val="24"/>
+          <w:szCs w:val="24"/>
+        </w:rPr>
+        <w:t>AlertDialog</w:t>
+      </w:r>
+      <w:proofErr w:type="spellEnd"/>
+      <w:r>
+        <w:rPr>
+          <w:rFonts w:ascii="Trebuchet MS" w:hAnsi="Trebuchet MS"/>
+          <w:color w:val="000000"/>
+          <w:sz w:val="24"/>
+          <w:szCs w:val="24"/>
+        </w:rPr>
+        <w:t xml:space="preserve"> for each of the markers to include a text field </w:t>
+      </w:r>
+      <w:r>
+        <w:rPr>
+          <w:rFonts w:ascii="Trebuchet MS" w:hAnsi="Trebuchet MS"/>
+          <w:color w:val="000000"/>
+          <w:sz w:val="24"/>
+          <w:szCs w:val="24"/>
+        </w:rPr>
+        <w:t>accompanied</w:t>
+      </w:r>
+      <w:r>
+        <w:rPr>
+          <w:rFonts w:ascii="Trebuchet MS" w:hAnsi="Trebuchet MS"/>
+          <w:color w:val="000000"/>
+          <w:sz w:val="24"/>
+          <w:szCs w:val="24"/>
+        </w:rPr>
+        <w:t xml:space="preserve"> </w:t>
+      </w:r>
+      <w:r>
+        <w:rPr>
+          <w:rFonts w:ascii="Trebuchet MS" w:hAnsi="Trebuchet MS"/>
+          <w:color w:val="000000"/>
+          <w:sz w:val="24"/>
+          <w:szCs w:val="24"/>
+        </w:rPr>
+        <w:t>by</w:t>
+      </w:r>
+      <w:r>
+        <w:rPr>
+          <w:rFonts w:ascii="Trebuchet MS" w:hAnsi="Trebuchet MS"/>
+          <w:color w:val="000000"/>
+          <w:sz w:val="24"/>
+          <w:szCs w:val="24"/>
+        </w:rPr>
+        <w:t xml:space="preserve"> a button. The button, when clicked, will check if the </w:t>
+      </w:r>
+      <w:r>
+        <w:rPr>
+          <w:rFonts w:ascii="Trebuchet MS" w:hAnsi="Trebuchet MS"/>
+          <w:color w:val="000000"/>
+          <w:sz w:val="24"/>
+          <w:szCs w:val="24"/>
+        </w:rPr>
+        <w:t>text field</w:t>
+      </w:r>
+      <w:r>
+        <w:rPr>
+          <w:rFonts w:ascii="Trebuchet MS" w:hAnsi="Trebuchet MS"/>
+          <w:color w:val="000000"/>
+          <w:sz w:val="24"/>
+          <w:szCs w:val="24"/>
+        </w:rPr>
+        <w:t xml:space="preserve"> is blank or if the poi doesn’t have a web ID. If it passes all the checks then the button calls the</w:t>
+      </w:r>
+      <w:r>
+        <w:rPr>
+          <w:rFonts w:ascii="Trebuchet MS" w:hAnsi="Trebuchet MS"/>
+          <w:color w:val="000000"/>
+          <w:sz w:val="24"/>
+          <w:szCs w:val="24"/>
+        </w:rPr>
+        <w:t xml:space="preserve"> function that sends the review including the </w:t>
+      </w:r>
+      <w:proofErr w:type="spellStart"/>
+      <w:r>
+        <w:rPr>
+          <w:rFonts w:ascii="Trebuchet MS" w:hAnsi="Trebuchet MS"/>
+          <w:color w:val="000000"/>
+          <w:sz w:val="24"/>
+          <w:szCs w:val="24"/>
+        </w:rPr>
+        <w:t>webId</w:t>
+      </w:r>
+      <w:proofErr w:type="spellEnd"/>
+      <w:r>
+        <w:rPr>
+          <w:rFonts w:ascii="Trebuchet MS" w:hAnsi="Trebuchet MS"/>
+          <w:color w:val="000000"/>
+          <w:sz w:val="24"/>
+          <w:szCs w:val="24"/>
+        </w:rPr>
+        <w:t xml:space="preserve"> and review text as the parameters. </w:t>
+      </w:r>
+    </w:p>
+    <w:p/>
     <w:sectPr>
       <w:pgSz w:w="12240" w:h="15840"/>
       <w:pgMar w:top="1440" w:right="1440" w:bottom="1440" w:left="1440" w:header="720" w:footer="720" w:gutter="0"/>

</xml_diff>

<commit_message>
added code snippets to report for task 9
</commit_message>
<xml_diff>
--- a/MAD_Report.docx
+++ b/MAD_Report.docx
@@ -7091,6 +7091,60 @@
       </w:pPr>
       <w:r>
         <w:rPr>
+          <w:noProof/>
+        </w:rPr>
+        <w:drawing>
+          <wp:anchor distT="0" distB="0" distL="114300" distR="114300" simplePos="0" relativeHeight="251709440" behindDoc="0" locked="0" layoutInCell="1" allowOverlap="1" wp14:anchorId="1BEB1348" wp14:editId="6502FAD9">
+            <wp:simplePos x="0" y="0"/>
+            <wp:positionH relativeFrom="margin">
+              <wp:align>right</wp:align>
+            </wp:positionH>
+            <wp:positionV relativeFrom="paragraph">
+              <wp:posOffset>931545</wp:posOffset>
+            </wp:positionV>
+            <wp:extent cx="5943600" cy="2127885"/>
+            <wp:effectExtent l="0" t="0" r="0" b="5715"/>
+            <wp:wrapTopAndBottom/>
+            <wp:docPr id="495188885" name="Picture 1"/>
+            <wp:cNvGraphicFramePr>
+              <a:graphicFrameLocks xmlns:a="http://schemas.openxmlformats.org/drawingml/2006/main" noChangeAspect="1"/>
+            </wp:cNvGraphicFramePr>
+            <a:graphic xmlns:a="http://schemas.openxmlformats.org/drawingml/2006/main">
+              <a:graphicData uri="http://schemas.openxmlformats.org/drawingml/2006/picture">
+                <pic:pic xmlns:pic="http://schemas.openxmlformats.org/drawingml/2006/picture">
+                  <pic:nvPicPr>
+                    <pic:cNvPr id="495188885" name=""/>
+                    <pic:cNvPicPr/>
+                  </pic:nvPicPr>
+                  <pic:blipFill>
+                    <a:blip r:embed="rId55">
+                      <a:extLst>
+                        <a:ext uri="{28A0092B-C50C-407E-A947-70E740481C1C}">
+                          <a14:useLocalDpi xmlns:a14="http://schemas.microsoft.com/office/drawing/2010/main" val="0"/>
+                        </a:ext>
+                      </a:extLst>
+                    </a:blip>
+                    <a:stretch>
+                      <a:fillRect/>
+                    </a:stretch>
+                  </pic:blipFill>
+                  <pic:spPr>
+                    <a:xfrm>
+                      <a:off x="0" y="0"/>
+                      <a:ext cx="5943600" cy="2127885"/>
+                    </a:xfrm>
+                    <a:prstGeom prst="rect">
+                      <a:avLst/>
+                    </a:prstGeom>
+                  </pic:spPr>
+                </pic:pic>
+              </a:graphicData>
+            </a:graphic>
+          </wp:anchor>
+        </w:drawing>
+      </w:r>
+      <w:r>
+        <w:rPr>
           <w:rFonts w:ascii="Trebuchet MS" w:hAnsi="Trebuchet MS"/>
           <w:color w:val="000000"/>
           <w:sz w:val="24"/>
@@ -7127,6 +7181,12 @@
         </w:rPr>
         <w:t>POST route sending the POI web ID and the review. This should display an error in the console if one has occurred and should also display a message indicating that the review had been added successfully.</w:t>
       </w:r>
+      <w:r>
+        <w:rPr>
+          <w:noProof/>
+        </w:rPr>
+        <w:t xml:space="preserve"> </w:t>
+      </w:r>
     </w:p>
     <w:p>
       <w:pPr>
@@ -7143,17 +7203,61 @@
       <w:pPr>
         <w:ind w:left="720"/>
         <w:rPr>
-          <w:sz w:val="24"/>
-          <w:szCs w:val="24"/>
-        </w:rPr>
-      </w:pPr>
-      <w:r>
-        <w:rPr>
           <w:rFonts w:ascii="Trebuchet MS" w:hAnsi="Trebuchet MS"/>
           <w:color w:val="000000"/>
           <w:sz w:val="24"/>
           <w:szCs w:val="24"/>
         </w:rPr>
+      </w:pPr>
+    </w:p>
+    <w:p>
+      <w:pPr>
+        <w:ind w:left="720"/>
+        <w:rPr>
+          <w:rFonts w:ascii="Trebuchet MS" w:hAnsi="Trebuchet MS"/>
+          <w:color w:val="000000"/>
+          <w:sz w:val="24"/>
+          <w:szCs w:val="24"/>
+        </w:rPr>
+      </w:pPr>
+    </w:p>
+    <w:p>
+      <w:pPr>
+        <w:ind w:left="720"/>
+        <w:rPr>
+          <w:rFonts w:ascii="Trebuchet MS" w:hAnsi="Trebuchet MS"/>
+          <w:color w:val="000000"/>
+          <w:sz w:val="24"/>
+          <w:szCs w:val="24"/>
+        </w:rPr>
+      </w:pPr>
+    </w:p>
+    <w:p>
+      <w:pPr>
+        <w:ind w:left="720"/>
+        <w:rPr>
+          <w:rFonts w:ascii="Trebuchet MS" w:hAnsi="Trebuchet MS"/>
+          <w:color w:val="000000"/>
+          <w:sz w:val="24"/>
+          <w:szCs w:val="24"/>
+        </w:rPr>
+      </w:pPr>
+    </w:p>
+    <w:p>
+      <w:pPr>
+        <w:ind w:left="720"/>
+        <w:rPr>
+          <w:sz w:val="24"/>
+          <w:szCs w:val="24"/>
+        </w:rPr>
+      </w:pPr>
+      <w:r>
+        <w:rPr>
+          <w:rFonts w:ascii="Trebuchet MS" w:hAnsi="Trebuchet MS"/>
+          <w:color w:val="000000"/>
+          <w:sz w:val="24"/>
+          <w:szCs w:val="24"/>
+        </w:rPr>
         <w:t xml:space="preserve">I will then update the </w:t>
       </w:r>
       <w:proofErr w:type="spellStart"/>
@@ -7258,6 +7362,72 @@
           <w:szCs w:val="24"/>
         </w:rPr>
         <w:t xml:space="preserve"> and review text as the parameters. </w:t>
+      </w:r>
+    </w:p>
+    <w:p>
+      <w:r>
+        <w:rPr>
+          <w:noProof/>
+        </w:rPr>
+        <w:lastRenderedPageBreak/>
+        <w:drawing>
+          <wp:anchor distT="0" distB="0" distL="114300" distR="114300" simplePos="0" relativeHeight="251708416" behindDoc="0" locked="0" layoutInCell="1" allowOverlap="1" wp14:anchorId="13DA80FB" wp14:editId="593813B8">
+            <wp:simplePos x="0" y="0"/>
+            <wp:positionH relativeFrom="margin">
+              <wp:posOffset>1000125</wp:posOffset>
+            </wp:positionH>
+            <wp:positionV relativeFrom="paragraph">
+              <wp:posOffset>0</wp:posOffset>
+            </wp:positionV>
+            <wp:extent cx="3618230" cy="4924425"/>
+            <wp:effectExtent l="0" t="0" r="1270" b="9525"/>
+            <wp:wrapTopAndBottom/>
+            <wp:docPr id="842809126" name="Picture 1"/>
+            <wp:cNvGraphicFramePr>
+              <a:graphicFrameLocks xmlns:a="http://schemas.openxmlformats.org/drawingml/2006/main" noChangeAspect="1"/>
+            </wp:cNvGraphicFramePr>
+            <a:graphic xmlns:a="http://schemas.openxmlformats.org/drawingml/2006/main">
+              <a:graphicData uri="http://schemas.openxmlformats.org/drawingml/2006/picture">
+                <pic:pic xmlns:pic="http://schemas.openxmlformats.org/drawingml/2006/picture">
+                  <pic:nvPicPr>
+                    <pic:cNvPr id="842809126" name=""/>
+                    <pic:cNvPicPr/>
+                  </pic:nvPicPr>
+                  <pic:blipFill>
+                    <a:blip r:embed="rId56">
+                      <a:extLst>
+                        <a:ext uri="{28A0092B-C50C-407E-A947-70E740481C1C}">
+                          <a14:useLocalDpi xmlns:a14="http://schemas.microsoft.com/office/drawing/2010/main" val="0"/>
+                        </a:ext>
+                      </a:extLst>
+                    </a:blip>
+                    <a:stretch>
+                      <a:fillRect/>
+                    </a:stretch>
+                  </pic:blipFill>
+                  <pic:spPr>
+                    <a:xfrm>
+                      <a:off x="0" y="0"/>
+                      <a:ext cx="3618230" cy="4924425"/>
+                    </a:xfrm>
+                    <a:prstGeom prst="rect">
+                      <a:avLst/>
+                    </a:prstGeom>
+                  </pic:spPr>
+                </pic:pic>
+              </a:graphicData>
+            </a:graphic>
+            <wp14:sizeRelH relativeFrom="margin">
+              <wp14:pctWidth>0</wp14:pctWidth>
+            </wp14:sizeRelH>
+            <wp14:sizeRelV relativeFrom="margin">
+              <wp14:pctHeight>0</wp14:pctHeight>
+            </wp14:sizeRelV>
+          </wp:anchor>
+        </w:drawing>
+      </w:r>
+      <w:r>
+        <w:tab/>
       </w:r>
     </w:p>
     <w:p/>

</xml_diff>

<commit_message>
Updated report to reflect version changes
</commit_message>
<xml_diff>
--- a/MAD_Report.docx
+++ b/MAD_Report.docx
@@ -373,73 +373,7 @@
           <w:sz w:val="24"/>
           <w:szCs w:val="24"/>
         </w:rPr>
-        <w:t xml:space="preserve">I will first start with this task by setting up the dependencies in my </w:t>
-      </w:r>
-      <w:proofErr w:type="spellStart"/>
-      <w:proofErr w:type="gramStart"/>
-      <w:r>
-        <w:rPr>
-          <w:rFonts w:ascii="Trebuchet MS" w:eastAsia="Trebuchet MS" w:hAnsi="Trebuchet MS" w:cs="Trebuchet MS"/>
-          <w:sz w:val="24"/>
-          <w:szCs w:val="24"/>
-        </w:rPr>
-        <w:t>build.gradle</w:t>
-      </w:r>
-      <w:proofErr w:type="spellEnd"/>
-      <w:proofErr w:type="gramEnd"/>
-      <w:r>
-        <w:rPr>
-          <w:rFonts w:ascii="Trebuchet MS" w:eastAsia="Trebuchet MS" w:hAnsi="Trebuchet MS" w:cs="Trebuchet MS"/>
-          <w:sz w:val="24"/>
-          <w:szCs w:val="24"/>
-        </w:rPr>
-        <w:t xml:space="preserve"> and </w:t>
-      </w:r>
-      <w:proofErr w:type="spellStart"/>
-      <w:proofErr w:type="gramStart"/>
-      <w:r>
-        <w:rPr>
-          <w:rFonts w:ascii="Trebuchet MS" w:eastAsia="Trebuchet MS" w:hAnsi="Trebuchet MS" w:cs="Trebuchet MS"/>
-          <w:sz w:val="24"/>
-          <w:szCs w:val="24"/>
-        </w:rPr>
-        <w:t>libs.versions</w:t>
-      </w:r>
-      <w:proofErr w:type="gramEnd"/>
-      <w:r>
-        <w:rPr>
-          <w:rFonts w:ascii="Trebuchet MS" w:eastAsia="Trebuchet MS" w:hAnsi="Trebuchet MS" w:cs="Trebuchet MS"/>
-          <w:sz w:val="24"/>
-          <w:szCs w:val="24"/>
-        </w:rPr>
-        <w:t>.toml</w:t>
-      </w:r>
-      <w:proofErr w:type="spellEnd"/>
-      <w:r>
-        <w:rPr>
-          <w:rFonts w:ascii="Trebuchet MS" w:eastAsia="Trebuchet MS" w:hAnsi="Trebuchet MS" w:cs="Trebuchet MS"/>
-          <w:sz w:val="24"/>
-          <w:szCs w:val="24"/>
-        </w:rPr>
-        <w:t xml:space="preserve"> files. I will add </w:t>
-      </w:r>
-      <w:proofErr w:type="spellStart"/>
-      <w:r>
-        <w:rPr>
-          <w:rFonts w:ascii="Trebuchet MS" w:eastAsia="Trebuchet MS" w:hAnsi="Trebuchet MS" w:cs="Trebuchet MS"/>
-          <w:sz w:val="24"/>
-          <w:szCs w:val="24"/>
-        </w:rPr>
-        <w:t>MapLibre</w:t>
-      </w:r>
-      <w:proofErr w:type="spellEnd"/>
-      <w:r>
-        <w:rPr>
-          <w:rFonts w:ascii="Trebuchet MS" w:eastAsia="Trebuchet MS" w:hAnsi="Trebuchet MS" w:cs="Trebuchet MS"/>
-          <w:sz w:val="24"/>
-          <w:szCs w:val="24"/>
-        </w:rPr>
-        <w:t xml:space="preserve"> with Vulkan support, the Ramani Maps Compose wrapper, and the standard AndroidX libraries needed for Compose.</w:t>
+        <w:t>I will first start with this task by setting up the dependencies in my build.gradle and libs.versions.toml files. I will add MapLibre with Vulkan support, the Ramani Maps Compose wrapper, and the standard AndroidX libraries needed for Compose.</w:t>
       </w:r>
       <w:r>
         <w:rPr>
@@ -572,25 +506,7 @@
           <w:sz w:val="24"/>
           <w:szCs w:val="24"/>
         </w:rPr>
-        <w:t xml:space="preserve">Then in the AndroidManifest.xml, I will set up the ACCESS_FINE_LOCATION and ACCESS_COARSE_LOCATION permissions, as well as INTERNET, since the map tiles will be gathered remotely from </w:t>
-      </w:r>
-      <w:proofErr w:type="spellStart"/>
-      <w:r>
-        <w:rPr>
-          <w:rFonts w:ascii="Trebuchet MS" w:eastAsia="Trebuchet MS" w:hAnsi="Trebuchet MS" w:cs="Trebuchet MS"/>
-          <w:sz w:val="24"/>
-          <w:szCs w:val="24"/>
-        </w:rPr>
-        <w:t>OpenFreeMap</w:t>
-      </w:r>
-      <w:proofErr w:type="spellEnd"/>
-      <w:r>
-        <w:rPr>
-          <w:rFonts w:ascii="Trebuchet MS" w:eastAsia="Trebuchet MS" w:hAnsi="Trebuchet MS" w:cs="Trebuchet MS"/>
-          <w:sz w:val="24"/>
-          <w:szCs w:val="24"/>
-        </w:rPr>
-        <w:t>.</w:t>
+        <w:t>Then in the AndroidManifest.xml, I will set up the ACCESS_FINE_LOCATION and ACCESS_COARSE_LOCATION permissions, as well as INTERNET, since the map tiles will be gathered remotely from OpenFreeMap.</w:t>
       </w:r>
       <w:r>
         <w:rPr>
@@ -736,61 +652,7 @@
           <w:sz w:val="24"/>
           <w:szCs w:val="24"/>
         </w:rPr>
-        <w:t xml:space="preserve">To manage the location state in both the activity and UI, I will need to add a </w:t>
-      </w:r>
-      <w:proofErr w:type="spellStart"/>
-      <w:r>
-        <w:rPr>
-          <w:rFonts w:ascii="Trebuchet MS" w:eastAsia="Trebuchet MS" w:hAnsi="Trebuchet MS" w:cs="Trebuchet MS"/>
-          <w:sz w:val="24"/>
-          <w:szCs w:val="24"/>
-        </w:rPr>
-        <w:t>LatLngViewModel</w:t>
-      </w:r>
-      <w:proofErr w:type="spellEnd"/>
-      <w:r>
-        <w:rPr>
-          <w:rFonts w:ascii="Trebuchet MS" w:eastAsia="Trebuchet MS" w:hAnsi="Trebuchet MS" w:cs="Trebuchet MS"/>
-          <w:sz w:val="24"/>
-          <w:szCs w:val="24"/>
-        </w:rPr>
-        <w:t xml:space="preserve"> class that will hold a </w:t>
-      </w:r>
-      <w:proofErr w:type="spellStart"/>
-      <w:r>
-        <w:rPr>
-          <w:rFonts w:ascii="Trebuchet MS" w:eastAsia="Trebuchet MS" w:hAnsi="Trebuchet MS" w:cs="Trebuchet MS"/>
-          <w:sz w:val="24"/>
-          <w:szCs w:val="24"/>
-        </w:rPr>
-        <w:t>latLng</w:t>
-      </w:r>
-      <w:proofErr w:type="spellEnd"/>
-      <w:r>
-        <w:rPr>
-          <w:rFonts w:ascii="Trebuchet MS" w:eastAsia="Trebuchet MS" w:hAnsi="Trebuchet MS" w:cs="Trebuchet MS"/>
-          <w:sz w:val="24"/>
-          <w:szCs w:val="24"/>
-        </w:rPr>
-        <w:t xml:space="preserve"> property backed by a </w:t>
-      </w:r>
-      <w:proofErr w:type="spellStart"/>
-      <w:r>
-        <w:rPr>
-          <w:rFonts w:ascii="Trebuchet MS" w:eastAsia="Trebuchet MS" w:hAnsi="Trebuchet MS" w:cs="Trebuchet MS"/>
-          <w:sz w:val="24"/>
-          <w:szCs w:val="24"/>
-        </w:rPr>
-        <w:t>MutableLiveData</w:t>
-      </w:r>
-      <w:proofErr w:type="spellEnd"/>
-      <w:r>
-        <w:rPr>
-          <w:rFonts w:ascii="Trebuchet MS" w:eastAsia="Trebuchet MS" w:hAnsi="Trebuchet MS" w:cs="Trebuchet MS"/>
-          <w:sz w:val="24"/>
-          <w:szCs w:val="24"/>
-        </w:rPr>
-        <w:t xml:space="preserve"> object. </w:t>
+        <w:t xml:space="preserve">To manage the location state in both the activity and UI, I will need to add a LatLngViewModel class that will hold a latLng property backed by a MutableLiveData object. </w:t>
       </w:r>
     </w:p>
     <w:p>
@@ -817,43 +679,7 @@
           <w:szCs w:val="24"/>
         </w:rPr>
         <w:lastRenderedPageBreak/>
-        <w:t xml:space="preserve">Whenever the </w:t>
-      </w:r>
-      <w:proofErr w:type="spellStart"/>
-      <w:r>
-        <w:rPr>
-          <w:rFonts w:ascii="Trebuchet MS" w:eastAsia="Trebuchet MS" w:hAnsi="Trebuchet MS" w:cs="Trebuchet MS"/>
-          <w:sz w:val="24"/>
-          <w:szCs w:val="24"/>
-        </w:rPr>
-        <w:t>latLng</w:t>
-      </w:r>
-      <w:proofErr w:type="spellEnd"/>
-      <w:r>
-        <w:rPr>
-          <w:rFonts w:ascii="Trebuchet MS" w:eastAsia="Trebuchet MS" w:hAnsi="Trebuchet MS" w:cs="Trebuchet MS"/>
-          <w:sz w:val="24"/>
-          <w:szCs w:val="24"/>
-        </w:rPr>
-        <w:t xml:space="preserve"> is updated, i.e. the user's location changes, it should automatically push the new value to </w:t>
-      </w:r>
-      <w:proofErr w:type="spellStart"/>
-      <w:r>
-        <w:rPr>
-          <w:rFonts w:ascii="Trebuchet MS" w:eastAsia="Trebuchet MS" w:hAnsi="Trebuchet MS" w:cs="Trebuchet MS"/>
-          <w:sz w:val="24"/>
-          <w:szCs w:val="24"/>
-        </w:rPr>
-        <w:t>latLngLiveData</w:t>
-      </w:r>
-      <w:proofErr w:type="spellEnd"/>
-      <w:r>
-        <w:rPr>
-          <w:rFonts w:ascii="Trebuchet MS" w:eastAsia="Trebuchet MS" w:hAnsi="Trebuchet MS" w:cs="Trebuchet MS"/>
-          <w:sz w:val="24"/>
-          <w:szCs w:val="24"/>
-        </w:rPr>
-        <w:t xml:space="preserve">, making it observable from the UI layer.  </w:t>
+        <w:t xml:space="preserve">Whenever the latLng is updated, i.e. the user's location changes, it should automatically push the new value to latLngLiveData, making it observable from the UI layer.  </w:t>
       </w:r>
     </w:p>
     <w:p>
@@ -945,97 +771,7 @@
           <w:sz w:val="24"/>
           <w:szCs w:val="24"/>
         </w:rPr>
-        <w:t xml:space="preserve">In the </w:t>
-      </w:r>
-      <w:proofErr w:type="spellStart"/>
-      <w:r>
-        <w:rPr>
-          <w:rFonts w:ascii="Trebuchet MS" w:eastAsia="Trebuchet MS" w:hAnsi="Trebuchet MS" w:cs="Trebuchet MS"/>
-          <w:sz w:val="24"/>
-          <w:szCs w:val="24"/>
-        </w:rPr>
-        <w:t>MainActivity</w:t>
-      </w:r>
-      <w:proofErr w:type="spellEnd"/>
-      <w:r>
-        <w:rPr>
-          <w:rFonts w:ascii="Trebuchet MS" w:eastAsia="Trebuchet MS" w:hAnsi="Trebuchet MS" w:cs="Trebuchet MS"/>
-          <w:sz w:val="24"/>
-          <w:szCs w:val="24"/>
-        </w:rPr>
-        <w:t xml:space="preserve">, I will add the </w:t>
-      </w:r>
-      <w:proofErr w:type="spellStart"/>
-      <w:r>
-        <w:rPr>
-          <w:rFonts w:ascii="Trebuchet MS" w:eastAsia="Trebuchet MS" w:hAnsi="Trebuchet MS" w:cs="Trebuchet MS"/>
-          <w:sz w:val="24"/>
-          <w:szCs w:val="24"/>
-        </w:rPr>
-        <w:t>LocationListener</w:t>
-      </w:r>
-      <w:proofErr w:type="spellEnd"/>
-      <w:r>
-        <w:rPr>
-          <w:rFonts w:ascii="Trebuchet MS" w:eastAsia="Trebuchet MS" w:hAnsi="Trebuchet MS" w:cs="Trebuchet MS"/>
-          <w:sz w:val="24"/>
-          <w:szCs w:val="24"/>
-        </w:rPr>
-        <w:t xml:space="preserve"> interface. This will allow me to override the </w:t>
-      </w:r>
-      <w:proofErr w:type="spellStart"/>
-      <w:r>
-        <w:rPr>
-          <w:rFonts w:ascii="Trebuchet MS" w:eastAsia="Trebuchet MS" w:hAnsi="Trebuchet MS" w:cs="Trebuchet MS"/>
-          <w:sz w:val="24"/>
-          <w:szCs w:val="24"/>
-        </w:rPr>
-        <w:t>onLocationChanged</w:t>
-      </w:r>
-      <w:proofErr w:type="spellEnd"/>
-      <w:r>
-        <w:rPr>
-          <w:rFonts w:ascii="Trebuchet MS" w:eastAsia="Trebuchet MS" w:hAnsi="Trebuchet MS" w:cs="Trebuchet MS"/>
-          <w:sz w:val="24"/>
-          <w:szCs w:val="24"/>
-        </w:rPr>
-        <w:t xml:space="preserve"> function, where I will update the </w:t>
-      </w:r>
-      <w:proofErr w:type="spellStart"/>
-      <w:r>
-        <w:rPr>
-          <w:rFonts w:ascii="Trebuchet MS" w:eastAsia="Trebuchet MS" w:hAnsi="Trebuchet MS" w:cs="Trebuchet MS"/>
-          <w:sz w:val="24"/>
-          <w:szCs w:val="24"/>
-        </w:rPr>
-        <w:t>ViewModel's</w:t>
-      </w:r>
-      <w:proofErr w:type="spellEnd"/>
-      <w:r>
-        <w:rPr>
-          <w:rFonts w:ascii="Trebuchet MS" w:eastAsia="Trebuchet MS" w:hAnsi="Trebuchet MS" w:cs="Trebuchet MS"/>
-          <w:sz w:val="24"/>
-          <w:szCs w:val="24"/>
-        </w:rPr>
-        <w:t xml:space="preserve"> </w:t>
-      </w:r>
-      <w:proofErr w:type="spellStart"/>
-      <w:r>
-        <w:rPr>
-          <w:rFonts w:ascii="Trebuchet MS" w:eastAsia="Trebuchet MS" w:hAnsi="Trebuchet MS" w:cs="Trebuchet MS"/>
-          <w:sz w:val="24"/>
-          <w:szCs w:val="24"/>
-        </w:rPr>
-        <w:t>latLng</w:t>
-      </w:r>
-      <w:proofErr w:type="spellEnd"/>
-      <w:r>
-        <w:rPr>
-          <w:rFonts w:ascii="Trebuchet MS" w:eastAsia="Trebuchet MS" w:hAnsi="Trebuchet MS" w:cs="Trebuchet MS"/>
-          <w:sz w:val="24"/>
-          <w:szCs w:val="24"/>
-        </w:rPr>
-        <w:t xml:space="preserve"> with the current coordinates gathered by the device itself.</w:t>
+        <w:t>In the MainActivity, I will add the LocationListener interface. This will allow me to override the onLocationChanged function, where I will update the ViewModel's latLng with the current coordinates gathered by the device itself.</w:t>
       </w:r>
       <w:r>
         <w:rPr>
@@ -1175,61 +911,7 @@
           <w:sz w:val="24"/>
           <w:szCs w:val="24"/>
         </w:rPr>
-        <w:t xml:space="preserve">To start receiving GPS updates, I will create a GPS function that will retrieve the </w:t>
-      </w:r>
-      <w:proofErr w:type="spellStart"/>
-      <w:r>
-        <w:rPr>
-          <w:rFonts w:ascii="Trebuchet MS" w:eastAsia="Trebuchet MS" w:hAnsi="Trebuchet MS" w:cs="Trebuchet MS"/>
-          <w:sz w:val="24"/>
-          <w:szCs w:val="24"/>
-        </w:rPr>
-        <w:t>LocationManager</w:t>
-      </w:r>
-      <w:proofErr w:type="spellEnd"/>
-      <w:r>
-        <w:rPr>
-          <w:rFonts w:ascii="Trebuchet MS" w:eastAsia="Trebuchet MS" w:hAnsi="Trebuchet MS" w:cs="Trebuchet MS"/>
-          <w:sz w:val="24"/>
-          <w:szCs w:val="24"/>
-        </w:rPr>
-        <w:t xml:space="preserve"> system service and call </w:t>
-      </w:r>
-      <w:proofErr w:type="spellStart"/>
-      <w:r>
-        <w:rPr>
-          <w:rFonts w:ascii="Trebuchet MS" w:eastAsia="Trebuchet MS" w:hAnsi="Trebuchet MS" w:cs="Trebuchet MS"/>
-          <w:sz w:val="24"/>
-          <w:szCs w:val="24"/>
-        </w:rPr>
-        <w:t>requestLocationUpdates</w:t>
-      </w:r>
-      <w:proofErr w:type="spellEnd"/>
-      <w:r>
-        <w:rPr>
-          <w:rFonts w:ascii="Trebuchet MS" w:eastAsia="Trebuchet MS" w:hAnsi="Trebuchet MS" w:cs="Trebuchet MS"/>
-          <w:sz w:val="24"/>
-          <w:szCs w:val="24"/>
-        </w:rPr>
-        <w:t xml:space="preserve">, which I will set to update every 2 seconds or after 5 </w:t>
-      </w:r>
-      <w:proofErr w:type="spellStart"/>
-      <w:r>
-        <w:rPr>
-          <w:rFonts w:ascii="Trebuchet MS" w:eastAsia="Trebuchet MS" w:hAnsi="Trebuchet MS" w:cs="Trebuchet MS"/>
-          <w:sz w:val="24"/>
-          <w:szCs w:val="24"/>
-        </w:rPr>
-        <w:t>metres</w:t>
-      </w:r>
-      <w:proofErr w:type="spellEnd"/>
-      <w:r>
-        <w:rPr>
-          <w:rFonts w:ascii="Trebuchet MS" w:eastAsia="Trebuchet MS" w:hAnsi="Trebuchet MS" w:cs="Trebuchet MS"/>
-          <w:sz w:val="24"/>
-          <w:szCs w:val="24"/>
-        </w:rPr>
-        <w:t xml:space="preserve"> of movement. This will keep the GPS accurate without slowing the machine down too much.</w:t>
+        <w:t>To start receiving GPS updates, I will create a GPS function that will retrieve the LocationManager system service and call requestLocationUpdates, which I will set to update every 2 seconds or after 5 metres of movement. This will keep the GPS accurate without slowing the machine down too much.</w:t>
       </w:r>
       <w:r>
         <w:rPr>
@@ -1352,35 +1034,7 @@
           <w:sz w:val="24"/>
           <w:szCs w:val="24"/>
         </w:rPr>
-        <w:t xml:space="preserve">I will also write a </w:t>
-      </w:r>
-      <w:proofErr w:type="spellStart"/>
-      <w:proofErr w:type="gramStart"/>
-      <w:r>
-        <w:rPr>
-          <w:rFonts w:ascii="Trebuchet MS" w:eastAsia="Trebuchet MS" w:hAnsi="Trebuchet MS" w:cs="Trebuchet MS"/>
-          <w:sz w:val="24"/>
-          <w:szCs w:val="24"/>
-        </w:rPr>
-        <w:t>checkPermissions</w:t>
-      </w:r>
-      <w:proofErr w:type="spellEnd"/>
-      <w:r>
-        <w:rPr>
-          <w:rFonts w:ascii="Trebuchet MS" w:eastAsia="Trebuchet MS" w:hAnsi="Trebuchet MS" w:cs="Trebuchet MS"/>
-          <w:sz w:val="24"/>
-          <w:szCs w:val="24"/>
-        </w:rPr>
-        <w:t xml:space="preserve"> function</w:t>
-      </w:r>
-      <w:proofErr w:type="gramEnd"/>
-      <w:r>
-        <w:rPr>
-          <w:rFonts w:ascii="Trebuchet MS" w:eastAsia="Trebuchet MS" w:hAnsi="Trebuchet MS" w:cs="Trebuchet MS"/>
-          <w:sz w:val="24"/>
-          <w:szCs w:val="24"/>
-        </w:rPr>
-        <w:t xml:space="preserve"> that will check whether the location permission has already been granted. If they haven’t, then it will launch a permission request. This will make sure that the GPS function is only called if the user approves the use of their location. A Toast message was shown if they denied it.</w:t>
+        <w:t>I will also write a checkPermissions function that will check whether the location permission has already been granted. If they haven’t, then it will launch a permission request. This will make sure that the GPS function is only called if the user approves the use of their location. A Toast message was shown if they denied it.</w:t>
       </w:r>
     </w:p>
     <w:p>
@@ -1511,187 +1165,7 @@
           <w:sz w:val="24"/>
           <w:szCs w:val="24"/>
         </w:rPr>
-        <w:t xml:space="preserve">Inside the </w:t>
-      </w:r>
-      <w:proofErr w:type="spellStart"/>
-      <w:r>
-        <w:rPr>
-          <w:rFonts w:ascii="Trebuchet MS" w:eastAsia="Trebuchet MS" w:hAnsi="Trebuchet MS" w:cs="Trebuchet MS"/>
-          <w:sz w:val="24"/>
-          <w:szCs w:val="24"/>
-        </w:rPr>
-        <w:t>setContent</w:t>
-      </w:r>
-      <w:proofErr w:type="spellEnd"/>
-      <w:r>
-        <w:rPr>
-          <w:rFonts w:ascii="Trebuchet MS" w:eastAsia="Trebuchet MS" w:hAnsi="Trebuchet MS" w:cs="Trebuchet MS"/>
-          <w:sz w:val="24"/>
-          <w:szCs w:val="24"/>
-        </w:rPr>
-        <w:t xml:space="preserve"> itself, I will use a </w:t>
-      </w:r>
-      <w:proofErr w:type="spellStart"/>
-      <w:r>
-        <w:rPr>
-          <w:rFonts w:ascii="Trebuchet MS" w:eastAsia="Trebuchet MS" w:hAnsi="Trebuchet MS" w:cs="Trebuchet MS"/>
-          <w:sz w:val="24"/>
-          <w:szCs w:val="24"/>
-        </w:rPr>
-        <w:t>mutablestate</w:t>
-      </w:r>
-      <w:proofErr w:type="spellEnd"/>
-      <w:r>
-        <w:rPr>
-          <w:rFonts w:ascii="Trebuchet MS" w:eastAsia="Trebuchet MS" w:hAnsi="Trebuchet MS" w:cs="Trebuchet MS"/>
-          <w:sz w:val="24"/>
-          <w:szCs w:val="24"/>
-        </w:rPr>
-        <w:t xml:space="preserve"> variable to hold the current </w:t>
-      </w:r>
-      <w:proofErr w:type="spellStart"/>
-      <w:r>
-        <w:rPr>
-          <w:rFonts w:ascii="Trebuchet MS" w:eastAsia="Trebuchet MS" w:hAnsi="Trebuchet MS" w:cs="Trebuchet MS"/>
-          <w:sz w:val="24"/>
-          <w:szCs w:val="24"/>
-        </w:rPr>
-        <w:t>LatLng</w:t>
-      </w:r>
-      <w:proofErr w:type="spellEnd"/>
-      <w:r>
-        <w:rPr>
-          <w:rFonts w:ascii="Trebuchet MS" w:eastAsia="Trebuchet MS" w:hAnsi="Trebuchet MS" w:cs="Trebuchet MS"/>
-          <w:sz w:val="24"/>
-          <w:szCs w:val="24"/>
-        </w:rPr>
-        <w:t xml:space="preserve"> and zoom level, observed the </w:t>
-      </w:r>
-      <w:proofErr w:type="spellStart"/>
-      <w:r>
-        <w:rPr>
-          <w:rFonts w:ascii="Trebuchet MS" w:eastAsia="Trebuchet MS" w:hAnsi="Trebuchet MS" w:cs="Trebuchet MS"/>
-          <w:sz w:val="24"/>
-          <w:szCs w:val="24"/>
-        </w:rPr>
-        <w:t>ViewModel's</w:t>
-      </w:r>
-      <w:proofErr w:type="spellEnd"/>
-      <w:r>
-        <w:rPr>
-          <w:rFonts w:ascii="Trebuchet MS" w:eastAsia="Trebuchet MS" w:hAnsi="Trebuchet MS" w:cs="Trebuchet MS"/>
-          <w:sz w:val="24"/>
-          <w:szCs w:val="24"/>
-        </w:rPr>
-        <w:t xml:space="preserve"> </w:t>
-      </w:r>
-      <w:proofErr w:type="spellStart"/>
-      <w:r>
-        <w:rPr>
-          <w:rFonts w:ascii="Trebuchet MS" w:eastAsia="Trebuchet MS" w:hAnsi="Trebuchet MS" w:cs="Trebuchet MS"/>
-          <w:sz w:val="24"/>
-          <w:szCs w:val="24"/>
-        </w:rPr>
-        <w:t>LiveData</w:t>
-      </w:r>
-      <w:proofErr w:type="spellEnd"/>
-      <w:r>
-        <w:rPr>
-          <w:rFonts w:ascii="Trebuchet MS" w:eastAsia="Trebuchet MS" w:hAnsi="Trebuchet MS" w:cs="Trebuchet MS"/>
-          <w:sz w:val="24"/>
-          <w:szCs w:val="24"/>
-        </w:rPr>
-        <w:t xml:space="preserve"> to keep that state updated, and pass the values into a </w:t>
-      </w:r>
-      <w:proofErr w:type="spellStart"/>
-      <w:r>
-        <w:rPr>
-          <w:rFonts w:ascii="Trebuchet MS" w:eastAsia="Trebuchet MS" w:hAnsi="Trebuchet MS" w:cs="Trebuchet MS"/>
-          <w:sz w:val="24"/>
-          <w:szCs w:val="24"/>
-        </w:rPr>
-        <w:t>MapLibre</w:t>
-      </w:r>
-      <w:proofErr w:type="spellEnd"/>
-      <w:r>
-        <w:rPr>
-          <w:rFonts w:ascii="Trebuchet MS" w:eastAsia="Trebuchet MS" w:hAnsi="Trebuchet MS" w:cs="Trebuchet MS"/>
-          <w:sz w:val="24"/>
-          <w:szCs w:val="24"/>
-        </w:rPr>
-        <w:t xml:space="preserve"> composable via a </w:t>
-      </w:r>
-      <w:proofErr w:type="spellStart"/>
-      <w:r>
-        <w:rPr>
-          <w:rFonts w:ascii="Trebuchet MS" w:eastAsia="Trebuchet MS" w:hAnsi="Trebuchet MS" w:cs="Trebuchet MS"/>
-          <w:sz w:val="24"/>
-          <w:szCs w:val="24"/>
-        </w:rPr>
-        <w:t>CameraPosition</w:t>
-      </w:r>
-      <w:proofErr w:type="spellEnd"/>
-      <w:r>
-        <w:rPr>
-          <w:rFonts w:ascii="Trebuchet MS" w:eastAsia="Trebuchet MS" w:hAnsi="Trebuchet MS" w:cs="Trebuchet MS"/>
-          <w:sz w:val="24"/>
-          <w:szCs w:val="24"/>
-        </w:rPr>
-        <w:t xml:space="preserve">, causing the map to </w:t>
-      </w:r>
-      <w:proofErr w:type="spellStart"/>
-      <w:r>
-        <w:rPr>
-          <w:rFonts w:ascii="Trebuchet MS" w:eastAsia="Trebuchet MS" w:hAnsi="Trebuchet MS" w:cs="Trebuchet MS"/>
-          <w:sz w:val="24"/>
-          <w:szCs w:val="24"/>
-        </w:rPr>
-        <w:t>recentre</w:t>
-      </w:r>
-      <w:proofErr w:type="spellEnd"/>
-      <w:r>
-        <w:rPr>
-          <w:rFonts w:ascii="Trebuchet MS" w:eastAsia="Trebuchet MS" w:hAnsi="Trebuchet MS" w:cs="Trebuchet MS"/>
-          <w:sz w:val="24"/>
-          <w:szCs w:val="24"/>
-        </w:rPr>
-        <w:t xml:space="preserve"> automatically whenever the user's location changed. This was all placed inside a Scaffold with </w:t>
-      </w:r>
-      <w:proofErr w:type="spellStart"/>
-      <w:r>
-        <w:rPr>
-          <w:rFonts w:ascii="Trebuchet MS" w:eastAsia="Trebuchet MS" w:hAnsi="Trebuchet MS" w:cs="Trebuchet MS"/>
-          <w:sz w:val="24"/>
-          <w:szCs w:val="24"/>
-        </w:rPr>
-        <w:t>innerpadding</w:t>
-      </w:r>
-      <w:proofErr w:type="spellEnd"/>
-      <w:r>
-        <w:rPr>
-          <w:rFonts w:ascii="Trebuchet MS" w:eastAsia="Trebuchet MS" w:hAnsi="Trebuchet MS" w:cs="Trebuchet MS"/>
-          <w:sz w:val="24"/>
-          <w:szCs w:val="24"/>
-        </w:rPr>
-        <w:t xml:space="preserve"> to prevent any overlap of the </w:t>
-      </w:r>
-      <w:proofErr w:type="gramStart"/>
-      <w:r>
-        <w:rPr>
-          <w:rFonts w:ascii="Trebuchet MS" w:eastAsia="Trebuchet MS" w:hAnsi="Trebuchet MS" w:cs="Trebuchet MS"/>
-          <w:sz w:val="24"/>
-          <w:szCs w:val="24"/>
-        </w:rPr>
-        <w:t>devices</w:t>
-      </w:r>
-      <w:proofErr w:type="gramEnd"/>
-      <w:r>
-        <w:rPr>
-          <w:rFonts w:ascii="Trebuchet MS" w:eastAsia="Trebuchet MS" w:hAnsi="Trebuchet MS" w:cs="Trebuchet MS"/>
-          <w:sz w:val="24"/>
-          <w:szCs w:val="24"/>
-        </w:rPr>
-        <w:t xml:space="preserve"> interfaces with the application itself.</w:t>
+        <w:t>Inside the setContent itself, I will use a mutablestate variable to hold the current LatLng and zoom level, observed the ViewModel's LiveData to keep that state updated, and pass the values into a MapLibre composable via a CameraPosition, causing the map to recentre automatically whenever the user's location changed. This was all placed inside a Scaffold with innerpadding to prevent any overlap of the devices interfaces with the application itself.</w:t>
       </w:r>
     </w:p>
     <w:p>
@@ -1791,29 +1265,7 @@
           <w:sz w:val="24"/>
           <w:szCs w:val="24"/>
         </w:rPr>
-        <w:t xml:space="preserve">- type (pub, restaurant, hotel, historical site, </w:t>
-      </w:r>
-      <w:proofErr w:type="spellStart"/>
-      <w:r>
-        <w:rPr>
-          <w:rFonts w:ascii="Trebuchet MS" w:hAnsi="Trebuchet MS"/>
-          <w:i/>
-          <w:iCs/>
-          <w:sz w:val="24"/>
-          <w:szCs w:val="24"/>
-        </w:rPr>
-        <w:t>etc</w:t>
-      </w:r>
-      <w:proofErr w:type="spellEnd"/>
-      <w:r>
-        <w:rPr>
-          <w:rFonts w:ascii="Trebuchet MS" w:hAnsi="Trebuchet MS"/>
-          <w:i/>
-          <w:iCs/>
-          <w:sz w:val="24"/>
-          <w:szCs w:val="24"/>
-        </w:rPr>
-        <w:t>);</w:t>
+        <w:t>- type (pub, restaurant, hotel, historical site, etc);</w:t>
       </w:r>
     </w:p>
     <w:p>
@@ -1908,31 +1360,7 @@
           <w:sz w:val="24"/>
           <w:szCs w:val="24"/>
         </w:rPr>
-        <w:t xml:space="preserve">For </w:t>
-      </w:r>
-      <w:proofErr w:type="gramStart"/>
-      <w:r>
-        <w:rPr>
-          <w:rFonts w:ascii="Trebuchet MS" w:hAnsi="Trebuchet MS"/>
-          <w:i/>
-          <w:iCs/>
-          <w:color w:val="000000"/>
-          <w:sz w:val="24"/>
-          <w:szCs w:val="24"/>
-        </w:rPr>
-        <w:t>now</w:t>
-      </w:r>
-      <w:proofErr w:type="gramEnd"/>
-      <w:r>
-        <w:rPr>
-          <w:rFonts w:ascii="Trebuchet MS" w:hAnsi="Trebuchet MS"/>
-          <w:i/>
-          <w:iCs/>
-          <w:color w:val="000000"/>
-          <w:sz w:val="24"/>
-          <w:szCs w:val="24"/>
-        </w:rPr>
-        <w:t xml:space="preserve"> you can just use buttons for navigation – there is no need to use an app bar, a navigation bar, or the navigation drawer just yet.</w:t>
+        <w:t>For now you can just use buttons for navigation – there is no need to use an app bar, a navigation bar, or the navigation drawer just yet.</w:t>
       </w:r>
       <w:r>
         <w:rPr>
@@ -2052,13 +1480,8 @@
       <w:r>
         <w:t xml:space="preserve"> </w:t>
       </w:r>
-      <w:proofErr w:type="spellStart"/>
-      <w:r>
-        <w:t>ViewModel</w:t>
-      </w:r>
-      <w:proofErr w:type="spellEnd"/>
-      <w:r>
-        <w:t>.</w:t>
+      <w:r>
+        <w:t>ViewModel.</w:t>
       </w:r>
     </w:p>
     <w:p>
@@ -2076,58 +1499,13 @@
         <w:ind w:left="720"/>
       </w:pPr>
       <w:r>
-        <w:t xml:space="preserve">I then plan to update my </w:t>
-      </w:r>
-      <w:proofErr w:type="spellStart"/>
-      <w:r>
-        <w:t>LatLng</w:t>
-      </w:r>
-      <w:proofErr w:type="spellEnd"/>
-      <w:r>
-        <w:t xml:space="preserve"> </w:t>
-      </w:r>
-      <w:proofErr w:type="spellStart"/>
-      <w:r>
-        <w:t>ViewModel</w:t>
-      </w:r>
-      <w:proofErr w:type="spellEnd"/>
-      <w:r>
-        <w:t xml:space="preserve"> to also include the POI list rather than adding a second </w:t>
-      </w:r>
-      <w:proofErr w:type="spellStart"/>
-      <w:r>
-        <w:t>ViewModel</w:t>
-      </w:r>
-      <w:proofErr w:type="spellEnd"/>
-      <w:r>
-        <w:t xml:space="preserve"> as this already holds the GPS location. I will add </w:t>
-      </w:r>
-      <w:proofErr w:type="spellStart"/>
-      <w:r>
-        <w:t>MutableLiveData</w:t>
-      </w:r>
-      <w:proofErr w:type="spellEnd"/>
-      <w:r>
-        <w:t>&lt;List&lt;Poi&gt;&gt;</w:t>
-      </w:r>
-      <w:r>
-        <w:t xml:space="preserve"> so that the </w:t>
-      </w:r>
-      <w:proofErr w:type="spellStart"/>
-      <w:r>
-        <w:t>MainActivity</w:t>
-      </w:r>
-      <w:proofErr w:type="spellEnd"/>
-      <w:r>
-        <w:t xml:space="preserve"> can observe the list, meaning that whenever a POI is added the UI can then automatically know to redraw any makers on the map. I will then add a function to the </w:t>
-      </w:r>
-      <w:proofErr w:type="spellStart"/>
-      <w:r>
-        <w:t>ViewModel</w:t>
-      </w:r>
-      <w:proofErr w:type="spellEnd"/>
-      <w:r>
-        <w:t xml:space="preserve"> which will add a </w:t>
+        <w:t xml:space="preserve">I then plan to update my LatLng ViewModel to also include the POI list rather than adding a second ViewModel as this already holds the GPS location. I will add </w:t>
+      </w:r>
+      <w:r>
+        <w:t>MutableLiveData&lt;List&lt;Poi&gt;&gt;</w:t>
+      </w:r>
+      <w:r>
+        <w:t xml:space="preserve"> so that the MainActivity can observe the list, meaning that whenever a POI is added the UI can then automatically know to redraw any makers on the map. I will then add a function to the ViewModel which will add a </w:t>
       </w:r>
       <w:r>
         <w:t xml:space="preserve">given </w:t>
@@ -2273,29 +1651,13 @@
         <w:t>I will then add a separate composable for the POI screen</w:t>
       </w:r>
       <w:r>
-        <w:t xml:space="preserve">. I plan to put this in its own separate file to prevent code from clustering in the </w:t>
-      </w:r>
-      <w:proofErr w:type="spellStart"/>
-      <w:r>
-        <w:t>MainActivity</w:t>
-      </w:r>
-      <w:proofErr w:type="spellEnd"/>
-      <w:r>
-        <w:t>.</w:t>
+        <w:t>. I plan to put this in its own separate file to prevent code from clustering in the MainActivity.</w:t>
       </w:r>
       <w:r>
         <w:t xml:space="preserve"> I will add two callback functions to the parameter of the composable. One will be for when a POI I added and the other will be for when the user wishes to navigate back to the home screen.</w:t>
       </w:r>
       <w:r>
-        <w:t xml:space="preserve"> I will also make it so the users current </w:t>
-      </w:r>
-      <w:proofErr w:type="spellStart"/>
-      <w:r>
-        <w:t>LatLng</w:t>
-      </w:r>
-      <w:proofErr w:type="spellEnd"/>
-      <w:r>
-        <w:t xml:space="preserve"> is also passed as a parameter for the POIs location.</w:t>
+        <w:t xml:space="preserve"> I will also make it so the users current LatLng is also passed as a parameter for the POIs location.</w:t>
       </w:r>
       <w:r>
         <w:t xml:space="preserve"> </w:t>
@@ -2370,76 +1732,23 @@
         </w:drawing>
       </w:r>
       <w:r>
-        <w:t xml:space="preserve">I will finally update the main composable to include the map page and the add poi page using the compose navigation. I will add the </w:t>
-      </w:r>
-      <w:proofErr w:type="spellStart"/>
-      <w:r>
-        <w:t>NavHost</w:t>
-      </w:r>
-      <w:proofErr w:type="spellEnd"/>
-      <w:r>
-        <w:t xml:space="preserve"> which will contain the two routes for the map page and the add poi page. I will then be able to define the callback functions for the </w:t>
-      </w:r>
-      <w:proofErr w:type="spellStart"/>
-      <w:r>
-        <w:t>onPoiAdded</w:t>
-      </w:r>
-      <w:proofErr w:type="spellEnd"/>
-      <w:r>
-        <w:t xml:space="preserve"> and </w:t>
-      </w:r>
-      <w:proofErr w:type="spellStart"/>
-      <w:r>
-        <w:t>onNavigateBack</w:t>
-      </w:r>
-      <w:proofErr w:type="spellEnd"/>
+        <w:t xml:space="preserve">I will finally update the main composable to include the map page and the add poi page using the compose navigation. I will add the NavHost which will contain the two routes for the map page and the add poi page. I will then be able to define the callback functions for the onPoiAdded and onNavigateBack. onPoiAdded will add the new poi to the ViewModel and the onNavigateBack will return the user to the previous page they were on. </w:t>
+      </w:r>
+      <w:r>
+        <w:t xml:space="preserve">I will place a </w:t>
+      </w:r>
+      <w:r>
+        <w:t xml:space="preserve">Symbol marker inside </w:t>
+      </w:r>
+      <w:r>
+        <w:t xml:space="preserve">the </w:t>
+      </w:r>
+      <w:r>
+        <w:t>MapLibre lambda</w:t>
+      </w:r>
       <w:r>
         <w:t xml:space="preserve">. </w:t>
       </w:r>
-      <w:proofErr w:type="spellStart"/>
-      <w:r>
-        <w:t>onPoiAdded</w:t>
-      </w:r>
-      <w:proofErr w:type="spellEnd"/>
-      <w:r>
-        <w:t xml:space="preserve"> will add the new poi to the </w:t>
-      </w:r>
-      <w:proofErr w:type="spellStart"/>
-      <w:r>
-        <w:t>ViewModel</w:t>
-      </w:r>
-      <w:proofErr w:type="spellEnd"/>
-      <w:r>
-        <w:t xml:space="preserve"> and the </w:t>
-      </w:r>
-      <w:proofErr w:type="spellStart"/>
-      <w:r>
-        <w:t>onNavigateBack</w:t>
-      </w:r>
-      <w:proofErr w:type="spellEnd"/>
-      <w:r>
-        <w:t xml:space="preserve"> will return the user to the previous page they were on. </w:t>
-      </w:r>
-      <w:r>
-        <w:t xml:space="preserve">I will place a </w:t>
-      </w:r>
-      <w:r>
-        <w:t xml:space="preserve">Symbol marker inside </w:t>
-      </w:r>
-      <w:r>
-        <w:t xml:space="preserve">the </w:t>
-      </w:r>
-      <w:proofErr w:type="spellStart"/>
-      <w:r>
-        <w:t>MapLibre</w:t>
-      </w:r>
-      <w:proofErr w:type="spellEnd"/>
-      <w:r>
-        <w:t xml:space="preserve"> lambda</w:t>
-      </w:r>
-      <w:r>
-        <w:t xml:space="preserve">. </w:t>
-      </w:r>
       <w:r>
         <w:t xml:space="preserve">The map </w:t>
       </w:r>
@@ -2453,43 +1762,20 @@
         <w:t xml:space="preserve"> the</w:t>
       </w:r>
       <w:r>
-        <w:t xml:space="preserve"> </w:t>
-      </w:r>
-      <w:proofErr w:type="spellStart"/>
-      <w:proofErr w:type="gramStart"/>
-      <w:r>
-        <w:t>poisState</w:t>
-      </w:r>
-      <w:proofErr w:type="spellEnd"/>
-      <w:proofErr w:type="gramEnd"/>
-      <w:r>
-        <w:t xml:space="preserve"> changes</w:t>
+        <w:t xml:space="preserve"> poisState changes</w:t>
       </w:r>
       <w:r>
         <w:t>. This will then</w:t>
       </w:r>
       <w:r>
-        <w:t xml:space="preserve"> loop through </w:t>
-      </w:r>
-      <w:proofErr w:type="spellStart"/>
-      <w:r>
-        <w:t>poisState</w:t>
-      </w:r>
-      <w:proofErr w:type="spellEnd"/>
-      <w:r>
-        <w:t xml:space="preserve"> and plac</w:t>
+        <w:t xml:space="preserve"> loop through poisState and plac</w:t>
       </w:r>
       <w:r>
         <w:t>e</w:t>
       </w:r>
       <w:r>
-        <w:t xml:space="preserve"> a Symbol at each POI's </w:t>
-      </w:r>
-      <w:proofErr w:type="spellStart"/>
-      <w:r>
-        <w:t>LatLng</w:t>
-      </w:r>
-      <w:proofErr w:type="spellEnd"/>
+        <w:t xml:space="preserve"> a Symbol at each POI's LatLng</w:t>
+      </w:r>
       <w:r>
         <w:t>. This makes it so</w:t>
       </w:r>
@@ -2500,15 +1786,7 @@
         <w:t>.</w:t>
       </w:r>
       <w:r>
-        <w:t xml:space="preserve"> I will make </w:t>
-      </w:r>
-      <w:proofErr w:type="gramStart"/>
-      <w:r>
-        <w:t>it</w:t>
-      </w:r>
-      <w:proofErr w:type="gramEnd"/>
-      <w:r>
-        <w:t xml:space="preserve"> so an alert dialog appears when the marker is clicked on, displaying the markers details including its name, type and description. This allows me to test that the marker has been added correctly.</w:t>
+        <w:t xml:space="preserve"> I will make it so an alert dialog appears when the marker is clicked on, displaying the markers details including its name, type and description. This allows me to test that the marker has been added correctly.</w:t>
       </w:r>
     </w:p>
     <w:p>
@@ -3054,15 +2332,7 @@
         <w:t xml:space="preserve">methods </w:t>
       </w:r>
       <w:r>
-        <w:t xml:space="preserve">for the database so it can be changed or searched. I plan to make it so that when the database returns all the POIs it contains, it will return it as a </w:t>
-      </w:r>
-      <w:proofErr w:type="spellStart"/>
-      <w:r>
-        <w:t>LiveData</w:t>
-      </w:r>
-      <w:proofErr w:type="spellEnd"/>
-      <w:r>
-        <w:t xml:space="preserve">&lt;List&lt;Poi&gt;&gt;. This will </w:t>
+        <w:t xml:space="preserve">for the database so it can be changed or searched. I plan to make it so that when the database returns all the POIs it contains, it will return it as a LiveData&lt;List&lt;Poi&gt;&gt;. This will </w:t>
       </w:r>
       <w:r>
         <w:t>make</w:t>
@@ -3071,36 +2341,7 @@
         <w:t xml:space="preserve"> sure that the UI is automatically updated with a new list of POIs whenever the database is changed.</w:t>
       </w:r>
       <w:r>
-        <w:t xml:space="preserve"> For now, I will give it three functions, </w:t>
-      </w:r>
-      <w:proofErr w:type="spellStart"/>
-      <w:proofErr w:type="gramStart"/>
-      <w:r>
-        <w:t>getAllPois</w:t>
-      </w:r>
-      <w:proofErr w:type="spellEnd"/>
-      <w:r>
-        <w:t>(</w:t>
-      </w:r>
-      <w:proofErr w:type="gramEnd"/>
-      <w:r>
-        <w:t xml:space="preserve">), </w:t>
-      </w:r>
-      <w:proofErr w:type="gramStart"/>
-      <w:r>
-        <w:t>insert(</w:t>
-      </w:r>
-      <w:proofErr w:type="gramEnd"/>
-      <w:r>
-        <w:t xml:space="preserve">) and </w:t>
-      </w:r>
-      <w:proofErr w:type="gramStart"/>
-      <w:r>
-        <w:t>delete(</w:t>
-      </w:r>
-      <w:proofErr w:type="gramEnd"/>
-      <w:r>
-        <w:t>).</w:t>
+        <w:t xml:space="preserve"> For now, I will give it three functions, getAllPois(), insert() and delete().</w:t>
       </w:r>
     </w:p>
     <w:p>
@@ -3173,28 +2414,7 @@
         </w:drawing>
       </w:r>
       <w:r>
-        <w:t xml:space="preserve">I plan to next create the file for the database itself. This will be placed within an abstract function which allows my other files to access its DAO and all the database operations within it. Inside it I will put a </w:t>
-      </w:r>
-      <w:proofErr w:type="spellStart"/>
-      <w:proofErr w:type="gramStart"/>
-      <w:r>
-        <w:t>getDatabase</w:t>
-      </w:r>
-      <w:proofErr w:type="spellEnd"/>
-      <w:r>
-        <w:t>(</w:t>
-      </w:r>
-      <w:proofErr w:type="gramEnd"/>
-      <w:r>
-        <w:t xml:space="preserve">) function which will check that a database </w:t>
-      </w:r>
-      <w:proofErr w:type="gramStart"/>
-      <w:r>
-        <w:t>doesn’t already</w:t>
-      </w:r>
-      <w:proofErr w:type="gramEnd"/>
-      <w:r>
-        <w:t xml:space="preserve"> exist, if not it will create one and save it, otherwise it will simply return the one that already exists.</w:t>
+        <w:t>I plan to next create the file for the database itself. This will be placed within an abstract function which allows my other files to access its DAO and all the database operations within it. Inside it I will put a getDatabase() function which will check that a database doesn’t already exist, if not it will create one and save it, otherwise it will simply return the one that already exists.</w:t>
       </w:r>
     </w:p>
     <w:p>
@@ -3263,74 +2483,16 @@
         </w:drawing>
       </w:r>
       <w:r>
-        <w:t xml:space="preserve">I will next update my </w:t>
-      </w:r>
-      <w:proofErr w:type="spellStart"/>
-      <w:r>
-        <w:t>Viewmodel</w:t>
-      </w:r>
-      <w:proofErr w:type="spellEnd"/>
-      <w:r>
-        <w:t xml:space="preserve">. </w:t>
-      </w:r>
-      <w:r>
-        <w:t xml:space="preserve">I will first change the </w:t>
-      </w:r>
-      <w:proofErr w:type="spellStart"/>
-      <w:r>
-        <w:t>ViewModel</w:t>
-      </w:r>
-      <w:proofErr w:type="spellEnd"/>
-      <w:r>
-        <w:t xml:space="preserve"> for </w:t>
-      </w:r>
-      <w:proofErr w:type="gramStart"/>
-      <w:r>
-        <w:t xml:space="preserve">a </w:t>
-      </w:r>
-      <w:proofErr w:type="spellStart"/>
-      <w:r>
-        <w:t>AndroidViewModel</w:t>
-      </w:r>
-      <w:proofErr w:type="spellEnd"/>
-      <w:proofErr w:type="gramEnd"/>
-      <w:r>
-        <w:t xml:space="preserve"> so that it can access the application context which will be needed to open the database. </w:t>
+        <w:t xml:space="preserve">I will next update my Viewmodel. </w:t>
+      </w:r>
+      <w:r>
+        <w:t xml:space="preserve">I will first change the ViewModel for a AndroidViewModel so that it can access the application context which will be needed to open the database. </w:t>
       </w:r>
       <w:r>
         <w:t xml:space="preserve">I plan to update the poi variable so that it gathers all the pois from the database as </w:t>
       </w:r>
-      <w:proofErr w:type="spellStart"/>
-      <w:r>
-        <w:t>LiveData</w:t>
-      </w:r>
-      <w:proofErr w:type="spellEnd"/>
-      <w:r>
-        <w:t xml:space="preserve"> allowing it to automatically update when a new POI is added. Because of this, I will also need to change the </w:t>
-      </w:r>
-      <w:proofErr w:type="spellStart"/>
-      <w:r>
-        <w:t>addpoi</w:t>
-      </w:r>
-      <w:proofErr w:type="spellEnd"/>
-      <w:r>
-        <w:t xml:space="preserve"> function in the </w:t>
-      </w:r>
-      <w:proofErr w:type="spellStart"/>
-      <w:r>
-        <w:t>Viewmodel</w:t>
-      </w:r>
-      <w:proofErr w:type="spellEnd"/>
-      <w:r>
-        <w:t xml:space="preserve"> so that it adds the poi to the database instead of list using the </w:t>
-      </w:r>
-      <w:proofErr w:type="spellStart"/>
-      <w:r>
-        <w:t>poiDao’s</w:t>
-      </w:r>
-      <w:proofErr w:type="spellEnd"/>
-      <w:r>
-        <w:t xml:space="preserve"> ins</w:t>
+      <w:r>
+        <w:t>LiveData allowing it to automatically update when a new POI is added. Because of this, I will also need to change the addpoi function in the Viewmodel so that it adds the poi to the database instead of list using the poiDao’s ins</w:t>
       </w:r>
       <w:r>
         <w:t>ert function.</w:t>
@@ -3411,15 +2573,7 @@
         </w:drawing>
       </w:r>
       <w:r>
-        <w:t xml:space="preserve">I will then update the button for my </w:t>
-      </w:r>
-      <w:proofErr w:type="spellStart"/>
-      <w:r>
-        <w:t>AddPoiScreen</w:t>
-      </w:r>
-      <w:proofErr w:type="spellEnd"/>
-      <w:r>
-        <w:t>. I will simply change the Poi structure in the button so that it fits the databases poi structure since the latitude and longitude for the pois in the database are separate variables.</w:t>
+        <w:t>I will then update the button for my AddPoiScreen. I will simply change the Poi structure in the button so that it fits the databases poi structure since the latitude and longitude for the pois in the database are separate variables.</w:t>
       </w:r>
     </w:p>
     <w:p>
@@ -3433,23 +2587,7 @@
       </w:pPr>
       <w:r>
         <w:lastRenderedPageBreak/>
-        <w:t xml:space="preserve">I will then need to change the </w:t>
-      </w:r>
-      <w:proofErr w:type="spellStart"/>
-      <w:r>
-        <w:t>MainActivity</w:t>
-      </w:r>
-      <w:proofErr w:type="spellEnd"/>
-      <w:r>
-        <w:t xml:space="preserve"> so that the Poi is converted back into the </w:t>
-      </w:r>
-      <w:proofErr w:type="spellStart"/>
-      <w:r>
-        <w:t>LatLng</w:t>
-      </w:r>
-      <w:proofErr w:type="spellEnd"/>
-      <w:r>
-        <w:t xml:space="preserve"> so that the map can properly mark its location.</w:t>
+        <w:t>I will then need to change the MainActivity so that the Poi is converted back into the LatLng so that the map can properly mark its location.</w:t>
       </w:r>
     </w:p>
     <w:p>
@@ -3663,15 +2801,7 @@
         <w:ind w:left="720"/>
       </w:pPr>
       <w:r>
-        <w:t xml:space="preserve">I have already set up the loading process for the POIs for task 3. This is done on </w:t>
-      </w:r>
-      <w:proofErr w:type="gramStart"/>
-      <w:r>
-        <w:t>startup and</w:t>
-      </w:r>
-      <w:proofErr w:type="gramEnd"/>
-      <w:r>
-        <w:t xml:space="preserve"> whenever the database is updated. </w:t>
+        <w:t xml:space="preserve">I have already set up the loading process for the POIs for task 3. This is done on startup and whenever the database is updated. </w:t>
       </w:r>
       <w:r>
         <w:t>However, to fit this task better I will change the code to use a button instead, this will make testing easier and give the user more control.</w:t>
@@ -3687,26 +2817,14 @@
         <w:ind w:left="720"/>
       </w:pPr>
       <w:r>
-        <w:t xml:space="preserve">I will start this by changing the DAO to </w:t>
-      </w:r>
-      <w:proofErr w:type="gramStart"/>
-      <w:r>
-        <w:t>return</w:t>
-      </w:r>
-      <w:proofErr w:type="gramEnd"/>
-      <w:r>
-        <w:t xml:space="preserve"> a plain list instead of </w:t>
-      </w:r>
-      <w:proofErr w:type="gramStart"/>
+        <w:t xml:space="preserve">I will start this by changing the DAO to return a plain list instead of </w:t>
+      </w:r>
       <w:r>
         <w:t xml:space="preserve">the </w:t>
       </w:r>
-      <w:proofErr w:type="spellStart"/>
       <w:r>
         <w:t>LiveData</w:t>
       </w:r>
-      <w:proofErr w:type="spellEnd"/>
-      <w:proofErr w:type="gramEnd"/>
       <w:r>
         <w:t xml:space="preserve"> since the POIs will no longer be automatically loaded. </w:t>
       </w:r>
@@ -3850,39 +2968,7 @@
         </w:drawing>
       </w:r>
       <w:r>
-        <w:t xml:space="preserve">I will also need to add a new function to the </w:t>
-      </w:r>
-      <w:proofErr w:type="spellStart"/>
-      <w:r>
-        <w:t>ViewModel</w:t>
-      </w:r>
-      <w:proofErr w:type="spellEnd"/>
-      <w:r>
-        <w:t xml:space="preserve"> which will load all the POIs from the database. It will run the database query on Dispatchers.IO in the background, then set the result to </w:t>
-      </w:r>
-      <w:proofErr w:type="spellStart"/>
-      <w:r>
-        <w:t>pois.value</w:t>
-      </w:r>
-      <w:proofErr w:type="spellEnd"/>
-      <w:r>
-        <w:t xml:space="preserve"> which should </w:t>
-      </w:r>
-      <w:proofErr w:type="gramStart"/>
-      <w:r>
-        <w:t>triggers</w:t>
-      </w:r>
-      <w:proofErr w:type="gramEnd"/>
-      <w:r>
-        <w:t xml:space="preserve"> the observer in </w:t>
-      </w:r>
-      <w:proofErr w:type="spellStart"/>
-      <w:r>
-        <w:t>MainActivity</w:t>
-      </w:r>
-      <w:proofErr w:type="spellEnd"/>
-      <w:r>
-        <w:t xml:space="preserve"> which will then update the map.</w:t>
+        <w:t>I will also need to add a new function to the ViewModel which will load all the POIs from the database. It will run the database query on Dispatchers.IO in the background, then set the result to pois.value which should triggers the observer in MainActivity which will then update the map.</w:t>
       </w:r>
     </w:p>
     <w:p>
@@ -3955,36 +3041,20 @@
         <w:t>it</w:t>
       </w:r>
       <w:r>
-        <w:t xml:space="preserve"> holds a plain list of pois instead of being assigned directly from the DAO’s live data since it no longer returns </w:t>
-      </w:r>
-      <w:proofErr w:type="spellStart"/>
-      <w:r>
-        <w:t>LiveData</w:t>
-      </w:r>
-      <w:proofErr w:type="spellEnd"/>
-      <w:r>
-        <w:t>.</w:t>
-      </w:r>
-    </w:p>
-    <w:p>
-      <w:pPr>
-        <w:ind w:left="720"/>
-      </w:pPr>
-    </w:p>
-    <w:p>
-      <w:pPr>
-        <w:ind w:left="720"/>
-      </w:pPr>
-      <w:r>
-        <w:t xml:space="preserve">I will then lastly need to add the load buttons to the </w:t>
-      </w:r>
-      <w:proofErr w:type="spellStart"/>
-      <w:r>
-        <w:t>MainActivity</w:t>
-      </w:r>
-      <w:proofErr w:type="spellEnd"/>
-      <w:r>
-        <w:t>. This will call the load poi function in the view model, loading all the pois from the database into the UI.</w:t>
+        <w:t xml:space="preserve"> holds a plain list of pois instead of being assigned directly from the DAO’s live data since it no longer returns LiveData.</w:t>
+      </w:r>
+    </w:p>
+    <w:p>
+      <w:pPr>
+        <w:ind w:left="720"/>
+      </w:pPr>
+    </w:p>
+    <w:p>
+      <w:pPr>
+        <w:ind w:left="720"/>
+      </w:pPr>
+      <w:r>
+        <w:t>I will then lastly need to add the load buttons to the MainActivity. This will call the load poi function in the view model, loading all the pois from the database into the UI.</w:t>
       </w:r>
     </w:p>
     <w:p>
@@ -4114,31 +3184,7 @@
           <w:sz w:val="24"/>
           <w:szCs w:val="24"/>
         </w:rPr>
-        <w:t xml:space="preserve"> in a text field. This should search the local database. The matching places should appear on the map as markers or circles. </w:t>
-      </w:r>
-      <w:proofErr w:type="gramStart"/>
-      <w:r>
-        <w:rPr>
-          <w:rFonts w:ascii="Trebuchet MS" w:hAnsi="Trebuchet MS"/>
-          <w:i/>
-          <w:iCs/>
-          <w:color w:val="000000"/>
-          <w:sz w:val="24"/>
-          <w:szCs w:val="24"/>
-        </w:rPr>
-        <w:t>Again</w:t>
-      </w:r>
-      <w:proofErr w:type="gramEnd"/>
-      <w:r>
-        <w:rPr>
-          <w:rFonts w:ascii="Trebuchet MS" w:hAnsi="Trebuchet MS"/>
-          <w:i/>
-          <w:iCs/>
-          <w:color w:val="000000"/>
-          <w:sz w:val="24"/>
-          <w:szCs w:val="24"/>
-        </w:rPr>
-        <w:t xml:space="preserve"> a dialog box should appear when the user clicks on each place.”</w:t>
+        <w:t xml:space="preserve"> in a text field. This should search the local database. The matching places should appear on the map as markers or circles. Again a dialog box should appear when the user clicks on each place.”</w:t>
       </w:r>
     </w:p>
     <w:p>
@@ -4284,31 +3330,7 @@
         <w:t>I will next create</w:t>
       </w:r>
       <w:r>
-        <w:t xml:space="preserve"> a new function in the </w:t>
-      </w:r>
-      <w:proofErr w:type="spellStart"/>
-      <w:r>
-        <w:t>ViewModel</w:t>
-      </w:r>
-      <w:proofErr w:type="spellEnd"/>
-      <w:r>
-        <w:t xml:space="preserve">. This will </w:t>
-      </w:r>
-      <w:proofErr w:type="gramStart"/>
-      <w:r>
-        <w:t>use the search</w:t>
-      </w:r>
-      <w:proofErr w:type="gramEnd"/>
-      <w:r>
-        <w:t xml:space="preserve"> by type function from the DAO. This will have the type as a parameter to search with and add the results to the </w:t>
-      </w:r>
-      <w:proofErr w:type="spellStart"/>
-      <w:r>
-        <w:t>pois.value</w:t>
-      </w:r>
-      <w:proofErr w:type="spellEnd"/>
-      <w:r>
-        <w:t>.</w:t>
+        <w:t xml:space="preserve"> a new function in the ViewModel. This will use the search by type function from the DAO. This will have the type as a parameter to search with and add the results to the pois.value.</w:t>
       </w:r>
       <w:r>
         <w:t xml:space="preserve"> This makes it so when a user searches a type, it only displays markers relating to that type. Then to display all the pois again the user will simply need to load the pois again.</w:t>
@@ -4384,31 +3406,7 @@
         </w:drawing>
       </w:r>
       <w:r>
-        <w:t xml:space="preserve">Then I will add an outlined text field to my </w:t>
-      </w:r>
-      <w:proofErr w:type="spellStart"/>
-      <w:r>
-        <w:t>MainActivity</w:t>
-      </w:r>
-      <w:proofErr w:type="spellEnd"/>
-      <w:r>
-        <w:t xml:space="preserve"> which will be used by the user to input the accommodation type that they are searching for. This will then be followed by a button which, when clicked, will take the </w:t>
-      </w:r>
-      <w:proofErr w:type="gramStart"/>
-      <w:r>
-        <w:t>inputted</w:t>
-      </w:r>
-      <w:proofErr w:type="gramEnd"/>
-      <w:r>
-        <w:t xml:space="preserve"> data and call the search pois by type function using the </w:t>
-      </w:r>
-      <w:proofErr w:type="gramStart"/>
-      <w:r>
-        <w:t>inputted</w:t>
-      </w:r>
-      <w:proofErr w:type="gramEnd"/>
-      <w:r>
-        <w:t xml:space="preserve"> data as the parameter.</w:t>
+        <w:t>Then I will add an outlined text field to my MainActivity which will be used by the user to input the accommodation type that they are searching for. This will then be followed by a button which, when clicked, will take the inputted data and call the search pois by type function using the inputted data as the parameter.</w:t>
       </w:r>
     </w:p>
     <w:p/>
@@ -4592,29 +3590,7 @@
           <w:sz w:val="24"/>
           <w:szCs w:val="24"/>
         </w:rPr>
-        <w:t xml:space="preserve">When the POIs are </w:t>
-      </w:r>
-      <w:proofErr w:type="gramStart"/>
-      <w:r>
-        <w:rPr>
-          <w:rFonts w:ascii="Trebuchet MS" w:hAnsi="Trebuchet MS"/>
-          <w:i/>
-          <w:iCs/>
-          <w:sz w:val="24"/>
-          <w:szCs w:val="24"/>
-        </w:rPr>
-        <w:t>loaded</w:t>
-      </w:r>
-      <w:proofErr w:type="gramEnd"/>
-      <w:r>
-        <w:rPr>
-          <w:rFonts w:ascii="Trebuchet MS" w:hAnsi="Trebuchet MS"/>
-          <w:i/>
-          <w:iCs/>
-          <w:sz w:val="24"/>
-          <w:szCs w:val="24"/>
-        </w:rPr>
-        <w:t xml:space="preserve"> they should be shown on the map as markers and saved to the database. To avoid duplicate entries in the database, check whether the point of interest with that ID is already present before adding it.”</w:t>
+        <w:t>When the POIs are loaded they should be shown on the map as markers and saved to the database. To avoid duplicate entries in the database, check whether the point of interest with that ID is already present before adding it.”</w:t>
       </w:r>
     </w:p>
     <w:p>
@@ -4895,35 +3871,7 @@
           <w:sz w:val="24"/>
           <w:szCs w:val="24"/>
         </w:rPr>
-        <w:t xml:space="preserve">On top of this I will need to add </w:t>
-      </w:r>
-      <w:proofErr w:type="spellStart"/>
-      <w:r>
-        <w:rPr>
-          <w:rFonts w:ascii="Trebuchet MS" w:hAnsi="Trebuchet MS"/>
-          <w:sz w:val="24"/>
-          <w:szCs w:val="24"/>
-        </w:rPr>
-        <w:t>usesCleartextTraffic</w:t>
-      </w:r>
-      <w:proofErr w:type="spellEnd"/>
-      <w:proofErr w:type="gramStart"/>
-      <w:r>
-        <w:rPr>
-          <w:rFonts w:ascii="Trebuchet MS" w:hAnsi="Trebuchet MS"/>
-          <w:sz w:val="24"/>
-          <w:szCs w:val="24"/>
-        </w:rPr>
-        <w:t>=”true</w:t>
-      </w:r>
-      <w:proofErr w:type="gramEnd"/>
-      <w:r>
-        <w:rPr>
-          <w:rFonts w:ascii="Trebuchet MS" w:hAnsi="Trebuchet MS"/>
-          <w:sz w:val="24"/>
-          <w:szCs w:val="24"/>
-        </w:rPr>
-        <w:t>” to my application. This is because Android doesn’t allow access to insecure servers (HTTP) which my server is. By using this it disables the restriction allowing my app to communicate with the server.</w:t>
+        <w:t>On top of this I will need to add usesCleartextTraffic=”true” to my application. This is because Android doesn’t allow access to insecure servers (HTTP) which my server is. By using this it disables the restriction allowing my app to communicate with the server.</w:t>
       </w:r>
     </w:p>
     <w:p>
@@ -5109,18 +4057,8 @@
           <w:sz w:val="24"/>
           <w:szCs w:val="24"/>
         </w:rPr>
-        <w:t xml:space="preserve"> as they both currently have different </w:t>
-      </w:r>
-      <w:proofErr w:type="spellStart"/>
-      <w:r>
-        <w:rPr>
-          <w:rFonts w:ascii="Trebuchet MS" w:hAnsi="Trebuchet MS"/>
-          <w:sz w:val="24"/>
-          <w:szCs w:val="24"/>
-        </w:rPr>
-        <w:t>feilds</w:t>
-      </w:r>
-      <w:proofErr w:type="spellEnd"/>
+        <w:t xml:space="preserve"> as they both currently have different feilds</w:t>
+      </w:r>
       <w:r>
         <w:rPr>
           <w:rFonts w:ascii="Trebuchet MS" w:hAnsi="Trebuchet MS"/>
@@ -5377,25 +4315,7 @@
           <w:szCs w:val="24"/>
         </w:rPr>
         <w:lastRenderedPageBreak/>
-        <w:t xml:space="preserve">This will need a new function which I will store within my </w:t>
-      </w:r>
-      <w:proofErr w:type="spellStart"/>
-      <w:r>
-        <w:rPr>
-          <w:rFonts w:ascii="Trebuchet MS" w:hAnsi="Trebuchet MS"/>
-          <w:sz w:val="24"/>
-          <w:szCs w:val="24"/>
-        </w:rPr>
-        <w:t>ViewModel</w:t>
-      </w:r>
-      <w:proofErr w:type="spellEnd"/>
-      <w:r>
-        <w:rPr>
-          <w:rFonts w:ascii="Trebuchet MS" w:hAnsi="Trebuchet MS"/>
-          <w:sz w:val="24"/>
-          <w:szCs w:val="24"/>
-        </w:rPr>
-        <w:t xml:space="preserve">. </w:t>
+        <w:t xml:space="preserve">This will need a new function which I will store within my ViewModel. </w:t>
       </w:r>
       <w:r>
         <w:rPr>
@@ -5419,25 +4339,7 @@
           <w:sz w:val="24"/>
           <w:szCs w:val="24"/>
         </w:rPr>
-        <w:t xml:space="preserve">” </w:t>
-      </w:r>
-      <w:proofErr w:type="spellStart"/>
-      <w:r>
-        <w:rPr>
-          <w:rFonts w:ascii="Trebuchet MS" w:hAnsi="Trebuchet MS"/>
-          <w:sz w:val="24"/>
-          <w:szCs w:val="24"/>
-        </w:rPr>
-        <w:t>url</w:t>
-      </w:r>
-      <w:proofErr w:type="spellEnd"/>
-      <w:r>
-        <w:rPr>
-          <w:rFonts w:ascii="Trebuchet MS" w:hAnsi="Trebuchet MS"/>
-          <w:sz w:val="24"/>
-          <w:szCs w:val="24"/>
-        </w:rPr>
-        <w:t xml:space="preserve"> which will gather all the pois in the web data base. The function will then, within a coroutine so it can handle the database operations, check each poi in the web database and compare its id with the ones in the local database. The ones that have an id which already exists in the local database are skipped to prevent duplicates. </w:t>
+        <w:t xml:space="preserve">” url which will gather all the pois in the web data base. The function will then, within a coroutine so it can handle the database operations, check each poi in the web database and compare its id with the ones in the local database. The ones that have an id which already exists in the local database are skipped to prevent duplicates. </w:t>
       </w:r>
       <w:r>
         <w:rPr>
@@ -5618,43 +4520,7 @@
           <w:sz w:val="24"/>
           <w:szCs w:val="24"/>
         </w:rPr>
-        <w:t xml:space="preserve">Then finally for this task I will need to add a new button </w:t>
-      </w:r>
-      <w:proofErr w:type="gramStart"/>
-      <w:r>
-        <w:rPr>
-          <w:rFonts w:ascii="Trebuchet MS" w:hAnsi="Trebuchet MS"/>
-          <w:sz w:val="24"/>
-          <w:szCs w:val="24"/>
-        </w:rPr>
-        <w:t>in</w:t>
-      </w:r>
-      <w:proofErr w:type="gramEnd"/>
-      <w:r>
-        <w:rPr>
-          <w:rFonts w:ascii="Trebuchet MS" w:hAnsi="Trebuchet MS"/>
-          <w:sz w:val="24"/>
-          <w:szCs w:val="24"/>
-        </w:rPr>
-        <w:t xml:space="preserve"> the </w:t>
-      </w:r>
-      <w:proofErr w:type="spellStart"/>
-      <w:r>
-        <w:rPr>
-          <w:rFonts w:ascii="Trebuchet MS" w:hAnsi="Trebuchet MS"/>
-          <w:sz w:val="24"/>
-          <w:szCs w:val="24"/>
-        </w:rPr>
-        <w:t>MainActivity</w:t>
-      </w:r>
-      <w:proofErr w:type="spellEnd"/>
-      <w:r>
-        <w:rPr>
-          <w:rFonts w:ascii="Trebuchet MS" w:hAnsi="Trebuchet MS"/>
-          <w:sz w:val="24"/>
-          <w:szCs w:val="24"/>
-        </w:rPr>
-        <w:t xml:space="preserve"> which uses the new function.</w:t>
+        <w:t>Then finally for this task I will need to add a new button in the MainActivity which uses the new function.</w:t>
       </w:r>
       <w:r>
         <w:rPr>
@@ -5900,71 +4766,27 @@
           <w:sz w:val="24"/>
           <w:szCs w:val="24"/>
         </w:rPr>
-        <w:t xml:space="preserve">- </w:t>
-      </w:r>
-      <w:proofErr w:type="spellStart"/>
-      <w:r>
-        <w:rPr>
-          <w:rFonts w:ascii="Trebuchet MS" w:hAnsi="Trebuchet MS"/>
-          <w:i/>
-          <w:iCs/>
-          <w:sz w:val="24"/>
-          <w:szCs w:val="24"/>
-        </w:rPr>
-        <w:t>lat</w:t>
-      </w:r>
-      <w:proofErr w:type="spellEnd"/>
-      <w:r>
-        <w:rPr>
-          <w:rFonts w:ascii="Trebuchet MS" w:hAnsi="Trebuchet MS"/>
-          <w:i/>
-          <w:iCs/>
-          <w:sz w:val="24"/>
-          <w:szCs w:val="24"/>
-        </w:rPr>
-        <w:t xml:space="preserve"> (the latitude)</w:t>
-      </w:r>
-    </w:p>
-    <w:p>
-      <w:pPr>
-        <w:rPr>
-          <w:i/>
-          <w:iCs/>
-          <w:sz w:val="24"/>
-          <w:szCs w:val="24"/>
-        </w:rPr>
-      </w:pPr>
-      <w:r>
-        <w:rPr>
-          <w:rFonts w:ascii="Trebuchet MS" w:hAnsi="Trebuchet MS"/>
-          <w:i/>
-          <w:iCs/>
-          <w:sz w:val="24"/>
-          <w:szCs w:val="24"/>
-        </w:rPr>
-        <w:t xml:space="preserve">- </w:t>
-      </w:r>
-      <w:proofErr w:type="spellStart"/>
-      <w:r>
-        <w:rPr>
-          <w:rFonts w:ascii="Trebuchet MS" w:hAnsi="Trebuchet MS"/>
-          <w:i/>
-          <w:iCs/>
-          <w:sz w:val="24"/>
-          <w:szCs w:val="24"/>
-        </w:rPr>
-        <w:t>lon</w:t>
-      </w:r>
-      <w:proofErr w:type="spellEnd"/>
-      <w:r>
-        <w:rPr>
-          <w:rFonts w:ascii="Trebuchet MS" w:hAnsi="Trebuchet MS"/>
-          <w:i/>
-          <w:iCs/>
-          <w:sz w:val="24"/>
-          <w:szCs w:val="24"/>
-        </w:rPr>
-        <w:t xml:space="preserve"> (the longitude).</w:t>
+        <w:t>- lat (the latitude)</w:t>
+      </w:r>
+    </w:p>
+    <w:p>
+      <w:pPr>
+        <w:rPr>
+          <w:i/>
+          <w:iCs/>
+          <w:sz w:val="24"/>
+          <w:szCs w:val="24"/>
+        </w:rPr>
+      </w:pPr>
+      <w:r>
+        <w:rPr>
+          <w:rFonts w:ascii="Trebuchet MS" w:hAnsi="Trebuchet MS"/>
+          <w:i/>
+          <w:iCs/>
+          <w:sz w:val="24"/>
+          <w:szCs w:val="24"/>
+        </w:rPr>
+        <w:t>- lon (the longitude).</w:t>
       </w:r>
     </w:p>
     <w:p>
@@ -6040,28 +4862,7 @@
     </w:p>
     <w:p>
       <w:r>
-        <w:t xml:space="preserve">To start this task, I will need to change my </w:t>
-      </w:r>
-      <w:proofErr w:type="spellStart"/>
-      <w:proofErr w:type="gramStart"/>
-      <w:r>
-        <w:t>addPoi</w:t>
-      </w:r>
-      <w:proofErr w:type="spellEnd"/>
-      <w:r>
-        <w:t>(</w:t>
-      </w:r>
-      <w:proofErr w:type="gramEnd"/>
-      <w:r>
-        <w:t xml:space="preserve">) function in the </w:t>
-      </w:r>
-      <w:proofErr w:type="spellStart"/>
-      <w:r>
-        <w:t>Viewmodel</w:t>
-      </w:r>
-      <w:proofErr w:type="spellEnd"/>
-      <w:r>
-        <w:t xml:space="preserve">. I will change the function so that instead of inserting the poi into the local database straight away it will first POST to the server using </w:t>
+        <w:t xml:space="preserve">To start this task, I will need to change my addPoi() function in the Viewmodel. I will change the function so that instead of inserting the poi into the local database straight away it will first POST to the server using </w:t>
       </w:r>
       <w:r>
         <w:t xml:space="preserve">the </w:t>
@@ -6075,23 +4876,7 @@
         </w:r>
       </w:hyperlink>
       <w:r>
-        <w:t xml:space="preserve"> </w:t>
-      </w:r>
-      <w:proofErr w:type="spellStart"/>
-      <w:r>
-        <w:t>url</w:t>
-      </w:r>
-      <w:proofErr w:type="spellEnd"/>
-      <w:r>
-        <w:t xml:space="preserve">, which will return the ID, then the function will use this ID as the </w:t>
-      </w:r>
-      <w:proofErr w:type="spellStart"/>
-      <w:r>
-        <w:t>webId</w:t>
-      </w:r>
-      <w:proofErr w:type="spellEnd"/>
-      <w:r>
-        <w:t xml:space="preserve"> then save it locally using the poi DAO insert function.. This makes sure that the poi is only added to the local database if it is successfully added to the web data base. This prevents any misalignment between the two databases.</w:t>
+        <w:t xml:space="preserve"> url, which will return the ID, then the function will use this ID as the webId then save it locally using the poi DAO insert function.. This makes sure that the poi is only added to the local database if it is successfully added to the web data base. This prevents any misalignment between the two databases.</w:t>
       </w:r>
     </w:p>
     <w:p/>
@@ -6103,31 +4888,7 @@
     <w:p/>
     <w:p>
       <w:r>
-        <w:t xml:space="preserve">Since the original poi has </w:t>
-      </w:r>
-      <w:proofErr w:type="spellStart"/>
-      <w:r>
-        <w:t>webId</w:t>
-      </w:r>
-      <w:proofErr w:type="spellEnd"/>
-      <w:r>
-        <w:t xml:space="preserve"> set to null, I will </w:t>
-      </w:r>
-      <w:proofErr w:type="gramStart"/>
-      <w:r>
-        <w:t>use .copy</w:t>
-      </w:r>
-      <w:proofErr w:type="gramEnd"/>
-      <w:r>
-        <w:t xml:space="preserve">() to create a new Poi object with the same fields but with the null </w:t>
-      </w:r>
-      <w:proofErr w:type="spellStart"/>
-      <w:r>
-        <w:t>webId</w:t>
-      </w:r>
-      <w:proofErr w:type="spellEnd"/>
-      <w:r>
-        <w:t xml:space="preserve"> replaced by the ID returned by the server. The original poi </w:t>
+        <w:t xml:space="preserve">Since the original poi has webId set to null, I will use .copy() to create a new Poi object with the same fields but with the null webId replaced by the ID returned by the server. The original poi </w:t>
       </w:r>
       <w:r>
         <w:t>will then be removed</w:t>
@@ -6139,15 +4900,7 @@
         <w:t xml:space="preserve">makes sure </w:t>
       </w:r>
       <w:r>
-        <w:t xml:space="preserve">that the record saved to the local database has a </w:t>
-      </w:r>
-      <w:proofErr w:type="spellStart"/>
-      <w:r>
-        <w:t>webId</w:t>
-      </w:r>
-      <w:proofErr w:type="spellEnd"/>
-      <w:r>
-        <w:t xml:space="preserve"> that matches the server</w:t>
+        <w:t>that the record saved to the local database has a webId that matches the server</w:t>
       </w:r>
       <w:r>
         <w:t>.</w:t>
@@ -6278,137 +5031,60 @@
         <w:t>These will be t</w:t>
       </w:r>
       <w:r>
-        <w:t xml:space="preserve">he </w:t>
-      </w:r>
-      <w:proofErr w:type="spellStart"/>
-      <w:r>
-        <w:t>topBar</w:t>
-      </w:r>
-      <w:proofErr w:type="spellEnd"/>
-      <w:r>
-        <w:t xml:space="preserve"> parameter </w:t>
+        <w:t xml:space="preserve">he topBar parameter </w:t>
       </w:r>
       <w:r>
         <w:t xml:space="preserve">which </w:t>
       </w:r>
       <w:r>
-        <w:t xml:space="preserve">will contain a </w:t>
-      </w:r>
-      <w:proofErr w:type="spellStart"/>
-      <w:r>
-        <w:t>TopAppBar</w:t>
-      </w:r>
-      <w:proofErr w:type="spellEnd"/>
-      <w:r>
-        <w:t xml:space="preserve"> composable </w:t>
+        <w:t xml:space="preserve">will contain a TopAppBar composable </w:t>
       </w:r>
       <w:r>
         <w:t>showing</w:t>
       </w:r>
       <w:r>
-        <w:t xml:space="preserve"> the app name and a hamburger menu </w:t>
-      </w:r>
-      <w:proofErr w:type="spellStart"/>
-      <w:r>
-        <w:t>IconButton</w:t>
-      </w:r>
-      <w:proofErr w:type="spellEnd"/>
+        <w:t xml:space="preserve"> the app name and a hamburger menu IconButton </w:t>
+      </w:r>
+      <w:r>
+        <w:t xml:space="preserve">which </w:t>
+      </w:r>
+      <w:r>
+        <w:t xml:space="preserve">when clicked will use </w:t>
+      </w:r>
+      <w:r>
+        <w:t xml:space="preserve">a </w:t>
+      </w:r>
+      <w:r>
+        <w:t>coroutineScope.launch to call drawerState.open(), which will</w:t>
+      </w:r>
+      <w:r>
+        <w:t xml:space="preserve"> then</w:t>
+      </w:r>
+      <w:r>
+        <w:t xml:space="preserve"> open the ModalNavigationDrawer. </w:t>
+      </w:r>
+      <w:r>
+        <w:t>I will wrap t</w:t>
+      </w:r>
+      <w:r>
+        <w:t>he drawer around the entire NavHost block rather than just the map screen's Scaffold, because it needs to be able to slide over all content.</w:t>
+      </w:r>
+    </w:p>
+    <w:p>
+      <w:pPr>
+        <w:ind w:left="720"/>
+      </w:pPr>
+      <w:r>
+        <w:t>I will make it so</w:t>
+      </w:r>
       <w:r>
         <w:t xml:space="preserve"> </w:t>
       </w:r>
       <w:r>
-        <w:t xml:space="preserve">which </w:t>
-      </w:r>
-      <w:r>
-        <w:t xml:space="preserve">when clicked will use </w:t>
-      </w:r>
-      <w:r>
-        <w:t xml:space="preserve">a </w:t>
-      </w:r>
-      <w:proofErr w:type="spellStart"/>
-      <w:r>
-        <w:t>coroutineScope.launch</w:t>
-      </w:r>
-      <w:proofErr w:type="spellEnd"/>
-      <w:r>
-        <w:t xml:space="preserve"> to call </w:t>
-      </w:r>
-      <w:proofErr w:type="spellStart"/>
-      <w:r>
-        <w:t>drawerState.open</w:t>
-      </w:r>
-      <w:proofErr w:type="spellEnd"/>
-      <w:r>
-        <w:t>(), which will</w:t>
-      </w:r>
-      <w:r>
-        <w:t xml:space="preserve"> then</w:t>
-      </w:r>
-      <w:r>
-        <w:t xml:space="preserve"> open the </w:t>
-      </w:r>
-      <w:proofErr w:type="spellStart"/>
-      <w:r>
-        <w:t>ModalNavigationDrawer</w:t>
-      </w:r>
-      <w:proofErr w:type="spellEnd"/>
-      <w:r>
-        <w:t xml:space="preserve">. </w:t>
-      </w:r>
-      <w:r>
-        <w:t>I will wrap t</w:t>
-      </w:r>
-      <w:r>
-        <w:t xml:space="preserve">he drawer around the entire </w:t>
-      </w:r>
-      <w:proofErr w:type="spellStart"/>
-      <w:r>
-        <w:t>NavHost</w:t>
-      </w:r>
-      <w:proofErr w:type="spellEnd"/>
-      <w:r>
-        <w:t xml:space="preserve"> block rather than just the map screen's Scaffold, because it needs to be able to slide over all content.</w:t>
-      </w:r>
-    </w:p>
-    <w:p>
-      <w:pPr>
-        <w:ind w:left="720"/>
-      </w:pPr>
-      <w:r>
-        <w:t>I will make it so</w:t>
-      </w:r>
-      <w:r>
-        <w:t xml:space="preserve"> </w:t>
-      </w:r>
-      <w:r>
         <w:t>e</w:t>
       </w:r>
       <w:r>
-        <w:t xml:space="preserve">ach </w:t>
-      </w:r>
-      <w:proofErr w:type="spellStart"/>
-      <w:r>
-        <w:t>NavigationDrawerItem</w:t>
-      </w:r>
-      <w:proofErr w:type="spellEnd"/>
-      <w:r>
-        <w:t xml:space="preserve"> inside the </w:t>
-      </w:r>
-      <w:proofErr w:type="spellStart"/>
-      <w:r>
-        <w:t>ModalDrawerSheet</w:t>
-      </w:r>
-      <w:proofErr w:type="spellEnd"/>
-      <w:r>
-        <w:t xml:space="preserve"> will call </w:t>
-      </w:r>
-      <w:proofErr w:type="spellStart"/>
-      <w:r>
-        <w:t>drawerState.close</w:t>
-      </w:r>
-      <w:proofErr w:type="spellEnd"/>
-      <w:r>
-        <w:t xml:space="preserve">() in a coroutine before navigating, </w:t>
+        <w:t xml:space="preserve">ach NavigationDrawerItem inside the ModalDrawerSheet will call drawerState.close() in a coroutine before navigating, </w:t>
       </w:r>
       <w:r>
         <w:t xml:space="preserve">this is </w:t>
@@ -6551,43 +5227,14 @@
         <w:t>The next parameter will be the</w:t>
       </w:r>
       <w:r>
-        <w:t xml:space="preserve"> </w:t>
-      </w:r>
-      <w:proofErr w:type="spellStart"/>
-      <w:r>
-        <w:t>bottomBar</w:t>
-      </w:r>
-      <w:proofErr w:type="spellEnd"/>
-      <w:r>
-        <w:t xml:space="preserve"> parameter </w:t>
+        <w:t xml:space="preserve"> bottomBar parameter </w:t>
       </w:r>
       <w:r>
         <w:t xml:space="preserve">which </w:t>
       </w:r>
       <w:r>
-        <w:t xml:space="preserve">will contain a </w:t>
-      </w:r>
-      <w:proofErr w:type="spellStart"/>
-      <w:r>
-        <w:t>NavigationBar</w:t>
-      </w:r>
-      <w:proofErr w:type="spellEnd"/>
-      <w:r>
-        <w:t xml:space="preserve"> with two </w:t>
-      </w:r>
-      <w:proofErr w:type="spellStart"/>
-      <w:r>
-        <w:t>NavigationBarItem</w:t>
-      </w:r>
-      <w:proofErr w:type="spellEnd"/>
-      <w:r>
-        <w:t xml:space="preserve"> </w:t>
-      </w:r>
-      <w:proofErr w:type="spellStart"/>
-      <w:r>
-        <w:t>composables</w:t>
-      </w:r>
-      <w:proofErr w:type="spellEnd"/>
+        <w:t>will contain a NavigationBar with two NavigationBarItem composables</w:t>
+      </w:r>
       <w:r>
         <w:t>,</w:t>
       </w:r>
@@ -6787,15 +5434,7 @@
         <w:t>I will then add a</w:t>
       </w:r>
       <w:r>
-        <w:t xml:space="preserve"> </w:t>
-      </w:r>
-      <w:proofErr w:type="spellStart"/>
-      <w:r>
-        <w:t>floatingActionButton</w:t>
-      </w:r>
-      <w:proofErr w:type="spellEnd"/>
-      <w:r>
-        <w:t xml:space="preserve"> </w:t>
+        <w:t xml:space="preserve"> floatingActionButton </w:t>
       </w:r>
       <w:r>
         <w:t xml:space="preserve">as the last </w:t>
@@ -6807,31 +5446,13 @@
         <w:t xml:space="preserve">which </w:t>
       </w:r>
       <w:r>
-        <w:t xml:space="preserve">will contain a </w:t>
-      </w:r>
-      <w:proofErr w:type="spellStart"/>
-      <w:r>
-        <w:t>FloatingActionButton</w:t>
-      </w:r>
-      <w:proofErr w:type="spellEnd"/>
-      <w:r>
-        <w:t xml:space="preserve"> with </w:t>
+        <w:t xml:space="preserve">will contain a FloatingActionButton with </w:t>
       </w:r>
       <w:r>
         <w:t>an</w:t>
       </w:r>
       <w:r>
-        <w:t xml:space="preserve"> </w:t>
-      </w:r>
-      <w:proofErr w:type="spellStart"/>
-      <w:proofErr w:type="gramStart"/>
-      <w:r>
-        <w:t>Icons.Filled.Add</w:t>
-      </w:r>
-      <w:proofErr w:type="spellEnd"/>
-      <w:proofErr w:type="gramEnd"/>
-      <w:r>
-        <w:t xml:space="preserve"> icon that </w:t>
+        <w:t xml:space="preserve"> Icons.Filled.Add icon that </w:t>
       </w:r>
       <w:r>
         <w:t xml:space="preserve">will </w:t>
@@ -6843,15 +5464,7 @@
         <w:t xml:space="preserve"> the user</w:t>
       </w:r>
       <w:r>
-        <w:t xml:space="preserve"> to the </w:t>
-      </w:r>
-      <w:proofErr w:type="spellStart"/>
-      <w:r>
-        <w:t>addPoi</w:t>
-      </w:r>
-      <w:proofErr w:type="spellEnd"/>
-      <w:r>
-        <w:t xml:space="preserve"> route</w:t>
+        <w:t xml:space="preserve"> to the addPoi route</w:t>
       </w:r>
       <w:r>
         <w:t>.</w:t>
@@ -6935,53 +5548,14 @@
       <w:r>
         <w:t xml:space="preserve"> </w:t>
       </w:r>
-      <w:proofErr w:type="spellStart"/>
-      <w:proofErr w:type="gramStart"/>
-      <w:r>
-        <w:t>OptIn</w:t>
-      </w:r>
-      <w:proofErr w:type="spellEnd"/>
-      <w:r>
-        <w:t>(</w:t>
-      </w:r>
-      <w:proofErr w:type="gramEnd"/>
-      <w:r>
-        <w:t>ExperimentalMaterial3</w:t>
-      </w:r>
-      <w:proofErr w:type="gramStart"/>
-      <w:r>
-        <w:t>Api::</w:t>
-      </w:r>
-      <w:proofErr w:type="gramEnd"/>
-      <w:r>
-        <w:t>class)</w:t>
-      </w:r>
-      <w:r>
-        <w:t xml:space="preserve"> before the </w:t>
-      </w:r>
-      <w:proofErr w:type="spellStart"/>
-      <w:proofErr w:type="gramStart"/>
-      <w:r>
-        <w:t>onCreate</w:t>
-      </w:r>
-      <w:proofErr w:type="spellEnd"/>
-      <w:r>
-        <w:t>(</w:t>
-      </w:r>
-      <w:proofErr w:type="gramEnd"/>
-      <w:r>
-        <w:t xml:space="preserve">) as </w:t>
-      </w:r>
-      <w:r>
-        <w:t xml:space="preserve">the </w:t>
-      </w:r>
-      <w:proofErr w:type="spellStart"/>
-      <w:r>
-        <w:t>TopAppBar</w:t>
-      </w:r>
-      <w:proofErr w:type="spellEnd"/>
-      <w:r>
-        <w:t xml:space="preserve"> is still experimental</w:t>
+      <w:r>
+        <w:t>OptIn(ExperimentalMaterial3Api::class)</w:t>
+      </w:r>
+      <w:r>
+        <w:t xml:space="preserve"> before the onCreate() as </w:t>
+      </w:r>
+      <w:r>
+        <w:t>the TopAppBar is still experimental</w:t>
       </w:r>
       <w:r>
         <w:t>.</w:t>
@@ -7033,40 +5607,7 @@
           <w:sz w:val="24"/>
           <w:szCs w:val="24"/>
         </w:rPr>
-        <w:t xml:space="preserve"> </w:t>
-      </w:r>
-      <w:r>
-        <w:rPr>
-          <w:rFonts w:ascii="Trebuchet MS" w:hAnsi="Trebuchet MS"/>
-          <w:i/>
-          <w:iCs/>
-          <w:color w:val="000000"/>
-          <w:sz w:val="24"/>
-          <w:szCs w:val="24"/>
-        </w:rPr>
-        <w:t>“</w:t>
-      </w:r>
-      <w:r>
-        <w:rPr>
-          <w:rFonts w:ascii="Trebuchet MS" w:hAnsi="Trebuchet MS"/>
-          <w:i/>
-          <w:iCs/>
-          <w:color w:val="000000"/>
-          <w:sz w:val="24"/>
-          <w:szCs w:val="24"/>
-        </w:rPr>
-        <w:t>Enhance your UI to allow the user to review a point of interest, within the dialog which appears when the user clicks a marker or circle on the map. There should be a review text field and review button on the dialog.</w:t>
-      </w:r>
-      <w:r>
-        <w:rPr>
-          <w:rFonts w:ascii="Trebuchet MS" w:hAnsi="Trebuchet MS"/>
-          <w:i/>
-          <w:iCs/>
-          <w:color w:val="000000"/>
-          <w:sz w:val="24"/>
-          <w:szCs w:val="24"/>
-        </w:rPr>
-        <w:t>”</w:t>
+        <w:t xml:space="preserve"> “Enhance your UI to allow the user to review a point of interest, within the dialog which appears when the user clicks a marker or circle on the map. There should be a review text field and review button on the dialog.”</w:t>
       </w:r>
     </w:p>
     <w:p>
@@ -7150,9 +5691,8 @@
           <w:sz w:val="24"/>
           <w:szCs w:val="24"/>
         </w:rPr>
-        <w:t xml:space="preserve">I will begin by adding a new function to my </w:t>
-      </w:r>
-      <w:proofErr w:type="spellStart"/>
+        <w:t xml:space="preserve">I will begin by adding a new function to my ViewModel which will use the /review/create </w:t>
+      </w:r>
       <w:r>
         <w:rPr>
           <w:rFonts w:ascii="Trebuchet MS" w:hAnsi="Trebuchet MS"/>
@@ -7160,208 +5700,149 @@
           <w:sz w:val="24"/>
           <w:szCs w:val="24"/>
         </w:rPr>
-        <w:t>ViewModel</w:t>
-      </w:r>
-      <w:proofErr w:type="spellEnd"/>
-      <w:r>
+        <w:t>POST route sending the POI web ID and the review. This should display an error in the console if one has occurred and should also display a message indicating that the review had been added successfully.</w:t>
+      </w:r>
+      <w:r>
+        <w:rPr>
+          <w:noProof/>
+        </w:rPr>
+        <w:t xml:space="preserve"> </w:t>
+      </w:r>
+    </w:p>
+    <w:p>
+      <w:pPr>
+        <w:ind w:left="720"/>
         <w:rPr>
           <w:rFonts w:ascii="Trebuchet MS" w:hAnsi="Trebuchet MS"/>
           <w:color w:val="000000"/>
           <w:sz w:val="24"/>
           <w:szCs w:val="24"/>
         </w:rPr>
-        <w:t xml:space="preserve"> which will use the /review/create </w:t>
-      </w:r>
-      <w:r>
+      </w:pPr>
+    </w:p>
+    <w:p>
+      <w:pPr>
+        <w:ind w:left="720"/>
         <w:rPr>
           <w:rFonts w:ascii="Trebuchet MS" w:hAnsi="Trebuchet MS"/>
           <w:color w:val="000000"/>
           <w:sz w:val="24"/>
           <w:szCs w:val="24"/>
         </w:rPr>
-        <w:t>POST route sending the POI web ID and the review. This should display an error in the console if one has occurred and should also display a message indicating that the review had been added successfully.</w:t>
-      </w:r>
-      <w:r>
-        <w:rPr>
-          <w:noProof/>
+      </w:pPr>
+    </w:p>
+    <w:p>
+      <w:pPr>
+        <w:ind w:left="720"/>
+        <w:rPr>
+          <w:rFonts w:ascii="Trebuchet MS" w:hAnsi="Trebuchet MS"/>
+          <w:color w:val="000000"/>
+          <w:sz w:val="24"/>
+          <w:szCs w:val="24"/>
+        </w:rPr>
+      </w:pPr>
+    </w:p>
+    <w:p>
+      <w:pPr>
+        <w:ind w:left="720"/>
+        <w:rPr>
+          <w:rFonts w:ascii="Trebuchet MS" w:hAnsi="Trebuchet MS"/>
+          <w:color w:val="000000"/>
+          <w:sz w:val="24"/>
+          <w:szCs w:val="24"/>
+        </w:rPr>
+      </w:pPr>
+    </w:p>
+    <w:p>
+      <w:pPr>
+        <w:ind w:left="720"/>
+        <w:rPr>
+          <w:rFonts w:ascii="Trebuchet MS" w:hAnsi="Trebuchet MS"/>
+          <w:color w:val="000000"/>
+          <w:sz w:val="24"/>
+          <w:szCs w:val="24"/>
+        </w:rPr>
+      </w:pPr>
+    </w:p>
+    <w:p>
+      <w:pPr>
+        <w:ind w:left="720"/>
+        <w:rPr>
+          <w:sz w:val="24"/>
+          <w:szCs w:val="24"/>
+        </w:rPr>
+      </w:pPr>
+      <w:r>
+        <w:rPr>
+          <w:rFonts w:ascii="Trebuchet MS" w:hAnsi="Trebuchet MS"/>
+          <w:color w:val="000000"/>
+          <w:sz w:val="24"/>
+          <w:szCs w:val="24"/>
+        </w:rPr>
+        <w:t xml:space="preserve">I will then update the AlertDialog for each of the markers to include a text field </w:t>
+      </w:r>
+      <w:r>
+        <w:rPr>
+          <w:rFonts w:ascii="Trebuchet MS" w:hAnsi="Trebuchet MS"/>
+          <w:color w:val="000000"/>
+          <w:sz w:val="24"/>
+          <w:szCs w:val="24"/>
+        </w:rPr>
+        <w:t>accompanied</w:t>
+      </w:r>
+      <w:r>
+        <w:rPr>
+          <w:rFonts w:ascii="Trebuchet MS" w:hAnsi="Trebuchet MS"/>
+          <w:color w:val="000000"/>
+          <w:sz w:val="24"/>
+          <w:szCs w:val="24"/>
         </w:rPr>
         <w:t xml:space="preserve"> </w:t>
       </w:r>
-    </w:p>
-    <w:p>
-      <w:pPr>
-        <w:ind w:left="720"/>
+      <w:r>
         <w:rPr>
           <w:rFonts w:ascii="Trebuchet MS" w:hAnsi="Trebuchet MS"/>
           <w:color w:val="000000"/>
           <w:sz w:val="24"/>
           <w:szCs w:val="24"/>
         </w:rPr>
-      </w:pPr>
-    </w:p>
-    <w:p>
-      <w:pPr>
-        <w:ind w:left="720"/>
+        <w:t>by</w:t>
+      </w:r>
+      <w:r>
         <w:rPr>
           <w:rFonts w:ascii="Trebuchet MS" w:hAnsi="Trebuchet MS"/>
           <w:color w:val="000000"/>
           <w:sz w:val="24"/>
           <w:szCs w:val="24"/>
         </w:rPr>
-      </w:pPr>
-    </w:p>
-    <w:p>
-      <w:pPr>
-        <w:ind w:left="720"/>
+        <w:t xml:space="preserve"> a button. The button, when clicked, will check if the </w:t>
+      </w:r>
+      <w:r>
         <w:rPr>
           <w:rFonts w:ascii="Trebuchet MS" w:hAnsi="Trebuchet MS"/>
           <w:color w:val="000000"/>
           <w:sz w:val="24"/>
           <w:szCs w:val="24"/>
         </w:rPr>
-      </w:pPr>
-    </w:p>
-    <w:p>
-      <w:pPr>
-        <w:ind w:left="720"/>
+        <w:t>text field</w:t>
+      </w:r>
+      <w:r>
         <w:rPr>
           <w:rFonts w:ascii="Trebuchet MS" w:hAnsi="Trebuchet MS"/>
           <w:color w:val="000000"/>
           <w:sz w:val="24"/>
           <w:szCs w:val="24"/>
         </w:rPr>
-      </w:pPr>
-    </w:p>
-    <w:p>
-      <w:pPr>
-        <w:ind w:left="720"/>
+        <w:t xml:space="preserve"> is blank or if the poi doesn’t have a web ID. If it passes all the checks then the button calls the</w:t>
+      </w:r>
+      <w:r>
         <w:rPr>
           <w:rFonts w:ascii="Trebuchet MS" w:hAnsi="Trebuchet MS"/>
           <w:color w:val="000000"/>
           <w:sz w:val="24"/>
           <w:szCs w:val="24"/>
         </w:rPr>
-      </w:pPr>
-    </w:p>
-    <w:p>
-      <w:pPr>
-        <w:ind w:left="720"/>
-        <w:rPr>
-          <w:sz w:val="24"/>
-          <w:szCs w:val="24"/>
-        </w:rPr>
-      </w:pPr>
-      <w:r>
-        <w:rPr>
-          <w:rFonts w:ascii="Trebuchet MS" w:hAnsi="Trebuchet MS"/>
-          <w:color w:val="000000"/>
-          <w:sz w:val="24"/>
-          <w:szCs w:val="24"/>
-        </w:rPr>
-        <w:t xml:space="preserve">I will then update the </w:t>
-      </w:r>
-      <w:proofErr w:type="spellStart"/>
-      <w:r>
-        <w:rPr>
-          <w:rFonts w:ascii="Trebuchet MS" w:hAnsi="Trebuchet MS"/>
-          <w:color w:val="000000"/>
-          <w:sz w:val="24"/>
-          <w:szCs w:val="24"/>
-        </w:rPr>
-        <w:t>AlertDialog</w:t>
-      </w:r>
-      <w:proofErr w:type="spellEnd"/>
-      <w:r>
-        <w:rPr>
-          <w:rFonts w:ascii="Trebuchet MS" w:hAnsi="Trebuchet MS"/>
-          <w:color w:val="000000"/>
-          <w:sz w:val="24"/>
-          <w:szCs w:val="24"/>
-        </w:rPr>
-        <w:t xml:space="preserve"> for each of the markers to include a text field </w:t>
-      </w:r>
-      <w:r>
-        <w:rPr>
-          <w:rFonts w:ascii="Trebuchet MS" w:hAnsi="Trebuchet MS"/>
-          <w:color w:val="000000"/>
-          <w:sz w:val="24"/>
-          <w:szCs w:val="24"/>
-        </w:rPr>
-        <w:t>accompanied</w:t>
-      </w:r>
-      <w:r>
-        <w:rPr>
-          <w:rFonts w:ascii="Trebuchet MS" w:hAnsi="Trebuchet MS"/>
-          <w:color w:val="000000"/>
-          <w:sz w:val="24"/>
-          <w:szCs w:val="24"/>
-        </w:rPr>
-        <w:t xml:space="preserve"> </w:t>
-      </w:r>
-      <w:r>
-        <w:rPr>
-          <w:rFonts w:ascii="Trebuchet MS" w:hAnsi="Trebuchet MS"/>
-          <w:color w:val="000000"/>
-          <w:sz w:val="24"/>
-          <w:szCs w:val="24"/>
-        </w:rPr>
-        <w:t>by</w:t>
-      </w:r>
-      <w:r>
-        <w:rPr>
-          <w:rFonts w:ascii="Trebuchet MS" w:hAnsi="Trebuchet MS"/>
-          <w:color w:val="000000"/>
-          <w:sz w:val="24"/>
-          <w:szCs w:val="24"/>
-        </w:rPr>
-        <w:t xml:space="preserve"> a button. The button, when clicked, will check if the </w:t>
-      </w:r>
-      <w:r>
-        <w:rPr>
-          <w:rFonts w:ascii="Trebuchet MS" w:hAnsi="Trebuchet MS"/>
-          <w:color w:val="000000"/>
-          <w:sz w:val="24"/>
-          <w:szCs w:val="24"/>
-        </w:rPr>
-        <w:t>text field</w:t>
-      </w:r>
-      <w:r>
-        <w:rPr>
-          <w:rFonts w:ascii="Trebuchet MS" w:hAnsi="Trebuchet MS"/>
-          <w:color w:val="000000"/>
-          <w:sz w:val="24"/>
-          <w:szCs w:val="24"/>
-        </w:rPr>
-        <w:t xml:space="preserve"> is blank or if the poi doesn’t have a web ID. If it passes all the checks then the button calls the</w:t>
-      </w:r>
-      <w:r>
-        <w:rPr>
-          <w:rFonts w:ascii="Trebuchet MS" w:hAnsi="Trebuchet MS"/>
-          <w:color w:val="000000"/>
-          <w:sz w:val="24"/>
-          <w:szCs w:val="24"/>
-        </w:rPr>
-        <w:t xml:space="preserve"> function that sends the review including the </w:t>
-      </w:r>
-      <w:proofErr w:type="spellStart"/>
-      <w:r>
-        <w:rPr>
-          <w:rFonts w:ascii="Trebuchet MS" w:hAnsi="Trebuchet MS"/>
-          <w:color w:val="000000"/>
-          <w:sz w:val="24"/>
-          <w:szCs w:val="24"/>
-        </w:rPr>
-        <w:t>webId</w:t>
-      </w:r>
-      <w:proofErr w:type="spellEnd"/>
-      <w:r>
-        <w:rPr>
-          <w:rFonts w:ascii="Trebuchet MS" w:hAnsi="Trebuchet MS"/>
-          <w:color w:val="000000"/>
-          <w:sz w:val="24"/>
-          <w:szCs w:val="24"/>
-        </w:rPr>
-        <w:t xml:space="preserve"> and review text as the parameters. </w:t>
+        <w:t xml:space="preserve"> function that sends the review including the webId and review text as the parameters. </w:t>
       </w:r>
     </w:p>
     <w:p>
@@ -7430,7 +5911,85 @@
         <w:tab/>
       </w:r>
     </w:p>
-    <w:p/>
+    <w:p>
+      <w:r>
+        <w:rPr>
+          <w:noProof/>
+        </w:rPr>
+        <w:drawing>
+          <wp:anchor distT="0" distB="0" distL="114300" distR="114300" simplePos="0" relativeHeight="251711488" behindDoc="0" locked="0" layoutInCell="1" allowOverlap="1" wp14:anchorId="3F605B9E" wp14:editId="3CFD4C6D">
+            <wp:simplePos x="0" y="0"/>
+            <wp:positionH relativeFrom="margin">
+              <wp:align>center</wp:align>
+            </wp:positionH>
+            <wp:positionV relativeFrom="paragraph">
+              <wp:posOffset>1256665</wp:posOffset>
+            </wp:positionV>
+            <wp:extent cx="1114425" cy="447675"/>
+            <wp:effectExtent l="0" t="0" r="9525" b="9525"/>
+            <wp:wrapTopAndBottom/>
+            <wp:docPr id="343698587" name="Picture 1"/>
+            <wp:cNvGraphicFramePr>
+              <a:graphicFrameLocks xmlns:a="http://schemas.openxmlformats.org/drawingml/2006/main" noChangeAspect="1"/>
+            </wp:cNvGraphicFramePr>
+            <a:graphic xmlns:a="http://schemas.openxmlformats.org/drawingml/2006/main">
+              <a:graphicData uri="http://schemas.openxmlformats.org/drawingml/2006/picture">
+                <pic:pic xmlns:pic="http://schemas.openxmlformats.org/drawingml/2006/picture">
+                  <pic:nvPicPr>
+                    <pic:cNvPr id="343698587" name=""/>
+                    <pic:cNvPicPr/>
+                  </pic:nvPicPr>
+                  <pic:blipFill>
+                    <a:blip r:embed="rId57">
+                      <a:extLst>
+                        <a:ext uri="{28A0092B-C50C-407E-A947-70E740481C1C}">
+                          <a14:useLocalDpi xmlns:a14="http://schemas.microsoft.com/office/drawing/2010/main" val="0"/>
+                        </a:ext>
+                      </a:extLst>
+                    </a:blip>
+                    <a:stretch>
+                      <a:fillRect/>
+                    </a:stretch>
+                  </pic:blipFill>
+                  <pic:spPr>
+                    <a:xfrm>
+                      <a:off x="0" y="0"/>
+                      <a:ext cx="1114425" cy="447675"/>
+                    </a:xfrm>
+                    <a:prstGeom prst="rect">
+                      <a:avLst/>
+                    </a:prstGeom>
+                  </pic:spPr>
+                </pic:pic>
+              </a:graphicData>
+            </a:graphic>
+          </wp:anchor>
+        </w:drawing>
+      </w:r>
+      <w:r>
+        <w:t xml:space="preserve">Reviewing the assignment brief I noticed its states that </w:t>
+      </w:r>
+      <w:r>
+        <w:rPr>
+          <w:i/>
+          <w:iCs/>
+        </w:rPr>
+        <w:t>“It must be buildable and runnable on recent versions of Android Studio (Narwhal or Otter).”</w:t>
+      </w:r>
+      <w:r>
+        <w:rPr>
+          <w:i/>
+          <w:iCs/>
+        </w:rPr>
+        <w:t xml:space="preserve"> </w:t>
+      </w:r>
+      <w:r>
+        <w:t>However, I had been coding on the very latest android studio panda 2. Looking at the android studio web, this is an issue as panda 2 uses apg’s from 4.0 – 9.1 (9.1 being the apg I was using) whereas Narwhal and Otter use an apg from 4.0-8.13 meaning my apg would not work on the software used in grading. I fixed this by simply changing the apg version and updating any necessary files</w:t>
+      </w:r>
+      <w:r>
+        <w:t>.</w:t>
+      </w:r>
+    </w:p>
     <w:sectPr>
       <w:pgSz w:w="12240" w:h="15840"/>
       <w:pgMar w:top="1440" w:right="1440" w:bottom="1440" w:left="1440" w:header="720" w:footer="720" w:gutter="0"/>

</xml_diff>

<commit_message>
Fixed bug when search poi by type
</commit_message>
<xml_diff>
--- a/MAD_Report.docx
+++ b/MAD_Report.docx
@@ -373,7 +373,73 @@
           <w:sz w:val="24"/>
           <w:szCs w:val="24"/>
         </w:rPr>
-        <w:t>I will first start with this task by setting up the dependencies in my build.gradle and libs.versions.toml files. I will add MapLibre with Vulkan support, the Ramani Maps Compose wrapper, and the standard AndroidX libraries needed for Compose.</w:t>
+        <w:t xml:space="preserve">I will first start with this task by setting up the dependencies in my </w:t>
+      </w:r>
+      <w:proofErr w:type="spellStart"/>
+      <w:proofErr w:type="gramStart"/>
+      <w:r>
+        <w:rPr>
+          <w:rFonts w:ascii="Trebuchet MS" w:eastAsia="Trebuchet MS" w:hAnsi="Trebuchet MS" w:cs="Trebuchet MS"/>
+          <w:sz w:val="24"/>
+          <w:szCs w:val="24"/>
+        </w:rPr>
+        <w:t>build.gradle</w:t>
+      </w:r>
+      <w:proofErr w:type="spellEnd"/>
+      <w:proofErr w:type="gramEnd"/>
+      <w:r>
+        <w:rPr>
+          <w:rFonts w:ascii="Trebuchet MS" w:eastAsia="Trebuchet MS" w:hAnsi="Trebuchet MS" w:cs="Trebuchet MS"/>
+          <w:sz w:val="24"/>
+          <w:szCs w:val="24"/>
+        </w:rPr>
+        <w:t xml:space="preserve"> and </w:t>
+      </w:r>
+      <w:proofErr w:type="spellStart"/>
+      <w:proofErr w:type="gramStart"/>
+      <w:r>
+        <w:rPr>
+          <w:rFonts w:ascii="Trebuchet MS" w:eastAsia="Trebuchet MS" w:hAnsi="Trebuchet MS" w:cs="Trebuchet MS"/>
+          <w:sz w:val="24"/>
+          <w:szCs w:val="24"/>
+        </w:rPr>
+        <w:t>libs.versions</w:t>
+      </w:r>
+      <w:proofErr w:type="gramEnd"/>
+      <w:r>
+        <w:rPr>
+          <w:rFonts w:ascii="Trebuchet MS" w:eastAsia="Trebuchet MS" w:hAnsi="Trebuchet MS" w:cs="Trebuchet MS"/>
+          <w:sz w:val="24"/>
+          <w:szCs w:val="24"/>
+        </w:rPr>
+        <w:t>.toml</w:t>
+      </w:r>
+      <w:proofErr w:type="spellEnd"/>
+      <w:r>
+        <w:rPr>
+          <w:rFonts w:ascii="Trebuchet MS" w:eastAsia="Trebuchet MS" w:hAnsi="Trebuchet MS" w:cs="Trebuchet MS"/>
+          <w:sz w:val="24"/>
+          <w:szCs w:val="24"/>
+        </w:rPr>
+        <w:t xml:space="preserve"> files. I will add </w:t>
+      </w:r>
+      <w:proofErr w:type="spellStart"/>
+      <w:r>
+        <w:rPr>
+          <w:rFonts w:ascii="Trebuchet MS" w:eastAsia="Trebuchet MS" w:hAnsi="Trebuchet MS" w:cs="Trebuchet MS"/>
+          <w:sz w:val="24"/>
+          <w:szCs w:val="24"/>
+        </w:rPr>
+        <w:t>MapLibre</w:t>
+      </w:r>
+      <w:proofErr w:type="spellEnd"/>
+      <w:r>
+        <w:rPr>
+          <w:rFonts w:ascii="Trebuchet MS" w:eastAsia="Trebuchet MS" w:hAnsi="Trebuchet MS" w:cs="Trebuchet MS"/>
+          <w:sz w:val="24"/>
+          <w:szCs w:val="24"/>
+        </w:rPr>
+        <w:t xml:space="preserve"> with Vulkan support, the Ramani Maps Compose wrapper, and the standard AndroidX libraries needed for Compose.</w:t>
       </w:r>
       <w:r>
         <w:rPr>
@@ -506,7 +572,25 @@
           <w:sz w:val="24"/>
           <w:szCs w:val="24"/>
         </w:rPr>
-        <w:t>Then in the AndroidManifest.xml, I will set up the ACCESS_FINE_LOCATION and ACCESS_COARSE_LOCATION permissions, as well as INTERNET, since the map tiles will be gathered remotely from OpenFreeMap.</w:t>
+        <w:t xml:space="preserve">Then in the AndroidManifest.xml, I will set up the ACCESS_FINE_LOCATION and ACCESS_COARSE_LOCATION permissions, as well as INTERNET, since the map tiles will be gathered remotely from </w:t>
+      </w:r>
+      <w:proofErr w:type="spellStart"/>
+      <w:r>
+        <w:rPr>
+          <w:rFonts w:ascii="Trebuchet MS" w:eastAsia="Trebuchet MS" w:hAnsi="Trebuchet MS" w:cs="Trebuchet MS"/>
+          <w:sz w:val="24"/>
+          <w:szCs w:val="24"/>
+        </w:rPr>
+        <w:t>OpenFreeMap</w:t>
+      </w:r>
+      <w:proofErr w:type="spellEnd"/>
+      <w:r>
+        <w:rPr>
+          <w:rFonts w:ascii="Trebuchet MS" w:eastAsia="Trebuchet MS" w:hAnsi="Trebuchet MS" w:cs="Trebuchet MS"/>
+          <w:sz w:val="24"/>
+          <w:szCs w:val="24"/>
+        </w:rPr>
+        <w:t>.</w:t>
       </w:r>
       <w:r>
         <w:rPr>
@@ -652,7 +736,61 @@
           <w:sz w:val="24"/>
           <w:szCs w:val="24"/>
         </w:rPr>
-        <w:t xml:space="preserve">To manage the location state in both the activity and UI, I will need to add a LatLngViewModel class that will hold a latLng property backed by a MutableLiveData object. </w:t>
+        <w:t xml:space="preserve">To manage the location state in both the activity and UI, I will need to add a </w:t>
+      </w:r>
+      <w:proofErr w:type="spellStart"/>
+      <w:r>
+        <w:rPr>
+          <w:rFonts w:ascii="Trebuchet MS" w:eastAsia="Trebuchet MS" w:hAnsi="Trebuchet MS" w:cs="Trebuchet MS"/>
+          <w:sz w:val="24"/>
+          <w:szCs w:val="24"/>
+        </w:rPr>
+        <w:t>LatLngViewModel</w:t>
+      </w:r>
+      <w:proofErr w:type="spellEnd"/>
+      <w:r>
+        <w:rPr>
+          <w:rFonts w:ascii="Trebuchet MS" w:eastAsia="Trebuchet MS" w:hAnsi="Trebuchet MS" w:cs="Trebuchet MS"/>
+          <w:sz w:val="24"/>
+          <w:szCs w:val="24"/>
+        </w:rPr>
+        <w:t xml:space="preserve"> class that will hold a </w:t>
+      </w:r>
+      <w:proofErr w:type="spellStart"/>
+      <w:r>
+        <w:rPr>
+          <w:rFonts w:ascii="Trebuchet MS" w:eastAsia="Trebuchet MS" w:hAnsi="Trebuchet MS" w:cs="Trebuchet MS"/>
+          <w:sz w:val="24"/>
+          <w:szCs w:val="24"/>
+        </w:rPr>
+        <w:t>latLng</w:t>
+      </w:r>
+      <w:proofErr w:type="spellEnd"/>
+      <w:r>
+        <w:rPr>
+          <w:rFonts w:ascii="Trebuchet MS" w:eastAsia="Trebuchet MS" w:hAnsi="Trebuchet MS" w:cs="Trebuchet MS"/>
+          <w:sz w:val="24"/>
+          <w:szCs w:val="24"/>
+        </w:rPr>
+        <w:t xml:space="preserve"> property backed by a </w:t>
+      </w:r>
+      <w:proofErr w:type="spellStart"/>
+      <w:r>
+        <w:rPr>
+          <w:rFonts w:ascii="Trebuchet MS" w:eastAsia="Trebuchet MS" w:hAnsi="Trebuchet MS" w:cs="Trebuchet MS"/>
+          <w:sz w:val="24"/>
+          <w:szCs w:val="24"/>
+        </w:rPr>
+        <w:t>MutableLiveData</w:t>
+      </w:r>
+      <w:proofErr w:type="spellEnd"/>
+      <w:r>
+        <w:rPr>
+          <w:rFonts w:ascii="Trebuchet MS" w:eastAsia="Trebuchet MS" w:hAnsi="Trebuchet MS" w:cs="Trebuchet MS"/>
+          <w:sz w:val="24"/>
+          <w:szCs w:val="24"/>
+        </w:rPr>
+        <w:t xml:space="preserve"> object. </w:t>
       </w:r>
     </w:p>
     <w:p>
@@ -679,7 +817,43 @@
           <w:szCs w:val="24"/>
         </w:rPr>
         <w:lastRenderedPageBreak/>
-        <w:t xml:space="preserve">Whenever the latLng is updated, i.e. the user's location changes, it should automatically push the new value to latLngLiveData, making it observable from the UI layer.  </w:t>
+        <w:t xml:space="preserve">Whenever the </w:t>
+      </w:r>
+      <w:proofErr w:type="spellStart"/>
+      <w:r>
+        <w:rPr>
+          <w:rFonts w:ascii="Trebuchet MS" w:eastAsia="Trebuchet MS" w:hAnsi="Trebuchet MS" w:cs="Trebuchet MS"/>
+          <w:sz w:val="24"/>
+          <w:szCs w:val="24"/>
+        </w:rPr>
+        <w:t>latLng</w:t>
+      </w:r>
+      <w:proofErr w:type="spellEnd"/>
+      <w:r>
+        <w:rPr>
+          <w:rFonts w:ascii="Trebuchet MS" w:eastAsia="Trebuchet MS" w:hAnsi="Trebuchet MS" w:cs="Trebuchet MS"/>
+          <w:sz w:val="24"/>
+          <w:szCs w:val="24"/>
+        </w:rPr>
+        <w:t xml:space="preserve"> is updated, i.e. the user's location changes, it should automatically push the new value to </w:t>
+      </w:r>
+      <w:proofErr w:type="spellStart"/>
+      <w:r>
+        <w:rPr>
+          <w:rFonts w:ascii="Trebuchet MS" w:eastAsia="Trebuchet MS" w:hAnsi="Trebuchet MS" w:cs="Trebuchet MS"/>
+          <w:sz w:val="24"/>
+          <w:szCs w:val="24"/>
+        </w:rPr>
+        <w:t>latLngLiveData</w:t>
+      </w:r>
+      <w:proofErr w:type="spellEnd"/>
+      <w:r>
+        <w:rPr>
+          <w:rFonts w:ascii="Trebuchet MS" w:eastAsia="Trebuchet MS" w:hAnsi="Trebuchet MS" w:cs="Trebuchet MS"/>
+          <w:sz w:val="24"/>
+          <w:szCs w:val="24"/>
+        </w:rPr>
+        <w:t xml:space="preserve">, making it observable from the UI layer.  </w:t>
       </w:r>
     </w:p>
     <w:p>
@@ -771,7 +945,97 @@
           <w:sz w:val="24"/>
           <w:szCs w:val="24"/>
         </w:rPr>
-        <w:t>In the MainActivity, I will add the LocationListener interface. This will allow me to override the onLocationChanged function, where I will update the ViewModel's latLng with the current coordinates gathered by the device itself.</w:t>
+        <w:t xml:space="preserve">In the </w:t>
+      </w:r>
+      <w:proofErr w:type="spellStart"/>
+      <w:r>
+        <w:rPr>
+          <w:rFonts w:ascii="Trebuchet MS" w:eastAsia="Trebuchet MS" w:hAnsi="Trebuchet MS" w:cs="Trebuchet MS"/>
+          <w:sz w:val="24"/>
+          <w:szCs w:val="24"/>
+        </w:rPr>
+        <w:t>MainActivity</w:t>
+      </w:r>
+      <w:proofErr w:type="spellEnd"/>
+      <w:r>
+        <w:rPr>
+          <w:rFonts w:ascii="Trebuchet MS" w:eastAsia="Trebuchet MS" w:hAnsi="Trebuchet MS" w:cs="Trebuchet MS"/>
+          <w:sz w:val="24"/>
+          <w:szCs w:val="24"/>
+        </w:rPr>
+        <w:t xml:space="preserve">, I will add the </w:t>
+      </w:r>
+      <w:proofErr w:type="spellStart"/>
+      <w:r>
+        <w:rPr>
+          <w:rFonts w:ascii="Trebuchet MS" w:eastAsia="Trebuchet MS" w:hAnsi="Trebuchet MS" w:cs="Trebuchet MS"/>
+          <w:sz w:val="24"/>
+          <w:szCs w:val="24"/>
+        </w:rPr>
+        <w:t>LocationListener</w:t>
+      </w:r>
+      <w:proofErr w:type="spellEnd"/>
+      <w:r>
+        <w:rPr>
+          <w:rFonts w:ascii="Trebuchet MS" w:eastAsia="Trebuchet MS" w:hAnsi="Trebuchet MS" w:cs="Trebuchet MS"/>
+          <w:sz w:val="24"/>
+          <w:szCs w:val="24"/>
+        </w:rPr>
+        <w:t xml:space="preserve"> interface. This will allow me to override the </w:t>
+      </w:r>
+      <w:proofErr w:type="spellStart"/>
+      <w:r>
+        <w:rPr>
+          <w:rFonts w:ascii="Trebuchet MS" w:eastAsia="Trebuchet MS" w:hAnsi="Trebuchet MS" w:cs="Trebuchet MS"/>
+          <w:sz w:val="24"/>
+          <w:szCs w:val="24"/>
+        </w:rPr>
+        <w:t>onLocationChanged</w:t>
+      </w:r>
+      <w:proofErr w:type="spellEnd"/>
+      <w:r>
+        <w:rPr>
+          <w:rFonts w:ascii="Trebuchet MS" w:eastAsia="Trebuchet MS" w:hAnsi="Trebuchet MS" w:cs="Trebuchet MS"/>
+          <w:sz w:val="24"/>
+          <w:szCs w:val="24"/>
+        </w:rPr>
+        <w:t xml:space="preserve"> function, where I will update the </w:t>
+      </w:r>
+      <w:proofErr w:type="spellStart"/>
+      <w:r>
+        <w:rPr>
+          <w:rFonts w:ascii="Trebuchet MS" w:eastAsia="Trebuchet MS" w:hAnsi="Trebuchet MS" w:cs="Trebuchet MS"/>
+          <w:sz w:val="24"/>
+          <w:szCs w:val="24"/>
+        </w:rPr>
+        <w:t>ViewModel's</w:t>
+      </w:r>
+      <w:proofErr w:type="spellEnd"/>
+      <w:r>
+        <w:rPr>
+          <w:rFonts w:ascii="Trebuchet MS" w:eastAsia="Trebuchet MS" w:hAnsi="Trebuchet MS" w:cs="Trebuchet MS"/>
+          <w:sz w:val="24"/>
+          <w:szCs w:val="24"/>
+        </w:rPr>
+        <w:t xml:space="preserve"> </w:t>
+      </w:r>
+      <w:proofErr w:type="spellStart"/>
+      <w:r>
+        <w:rPr>
+          <w:rFonts w:ascii="Trebuchet MS" w:eastAsia="Trebuchet MS" w:hAnsi="Trebuchet MS" w:cs="Trebuchet MS"/>
+          <w:sz w:val="24"/>
+          <w:szCs w:val="24"/>
+        </w:rPr>
+        <w:t>latLng</w:t>
+      </w:r>
+      <w:proofErr w:type="spellEnd"/>
+      <w:r>
+        <w:rPr>
+          <w:rFonts w:ascii="Trebuchet MS" w:eastAsia="Trebuchet MS" w:hAnsi="Trebuchet MS" w:cs="Trebuchet MS"/>
+          <w:sz w:val="24"/>
+          <w:szCs w:val="24"/>
+        </w:rPr>
+        <w:t xml:space="preserve"> with the current coordinates gathered by the device itself.</w:t>
       </w:r>
       <w:r>
         <w:rPr>
@@ -911,7 +1175,61 @@
           <w:sz w:val="24"/>
           <w:szCs w:val="24"/>
         </w:rPr>
-        <w:t>To start receiving GPS updates, I will create a GPS function that will retrieve the LocationManager system service and call requestLocationUpdates, which I will set to update every 2 seconds or after 5 metres of movement. This will keep the GPS accurate without slowing the machine down too much.</w:t>
+        <w:t xml:space="preserve">To start receiving GPS updates, I will create a GPS function that will retrieve the </w:t>
+      </w:r>
+      <w:proofErr w:type="spellStart"/>
+      <w:r>
+        <w:rPr>
+          <w:rFonts w:ascii="Trebuchet MS" w:eastAsia="Trebuchet MS" w:hAnsi="Trebuchet MS" w:cs="Trebuchet MS"/>
+          <w:sz w:val="24"/>
+          <w:szCs w:val="24"/>
+        </w:rPr>
+        <w:t>LocationManager</w:t>
+      </w:r>
+      <w:proofErr w:type="spellEnd"/>
+      <w:r>
+        <w:rPr>
+          <w:rFonts w:ascii="Trebuchet MS" w:eastAsia="Trebuchet MS" w:hAnsi="Trebuchet MS" w:cs="Trebuchet MS"/>
+          <w:sz w:val="24"/>
+          <w:szCs w:val="24"/>
+        </w:rPr>
+        <w:t xml:space="preserve"> system service and call </w:t>
+      </w:r>
+      <w:proofErr w:type="spellStart"/>
+      <w:r>
+        <w:rPr>
+          <w:rFonts w:ascii="Trebuchet MS" w:eastAsia="Trebuchet MS" w:hAnsi="Trebuchet MS" w:cs="Trebuchet MS"/>
+          <w:sz w:val="24"/>
+          <w:szCs w:val="24"/>
+        </w:rPr>
+        <w:t>requestLocationUpdates</w:t>
+      </w:r>
+      <w:proofErr w:type="spellEnd"/>
+      <w:r>
+        <w:rPr>
+          <w:rFonts w:ascii="Trebuchet MS" w:eastAsia="Trebuchet MS" w:hAnsi="Trebuchet MS" w:cs="Trebuchet MS"/>
+          <w:sz w:val="24"/>
+          <w:szCs w:val="24"/>
+        </w:rPr>
+        <w:t xml:space="preserve">, which I will set to update every 2 seconds or after 5 </w:t>
+      </w:r>
+      <w:proofErr w:type="spellStart"/>
+      <w:r>
+        <w:rPr>
+          <w:rFonts w:ascii="Trebuchet MS" w:eastAsia="Trebuchet MS" w:hAnsi="Trebuchet MS" w:cs="Trebuchet MS"/>
+          <w:sz w:val="24"/>
+          <w:szCs w:val="24"/>
+        </w:rPr>
+        <w:t>metres</w:t>
+      </w:r>
+      <w:proofErr w:type="spellEnd"/>
+      <w:r>
+        <w:rPr>
+          <w:rFonts w:ascii="Trebuchet MS" w:eastAsia="Trebuchet MS" w:hAnsi="Trebuchet MS" w:cs="Trebuchet MS"/>
+          <w:sz w:val="24"/>
+          <w:szCs w:val="24"/>
+        </w:rPr>
+        <w:t xml:space="preserve"> of movement. This will keep the GPS accurate without slowing the machine down too much.</w:t>
       </w:r>
       <w:r>
         <w:rPr>
@@ -1034,7 +1352,35 @@
           <w:sz w:val="24"/>
           <w:szCs w:val="24"/>
         </w:rPr>
-        <w:t>I will also write a checkPermissions function that will check whether the location permission has already been granted. If they haven’t, then it will launch a permission request. This will make sure that the GPS function is only called if the user approves the use of their location. A Toast message was shown if they denied it.</w:t>
+        <w:t xml:space="preserve">I will also write a </w:t>
+      </w:r>
+      <w:proofErr w:type="spellStart"/>
+      <w:proofErr w:type="gramStart"/>
+      <w:r>
+        <w:rPr>
+          <w:rFonts w:ascii="Trebuchet MS" w:eastAsia="Trebuchet MS" w:hAnsi="Trebuchet MS" w:cs="Trebuchet MS"/>
+          <w:sz w:val="24"/>
+          <w:szCs w:val="24"/>
+        </w:rPr>
+        <w:t>checkPermissions</w:t>
+      </w:r>
+      <w:proofErr w:type="spellEnd"/>
+      <w:r>
+        <w:rPr>
+          <w:rFonts w:ascii="Trebuchet MS" w:eastAsia="Trebuchet MS" w:hAnsi="Trebuchet MS" w:cs="Trebuchet MS"/>
+          <w:sz w:val="24"/>
+          <w:szCs w:val="24"/>
+        </w:rPr>
+        <w:t xml:space="preserve"> function</w:t>
+      </w:r>
+      <w:proofErr w:type="gramEnd"/>
+      <w:r>
+        <w:rPr>
+          <w:rFonts w:ascii="Trebuchet MS" w:eastAsia="Trebuchet MS" w:hAnsi="Trebuchet MS" w:cs="Trebuchet MS"/>
+          <w:sz w:val="24"/>
+          <w:szCs w:val="24"/>
+        </w:rPr>
+        <w:t xml:space="preserve"> that will check whether the location permission has already been granted. If they haven’t, then it will launch a permission request. This will make sure that the GPS function is only called if the user approves the use of their location. A Toast message was shown if they denied it.</w:t>
       </w:r>
     </w:p>
     <w:p>
@@ -1165,7 +1511,187 @@
           <w:sz w:val="24"/>
           <w:szCs w:val="24"/>
         </w:rPr>
-        <w:t>Inside the setContent itself, I will use a mutablestate variable to hold the current LatLng and zoom level, observed the ViewModel's LiveData to keep that state updated, and pass the values into a MapLibre composable via a CameraPosition, causing the map to recentre automatically whenever the user's location changed. This was all placed inside a Scaffold with innerpadding to prevent any overlap of the devices interfaces with the application itself.</w:t>
+        <w:t xml:space="preserve">Inside the </w:t>
+      </w:r>
+      <w:proofErr w:type="spellStart"/>
+      <w:r>
+        <w:rPr>
+          <w:rFonts w:ascii="Trebuchet MS" w:eastAsia="Trebuchet MS" w:hAnsi="Trebuchet MS" w:cs="Trebuchet MS"/>
+          <w:sz w:val="24"/>
+          <w:szCs w:val="24"/>
+        </w:rPr>
+        <w:t>setContent</w:t>
+      </w:r>
+      <w:proofErr w:type="spellEnd"/>
+      <w:r>
+        <w:rPr>
+          <w:rFonts w:ascii="Trebuchet MS" w:eastAsia="Trebuchet MS" w:hAnsi="Trebuchet MS" w:cs="Trebuchet MS"/>
+          <w:sz w:val="24"/>
+          <w:szCs w:val="24"/>
+        </w:rPr>
+        <w:t xml:space="preserve"> itself, I will use a </w:t>
+      </w:r>
+      <w:proofErr w:type="spellStart"/>
+      <w:r>
+        <w:rPr>
+          <w:rFonts w:ascii="Trebuchet MS" w:eastAsia="Trebuchet MS" w:hAnsi="Trebuchet MS" w:cs="Trebuchet MS"/>
+          <w:sz w:val="24"/>
+          <w:szCs w:val="24"/>
+        </w:rPr>
+        <w:t>mutablestate</w:t>
+      </w:r>
+      <w:proofErr w:type="spellEnd"/>
+      <w:r>
+        <w:rPr>
+          <w:rFonts w:ascii="Trebuchet MS" w:eastAsia="Trebuchet MS" w:hAnsi="Trebuchet MS" w:cs="Trebuchet MS"/>
+          <w:sz w:val="24"/>
+          <w:szCs w:val="24"/>
+        </w:rPr>
+        <w:t xml:space="preserve"> variable to hold the current </w:t>
+      </w:r>
+      <w:proofErr w:type="spellStart"/>
+      <w:r>
+        <w:rPr>
+          <w:rFonts w:ascii="Trebuchet MS" w:eastAsia="Trebuchet MS" w:hAnsi="Trebuchet MS" w:cs="Trebuchet MS"/>
+          <w:sz w:val="24"/>
+          <w:szCs w:val="24"/>
+        </w:rPr>
+        <w:t>LatLng</w:t>
+      </w:r>
+      <w:proofErr w:type="spellEnd"/>
+      <w:r>
+        <w:rPr>
+          <w:rFonts w:ascii="Trebuchet MS" w:eastAsia="Trebuchet MS" w:hAnsi="Trebuchet MS" w:cs="Trebuchet MS"/>
+          <w:sz w:val="24"/>
+          <w:szCs w:val="24"/>
+        </w:rPr>
+        <w:t xml:space="preserve"> and zoom level, observed the </w:t>
+      </w:r>
+      <w:proofErr w:type="spellStart"/>
+      <w:r>
+        <w:rPr>
+          <w:rFonts w:ascii="Trebuchet MS" w:eastAsia="Trebuchet MS" w:hAnsi="Trebuchet MS" w:cs="Trebuchet MS"/>
+          <w:sz w:val="24"/>
+          <w:szCs w:val="24"/>
+        </w:rPr>
+        <w:t>ViewModel's</w:t>
+      </w:r>
+      <w:proofErr w:type="spellEnd"/>
+      <w:r>
+        <w:rPr>
+          <w:rFonts w:ascii="Trebuchet MS" w:eastAsia="Trebuchet MS" w:hAnsi="Trebuchet MS" w:cs="Trebuchet MS"/>
+          <w:sz w:val="24"/>
+          <w:szCs w:val="24"/>
+        </w:rPr>
+        <w:t xml:space="preserve"> </w:t>
+      </w:r>
+      <w:proofErr w:type="spellStart"/>
+      <w:r>
+        <w:rPr>
+          <w:rFonts w:ascii="Trebuchet MS" w:eastAsia="Trebuchet MS" w:hAnsi="Trebuchet MS" w:cs="Trebuchet MS"/>
+          <w:sz w:val="24"/>
+          <w:szCs w:val="24"/>
+        </w:rPr>
+        <w:t>LiveData</w:t>
+      </w:r>
+      <w:proofErr w:type="spellEnd"/>
+      <w:r>
+        <w:rPr>
+          <w:rFonts w:ascii="Trebuchet MS" w:eastAsia="Trebuchet MS" w:hAnsi="Trebuchet MS" w:cs="Trebuchet MS"/>
+          <w:sz w:val="24"/>
+          <w:szCs w:val="24"/>
+        </w:rPr>
+        <w:t xml:space="preserve"> to keep that state updated, and pass the values into a </w:t>
+      </w:r>
+      <w:proofErr w:type="spellStart"/>
+      <w:r>
+        <w:rPr>
+          <w:rFonts w:ascii="Trebuchet MS" w:eastAsia="Trebuchet MS" w:hAnsi="Trebuchet MS" w:cs="Trebuchet MS"/>
+          <w:sz w:val="24"/>
+          <w:szCs w:val="24"/>
+        </w:rPr>
+        <w:t>MapLibre</w:t>
+      </w:r>
+      <w:proofErr w:type="spellEnd"/>
+      <w:r>
+        <w:rPr>
+          <w:rFonts w:ascii="Trebuchet MS" w:eastAsia="Trebuchet MS" w:hAnsi="Trebuchet MS" w:cs="Trebuchet MS"/>
+          <w:sz w:val="24"/>
+          <w:szCs w:val="24"/>
+        </w:rPr>
+        <w:t xml:space="preserve"> composable via a </w:t>
+      </w:r>
+      <w:proofErr w:type="spellStart"/>
+      <w:r>
+        <w:rPr>
+          <w:rFonts w:ascii="Trebuchet MS" w:eastAsia="Trebuchet MS" w:hAnsi="Trebuchet MS" w:cs="Trebuchet MS"/>
+          <w:sz w:val="24"/>
+          <w:szCs w:val="24"/>
+        </w:rPr>
+        <w:t>CameraPosition</w:t>
+      </w:r>
+      <w:proofErr w:type="spellEnd"/>
+      <w:r>
+        <w:rPr>
+          <w:rFonts w:ascii="Trebuchet MS" w:eastAsia="Trebuchet MS" w:hAnsi="Trebuchet MS" w:cs="Trebuchet MS"/>
+          <w:sz w:val="24"/>
+          <w:szCs w:val="24"/>
+        </w:rPr>
+        <w:t xml:space="preserve">, causing the map to </w:t>
+      </w:r>
+      <w:proofErr w:type="spellStart"/>
+      <w:r>
+        <w:rPr>
+          <w:rFonts w:ascii="Trebuchet MS" w:eastAsia="Trebuchet MS" w:hAnsi="Trebuchet MS" w:cs="Trebuchet MS"/>
+          <w:sz w:val="24"/>
+          <w:szCs w:val="24"/>
+        </w:rPr>
+        <w:t>recentre</w:t>
+      </w:r>
+      <w:proofErr w:type="spellEnd"/>
+      <w:r>
+        <w:rPr>
+          <w:rFonts w:ascii="Trebuchet MS" w:eastAsia="Trebuchet MS" w:hAnsi="Trebuchet MS" w:cs="Trebuchet MS"/>
+          <w:sz w:val="24"/>
+          <w:szCs w:val="24"/>
+        </w:rPr>
+        <w:t xml:space="preserve"> automatically whenever the user's location changed. This was all placed inside a Scaffold with </w:t>
+      </w:r>
+      <w:proofErr w:type="spellStart"/>
+      <w:r>
+        <w:rPr>
+          <w:rFonts w:ascii="Trebuchet MS" w:eastAsia="Trebuchet MS" w:hAnsi="Trebuchet MS" w:cs="Trebuchet MS"/>
+          <w:sz w:val="24"/>
+          <w:szCs w:val="24"/>
+        </w:rPr>
+        <w:t>innerpadding</w:t>
+      </w:r>
+      <w:proofErr w:type="spellEnd"/>
+      <w:r>
+        <w:rPr>
+          <w:rFonts w:ascii="Trebuchet MS" w:eastAsia="Trebuchet MS" w:hAnsi="Trebuchet MS" w:cs="Trebuchet MS"/>
+          <w:sz w:val="24"/>
+          <w:szCs w:val="24"/>
+        </w:rPr>
+        <w:t xml:space="preserve"> to prevent any overlap of the </w:t>
+      </w:r>
+      <w:proofErr w:type="gramStart"/>
+      <w:r>
+        <w:rPr>
+          <w:rFonts w:ascii="Trebuchet MS" w:eastAsia="Trebuchet MS" w:hAnsi="Trebuchet MS" w:cs="Trebuchet MS"/>
+          <w:sz w:val="24"/>
+          <w:szCs w:val="24"/>
+        </w:rPr>
+        <w:t>devices</w:t>
+      </w:r>
+      <w:proofErr w:type="gramEnd"/>
+      <w:r>
+        <w:rPr>
+          <w:rFonts w:ascii="Trebuchet MS" w:eastAsia="Trebuchet MS" w:hAnsi="Trebuchet MS" w:cs="Trebuchet MS"/>
+          <w:sz w:val="24"/>
+          <w:szCs w:val="24"/>
+        </w:rPr>
+        <w:t xml:space="preserve"> interfaces with the application itself.</w:t>
       </w:r>
     </w:p>
     <w:p>
@@ -1265,7 +1791,29 @@
           <w:sz w:val="24"/>
           <w:szCs w:val="24"/>
         </w:rPr>
-        <w:t>- type (pub, restaurant, hotel, historical site, etc);</w:t>
+        <w:t xml:space="preserve">- type (pub, restaurant, hotel, historical site, </w:t>
+      </w:r>
+      <w:proofErr w:type="spellStart"/>
+      <w:r>
+        <w:rPr>
+          <w:rFonts w:ascii="Trebuchet MS" w:hAnsi="Trebuchet MS"/>
+          <w:i/>
+          <w:iCs/>
+          <w:sz w:val="24"/>
+          <w:szCs w:val="24"/>
+        </w:rPr>
+        <w:t>etc</w:t>
+      </w:r>
+      <w:proofErr w:type="spellEnd"/>
+      <w:r>
+        <w:rPr>
+          <w:rFonts w:ascii="Trebuchet MS" w:hAnsi="Trebuchet MS"/>
+          <w:i/>
+          <w:iCs/>
+          <w:sz w:val="24"/>
+          <w:szCs w:val="24"/>
+        </w:rPr>
+        <w:t>);</w:t>
       </w:r>
     </w:p>
     <w:p>
@@ -1360,7 +1908,31 @@
           <w:sz w:val="24"/>
           <w:szCs w:val="24"/>
         </w:rPr>
-        <w:t>For now you can just use buttons for navigation – there is no need to use an app bar, a navigation bar, or the navigation drawer just yet.</w:t>
+        <w:t xml:space="preserve">For </w:t>
+      </w:r>
+      <w:proofErr w:type="gramStart"/>
+      <w:r>
+        <w:rPr>
+          <w:rFonts w:ascii="Trebuchet MS" w:hAnsi="Trebuchet MS"/>
+          <w:i/>
+          <w:iCs/>
+          <w:color w:val="000000"/>
+          <w:sz w:val="24"/>
+          <w:szCs w:val="24"/>
+        </w:rPr>
+        <w:t>now</w:t>
+      </w:r>
+      <w:proofErr w:type="gramEnd"/>
+      <w:r>
+        <w:rPr>
+          <w:rFonts w:ascii="Trebuchet MS" w:hAnsi="Trebuchet MS"/>
+          <w:i/>
+          <w:iCs/>
+          <w:color w:val="000000"/>
+          <w:sz w:val="24"/>
+          <w:szCs w:val="24"/>
+        </w:rPr>
+        <w:t xml:space="preserve"> you can just use buttons for navigation – there is no need to use an app bar, a navigation bar, or the navigation drawer just yet.</w:t>
       </w:r>
       <w:r>
         <w:rPr>
@@ -1480,8 +2052,13 @@
       <w:r>
         <w:t xml:space="preserve"> </w:t>
       </w:r>
-      <w:r>
-        <w:t>ViewModel.</w:t>
+      <w:proofErr w:type="spellStart"/>
+      <w:r>
+        <w:t>ViewModel</w:t>
+      </w:r>
+      <w:proofErr w:type="spellEnd"/>
+      <w:r>
+        <w:t>.</w:t>
       </w:r>
     </w:p>
     <w:p>
@@ -1499,13 +2076,58 @@
         <w:ind w:left="720"/>
       </w:pPr>
       <w:r>
-        <w:t xml:space="preserve">I then plan to update my LatLng ViewModel to also include the POI list rather than adding a second ViewModel as this already holds the GPS location. I will add </w:t>
-      </w:r>
-      <w:r>
-        <w:t>MutableLiveData&lt;List&lt;Poi&gt;&gt;</w:t>
-      </w:r>
-      <w:r>
-        <w:t xml:space="preserve"> so that the MainActivity can observe the list, meaning that whenever a POI is added the UI can then automatically know to redraw any makers on the map. I will then add a function to the ViewModel which will add a </w:t>
+        <w:t xml:space="preserve">I then plan to update my </w:t>
+      </w:r>
+      <w:proofErr w:type="spellStart"/>
+      <w:r>
+        <w:t>LatLng</w:t>
+      </w:r>
+      <w:proofErr w:type="spellEnd"/>
+      <w:r>
+        <w:t xml:space="preserve"> </w:t>
+      </w:r>
+      <w:proofErr w:type="spellStart"/>
+      <w:r>
+        <w:t>ViewModel</w:t>
+      </w:r>
+      <w:proofErr w:type="spellEnd"/>
+      <w:r>
+        <w:t xml:space="preserve"> to also include the POI list rather than adding a second </w:t>
+      </w:r>
+      <w:proofErr w:type="spellStart"/>
+      <w:r>
+        <w:t>ViewModel</w:t>
+      </w:r>
+      <w:proofErr w:type="spellEnd"/>
+      <w:r>
+        <w:t xml:space="preserve"> as this already holds the GPS location. I will add </w:t>
+      </w:r>
+      <w:proofErr w:type="spellStart"/>
+      <w:r>
+        <w:t>MutableLiveData</w:t>
+      </w:r>
+      <w:proofErr w:type="spellEnd"/>
+      <w:r>
+        <w:t>&lt;List&lt;Poi&gt;&gt;</w:t>
+      </w:r>
+      <w:r>
+        <w:t xml:space="preserve"> so that the </w:t>
+      </w:r>
+      <w:proofErr w:type="spellStart"/>
+      <w:r>
+        <w:t>MainActivity</w:t>
+      </w:r>
+      <w:proofErr w:type="spellEnd"/>
+      <w:r>
+        <w:t xml:space="preserve"> can observe the list, meaning that whenever a POI is added the UI can then automatically know to redraw any makers on the map. I will then add a function to the </w:t>
+      </w:r>
+      <w:proofErr w:type="spellStart"/>
+      <w:r>
+        <w:t>ViewModel</w:t>
+      </w:r>
+      <w:proofErr w:type="spellEnd"/>
+      <w:r>
+        <w:t xml:space="preserve"> which will add a </w:t>
       </w:r>
       <w:r>
         <w:t xml:space="preserve">given </w:t>
@@ -1651,13 +2273,29 @@
         <w:t>I will then add a separate composable for the POI screen</w:t>
       </w:r>
       <w:r>
-        <w:t>. I plan to put this in its own separate file to prevent code from clustering in the MainActivity.</w:t>
+        <w:t xml:space="preserve">. I plan to put this in its own separate file to prevent code from clustering in the </w:t>
+      </w:r>
+      <w:proofErr w:type="spellStart"/>
+      <w:r>
+        <w:t>MainActivity</w:t>
+      </w:r>
+      <w:proofErr w:type="spellEnd"/>
+      <w:r>
+        <w:t>.</w:t>
       </w:r>
       <w:r>
         <w:t xml:space="preserve"> I will add two callback functions to the parameter of the composable. One will be for when a POI I added and the other will be for when the user wishes to navigate back to the home screen.</w:t>
       </w:r>
       <w:r>
-        <w:t xml:space="preserve"> I will also make it so the users current LatLng is also passed as a parameter for the POIs location.</w:t>
+        <w:t xml:space="preserve"> I will also make it so the users current </w:t>
+      </w:r>
+      <w:proofErr w:type="spellStart"/>
+      <w:r>
+        <w:t>LatLng</w:t>
+      </w:r>
+      <w:proofErr w:type="spellEnd"/>
+      <w:r>
+        <w:t xml:space="preserve"> is also passed as a parameter for the POIs location.</w:t>
       </w:r>
       <w:r>
         <w:t xml:space="preserve"> </w:t>
@@ -1732,7 +2370,55 @@
         </w:drawing>
       </w:r>
       <w:r>
-        <w:t xml:space="preserve">I will finally update the main composable to include the map page and the add poi page using the compose navigation. I will add the NavHost which will contain the two routes for the map page and the add poi page. I will then be able to define the callback functions for the onPoiAdded and onNavigateBack. onPoiAdded will add the new poi to the ViewModel and the onNavigateBack will return the user to the previous page they were on. </w:t>
+        <w:t xml:space="preserve">I will finally update the main composable to include the map page and the add poi page using the compose navigation. I will add the </w:t>
+      </w:r>
+      <w:proofErr w:type="spellStart"/>
+      <w:r>
+        <w:t>NavHost</w:t>
+      </w:r>
+      <w:proofErr w:type="spellEnd"/>
+      <w:r>
+        <w:t xml:space="preserve"> which will contain the two routes for the map page and the add poi page. I will then be able to define the callback functions for the </w:t>
+      </w:r>
+      <w:proofErr w:type="spellStart"/>
+      <w:r>
+        <w:t>onPoiAdded</w:t>
+      </w:r>
+      <w:proofErr w:type="spellEnd"/>
+      <w:r>
+        <w:t xml:space="preserve"> and </w:t>
+      </w:r>
+      <w:proofErr w:type="spellStart"/>
+      <w:r>
+        <w:t>onNavigateBack</w:t>
+      </w:r>
+      <w:proofErr w:type="spellEnd"/>
+      <w:r>
+        <w:t xml:space="preserve">. </w:t>
+      </w:r>
+      <w:proofErr w:type="spellStart"/>
+      <w:r>
+        <w:t>onPoiAdded</w:t>
+      </w:r>
+      <w:proofErr w:type="spellEnd"/>
+      <w:r>
+        <w:t xml:space="preserve"> will add the new poi to the </w:t>
+      </w:r>
+      <w:proofErr w:type="spellStart"/>
+      <w:r>
+        <w:t>ViewModel</w:t>
+      </w:r>
+      <w:proofErr w:type="spellEnd"/>
+      <w:r>
+        <w:t xml:space="preserve"> and the </w:t>
+      </w:r>
+      <w:proofErr w:type="spellStart"/>
+      <w:r>
+        <w:t>onNavigateBack</w:t>
+      </w:r>
+      <w:proofErr w:type="spellEnd"/>
+      <w:r>
+        <w:t xml:space="preserve"> will return the user to the previous page they were on. </w:t>
       </w:r>
       <w:r>
         <w:t xml:space="preserve">I will place a </w:t>
@@ -1743,8 +2429,13 @@
       <w:r>
         <w:t xml:space="preserve">the </w:t>
       </w:r>
-      <w:r>
-        <w:t>MapLibre lambda</w:t>
+      <w:proofErr w:type="spellStart"/>
+      <w:r>
+        <w:t>MapLibre</w:t>
+      </w:r>
+      <w:proofErr w:type="spellEnd"/>
+      <w:r>
+        <w:t xml:space="preserve"> lambda</w:t>
       </w:r>
       <w:r>
         <w:t xml:space="preserve">. </w:t>
@@ -1762,20 +2453,43 @@
         <w:t xml:space="preserve"> the</w:t>
       </w:r>
       <w:r>
-        <w:t xml:space="preserve"> poisState changes</w:t>
+        <w:t xml:space="preserve"> </w:t>
+      </w:r>
+      <w:proofErr w:type="spellStart"/>
+      <w:proofErr w:type="gramStart"/>
+      <w:r>
+        <w:t>poisState</w:t>
+      </w:r>
+      <w:proofErr w:type="spellEnd"/>
+      <w:proofErr w:type="gramEnd"/>
+      <w:r>
+        <w:t xml:space="preserve"> changes</w:t>
       </w:r>
       <w:r>
         <w:t>. This will then</w:t>
       </w:r>
       <w:r>
-        <w:t xml:space="preserve"> loop through poisState and plac</w:t>
+        <w:t xml:space="preserve"> loop through </w:t>
+      </w:r>
+      <w:proofErr w:type="spellStart"/>
+      <w:r>
+        <w:t>poisState</w:t>
+      </w:r>
+      <w:proofErr w:type="spellEnd"/>
+      <w:r>
+        <w:t xml:space="preserve"> and plac</w:t>
       </w:r>
       <w:r>
         <w:t>e</w:t>
       </w:r>
       <w:r>
-        <w:t xml:space="preserve"> a Symbol at each POI's LatLng</w:t>
-      </w:r>
+        <w:t xml:space="preserve"> a Symbol at each POI's </w:t>
+      </w:r>
+      <w:proofErr w:type="spellStart"/>
+      <w:r>
+        <w:t>LatLng</w:t>
+      </w:r>
+      <w:proofErr w:type="spellEnd"/>
       <w:r>
         <w:t>. This makes it so</w:t>
       </w:r>
@@ -1786,7 +2500,15 @@
         <w:t>.</w:t>
       </w:r>
       <w:r>
-        <w:t xml:space="preserve"> I will make it so an alert dialog appears when the marker is clicked on, displaying the markers details including its name, type and description. This allows me to test that the marker has been added correctly.</w:t>
+        <w:t xml:space="preserve"> I will make </w:t>
+      </w:r>
+      <w:proofErr w:type="gramStart"/>
+      <w:r>
+        <w:t>it</w:t>
+      </w:r>
+      <w:proofErr w:type="gramEnd"/>
+      <w:r>
+        <w:t xml:space="preserve"> so an alert dialog appears when the marker is clicked on, displaying the markers details including its name, type and description. This allows me to test that the marker has been added correctly.</w:t>
       </w:r>
     </w:p>
     <w:p>
@@ -2332,7 +3054,15 @@
         <w:t xml:space="preserve">methods </w:t>
       </w:r>
       <w:r>
-        <w:t xml:space="preserve">for the database so it can be changed or searched. I plan to make it so that when the database returns all the POIs it contains, it will return it as a LiveData&lt;List&lt;Poi&gt;&gt;. This will </w:t>
+        <w:t xml:space="preserve">for the database so it can be changed or searched. I plan to make it so that when the database returns all the POIs it contains, it will return it as a </w:t>
+      </w:r>
+      <w:proofErr w:type="spellStart"/>
+      <w:r>
+        <w:t>LiveData</w:t>
+      </w:r>
+      <w:proofErr w:type="spellEnd"/>
+      <w:r>
+        <w:t xml:space="preserve">&lt;List&lt;Poi&gt;&gt;. This will </w:t>
       </w:r>
       <w:r>
         <w:t>make</w:t>
@@ -2341,7 +3071,36 @@
         <w:t xml:space="preserve"> sure that the UI is automatically updated with a new list of POIs whenever the database is changed.</w:t>
       </w:r>
       <w:r>
-        <w:t xml:space="preserve"> For now, I will give it three functions, getAllPois(), insert() and delete().</w:t>
+        <w:t xml:space="preserve"> For now, I will give it three functions, </w:t>
+      </w:r>
+      <w:proofErr w:type="spellStart"/>
+      <w:proofErr w:type="gramStart"/>
+      <w:r>
+        <w:t>getAllPois</w:t>
+      </w:r>
+      <w:proofErr w:type="spellEnd"/>
+      <w:r>
+        <w:t>(</w:t>
+      </w:r>
+      <w:proofErr w:type="gramEnd"/>
+      <w:r>
+        <w:t xml:space="preserve">), </w:t>
+      </w:r>
+      <w:proofErr w:type="gramStart"/>
+      <w:r>
+        <w:t>insert(</w:t>
+      </w:r>
+      <w:proofErr w:type="gramEnd"/>
+      <w:r>
+        <w:t xml:space="preserve">) and </w:t>
+      </w:r>
+      <w:proofErr w:type="gramStart"/>
+      <w:r>
+        <w:t>delete(</w:t>
+      </w:r>
+      <w:proofErr w:type="gramEnd"/>
+      <w:r>
+        <w:t>).</w:t>
       </w:r>
     </w:p>
     <w:p>
@@ -2414,7 +3173,28 @@
         </w:drawing>
       </w:r>
       <w:r>
-        <w:t>I plan to next create the file for the database itself. This will be placed within an abstract function which allows my other files to access its DAO and all the database operations within it. Inside it I will put a getDatabase() function which will check that a database doesn’t already exist, if not it will create one and save it, otherwise it will simply return the one that already exists.</w:t>
+        <w:t xml:space="preserve">I plan to next create the file for the database itself. This will be placed within an abstract function which allows my other files to access its DAO and all the database operations within it. Inside it I will put a </w:t>
+      </w:r>
+      <w:proofErr w:type="spellStart"/>
+      <w:proofErr w:type="gramStart"/>
+      <w:r>
+        <w:t>getDatabase</w:t>
+      </w:r>
+      <w:proofErr w:type="spellEnd"/>
+      <w:r>
+        <w:t>(</w:t>
+      </w:r>
+      <w:proofErr w:type="gramEnd"/>
+      <w:r>
+        <w:t xml:space="preserve">) function which will check that a database </w:t>
+      </w:r>
+      <w:proofErr w:type="gramStart"/>
+      <w:r>
+        <w:t>doesn’t already</w:t>
+      </w:r>
+      <w:proofErr w:type="gramEnd"/>
+      <w:r>
+        <w:t xml:space="preserve"> exist, if not it will create one and save it, otherwise it will simply return the one that already exists.</w:t>
       </w:r>
     </w:p>
     <w:p>
@@ -2483,16 +3263,74 @@
         </w:drawing>
       </w:r>
       <w:r>
-        <w:t xml:space="preserve">I will next update my Viewmodel. </w:t>
-      </w:r>
-      <w:r>
-        <w:t xml:space="preserve">I will first change the ViewModel for a AndroidViewModel so that it can access the application context which will be needed to open the database. </w:t>
+        <w:t xml:space="preserve">I will next update my </w:t>
+      </w:r>
+      <w:proofErr w:type="spellStart"/>
+      <w:r>
+        <w:t>Viewmodel</w:t>
+      </w:r>
+      <w:proofErr w:type="spellEnd"/>
+      <w:r>
+        <w:t xml:space="preserve">. </w:t>
+      </w:r>
+      <w:r>
+        <w:t xml:space="preserve">I will first change the </w:t>
+      </w:r>
+      <w:proofErr w:type="spellStart"/>
+      <w:r>
+        <w:t>ViewModel</w:t>
+      </w:r>
+      <w:proofErr w:type="spellEnd"/>
+      <w:r>
+        <w:t xml:space="preserve"> for </w:t>
+      </w:r>
+      <w:proofErr w:type="gramStart"/>
+      <w:r>
+        <w:t xml:space="preserve">a </w:t>
+      </w:r>
+      <w:proofErr w:type="spellStart"/>
+      <w:r>
+        <w:t>AndroidViewModel</w:t>
+      </w:r>
+      <w:proofErr w:type="spellEnd"/>
+      <w:proofErr w:type="gramEnd"/>
+      <w:r>
+        <w:t xml:space="preserve"> so that it can access the application context which will be needed to open the database. </w:t>
       </w:r>
       <w:r>
         <w:t xml:space="preserve">I plan to update the poi variable so that it gathers all the pois from the database as </w:t>
       </w:r>
-      <w:r>
-        <w:t>LiveData allowing it to automatically update when a new POI is added. Because of this, I will also need to change the addpoi function in the Viewmodel so that it adds the poi to the database instead of list using the poiDao’s ins</w:t>
+      <w:proofErr w:type="spellStart"/>
+      <w:r>
+        <w:t>LiveData</w:t>
+      </w:r>
+      <w:proofErr w:type="spellEnd"/>
+      <w:r>
+        <w:t xml:space="preserve"> allowing it to automatically update when a new POI is added. Because of this, I will also need to change the </w:t>
+      </w:r>
+      <w:proofErr w:type="spellStart"/>
+      <w:r>
+        <w:t>addpoi</w:t>
+      </w:r>
+      <w:proofErr w:type="spellEnd"/>
+      <w:r>
+        <w:t xml:space="preserve"> function in the </w:t>
+      </w:r>
+      <w:proofErr w:type="spellStart"/>
+      <w:r>
+        <w:t>Viewmodel</w:t>
+      </w:r>
+      <w:proofErr w:type="spellEnd"/>
+      <w:r>
+        <w:t xml:space="preserve"> so that it adds the poi to the database instead of list using the </w:t>
+      </w:r>
+      <w:proofErr w:type="spellStart"/>
+      <w:r>
+        <w:t>poiDao’s</w:t>
+      </w:r>
+      <w:proofErr w:type="spellEnd"/>
+      <w:r>
+        <w:t xml:space="preserve"> ins</w:t>
       </w:r>
       <w:r>
         <w:t>ert function.</w:t>
@@ -2573,7 +3411,15 @@
         </w:drawing>
       </w:r>
       <w:r>
-        <w:t>I will then update the button for my AddPoiScreen. I will simply change the Poi structure in the button so that it fits the databases poi structure since the latitude and longitude for the pois in the database are separate variables.</w:t>
+        <w:t xml:space="preserve">I will then update the button for my </w:t>
+      </w:r>
+      <w:proofErr w:type="spellStart"/>
+      <w:r>
+        <w:t>AddPoiScreen</w:t>
+      </w:r>
+      <w:proofErr w:type="spellEnd"/>
+      <w:r>
+        <w:t>. I will simply change the Poi structure in the button so that it fits the databases poi structure since the latitude and longitude for the pois in the database are separate variables.</w:t>
       </w:r>
     </w:p>
     <w:p>
@@ -2587,7 +3433,23 @@
       </w:pPr>
       <w:r>
         <w:lastRenderedPageBreak/>
-        <w:t>I will then need to change the MainActivity so that the Poi is converted back into the LatLng so that the map can properly mark its location.</w:t>
+        <w:t xml:space="preserve">I will then need to change the </w:t>
+      </w:r>
+      <w:proofErr w:type="spellStart"/>
+      <w:r>
+        <w:t>MainActivity</w:t>
+      </w:r>
+      <w:proofErr w:type="spellEnd"/>
+      <w:r>
+        <w:t xml:space="preserve"> so that the Poi is converted back into the </w:t>
+      </w:r>
+      <w:proofErr w:type="spellStart"/>
+      <w:r>
+        <w:t>LatLng</w:t>
+      </w:r>
+      <w:proofErr w:type="spellEnd"/>
+      <w:r>
+        <w:t xml:space="preserve"> so that the map can properly mark its location.</w:t>
       </w:r>
     </w:p>
     <w:p>
@@ -2801,7 +3663,15 @@
         <w:ind w:left="720"/>
       </w:pPr>
       <w:r>
-        <w:t xml:space="preserve">I have already set up the loading process for the POIs for task 3. This is done on startup and whenever the database is updated. </w:t>
+        <w:t xml:space="preserve">I have already set up the loading process for the POIs for task 3. This is done on </w:t>
+      </w:r>
+      <w:proofErr w:type="gramStart"/>
+      <w:r>
+        <w:t>startup and</w:t>
+      </w:r>
+      <w:proofErr w:type="gramEnd"/>
+      <w:r>
+        <w:t xml:space="preserve"> whenever the database is updated. </w:t>
       </w:r>
       <w:r>
         <w:t>However, to fit this task better I will change the code to use a button instead, this will make testing easier and give the user more control.</w:t>
@@ -2817,14 +3687,26 @@
         <w:ind w:left="720"/>
       </w:pPr>
       <w:r>
-        <w:t xml:space="preserve">I will start this by changing the DAO to return a plain list instead of </w:t>
-      </w:r>
+        <w:t xml:space="preserve">I will start this by changing the DAO to </w:t>
+      </w:r>
+      <w:proofErr w:type="gramStart"/>
+      <w:r>
+        <w:t>return</w:t>
+      </w:r>
+      <w:proofErr w:type="gramEnd"/>
+      <w:r>
+        <w:t xml:space="preserve"> a plain list instead of </w:t>
+      </w:r>
+      <w:proofErr w:type="gramStart"/>
       <w:r>
         <w:t xml:space="preserve">the </w:t>
       </w:r>
+      <w:proofErr w:type="spellStart"/>
       <w:r>
         <w:t>LiveData</w:t>
       </w:r>
+      <w:proofErr w:type="spellEnd"/>
+      <w:proofErr w:type="gramEnd"/>
       <w:r>
         <w:t xml:space="preserve"> since the POIs will no longer be automatically loaded. </w:t>
       </w:r>
@@ -2968,7 +3850,39 @@
         </w:drawing>
       </w:r>
       <w:r>
-        <w:t>I will also need to add a new function to the ViewModel which will load all the POIs from the database. It will run the database query on Dispatchers.IO in the background, then set the result to pois.value which should triggers the observer in MainActivity which will then update the map.</w:t>
+        <w:t xml:space="preserve">I will also need to add a new function to the </w:t>
+      </w:r>
+      <w:proofErr w:type="spellStart"/>
+      <w:r>
+        <w:t>ViewModel</w:t>
+      </w:r>
+      <w:proofErr w:type="spellEnd"/>
+      <w:r>
+        <w:t xml:space="preserve"> which will load all the POIs from the database. It will run the database query on Dispatchers.IO in the background, then set the result to </w:t>
+      </w:r>
+      <w:proofErr w:type="spellStart"/>
+      <w:r>
+        <w:t>pois.value</w:t>
+      </w:r>
+      <w:proofErr w:type="spellEnd"/>
+      <w:r>
+        <w:t xml:space="preserve"> which should </w:t>
+      </w:r>
+      <w:proofErr w:type="gramStart"/>
+      <w:r>
+        <w:t>triggers</w:t>
+      </w:r>
+      <w:proofErr w:type="gramEnd"/>
+      <w:r>
+        <w:t xml:space="preserve"> the observer in </w:t>
+      </w:r>
+      <w:proofErr w:type="spellStart"/>
+      <w:r>
+        <w:t>MainActivity</w:t>
+      </w:r>
+      <w:proofErr w:type="spellEnd"/>
+      <w:r>
+        <w:t xml:space="preserve"> which will then update the map.</w:t>
       </w:r>
     </w:p>
     <w:p>
@@ -3041,20 +3955,36 @@
         <w:t>it</w:t>
       </w:r>
       <w:r>
-        <w:t xml:space="preserve"> holds a plain list of pois instead of being assigned directly from the DAO’s live data since it no longer returns LiveData.</w:t>
-      </w:r>
-    </w:p>
-    <w:p>
-      <w:pPr>
-        <w:ind w:left="720"/>
-      </w:pPr>
-    </w:p>
-    <w:p>
-      <w:pPr>
-        <w:ind w:left="720"/>
-      </w:pPr>
-      <w:r>
-        <w:t>I will then lastly need to add the load buttons to the MainActivity. This will call the load poi function in the view model, loading all the pois from the database into the UI.</w:t>
+        <w:t xml:space="preserve"> holds a plain list of pois instead of being assigned directly from the DAO’s live data since it no longer returns </w:t>
+      </w:r>
+      <w:proofErr w:type="spellStart"/>
+      <w:r>
+        <w:t>LiveData</w:t>
+      </w:r>
+      <w:proofErr w:type="spellEnd"/>
+      <w:r>
+        <w:t>.</w:t>
+      </w:r>
+    </w:p>
+    <w:p>
+      <w:pPr>
+        <w:ind w:left="720"/>
+      </w:pPr>
+    </w:p>
+    <w:p>
+      <w:pPr>
+        <w:ind w:left="720"/>
+      </w:pPr>
+      <w:r>
+        <w:t xml:space="preserve">I will then lastly need to add the load buttons to the </w:t>
+      </w:r>
+      <w:proofErr w:type="spellStart"/>
+      <w:r>
+        <w:t>MainActivity</w:t>
+      </w:r>
+      <w:proofErr w:type="spellEnd"/>
+      <w:r>
+        <w:t>. This will call the load poi function in the view model, loading all the pois from the database into the UI.</w:t>
       </w:r>
     </w:p>
     <w:p>
@@ -3184,7 +4114,31 @@
           <w:sz w:val="24"/>
           <w:szCs w:val="24"/>
         </w:rPr>
-        <w:t xml:space="preserve"> in a text field. This should search the local database. The matching places should appear on the map as markers or circles. Again a dialog box should appear when the user clicks on each place.”</w:t>
+        <w:t xml:space="preserve"> in a text field. This should search the local database. The matching places should appear on the map as markers or circles. </w:t>
+      </w:r>
+      <w:proofErr w:type="gramStart"/>
+      <w:r>
+        <w:rPr>
+          <w:rFonts w:ascii="Trebuchet MS" w:hAnsi="Trebuchet MS"/>
+          <w:i/>
+          <w:iCs/>
+          <w:color w:val="000000"/>
+          <w:sz w:val="24"/>
+          <w:szCs w:val="24"/>
+        </w:rPr>
+        <w:t>Again</w:t>
+      </w:r>
+      <w:proofErr w:type="gramEnd"/>
+      <w:r>
+        <w:rPr>
+          <w:rFonts w:ascii="Trebuchet MS" w:hAnsi="Trebuchet MS"/>
+          <w:i/>
+          <w:iCs/>
+          <w:color w:val="000000"/>
+          <w:sz w:val="24"/>
+          <w:szCs w:val="24"/>
+        </w:rPr>
+        <w:t xml:space="preserve"> a dialog box should appear when the user clicks on each place.”</w:t>
       </w:r>
     </w:p>
     <w:p>
@@ -3201,18 +4155,18 @@
           <w:noProof/>
         </w:rPr>
         <w:drawing>
-          <wp:anchor distT="0" distB="0" distL="114300" distR="114300" simplePos="0" relativeHeight="251689984" behindDoc="0" locked="0" layoutInCell="1" allowOverlap="1" wp14:anchorId="078EF1E4" wp14:editId="0668681B">
+          <wp:anchor distT="0" distB="0" distL="114300" distR="114300" simplePos="0" relativeHeight="251712512" behindDoc="0" locked="0" layoutInCell="1" allowOverlap="1" wp14:anchorId="2A78E008" wp14:editId="06C21640">
             <wp:simplePos x="0" y="0"/>
             <wp:positionH relativeFrom="margin">
               <wp:align>center</wp:align>
             </wp:positionH>
             <wp:positionV relativeFrom="paragraph">
-              <wp:posOffset>605155</wp:posOffset>
+              <wp:posOffset>596652</wp:posOffset>
             </wp:positionV>
-            <wp:extent cx="5010150" cy="495300"/>
-            <wp:effectExtent l="0" t="0" r="0" b="0"/>
+            <wp:extent cx="4772025" cy="428625"/>
+            <wp:effectExtent l="0" t="0" r="9525" b="9525"/>
             <wp:wrapTopAndBottom/>
-            <wp:docPr id="21484269" name="Picture 1"/>
+            <wp:docPr id="2053566097" name="Picture 1"/>
             <wp:cNvGraphicFramePr>
               <a:graphicFrameLocks xmlns:a="http://schemas.openxmlformats.org/drawingml/2006/main" noChangeAspect="1"/>
             </wp:cNvGraphicFramePr>
@@ -3220,7 +4174,7 @@
               <a:graphicData uri="http://schemas.openxmlformats.org/drawingml/2006/picture">
                 <pic:pic xmlns:pic="http://schemas.openxmlformats.org/drawingml/2006/picture">
                   <pic:nvPicPr>
-                    <pic:cNvPr id="21484269" name=""/>
+                    <pic:cNvPr id="2053566097" name=""/>
                     <pic:cNvPicPr/>
                   </pic:nvPicPr>
                   <pic:blipFill>
@@ -3238,7 +4192,7 @@
                   <pic:spPr>
                     <a:xfrm>
                       <a:off x="0" y="0"/>
-                      <a:ext cx="5010150" cy="495300"/>
+                      <a:ext cx="4772025" cy="428625"/>
                     </a:xfrm>
                     <a:prstGeom prst="rect">
                       <a:avLst/>
@@ -3330,7 +4284,31 @@
         <w:t>I will next create</w:t>
       </w:r>
       <w:r>
-        <w:t xml:space="preserve"> a new function in the ViewModel. This will use the search by type function from the DAO. This will have the type as a parameter to search with and add the results to the pois.value.</w:t>
+        <w:t xml:space="preserve"> a new function in the </w:t>
+      </w:r>
+      <w:proofErr w:type="spellStart"/>
+      <w:r>
+        <w:t>ViewModel</w:t>
+      </w:r>
+      <w:proofErr w:type="spellEnd"/>
+      <w:r>
+        <w:t xml:space="preserve">. This will </w:t>
+      </w:r>
+      <w:proofErr w:type="gramStart"/>
+      <w:r>
+        <w:t>use the search</w:t>
+      </w:r>
+      <w:proofErr w:type="gramEnd"/>
+      <w:r>
+        <w:t xml:space="preserve"> by type function from the DAO. This will have the type as a parameter to search with and add the results to the </w:t>
+      </w:r>
+      <w:proofErr w:type="spellStart"/>
+      <w:r>
+        <w:t>pois.value</w:t>
+      </w:r>
+      <w:proofErr w:type="spellEnd"/>
+      <w:r>
+        <w:t>.</w:t>
       </w:r>
       <w:r>
         <w:t xml:space="preserve"> This makes it so when a user searches a type, it only displays markers relating to that type. Then to display all the pois again the user will simply need to load the pois again.</w:t>
@@ -3406,7 +4384,31 @@
         </w:drawing>
       </w:r>
       <w:r>
-        <w:t>Then I will add an outlined text field to my MainActivity which will be used by the user to input the accommodation type that they are searching for. This will then be followed by a button which, when clicked, will take the inputted data and call the search pois by type function using the inputted data as the parameter.</w:t>
+        <w:t xml:space="preserve">Then I will add an outlined text field to my </w:t>
+      </w:r>
+      <w:proofErr w:type="spellStart"/>
+      <w:r>
+        <w:t>MainActivity</w:t>
+      </w:r>
+      <w:proofErr w:type="spellEnd"/>
+      <w:r>
+        <w:t xml:space="preserve"> which will be used by the user to input the accommodation type that they are searching for. This will then be followed by a button which, when clicked, will take the </w:t>
+      </w:r>
+      <w:proofErr w:type="gramStart"/>
+      <w:r>
+        <w:t>inputted</w:t>
+      </w:r>
+      <w:proofErr w:type="gramEnd"/>
+      <w:r>
+        <w:t xml:space="preserve"> data and call the search pois by type function using the </w:t>
+      </w:r>
+      <w:proofErr w:type="gramStart"/>
+      <w:r>
+        <w:t>inputted</w:t>
+      </w:r>
+      <w:proofErr w:type="gramEnd"/>
+      <w:r>
+        <w:t xml:space="preserve"> data as the parameter.</w:t>
       </w:r>
     </w:p>
     <w:p/>
@@ -3590,7 +4592,29 @@
           <w:sz w:val="24"/>
           <w:szCs w:val="24"/>
         </w:rPr>
-        <w:t>When the POIs are loaded they should be shown on the map as markers and saved to the database. To avoid duplicate entries in the database, check whether the point of interest with that ID is already present before adding it.”</w:t>
+        <w:t xml:space="preserve">When the POIs are </w:t>
+      </w:r>
+      <w:proofErr w:type="gramStart"/>
+      <w:r>
+        <w:rPr>
+          <w:rFonts w:ascii="Trebuchet MS" w:hAnsi="Trebuchet MS"/>
+          <w:i/>
+          <w:iCs/>
+          <w:sz w:val="24"/>
+          <w:szCs w:val="24"/>
+        </w:rPr>
+        <w:t>loaded</w:t>
+      </w:r>
+      <w:proofErr w:type="gramEnd"/>
+      <w:r>
+        <w:rPr>
+          <w:rFonts w:ascii="Trebuchet MS" w:hAnsi="Trebuchet MS"/>
+          <w:i/>
+          <w:iCs/>
+          <w:sz w:val="24"/>
+          <w:szCs w:val="24"/>
+        </w:rPr>
+        <w:t xml:space="preserve"> they should be shown on the map as markers and saved to the database. To avoid duplicate entries in the database, check whether the point of interest with that ID is already present before adding it.”</w:t>
       </w:r>
     </w:p>
     <w:p>
@@ -3871,7 +4895,35 @@
           <w:sz w:val="24"/>
           <w:szCs w:val="24"/>
         </w:rPr>
-        <w:t>On top of this I will need to add usesCleartextTraffic=”true” to my application. This is because Android doesn’t allow access to insecure servers (HTTP) which my server is. By using this it disables the restriction allowing my app to communicate with the server.</w:t>
+        <w:t xml:space="preserve">On top of this I will need to add </w:t>
+      </w:r>
+      <w:proofErr w:type="spellStart"/>
+      <w:r>
+        <w:rPr>
+          <w:rFonts w:ascii="Trebuchet MS" w:hAnsi="Trebuchet MS"/>
+          <w:sz w:val="24"/>
+          <w:szCs w:val="24"/>
+        </w:rPr>
+        <w:t>usesCleartextTraffic</w:t>
+      </w:r>
+      <w:proofErr w:type="spellEnd"/>
+      <w:proofErr w:type="gramStart"/>
+      <w:r>
+        <w:rPr>
+          <w:rFonts w:ascii="Trebuchet MS" w:hAnsi="Trebuchet MS"/>
+          <w:sz w:val="24"/>
+          <w:szCs w:val="24"/>
+        </w:rPr>
+        <w:t>=”true</w:t>
+      </w:r>
+      <w:proofErr w:type="gramEnd"/>
+      <w:r>
+        <w:rPr>
+          <w:rFonts w:ascii="Trebuchet MS" w:hAnsi="Trebuchet MS"/>
+          <w:sz w:val="24"/>
+          <w:szCs w:val="24"/>
+        </w:rPr>
+        <w:t>” to my application. This is because Android doesn’t allow access to insecure servers (HTTP) which my server is. By using this it disables the restriction allowing my app to communicate with the server.</w:t>
       </w:r>
     </w:p>
     <w:p>
@@ -4057,8 +5109,18 @@
           <w:sz w:val="24"/>
           <w:szCs w:val="24"/>
         </w:rPr>
-        <w:t xml:space="preserve"> as they both currently have different feilds</w:t>
-      </w:r>
+        <w:t xml:space="preserve"> as they both currently have different </w:t>
+      </w:r>
+      <w:proofErr w:type="spellStart"/>
+      <w:r>
+        <w:rPr>
+          <w:rFonts w:ascii="Trebuchet MS" w:hAnsi="Trebuchet MS"/>
+          <w:sz w:val="24"/>
+          <w:szCs w:val="24"/>
+        </w:rPr>
+        <w:t>feilds</w:t>
+      </w:r>
+      <w:proofErr w:type="spellEnd"/>
       <w:r>
         <w:rPr>
           <w:rFonts w:ascii="Trebuchet MS" w:hAnsi="Trebuchet MS"/>
@@ -4315,7 +5377,25 @@
           <w:szCs w:val="24"/>
         </w:rPr>
         <w:lastRenderedPageBreak/>
-        <w:t xml:space="preserve">This will need a new function which I will store within my ViewModel. </w:t>
+        <w:t xml:space="preserve">This will need a new function which I will store within my </w:t>
+      </w:r>
+      <w:proofErr w:type="spellStart"/>
+      <w:r>
+        <w:rPr>
+          <w:rFonts w:ascii="Trebuchet MS" w:hAnsi="Trebuchet MS"/>
+          <w:sz w:val="24"/>
+          <w:szCs w:val="24"/>
+        </w:rPr>
+        <w:t>ViewModel</w:t>
+      </w:r>
+      <w:proofErr w:type="spellEnd"/>
+      <w:r>
+        <w:rPr>
+          <w:rFonts w:ascii="Trebuchet MS" w:hAnsi="Trebuchet MS"/>
+          <w:sz w:val="24"/>
+          <w:szCs w:val="24"/>
+        </w:rPr>
+        <w:t xml:space="preserve">. </w:t>
       </w:r>
       <w:r>
         <w:rPr>
@@ -4339,7 +5419,25 @@
           <w:sz w:val="24"/>
           <w:szCs w:val="24"/>
         </w:rPr>
-        <w:t xml:space="preserve">” url which will gather all the pois in the web data base. The function will then, within a coroutine so it can handle the database operations, check each poi in the web database and compare its id with the ones in the local database. The ones that have an id which already exists in the local database are skipped to prevent duplicates. </w:t>
+        <w:t xml:space="preserve">” </w:t>
+      </w:r>
+      <w:proofErr w:type="spellStart"/>
+      <w:r>
+        <w:rPr>
+          <w:rFonts w:ascii="Trebuchet MS" w:hAnsi="Trebuchet MS"/>
+          <w:sz w:val="24"/>
+          <w:szCs w:val="24"/>
+        </w:rPr>
+        <w:t>url</w:t>
+      </w:r>
+      <w:proofErr w:type="spellEnd"/>
+      <w:r>
+        <w:rPr>
+          <w:rFonts w:ascii="Trebuchet MS" w:hAnsi="Trebuchet MS"/>
+          <w:sz w:val="24"/>
+          <w:szCs w:val="24"/>
+        </w:rPr>
+        <w:t xml:space="preserve"> which will gather all the pois in the web data base. The function will then, within a coroutine so it can handle the database operations, check each poi in the web database and compare its id with the ones in the local database. The ones that have an id which already exists in the local database are skipped to prevent duplicates. </w:t>
       </w:r>
       <w:r>
         <w:rPr>
@@ -4520,7 +5618,43 @@
           <w:sz w:val="24"/>
           <w:szCs w:val="24"/>
         </w:rPr>
-        <w:t>Then finally for this task I will need to add a new button in the MainActivity which uses the new function.</w:t>
+        <w:t xml:space="preserve">Then finally for this task I will need to add a new button </w:t>
+      </w:r>
+      <w:proofErr w:type="gramStart"/>
+      <w:r>
+        <w:rPr>
+          <w:rFonts w:ascii="Trebuchet MS" w:hAnsi="Trebuchet MS"/>
+          <w:sz w:val="24"/>
+          <w:szCs w:val="24"/>
+        </w:rPr>
+        <w:t>in</w:t>
+      </w:r>
+      <w:proofErr w:type="gramEnd"/>
+      <w:r>
+        <w:rPr>
+          <w:rFonts w:ascii="Trebuchet MS" w:hAnsi="Trebuchet MS"/>
+          <w:sz w:val="24"/>
+          <w:szCs w:val="24"/>
+        </w:rPr>
+        <w:t xml:space="preserve"> the </w:t>
+      </w:r>
+      <w:proofErr w:type="spellStart"/>
+      <w:r>
+        <w:rPr>
+          <w:rFonts w:ascii="Trebuchet MS" w:hAnsi="Trebuchet MS"/>
+          <w:sz w:val="24"/>
+          <w:szCs w:val="24"/>
+        </w:rPr>
+        <w:t>MainActivity</w:t>
+      </w:r>
+      <w:proofErr w:type="spellEnd"/>
+      <w:r>
+        <w:rPr>
+          <w:rFonts w:ascii="Trebuchet MS" w:hAnsi="Trebuchet MS"/>
+          <w:sz w:val="24"/>
+          <w:szCs w:val="24"/>
+        </w:rPr>
+        <w:t xml:space="preserve"> which uses the new function.</w:t>
       </w:r>
       <w:r>
         <w:rPr>
@@ -4766,27 +5900,71 @@
           <w:sz w:val="24"/>
           <w:szCs w:val="24"/>
         </w:rPr>
-        <w:t>- lat (the latitude)</w:t>
-      </w:r>
-    </w:p>
-    <w:p>
-      <w:pPr>
-        <w:rPr>
-          <w:i/>
-          <w:iCs/>
-          <w:sz w:val="24"/>
-          <w:szCs w:val="24"/>
-        </w:rPr>
-      </w:pPr>
-      <w:r>
-        <w:rPr>
-          <w:rFonts w:ascii="Trebuchet MS" w:hAnsi="Trebuchet MS"/>
-          <w:i/>
-          <w:iCs/>
-          <w:sz w:val="24"/>
-          <w:szCs w:val="24"/>
-        </w:rPr>
-        <w:t>- lon (the longitude).</w:t>
+        <w:t xml:space="preserve">- </w:t>
+      </w:r>
+      <w:proofErr w:type="spellStart"/>
+      <w:r>
+        <w:rPr>
+          <w:rFonts w:ascii="Trebuchet MS" w:hAnsi="Trebuchet MS"/>
+          <w:i/>
+          <w:iCs/>
+          <w:sz w:val="24"/>
+          <w:szCs w:val="24"/>
+        </w:rPr>
+        <w:t>lat</w:t>
+      </w:r>
+      <w:proofErr w:type="spellEnd"/>
+      <w:r>
+        <w:rPr>
+          <w:rFonts w:ascii="Trebuchet MS" w:hAnsi="Trebuchet MS"/>
+          <w:i/>
+          <w:iCs/>
+          <w:sz w:val="24"/>
+          <w:szCs w:val="24"/>
+        </w:rPr>
+        <w:t xml:space="preserve"> (the latitude)</w:t>
+      </w:r>
+    </w:p>
+    <w:p>
+      <w:pPr>
+        <w:rPr>
+          <w:i/>
+          <w:iCs/>
+          <w:sz w:val="24"/>
+          <w:szCs w:val="24"/>
+        </w:rPr>
+      </w:pPr>
+      <w:r>
+        <w:rPr>
+          <w:rFonts w:ascii="Trebuchet MS" w:hAnsi="Trebuchet MS"/>
+          <w:i/>
+          <w:iCs/>
+          <w:sz w:val="24"/>
+          <w:szCs w:val="24"/>
+        </w:rPr>
+        <w:t xml:space="preserve">- </w:t>
+      </w:r>
+      <w:proofErr w:type="spellStart"/>
+      <w:r>
+        <w:rPr>
+          <w:rFonts w:ascii="Trebuchet MS" w:hAnsi="Trebuchet MS"/>
+          <w:i/>
+          <w:iCs/>
+          <w:sz w:val="24"/>
+          <w:szCs w:val="24"/>
+        </w:rPr>
+        <w:t>lon</w:t>
+      </w:r>
+      <w:proofErr w:type="spellEnd"/>
+      <w:r>
+        <w:rPr>
+          <w:rFonts w:ascii="Trebuchet MS" w:hAnsi="Trebuchet MS"/>
+          <w:i/>
+          <w:iCs/>
+          <w:sz w:val="24"/>
+          <w:szCs w:val="24"/>
+        </w:rPr>
+        <w:t xml:space="preserve"> (the longitude).</w:t>
       </w:r>
     </w:p>
     <w:p>
@@ -4862,7 +6040,28 @@
     </w:p>
     <w:p>
       <w:r>
-        <w:t xml:space="preserve">To start this task, I will need to change my addPoi() function in the Viewmodel. I will change the function so that instead of inserting the poi into the local database straight away it will first POST to the server using </w:t>
+        <w:t xml:space="preserve">To start this task, I will need to change my </w:t>
+      </w:r>
+      <w:proofErr w:type="spellStart"/>
+      <w:proofErr w:type="gramStart"/>
+      <w:r>
+        <w:t>addPoi</w:t>
+      </w:r>
+      <w:proofErr w:type="spellEnd"/>
+      <w:r>
+        <w:t>(</w:t>
+      </w:r>
+      <w:proofErr w:type="gramEnd"/>
+      <w:r>
+        <w:t xml:space="preserve">) function in the </w:t>
+      </w:r>
+      <w:proofErr w:type="spellStart"/>
+      <w:r>
+        <w:t>Viewmodel</w:t>
+      </w:r>
+      <w:proofErr w:type="spellEnd"/>
+      <w:r>
+        <w:t xml:space="preserve">. I will change the function so that instead of inserting the poi into the local database straight away it will first POST to the server using </w:t>
       </w:r>
       <w:r>
         <w:t xml:space="preserve">the </w:t>
@@ -4876,7 +6075,23 @@
         </w:r>
       </w:hyperlink>
       <w:r>
-        <w:t xml:space="preserve"> url, which will return the ID, then the function will use this ID as the webId then save it locally using the poi DAO insert function.. This makes sure that the poi is only added to the local database if it is successfully added to the web data base. This prevents any misalignment between the two databases.</w:t>
+        <w:t xml:space="preserve"> </w:t>
+      </w:r>
+      <w:proofErr w:type="spellStart"/>
+      <w:r>
+        <w:t>url</w:t>
+      </w:r>
+      <w:proofErr w:type="spellEnd"/>
+      <w:r>
+        <w:t xml:space="preserve">, which will return the ID, then the function will use this ID as the </w:t>
+      </w:r>
+      <w:proofErr w:type="spellStart"/>
+      <w:r>
+        <w:t>webId</w:t>
+      </w:r>
+      <w:proofErr w:type="spellEnd"/>
+      <w:r>
+        <w:t xml:space="preserve"> then save it locally using the poi DAO insert function.. This makes sure that the poi is only added to the local database if it is successfully added to the web data base. This prevents any misalignment between the two databases.</w:t>
       </w:r>
     </w:p>
     <w:p/>
@@ -4888,7 +6103,31 @@
     <w:p/>
     <w:p>
       <w:r>
-        <w:t xml:space="preserve">Since the original poi has webId set to null, I will use .copy() to create a new Poi object with the same fields but with the null webId replaced by the ID returned by the server. The original poi </w:t>
+        <w:t xml:space="preserve">Since the original poi has </w:t>
+      </w:r>
+      <w:proofErr w:type="spellStart"/>
+      <w:r>
+        <w:t>webId</w:t>
+      </w:r>
+      <w:proofErr w:type="spellEnd"/>
+      <w:r>
+        <w:t xml:space="preserve"> set to null, I will </w:t>
+      </w:r>
+      <w:proofErr w:type="gramStart"/>
+      <w:r>
+        <w:t>use .copy</w:t>
+      </w:r>
+      <w:proofErr w:type="gramEnd"/>
+      <w:r>
+        <w:t xml:space="preserve">() to create a new Poi object with the same fields but with the null </w:t>
+      </w:r>
+      <w:proofErr w:type="spellStart"/>
+      <w:r>
+        <w:t>webId</w:t>
+      </w:r>
+      <w:proofErr w:type="spellEnd"/>
+      <w:r>
+        <w:t xml:space="preserve"> replaced by the ID returned by the server. The original poi </w:t>
       </w:r>
       <w:r>
         <w:t>will then be removed</w:t>
@@ -4900,7 +6139,15 @@
         <w:t xml:space="preserve">makes sure </w:t>
       </w:r>
       <w:r>
-        <w:t>that the record saved to the local database has a webId that matches the server</w:t>
+        <w:t xml:space="preserve">that the record saved to the local database has a </w:t>
+      </w:r>
+      <w:proofErr w:type="spellStart"/>
+      <w:r>
+        <w:t>webId</w:t>
+      </w:r>
+      <w:proofErr w:type="spellEnd"/>
+      <w:r>
+        <w:t xml:space="preserve"> that matches the server</w:t>
       </w:r>
       <w:r>
         <w:t>.</w:t>
@@ -5031,19 +6278,43 @@
         <w:t>These will be t</w:t>
       </w:r>
       <w:r>
-        <w:t xml:space="preserve">he topBar parameter </w:t>
+        <w:t xml:space="preserve">he </w:t>
+      </w:r>
+      <w:proofErr w:type="spellStart"/>
+      <w:r>
+        <w:t>topBar</w:t>
+      </w:r>
+      <w:proofErr w:type="spellEnd"/>
+      <w:r>
+        <w:t xml:space="preserve"> parameter </w:t>
       </w:r>
       <w:r>
         <w:t xml:space="preserve">which </w:t>
       </w:r>
       <w:r>
-        <w:t xml:space="preserve">will contain a TopAppBar composable </w:t>
+        <w:t xml:space="preserve">will contain a </w:t>
+      </w:r>
+      <w:proofErr w:type="spellStart"/>
+      <w:r>
+        <w:t>TopAppBar</w:t>
+      </w:r>
+      <w:proofErr w:type="spellEnd"/>
+      <w:r>
+        <w:t xml:space="preserve"> composable </w:t>
       </w:r>
       <w:r>
         <w:t>showing</w:t>
       </w:r>
       <w:r>
-        <w:t xml:space="preserve"> the app name and a hamburger menu IconButton </w:t>
+        <w:t xml:space="preserve"> the app name and a hamburger menu </w:t>
+      </w:r>
+      <w:proofErr w:type="spellStart"/>
+      <w:r>
+        <w:t>IconButton</w:t>
+      </w:r>
+      <w:proofErr w:type="spellEnd"/>
+      <w:r>
+        <w:t xml:space="preserve"> </w:t>
       </w:r>
       <w:r>
         <w:t xml:space="preserve">which </w:t>
@@ -5054,20 +6325,49 @@
       <w:r>
         <w:t xml:space="preserve">a </w:t>
       </w:r>
-      <w:r>
-        <w:t>coroutineScope.launch to call drawerState.open(), which will</w:t>
+      <w:proofErr w:type="spellStart"/>
+      <w:r>
+        <w:t>coroutineScope.launch</w:t>
+      </w:r>
+      <w:proofErr w:type="spellEnd"/>
+      <w:r>
+        <w:t xml:space="preserve"> to call </w:t>
+      </w:r>
+      <w:proofErr w:type="spellStart"/>
+      <w:r>
+        <w:t>drawerState.open</w:t>
+      </w:r>
+      <w:proofErr w:type="spellEnd"/>
+      <w:r>
+        <w:t>(), which will</w:t>
       </w:r>
       <w:r>
         <w:t xml:space="preserve"> then</w:t>
       </w:r>
       <w:r>
-        <w:t xml:space="preserve"> open the ModalNavigationDrawer. </w:t>
+        <w:t xml:space="preserve"> open the </w:t>
+      </w:r>
+      <w:proofErr w:type="spellStart"/>
+      <w:r>
+        <w:t>ModalNavigationDrawer</w:t>
+      </w:r>
+      <w:proofErr w:type="spellEnd"/>
+      <w:r>
+        <w:t xml:space="preserve">. </w:t>
       </w:r>
       <w:r>
         <w:t>I will wrap t</w:t>
       </w:r>
       <w:r>
-        <w:t>he drawer around the entire NavHost block rather than just the map screen's Scaffold, because it needs to be able to slide over all content.</w:t>
+        <w:t xml:space="preserve">he drawer around the entire </w:t>
+      </w:r>
+      <w:proofErr w:type="spellStart"/>
+      <w:r>
+        <w:t>NavHost</w:t>
+      </w:r>
+      <w:proofErr w:type="spellEnd"/>
+      <w:r>
+        <w:t xml:space="preserve"> block rather than just the map screen's Scaffold, because it needs to be able to slide over all content.</w:t>
       </w:r>
     </w:p>
     <w:p>
@@ -5084,7 +6384,31 @@
         <w:t>e</w:t>
       </w:r>
       <w:r>
-        <w:t xml:space="preserve">ach NavigationDrawerItem inside the ModalDrawerSheet will call drawerState.close() in a coroutine before navigating, </w:t>
+        <w:t xml:space="preserve">ach </w:t>
+      </w:r>
+      <w:proofErr w:type="spellStart"/>
+      <w:r>
+        <w:t>NavigationDrawerItem</w:t>
+      </w:r>
+      <w:proofErr w:type="spellEnd"/>
+      <w:r>
+        <w:t xml:space="preserve"> inside the </w:t>
+      </w:r>
+      <w:proofErr w:type="spellStart"/>
+      <w:r>
+        <w:t>ModalDrawerSheet</w:t>
+      </w:r>
+      <w:proofErr w:type="spellEnd"/>
+      <w:r>
+        <w:t xml:space="preserve"> will call </w:t>
+      </w:r>
+      <w:proofErr w:type="spellStart"/>
+      <w:r>
+        <w:t>drawerState.close</w:t>
+      </w:r>
+      <w:proofErr w:type="spellEnd"/>
+      <w:r>
+        <w:t xml:space="preserve">() in a coroutine before navigating, </w:t>
       </w:r>
       <w:r>
         <w:t xml:space="preserve">this is </w:t>
@@ -5227,14 +6551,43 @@
         <w:t>The next parameter will be the</w:t>
       </w:r>
       <w:r>
-        <w:t xml:space="preserve"> bottomBar parameter </w:t>
+        <w:t xml:space="preserve"> </w:t>
+      </w:r>
+      <w:proofErr w:type="spellStart"/>
+      <w:r>
+        <w:t>bottomBar</w:t>
+      </w:r>
+      <w:proofErr w:type="spellEnd"/>
+      <w:r>
+        <w:t xml:space="preserve"> parameter </w:t>
       </w:r>
       <w:r>
         <w:t xml:space="preserve">which </w:t>
       </w:r>
       <w:r>
-        <w:t>will contain a NavigationBar with two NavigationBarItem composables</w:t>
-      </w:r>
+        <w:t xml:space="preserve">will contain a </w:t>
+      </w:r>
+      <w:proofErr w:type="spellStart"/>
+      <w:r>
+        <w:t>NavigationBar</w:t>
+      </w:r>
+      <w:proofErr w:type="spellEnd"/>
+      <w:r>
+        <w:t xml:space="preserve"> with two </w:t>
+      </w:r>
+      <w:proofErr w:type="spellStart"/>
+      <w:r>
+        <w:t>NavigationBarItem</w:t>
+      </w:r>
+      <w:proofErr w:type="spellEnd"/>
+      <w:r>
+        <w:t xml:space="preserve"> </w:t>
+      </w:r>
+      <w:proofErr w:type="spellStart"/>
+      <w:r>
+        <w:t>composables</w:t>
+      </w:r>
+      <w:proofErr w:type="spellEnd"/>
       <w:r>
         <w:t>,</w:t>
       </w:r>
@@ -5434,7 +6787,15 @@
         <w:t>I will then add a</w:t>
       </w:r>
       <w:r>
-        <w:t xml:space="preserve"> floatingActionButton </w:t>
+        <w:t xml:space="preserve"> </w:t>
+      </w:r>
+      <w:proofErr w:type="spellStart"/>
+      <w:r>
+        <w:t>floatingActionButton</w:t>
+      </w:r>
+      <w:proofErr w:type="spellEnd"/>
+      <w:r>
+        <w:t xml:space="preserve"> </w:t>
       </w:r>
       <w:r>
         <w:t xml:space="preserve">as the last </w:t>
@@ -5446,13 +6807,31 @@
         <w:t xml:space="preserve">which </w:t>
       </w:r>
       <w:r>
-        <w:t xml:space="preserve">will contain a FloatingActionButton with </w:t>
+        <w:t xml:space="preserve">will contain a </w:t>
+      </w:r>
+      <w:proofErr w:type="spellStart"/>
+      <w:r>
+        <w:t>FloatingActionButton</w:t>
+      </w:r>
+      <w:proofErr w:type="spellEnd"/>
+      <w:r>
+        <w:t xml:space="preserve"> with </w:t>
       </w:r>
       <w:r>
         <w:t>an</w:t>
       </w:r>
       <w:r>
-        <w:t xml:space="preserve"> Icons.Filled.Add icon that </w:t>
+        <w:t xml:space="preserve"> </w:t>
+      </w:r>
+      <w:proofErr w:type="spellStart"/>
+      <w:proofErr w:type="gramStart"/>
+      <w:r>
+        <w:t>Icons.Filled.Add</w:t>
+      </w:r>
+      <w:proofErr w:type="spellEnd"/>
+      <w:proofErr w:type="gramEnd"/>
+      <w:r>
+        <w:t xml:space="preserve"> icon that </w:t>
       </w:r>
       <w:r>
         <w:t xml:space="preserve">will </w:t>
@@ -5464,7 +6843,15 @@
         <w:t xml:space="preserve"> the user</w:t>
       </w:r>
       <w:r>
-        <w:t xml:space="preserve"> to the addPoi route</w:t>
+        <w:t xml:space="preserve"> to the </w:t>
+      </w:r>
+      <w:proofErr w:type="spellStart"/>
+      <w:r>
+        <w:t>addPoi</w:t>
+      </w:r>
+      <w:proofErr w:type="spellEnd"/>
+      <w:r>
+        <w:t xml:space="preserve"> route</w:t>
       </w:r>
       <w:r>
         <w:t>.</w:t>
@@ -5548,14 +6935,53 @@
       <w:r>
         <w:t xml:space="preserve"> </w:t>
       </w:r>
-      <w:r>
-        <w:t>OptIn(ExperimentalMaterial3Api::class)</w:t>
-      </w:r>
-      <w:r>
-        <w:t xml:space="preserve"> before the onCreate() as </w:t>
-      </w:r>
-      <w:r>
-        <w:t>the TopAppBar is still experimental</w:t>
+      <w:proofErr w:type="spellStart"/>
+      <w:proofErr w:type="gramStart"/>
+      <w:r>
+        <w:t>OptIn</w:t>
+      </w:r>
+      <w:proofErr w:type="spellEnd"/>
+      <w:r>
+        <w:t>(</w:t>
+      </w:r>
+      <w:proofErr w:type="gramEnd"/>
+      <w:r>
+        <w:t>ExperimentalMaterial3</w:t>
+      </w:r>
+      <w:proofErr w:type="gramStart"/>
+      <w:r>
+        <w:t>Api::</w:t>
+      </w:r>
+      <w:proofErr w:type="gramEnd"/>
+      <w:r>
+        <w:t>class)</w:t>
+      </w:r>
+      <w:r>
+        <w:t xml:space="preserve"> before the </w:t>
+      </w:r>
+      <w:proofErr w:type="spellStart"/>
+      <w:proofErr w:type="gramStart"/>
+      <w:r>
+        <w:t>onCreate</w:t>
+      </w:r>
+      <w:proofErr w:type="spellEnd"/>
+      <w:r>
+        <w:t>(</w:t>
+      </w:r>
+      <w:proofErr w:type="gramEnd"/>
+      <w:r>
+        <w:t xml:space="preserve">) as </w:t>
+      </w:r>
+      <w:r>
+        <w:t xml:space="preserve">the </w:t>
+      </w:r>
+      <w:proofErr w:type="spellStart"/>
+      <w:r>
+        <w:t>TopAppBar</w:t>
+      </w:r>
+      <w:proofErr w:type="spellEnd"/>
+      <w:r>
+        <w:t xml:space="preserve"> is still experimental</w:t>
       </w:r>
       <w:r>
         <w:t>.</w:t>
@@ -5691,8 +7117,9 @@
           <w:sz w:val="24"/>
           <w:szCs w:val="24"/>
         </w:rPr>
-        <w:t xml:space="preserve">I will begin by adding a new function to my ViewModel which will use the /review/create </w:t>
-      </w:r>
+        <w:t xml:space="preserve">I will begin by adding a new function to my </w:t>
+      </w:r>
+      <w:proofErr w:type="spellStart"/>
       <w:r>
         <w:rPr>
           <w:rFonts w:ascii="Trebuchet MS" w:hAnsi="Trebuchet MS"/>
@@ -5700,6 +7127,25 @@
           <w:sz w:val="24"/>
           <w:szCs w:val="24"/>
         </w:rPr>
+        <w:t>ViewModel</w:t>
+      </w:r>
+      <w:proofErr w:type="spellEnd"/>
+      <w:r>
+        <w:rPr>
+          <w:rFonts w:ascii="Trebuchet MS" w:hAnsi="Trebuchet MS"/>
+          <w:color w:val="000000"/>
+          <w:sz w:val="24"/>
+          <w:szCs w:val="24"/>
+        </w:rPr>
+        <w:t xml:space="preserve"> which will use the /review/create </w:t>
+      </w:r>
+      <w:r>
+        <w:rPr>
+          <w:rFonts w:ascii="Trebuchet MS" w:hAnsi="Trebuchet MS"/>
+          <w:color w:val="000000"/>
+          <w:sz w:val="24"/>
+          <w:szCs w:val="24"/>
+        </w:rPr>
         <w:t>POST route sending the POI web ID and the review. This should display an error in the console if one has occurred and should also display a message indicating that the review had been added successfully.</w:t>
       </w:r>
       <w:r>
@@ -5779,8 +7225,9 @@
           <w:sz w:val="24"/>
           <w:szCs w:val="24"/>
         </w:rPr>
-        <w:t xml:space="preserve">I will then update the AlertDialog for each of the markers to include a text field </w:t>
-      </w:r>
+        <w:t xml:space="preserve">I will then update the </w:t>
+      </w:r>
+      <w:proofErr w:type="spellStart"/>
       <w:r>
         <w:rPr>
           <w:rFonts w:ascii="Trebuchet MS" w:hAnsi="Trebuchet MS"/>
@@ -5788,6 +7235,25 @@
           <w:sz w:val="24"/>
           <w:szCs w:val="24"/>
         </w:rPr>
+        <w:t>AlertDialog</w:t>
+      </w:r>
+      <w:proofErr w:type="spellEnd"/>
+      <w:r>
+        <w:rPr>
+          <w:rFonts w:ascii="Trebuchet MS" w:hAnsi="Trebuchet MS"/>
+          <w:color w:val="000000"/>
+          <w:sz w:val="24"/>
+          <w:szCs w:val="24"/>
+        </w:rPr>
+        <w:t xml:space="preserve"> for each of the markers to include a text field </w:t>
+      </w:r>
+      <w:r>
+        <w:rPr>
+          <w:rFonts w:ascii="Trebuchet MS" w:hAnsi="Trebuchet MS"/>
+          <w:color w:val="000000"/>
+          <w:sz w:val="24"/>
+          <w:szCs w:val="24"/>
+        </w:rPr>
         <w:t>accompanied</w:t>
       </w:r>
       <w:r>
@@ -5842,7 +7308,27 @@
           <w:sz w:val="24"/>
           <w:szCs w:val="24"/>
         </w:rPr>
-        <w:t xml:space="preserve"> function that sends the review including the webId and review text as the parameters. </w:t>
+        <w:t xml:space="preserve"> function that sends the review including the </w:t>
+      </w:r>
+      <w:proofErr w:type="spellStart"/>
+      <w:r>
+        <w:rPr>
+          <w:rFonts w:ascii="Trebuchet MS" w:hAnsi="Trebuchet MS"/>
+          <w:color w:val="000000"/>
+          <w:sz w:val="24"/>
+          <w:szCs w:val="24"/>
+        </w:rPr>
+        <w:t>webId</w:t>
+      </w:r>
+      <w:proofErr w:type="spellEnd"/>
+      <w:r>
+        <w:rPr>
+          <w:rFonts w:ascii="Trebuchet MS" w:hAnsi="Trebuchet MS"/>
+          <w:color w:val="000000"/>
+          <w:sz w:val="24"/>
+          <w:szCs w:val="24"/>
+        </w:rPr>
+        <w:t xml:space="preserve"> and review text as the parameters. </w:t>
       </w:r>
     </w:p>
     <w:p>
@@ -5984,7 +7470,47 @@
         <w:t xml:space="preserve"> </w:t>
       </w:r>
       <w:r>
-        <w:t>However, I had been coding on the very latest android studio panda 2. Looking at the android studio web, this is an issue as panda 2 uses apg’s from 4.0 – 9.1 (9.1 being the apg I was using) whereas Narwhal and Otter use an apg from 4.0-8.13 meaning my apg would not work on the software used in grading. I fixed this by simply changing the apg version and updating any necessary files</w:t>
+        <w:t xml:space="preserve">However, I had been coding on the very latest android studio panda 2. Looking at the android studio web, this is an issue as panda 2 uses </w:t>
+      </w:r>
+      <w:proofErr w:type="spellStart"/>
+      <w:r>
+        <w:t>apg’s</w:t>
+      </w:r>
+      <w:proofErr w:type="spellEnd"/>
+      <w:r>
+        <w:t xml:space="preserve"> from 4.0 – 9.1 (9.1 being the </w:t>
+      </w:r>
+      <w:proofErr w:type="spellStart"/>
+      <w:r>
+        <w:t>apg</w:t>
+      </w:r>
+      <w:proofErr w:type="spellEnd"/>
+      <w:r>
+        <w:t xml:space="preserve"> I was using) whereas Narwhal and Otter use an </w:t>
+      </w:r>
+      <w:proofErr w:type="spellStart"/>
+      <w:r>
+        <w:t>apg</w:t>
+      </w:r>
+      <w:proofErr w:type="spellEnd"/>
+      <w:r>
+        <w:t xml:space="preserve"> from 4.0-8.13 meaning my </w:t>
+      </w:r>
+      <w:proofErr w:type="spellStart"/>
+      <w:r>
+        <w:t>apg</w:t>
+      </w:r>
+      <w:proofErr w:type="spellEnd"/>
+      <w:r>
+        <w:t xml:space="preserve"> would not work on the software used in grading. I fixed this by simply changing the </w:t>
+      </w:r>
+      <w:proofErr w:type="spellStart"/>
+      <w:r>
+        <w:t>apg</w:t>
+      </w:r>
+      <w:proofErr w:type="spellEnd"/>
+      <w:r>
+        <w:t xml:space="preserve"> version and updating any necessary files</w:t>
       </w:r>
       <w:r>
         <w:t>.</w:t>

</xml_diff>

<commit_message>
Futher fixes to SearchByType bug. Updated report to show changes
</commit_message>
<xml_diff>
--- a/MAD_Report.docx
+++ b/MAD_Report.docx
@@ -373,73 +373,7 @@
           <w:sz w:val="24"/>
           <w:szCs w:val="24"/>
         </w:rPr>
-        <w:t xml:space="preserve">I will first start with this task by setting up the dependencies in my </w:t>
-      </w:r>
-      <w:proofErr w:type="spellStart"/>
-      <w:proofErr w:type="gramStart"/>
-      <w:r>
-        <w:rPr>
-          <w:rFonts w:ascii="Trebuchet MS" w:eastAsia="Trebuchet MS" w:hAnsi="Trebuchet MS" w:cs="Trebuchet MS"/>
-          <w:sz w:val="24"/>
-          <w:szCs w:val="24"/>
-        </w:rPr>
-        <w:t>build.gradle</w:t>
-      </w:r>
-      <w:proofErr w:type="spellEnd"/>
-      <w:proofErr w:type="gramEnd"/>
-      <w:r>
-        <w:rPr>
-          <w:rFonts w:ascii="Trebuchet MS" w:eastAsia="Trebuchet MS" w:hAnsi="Trebuchet MS" w:cs="Trebuchet MS"/>
-          <w:sz w:val="24"/>
-          <w:szCs w:val="24"/>
-        </w:rPr>
-        <w:t xml:space="preserve"> and </w:t>
-      </w:r>
-      <w:proofErr w:type="spellStart"/>
-      <w:proofErr w:type="gramStart"/>
-      <w:r>
-        <w:rPr>
-          <w:rFonts w:ascii="Trebuchet MS" w:eastAsia="Trebuchet MS" w:hAnsi="Trebuchet MS" w:cs="Trebuchet MS"/>
-          <w:sz w:val="24"/>
-          <w:szCs w:val="24"/>
-        </w:rPr>
-        <w:t>libs.versions</w:t>
-      </w:r>
-      <w:proofErr w:type="gramEnd"/>
-      <w:r>
-        <w:rPr>
-          <w:rFonts w:ascii="Trebuchet MS" w:eastAsia="Trebuchet MS" w:hAnsi="Trebuchet MS" w:cs="Trebuchet MS"/>
-          <w:sz w:val="24"/>
-          <w:szCs w:val="24"/>
-        </w:rPr>
-        <w:t>.toml</w:t>
-      </w:r>
-      <w:proofErr w:type="spellEnd"/>
-      <w:r>
-        <w:rPr>
-          <w:rFonts w:ascii="Trebuchet MS" w:eastAsia="Trebuchet MS" w:hAnsi="Trebuchet MS" w:cs="Trebuchet MS"/>
-          <w:sz w:val="24"/>
-          <w:szCs w:val="24"/>
-        </w:rPr>
-        <w:t xml:space="preserve"> files. I will add </w:t>
-      </w:r>
-      <w:proofErr w:type="spellStart"/>
-      <w:r>
-        <w:rPr>
-          <w:rFonts w:ascii="Trebuchet MS" w:eastAsia="Trebuchet MS" w:hAnsi="Trebuchet MS" w:cs="Trebuchet MS"/>
-          <w:sz w:val="24"/>
-          <w:szCs w:val="24"/>
-        </w:rPr>
-        <w:t>MapLibre</w:t>
-      </w:r>
-      <w:proofErr w:type="spellEnd"/>
-      <w:r>
-        <w:rPr>
-          <w:rFonts w:ascii="Trebuchet MS" w:eastAsia="Trebuchet MS" w:hAnsi="Trebuchet MS" w:cs="Trebuchet MS"/>
-          <w:sz w:val="24"/>
-          <w:szCs w:val="24"/>
-        </w:rPr>
-        <w:t xml:space="preserve"> with Vulkan support, the Ramani Maps Compose wrapper, and the standard AndroidX libraries needed for Compose.</w:t>
+        <w:t>I will first start with this task by setting up the dependencies in my build.gradle and libs.versions.toml files. I will add MapLibre with Vulkan support, the Ramani Maps Compose wrapper, and the standard AndroidX libraries needed for Compose.</w:t>
       </w:r>
       <w:r>
         <w:rPr>
@@ -572,25 +506,7 @@
           <w:sz w:val="24"/>
           <w:szCs w:val="24"/>
         </w:rPr>
-        <w:t xml:space="preserve">Then in the AndroidManifest.xml, I will set up the ACCESS_FINE_LOCATION and ACCESS_COARSE_LOCATION permissions, as well as INTERNET, since the map tiles will be gathered remotely from </w:t>
-      </w:r>
-      <w:proofErr w:type="spellStart"/>
-      <w:r>
-        <w:rPr>
-          <w:rFonts w:ascii="Trebuchet MS" w:eastAsia="Trebuchet MS" w:hAnsi="Trebuchet MS" w:cs="Trebuchet MS"/>
-          <w:sz w:val="24"/>
-          <w:szCs w:val="24"/>
-        </w:rPr>
-        <w:t>OpenFreeMap</w:t>
-      </w:r>
-      <w:proofErr w:type="spellEnd"/>
-      <w:r>
-        <w:rPr>
-          <w:rFonts w:ascii="Trebuchet MS" w:eastAsia="Trebuchet MS" w:hAnsi="Trebuchet MS" w:cs="Trebuchet MS"/>
-          <w:sz w:val="24"/>
-          <w:szCs w:val="24"/>
-        </w:rPr>
-        <w:t>.</w:t>
+        <w:t>Then in the AndroidManifest.xml, I will set up the ACCESS_FINE_LOCATION and ACCESS_COARSE_LOCATION permissions, as well as INTERNET, since the map tiles will be gathered remotely from OpenFreeMap.</w:t>
       </w:r>
       <w:r>
         <w:rPr>
@@ -736,61 +652,7 @@
           <w:sz w:val="24"/>
           <w:szCs w:val="24"/>
         </w:rPr>
-        <w:t xml:space="preserve">To manage the location state in both the activity and UI, I will need to add a </w:t>
-      </w:r>
-      <w:proofErr w:type="spellStart"/>
-      <w:r>
-        <w:rPr>
-          <w:rFonts w:ascii="Trebuchet MS" w:eastAsia="Trebuchet MS" w:hAnsi="Trebuchet MS" w:cs="Trebuchet MS"/>
-          <w:sz w:val="24"/>
-          <w:szCs w:val="24"/>
-        </w:rPr>
-        <w:t>LatLngViewModel</w:t>
-      </w:r>
-      <w:proofErr w:type="spellEnd"/>
-      <w:r>
-        <w:rPr>
-          <w:rFonts w:ascii="Trebuchet MS" w:eastAsia="Trebuchet MS" w:hAnsi="Trebuchet MS" w:cs="Trebuchet MS"/>
-          <w:sz w:val="24"/>
-          <w:szCs w:val="24"/>
-        </w:rPr>
-        <w:t xml:space="preserve"> class that will hold a </w:t>
-      </w:r>
-      <w:proofErr w:type="spellStart"/>
-      <w:r>
-        <w:rPr>
-          <w:rFonts w:ascii="Trebuchet MS" w:eastAsia="Trebuchet MS" w:hAnsi="Trebuchet MS" w:cs="Trebuchet MS"/>
-          <w:sz w:val="24"/>
-          <w:szCs w:val="24"/>
-        </w:rPr>
-        <w:t>latLng</w:t>
-      </w:r>
-      <w:proofErr w:type="spellEnd"/>
-      <w:r>
-        <w:rPr>
-          <w:rFonts w:ascii="Trebuchet MS" w:eastAsia="Trebuchet MS" w:hAnsi="Trebuchet MS" w:cs="Trebuchet MS"/>
-          <w:sz w:val="24"/>
-          <w:szCs w:val="24"/>
-        </w:rPr>
-        <w:t xml:space="preserve"> property backed by a </w:t>
-      </w:r>
-      <w:proofErr w:type="spellStart"/>
-      <w:r>
-        <w:rPr>
-          <w:rFonts w:ascii="Trebuchet MS" w:eastAsia="Trebuchet MS" w:hAnsi="Trebuchet MS" w:cs="Trebuchet MS"/>
-          <w:sz w:val="24"/>
-          <w:szCs w:val="24"/>
-        </w:rPr>
-        <w:t>MutableLiveData</w:t>
-      </w:r>
-      <w:proofErr w:type="spellEnd"/>
-      <w:r>
-        <w:rPr>
-          <w:rFonts w:ascii="Trebuchet MS" w:eastAsia="Trebuchet MS" w:hAnsi="Trebuchet MS" w:cs="Trebuchet MS"/>
-          <w:sz w:val="24"/>
-          <w:szCs w:val="24"/>
-        </w:rPr>
-        <w:t xml:space="preserve"> object. </w:t>
+        <w:t xml:space="preserve">To manage the location state in both the activity and UI, I will need to add a LatLngViewModel class that will hold a latLng property backed by a MutableLiveData object. </w:t>
       </w:r>
     </w:p>
     <w:p>
@@ -817,43 +679,7 @@
           <w:szCs w:val="24"/>
         </w:rPr>
         <w:lastRenderedPageBreak/>
-        <w:t xml:space="preserve">Whenever the </w:t>
-      </w:r>
-      <w:proofErr w:type="spellStart"/>
-      <w:r>
-        <w:rPr>
-          <w:rFonts w:ascii="Trebuchet MS" w:eastAsia="Trebuchet MS" w:hAnsi="Trebuchet MS" w:cs="Trebuchet MS"/>
-          <w:sz w:val="24"/>
-          <w:szCs w:val="24"/>
-        </w:rPr>
-        <w:t>latLng</w:t>
-      </w:r>
-      <w:proofErr w:type="spellEnd"/>
-      <w:r>
-        <w:rPr>
-          <w:rFonts w:ascii="Trebuchet MS" w:eastAsia="Trebuchet MS" w:hAnsi="Trebuchet MS" w:cs="Trebuchet MS"/>
-          <w:sz w:val="24"/>
-          <w:szCs w:val="24"/>
-        </w:rPr>
-        <w:t xml:space="preserve"> is updated, i.e. the user's location changes, it should automatically push the new value to </w:t>
-      </w:r>
-      <w:proofErr w:type="spellStart"/>
-      <w:r>
-        <w:rPr>
-          <w:rFonts w:ascii="Trebuchet MS" w:eastAsia="Trebuchet MS" w:hAnsi="Trebuchet MS" w:cs="Trebuchet MS"/>
-          <w:sz w:val="24"/>
-          <w:szCs w:val="24"/>
-        </w:rPr>
-        <w:t>latLngLiveData</w:t>
-      </w:r>
-      <w:proofErr w:type="spellEnd"/>
-      <w:r>
-        <w:rPr>
-          <w:rFonts w:ascii="Trebuchet MS" w:eastAsia="Trebuchet MS" w:hAnsi="Trebuchet MS" w:cs="Trebuchet MS"/>
-          <w:sz w:val="24"/>
-          <w:szCs w:val="24"/>
-        </w:rPr>
-        <w:t xml:space="preserve">, making it observable from the UI layer.  </w:t>
+        <w:t xml:space="preserve">Whenever the latLng is updated, i.e. the user's location changes, it should automatically push the new value to latLngLiveData, making it observable from the UI layer.  </w:t>
       </w:r>
     </w:p>
     <w:p>
@@ -945,97 +771,7 @@
           <w:sz w:val="24"/>
           <w:szCs w:val="24"/>
         </w:rPr>
-        <w:t xml:space="preserve">In the </w:t>
-      </w:r>
-      <w:proofErr w:type="spellStart"/>
-      <w:r>
-        <w:rPr>
-          <w:rFonts w:ascii="Trebuchet MS" w:eastAsia="Trebuchet MS" w:hAnsi="Trebuchet MS" w:cs="Trebuchet MS"/>
-          <w:sz w:val="24"/>
-          <w:szCs w:val="24"/>
-        </w:rPr>
-        <w:t>MainActivity</w:t>
-      </w:r>
-      <w:proofErr w:type="spellEnd"/>
-      <w:r>
-        <w:rPr>
-          <w:rFonts w:ascii="Trebuchet MS" w:eastAsia="Trebuchet MS" w:hAnsi="Trebuchet MS" w:cs="Trebuchet MS"/>
-          <w:sz w:val="24"/>
-          <w:szCs w:val="24"/>
-        </w:rPr>
-        <w:t xml:space="preserve">, I will add the </w:t>
-      </w:r>
-      <w:proofErr w:type="spellStart"/>
-      <w:r>
-        <w:rPr>
-          <w:rFonts w:ascii="Trebuchet MS" w:eastAsia="Trebuchet MS" w:hAnsi="Trebuchet MS" w:cs="Trebuchet MS"/>
-          <w:sz w:val="24"/>
-          <w:szCs w:val="24"/>
-        </w:rPr>
-        <w:t>LocationListener</w:t>
-      </w:r>
-      <w:proofErr w:type="spellEnd"/>
-      <w:r>
-        <w:rPr>
-          <w:rFonts w:ascii="Trebuchet MS" w:eastAsia="Trebuchet MS" w:hAnsi="Trebuchet MS" w:cs="Trebuchet MS"/>
-          <w:sz w:val="24"/>
-          <w:szCs w:val="24"/>
-        </w:rPr>
-        <w:t xml:space="preserve"> interface. This will allow me to override the </w:t>
-      </w:r>
-      <w:proofErr w:type="spellStart"/>
-      <w:r>
-        <w:rPr>
-          <w:rFonts w:ascii="Trebuchet MS" w:eastAsia="Trebuchet MS" w:hAnsi="Trebuchet MS" w:cs="Trebuchet MS"/>
-          <w:sz w:val="24"/>
-          <w:szCs w:val="24"/>
-        </w:rPr>
-        <w:t>onLocationChanged</w:t>
-      </w:r>
-      <w:proofErr w:type="spellEnd"/>
-      <w:r>
-        <w:rPr>
-          <w:rFonts w:ascii="Trebuchet MS" w:eastAsia="Trebuchet MS" w:hAnsi="Trebuchet MS" w:cs="Trebuchet MS"/>
-          <w:sz w:val="24"/>
-          <w:szCs w:val="24"/>
-        </w:rPr>
-        <w:t xml:space="preserve"> function, where I will update the </w:t>
-      </w:r>
-      <w:proofErr w:type="spellStart"/>
-      <w:r>
-        <w:rPr>
-          <w:rFonts w:ascii="Trebuchet MS" w:eastAsia="Trebuchet MS" w:hAnsi="Trebuchet MS" w:cs="Trebuchet MS"/>
-          <w:sz w:val="24"/>
-          <w:szCs w:val="24"/>
-        </w:rPr>
-        <w:t>ViewModel's</w:t>
-      </w:r>
-      <w:proofErr w:type="spellEnd"/>
-      <w:r>
-        <w:rPr>
-          <w:rFonts w:ascii="Trebuchet MS" w:eastAsia="Trebuchet MS" w:hAnsi="Trebuchet MS" w:cs="Trebuchet MS"/>
-          <w:sz w:val="24"/>
-          <w:szCs w:val="24"/>
-        </w:rPr>
-        <w:t xml:space="preserve"> </w:t>
-      </w:r>
-      <w:proofErr w:type="spellStart"/>
-      <w:r>
-        <w:rPr>
-          <w:rFonts w:ascii="Trebuchet MS" w:eastAsia="Trebuchet MS" w:hAnsi="Trebuchet MS" w:cs="Trebuchet MS"/>
-          <w:sz w:val="24"/>
-          <w:szCs w:val="24"/>
-        </w:rPr>
-        <w:t>latLng</w:t>
-      </w:r>
-      <w:proofErr w:type="spellEnd"/>
-      <w:r>
-        <w:rPr>
-          <w:rFonts w:ascii="Trebuchet MS" w:eastAsia="Trebuchet MS" w:hAnsi="Trebuchet MS" w:cs="Trebuchet MS"/>
-          <w:sz w:val="24"/>
-          <w:szCs w:val="24"/>
-        </w:rPr>
-        <w:t xml:space="preserve"> with the current coordinates gathered by the device itself.</w:t>
+        <w:t>In the MainActivity, I will add the LocationListener interface. This will allow me to override the onLocationChanged function, where I will update the ViewModel's latLng with the current coordinates gathered by the device itself.</w:t>
       </w:r>
       <w:r>
         <w:rPr>
@@ -1175,61 +911,7 @@
           <w:sz w:val="24"/>
           <w:szCs w:val="24"/>
         </w:rPr>
-        <w:t xml:space="preserve">To start receiving GPS updates, I will create a GPS function that will retrieve the </w:t>
-      </w:r>
-      <w:proofErr w:type="spellStart"/>
-      <w:r>
-        <w:rPr>
-          <w:rFonts w:ascii="Trebuchet MS" w:eastAsia="Trebuchet MS" w:hAnsi="Trebuchet MS" w:cs="Trebuchet MS"/>
-          <w:sz w:val="24"/>
-          <w:szCs w:val="24"/>
-        </w:rPr>
-        <w:t>LocationManager</w:t>
-      </w:r>
-      <w:proofErr w:type="spellEnd"/>
-      <w:r>
-        <w:rPr>
-          <w:rFonts w:ascii="Trebuchet MS" w:eastAsia="Trebuchet MS" w:hAnsi="Trebuchet MS" w:cs="Trebuchet MS"/>
-          <w:sz w:val="24"/>
-          <w:szCs w:val="24"/>
-        </w:rPr>
-        <w:t xml:space="preserve"> system service and call </w:t>
-      </w:r>
-      <w:proofErr w:type="spellStart"/>
-      <w:r>
-        <w:rPr>
-          <w:rFonts w:ascii="Trebuchet MS" w:eastAsia="Trebuchet MS" w:hAnsi="Trebuchet MS" w:cs="Trebuchet MS"/>
-          <w:sz w:val="24"/>
-          <w:szCs w:val="24"/>
-        </w:rPr>
-        <w:t>requestLocationUpdates</w:t>
-      </w:r>
-      <w:proofErr w:type="spellEnd"/>
-      <w:r>
-        <w:rPr>
-          <w:rFonts w:ascii="Trebuchet MS" w:eastAsia="Trebuchet MS" w:hAnsi="Trebuchet MS" w:cs="Trebuchet MS"/>
-          <w:sz w:val="24"/>
-          <w:szCs w:val="24"/>
-        </w:rPr>
-        <w:t xml:space="preserve">, which I will set to update every 2 seconds or after 5 </w:t>
-      </w:r>
-      <w:proofErr w:type="spellStart"/>
-      <w:r>
-        <w:rPr>
-          <w:rFonts w:ascii="Trebuchet MS" w:eastAsia="Trebuchet MS" w:hAnsi="Trebuchet MS" w:cs="Trebuchet MS"/>
-          <w:sz w:val="24"/>
-          <w:szCs w:val="24"/>
-        </w:rPr>
-        <w:t>metres</w:t>
-      </w:r>
-      <w:proofErr w:type="spellEnd"/>
-      <w:r>
-        <w:rPr>
-          <w:rFonts w:ascii="Trebuchet MS" w:eastAsia="Trebuchet MS" w:hAnsi="Trebuchet MS" w:cs="Trebuchet MS"/>
-          <w:sz w:val="24"/>
-          <w:szCs w:val="24"/>
-        </w:rPr>
-        <w:t xml:space="preserve"> of movement. This will keep the GPS accurate without slowing the machine down too much.</w:t>
+        <w:t>To start receiving GPS updates, I will create a GPS function that will retrieve the LocationManager system service and call requestLocationUpdates, which I will set to update every 2 seconds or after 5 metres of movement. This will keep the GPS accurate without slowing the machine down too much.</w:t>
       </w:r>
       <w:r>
         <w:rPr>
@@ -1352,35 +1034,7 @@
           <w:sz w:val="24"/>
           <w:szCs w:val="24"/>
         </w:rPr>
-        <w:t xml:space="preserve">I will also write a </w:t>
-      </w:r>
-      <w:proofErr w:type="spellStart"/>
-      <w:proofErr w:type="gramStart"/>
-      <w:r>
-        <w:rPr>
-          <w:rFonts w:ascii="Trebuchet MS" w:eastAsia="Trebuchet MS" w:hAnsi="Trebuchet MS" w:cs="Trebuchet MS"/>
-          <w:sz w:val="24"/>
-          <w:szCs w:val="24"/>
-        </w:rPr>
-        <w:t>checkPermissions</w:t>
-      </w:r>
-      <w:proofErr w:type="spellEnd"/>
-      <w:r>
-        <w:rPr>
-          <w:rFonts w:ascii="Trebuchet MS" w:eastAsia="Trebuchet MS" w:hAnsi="Trebuchet MS" w:cs="Trebuchet MS"/>
-          <w:sz w:val="24"/>
-          <w:szCs w:val="24"/>
-        </w:rPr>
-        <w:t xml:space="preserve"> function</w:t>
-      </w:r>
-      <w:proofErr w:type="gramEnd"/>
-      <w:r>
-        <w:rPr>
-          <w:rFonts w:ascii="Trebuchet MS" w:eastAsia="Trebuchet MS" w:hAnsi="Trebuchet MS" w:cs="Trebuchet MS"/>
-          <w:sz w:val="24"/>
-          <w:szCs w:val="24"/>
-        </w:rPr>
-        <w:t xml:space="preserve"> that will check whether the location permission has already been granted. If they haven’t, then it will launch a permission request. This will make sure that the GPS function is only called if the user approves the use of their location. A Toast message was shown if they denied it.</w:t>
+        <w:t>I will also write a checkPermissions function that will check whether the location permission has already been granted. If they haven’t, then it will launch a permission request. This will make sure that the GPS function is only called if the user approves the use of their location. A Toast message was shown if they denied it.</w:t>
       </w:r>
     </w:p>
     <w:p>
@@ -1511,187 +1165,7 @@
           <w:sz w:val="24"/>
           <w:szCs w:val="24"/>
         </w:rPr>
-        <w:t xml:space="preserve">Inside the </w:t>
-      </w:r>
-      <w:proofErr w:type="spellStart"/>
-      <w:r>
-        <w:rPr>
-          <w:rFonts w:ascii="Trebuchet MS" w:eastAsia="Trebuchet MS" w:hAnsi="Trebuchet MS" w:cs="Trebuchet MS"/>
-          <w:sz w:val="24"/>
-          <w:szCs w:val="24"/>
-        </w:rPr>
-        <w:t>setContent</w:t>
-      </w:r>
-      <w:proofErr w:type="spellEnd"/>
-      <w:r>
-        <w:rPr>
-          <w:rFonts w:ascii="Trebuchet MS" w:eastAsia="Trebuchet MS" w:hAnsi="Trebuchet MS" w:cs="Trebuchet MS"/>
-          <w:sz w:val="24"/>
-          <w:szCs w:val="24"/>
-        </w:rPr>
-        <w:t xml:space="preserve"> itself, I will use a </w:t>
-      </w:r>
-      <w:proofErr w:type="spellStart"/>
-      <w:r>
-        <w:rPr>
-          <w:rFonts w:ascii="Trebuchet MS" w:eastAsia="Trebuchet MS" w:hAnsi="Trebuchet MS" w:cs="Trebuchet MS"/>
-          <w:sz w:val="24"/>
-          <w:szCs w:val="24"/>
-        </w:rPr>
-        <w:t>mutablestate</w:t>
-      </w:r>
-      <w:proofErr w:type="spellEnd"/>
-      <w:r>
-        <w:rPr>
-          <w:rFonts w:ascii="Trebuchet MS" w:eastAsia="Trebuchet MS" w:hAnsi="Trebuchet MS" w:cs="Trebuchet MS"/>
-          <w:sz w:val="24"/>
-          <w:szCs w:val="24"/>
-        </w:rPr>
-        <w:t xml:space="preserve"> variable to hold the current </w:t>
-      </w:r>
-      <w:proofErr w:type="spellStart"/>
-      <w:r>
-        <w:rPr>
-          <w:rFonts w:ascii="Trebuchet MS" w:eastAsia="Trebuchet MS" w:hAnsi="Trebuchet MS" w:cs="Trebuchet MS"/>
-          <w:sz w:val="24"/>
-          <w:szCs w:val="24"/>
-        </w:rPr>
-        <w:t>LatLng</w:t>
-      </w:r>
-      <w:proofErr w:type="spellEnd"/>
-      <w:r>
-        <w:rPr>
-          <w:rFonts w:ascii="Trebuchet MS" w:eastAsia="Trebuchet MS" w:hAnsi="Trebuchet MS" w:cs="Trebuchet MS"/>
-          <w:sz w:val="24"/>
-          <w:szCs w:val="24"/>
-        </w:rPr>
-        <w:t xml:space="preserve"> and zoom level, observed the </w:t>
-      </w:r>
-      <w:proofErr w:type="spellStart"/>
-      <w:r>
-        <w:rPr>
-          <w:rFonts w:ascii="Trebuchet MS" w:eastAsia="Trebuchet MS" w:hAnsi="Trebuchet MS" w:cs="Trebuchet MS"/>
-          <w:sz w:val="24"/>
-          <w:szCs w:val="24"/>
-        </w:rPr>
-        <w:t>ViewModel's</w:t>
-      </w:r>
-      <w:proofErr w:type="spellEnd"/>
-      <w:r>
-        <w:rPr>
-          <w:rFonts w:ascii="Trebuchet MS" w:eastAsia="Trebuchet MS" w:hAnsi="Trebuchet MS" w:cs="Trebuchet MS"/>
-          <w:sz w:val="24"/>
-          <w:szCs w:val="24"/>
-        </w:rPr>
-        <w:t xml:space="preserve"> </w:t>
-      </w:r>
-      <w:proofErr w:type="spellStart"/>
-      <w:r>
-        <w:rPr>
-          <w:rFonts w:ascii="Trebuchet MS" w:eastAsia="Trebuchet MS" w:hAnsi="Trebuchet MS" w:cs="Trebuchet MS"/>
-          <w:sz w:val="24"/>
-          <w:szCs w:val="24"/>
-        </w:rPr>
-        <w:t>LiveData</w:t>
-      </w:r>
-      <w:proofErr w:type="spellEnd"/>
-      <w:r>
-        <w:rPr>
-          <w:rFonts w:ascii="Trebuchet MS" w:eastAsia="Trebuchet MS" w:hAnsi="Trebuchet MS" w:cs="Trebuchet MS"/>
-          <w:sz w:val="24"/>
-          <w:szCs w:val="24"/>
-        </w:rPr>
-        <w:t xml:space="preserve"> to keep that state updated, and pass the values into a </w:t>
-      </w:r>
-      <w:proofErr w:type="spellStart"/>
-      <w:r>
-        <w:rPr>
-          <w:rFonts w:ascii="Trebuchet MS" w:eastAsia="Trebuchet MS" w:hAnsi="Trebuchet MS" w:cs="Trebuchet MS"/>
-          <w:sz w:val="24"/>
-          <w:szCs w:val="24"/>
-        </w:rPr>
-        <w:t>MapLibre</w:t>
-      </w:r>
-      <w:proofErr w:type="spellEnd"/>
-      <w:r>
-        <w:rPr>
-          <w:rFonts w:ascii="Trebuchet MS" w:eastAsia="Trebuchet MS" w:hAnsi="Trebuchet MS" w:cs="Trebuchet MS"/>
-          <w:sz w:val="24"/>
-          <w:szCs w:val="24"/>
-        </w:rPr>
-        <w:t xml:space="preserve"> composable via a </w:t>
-      </w:r>
-      <w:proofErr w:type="spellStart"/>
-      <w:r>
-        <w:rPr>
-          <w:rFonts w:ascii="Trebuchet MS" w:eastAsia="Trebuchet MS" w:hAnsi="Trebuchet MS" w:cs="Trebuchet MS"/>
-          <w:sz w:val="24"/>
-          <w:szCs w:val="24"/>
-        </w:rPr>
-        <w:t>CameraPosition</w:t>
-      </w:r>
-      <w:proofErr w:type="spellEnd"/>
-      <w:r>
-        <w:rPr>
-          <w:rFonts w:ascii="Trebuchet MS" w:eastAsia="Trebuchet MS" w:hAnsi="Trebuchet MS" w:cs="Trebuchet MS"/>
-          <w:sz w:val="24"/>
-          <w:szCs w:val="24"/>
-        </w:rPr>
-        <w:t xml:space="preserve">, causing the map to </w:t>
-      </w:r>
-      <w:proofErr w:type="spellStart"/>
-      <w:r>
-        <w:rPr>
-          <w:rFonts w:ascii="Trebuchet MS" w:eastAsia="Trebuchet MS" w:hAnsi="Trebuchet MS" w:cs="Trebuchet MS"/>
-          <w:sz w:val="24"/>
-          <w:szCs w:val="24"/>
-        </w:rPr>
-        <w:t>recentre</w:t>
-      </w:r>
-      <w:proofErr w:type="spellEnd"/>
-      <w:r>
-        <w:rPr>
-          <w:rFonts w:ascii="Trebuchet MS" w:eastAsia="Trebuchet MS" w:hAnsi="Trebuchet MS" w:cs="Trebuchet MS"/>
-          <w:sz w:val="24"/>
-          <w:szCs w:val="24"/>
-        </w:rPr>
-        <w:t xml:space="preserve"> automatically whenever the user's location changed. This was all placed inside a Scaffold with </w:t>
-      </w:r>
-      <w:proofErr w:type="spellStart"/>
-      <w:r>
-        <w:rPr>
-          <w:rFonts w:ascii="Trebuchet MS" w:eastAsia="Trebuchet MS" w:hAnsi="Trebuchet MS" w:cs="Trebuchet MS"/>
-          <w:sz w:val="24"/>
-          <w:szCs w:val="24"/>
-        </w:rPr>
-        <w:t>innerpadding</w:t>
-      </w:r>
-      <w:proofErr w:type="spellEnd"/>
-      <w:r>
-        <w:rPr>
-          <w:rFonts w:ascii="Trebuchet MS" w:eastAsia="Trebuchet MS" w:hAnsi="Trebuchet MS" w:cs="Trebuchet MS"/>
-          <w:sz w:val="24"/>
-          <w:szCs w:val="24"/>
-        </w:rPr>
-        <w:t xml:space="preserve"> to prevent any overlap of the </w:t>
-      </w:r>
-      <w:proofErr w:type="gramStart"/>
-      <w:r>
-        <w:rPr>
-          <w:rFonts w:ascii="Trebuchet MS" w:eastAsia="Trebuchet MS" w:hAnsi="Trebuchet MS" w:cs="Trebuchet MS"/>
-          <w:sz w:val="24"/>
-          <w:szCs w:val="24"/>
-        </w:rPr>
-        <w:t>devices</w:t>
-      </w:r>
-      <w:proofErr w:type="gramEnd"/>
-      <w:r>
-        <w:rPr>
-          <w:rFonts w:ascii="Trebuchet MS" w:eastAsia="Trebuchet MS" w:hAnsi="Trebuchet MS" w:cs="Trebuchet MS"/>
-          <w:sz w:val="24"/>
-          <w:szCs w:val="24"/>
-        </w:rPr>
-        <w:t xml:space="preserve"> interfaces with the application itself.</w:t>
+        <w:t>Inside the setContent itself, I will use a mutablestate variable to hold the current LatLng and zoom level, observed the ViewModel's LiveData to keep that state updated, and pass the values into a MapLibre composable via a CameraPosition, causing the map to recentre automatically whenever the user's location changed. This was all placed inside a Scaffold with innerpadding to prevent any overlap of the devices interfaces with the application itself.</w:t>
       </w:r>
     </w:p>
     <w:p>
@@ -1791,29 +1265,7 @@
           <w:sz w:val="24"/>
           <w:szCs w:val="24"/>
         </w:rPr>
-        <w:t xml:space="preserve">- type (pub, restaurant, hotel, historical site, </w:t>
-      </w:r>
-      <w:proofErr w:type="spellStart"/>
-      <w:r>
-        <w:rPr>
-          <w:rFonts w:ascii="Trebuchet MS" w:hAnsi="Trebuchet MS"/>
-          <w:i/>
-          <w:iCs/>
-          <w:sz w:val="24"/>
-          <w:szCs w:val="24"/>
-        </w:rPr>
-        <w:t>etc</w:t>
-      </w:r>
-      <w:proofErr w:type="spellEnd"/>
-      <w:r>
-        <w:rPr>
-          <w:rFonts w:ascii="Trebuchet MS" w:hAnsi="Trebuchet MS"/>
-          <w:i/>
-          <w:iCs/>
-          <w:sz w:val="24"/>
-          <w:szCs w:val="24"/>
-        </w:rPr>
-        <w:t>);</w:t>
+        <w:t>- type (pub, restaurant, hotel, historical site, etc);</w:t>
       </w:r>
     </w:p>
     <w:p>
@@ -1908,31 +1360,7 @@
           <w:sz w:val="24"/>
           <w:szCs w:val="24"/>
         </w:rPr>
-        <w:t xml:space="preserve">For </w:t>
-      </w:r>
-      <w:proofErr w:type="gramStart"/>
-      <w:r>
-        <w:rPr>
-          <w:rFonts w:ascii="Trebuchet MS" w:hAnsi="Trebuchet MS"/>
-          <w:i/>
-          <w:iCs/>
-          <w:color w:val="000000"/>
-          <w:sz w:val="24"/>
-          <w:szCs w:val="24"/>
-        </w:rPr>
-        <w:t>now</w:t>
-      </w:r>
-      <w:proofErr w:type="gramEnd"/>
-      <w:r>
-        <w:rPr>
-          <w:rFonts w:ascii="Trebuchet MS" w:hAnsi="Trebuchet MS"/>
-          <w:i/>
-          <w:iCs/>
-          <w:color w:val="000000"/>
-          <w:sz w:val="24"/>
-          <w:szCs w:val="24"/>
-        </w:rPr>
-        <w:t xml:space="preserve"> you can just use buttons for navigation – there is no need to use an app bar, a navigation bar, or the navigation drawer just yet.</w:t>
+        <w:t>For now you can just use buttons for navigation – there is no need to use an app bar, a navigation bar, or the navigation drawer just yet.</w:t>
       </w:r>
       <w:r>
         <w:rPr>
@@ -2052,13 +1480,8 @@
       <w:r>
         <w:t xml:space="preserve"> </w:t>
       </w:r>
-      <w:proofErr w:type="spellStart"/>
-      <w:r>
-        <w:t>ViewModel</w:t>
-      </w:r>
-      <w:proofErr w:type="spellEnd"/>
-      <w:r>
-        <w:t>.</w:t>
+      <w:r>
+        <w:t>ViewModel.</w:t>
       </w:r>
     </w:p>
     <w:p>
@@ -2076,58 +1499,13 @@
         <w:ind w:left="720"/>
       </w:pPr>
       <w:r>
-        <w:t xml:space="preserve">I then plan to update my </w:t>
-      </w:r>
-      <w:proofErr w:type="spellStart"/>
-      <w:r>
-        <w:t>LatLng</w:t>
-      </w:r>
-      <w:proofErr w:type="spellEnd"/>
-      <w:r>
-        <w:t xml:space="preserve"> </w:t>
-      </w:r>
-      <w:proofErr w:type="spellStart"/>
-      <w:r>
-        <w:t>ViewModel</w:t>
-      </w:r>
-      <w:proofErr w:type="spellEnd"/>
-      <w:r>
-        <w:t xml:space="preserve"> to also include the POI list rather than adding a second </w:t>
-      </w:r>
-      <w:proofErr w:type="spellStart"/>
-      <w:r>
-        <w:t>ViewModel</w:t>
-      </w:r>
-      <w:proofErr w:type="spellEnd"/>
-      <w:r>
-        <w:t xml:space="preserve"> as this already holds the GPS location. I will add </w:t>
-      </w:r>
-      <w:proofErr w:type="spellStart"/>
-      <w:r>
-        <w:t>MutableLiveData</w:t>
-      </w:r>
-      <w:proofErr w:type="spellEnd"/>
-      <w:r>
-        <w:t>&lt;List&lt;Poi&gt;&gt;</w:t>
-      </w:r>
-      <w:r>
-        <w:t xml:space="preserve"> so that the </w:t>
-      </w:r>
-      <w:proofErr w:type="spellStart"/>
-      <w:r>
-        <w:t>MainActivity</w:t>
-      </w:r>
-      <w:proofErr w:type="spellEnd"/>
-      <w:r>
-        <w:t xml:space="preserve"> can observe the list, meaning that whenever a POI is added the UI can then automatically know to redraw any makers on the map. I will then add a function to the </w:t>
-      </w:r>
-      <w:proofErr w:type="spellStart"/>
-      <w:r>
-        <w:t>ViewModel</w:t>
-      </w:r>
-      <w:proofErr w:type="spellEnd"/>
-      <w:r>
-        <w:t xml:space="preserve"> which will add a </w:t>
+        <w:t xml:space="preserve">I then plan to update my LatLng ViewModel to also include the POI list rather than adding a second ViewModel as this already holds the GPS location. I will add </w:t>
+      </w:r>
+      <w:r>
+        <w:t>MutableLiveData&lt;List&lt;Poi&gt;&gt;</w:t>
+      </w:r>
+      <w:r>
+        <w:t xml:space="preserve"> so that the MainActivity can observe the list, meaning that whenever a POI is added the UI can then automatically know to redraw any makers on the map. I will then add a function to the ViewModel which will add a </w:t>
       </w:r>
       <w:r>
         <w:t xml:space="preserve">given </w:t>
@@ -2273,29 +1651,13 @@
         <w:t>I will then add a separate composable for the POI screen</w:t>
       </w:r>
       <w:r>
-        <w:t xml:space="preserve">. I plan to put this in its own separate file to prevent code from clustering in the </w:t>
-      </w:r>
-      <w:proofErr w:type="spellStart"/>
-      <w:r>
-        <w:t>MainActivity</w:t>
-      </w:r>
-      <w:proofErr w:type="spellEnd"/>
-      <w:r>
-        <w:t>.</w:t>
+        <w:t>. I plan to put this in its own separate file to prevent code from clustering in the MainActivity.</w:t>
       </w:r>
       <w:r>
         <w:t xml:space="preserve"> I will add two callback functions to the parameter of the composable. One will be for when a POI I added and the other will be for when the user wishes to navigate back to the home screen.</w:t>
       </w:r>
       <w:r>
-        <w:t xml:space="preserve"> I will also make it so the users current </w:t>
-      </w:r>
-      <w:proofErr w:type="spellStart"/>
-      <w:r>
-        <w:t>LatLng</w:t>
-      </w:r>
-      <w:proofErr w:type="spellEnd"/>
-      <w:r>
-        <w:t xml:space="preserve"> is also passed as a parameter for the POIs location.</w:t>
+        <w:t xml:space="preserve"> I will also make it so the users current LatLng is also passed as a parameter for the POIs location.</w:t>
       </w:r>
       <w:r>
         <w:t xml:space="preserve"> </w:t>
@@ -2370,76 +1732,23 @@
         </w:drawing>
       </w:r>
       <w:r>
-        <w:t xml:space="preserve">I will finally update the main composable to include the map page and the add poi page using the compose navigation. I will add the </w:t>
-      </w:r>
-      <w:proofErr w:type="spellStart"/>
-      <w:r>
-        <w:t>NavHost</w:t>
-      </w:r>
-      <w:proofErr w:type="spellEnd"/>
-      <w:r>
-        <w:t xml:space="preserve"> which will contain the two routes for the map page and the add poi page. I will then be able to define the callback functions for the </w:t>
-      </w:r>
-      <w:proofErr w:type="spellStart"/>
-      <w:r>
-        <w:t>onPoiAdded</w:t>
-      </w:r>
-      <w:proofErr w:type="spellEnd"/>
-      <w:r>
-        <w:t xml:space="preserve"> and </w:t>
-      </w:r>
-      <w:proofErr w:type="spellStart"/>
-      <w:r>
-        <w:t>onNavigateBack</w:t>
-      </w:r>
-      <w:proofErr w:type="spellEnd"/>
+        <w:t xml:space="preserve">I will finally update the main composable to include the map page and the add poi page using the compose navigation. I will add the NavHost which will contain the two routes for the map page and the add poi page. I will then be able to define the callback functions for the onPoiAdded and onNavigateBack. onPoiAdded will add the new poi to the ViewModel and the onNavigateBack will return the user to the previous page they were on. </w:t>
+      </w:r>
+      <w:r>
+        <w:t xml:space="preserve">I will place a </w:t>
+      </w:r>
+      <w:r>
+        <w:t xml:space="preserve">Symbol marker inside </w:t>
+      </w:r>
+      <w:r>
+        <w:t xml:space="preserve">the </w:t>
+      </w:r>
+      <w:r>
+        <w:t>MapLibre lambda</w:t>
+      </w:r>
       <w:r>
         <w:t xml:space="preserve">. </w:t>
       </w:r>
-      <w:proofErr w:type="spellStart"/>
-      <w:r>
-        <w:t>onPoiAdded</w:t>
-      </w:r>
-      <w:proofErr w:type="spellEnd"/>
-      <w:r>
-        <w:t xml:space="preserve"> will add the new poi to the </w:t>
-      </w:r>
-      <w:proofErr w:type="spellStart"/>
-      <w:r>
-        <w:t>ViewModel</w:t>
-      </w:r>
-      <w:proofErr w:type="spellEnd"/>
-      <w:r>
-        <w:t xml:space="preserve"> and the </w:t>
-      </w:r>
-      <w:proofErr w:type="spellStart"/>
-      <w:r>
-        <w:t>onNavigateBack</w:t>
-      </w:r>
-      <w:proofErr w:type="spellEnd"/>
-      <w:r>
-        <w:t xml:space="preserve"> will return the user to the previous page they were on. </w:t>
-      </w:r>
-      <w:r>
-        <w:t xml:space="preserve">I will place a </w:t>
-      </w:r>
-      <w:r>
-        <w:t xml:space="preserve">Symbol marker inside </w:t>
-      </w:r>
-      <w:r>
-        <w:t xml:space="preserve">the </w:t>
-      </w:r>
-      <w:proofErr w:type="spellStart"/>
-      <w:r>
-        <w:t>MapLibre</w:t>
-      </w:r>
-      <w:proofErr w:type="spellEnd"/>
-      <w:r>
-        <w:t xml:space="preserve"> lambda</w:t>
-      </w:r>
-      <w:r>
-        <w:t xml:space="preserve">. </w:t>
-      </w:r>
       <w:r>
         <w:t xml:space="preserve">The map </w:t>
       </w:r>
@@ -2453,43 +1762,20 @@
         <w:t xml:space="preserve"> the</w:t>
       </w:r>
       <w:r>
-        <w:t xml:space="preserve"> </w:t>
-      </w:r>
-      <w:proofErr w:type="spellStart"/>
-      <w:proofErr w:type="gramStart"/>
-      <w:r>
-        <w:t>poisState</w:t>
-      </w:r>
-      <w:proofErr w:type="spellEnd"/>
-      <w:proofErr w:type="gramEnd"/>
-      <w:r>
-        <w:t xml:space="preserve"> changes</w:t>
+        <w:t xml:space="preserve"> poisState changes</w:t>
       </w:r>
       <w:r>
         <w:t>. This will then</w:t>
       </w:r>
       <w:r>
-        <w:t xml:space="preserve"> loop through </w:t>
-      </w:r>
-      <w:proofErr w:type="spellStart"/>
-      <w:r>
-        <w:t>poisState</w:t>
-      </w:r>
-      <w:proofErr w:type="spellEnd"/>
-      <w:r>
-        <w:t xml:space="preserve"> and plac</w:t>
+        <w:t xml:space="preserve"> loop through poisState and plac</w:t>
       </w:r>
       <w:r>
         <w:t>e</w:t>
       </w:r>
       <w:r>
-        <w:t xml:space="preserve"> a Symbol at each POI's </w:t>
-      </w:r>
-      <w:proofErr w:type="spellStart"/>
-      <w:r>
-        <w:t>LatLng</w:t>
-      </w:r>
-      <w:proofErr w:type="spellEnd"/>
+        <w:t xml:space="preserve"> a Symbol at each POI's LatLng</w:t>
+      </w:r>
       <w:r>
         <w:t>. This makes it so</w:t>
       </w:r>
@@ -2500,15 +1786,7 @@
         <w:t>.</w:t>
       </w:r>
       <w:r>
-        <w:t xml:space="preserve"> I will make </w:t>
-      </w:r>
-      <w:proofErr w:type="gramStart"/>
-      <w:r>
-        <w:t>it</w:t>
-      </w:r>
-      <w:proofErr w:type="gramEnd"/>
-      <w:r>
-        <w:t xml:space="preserve"> so an alert dialog appears when the marker is clicked on, displaying the markers details including its name, type and description. This allows me to test that the marker has been added correctly.</w:t>
+        <w:t xml:space="preserve"> I will make it so an alert dialog appears when the marker is clicked on, displaying the markers details including its name, type and description. This allows me to test that the marker has been added correctly.</w:t>
       </w:r>
     </w:p>
     <w:p>
@@ -3054,15 +2332,7 @@
         <w:t xml:space="preserve">methods </w:t>
       </w:r>
       <w:r>
-        <w:t xml:space="preserve">for the database so it can be changed or searched. I plan to make it so that when the database returns all the POIs it contains, it will return it as a </w:t>
-      </w:r>
-      <w:proofErr w:type="spellStart"/>
-      <w:r>
-        <w:t>LiveData</w:t>
-      </w:r>
-      <w:proofErr w:type="spellEnd"/>
-      <w:r>
-        <w:t xml:space="preserve">&lt;List&lt;Poi&gt;&gt;. This will </w:t>
+        <w:t xml:space="preserve">for the database so it can be changed or searched. I plan to make it so that when the database returns all the POIs it contains, it will return it as a LiveData&lt;List&lt;Poi&gt;&gt;. This will </w:t>
       </w:r>
       <w:r>
         <w:t>make</w:t>
@@ -3071,36 +2341,7 @@
         <w:t xml:space="preserve"> sure that the UI is automatically updated with a new list of POIs whenever the database is changed.</w:t>
       </w:r>
       <w:r>
-        <w:t xml:space="preserve"> For now, I will give it three functions, </w:t>
-      </w:r>
-      <w:proofErr w:type="spellStart"/>
-      <w:proofErr w:type="gramStart"/>
-      <w:r>
-        <w:t>getAllPois</w:t>
-      </w:r>
-      <w:proofErr w:type="spellEnd"/>
-      <w:r>
-        <w:t>(</w:t>
-      </w:r>
-      <w:proofErr w:type="gramEnd"/>
-      <w:r>
-        <w:t xml:space="preserve">), </w:t>
-      </w:r>
-      <w:proofErr w:type="gramStart"/>
-      <w:r>
-        <w:t>insert(</w:t>
-      </w:r>
-      <w:proofErr w:type="gramEnd"/>
-      <w:r>
-        <w:t xml:space="preserve">) and </w:t>
-      </w:r>
-      <w:proofErr w:type="gramStart"/>
-      <w:r>
-        <w:t>delete(</w:t>
-      </w:r>
-      <w:proofErr w:type="gramEnd"/>
-      <w:r>
-        <w:t>).</w:t>
+        <w:t xml:space="preserve"> For now, I will give it three functions, getAllPois(), insert() and delete().</w:t>
       </w:r>
     </w:p>
     <w:p>
@@ -3173,28 +2414,7 @@
         </w:drawing>
       </w:r>
       <w:r>
-        <w:t xml:space="preserve">I plan to next create the file for the database itself. This will be placed within an abstract function which allows my other files to access its DAO and all the database operations within it. Inside it I will put a </w:t>
-      </w:r>
-      <w:proofErr w:type="spellStart"/>
-      <w:proofErr w:type="gramStart"/>
-      <w:r>
-        <w:t>getDatabase</w:t>
-      </w:r>
-      <w:proofErr w:type="spellEnd"/>
-      <w:r>
-        <w:t>(</w:t>
-      </w:r>
-      <w:proofErr w:type="gramEnd"/>
-      <w:r>
-        <w:t xml:space="preserve">) function which will check that a database </w:t>
-      </w:r>
-      <w:proofErr w:type="gramStart"/>
-      <w:r>
-        <w:t>doesn’t already</w:t>
-      </w:r>
-      <w:proofErr w:type="gramEnd"/>
-      <w:r>
-        <w:t xml:space="preserve"> exist, if not it will create one and save it, otherwise it will simply return the one that already exists.</w:t>
+        <w:t>I plan to next create the file for the database itself. This will be placed within an abstract function which allows my other files to access its DAO and all the database operations within it. Inside it I will put a getDatabase() function which will check that a database doesn’t already exist, if not it will create one and save it, otherwise it will simply return the one that already exists.</w:t>
       </w:r>
     </w:p>
     <w:p>
@@ -3263,74 +2483,16 @@
         </w:drawing>
       </w:r>
       <w:r>
-        <w:t xml:space="preserve">I will next update my </w:t>
-      </w:r>
-      <w:proofErr w:type="spellStart"/>
-      <w:r>
-        <w:t>Viewmodel</w:t>
-      </w:r>
-      <w:proofErr w:type="spellEnd"/>
-      <w:r>
-        <w:t xml:space="preserve">. </w:t>
-      </w:r>
-      <w:r>
-        <w:t xml:space="preserve">I will first change the </w:t>
-      </w:r>
-      <w:proofErr w:type="spellStart"/>
-      <w:r>
-        <w:t>ViewModel</w:t>
-      </w:r>
-      <w:proofErr w:type="spellEnd"/>
-      <w:r>
-        <w:t xml:space="preserve"> for </w:t>
-      </w:r>
-      <w:proofErr w:type="gramStart"/>
-      <w:r>
-        <w:t xml:space="preserve">a </w:t>
-      </w:r>
-      <w:proofErr w:type="spellStart"/>
-      <w:r>
-        <w:t>AndroidViewModel</w:t>
-      </w:r>
-      <w:proofErr w:type="spellEnd"/>
-      <w:proofErr w:type="gramEnd"/>
-      <w:r>
-        <w:t xml:space="preserve"> so that it can access the application context which will be needed to open the database. </w:t>
+        <w:t xml:space="preserve">I will next update my Viewmodel. </w:t>
+      </w:r>
+      <w:r>
+        <w:t xml:space="preserve">I will first change the ViewModel for a AndroidViewModel so that it can access the application context which will be needed to open the database. </w:t>
       </w:r>
       <w:r>
         <w:t xml:space="preserve">I plan to update the poi variable so that it gathers all the pois from the database as </w:t>
       </w:r>
-      <w:proofErr w:type="spellStart"/>
-      <w:r>
-        <w:t>LiveData</w:t>
-      </w:r>
-      <w:proofErr w:type="spellEnd"/>
-      <w:r>
-        <w:t xml:space="preserve"> allowing it to automatically update when a new POI is added. Because of this, I will also need to change the </w:t>
-      </w:r>
-      <w:proofErr w:type="spellStart"/>
-      <w:r>
-        <w:t>addpoi</w:t>
-      </w:r>
-      <w:proofErr w:type="spellEnd"/>
-      <w:r>
-        <w:t xml:space="preserve"> function in the </w:t>
-      </w:r>
-      <w:proofErr w:type="spellStart"/>
-      <w:r>
-        <w:t>Viewmodel</w:t>
-      </w:r>
-      <w:proofErr w:type="spellEnd"/>
-      <w:r>
-        <w:t xml:space="preserve"> so that it adds the poi to the database instead of list using the </w:t>
-      </w:r>
-      <w:proofErr w:type="spellStart"/>
-      <w:r>
-        <w:t>poiDao’s</w:t>
-      </w:r>
-      <w:proofErr w:type="spellEnd"/>
-      <w:r>
-        <w:t xml:space="preserve"> ins</w:t>
+      <w:r>
+        <w:t>LiveData allowing it to automatically update when a new POI is added. Because of this, I will also need to change the addpoi function in the Viewmodel so that it adds the poi to the database instead of list using the poiDao’s ins</w:t>
       </w:r>
       <w:r>
         <w:t>ert function.</w:t>
@@ -3411,15 +2573,7 @@
         </w:drawing>
       </w:r>
       <w:r>
-        <w:t xml:space="preserve">I will then update the button for my </w:t>
-      </w:r>
-      <w:proofErr w:type="spellStart"/>
-      <w:r>
-        <w:t>AddPoiScreen</w:t>
-      </w:r>
-      <w:proofErr w:type="spellEnd"/>
-      <w:r>
-        <w:t>. I will simply change the Poi structure in the button so that it fits the databases poi structure since the latitude and longitude for the pois in the database are separate variables.</w:t>
+        <w:t>I will then update the button for my AddPoiScreen. I will simply change the Poi structure in the button so that it fits the databases poi structure since the latitude and longitude for the pois in the database are separate variables.</w:t>
       </w:r>
     </w:p>
     <w:p>
@@ -3433,23 +2587,7 @@
       </w:pPr>
       <w:r>
         <w:lastRenderedPageBreak/>
-        <w:t xml:space="preserve">I will then need to change the </w:t>
-      </w:r>
-      <w:proofErr w:type="spellStart"/>
-      <w:r>
-        <w:t>MainActivity</w:t>
-      </w:r>
-      <w:proofErr w:type="spellEnd"/>
-      <w:r>
-        <w:t xml:space="preserve"> so that the Poi is converted back into the </w:t>
-      </w:r>
-      <w:proofErr w:type="spellStart"/>
-      <w:r>
-        <w:t>LatLng</w:t>
-      </w:r>
-      <w:proofErr w:type="spellEnd"/>
-      <w:r>
-        <w:t xml:space="preserve"> so that the map can properly mark its location.</w:t>
+        <w:t>I will then need to change the MainActivity so that the Poi is converted back into the LatLng so that the map can properly mark its location.</w:t>
       </w:r>
     </w:p>
     <w:p>
@@ -3663,15 +2801,7 @@
         <w:ind w:left="720"/>
       </w:pPr>
       <w:r>
-        <w:t xml:space="preserve">I have already set up the loading process for the POIs for task 3. This is done on </w:t>
-      </w:r>
-      <w:proofErr w:type="gramStart"/>
-      <w:r>
-        <w:t>startup and</w:t>
-      </w:r>
-      <w:proofErr w:type="gramEnd"/>
-      <w:r>
-        <w:t xml:space="preserve"> whenever the database is updated. </w:t>
+        <w:t xml:space="preserve">I have already set up the loading process for the POIs for task 3. This is done on startup and whenever the database is updated. </w:t>
       </w:r>
       <w:r>
         <w:t>However, to fit this task better I will change the code to use a button instead, this will make testing easier and give the user more control.</w:t>
@@ -3687,26 +2817,14 @@
         <w:ind w:left="720"/>
       </w:pPr>
       <w:r>
-        <w:t xml:space="preserve">I will start this by changing the DAO to </w:t>
-      </w:r>
-      <w:proofErr w:type="gramStart"/>
-      <w:r>
-        <w:t>return</w:t>
-      </w:r>
-      <w:proofErr w:type="gramEnd"/>
-      <w:r>
-        <w:t xml:space="preserve"> a plain list instead of </w:t>
-      </w:r>
-      <w:proofErr w:type="gramStart"/>
+        <w:t xml:space="preserve">I will start this by changing the DAO to return a plain list instead of </w:t>
+      </w:r>
       <w:r>
         <w:t xml:space="preserve">the </w:t>
       </w:r>
-      <w:proofErr w:type="spellStart"/>
       <w:r>
         <w:t>LiveData</w:t>
       </w:r>
-      <w:proofErr w:type="spellEnd"/>
-      <w:proofErr w:type="gramEnd"/>
       <w:r>
         <w:t xml:space="preserve"> since the POIs will no longer be automatically loaded. </w:t>
       </w:r>
@@ -3850,39 +2968,7 @@
         </w:drawing>
       </w:r>
       <w:r>
-        <w:t xml:space="preserve">I will also need to add a new function to the </w:t>
-      </w:r>
-      <w:proofErr w:type="spellStart"/>
-      <w:r>
-        <w:t>ViewModel</w:t>
-      </w:r>
-      <w:proofErr w:type="spellEnd"/>
-      <w:r>
-        <w:t xml:space="preserve"> which will load all the POIs from the database. It will run the database query on Dispatchers.IO in the background, then set the result to </w:t>
-      </w:r>
-      <w:proofErr w:type="spellStart"/>
-      <w:r>
-        <w:t>pois.value</w:t>
-      </w:r>
-      <w:proofErr w:type="spellEnd"/>
-      <w:r>
-        <w:t xml:space="preserve"> which should </w:t>
-      </w:r>
-      <w:proofErr w:type="gramStart"/>
-      <w:r>
-        <w:t>triggers</w:t>
-      </w:r>
-      <w:proofErr w:type="gramEnd"/>
-      <w:r>
-        <w:t xml:space="preserve"> the observer in </w:t>
-      </w:r>
-      <w:proofErr w:type="spellStart"/>
-      <w:r>
-        <w:t>MainActivity</w:t>
-      </w:r>
-      <w:proofErr w:type="spellEnd"/>
-      <w:r>
-        <w:t xml:space="preserve"> which will then update the map.</w:t>
+        <w:t>I will also need to add a new function to the ViewModel which will load all the POIs from the database. It will run the database query on Dispatchers.IO in the background, then set the result to pois.value which should triggers the observer in MainActivity which will then update the map.</w:t>
       </w:r>
     </w:p>
     <w:p>
@@ -3955,36 +3041,20 @@
         <w:t>it</w:t>
       </w:r>
       <w:r>
-        <w:t xml:space="preserve"> holds a plain list of pois instead of being assigned directly from the DAO’s live data since it no longer returns </w:t>
-      </w:r>
-      <w:proofErr w:type="spellStart"/>
-      <w:r>
-        <w:t>LiveData</w:t>
-      </w:r>
-      <w:proofErr w:type="spellEnd"/>
-      <w:r>
-        <w:t>.</w:t>
-      </w:r>
-    </w:p>
-    <w:p>
-      <w:pPr>
-        <w:ind w:left="720"/>
-      </w:pPr>
-    </w:p>
-    <w:p>
-      <w:pPr>
-        <w:ind w:left="720"/>
-      </w:pPr>
-      <w:r>
-        <w:t xml:space="preserve">I will then lastly need to add the load buttons to the </w:t>
-      </w:r>
-      <w:proofErr w:type="spellStart"/>
-      <w:r>
-        <w:t>MainActivity</w:t>
-      </w:r>
-      <w:proofErr w:type="spellEnd"/>
-      <w:r>
-        <w:t>. This will call the load poi function in the view model, loading all the pois from the database into the UI.</w:t>
+        <w:t xml:space="preserve"> holds a plain list of pois instead of being assigned directly from the DAO’s live data since it no longer returns LiveData.</w:t>
+      </w:r>
+    </w:p>
+    <w:p>
+      <w:pPr>
+        <w:ind w:left="720"/>
+      </w:pPr>
+    </w:p>
+    <w:p>
+      <w:pPr>
+        <w:ind w:left="720"/>
+      </w:pPr>
+      <w:r>
+        <w:t>I will then lastly need to add the load buttons to the MainActivity. This will call the load poi function in the view model, loading all the pois from the database into the UI.</w:t>
       </w:r>
     </w:p>
     <w:p>
@@ -4114,31 +3184,7 @@
           <w:sz w:val="24"/>
           <w:szCs w:val="24"/>
         </w:rPr>
-        <w:t xml:space="preserve"> in a text field. This should search the local database. The matching places should appear on the map as markers or circles. </w:t>
-      </w:r>
-      <w:proofErr w:type="gramStart"/>
-      <w:r>
-        <w:rPr>
-          <w:rFonts w:ascii="Trebuchet MS" w:hAnsi="Trebuchet MS"/>
-          <w:i/>
-          <w:iCs/>
-          <w:color w:val="000000"/>
-          <w:sz w:val="24"/>
-          <w:szCs w:val="24"/>
-        </w:rPr>
-        <w:t>Again</w:t>
-      </w:r>
-      <w:proofErr w:type="gramEnd"/>
-      <w:r>
-        <w:rPr>
-          <w:rFonts w:ascii="Trebuchet MS" w:hAnsi="Trebuchet MS"/>
-          <w:i/>
-          <w:iCs/>
-          <w:color w:val="000000"/>
-          <w:sz w:val="24"/>
-          <w:szCs w:val="24"/>
-        </w:rPr>
-        <w:t xml:space="preserve"> a dialog box should appear when the user clicks on each place.”</w:t>
+        <w:t xml:space="preserve"> in a text field. This should search the local database. The matching places should appear on the map as markers or circles. Again a dialog box should appear when the user clicks on each place.”</w:t>
       </w:r>
     </w:p>
     <w:p>
@@ -4284,31 +3330,7 @@
         <w:t>I will next create</w:t>
       </w:r>
       <w:r>
-        <w:t xml:space="preserve"> a new function in the </w:t>
-      </w:r>
-      <w:proofErr w:type="spellStart"/>
-      <w:r>
-        <w:t>ViewModel</w:t>
-      </w:r>
-      <w:proofErr w:type="spellEnd"/>
-      <w:r>
-        <w:t xml:space="preserve">. This will </w:t>
-      </w:r>
-      <w:proofErr w:type="gramStart"/>
-      <w:r>
-        <w:t>use the search</w:t>
-      </w:r>
-      <w:proofErr w:type="gramEnd"/>
-      <w:r>
-        <w:t xml:space="preserve"> by type function from the DAO. This will have the type as a parameter to search with and add the results to the </w:t>
-      </w:r>
-      <w:proofErr w:type="spellStart"/>
-      <w:r>
-        <w:t>pois.value</w:t>
-      </w:r>
-      <w:proofErr w:type="spellEnd"/>
-      <w:r>
-        <w:t>.</w:t>
+        <w:t xml:space="preserve"> a new function in the ViewModel. This will use the search by type function from the DAO. This will have the type as a parameter to search with and add the results to the pois.value.</w:t>
       </w:r>
       <w:r>
         <w:t xml:space="preserve"> This makes it so when a user searches a type, it only displays markers relating to that type. Then to display all the pois again the user will simply need to load the pois again.</w:t>
@@ -4384,115 +3406,103 @@
         </w:drawing>
       </w:r>
       <w:r>
-        <w:t xml:space="preserve">Then I will add an outlined text field to my </w:t>
-      </w:r>
-      <w:proofErr w:type="spellStart"/>
-      <w:r>
-        <w:t>MainActivity</w:t>
-      </w:r>
-      <w:proofErr w:type="spellEnd"/>
-      <w:r>
-        <w:t xml:space="preserve"> which will be used by the user to input the accommodation type that they are searching for. This will then be followed by a button which, when clicked, will take the </w:t>
-      </w:r>
-      <w:proofErr w:type="gramStart"/>
-      <w:r>
-        <w:t>inputted</w:t>
-      </w:r>
-      <w:proofErr w:type="gramEnd"/>
-      <w:r>
-        <w:t xml:space="preserve"> data and call the search pois by type function using the </w:t>
-      </w:r>
-      <w:proofErr w:type="gramStart"/>
-      <w:r>
-        <w:t>inputted</w:t>
-      </w:r>
-      <w:proofErr w:type="gramEnd"/>
-      <w:r>
-        <w:t xml:space="preserve"> data as the parameter.</w:t>
+        <w:t>Then I will add an outlined text field to my MainActivity which will be used by the user to input the accommodation type that they are searching for. This will then be followed by a button which, when clicked, will take the inputted data and call the search pois by type function using the inputted data as the parameter.</w:t>
       </w:r>
     </w:p>
     <w:p/>
     <w:p>
       <w:pPr>
-        <w:rPr>
-          <w:rFonts w:ascii="Trebuchet MS" w:hAnsi="Trebuchet MS"/>
-          <w:sz w:val="24"/>
-          <w:szCs w:val="24"/>
-        </w:rPr>
-      </w:pPr>
-    </w:p>
-    <w:p>
-      <w:pPr>
-        <w:rPr>
-          <w:rFonts w:ascii="Trebuchet MS" w:hAnsi="Trebuchet MS"/>
-          <w:sz w:val="24"/>
-          <w:szCs w:val="24"/>
-        </w:rPr>
-      </w:pPr>
-    </w:p>
-    <w:p>
-      <w:pPr>
-        <w:rPr>
-          <w:rFonts w:ascii="Trebuchet MS" w:hAnsi="Trebuchet MS"/>
-          <w:sz w:val="24"/>
-          <w:szCs w:val="24"/>
-        </w:rPr>
-      </w:pPr>
-    </w:p>
-    <w:p>
-      <w:pPr>
-        <w:rPr>
-          <w:rFonts w:ascii="Trebuchet MS" w:hAnsi="Trebuchet MS"/>
-          <w:sz w:val="24"/>
-          <w:szCs w:val="24"/>
-        </w:rPr>
-      </w:pPr>
-    </w:p>
-    <w:p>
-      <w:pPr>
-        <w:rPr>
-          <w:rFonts w:ascii="Trebuchet MS" w:hAnsi="Trebuchet MS"/>
-          <w:sz w:val="24"/>
-          <w:szCs w:val="24"/>
-        </w:rPr>
-      </w:pPr>
-    </w:p>
-    <w:p>
-      <w:pPr>
-        <w:rPr>
-          <w:rFonts w:ascii="Trebuchet MS" w:hAnsi="Trebuchet MS"/>
-          <w:sz w:val="24"/>
-          <w:szCs w:val="24"/>
-        </w:rPr>
-      </w:pPr>
-    </w:p>
-    <w:p>
-      <w:pPr>
-        <w:rPr>
-          <w:rFonts w:ascii="Trebuchet MS" w:hAnsi="Trebuchet MS"/>
-          <w:sz w:val="24"/>
-          <w:szCs w:val="24"/>
-        </w:rPr>
-      </w:pPr>
-    </w:p>
-    <w:p>
-      <w:pPr>
-        <w:rPr>
-          <w:rFonts w:ascii="Trebuchet MS" w:hAnsi="Trebuchet MS"/>
-          <w:sz w:val="24"/>
-          <w:szCs w:val="24"/>
-        </w:rPr>
-      </w:pPr>
-    </w:p>
-    <w:p>
-      <w:pPr>
-        <w:rPr>
-          <w:i/>
-          <w:iCs/>
-          <w:sz w:val="24"/>
-          <w:szCs w:val="24"/>
-        </w:rPr>
-      </w:pPr>
+        <w:ind w:left="720"/>
+      </w:pPr>
+      <w:r>
+        <w:rPr>
+          <w:noProof/>
+        </w:rPr>
+        <w:drawing>
+          <wp:anchor distT="0" distB="0" distL="114300" distR="114300" simplePos="0" relativeHeight="251713536" behindDoc="0" locked="0" layoutInCell="1" allowOverlap="1" wp14:anchorId="280623FB" wp14:editId="544E7B83">
+            <wp:simplePos x="0" y="0"/>
+            <wp:positionH relativeFrom="margin">
+              <wp:align>center</wp:align>
+            </wp:positionH>
+            <wp:positionV relativeFrom="paragraph">
+              <wp:posOffset>1200316</wp:posOffset>
+            </wp:positionV>
+            <wp:extent cx="2009775" cy="447675"/>
+            <wp:effectExtent l="0" t="0" r="9525" b="9525"/>
+            <wp:wrapTopAndBottom/>
+            <wp:docPr id="1458620457" name="Picture 1"/>
+            <wp:cNvGraphicFramePr>
+              <a:graphicFrameLocks xmlns:a="http://schemas.openxmlformats.org/drawingml/2006/main" noChangeAspect="1"/>
+            </wp:cNvGraphicFramePr>
+            <a:graphic xmlns:a="http://schemas.openxmlformats.org/drawingml/2006/main">
+              <a:graphicData uri="http://schemas.openxmlformats.org/drawingml/2006/picture">
+                <pic:pic xmlns:pic="http://schemas.openxmlformats.org/drawingml/2006/picture">
+                  <pic:nvPicPr>
+                    <pic:cNvPr id="1458620457" name=""/>
+                    <pic:cNvPicPr/>
+                  </pic:nvPicPr>
+                  <pic:blipFill>
+                    <a:blip r:embed="rId38">
+                      <a:extLst>
+                        <a:ext uri="{28A0092B-C50C-407E-A947-70E740481C1C}">
+                          <a14:useLocalDpi xmlns:a14="http://schemas.microsoft.com/office/drawing/2010/main" val="0"/>
+                        </a:ext>
+                      </a:extLst>
+                    </a:blip>
+                    <a:stretch>
+                      <a:fillRect/>
+                    </a:stretch>
+                  </pic:blipFill>
+                  <pic:spPr>
+                    <a:xfrm>
+                      <a:off x="0" y="0"/>
+                      <a:ext cx="2009775" cy="447675"/>
+                    </a:xfrm>
+                    <a:prstGeom prst="rect">
+                      <a:avLst/>
+                    </a:prstGeom>
+                  </pic:spPr>
+                </pic:pic>
+              </a:graphicData>
+            </a:graphic>
+          </wp:anchor>
+        </w:drawing>
+      </w:r>
+      <w:r>
+        <w:t>An</w:t>
+      </w:r>
+      <w:r>
+        <w:t xml:space="preserve"> issue I came across </w:t>
+      </w:r>
+      <w:r>
+        <w:t xml:space="preserve">adding this code </w:t>
+      </w:r>
+      <w:r>
+        <w:t xml:space="preserve">was that Ramini maps were not displaying my markers correctly. Some markers were not </w:t>
+      </w:r>
+      <w:r>
+        <w:t>shown</w:t>
+      </w:r>
+      <w:r>
+        <w:t xml:space="preserve"> </w:t>
+      </w:r>
+      <w:r>
+        <w:t>on the map</w:t>
+      </w:r>
+      <w:r>
+        <w:t xml:space="preserve"> but were still able to be clicked</w:t>
+      </w:r>
+      <w:r>
+        <w:t>, this was after searching for a specific type</w:t>
+      </w:r>
+      <w:r>
+        <w:t>.</w:t>
+      </w:r>
+      <w:r>
+        <w:t xml:space="preserve"> I found a workaround by using the key() block. This will take the poisState as a parameter meaning that every time the poisState is updated, the map will be rebuilt. I must note that this isn’t very efficient, destroying and rebuilding the map, but this is the only workaround I was able to find.</w:t>
+      </w:r>
+    </w:p>
+    <w:p>
       <w:r>
         <w:rPr>
           <w:rFonts w:ascii="Trebuchet MS" w:hAnsi="Trebuchet MS"/>
@@ -4592,29 +3602,7 @@
           <w:sz w:val="24"/>
           <w:szCs w:val="24"/>
         </w:rPr>
-        <w:t xml:space="preserve">When the POIs are </w:t>
-      </w:r>
-      <w:proofErr w:type="gramStart"/>
-      <w:r>
-        <w:rPr>
-          <w:rFonts w:ascii="Trebuchet MS" w:hAnsi="Trebuchet MS"/>
-          <w:i/>
-          <w:iCs/>
-          <w:sz w:val="24"/>
-          <w:szCs w:val="24"/>
-        </w:rPr>
-        <w:t>loaded</w:t>
-      </w:r>
-      <w:proofErr w:type="gramEnd"/>
-      <w:r>
-        <w:rPr>
-          <w:rFonts w:ascii="Trebuchet MS" w:hAnsi="Trebuchet MS"/>
-          <w:i/>
-          <w:iCs/>
-          <w:sz w:val="24"/>
-          <w:szCs w:val="24"/>
-        </w:rPr>
-        <w:t xml:space="preserve"> they should be shown on the map as markers and saved to the database. To avoid duplicate entries in the database, check whether the point of interest with that ID is already present before adding it.”</w:t>
+        <w:t>When the POIs are loaded they should be shown on the map as markers and saved to the database. To avoid duplicate entries in the database, check whether the point of interest with that ID is already present before adding it.”</w:t>
       </w:r>
     </w:p>
     <w:p>
@@ -4665,7 +3653,7 @@
                     <pic:cNvPicPr/>
                   </pic:nvPicPr>
                   <pic:blipFill>
-                    <a:blip r:embed="rId38">
+                    <a:blip r:embed="rId39">
                       <a:extLst>
                         <a:ext uri="{28A0092B-C50C-407E-A947-70E740481C1C}">
                           <a14:useLocalDpi xmlns:a14="http://schemas.microsoft.com/office/drawing/2010/main" val="0"/>
@@ -4719,7 +3707,7 @@
                     <pic:cNvPicPr/>
                   </pic:nvPicPr>
                   <pic:blipFill>
-                    <a:blip r:embed="rId39">
+                    <a:blip r:embed="rId40">
                       <a:extLst>
                         <a:ext uri="{28A0092B-C50C-407E-A947-70E740481C1C}">
                           <a14:useLocalDpi xmlns:a14="http://schemas.microsoft.com/office/drawing/2010/main" val="0"/>
@@ -4773,7 +3761,7 @@
                     <pic:cNvPicPr/>
                   </pic:nvPicPr>
                   <pic:blipFill>
-                    <a:blip r:embed="rId40">
+                    <a:blip r:embed="rId41">
                       <a:extLst>
                         <a:ext uri="{28A0092B-C50C-407E-A947-70E740481C1C}">
                           <a14:useLocalDpi xmlns:a14="http://schemas.microsoft.com/office/drawing/2010/main" val="0"/>
@@ -4863,7 +3851,7 @@
                     <pic:cNvPicPr/>
                   </pic:nvPicPr>
                   <pic:blipFill>
-                    <a:blip r:embed="rId41">
+                    <a:blip r:embed="rId42">
                       <a:extLst>
                         <a:ext uri="{28A0092B-C50C-407E-A947-70E740481C1C}">
                           <a14:useLocalDpi xmlns:a14="http://schemas.microsoft.com/office/drawing/2010/main" val="0"/>
@@ -4895,35 +3883,7 @@
           <w:sz w:val="24"/>
           <w:szCs w:val="24"/>
         </w:rPr>
-        <w:t xml:space="preserve">On top of this I will need to add </w:t>
-      </w:r>
-      <w:proofErr w:type="spellStart"/>
-      <w:r>
-        <w:rPr>
-          <w:rFonts w:ascii="Trebuchet MS" w:hAnsi="Trebuchet MS"/>
-          <w:sz w:val="24"/>
-          <w:szCs w:val="24"/>
-        </w:rPr>
-        <w:t>usesCleartextTraffic</w:t>
-      </w:r>
-      <w:proofErr w:type="spellEnd"/>
-      <w:proofErr w:type="gramStart"/>
-      <w:r>
-        <w:rPr>
-          <w:rFonts w:ascii="Trebuchet MS" w:hAnsi="Trebuchet MS"/>
-          <w:sz w:val="24"/>
-          <w:szCs w:val="24"/>
-        </w:rPr>
-        <w:t>=”true</w:t>
-      </w:r>
-      <w:proofErr w:type="gramEnd"/>
-      <w:r>
-        <w:rPr>
-          <w:rFonts w:ascii="Trebuchet MS" w:hAnsi="Trebuchet MS"/>
-          <w:sz w:val="24"/>
-          <w:szCs w:val="24"/>
-        </w:rPr>
-        <w:t>” to my application. This is because Android doesn’t allow access to insecure servers (HTTP) which my server is. By using this it disables the restriction allowing my app to communicate with the server.</w:t>
+        <w:t>On top of this I will need to add usesCleartextTraffic=”true” to my application. This is because Android doesn’t allow access to insecure servers (HTTP) which my server is. By using this it disables the restriction allowing my app to communicate with the server.</w:t>
       </w:r>
     </w:p>
     <w:p>
@@ -4973,7 +3933,7 @@
                     <pic:cNvPicPr/>
                   </pic:nvPicPr>
                   <pic:blipFill>
-                    <a:blip r:embed="rId42">
+                    <a:blip r:embed="rId43">
                       <a:extLst>
                         <a:ext uri="{28A0092B-C50C-407E-A947-70E740481C1C}">
                           <a14:useLocalDpi xmlns:a14="http://schemas.microsoft.com/office/drawing/2010/main" val="0"/>
@@ -5061,7 +4021,7 @@
                     <pic:cNvPicPr/>
                   </pic:nvPicPr>
                   <pic:blipFill>
-                    <a:blip r:embed="rId43">
+                    <a:blip r:embed="rId44">
                       <a:extLst>
                         <a:ext uri="{28A0092B-C50C-407E-A947-70E740481C1C}">
                           <a14:useLocalDpi xmlns:a14="http://schemas.microsoft.com/office/drawing/2010/main" val="0"/>
@@ -5109,18 +4069,8 @@
           <w:sz w:val="24"/>
           <w:szCs w:val="24"/>
         </w:rPr>
-        <w:t xml:space="preserve"> as they both currently have different </w:t>
-      </w:r>
-      <w:proofErr w:type="spellStart"/>
-      <w:r>
-        <w:rPr>
-          <w:rFonts w:ascii="Trebuchet MS" w:hAnsi="Trebuchet MS"/>
-          <w:sz w:val="24"/>
-          <w:szCs w:val="24"/>
-        </w:rPr>
-        <w:t>feilds</w:t>
-      </w:r>
-      <w:proofErr w:type="spellEnd"/>
+        <w:t xml:space="preserve"> as they both currently have different feilds</w:t>
+      </w:r>
       <w:r>
         <w:rPr>
           <w:rFonts w:ascii="Trebuchet MS" w:hAnsi="Trebuchet MS"/>
@@ -5187,7 +4137,7 @@
                     <pic:cNvPicPr/>
                   </pic:nvPicPr>
                   <pic:blipFill>
-                    <a:blip r:embed="rId44">
+                    <a:blip r:embed="rId45">
                       <a:extLst>
                         <a:ext uri="{28A0092B-C50C-407E-A947-70E740481C1C}">
                           <a14:useLocalDpi xmlns:a14="http://schemas.microsoft.com/office/drawing/2010/main" val="0"/>
@@ -5377,25 +4327,7 @@
           <w:szCs w:val="24"/>
         </w:rPr>
         <w:lastRenderedPageBreak/>
-        <w:t xml:space="preserve">This will need a new function which I will store within my </w:t>
-      </w:r>
-      <w:proofErr w:type="spellStart"/>
-      <w:r>
-        <w:rPr>
-          <w:rFonts w:ascii="Trebuchet MS" w:hAnsi="Trebuchet MS"/>
-          <w:sz w:val="24"/>
-          <w:szCs w:val="24"/>
-        </w:rPr>
-        <w:t>ViewModel</w:t>
-      </w:r>
-      <w:proofErr w:type="spellEnd"/>
-      <w:r>
-        <w:rPr>
-          <w:rFonts w:ascii="Trebuchet MS" w:hAnsi="Trebuchet MS"/>
-          <w:sz w:val="24"/>
-          <w:szCs w:val="24"/>
-        </w:rPr>
-        <w:t xml:space="preserve">. </w:t>
+        <w:t xml:space="preserve">This will need a new function which I will store within my ViewModel. </w:t>
       </w:r>
       <w:r>
         <w:rPr>
@@ -5419,25 +4351,7 @@
           <w:sz w:val="24"/>
           <w:szCs w:val="24"/>
         </w:rPr>
-        <w:t xml:space="preserve">” </w:t>
-      </w:r>
-      <w:proofErr w:type="spellStart"/>
-      <w:r>
-        <w:rPr>
-          <w:rFonts w:ascii="Trebuchet MS" w:hAnsi="Trebuchet MS"/>
-          <w:sz w:val="24"/>
-          <w:szCs w:val="24"/>
-        </w:rPr>
-        <w:t>url</w:t>
-      </w:r>
-      <w:proofErr w:type="spellEnd"/>
-      <w:r>
-        <w:rPr>
-          <w:rFonts w:ascii="Trebuchet MS" w:hAnsi="Trebuchet MS"/>
-          <w:sz w:val="24"/>
-          <w:szCs w:val="24"/>
-        </w:rPr>
-        <w:t xml:space="preserve"> which will gather all the pois in the web data base. The function will then, within a coroutine so it can handle the database operations, check each poi in the web database and compare its id with the ones in the local database. The ones that have an id which already exists in the local database are skipped to prevent duplicates. </w:t>
+        <w:t xml:space="preserve">” url which will gather all the pois in the web data base. The function will then, within a coroutine so it can handle the database operations, check each poi in the web database and compare its id with the ones in the local database. The ones that have an id which already exists in the local database are skipped to prevent duplicates. </w:t>
       </w:r>
       <w:r>
         <w:rPr>
@@ -5477,7 +4391,7 @@
                     <pic:cNvPicPr/>
                   </pic:nvPicPr>
                   <pic:blipFill>
-                    <a:blip r:embed="rId45"/>
+                    <a:blip r:embed="rId46"/>
                     <a:stretch>
                       <a:fillRect/>
                     </a:stretch>
@@ -5586,7 +4500,7 @@
                     <pic:cNvPicPr/>
                   </pic:nvPicPr>
                   <pic:blipFill>
-                    <a:blip r:embed="rId46">
+                    <a:blip r:embed="rId47">
                       <a:extLst>
                         <a:ext uri="{28A0092B-C50C-407E-A947-70E740481C1C}">
                           <a14:useLocalDpi xmlns:a14="http://schemas.microsoft.com/office/drawing/2010/main" val="0"/>
@@ -5618,43 +4532,7 @@
           <w:sz w:val="24"/>
           <w:szCs w:val="24"/>
         </w:rPr>
-        <w:t xml:space="preserve">Then finally for this task I will need to add a new button </w:t>
-      </w:r>
-      <w:proofErr w:type="gramStart"/>
-      <w:r>
-        <w:rPr>
-          <w:rFonts w:ascii="Trebuchet MS" w:hAnsi="Trebuchet MS"/>
-          <w:sz w:val="24"/>
-          <w:szCs w:val="24"/>
-        </w:rPr>
-        <w:t>in</w:t>
-      </w:r>
-      <w:proofErr w:type="gramEnd"/>
-      <w:r>
-        <w:rPr>
-          <w:rFonts w:ascii="Trebuchet MS" w:hAnsi="Trebuchet MS"/>
-          <w:sz w:val="24"/>
-          <w:szCs w:val="24"/>
-        </w:rPr>
-        <w:t xml:space="preserve"> the </w:t>
-      </w:r>
-      <w:proofErr w:type="spellStart"/>
-      <w:r>
-        <w:rPr>
-          <w:rFonts w:ascii="Trebuchet MS" w:hAnsi="Trebuchet MS"/>
-          <w:sz w:val="24"/>
-          <w:szCs w:val="24"/>
-        </w:rPr>
-        <w:t>MainActivity</w:t>
-      </w:r>
-      <w:proofErr w:type="spellEnd"/>
-      <w:r>
-        <w:rPr>
-          <w:rFonts w:ascii="Trebuchet MS" w:hAnsi="Trebuchet MS"/>
-          <w:sz w:val="24"/>
-          <w:szCs w:val="24"/>
-        </w:rPr>
-        <w:t xml:space="preserve"> which uses the new function.</w:t>
+        <w:t>Then finally for this task I will need to add a new button in the MainActivity which uses the new function.</w:t>
       </w:r>
       <w:r>
         <w:rPr>
@@ -5900,71 +4778,27 @@
           <w:sz w:val="24"/>
           <w:szCs w:val="24"/>
         </w:rPr>
-        <w:t xml:space="preserve">- </w:t>
-      </w:r>
-      <w:proofErr w:type="spellStart"/>
-      <w:r>
-        <w:rPr>
-          <w:rFonts w:ascii="Trebuchet MS" w:hAnsi="Trebuchet MS"/>
-          <w:i/>
-          <w:iCs/>
-          <w:sz w:val="24"/>
-          <w:szCs w:val="24"/>
-        </w:rPr>
-        <w:t>lat</w:t>
-      </w:r>
-      <w:proofErr w:type="spellEnd"/>
-      <w:r>
-        <w:rPr>
-          <w:rFonts w:ascii="Trebuchet MS" w:hAnsi="Trebuchet MS"/>
-          <w:i/>
-          <w:iCs/>
-          <w:sz w:val="24"/>
-          <w:szCs w:val="24"/>
-        </w:rPr>
-        <w:t xml:space="preserve"> (the latitude)</w:t>
-      </w:r>
-    </w:p>
-    <w:p>
-      <w:pPr>
-        <w:rPr>
-          <w:i/>
-          <w:iCs/>
-          <w:sz w:val="24"/>
-          <w:szCs w:val="24"/>
-        </w:rPr>
-      </w:pPr>
-      <w:r>
-        <w:rPr>
-          <w:rFonts w:ascii="Trebuchet MS" w:hAnsi="Trebuchet MS"/>
-          <w:i/>
-          <w:iCs/>
-          <w:sz w:val="24"/>
-          <w:szCs w:val="24"/>
-        </w:rPr>
-        <w:t xml:space="preserve">- </w:t>
-      </w:r>
-      <w:proofErr w:type="spellStart"/>
-      <w:r>
-        <w:rPr>
-          <w:rFonts w:ascii="Trebuchet MS" w:hAnsi="Trebuchet MS"/>
-          <w:i/>
-          <w:iCs/>
-          <w:sz w:val="24"/>
-          <w:szCs w:val="24"/>
-        </w:rPr>
-        <w:t>lon</w:t>
-      </w:r>
-      <w:proofErr w:type="spellEnd"/>
-      <w:r>
-        <w:rPr>
-          <w:rFonts w:ascii="Trebuchet MS" w:hAnsi="Trebuchet MS"/>
-          <w:i/>
-          <w:iCs/>
-          <w:sz w:val="24"/>
-          <w:szCs w:val="24"/>
-        </w:rPr>
-        <w:t xml:space="preserve"> (the longitude).</w:t>
+        <w:t>- lat (the latitude)</w:t>
+      </w:r>
+    </w:p>
+    <w:p>
+      <w:pPr>
+        <w:rPr>
+          <w:i/>
+          <w:iCs/>
+          <w:sz w:val="24"/>
+          <w:szCs w:val="24"/>
+        </w:rPr>
+      </w:pPr>
+      <w:r>
+        <w:rPr>
+          <w:rFonts w:ascii="Trebuchet MS" w:hAnsi="Trebuchet MS"/>
+          <w:i/>
+          <w:iCs/>
+          <w:sz w:val="24"/>
+          <w:szCs w:val="24"/>
+        </w:rPr>
+        <w:t>- lon (the longitude).</w:t>
       </w:r>
     </w:p>
     <w:p>
@@ -6040,33 +4874,12 @@
     </w:p>
     <w:p>
       <w:r>
-        <w:t xml:space="preserve">To start this task, I will need to change my </w:t>
-      </w:r>
-      <w:proofErr w:type="spellStart"/>
-      <w:proofErr w:type="gramStart"/>
-      <w:r>
-        <w:t>addPoi</w:t>
-      </w:r>
-      <w:proofErr w:type="spellEnd"/>
-      <w:r>
-        <w:t>(</w:t>
-      </w:r>
-      <w:proofErr w:type="gramEnd"/>
-      <w:r>
-        <w:t xml:space="preserve">) function in the </w:t>
-      </w:r>
-      <w:proofErr w:type="spellStart"/>
-      <w:r>
-        <w:t>Viewmodel</w:t>
-      </w:r>
-      <w:proofErr w:type="spellEnd"/>
-      <w:r>
-        <w:t xml:space="preserve">. I will change the function so that instead of inserting the poi into the local database straight away it will first POST to the server using </w:t>
+        <w:t xml:space="preserve">To start this task, I will need to change my addPoi() function in the Viewmodel. I will change the function so that instead of inserting the poi into the local database straight away it will first POST to the server using </w:t>
       </w:r>
       <w:r>
         <w:t xml:space="preserve">the </w:t>
       </w:r>
-      <w:hyperlink r:id="rId47" w:history="1">
+      <w:hyperlink r:id="rId48" w:history="1">
         <w:r>
           <w:rPr>
             <w:rStyle w:val="Hyperlink"/>
@@ -6075,23 +4888,7 @@
         </w:r>
       </w:hyperlink>
       <w:r>
-        <w:t xml:space="preserve"> </w:t>
-      </w:r>
-      <w:proofErr w:type="spellStart"/>
-      <w:r>
-        <w:t>url</w:t>
-      </w:r>
-      <w:proofErr w:type="spellEnd"/>
-      <w:r>
-        <w:t xml:space="preserve">, which will return the ID, then the function will use this ID as the </w:t>
-      </w:r>
-      <w:proofErr w:type="spellStart"/>
-      <w:r>
-        <w:t>webId</w:t>
-      </w:r>
-      <w:proofErr w:type="spellEnd"/>
-      <w:r>
-        <w:t xml:space="preserve"> then save it locally using the poi DAO insert function.. This makes sure that the poi is only added to the local database if it is successfully added to the web data base. This prevents any misalignment between the two databases.</w:t>
+        <w:t xml:space="preserve"> url, which will return the ID, then the function will use this ID as the webId then save it locally using the poi DAO insert function.. This makes sure that the poi is only added to the local database if it is successfully added to the web data base. This prevents any misalignment between the two databases.</w:t>
       </w:r>
     </w:p>
     <w:p/>
@@ -6103,31 +4900,7 @@
     <w:p/>
     <w:p>
       <w:r>
-        <w:t xml:space="preserve">Since the original poi has </w:t>
-      </w:r>
-      <w:proofErr w:type="spellStart"/>
-      <w:r>
-        <w:t>webId</w:t>
-      </w:r>
-      <w:proofErr w:type="spellEnd"/>
-      <w:r>
-        <w:t xml:space="preserve"> set to null, I will </w:t>
-      </w:r>
-      <w:proofErr w:type="gramStart"/>
-      <w:r>
-        <w:t>use .copy</w:t>
-      </w:r>
-      <w:proofErr w:type="gramEnd"/>
-      <w:r>
-        <w:t xml:space="preserve">() to create a new Poi object with the same fields but with the null </w:t>
-      </w:r>
-      <w:proofErr w:type="spellStart"/>
-      <w:r>
-        <w:t>webId</w:t>
-      </w:r>
-      <w:proofErr w:type="spellEnd"/>
-      <w:r>
-        <w:t xml:space="preserve"> replaced by the ID returned by the server. The original poi </w:t>
+        <w:t xml:space="preserve">Since the original poi has webId set to null, I will use .copy() to create a new Poi object with the same fields but with the null webId replaced by the ID returned by the server. The original poi </w:t>
       </w:r>
       <w:r>
         <w:t>will then be removed</w:t>
@@ -6139,15 +4912,7 @@
         <w:t xml:space="preserve">makes sure </w:t>
       </w:r>
       <w:r>
-        <w:t xml:space="preserve">that the record saved to the local database has a </w:t>
-      </w:r>
-      <w:proofErr w:type="spellStart"/>
-      <w:r>
-        <w:t>webId</w:t>
-      </w:r>
-      <w:proofErr w:type="spellEnd"/>
-      <w:r>
-        <w:t xml:space="preserve"> that matches the server</w:t>
+        <w:t>that the record saved to the local database has a webId that matches the server</w:t>
       </w:r>
       <w:r>
         <w:t>.</w:t>
@@ -6186,7 +4951,7 @@
                     <pic:cNvPicPr/>
                   </pic:nvPicPr>
                   <pic:blipFill>
-                    <a:blip r:embed="rId48">
+                    <a:blip r:embed="rId49">
                       <a:extLst>
                         <a:ext uri="{28A0092B-C50C-407E-A947-70E740481C1C}">
                           <a14:useLocalDpi xmlns:a14="http://schemas.microsoft.com/office/drawing/2010/main" val="0"/>
@@ -6278,137 +5043,60 @@
         <w:t>These will be t</w:t>
       </w:r>
       <w:r>
-        <w:t xml:space="preserve">he </w:t>
-      </w:r>
-      <w:proofErr w:type="spellStart"/>
-      <w:r>
-        <w:t>topBar</w:t>
-      </w:r>
-      <w:proofErr w:type="spellEnd"/>
-      <w:r>
-        <w:t xml:space="preserve"> parameter </w:t>
+        <w:t xml:space="preserve">he topBar parameter </w:t>
       </w:r>
       <w:r>
         <w:t xml:space="preserve">which </w:t>
       </w:r>
       <w:r>
-        <w:t xml:space="preserve">will contain a </w:t>
-      </w:r>
-      <w:proofErr w:type="spellStart"/>
-      <w:r>
-        <w:t>TopAppBar</w:t>
-      </w:r>
-      <w:proofErr w:type="spellEnd"/>
-      <w:r>
-        <w:t xml:space="preserve"> composable </w:t>
+        <w:t xml:space="preserve">will contain a TopAppBar composable </w:t>
       </w:r>
       <w:r>
         <w:t>showing</w:t>
       </w:r>
       <w:r>
-        <w:t xml:space="preserve"> the app name and a hamburger menu </w:t>
-      </w:r>
-      <w:proofErr w:type="spellStart"/>
-      <w:r>
-        <w:t>IconButton</w:t>
-      </w:r>
-      <w:proofErr w:type="spellEnd"/>
+        <w:t xml:space="preserve"> the app name and a hamburger menu IconButton </w:t>
+      </w:r>
+      <w:r>
+        <w:t xml:space="preserve">which </w:t>
+      </w:r>
+      <w:r>
+        <w:t xml:space="preserve">when clicked will use </w:t>
+      </w:r>
+      <w:r>
+        <w:t xml:space="preserve">a </w:t>
+      </w:r>
+      <w:r>
+        <w:t>coroutineScope.launch to call drawerState.open(), which will</w:t>
+      </w:r>
+      <w:r>
+        <w:t xml:space="preserve"> then</w:t>
+      </w:r>
+      <w:r>
+        <w:t xml:space="preserve"> open the ModalNavigationDrawer. </w:t>
+      </w:r>
+      <w:r>
+        <w:t>I will wrap t</w:t>
+      </w:r>
+      <w:r>
+        <w:t>he drawer around the entire NavHost block rather than just the map screen's Scaffold, because it needs to be able to slide over all content.</w:t>
+      </w:r>
+    </w:p>
+    <w:p>
+      <w:pPr>
+        <w:ind w:left="720"/>
+      </w:pPr>
+      <w:r>
+        <w:t>I will make it so</w:t>
+      </w:r>
       <w:r>
         <w:t xml:space="preserve"> </w:t>
       </w:r>
       <w:r>
-        <w:t xml:space="preserve">which </w:t>
-      </w:r>
-      <w:r>
-        <w:t xml:space="preserve">when clicked will use </w:t>
-      </w:r>
-      <w:r>
-        <w:t xml:space="preserve">a </w:t>
-      </w:r>
-      <w:proofErr w:type="spellStart"/>
-      <w:r>
-        <w:t>coroutineScope.launch</w:t>
-      </w:r>
-      <w:proofErr w:type="spellEnd"/>
-      <w:r>
-        <w:t xml:space="preserve"> to call </w:t>
-      </w:r>
-      <w:proofErr w:type="spellStart"/>
-      <w:r>
-        <w:t>drawerState.open</w:t>
-      </w:r>
-      <w:proofErr w:type="spellEnd"/>
-      <w:r>
-        <w:t>(), which will</w:t>
-      </w:r>
-      <w:r>
-        <w:t xml:space="preserve"> then</w:t>
-      </w:r>
-      <w:r>
-        <w:t xml:space="preserve"> open the </w:t>
-      </w:r>
-      <w:proofErr w:type="spellStart"/>
-      <w:r>
-        <w:t>ModalNavigationDrawer</w:t>
-      </w:r>
-      <w:proofErr w:type="spellEnd"/>
-      <w:r>
-        <w:t xml:space="preserve">. </w:t>
-      </w:r>
-      <w:r>
-        <w:t>I will wrap t</w:t>
-      </w:r>
-      <w:r>
-        <w:t xml:space="preserve">he drawer around the entire </w:t>
-      </w:r>
-      <w:proofErr w:type="spellStart"/>
-      <w:r>
-        <w:t>NavHost</w:t>
-      </w:r>
-      <w:proofErr w:type="spellEnd"/>
-      <w:r>
-        <w:t xml:space="preserve"> block rather than just the map screen's Scaffold, because it needs to be able to slide over all content.</w:t>
-      </w:r>
-    </w:p>
-    <w:p>
-      <w:pPr>
-        <w:ind w:left="720"/>
-      </w:pPr>
-      <w:r>
-        <w:t>I will make it so</w:t>
-      </w:r>
-      <w:r>
-        <w:t xml:space="preserve"> </w:t>
-      </w:r>
-      <w:r>
         <w:t>e</w:t>
       </w:r>
       <w:r>
-        <w:t xml:space="preserve">ach </w:t>
-      </w:r>
-      <w:proofErr w:type="spellStart"/>
-      <w:r>
-        <w:t>NavigationDrawerItem</w:t>
-      </w:r>
-      <w:proofErr w:type="spellEnd"/>
-      <w:r>
-        <w:t xml:space="preserve"> inside the </w:t>
-      </w:r>
-      <w:proofErr w:type="spellStart"/>
-      <w:r>
-        <w:t>ModalDrawerSheet</w:t>
-      </w:r>
-      <w:proofErr w:type="spellEnd"/>
-      <w:r>
-        <w:t xml:space="preserve"> will call </w:t>
-      </w:r>
-      <w:proofErr w:type="spellStart"/>
-      <w:r>
-        <w:t>drawerState.close</w:t>
-      </w:r>
-      <w:proofErr w:type="spellEnd"/>
-      <w:r>
-        <w:t xml:space="preserve">() in a coroutine before navigating, </w:t>
+        <w:t xml:space="preserve">ach NavigationDrawerItem inside the ModalDrawerSheet will call drawerState.close() in a coroutine before navigating, </w:t>
       </w:r>
       <w:r>
         <w:t xml:space="preserve">this is </w:t>
@@ -6427,7 +5115,7 @@
         </w:rPr>
         <w:lastRenderedPageBreak/>
         <w:drawing>
-          <wp:anchor distT="0" distB="0" distL="114300" distR="114300" simplePos="0" relativeHeight="251703296" behindDoc="0" locked="0" layoutInCell="1" allowOverlap="1" wp14:anchorId="34E27E11" wp14:editId="61B9AD1C">
+          <wp:anchor distT="0" distB="0" distL="114300" distR="114300" simplePos="0" relativeHeight="251703296" behindDoc="0" locked="0" layoutInCell="1" allowOverlap="1" wp14:anchorId="34E27E11" wp14:editId="303E6BE2">
             <wp:simplePos x="0" y="0"/>
             <wp:positionH relativeFrom="page">
               <wp:posOffset>3676650</wp:posOffset>
@@ -6450,7 +5138,7 @@
                     <pic:cNvPicPr/>
                   </pic:nvPicPr>
                   <pic:blipFill>
-                    <a:blip r:embed="rId49">
+                    <a:blip r:embed="rId50">
                       <a:extLst>
                         <a:ext uri="{28A0092B-C50C-407E-A947-70E740481C1C}">
                           <a14:useLocalDpi xmlns:a14="http://schemas.microsoft.com/office/drawing/2010/main" val="0"/>
@@ -6510,7 +5198,7 @@
                     <pic:cNvPicPr/>
                   </pic:nvPicPr>
                   <pic:blipFill>
-                    <a:blip r:embed="rId50">
+                    <a:blip r:embed="rId51">
                       <a:extLst>
                         <a:ext uri="{28A0092B-C50C-407E-A947-70E740481C1C}">
                           <a14:useLocalDpi xmlns:a14="http://schemas.microsoft.com/office/drawing/2010/main" val="0"/>
@@ -6551,43 +5239,14 @@
         <w:t>The next parameter will be the</w:t>
       </w:r>
       <w:r>
-        <w:t xml:space="preserve"> </w:t>
-      </w:r>
-      <w:proofErr w:type="spellStart"/>
-      <w:r>
-        <w:t>bottomBar</w:t>
-      </w:r>
-      <w:proofErr w:type="spellEnd"/>
-      <w:r>
-        <w:t xml:space="preserve"> parameter </w:t>
+        <w:t xml:space="preserve"> bottomBar parameter </w:t>
       </w:r>
       <w:r>
         <w:t xml:space="preserve">which </w:t>
       </w:r>
       <w:r>
-        <w:t xml:space="preserve">will contain a </w:t>
-      </w:r>
-      <w:proofErr w:type="spellStart"/>
-      <w:r>
-        <w:t>NavigationBar</w:t>
-      </w:r>
-      <w:proofErr w:type="spellEnd"/>
-      <w:r>
-        <w:t xml:space="preserve"> with two </w:t>
-      </w:r>
-      <w:proofErr w:type="spellStart"/>
-      <w:r>
-        <w:t>NavigationBarItem</w:t>
-      </w:r>
-      <w:proofErr w:type="spellEnd"/>
-      <w:r>
-        <w:t xml:space="preserve"> </w:t>
-      </w:r>
-      <w:proofErr w:type="spellStart"/>
-      <w:r>
-        <w:t>composables</w:t>
-      </w:r>
-      <w:proofErr w:type="spellEnd"/>
+        <w:t>will contain a NavigationBar with two NavigationBarItem composables</w:t>
+      </w:r>
       <w:r>
         <w:t>,</w:t>
       </w:r>
@@ -6604,7 +5263,7 @@
           <w:noProof/>
         </w:rPr>
         <w:drawing>
-          <wp:anchor distT="0" distB="0" distL="114300" distR="114300" simplePos="0" relativeHeight="251705344" behindDoc="0" locked="0" layoutInCell="1" allowOverlap="1" wp14:anchorId="6CA52A84" wp14:editId="6C875E04">
+          <wp:anchor distT="0" distB="0" distL="114300" distR="114300" simplePos="0" relativeHeight="251705344" behindDoc="0" locked="0" layoutInCell="1" allowOverlap="1" wp14:anchorId="6CA52A84" wp14:editId="052FE335">
             <wp:simplePos x="0" y="0"/>
             <wp:positionH relativeFrom="column">
               <wp:posOffset>2941320</wp:posOffset>
@@ -6627,7 +5286,7 @@
                     <pic:cNvPicPr/>
                   </pic:nvPicPr>
                   <pic:blipFill>
-                    <a:blip r:embed="rId51">
+                    <a:blip r:embed="rId52">
                       <a:extLst>
                         <a:ext uri="{28A0092B-C50C-407E-A947-70E740481C1C}">
                           <a14:useLocalDpi xmlns:a14="http://schemas.microsoft.com/office/drawing/2010/main" val="0"/>
@@ -6687,7 +5346,7 @@
                     <pic:cNvPicPr/>
                   </pic:nvPicPr>
                   <pic:blipFill>
-                    <a:blip r:embed="rId52">
+                    <a:blip r:embed="rId53">
                       <a:extLst>
                         <a:ext uri="{28A0092B-C50C-407E-A947-70E740481C1C}">
                           <a14:useLocalDpi xmlns:a14="http://schemas.microsoft.com/office/drawing/2010/main" val="0"/>
@@ -6734,7 +5393,7 @@
           <w:noProof/>
         </w:rPr>
         <w:drawing>
-          <wp:anchor distT="0" distB="0" distL="114300" distR="114300" simplePos="0" relativeHeight="251706368" behindDoc="0" locked="0" layoutInCell="1" allowOverlap="1" wp14:anchorId="177154F8" wp14:editId="4B849F83">
+          <wp:anchor distT="0" distB="0" distL="114300" distR="114300" simplePos="0" relativeHeight="251706368" behindDoc="0" locked="0" layoutInCell="1" allowOverlap="1" wp14:anchorId="177154F8" wp14:editId="2CB3F5FE">
             <wp:simplePos x="0" y="0"/>
             <wp:positionH relativeFrom="margin">
               <wp:align>left</wp:align>
@@ -6757,7 +5416,7 @@
                     <pic:cNvPicPr/>
                   </pic:nvPicPr>
                   <pic:blipFill>
-                    <a:blip r:embed="rId53">
+                    <a:blip r:embed="rId54">
                       <a:extLst>
                         <a:ext uri="{28A0092B-C50C-407E-A947-70E740481C1C}">
                           <a14:useLocalDpi xmlns:a14="http://schemas.microsoft.com/office/drawing/2010/main" val="0"/>
@@ -6787,15 +5446,7 @@
         <w:t>I will then add a</w:t>
       </w:r>
       <w:r>
-        <w:t xml:space="preserve"> </w:t>
-      </w:r>
-      <w:proofErr w:type="spellStart"/>
-      <w:r>
-        <w:t>floatingActionButton</w:t>
-      </w:r>
-      <w:proofErr w:type="spellEnd"/>
-      <w:r>
-        <w:t xml:space="preserve"> </w:t>
+        <w:t xml:space="preserve"> floatingActionButton </w:t>
       </w:r>
       <w:r>
         <w:t xml:space="preserve">as the last </w:t>
@@ -6807,31 +5458,13 @@
         <w:t xml:space="preserve">which </w:t>
       </w:r>
       <w:r>
-        <w:t xml:space="preserve">will contain a </w:t>
-      </w:r>
-      <w:proofErr w:type="spellStart"/>
-      <w:r>
-        <w:t>FloatingActionButton</w:t>
-      </w:r>
-      <w:proofErr w:type="spellEnd"/>
-      <w:r>
-        <w:t xml:space="preserve"> with </w:t>
+        <w:t xml:space="preserve">will contain a FloatingActionButton with </w:t>
       </w:r>
       <w:r>
         <w:t>an</w:t>
       </w:r>
       <w:r>
-        <w:t xml:space="preserve"> </w:t>
-      </w:r>
-      <w:proofErr w:type="spellStart"/>
-      <w:proofErr w:type="gramStart"/>
-      <w:r>
-        <w:t>Icons.Filled.Add</w:t>
-      </w:r>
-      <w:proofErr w:type="spellEnd"/>
-      <w:proofErr w:type="gramEnd"/>
-      <w:r>
-        <w:t xml:space="preserve"> icon that </w:t>
+        <w:t xml:space="preserve"> Icons.Filled.Add icon that </w:t>
       </w:r>
       <w:r>
         <w:t xml:space="preserve">will </w:t>
@@ -6843,15 +5476,7 @@
         <w:t xml:space="preserve"> the user</w:t>
       </w:r>
       <w:r>
-        <w:t xml:space="preserve"> to the </w:t>
-      </w:r>
-      <w:proofErr w:type="spellStart"/>
-      <w:r>
-        <w:t>addPoi</w:t>
-      </w:r>
-      <w:proofErr w:type="spellEnd"/>
-      <w:r>
-        <w:t xml:space="preserve"> route</w:t>
+        <w:t xml:space="preserve"> to the addPoi route</w:t>
       </w:r>
       <w:r>
         <w:t>.</w:t>
@@ -6877,7 +5502,7 @@
         </w:rPr>
         <w:lastRenderedPageBreak/>
         <w:drawing>
-          <wp:anchor distT="0" distB="0" distL="114300" distR="114300" simplePos="0" relativeHeight="251707392" behindDoc="0" locked="0" layoutInCell="1" allowOverlap="1" wp14:anchorId="0475AAA6" wp14:editId="3F941DE4">
+          <wp:anchor distT="0" distB="0" distL="114300" distR="114300" simplePos="0" relativeHeight="251707392" behindDoc="0" locked="0" layoutInCell="1" allowOverlap="1" wp14:anchorId="0475AAA6" wp14:editId="0B0D1C04">
             <wp:simplePos x="0" y="0"/>
             <wp:positionH relativeFrom="margin">
               <wp:align>center</wp:align>
@@ -6900,7 +5525,7 @@
                     <pic:cNvPicPr/>
                   </pic:nvPicPr>
                   <pic:blipFill>
-                    <a:blip r:embed="rId54">
+                    <a:blip r:embed="rId55">
                       <a:extLst>
                         <a:ext uri="{28A0092B-C50C-407E-A947-70E740481C1C}">
                           <a14:useLocalDpi xmlns:a14="http://schemas.microsoft.com/office/drawing/2010/main" val="0"/>
@@ -6935,53 +5560,14 @@
       <w:r>
         <w:t xml:space="preserve"> </w:t>
       </w:r>
-      <w:proofErr w:type="spellStart"/>
-      <w:proofErr w:type="gramStart"/>
-      <w:r>
-        <w:t>OptIn</w:t>
-      </w:r>
-      <w:proofErr w:type="spellEnd"/>
-      <w:r>
-        <w:t>(</w:t>
-      </w:r>
-      <w:proofErr w:type="gramEnd"/>
-      <w:r>
-        <w:t>ExperimentalMaterial3</w:t>
-      </w:r>
-      <w:proofErr w:type="gramStart"/>
-      <w:r>
-        <w:t>Api::</w:t>
-      </w:r>
-      <w:proofErr w:type="gramEnd"/>
-      <w:r>
-        <w:t>class)</w:t>
-      </w:r>
-      <w:r>
-        <w:t xml:space="preserve"> before the </w:t>
-      </w:r>
-      <w:proofErr w:type="spellStart"/>
-      <w:proofErr w:type="gramStart"/>
-      <w:r>
-        <w:t>onCreate</w:t>
-      </w:r>
-      <w:proofErr w:type="spellEnd"/>
-      <w:r>
-        <w:t>(</w:t>
-      </w:r>
-      <w:proofErr w:type="gramEnd"/>
-      <w:r>
-        <w:t xml:space="preserve">) as </w:t>
-      </w:r>
-      <w:r>
-        <w:t xml:space="preserve">the </w:t>
-      </w:r>
-      <w:proofErr w:type="spellStart"/>
-      <w:r>
-        <w:t>TopAppBar</w:t>
-      </w:r>
-      <w:proofErr w:type="spellEnd"/>
-      <w:r>
-        <w:t xml:space="preserve"> is still experimental</w:t>
+      <w:r>
+        <w:t>OptIn(ExperimentalMaterial3Api::class)</w:t>
+      </w:r>
+      <w:r>
+        <w:t xml:space="preserve"> before the onCreate() as </w:t>
+      </w:r>
+      <w:r>
+        <w:t>the TopAppBar is still experimental</w:t>
       </w:r>
       <w:r>
         <w:t>.</w:t>
@@ -7061,7 +5647,7 @@
           <w:noProof/>
         </w:rPr>
         <w:drawing>
-          <wp:anchor distT="0" distB="0" distL="114300" distR="114300" simplePos="0" relativeHeight="251709440" behindDoc="0" locked="0" layoutInCell="1" allowOverlap="1" wp14:anchorId="1BEB1348" wp14:editId="6502FAD9">
+          <wp:anchor distT="0" distB="0" distL="114300" distR="114300" simplePos="0" relativeHeight="251709440" behindDoc="0" locked="0" layoutInCell="1" allowOverlap="1" wp14:anchorId="1BEB1348" wp14:editId="6BC1FFDA">
             <wp:simplePos x="0" y="0"/>
             <wp:positionH relativeFrom="margin">
               <wp:align>right</wp:align>
@@ -7084,7 +5670,7 @@
                     <pic:cNvPicPr/>
                   </pic:nvPicPr>
                   <pic:blipFill>
-                    <a:blip r:embed="rId55">
+                    <a:blip r:embed="rId56">
                       <a:extLst>
                         <a:ext uri="{28A0092B-C50C-407E-A947-70E740481C1C}">
                           <a14:useLocalDpi xmlns:a14="http://schemas.microsoft.com/office/drawing/2010/main" val="0"/>
@@ -7117,9 +5703,8 @@
           <w:sz w:val="24"/>
           <w:szCs w:val="24"/>
         </w:rPr>
-        <w:t xml:space="preserve">I will begin by adding a new function to my </w:t>
-      </w:r>
-      <w:proofErr w:type="spellStart"/>
+        <w:t xml:space="preserve">I will begin by adding a new function to my ViewModel which will use the /review/create </w:t>
+      </w:r>
       <w:r>
         <w:rPr>
           <w:rFonts w:ascii="Trebuchet MS" w:hAnsi="Trebuchet MS"/>
@@ -7127,208 +5712,149 @@
           <w:sz w:val="24"/>
           <w:szCs w:val="24"/>
         </w:rPr>
-        <w:t>ViewModel</w:t>
-      </w:r>
-      <w:proofErr w:type="spellEnd"/>
-      <w:r>
+        <w:t>POST route sending the POI web ID and the review. This should display an error in the console if one has occurred and should also display a message indicating that the review had been added successfully.</w:t>
+      </w:r>
+      <w:r>
+        <w:rPr>
+          <w:noProof/>
+        </w:rPr>
+        <w:t xml:space="preserve"> </w:t>
+      </w:r>
+    </w:p>
+    <w:p>
+      <w:pPr>
+        <w:ind w:left="720"/>
         <w:rPr>
           <w:rFonts w:ascii="Trebuchet MS" w:hAnsi="Trebuchet MS"/>
           <w:color w:val="000000"/>
           <w:sz w:val="24"/>
           <w:szCs w:val="24"/>
         </w:rPr>
-        <w:t xml:space="preserve"> which will use the /review/create </w:t>
-      </w:r>
-      <w:r>
+      </w:pPr>
+    </w:p>
+    <w:p>
+      <w:pPr>
+        <w:ind w:left="720"/>
         <w:rPr>
           <w:rFonts w:ascii="Trebuchet MS" w:hAnsi="Trebuchet MS"/>
           <w:color w:val="000000"/>
           <w:sz w:val="24"/>
           <w:szCs w:val="24"/>
         </w:rPr>
-        <w:t>POST route sending the POI web ID and the review. This should display an error in the console if one has occurred and should also display a message indicating that the review had been added successfully.</w:t>
-      </w:r>
-      <w:r>
-        <w:rPr>
-          <w:noProof/>
+      </w:pPr>
+    </w:p>
+    <w:p>
+      <w:pPr>
+        <w:ind w:left="720"/>
+        <w:rPr>
+          <w:rFonts w:ascii="Trebuchet MS" w:hAnsi="Trebuchet MS"/>
+          <w:color w:val="000000"/>
+          <w:sz w:val="24"/>
+          <w:szCs w:val="24"/>
+        </w:rPr>
+      </w:pPr>
+    </w:p>
+    <w:p>
+      <w:pPr>
+        <w:ind w:left="720"/>
+        <w:rPr>
+          <w:rFonts w:ascii="Trebuchet MS" w:hAnsi="Trebuchet MS"/>
+          <w:color w:val="000000"/>
+          <w:sz w:val="24"/>
+          <w:szCs w:val="24"/>
+        </w:rPr>
+      </w:pPr>
+    </w:p>
+    <w:p>
+      <w:pPr>
+        <w:ind w:left="720"/>
+        <w:rPr>
+          <w:rFonts w:ascii="Trebuchet MS" w:hAnsi="Trebuchet MS"/>
+          <w:color w:val="000000"/>
+          <w:sz w:val="24"/>
+          <w:szCs w:val="24"/>
+        </w:rPr>
+      </w:pPr>
+    </w:p>
+    <w:p>
+      <w:pPr>
+        <w:ind w:left="720"/>
+        <w:rPr>
+          <w:sz w:val="24"/>
+          <w:szCs w:val="24"/>
+        </w:rPr>
+      </w:pPr>
+      <w:r>
+        <w:rPr>
+          <w:rFonts w:ascii="Trebuchet MS" w:hAnsi="Trebuchet MS"/>
+          <w:color w:val="000000"/>
+          <w:sz w:val="24"/>
+          <w:szCs w:val="24"/>
+        </w:rPr>
+        <w:t xml:space="preserve">I will then update the AlertDialog for each of the markers to include a text field </w:t>
+      </w:r>
+      <w:r>
+        <w:rPr>
+          <w:rFonts w:ascii="Trebuchet MS" w:hAnsi="Trebuchet MS"/>
+          <w:color w:val="000000"/>
+          <w:sz w:val="24"/>
+          <w:szCs w:val="24"/>
+        </w:rPr>
+        <w:t>accompanied</w:t>
+      </w:r>
+      <w:r>
+        <w:rPr>
+          <w:rFonts w:ascii="Trebuchet MS" w:hAnsi="Trebuchet MS"/>
+          <w:color w:val="000000"/>
+          <w:sz w:val="24"/>
+          <w:szCs w:val="24"/>
         </w:rPr>
         <w:t xml:space="preserve"> </w:t>
       </w:r>
-    </w:p>
-    <w:p>
-      <w:pPr>
-        <w:ind w:left="720"/>
+      <w:r>
         <w:rPr>
           <w:rFonts w:ascii="Trebuchet MS" w:hAnsi="Trebuchet MS"/>
           <w:color w:val="000000"/>
           <w:sz w:val="24"/>
           <w:szCs w:val="24"/>
         </w:rPr>
-      </w:pPr>
-    </w:p>
-    <w:p>
-      <w:pPr>
-        <w:ind w:left="720"/>
+        <w:t>by</w:t>
+      </w:r>
+      <w:r>
         <w:rPr>
           <w:rFonts w:ascii="Trebuchet MS" w:hAnsi="Trebuchet MS"/>
           <w:color w:val="000000"/>
           <w:sz w:val="24"/>
           <w:szCs w:val="24"/>
         </w:rPr>
-      </w:pPr>
-    </w:p>
-    <w:p>
-      <w:pPr>
-        <w:ind w:left="720"/>
+        <w:t xml:space="preserve"> a button. The button, when clicked, will check if the </w:t>
+      </w:r>
+      <w:r>
         <w:rPr>
           <w:rFonts w:ascii="Trebuchet MS" w:hAnsi="Trebuchet MS"/>
           <w:color w:val="000000"/>
           <w:sz w:val="24"/>
           <w:szCs w:val="24"/>
         </w:rPr>
-      </w:pPr>
-    </w:p>
-    <w:p>
-      <w:pPr>
-        <w:ind w:left="720"/>
+        <w:t>text field</w:t>
+      </w:r>
+      <w:r>
         <w:rPr>
           <w:rFonts w:ascii="Trebuchet MS" w:hAnsi="Trebuchet MS"/>
           <w:color w:val="000000"/>
           <w:sz w:val="24"/>
           <w:szCs w:val="24"/>
         </w:rPr>
-      </w:pPr>
-    </w:p>
-    <w:p>
-      <w:pPr>
-        <w:ind w:left="720"/>
+        <w:t xml:space="preserve"> is blank or if the poi doesn’t have a web ID. If it passes all the checks then the button calls the</w:t>
+      </w:r>
+      <w:r>
         <w:rPr>
           <w:rFonts w:ascii="Trebuchet MS" w:hAnsi="Trebuchet MS"/>
           <w:color w:val="000000"/>
           <w:sz w:val="24"/>
           <w:szCs w:val="24"/>
         </w:rPr>
-      </w:pPr>
-    </w:p>
-    <w:p>
-      <w:pPr>
-        <w:ind w:left="720"/>
-        <w:rPr>
-          <w:sz w:val="24"/>
-          <w:szCs w:val="24"/>
-        </w:rPr>
-      </w:pPr>
-      <w:r>
-        <w:rPr>
-          <w:rFonts w:ascii="Trebuchet MS" w:hAnsi="Trebuchet MS"/>
-          <w:color w:val="000000"/>
-          <w:sz w:val="24"/>
-          <w:szCs w:val="24"/>
-        </w:rPr>
-        <w:t xml:space="preserve">I will then update the </w:t>
-      </w:r>
-      <w:proofErr w:type="spellStart"/>
-      <w:r>
-        <w:rPr>
-          <w:rFonts w:ascii="Trebuchet MS" w:hAnsi="Trebuchet MS"/>
-          <w:color w:val="000000"/>
-          <w:sz w:val="24"/>
-          <w:szCs w:val="24"/>
-        </w:rPr>
-        <w:t>AlertDialog</w:t>
-      </w:r>
-      <w:proofErr w:type="spellEnd"/>
-      <w:r>
-        <w:rPr>
-          <w:rFonts w:ascii="Trebuchet MS" w:hAnsi="Trebuchet MS"/>
-          <w:color w:val="000000"/>
-          <w:sz w:val="24"/>
-          <w:szCs w:val="24"/>
-        </w:rPr>
-        <w:t xml:space="preserve"> for each of the markers to include a text field </w:t>
-      </w:r>
-      <w:r>
-        <w:rPr>
-          <w:rFonts w:ascii="Trebuchet MS" w:hAnsi="Trebuchet MS"/>
-          <w:color w:val="000000"/>
-          <w:sz w:val="24"/>
-          <w:szCs w:val="24"/>
-        </w:rPr>
-        <w:t>accompanied</w:t>
-      </w:r>
-      <w:r>
-        <w:rPr>
-          <w:rFonts w:ascii="Trebuchet MS" w:hAnsi="Trebuchet MS"/>
-          <w:color w:val="000000"/>
-          <w:sz w:val="24"/>
-          <w:szCs w:val="24"/>
-        </w:rPr>
-        <w:t xml:space="preserve"> </w:t>
-      </w:r>
-      <w:r>
-        <w:rPr>
-          <w:rFonts w:ascii="Trebuchet MS" w:hAnsi="Trebuchet MS"/>
-          <w:color w:val="000000"/>
-          <w:sz w:val="24"/>
-          <w:szCs w:val="24"/>
-        </w:rPr>
-        <w:t>by</w:t>
-      </w:r>
-      <w:r>
-        <w:rPr>
-          <w:rFonts w:ascii="Trebuchet MS" w:hAnsi="Trebuchet MS"/>
-          <w:color w:val="000000"/>
-          <w:sz w:val="24"/>
-          <w:szCs w:val="24"/>
-        </w:rPr>
-        <w:t xml:space="preserve"> a button. The button, when clicked, will check if the </w:t>
-      </w:r>
-      <w:r>
-        <w:rPr>
-          <w:rFonts w:ascii="Trebuchet MS" w:hAnsi="Trebuchet MS"/>
-          <w:color w:val="000000"/>
-          <w:sz w:val="24"/>
-          <w:szCs w:val="24"/>
-        </w:rPr>
-        <w:t>text field</w:t>
-      </w:r>
-      <w:r>
-        <w:rPr>
-          <w:rFonts w:ascii="Trebuchet MS" w:hAnsi="Trebuchet MS"/>
-          <w:color w:val="000000"/>
-          <w:sz w:val="24"/>
-          <w:szCs w:val="24"/>
-        </w:rPr>
-        <w:t xml:space="preserve"> is blank or if the poi doesn’t have a web ID. If it passes all the checks then the button calls the</w:t>
-      </w:r>
-      <w:r>
-        <w:rPr>
-          <w:rFonts w:ascii="Trebuchet MS" w:hAnsi="Trebuchet MS"/>
-          <w:color w:val="000000"/>
-          <w:sz w:val="24"/>
-          <w:szCs w:val="24"/>
-        </w:rPr>
-        <w:t xml:space="preserve"> function that sends the review including the </w:t>
-      </w:r>
-      <w:proofErr w:type="spellStart"/>
-      <w:r>
-        <w:rPr>
-          <w:rFonts w:ascii="Trebuchet MS" w:hAnsi="Trebuchet MS"/>
-          <w:color w:val="000000"/>
-          <w:sz w:val="24"/>
-          <w:szCs w:val="24"/>
-        </w:rPr>
-        <w:t>webId</w:t>
-      </w:r>
-      <w:proofErr w:type="spellEnd"/>
-      <w:r>
-        <w:rPr>
-          <w:rFonts w:ascii="Trebuchet MS" w:hAnsi="Trebuchet MS"/>
-          <w:color w:val="000000"/>
-          <w:sz w:val="24"/>
-          <w:szCs w:val="24"/>
-        </w:rPr>
-        <w:t xml:space="preserve"> and review text as the parameters. </w:t>
+        <w:t xml:space="preserve"> function that sends the review including the webId and review text as the parameters. </w:t>
       </w:r>
     </w:p>
     <w:p>
@@ -7361,7 +5887,7 @@
                     <pic:cNvPicPr/>
                   </pic:nvPicPr>
                   <pic:blipFill>
-                    <a:blip r:embed="rId56">
+                    <a:blip r:embed="rId57">
                       <a:extLst>
                         <a:ext uri="{28A0092B-C50C-407E-A947-70E740481C1C}">
                           <a14:useLocalDpi xmlns:a14="http://schemas.microsoft.com/office/drawing/2010/main" val="0"/>
@@ -7397,13 +5923,14 @@
         <w:tab/>
       </w:r>
     </w:p>
+    <w:p/>
     <w:p>
       <w:r>
         <w:rPr>
           <w:noProof/>
         </w:rPr>
         <w:drawing>
-          <wp:anchor distT="0" distB="0" distL="114300" distR="114300" simplePos="0" relativeHeight="251711488" behindDoc="0" locked="0" layoutInCell="1" allowOverlap="1" wp14:anchorId="3F605B9E" wp14:editId="3CFD4C6D">
+          <wp:anchor distT="0" distB="0" distL="114300" distR="114300" simplePos="0" relativeHeight="251711488" behindDoc="0" locked="0" layoutInCell="1" allowOverlap="1" wp14:anchorId="3F605B9E" wp14:editId="44C2C80B">
             <wp:simplePos x="0" y="0"/>
             <wp:positionH relativeFrom="margin">
               <wp:align>center</wp:align>
@@ -7426,7 +5953,7 @@
                     <pic:cNvPicPr/>
                   </pic:nvPicPr>
                   <pic:blipFill>
-                    <a:blip r:embed="rId57">
+                    <a:blip r:embed="rId58">
                       <a:extLst>
                         <a:ext uri="{28A0092B-C50C-407E-A947-70E740481C1C}">
                           <a14:useLocalDpi xmlns:a14="http://schemas.microsoft.com/office/drawing/2010/main" val="0"/>
@@ -7470,52 +5997,13 @@
         <w:t xml:space="preserve"> </w:t>
       </w:r>
       <w:r>
-        <w:t xml:space="preserve">However, I had been coding on the very latest android studio panda 2. Looking at the android studio web, this is an issue as panda 2 uses </w:t>
-      </w:r>
-      <w:proofErr w:type="spellStart"/>
-      <w:r>
-        <w:t>apg’s</w:t>
-      </w:r>
-      <w:proofErr w:type="spellEnd"/>
-      <w:r>
-        <w:t xml:space="preserve"> from 4.0 – 9.1 (9.1 being the </w:t>
-      </w:r>
-      <w:proofErr w:type="spellStart"/>
-      <w:r>
-        <w:t>apg</w:t>
-      </w:r>
-      <w:proofErr w:type="spellEnd"/>
-      <w:r>
-        <w:t xml:space="preserve"> I was using) whereas Narwhal and Otter use an </w:t>
-      </w:r>
-      <w:proofErr w:type="spellStart"/>
-      <w:r>
-        <w:t>apg</w:t>
-      </w:r>
-      <w:proofErr w:type="spellEnd"/>
-      <w:r>
-        <w:t xml:space="preserve"> from 4.0-8.13 meaning my </w:t>
-      </w:r>
-      <w:proofErr w:type="spellStart"/>
-      <w:r>
-        <w:t>apg</w:t>
-      </w:r>
-      <w:proofErr w:type="spellEnd"/>
-      <w:r>
-        <w:t xml:space="preserve"> would not work on the software used in grading. I fixed this by simply changing the </w:t>
-      </w:r>
-      <w:proofErr w:type="spellStart"/>
-      <w:r>
-        <w:t>apg</w:t>
-      </w:r>
-      <w:proofErr w:type="spellEnd"/>
-      <w:r>
-        <w:t xml:space="preserve"> version and updating any necessary files</w:t>
+        <w:t>However, I had been coding on the very latest android studio panda 2. Looking at the android studio web, this is an issue as panda 2 uses apg’s from 4.0 – 9.1 (9.1 being the apg I was using) whereas Narwhal and Otter use an apg from 4.0-8.13 meaning my apg would not work on the software used in grading. I fixed this by simply changing the apg version and updating any necessary files</w:t>
       </w:r>
       <w:r>
         <w:t>.</w:t>
       </w:r>
     </w:p>
+    <w:p/>
     <w:sectPr>
       <w:pgSz w:w="12240" w:h="15840"/>
       <w:pgMar w:top="1440" w:right="1440" w:bottom="1440" w:left="1440" w:header="720" w:footer="720" w:gutter="0"/>

</xml_diff>